<commit_message>
Adicionando a documentação atualizada do projeto do Github - 28/03/2026
</commit_message>
<xml_diff>
--- a/Terceiro_Semestre/Projeto_Integrador/Documentação/Modelo_Projeto_Integrador_principal.docx
+++ b/Terceiro_Semestre/Projeto_Integrador/Documentação/Modelo_Projeto_Integrador_principal.docx
@@ -2036,13 +2036,49 @@
         <w:jc w:val="both"/>
       </w:pPr>
       <w:r>
-        <w:t>Cada usuário tem funções especificas para manter a integridade do sistema de alocação de laboratórios. Usuários: Diretor Acadê</w:t>
-      </w:r>
-      <w:r>
-        <w:t>mico responsável p</w:t>
-      </w:r>
-      <w:r>
-        <w:t>elo Cadastro de laboratórios de informática</w:t>
+        <w:t xml:space="preserve">Cada usuário tem funções especificas para manter a integridade do sistema de alocação de laboratórios. Usuários: </w:t>
+      </w:r>
+      <w:r>
+        <w:t>d</w:t>
+      </w:r>
+      <w:r>
+        <w:t xml:space="preserve">iretor </w:t>
+      </w:r>
+      <w:r>
+        <w:t>a</w:t>
+      </w:r>
+      <w:r>
+        <w:t>cadê</w:t>
+      </w:r>
+      <w:r>
+        <w:t xml:space="preserve">mico </w:t>
+      </w:r>
+      <w:r>
+        <w:t xml:space="preserve">é </w:t>
+      </w:r>
+      <w:r>
+        <w:t>responsável p</w:t>
+      </w:r>
+      <w:r>
+        <w:t>elo</w:t>
+      </w:r>
+      <w:r>
+        <w:t>s</w:t>
+      </w:r>
+      <w:r>
+        <w:t xml:space="preserve"> </w:t>
+      </w:r>
+      <w:r>
+        <w:t>c</w:t>
+      </w:r>
+      <w:r>
+        <w:t>adastro</w:t>
+      </w:r>
+      <w:r>
+        <w:t>s</w:t>
+      </w:r>
+      <w:r>
+        <w:t xml:space="preserve"> de laboratórios de informática</w:t>
       </w:r>
       <w:r>
         <w:t>,</w:t>
@@ -2084,16 +2120,11 @@
         <w:t xml:space="preserve">geral de cada </w:t>
       </w:r>
       <w:r>
-        <w:t xml:space="preserve">laboratório (visualizar alterações feitas pelos coordenadores ou </w:t>
-      </w:r>
-      <w:proofErr w:type="spellStart"/>
-      <w:r>
-        <w:t>responsáveis</w:t>
-      </w:r>
-      <w:r>
-        <w:t>cde</w:t>
-      </w:r>
-      <w:proofErr w:type="spellEnd"/>
+        <w:t>laboratório (visualizar alterações feitas pelos coordenadores ou responsáveis</w:t>
+      </w:r>
+      <w:r>
+        <w:t xml:space="preserve"> de</w:t>
+      </w:r>
       <w:r>
         <w:t xml:space="preserve"> TI</w:t>
       </w:r>
@@ -2125,7 +2156,13 @@
         <w:t xml:space="preserve"> das</w:t>
       </w:r>
       <w:r>
-        <w:t xml:space="preserve"> disciplinas e relacionar com os softwares que elas requisitam, informar a quantidade de alunos matriculados em cada disciplina, duração dos horários de início e fim das aulas</w:t>
+        <w:t xml:space="preserve"> disciplinas e relacionar com os softwares que elas requisitam, informa</w:t>
+      </w:r>
+      <w:r>
+        <w:t>ndo</w:t>
+      </w:r>
+      <w:r>
+        <w:t xml:space="preserve"> a quantidade de alunos matriculados em cada disciplina, duração dos horários de início e fim das aulas</w:t>
       </w:r>
       <w:r>
         <w:t xml:space="preserve"> e solicita a alocação de determinado laboratório</w:t>
@@ -2190,10 +2227,73 @@
         <w:jc w:val="both"/>
       </w:pPr>
       <w:r>
-        <w:t xml:space="preserve">Seguiremos o padrão </w:t>
-      </w:r>
-      <w:r>
-        <w:t>estabelecidas nas atas que estão anexadas ao fim deste documento.</w:t>
+        <w:t>Será seguido o padrão estabelecido nas atas anexadas ao final deste documento.</w:t>
+      </w:r>
+    </w:p>
+    <w:p>
+      <w:pPr>
+        <w:ind w:left="851"/>
+        <w:jc w:val="both"/>
+      </w:pPr>
+      <w:r>
+        <w:t>Atalho para às a</w:t>
+      </w:r>
+      <w:r>
+        <w:t xml:space="preserve">tas </w:t>
+      </w:r>
+      <w:r>
+        <w:fldChar w:fldCharType="begin"/>
+      </w:r>
+      <w:r>
+        <w:instrText>HYPERLINK  \l "Ata_1"</w:instrText>
+      </w:r>
+      <w:r>
+        <w:fldChar w:fldCharType="separate"/>
+      </w:r>
+      <w:r>
+        <w:rPr>
+          <w:rStyle w:val="Hyperlink"/>
+        </w:rPr>
+        <w:t>1</w:t>
+      </w:r>
+      <w:r>
+        <w:fldChar w:fldCharType="end"/>
+      </w:r>
+      <w:r>
+        <w:t xml:space="preserve">, </w:t>
+      </w:r>
+      <w:hyperlink w:anchor="Ata_2" w:history="1">
+        <w:r>
+          <w:rPr>
+            <w:rStyle w:val="Hyperlink"/>
+          </w:rPr>
+          <w:t>2</w:t>
+        </w:r>
+      </w:hyperlink>
+      <w:r>
+        <w:t xml:space="preserve">, </w:t>
+      </w:r>
+      <w:hyperlink w:anchor="Ata_3" w:history="1">
+        <w:r>
+          <w:rPr>
+            <w:rStyle w:val="Hyperlink"/>
+          </w:rPr>
+          <w:t>3</w:t>
+        </w:r>
+      </w:hyperlink>
+      <w:r>
+        <w:t xml:space="preserve"> e </w:t>
+      </w:r>
+      <w:hyperlink w:anchor="Ata_4" w:history="1">
+        <w:r>
+          <w:rPr>
+            <w:rStyle w:val="Hyperlink"/>
+          </w:rPr>
+          <w:t>4</w:t>
+        </w:r>
+      </w:hyperlink>
+      <w:r>
+        <w:t>.</w:t>
       </w:r>
     </w:p>
     <w:p>
@@ -2758,6 +2858,7 @@
         <w:t>Página inicial do sistema Web</w:t>
       </w:r>
     </w:p>
+    <w:p/>
     <w:p>
       <w:r>
         <w:rPr>
@@ -2866,6 +2967,7 @@
         <w:t>Visualizar usuário logado no sistema</w:t>
       </w:r>
     </w:p>
+    <w:p/>
     <w:p>
       <w:r>
         <w:rPr>
@@ -2919,6 +3021,7 @@
         <w:t>Página de gestão de cadastro do sistema</w:t>
       </w:r>
     </w:p>
+    <w:p/>
     <w:p>
       <w:pPr>
         <w:pStyle w:val="Ttulo2"/>
@@ -3041,6 +3144,7 @@
         <w:jc w:val="both"/>
       </w:pPr>
       <w:r>
+        <w:lastRenderedPageBreak/>
         <w:t xml:space="preserve">Interface com navegador web: Nosso sistema terá a capacidade de se adequar aos diferentes navegadores, como Google, Microsoft Edge, Opera e Brave. O Projeto será desenvolvido seguindo as seguintes versões dos navegadores:  </w:t>
       </w:r>
     </w:p>
@@ -3054,7 +3158,6 @@
         <w:jc w:val="both"/>
       </w:pPr>
       <w:r>
-        <w:lastRenderedPageBreak/>
         <w:t>Google Chrome versão 146 (Chromium 146)</w:t>
       </w:r>
     </w:p>
@@ -3138,7 +3241,7 @@
         </w:rPr>
         <w:lastRenderedPageBreak/>
         <w:drawing>
-          <wp:inline distT="0" distB="0" distL="0" distR="0" wp14:anchorId="6BBB43A5" wp14:editId="52A9B704">
+          <wp:inline distT="0" distB="0" distL="0" distR="0" wp14:anchorId="6BBB43A5" wp14:editId="6ADCA0BC">
             <wp:extent cx="9326615" cy="2286952"/>
             <wp:effectExtent l="0" t="4445" r="3810" b="3810"/>
             <wp:docPr id="1746117796" name="drawing"/>
@@ -3242,105 +3345,164 @@
     </w:p>
     <w:p>
       <w:pPr>
+        <w:ind w:left="851" w:firstLine="1"/>
+        <w:jc w:val="both"/>
+      </w:pPr>
+      <w:r>
+        <w:t xml:space="preserve">Linguagem de </w:t>
+      </w:r>
+      <w:r>
+        <w:t>programação C#</w:t>
+      </w:r>
+      <w:r>
+        <w:t xml:space="preserve">, versão 12.0. </w:t>
+      </w:r>
+      <w:r>
+        <w:t xml:space="preserve">Com </w:t>
+      </w:r>
+      <w:proofErr w:type="spellStart"/>
+      <w:proofErr w:type="gramStart"/>
+      <w:r>
+        <w:t>auxilio</w:t>
+      </w:r>
+      <w:proofErr w:type="spellEnd"/>
+      <w:proofErr w:type="gramEnd"/>
+      <w:r>
+        <w:t xml:space="preserve"> do Framework .NET Core LTS 8</w:t>
+      </w:r>
+    </w:p>
+    <w:p>
+      <w:pPr>
         <w:ind w:left="851"/>
         <w:jc w:val="both"/>
-        <w:rPr>
-          <w:highlight w:val="yellow"/>
-        </w:rPr>
-      </w:pPr>
-      <w:r>
-        <w:rPr>
-          <w:highlight w:val="yellow"/>
-        </w:rPr>
-        <w:t>Digite seu texto aqui. Descreva nome e versão da(s) linguagem(ns) de programação a ser(em) utilizada(s).</w:t>
-      </w:r>
+      </w:pPr>
+    </w:p>
+    <w:p>
+      <w:pPr>
+        <w:pStyle w:val="Ttulo3"/>
+        <w:jc w:val="both"/>
+        <w:rPr>
+          <w:i w:val="0"/>
+        </w:rPr>
+      </w:pPr>
+      <w:bookmarkStart w:id="17" w:name="_Toc14943"/>
+      <w:r>
+        <w:rPr>
+          <w:i w:val="0"/>
+        </w:rPr>
+        <w:t>3.1.2</w:t>
+      </w:r>
+      <w:r>
+        <w:tab/>
+      </w:r>
+      <w:r>
+        <w:rPr>
+          <w:i w:val="0"/>
+        </w:rPr>
+        <w:t>BANCO DE DADOS</w:t>
+      </w:r>
+      <w:bookmarkEnd w:id="17"/>
     </w:p>
     <w:p>
       <w:pPr>
         <w:ind w:left="851"/>
         <w:jc w:val="both"/>
       </w:pPr>
-    </w:p>
-    <w:p>
-      <w:pPr>
-        <w:pStyle w:val="Ttulo3"/>
-        <w:jc w:val="both"/>
-        <w:rPr>
-          <w:i w:val="0"/>
-        </w:rPr>
-      </w:pPr>
-      <w:bookmarkStart w:id="17" w:name="_Toc14943"/>
-      <w:r>
-        <w:rPr>
-          <w:i w:val="0"/>
-        </w:rPr>
-        <w:t>3.1.2</w:t>
-      </w:r>
-      <w:r>
-        <w:tab/>
-      </w:r>
-      <w:r>
-        <w:rPr>
-          <w:i w:val="0"/>
-        </w:rPr>
-        <w:t>BANCO DE DADOS</w:t>
-      </w:r>
-      <w:bookmarkEnd w:id="17"/>
-    </w:p>
-    <w:p>
-      <w:pPr>
-        <w:ind w:left="851"/>
-        <w:jc w:val="both"/>
-        <w:rPr>
-          <w:highlight w:val="yellow"/>
-        </w:rPr>
-      </w:pPr>
-      <w:r>
-        <w:rPr>
-          <w:highlight w:val="yellow"/>
-        </w:rPr>
-        <w:t>Banco a ser usado e versão</w:t>
-      </w:r>
-    </w:p>
-    <w:p>
-      <w:pPr>
-        <w:ind w:left="851"/>
-        <w:jc w:val="both"/>
-        <w:rPr>
-          <w:highlight w:val="yellow"/>
-        </w:rPr>
-      </w:pPr>
-      <w:r>
-        <w:rPr>
-          <w:highlight w:val="yellow"/>
-        </w:rPr>
-        <w:t>Backup: quando vai ser realizado (frequência)? Inicia que horas? Automático ou manual? Integral ou incremental? Onde vai ser gravado (nuvem, rede, DVD, pendri</w:t>
-      </w:r>
-      <w:r>
-        <w:rPr>
-          <w:highlight w:val="yellow"/>
-        </w:rPr>
-        <w:t>ve)</w:t>
-      </w:r>
-    </w:p>
-    <w:p>
-      <w:pPr>
-        <w:ind w:left="851"/>
-        <w:jc w:val="both"/>
-        <w:rPr>
-          <w:highlight w:val="yellow"/>
-        </w:rPr>
-      </w:pPr>
-      <w:r>
-        <w:rPr>
-          <w:highlight w:val="yellow"/>
-        </w:rPr>
-        <w:t>Restauração: quem vai ser responsável? Em qual circunstância vai ser feita a restauração?</w:t>
-      </w:r>
-    </w:p>
-    <w:p>
-      <w:pPr>
-        <w:ind w:left="851"/>
+      <w:r>
+        <w:t xml:space="preserve">Banco </w:t>
+      </w:r>
+      <w:r>
+        <w:t xml:space="preserve">de dados PostgreSQL </w:t>
+      </w:r>
+      <w:r>
+        <w:t>18.3.2.</w:t>
+      </w:r>
+    </w:p>
+    <w:p>
+      <w:pPr>
+        <w:pStyle w:val="PargrafodaLista"/>
+        <w:numPr>
+          <w:ilvl w:val="0"/>
+          <w:numId w:val="11"/>
+        </w:numPr>
+        <w:jc w:val="both"/>
+      </w:pPr>
+      <w:r>
+        <w:t xml:space="preserve">Backup: </w:t>
+      </w:r>
+      <w:r>
+        <w:t>O back</w:t>
+      </w:r>
+      <w:r>
+        <w:t xml:space="preserve">up será realizado </w:t>
+      </w:r>
+      <w:r>
+        <w:t xml:space="preserve">duas vezes durante os dias </w:t>
+      </w:r>
+      <w:r>
+        <w:t>segunda-feira, quarta-feira e sexta-feira</w:t>
+      </w:r>
+      <w:r>
+        <w:t xml:space="preserve"> </w:t>
+      </w:r>
+      <w:r>
+        <w:t>de forma automática</w:t>
+      </w:r>
+      <w:r>
+        <w:t xml:space="preserve">, </w:t>
+      </w:r>
+      <w:r>
+        <w:t>incremental</w:t>
+      </w:r>
+      <w:r>
+        <w:t xml:space="preserve"> e será salvo na nuvem</w:t>
+      </w:r>
+      <w:r>
+        <w:t xml:space="preserve">. </w:t>
+      </w:r>
+      <w:r>
+        <w:t xml:space="preserve">O primeiro backup iniciará às </w:t>
+      </w:r>
+      <w:r>
+        <w:t>6</w:t>
+      </w:r>
+      <w:r>
+        <w:t xml:space="preserve">:00 da manhã </w:t>
+      </w:r>
+      <w:r>
+        <w:t xml:space="preserve">e o segundo às </w:t>
+      </w:r>
+      <w:r>
+        <w:t>18:00</w:t>
+      </w:r>
+      <w:r>
+        <w:t>.</w:t>
+      </w:r>
+    </w:p>
+    <w:p>
+      <w:pPr>
+        <w:pStyle w:val="PargrafodaLista"/>
+        <w:numPr>
+          <w:ilvl w:val="0"/>
+          <w:numId w:val="11"/>
+        </w:numPr>
+        <w:jc w:val="both"/>
+      </w:pPr>
+      <w:r>
+        <w:t xml:space="preserve">Restauração: </w:t>
+      </w:r>
+      <w:r>
+        <w:t>O responsável pela restauração do backup será o Jackson</w:t>
+      </w:r>
+      <w:r>
+        <w:t xml:space="preserve"> e a principal circunstância para </w:t>
+      </w:r>
+      <w:r>
+        <w:t>realizar este processo seria na corrupção ou erros no banco de dados.</w:t>
+      </w:r>
+    </w:p>
+    <w:p>
+      <w:pPr>
         <w:jc w:val="both"/>
       </w:pPr>
     </w:p>
@@ -3430,7 +3592,6 @@
         <w:jc w:val="both"/>
         <w:rPr>
           <w:i w:val="0"/>
-          <w:iCs/>
         </w:rPr>
       </w:pPr>
       <w:bookmarkStart w:id="19" w:name="_Toc19201"/>
@@ -3452,52 +3613,56 @@
       <w:bookmarkEnd w:id="19"/>
     </w:p>
     <w:p>
+      <w:r>
+        <w:tab/>
+        <w:t>Os requisitos não funcionais são:</w:t>
+      </w:r>
+    </w:p>
+    <w:p>
+      <w:pPr>
+        <w:pStyle w:val="PargrafodaLista"/>
+        <w:numPr>
+          <w:ilvl w:val="0"/>
+          <w:numId w:val="17"/>
+        </w:numPr>
+        <w:jc w:val="both"/>
+      </w:pPr>
+      <w:r>
+        <w:t xml:space="preserve">Segurança: </w:t>
+      </w:r>
+      <w:r>
+        <w:t>o sistema deve garantir autenticação por login e senha, controle de acesso por perfil de usuário e proteção das informações cadastradas, assegurando que apenas usuários autorizados possam visualizar, cadastrar, alterar ou aprovar dados no sistema.</w:t>
+      </w:r>
+    </w:p>
+    <w:p>
+      <w:pPr>
+        <w:pStyle w:val="PargrafodaLista"/>
+        <w:numPr>
+          <w:ilvl w:val="0"/>
+          <w:numId w:val="16"/>
+        </w:numPr>
+        <w:jc w:val="both"/>
+      </w:pPr>
+      <w:r>
+        <w:t>Manutenibilidade: o sistema deve ser estruturado de forma modular e organizada, permitindo correções, atualizações e inclusão de novas funcionalidades com baixo impacto nas demais partes da aplicação.</w:t>
+      </w:r>
+    </w:p>
+    <w:p>
+      <w:pPr>
+        <w:pStyle w:val="PargrafodaLista"/>
+        <w:numPr>
+          <w:ilvl w:val="0"/>
+          <w:numId w:val="16"/>
+        </w:numPr>
+        <w:jc w:val="both"/>
+      </w:pPr>
+      <w:r>
+        <w:t>Escalabilidade: o sistema deve ser capaz de suportar o crescimento da quantidade de usuários, disciplinas, laboratórios, softwares e alocações, mantendo desempenho adequado e permitindo expansão futura da solução.</w:t>
+      </w:r>
+    </w:p>
+    <w:p>
       <w:pPr>
         <w:ind w:left="851"/>
-        <w:jc w:val="both"/>
-        <w:rPr>
-          <w:highlight w:val="yellow"/>
-        </w:rPr>
-      </w:pPr>
-      <w:r>
-        <w:rPr>
-          <w:highlight w:val="yellow"/>
-        </w:rPr>
-        <w:t>Segurança</w:t>
-      </w:r>
-    </w:p>
-    <w:p>
-      <w:pPr>
-        <w:ind w:left="851"/>
-        <w:jc w:val="both"/>
-        <w:rPr>
-          <w:highlight w:val="yellow"/>
-        </w:rPr>
-      </w:pPr>
-      <w:r>
-        <w:rPr>
-          <w:highlight w:val="yellow"/>
-        </w:rPr>
-        <w:t>Manutenibilidade</w:t>
-      </w:r>
-    </w:p>
-    <w:p>
-      <w:pPr>
-        <w:ind w:left="851"/>
-        <w:jc w:val="both"/>
-        <w:rPr>
-          <w:highlight w:val="yellow"/>
-        </w:rPr>
-      </w:pPr>
-      <w:r>
-        <w:rPr>
-          <w:highlight w:val="yellow"/>
-        </w:rPr>
-        <w:t>Escalabilidade</w:t>
-      </w:r>
-    </w:p>
-    <w:p>
-      <w:pPr>
         <w:jc w:val="both"/>
       </w:pPr>
     </w:p>
@@ -3515,6 +3680,7 @@
         <w:rPr>
           <w:i w:val="0"/>
         </w:rPr>
+        <w:lastRenderedPageBreak/>
         <w:t>3.3</w:t>
       </w:r>
       <w:r>
@@ -3545,7 +3711,6 @@
           <w:i w:val="0"/>
           <w:iCs/>
         </w:rPr>
-        <w:lastRenderedPageBreak/>
         <w:t>Diagrama de Classes:</w:t>
       </w:r>
       <w:r>
@@ -3615,24 +3780,7 @@
           <w:iCs/>
         </w:rPr>
         <w:br/>
-      </w:r>
-      <w:r>
-        <w:rPr>
-          <w:b w:val="0"/>
-          <w:bCs w:val="0"/>
-          <w:i w:val="0"/>
-          <w:iCs/>
-        </w:rPr>
-        <w:t>Diagrama de C</w:t>
-      </w:r>
-      <w:r>
-        <w:rPr>
-          <w:b w:val="0"/>
-          <w:bCs w:val="0"/>
-          <w:i w:val="0"/>
-          <w:iCs/>
-        </w:rPr>
-        <w:t>asos de Uso:</w:t>
+        <w:t>Diagrama de Casos de Uso:</w:t>
       </w:r>
     </w:p>
     <w:p>
@@ -3938,10 +4086,12 @@
       <w:bookmarkEnd w:id="25"/>
     </w:p>
     <w:p>
-      <w:r>
-        <w:t>Atas anexadas</w:t>
-      </w:r>
-    </w:p>
+      <w:bookmarkStart w:id="26" w:name="Ata_1"/>
+      <w:r>
+        <w:t>Ata 1</w:t>
+      </w:r>
+    </w:p>
+    <w:bookmarkEnd w:id="26"/>
     <w:p>
       <w:pPr>
         <w:jc w:val="both"/>
@@ -3955,9 +4105,9 @@
           <w:color w:val="F6F6F6"/>
         </w:rPr>
         <w:drawing>
-          <wp:inline distT="0" distB="0" distL="0" distR="0" wp14:anchorId="2BE6FD17" wp14:editId="578815F3">
-            <wp:extent cx="2807439" cy="4024215"/>
-            <wp:effectExtent l="0" t="0" r="0" b="0"/>
+          <wp:inline distT="0" distB="0" distL="0" distR="0" wp14:anchorId="2BE6FD17" wp14:editId="779DDA05">
+            <wp:extent cx="2507376" cy="3594100"/>
+            <wp:effectExtent l="0" t="0" r="7620" b="6350"/>
             <wp:docPr id="927355617" name="drawing"/>
             <wp:cNvGraphicFramePr>
               <a:graphicFrameLocks xmlns:a="http://schemas.openxmlformats.org/drawingml/2006/main" noChangeAspect="1"/>
@@ -3984,7 +4134,7 @@
                   <pic:spPr>
                     <a:xfrm>
                       <a:off x="0" y="0"/>
-                      <a:ext cx="2807439" cy="4024215"/>
+                      <a:ext cx="2513177" cy="3602415"/>
                     </a:xfrm>
                     <a:prstGeom prst="rect">
                       <a:avLst/>
@@ -3996,15 +4146,33 @@
           </wp:inline>
         </w:drawing>
       </w:r>
+    </w:p>
+    <w:p>
+      <w:bookmarkStart w:id="27" w:name="Ata_2"/>
+      <w:r>
+        <w:t xml:space="preserve">Ata </w:t>
+      </w:r>
+      <w:r>
+        <w:t>2</w:t>
+      </w:r>
+    </w:p>
+    <w:bookmarkEnd w:id="27"/>
+    <w:p>
+      <w:pPr>
+        <w:jc w:val="both"/>
+        <w:rPr>
+          <w:color w:val="F6F6F6"/>
+        </w:rPr>
+      </w:pPr>
       <w:r>
         <w:rPr>
           <w:noProof/>
           <w:color w:val="F6F6F6"/>
         </w:rPr>
         <w:drawing>
-          <wp:inline distT="0" distB="0" distL="0" distR="0" wp14:anchorId="1ABEE6C4" wp14:editId="28A7BEBA">
-            <wp:extent cx="2845060" cy="4021640"/>
-            <wp:effectExtent l="0" t="0" r="0" b="0"/>
+          <wp:inline distT="0" distB="0" distL="0" distR="0" wp14:anchorId="1ABEE6C4" wp14:editId="46424770">
+            <wp:extent cx="2500952" cy="3535228"/>
+            <wp:effectExtent l="0" t="0" r="0" b="8255"/>
             <wp:docPr id="539508390" name="drawing"/>
             <wp:cNvGraphicFramePr>
               <a:graphicFrameLocks xmlns:a="http://schemas.openxmlformats.org/drawingml/2006/main" noChangeAspect="1"/>
@@ -4031,7 +4199,7 @@
                   <pic:spPr>
                     <a:xfrm>
                       <a:off x="0" y="0"/>
-                      <a:ext cx="2868548" cy="4054842"/>
+                      <a:ext cx="2543696" cy="3595648"/>
                     </a:xfrm>
                     <a:prstGeom prst="rect">
                       <a:avLst/>
@@ -4047,19 +4215,44 @@
     <w:p>
       <w:pPr>
         <w:jc w:val="both"/>
-        <w:rPr>
-          <w:color w:val="F6F6F6"/>
-        </w:rPr>
+      </w:pPr>
+    </w:p>
+    <w:p>
+      <w:pPr>
+        <w:jc w:val="both"/>
+      </w:pPr>
+    </w:p>
+    <w:p>
+      <w:pPr>
+        <w:jc w:val="both"/>
+      </w:pPr>
+    </w:p>
+    <w:p>
+      <w:pPr>
+        <w:jc w:val="both"/>
+      </w:pPr>
+      <w:bookmarkStart w:id="28" w:name="Ata_3"/>
+      <w:r>
+        <w:lastRenderedPageBreak/>
+        <w:t>Ata</w:t>
+      </w:r>
+      <w:r>
+        <w:t xml:space="preserve"> 3</w:t>
+      </w:r>
+    </w:p>
+    <w:bookmarkEnd w:id="28"/>
+    <w:p>
+      <w:pPr>
+        <w:jc w:val="both"/>
       </w:pPr>
       <w:r>
         <w:rPr>
           <w:noProof/>
-          <w:color w:val="F6F6F6"/>
         </w:rPr>
         <w:drawing>
-          <wp:inline distT="0" distB="0" distL="0" distR="0" wp14:anchorId="464CB106" wp14:editId="073009A7">
-            <wp:extent cx="2807280" cy="3986865"/>
-            <wp:effectExtent l="0" t="0" r="0" b="0"/>
+          <wp:inline distT="0" distB="0" distL="0" distR="0" wp14:anchorId="464CB106" wp14:editId="337CE74B">
+            <wp:extent cx="2596896" cy="3688080"/>
+            <wp:effectExtent l="0" t="0" r="0" b="7620"/>
             <wp:docPr id="1111046623" name="drawing"/>
             <wp:cNvGraphicFramePr>
               <a:graphicFrameLocks xmlns:a="http://schemas.openxmlformats.org/drawingml/2006/main" noChangeAspect="1"/>
@@ -4086,7 +4279,7 @@
                   <pic:spPr>
                     <a:xfrm>
                       <a:off x="0" y="0"/>
-                      <a:ext cx="2807280" cy="3986865"/>
+                      <a:ext cx="2600783" cy="3693600"/>
                     </a:xfrm>
                     <a:prstGeom prst="rect">
                       <a:avLst/>
@@ -4098,15 +4291,29 @@
           </wp:inline>
         </w:drawing>
       </w:r>
+    </w:p>
+    <w:p>
+      <w:pPr>
+        <w:jc w:val="both"/>
+      </w:pPr>
+      <w:bookmarkStart w:id="29" w:name="Ata_4"/>
+      <w:r>
+        <w:t>Ata 4</w:t>
+      </w:r>
+    </w:p>
+    <w:bookmarkEnd w:id="29"/>
+    <w:p>
+      <w:pPr>
+        <w:jc w:val="both"/>
+      </w:pPr>
       <w:r>
         <w:rPr>
           <w:noProof/>
-          <w:color w:val="F6F6F6"/>
         </w:rPr>
         <w:drawing>
-          <wp:inline distT="0" distB="0" distL="0" distR="0" wp14:anchorId="58EEF04F" wp14:editId="6185D9B8">
-            <wp:extent cx="2807375" cy="3987000"/>
-            <wp:effectExtent l="0" t="0" r="0" b="0"/>
+          <wp:inline distT="0" distB="0" distL="0" distR="0" wp14:anchorId="58EEF04F" wp14:editId="1AD17F8D">
+            <wp:extent cx="2586165" cy="3672840"/>
+            <wp:effectExtent l="0" t="0" r="5080" b="3810"/>
             <wp:docPr id="1283937438" name="drawing"/>
             <wp:cNvGraphicFramePr>
               <a:graphicFrameLocks xmlns:a="http://schemas.openxmlformats.org/drawingml/2006/main" noChangeAspect="1"/>
@@ -4133,7 +4340,7 @@
                   <pic:spPr>
                     <a:xfrm>
                       <a:off x="0" y="0"/>
-                      <a:ext cx="2807375" cy="3987000"/>
+                      <a:ext cx="2589222" cy="3677181"/>
                     </a:xfrm>
                     <a:prstGeom prst="rect">
                       <a:avLst/>
@@ -4830,6 +5037,119 @@
     </w:lvl>
   </w:abstractNum>
   <w:abstractNum w:abstractNumId="4" w15:restartNumberingAfterBreak="0">
+    <w:nsid w:val="1E7B14E5"/>
+    <w:multiLevelType w:val="hybridMultilevel"/>
+    <w:tmpl w:val="71600324"/>
+    <w:lvl w:ilvl="0" w:tplc="04160001">
+      <w:start w:val="1"/>
+      <w:numFmt w:val="bullet"/>
+      <w:lvlText w:val=""/>
+      <w:lvlJc w:val="left"/>
+      <w:pPr>
+        <w:ind w:left="1571" w:hanging="360"/>
+      </w:pPr>
+      <w:rPr>
+        <w:rFonts w:ascii="Symbol" w:hAnsi="Symbol" w:hint="default"/>
+      </w:rPr>
+    </w:lvl>
+    <w:lvl w:ilvl="1" w:tplc="04160003" w:tentative="1">
+      <w:start w:val="1"/>
+      <w:numFmt w:val="bullet"/>
+      <w:lvlText w:val="o"/>
+      <w:lvlJc w:val="left"/>
+      <w:pPr>
+        <w:ind w:left="2291" w:hanging="360"/>
+      </w:pPr>
+      <w:rPr>
+        <w:rFonts w:ascii="Courier New" w:hAnsi="Courier New" w:cs="Courier New" w:hint="default"/>
+      </w:rPr>
+    </w:lvl>
+    <w:lvl w:ilvl="2" w:tplc="04160005" w:tentative="1">
+      <w:start w:val="1"/>
+      <w:numFmt w:val="bullet"/>
+      <w:lvlText w:val=""/>
+      <w:lvlJc w:val="left"/>
+      <w:pPr>
+        <w:ind w:left="3011" w:hanging="360"/>
+      </w:pPr>
+      <w:rPr>
+        <w:rFonts w:ascii="Wingdings" w:hAnsi="Wingdings" w:hint="default"/>
+      </w:rPr>
+    </w:lvl>
+    <w:lvl w:ilvl="3" w:tplc="04160001" w:tentative="1">
+      <w:start w:val="1"/>
+      <w:numFmt w:val="bullet"/>
+      <w:lvlText w:val=""/>
+      <w:lvlJc w:val="left"/>
+      <w:pPr>
+        <w:ind w:left="3731" w:hanging="360"/>
+      </w:pPr>
+      <w:rPr>
+        <w:rFonts w:ascii="Symbol" w:hAnsi="Symbol" w:hint="default"/>
+      </w:rPr>
+    </w:lvl>
+    <w:lvl w:ilvl="4" w:tplc="04160003" w:tentative="1">
+      <w:start w:val="1"/>
+      <w:numFmt w:val="bullet"/>
+      <w:lvlText w:val="o"/>
+      <w:lvlJc w:val="left"/>
+      <w:pPr>
+        <w:ind w:left="4451" w:hanging="360"/>
+      </w:pPr>
+      <w:rPr>
+        <w:rFonts w:ascii="Courier New" w:hAnsi="Courier New" w:cs="Courier New" w:hint="default"/>
+      </w:rPr>
+    </w:lvl>
+    <w:lvl w:ilvl="5" w:tplc="04160005" w:tentative="1">
+      <w:start w:val="1"/>
+      <w:numFmt w:val="bullet"/>
+      <w:lvlText w:val=""/>
+      <w:lvlJc w:val="left"/>
+      <w:pPr>
+        <w:ind w:left="5171" w:hanging="360"/>
+      </w:pPr>
+      <w:rPr>
+        <w:rFonts w:ascii="Wingdings" w:hAnsi="Wingdings" w:hint="default"/>
+      </w:rPr>
+    </w:lvl>
+    <w:lvl w:ilvl="6" w:tplc="04160001" w:tentative="1">
+      <w:start w:val="1"/>
+      <w:numFmt w:val="bullet"/>
+      <w:lvlText w:val=""/>
+      <w:lvlJc w:val="left"/>
+      <w:pPr>
+        <w:ind w:left="5891" w:hanging="360"/>
+      </w:pPr>
+      <w:rPr>
+        <w:rFonts w:ascii="Symbol" w:hAnsi="Symbol" w:hint="default"/>
+      </w:rPr>
+    </w:lvl>
+    <w:lvl w:ilvl="7" w:tplc="04160003" w:tentative="1">
+      <w:start w:val="1"/>
+      <w:numFmt w:val="bullet"/>
+      <w:lvlText w:val="o"/>
+      <w:lvlJc w:val="left"/>
+      <w:pPr>
+        <w:ind w:left="6611" w:hanging="360"/>
+      </w:pPr>
+      <w:rPr>
+        <w:rFonts w:ascii="Courier New" w:hAnsi="Courier New" w:cs="Courier New" w:hint="default"/>
+      </w:rPr>
+    </w:lvl>
+    <w:lvl w:ilvl="8" w:tplc="04160005" w:tentative="1">
+      <w:start w:val="1"/>
+      <w:numFmt w:val="bullet"/>
+      <w:lvlText w:val=""/>
+      <w:lvlJc w:val="left"/>
+      <w:pPr>
+        <w:ind w:left="7331" w:hanging="360"/>
+      </w:pPr>
+      <w:rPr>
+        <w:rFonts w:ascii="Wingdings" w:hAnsi="Wingdings" w:hint="default"/>
+      </w:rPr>
+    </w:lvl>
+  </w:abstractNum>
+  <w:abstractNum w:abstractNumId="5" w15:restartNumberingAfterBreak="0">
     <w:nsid w:val="2D8B5972"/>
     <w:multiLevelType w:val="hybridMultilevel"/>
     <w:tmpl w:val="63D41E74"/>
@@ -4942,7 +5262,7 @@
       </w:rPr>
     </w:lvl>
   </w:abstractNum>
-  <w:abstractNum w:abstractNumId="5" w15:restartNumberingAfterBreak="0">
+  <w:abstractNum w:abstractNumId="6" w15:restartNumberingAfterBreak="0">
     <w:nsid w:val="2E4AB3C5"/>
     <w:multiLevelType w:val="hybridMultilevel"/>
     <w:tmpl w:val="F78E9C6C"/>
@@ -5055,7 +5375,346 @@
       </w:rPr>
     </w:lvl>
   </w:abstractNum>
-  <w:abstractNum w:abstractNumId="6" w15:restartNumberingAfterBreak="0">
+  <w:abstractNum w:abstractNumId="7" w15:restartNumberingAfterBreak="0">
+    <w:nsid w:val="2E580FDE"/>
+    <w:multiLevelType w:val="multilevel"/>
+    <w:tmpl w:val="C7127E38"/>
+    <w:lvl w:ilvl="0">
+      <w:start w:val="1"/>
+      <w:numFmt w:val="decimal"/>
+      <w:lvlText w:val="%1."/>
+      <w:lvlJc w:val="left"/>
+      <w:pPr>
+        <w:tabs>
+          <w:tab w:val="num" w:pos="720"/>
+        </w:tabs>
+        <w:ind w:left="720" w:hanging="360"/>
+      </w:pPr>
+    </w:lvl>
+    <w:lvl w:ilvl="1" w:tentative="1">
+      <w:start w:val="1"/>
+      <w:numFmt w:val="decimal"/>
+      <w:lvlText w:val="%2."/>
+      <w:lvlJc w:val="left"/>
+      <w:pPr>
+        <w:tabs>
+          <w:tab w:val="num" w:pos="1440"/>
+        </w:tabs>
+        <w:ind w:left="1440" w:hanging="360"/>
+      </w:pPr>
+    </w:lvl>
+    <w:lvl w:ilvl="2" w:tentative="1">
+      <w:start w:val="1"/>
+      <w:numFmt w:val="decimal"/>
+      <w:lvlText w:val="%3."/>
+      <w:lvlJc w:val="left"/>
+      <w:pPr>
+        <w:tabs>
+          <w:tab w:val="num" w:pos="2160"/>
+        </w:tabs>
+        <w:ind w:left="2160" w:hanging="360"/>
+      </w:pPr>
+    </w:lvl>
+    <w:lvl w:ilvl="3" w:tentative="1">
+      <w:start w:val="1"/>
+      <w:numFmt w:val="decimal"/>
+      <w:lvlText w:val="%4."/>
+      <w:lvlJc w:val="left"/>
+      <w:pPr>
+        <w:tabs>
+          <w:tab w:val="num" w:pos="2880"/>
+        </w:tabs>
+        <w:ind w:left="2880" w:hanging="360"/>
+      </w:pPr>
+    </w:lvl>
+    <w:lvl w:ilvl="4" w:tentative="1">
+      <w:start w:val="1"/>
+      <w:numFmt w:val="decimal"/>
+      <w:lvlText w:val="%5."/>
+      <w:lvlJc w:val="left"/>
+      <w:pPr>
+        <w:tabs>
+          <w:tab w:val="num" w:pos="3600"/>
+        </w:tabs>
+        <w:ind w:left="3600" w:hanging="360"/>
+      </w:pPr>
+    </w:lvl>
+    <w:lvl w:ilvl="5" w:tentative="1">
+      <w:start w:val="1"/>
+      <w:numFmt w:val="decimal"/>
+      <w:lvlText w:val="%6."/>
+      <w:lvlJc w:val="left"/>
+      <w:pPr>
+        <w:tabs>
+          <w:tab w:val="num" w:pos="4320"/>
+        </w:tabs>
+        <w:ind w:left="4320" w:hanging="360"/>
+      </w:pPr>
+    </w:lvl>
+    <w:lvl w:ilvl="6" w:tentative="1">
+      <w:start w:val="1"/>
+      <w:numFmt w:val="decimal"/>
+      <w:lvlText w:val="%7."/>
+      <w:lvlJc w:val="left"/>
+      <w:pPr>
+        <w:tabs>
+          <w:tab w:val="num" w:pos="5040"/>
+        </w:tabs>
+        <w:ind w:left="5040" w:hanging="360"/>
+      </w:pPr>
+    </w:lvl>
+    <w:lvl w:ilvl="7" w:tentative="1">
+      <w:start w:val="1"/>
+      <w:numFmt w:val="decimal"/>
+      <w:lvlText w:val="%8."/>
+      <w:lvlJc w:val="left"/>
+      <w:pPr>
+        <w:tabs>
+          <w:tab w:val="num" w:pos="5760"/>
+        </w:tabs>
+        <w:ind w:left="5760" w:hanging="360"/>
+      </w:pPr>
+    </w:lvl>
+    <w:lvl w:ilvl="8" w:tentative="1">
+      <w:start w:val="1"/>
+      <w:numFmt w:val="decimal"/>
+      <w:lvlText w:val="%9."/>
+      <w:lvlJc w:val="left"/>
+      <w:pPr>
+        <w:tabs>
+          <w:tab w:val="num" w:pos="6480"/>
+        </w:tabs>
+        <w:ind w:left="6480" w:hanging="360"/>
+      </w:pPr>
+    </w:lvl>
+  </w:abstractNum>
+  <w:abstractNum w:abstractNumId="8" w15:restartNumberingAfterBreak="0">
+    <w:nsid w:val="49587503"/>
+    <w:multiLevelType w:val="hybridMultilevel"/>
+    <w:tmpl w:val="775EE202"/>
+    <w:lvl w:ilvl="0" w:tplc="04160001">
+      <w:start w:val="1"/>
+      <w:numFmt w:val="bullet"/>
+      <w:lvlText w:val=""/>
+      <w:lvlJc w:val="left"/>
+      <w:pPr>
+        <w:ind w:left="1571" w:hanging="360"/>
+      </w:pPr>
+      <w:rPr>
+        <w:rFonts w:ascii="Symbol" w:hAnsi="Symbol" w:hint="default"/>
+      </w:rPr>
+    </w:lvl>
+    <w:lvl w:ilvl="1" w:tplc="04160003" w:tentative="1">
+      <w:start w:val="1"/>
+      <w:numFmt w:val="bullet"/>
+      <w:lvlText w:val="o"/>
+      <w:lvlJc w:val="left"/>
+      <w:pPr>
+        <w:ind w:left="2291" w:hanging="360"/>
+      </w:pPr>
+      <w:rPr>
+        <w:rFonts w:ascii="Courier New" w:hAnsi="Courier New" w:cs="Courier New" w:hint="default"/>
+      </w:rPr>
+    </w:lvl>
+    <w:lvl w:ilvl="2" w:tplc="04160005" w:tentative="1">
+      <w:start w:val="1"/>
+      <w:numFmt w:val="bullet"/>
+      <w:lvlText w:val=""/>
+      <w:lvlJc w:val="left"/>
+      <w:pPr>
+        <w:ind w:left="3011" w:hanging="360"/>
+      </w:pPr>
+      <w:rPr>
+        <w:rFonts w:ascii="Wingdings" w:hAnsi="Wingdings" w:hint="default"/>
+      </w:rPr>
+    </w:lvl>
+    <w:lvl w:ilvl="3" w:tplc="04160001" w:tentative="1">
+      <w:start w:val="1"/>
+      <w:numFmt w:val="bullet"/>
+      <w:lvlText w:val=""/>
+      <w:lvlJc w:val="left"/>
+      <w:pPr>
+        <w:ind w:left="3731" w:hanging="360"/>
+      </w:pPr>
+      <w:rPr>
+        <w:rFonts w:ascii="Symbol" w:hAnsi="Symbol" w:hint="default"/>
+      </w:rPr>
+    </w:lvl>
+    <w:lvl w:ilvl="4" w:tplc="04160003" w:tentative="1">
+      <w:start w:val="1"/>
+      <w:numFmt w:val="bullet"/>
+      <w:lvlText w:val="o"/>
+      <w:lvlJc w:val="left"/>
+      <w:pPr>
+        <w:ind w:left="4451" w:hanging="360"/>
+      </w:pPr>
+      <w:rPr>
+        <w:rFonts w:ascii="Courier New" w:hAnsi="Courier New" w:cs="Courier New" w:hint="default"/>
+      </w:rPr>
+    </w:lvl>
+    <w:lvl w:ilvl="5" w:tplc="04160005" w:tentative="1">
+      <w:start w:val="1"/>
+      <w:numFmt w:val="bullet"/>
+      <w:lvlText w:val=""/>
+      <w:lvlJc w:val="left"/>
+      <w:pPr>
+        <w:ind w:left="5171" w:hanging="360"/>
+      </w:pPr>
+      <w:rPr>
+        <w:rFonts w:ascii="Wingdings" w:hAnsi="Wingdings" w:hint="default"/>
+      </w:rPr>
+    </w:lvl>
+    <w:lvl w:ilvl="6" w:tplc="04160001" w:tentative="1">
+      <w:start w:val="1"/>
+      <w:numFmt w:val="bullet"/>
+      <w:lvlText w:val=""/>
+      <w:lvlJc w:val="left"/>
+      <w:pPr>
+        <w:ind w:left="5891" w:hanging="360"/>
+      </w:pPr>
+      <w:rPr>
+        <w:rFonts w:ascii="Symbol" w:hAnsi="Symbol" w:hint="default"/>
+      </w:rPr>
+    </w:lvl>
+    <w:lvl w:ilvl="7" w:tplc="04160003" w:tentative="1">
+      <w:start w:val="1"/>
+      <w:numFmt w:val="bullet"/>
+      <w:lvlText w:val="o"/>
+      <w:lvlJc w:val="left"/>
+      <w:pPr>
+        <w:ind w:left="6611" w:hanging="360"/>
+      </w:pPr>
+      <w:rPr>
+        <w:rFonts w:ascii="Courier New" w:hAnsi="Courier New" w:cs="Courier New" w:hint="default"/>
+      </w:rPr>
+    </w:lvl>
+    <w:lvl w:ilvl="8" w:tplc="04160005" w:tentative="1">
+      <w:start w:val="1"/>
+      <w:numFmt w:val="bullet"/>
+      <w:lvlText w:val=""/>
+      <w:lvlJc w:val="left"/>
+      <w:pPr>
+        <w:ind w:left="7331" w:hanging="360"/>
+      </w:pPr>
+      <w:rPr>
+        <w:rFonts w:ascii="Wingdings" w:hAnsi="Wingdings" w:hint="default"/>
+      </w:rPr>
+    </w:lvl>
+  </w:abstractNum>
+  <w:abstractNum w:abstractNumId="9" w15:restartNumberingAfterBreak="0">
+    <w:nsid w:val="52B479C2"/>
+    <w:multiLevelType w:val="hybridMultilevel"/>
+    <w:tmpl w:val="361AEDCA"/>
+    <w:lvl w:ilvl="0" w:tplc="04160001">
+      <w:start w:val="1"/>
+      <w:numFmt w:val="bullet"/>
+      <w:lvlText w:val=""/>
+      <w:lvlJc w:val="left"/>
+      <w:pPr>
+        <w:ind w:left="1571" w:hanging="360"/>
+      </w:pPr>
+      <w:rPr>
+        <w:rFonts w:ascii="Symbol" w:hAnsi="Symbol" w:hint="default"/>
+      </w:rPr>
+    </w:lvl>
+    <w:lvl w:ilvl="1" w:tplc="04160003" w:tentative="1">
+      <w:start w:val="1"/>
+      <w:numFmt w:val="bullet"/>
+      <w:lvlText w:val="o"/>
+      <w:lvlJc w:val="left"/>
+      <w:pPr>
+        <w:ind w:left="2291" w:hanging="360"/>
+      </w:pPr>
+      <w:rPr>
+        <w:rFonts w:ascii="Courier New" w:hAnsi="Courier New" w:cs="Courier New" w:hint="default"/>
+      </w:rPr>
+    </w:lvl>
+    <w:lvl w:ilvl="2" w:tplc="04160005" w:tentative="1">
+      <w:start w:val="1"/>
+      <w:numFmt w:val="bullet"/>
+      <w:lvlText w:val=""/>
+      <w:lvlJc w:val="left"/>
+      <w:pPr>
+        <w:ind w:left="3011" w:hanging="360"/>
+      </w:pPr>
+      <w:rPr>
+        <w:rFonts w:ascii="Wingdings" w:hAnsi="Wingdings" w:hint="default"/>
+      </w:rPr>
+    </w:lvl>
+    <w:lvl w:ilvl="3" w:tplc="04160001" w:tentative="1">
+      <w:start w:val="1"/>
+      <w:numFmt w:val="bullet"/>
+      <w:lvlText w:val=""/>
+      <w:lvlJc w:val="left"/>
+      <w:pPr>
+        <w:ind w:left="3731" w:hanging="360"/>
+      </w:pPr>
+      <w:rPr>
+        <w:rFonts w:ascii="Symbol" w:hAnsi="Symbol" w:hint="default"/>
+      </w:rPr>
+    </w:lvl>
+    <w:lvl w:ilvl="4" w:tplc="04160003" w:tentative="1">
+      <w:start w:val="1"/>
+      <w:numFmt w:val="bullet"/>
+      <w:lvlText w:val="o"/>
+      <w:lvlJc w:val="left"/>
+      <w:pPr>
+        <w:ind w:left="4451" w:hanging="360"/>
+      </w:pPr>
+      <w:rPr>
+        <w:rFonts w:ascii="Courier New" w:hAnsi="Courier New" w:cs="Courier New" w:hint="default"/>
+      </w:rPr>
+    </w:lvl>
+    <w:lvl w:ilvl="5" w:tplc="04160005" w:tentative="1">
+      <w:start w:val="1"/>
+      <w:numFmt w:val="bullet"/>
+      <w:lvlText w:val=""/>
+      <w:lvlJc w:val="left"/>
+      <w:pPr>
+        <w:ind w:left="5171" w:hanging="360"/>
+      </w:pPr>
+      <w:rPr>
+        <w:rFonts w:ascii="Wingdings" w:hAnsi="Wingdings" w:hint="default"/>
+      </w:rPr>
+    </w:lvl>
+    <w:lvl w:ilvl="6" w:tplc="04160001" w:tentative="1">
+      <w:start w:val="1"/>
+      <w:numFmt w:val="bullet"/>
+      <w:lvlText w:val=""/>
+      <w:lvlJc w:val="left"/>
+      <w:pPr>
+        <w:ind w:left="5891" w:hanging="360"/>
+      </w:pPr>
+      <w:rPr>
+        <w:rFonts w:ascii="Symbol" w:hAnsi="Symbol" w:hint="default"/>
+      </w:rPr>
+    </w:lvl>
+    <w:lvl w:ilvl="7" w:tplc="04160003" w:tentative="1">
+      <w:start w:val="1"/>
+      <w:numFmt w:val="bullet"/>
+      <w:lvlText w:val="o"/>
+      <w:lvlJc w:val="left"/>
+      <w:pPr>
+        <w:ind w:left="6611" w:hanging="360"/>
+      </w:pPr>
+      <w:rPr>
+        <w:rFonts w:ascii="Courier New" w:hAnsi="Courier New" w:cs="Courier New" w:hint="default"/>
+      </w:rPr>
+    </w:lvl>
+    <w:lvl w:ilvl="8" w:tplc="04160005" w:tentative="1">
+      <w:start w:val="1"/>
+      <w:numFmt w:val="bullet"/>
+      <w:lvlText w:val=""/>
+      <w:lvlJc w:val="left"/>
+      <w:pPr>
+        <w:ind w:left="7331" w:hanging="360"/>
+      </w:pPr>
+      <w:rPr>
+        <w:rFonts w:ascii="Wingdings" w:hAnsi="Wingdings" w:hint="default"/>
+      </w:rPr>
+    </w:lvl>
+  </w:abstractNum>
+  <w:abstractNum w:abstractNumId="10" w15:restartNumberingAfterBreak="0">
     <w:nsid w:val="53FA52DF"/>
     <w:multiLevelType w:val="hybridMultilevel"/>
     <w:tmpl w:val="8212948C"/>
@@ -5144,7 +5803,7 @@
       </w:pPr>
     </w:lvl>
   </w:abstractNum>
-  <w:abstractNum w:abstractNumId="7" w15:restartNumberingAfterBreak="0">
+  <w:abstractNum w:abstractNumId="11" w15:restartNumberingAfterBreak="0">
     <w:nsid w:val="5AB6F6E3"/>
     <w:multiLevelType w:val="hybridMultilevel"/>
     <w:tmpl w:val="805A867C"/>
@@ -5257,7 +5916,7 @@
       </w:rPr>
     </w:lvl>
   </w:abstractNum>
-  <w:abstractNum w:abstractNumId="8" w15:restartNumberingAfterBreak="0">
+  <w:abstractNum w:abstractNumId="12" w15:restartNumberingAfterBreak="0">
     <w:nsid w:val="5D5DC71D"/>
     <w:multiLevelType w:val="hybridMultilevel"/>
     <w:tmpl w:val="C8B6695E"/>
@@ -5370,7 +6029,7 @@
       </w:rPr>
     </w:lvl>
   </w:abstractNum>
-  <w:abstractNum w:abstractNumId="9" w15:restartNumberingAfterBreak="0">
+  <w:abstractNum w:abstractNumId="13" w15:restartNumberingAfterBreak="0">
     <w:nsid w:val="70226238"/>
     <w:multiLevelType w:val="hybridMultilevel"/>
     <w:tmpl w:val="3520886A"/>
@@ -5483,7 +6142,7 @@
       </w:rPr>
     </w:lvl>
   </w:abstractNum>
-  <w:abstractNum w:abstractNumId="10" w15:restartNumberingAfterBreak="0">
+  <w:abstractNum w:abstractNumId="14" w15:restartNumberingAfterBreak="0">
     <w:nsid w:val="78C6E0F9"/>
     <w:multiLevelType w:val="hybridMultilevel"/>
     <w:tmpl w:val="43AEB4A4"/>
@@ -5596,10 +6255,10 @@
       </w:rPr>
     </w:lvl>
   </w:abstractNum>
-  <w:abstractNum w:abstractNumId="11" w15:restartNumberingAfterBreak="0">
+  <w:abstractNum w:abstractNumId="15" w15:restartNumberingAfterBreak="0">
     <w:nsid w:val="7B007F78"/>
     <w:multiLevelType w:val="hybridMultilevel"/>
-    <w:tmpl w:val="C94CEDD8"/>
+    <w:tmpl w:val="845E85BC"/>
     <w:lvl w:ilvl="0" w:tplc="04160001">
       <w:start w:val="1"/>
       <w:numFmt w:val="bullet"/>
@@ -5709,7 +6368,7 @@
       </w:rPr>
     </w:lvl>
   </w:abstractNum>
-  <w:abstractNum w:abstractNumId="12" w15:restartNumberingAfterBreak="0">
+  <w:abstractNum w:abstractNumId="16" w15:restartNumberingAfterBreak="0">
     <w:nsid w:val="7F58207E"/>
     <w:multiLevelType w:val="hybridMultilevel"/>
     <w:tmpl w:val="8CF2AE86"/>
@@ -5826,40 +6485,52 @@
     <w:abstractNumId w:val="3"/>
   </w:num>
   <w:num w:numId="2" w16cid:durableId="1161434063">
-    <w:abstractNumId w:val="5"/>
+    <w:abstractNumId w:val="6"/>
   </w:num>
   <w:num w:numId="3" w16cid:durableId="1442452040">
     <w:abstractNumId w:val="0"/>
   </w:num>
   <w:num w:numId="4" w16cid:durableId="702219057">
-    <w:abstractNumId w:val="4"/>
+    <w:abstractNumId w:val="5"/>
   </w:num>
   <w:num w:numId="5" w16cid:durableId="792094114">
-    <w:abstractNumId w:val="8"/>
+    <w:abstractNumId w:val="12"/>
   </w:num>
   <w:num w:numId="6" w16cid:durableId="1388525438">
-    <w:abstractNumId w:val="7"/>
+    <w:abstractNumId w:val="11"/>
   </w:num>
   <w:num w:numId="7" w16cid:durableId="419562942">
-    <w:abstractNumId w:val="9"/>
+    <w:abstractNumId w:val="13"/>
   </w:num>
   <w:num w:numId="8" w16cid:durableId="769160836">
     <w:abstractNumId w:val="2"/>
   </w:num>
   <w:num w:numId="9" w16cid:durableId="142309040">
-    <w:abstractNumId w:val="10"/>
+    <w:abstractNumId w:val="14"/>
   </w:num>
   <w:num w:numId="10" w16cid:durableId="1272400176">
     <w:abstractNumId w:val="1"/>
   </w:num>
   <w:num w:numId="11" w16cid:durableId="1572545847">
-    <w:abstractNumId w:val="11"/>
+    <w:abstractNumId w:val="15"/>
   </w:num>
   <w:num w:numId="12" w16cid:durableId="1512600163">
-    <w:abstractNumId w:val="12"/>
+    <w:abstractNumId w:val="16"/>
   </w:num>
   <w:num w:numId="13" w16cid:durableId="1936130706">
-    <w:abstractNumId w:val="6"/>
+    <w:abstractNumId w:val="10"/>
+  </w:num>
+  <w:num w:numId="14" w16cid:durableId="1444807861">
+    <w:abstractNumId w:val="8"/>
+  </w:num>
+  <w:num w:numId="15" w16cid:durableId="1224297964">
+    <w:abstractNumId w:val="7"/>
+  </w:num>
+  <w:num w:numId="16" w16cid:durableId="1987321262">
+    <w:abstractNumId w:val="9"/>
+  </w:num>
+  <w:num w:numId="17" w16cid:durableId="1760560585">
+    <w:abstractNumId w:val="4"/>
   </w:num>
 </w:numbering>
 </file>
@@ -6256,7 +6927,7 @@
   <w:style w:type="paragraph" w:default="1" w:styleId="Normal">
     <w:name w:val="Normal"/>
     <w:qFormat/>
-    <w:rsid w:val="008341C6"/>
+    <w:rsid w:val="00AA0C5B"/>
     <w:pPr>
       <w:spacing w:line="360" w:lineRule="auto"/>
       <w:contextualSpacing/>
@@ -6430,7 +7101,6 @@
   <w:style w:type="character" w:default="1" w:styleId="Fontepargpadro">
     <w:name w:val="Default Paragraph Font"/>
     <w:uiPriority w:val="1"/>
-    <w:semiHidden/>
     <w:unhideWhenUsed/>
   </w:style>
   <w:style w:type="table" w:default="1" w:styleId="Tabelanormal">
@@ -7172,6 +7842,18 @@
     <w:uiPriority w:val="99"/>
     <w:qFormat/>
   </w:style>
+  <w:style w:type="character" w:styleId="MenoPendente">
+    <w:name w:val="Unresolved Mention"/>
+    <w:basedOn w:val="Fontepargpadro"/>
+    <w:uiPriority w:val="99"/>
+    <w:semiHidden/>
+    <w:unhideWhenUsed/>
+    <w:rsid w:val="00AA0C5B"/>
+    <w:rPr>
+      <w:color w:val="605E5C"/>
+      <w:shd w:val="clear" w:color="auto" w:fill="E1DFDD"/>
+    </w:rPr>
+  </w:style>
 </w:styles>
 </file>
 

</xml_diff>

<commit_message>
Enviando a documentação atualizada do projeto integrador para o Github - 13/04/2026
</commit_message>
<xml_diff>
--- a/Terceiro_Semestre/Projeto_Integrador/Documentação/Modelo_Projeto_Integrador_principal.docx
+++ b/Terceiro_Semestre/Projeto_Integrador/Documentação/Modelo_Projeto_Integrador_principal.docx
@@ -1,6 +1,6 @@
 
 <file path=word/document.xml><?xml version="1.0" encoding="utf-8"?>
-<w:document xmlns:wpc="http://schemas.microsoft.com/office/word/2010/wordprocessingCanvas" xmlns:cx="http://schemas.microsoft.com/office/drawing/2014/chartex" xmlns:cx1="http://schemas.microsoft.com/office/drawing/2015/9/8/chartex" xmlns:cx2="http://schemas.microsoft.com/office/drawing/2015/10/21/chartex" xmlns:cx3="http://schemas.microsoft.com/office/drawing/2016/5/9/chartex" xmlns:cx4="http://schemas.microsoft.com/office/drawing/2016/5/10/chartex" xmlns:cx5="http://schemas.microsoft.com/office/drawing/2016/5/11/chartex" xmlns:cx6="http://schemas.microsoft.com/office/drawing/2016/5/12/chartex" xmlns:cx7="http://schemas.microsoft.com/office/drawing/2016/5/13/chartex" xmlns:cx8="http://schemas.microsoft.com/office/drawing/2016/5/14/chartex" xmlns:mc="http://schemas.openxmlformats.org/markup-compatibility/2006" xmlns:aink="http://schemas.microsoft.com/office/drawing/2016/ink" xmlns:am3d="http://schemas.microsoft.com/office/drawing/2017/model3d" xmlns:o="urn:schemas-microsoft-com:office:office" xmlns:oel="http://schemas.microsoft.com/office/2019/extlst" xmlns:r="http://schemas.openxmlformats.org/officeDocument/2006/relationships" xmlns:m="http://schemas.openxmlformats.org/officeDocument/2006/math" xmlns:v="urn:schemas-microsoft-com:vml" xmlns:wp14="http://schemas.microsoft.com/office/word/2010/wordprocessingDrawing" xmlns:wp="http://schemas.openxmlformats.org/drawingml/2006/wordprocessingDrawing" xmlns:w10="urn:schemas-microsoft-com:office:word" xmlns:w="http://schemas.openxmlformats.org/wordprocessingml/2006/main" xmlns:w14="http://schemas.microsoft.com/office/word/2010/wordml" xmlns:w15="http://schemas.microsoft.com/office/word/2012/wordml" xmlns:w16cex="http://schemas.microsoft.com/office/word/2018/wordml/cex" xmlns:w16cid="http://schemas.microsoft.com/office/word/2016/wordml/cid" xmlns:w16="http://schemas.microsoft.com/office/word/2018/wordml" xmlns:w16du="http://schemas.microsoft.com/office/word/2023/wordml/word16du" xmlns:w16sdtdh="http://schemas.microsoft.com/office/word/2020/wordml/sdtdatahash" xmlns:w16sdtfl="http://schemas.microsoft.com/office/word/2024/wordml/sdtformatlock" xmlns:w16se="http://schemas.microsoft.com/office/word/2015/wordml/symex" xmlns:wpg="http://schemas.microsoft.com/office/word/2010/wordprocessingGroup" xmlns:wpi="http://schemas.microsoft.com/office/word/2010/wordprocessingInk" xmlns:wne="http://schemas.microsoft.com/office/word/2006/wordml" xmlns:wps="http://schemas.microsoft.com/office/word/2010/wordprocessingShape" mc:Ignorable="w14 w15 w16se w16cid w16 w16cex w16sdtdh w16sdtfl w16du wp14">
+<w:document xmlns:wpc="http://schemas.microsoft.com/office/word/2010/wordprocessingCanvas" xmlns:cx="http://schemas.microsoft.com/office/drawing/2014/chartex" xmlns:mc="http://schemas.openxmlformats.org/markup-compatibility/2006" xmlns:o="urn:schemas-microsoft-com:office:office" xmlns:r="http://schemas.openxmlformats.org/officeDocument/2006/relationships" xmlns:m="http://schemas.openxmlformats.org/officeDocument/2006/math" xmlns:v="urn:schemas-microsoft-com:vml" xmlns:wp14="http://schemas.microsoft.com/office/word/2010/wordprocessingDrawing" xmlns:wp="http://schemas.openxmlformats.org/drawingml/2006/wordprocessingDrawing" xmlns:w10="urn:schemas-microsoft-com:office:word" xmlns:w="http://schemas.openxmlformats.org/wordprocessingml/2006/main" xmlns:w14="http://schemas.microsoft.com/office/word/2010/wordml" xmlns:w15="http://schemas.microsoft.com/office/word/2012/wordml" xmlns:w16se="http://schemas.microsoft.com/office/word/2015/wordml/symex" xmlns:wpg="http://schemas.microsoft.com/office/word/2010/wordprocessingGroup" xmlns:wpi="http://schemas.microsoft.com/office/word/2010/wordprocessingInk" xmlns:wne="http://schemas.microsoft.com/office/word/2006/wordml" xmlns:wps="http://schemas.microsoft.com/office/word/2010/wordprocessingShape" mc:Ignorable="w14 w15 w16se wp14">
   <w:body>
     <w:p>
       <w:pPr>
@@ -2312,11 +2312,15 @@
     </w:p>
     <w:p>
       <w:pPr>
-        <w:ind w:left="851"/>
-        <w:jc w:val="both"/>
-      </w:pPr>
-      <w:r>
-        <w:t>Não Aplicável</w:t>
+        <w:pStyle w:val="PargrafodaLista"/>
+        <w:numPr>
+          <w:ilvl w:val="0"/>
+          <w:numId w:val="18"/>
+        </w:numPr>
+        <w:jc w:val="both"/>
+      </w:pPr>
+      <w:r>
+        <w:t>RF: Requisitos Funcionais.</w:t>
       </w:r>
     </w:p>
     <w:p>
@@ -2741,6 +2745,7 @@
       <w:r>
         <w:rPr>
           <w:noProof/>
+          <w:lang w:eastAsia="pt-BR"/>
         </w:rPr>
         <w:drawing>
           <wp:inline distT="0" distB="0" distL="0" distR="0" wp14:anchorId="36D3A9C8" wp14:editId="1BC96235">
@@ -2798,6 +2803,7 @@
       <w:r>
         <w:rPr>
           <w:noProof/>
+          <w:lang w:eastAsia="pt-BR"/>
         </w:rPr>
         <w:lastRenderedPageBreak/>
         <w:drawing>
@@ -2853,6 +2859,7 @@
       <w:r>
         <w:rPr>
           <w:noProof/>
+          <w:lang w:eastAsia="pt-BR"/>
         </w:rPr>
         <w:drawing>
           <wp:inline distT="0" distB="0" distL="0" distR="0" wp14:anchorId="1290E9B8" wp14:editId="56A4B361">
@@ -2907,6 +2914,7 @@
       <w:r>
         <w:rPr>
           <w:noProof/>
+          <w:lang w:eastAsia="pt-BR"/>
         </w:rPr>
         <w:lastRenderedPageBreak/>
         <w:drawing>
@@ -2962,6 +2970,7 @@
       <w:r>
         <w:rPr>
           <w:noProof/>
+          <w:lang w:eastAsia="pt-BR"/>
         </w:rPr>
         <w:drawing>
           <wp:inline distT="0" distB="0" distL="0" distR="0" wp14:anchorId="2CDA1436" wp14:editId="5E6FE594">
@@ -3228,13 +3237,14 @@
       <w:r>
         <w:rPr>
           <w:noProof/>
+          <w:lang w:eastAsia="pt-BR"/>
         </w:rPr>
         <w:lastRenderedPageBreak/>
         <w:drawing>
-          <wp:inline distT="0" distB="0" distL="0" distR="0" wp14:anchorId="6BBB43A5" wp14:editId="6ADCA0BC">
-            <wp:extent cx="9326615" cy="2286952"/>
-            <wp:effectExtent l="0" t="4445" r="3810" b="3810"/>
-            <wp:docPr id="1746117796" name="drawing"/>
+          <wp:inline distT="0" distB="0" distL="0" distR="0" wp14:anchorId="4811D009" wp14:editId="0150D74F">
+            <wp:extent cx="9533169" cy="2407462"/>
+            <wp:effectExtent l="317" t="0" r="0" b="0"/>
+            <wp:docPr id="1" name="Imagem 1"/>
             <wp:cNvGraphicFramePr>
               <a:graphicFrameLocks xmlns:a="http://schemas.openxmlformats.org/drawingml/2006/main" noChangeAspect="1"/>
             </wp:cNvGraphicFramePr>
@@ -3242,17 +3252,11 @@
               <a:graphicData uri="http://schemas.openxmlformats.org/drawingml/2006/picture">
                 <pic:pic xmlns:pic="http://schemas.openxmlformats.org/drawingml/2006/picture">
                   <pic:nvPicPr>
-                    <pic:cNvPr id="1746117796" name="Picture 1746117796"/>
+                    <pic:cNvPr id="1" name=""/>
                     <pic:cNvPicPr/>
                   </pic:nvPicPr>
                   <pic:blipFill>
-                    <a:blip r:embed="rId14">
-                      <a:extLst>
-                        <a:ext uri="{28A0092B-C50C-407E-A947-70E740481C1C}">
-                          <a14:useLocalDpi xmlns:a14="http://schemas.microsoft.com/office/drawing/2010/main" val="0"/>
-                        </a:ext>
-                      </a:extLst>
-                    </a:blip>
+                    <a:blip r:embed="rId14"/>
                     <a:stretch>
                       <a:fillRect/>
                     </a:stretch>
@@ -3260,7 +3264,7 @@
                   <pic:spPr>
                     <a:xfrm rot="16200000">
                       <a:off x="0" y="0"/>
-                      <a:ext cx="9326615" cy="2286952"/>
+                      <a:ext cx="9564129" cy="2415281"/>
                     </a:xfrm>
                     <a:prstGeom prst="rect">
                       <a:avLst/>
@@ -3351,12 +3355,10 @@
         <w:t xml:space="preserve">Com </w:t>
       </w:r>
       <w:proofErr w:type="spellStart"/>
-      <w:proofErr w:type="gramStart"/>
       <w:r>
         <w:t>auxilio</w:t>
       </w:r>
       <w:proofErr w:type="spellEnd"/>
-      <w:proofErr w:type="gramEnd"/>
       <w:r>
         <w:t xml:space="preserve"> do Framework .NET Core LTS 8</w:t>
       </w:r>
@@ -3716,6 +3718,7 @@
           <w:i w:val="0"/>
           <w:iCs/>
           <w:noProof/>
+          <w:lang w:eastAsia="pt-BR"/>
         </w:rPr>
         <w:drawing>
           <wp:inline distT="0" distB="0" distL="0" distR="0" wp14:anchorId="675E87CB" wp14:editId="63A21E2B">
@@ -3788,12 +3791,13 @@
           <w:i w:val="0"/>
           <w:iCs/>
           <w:noProof/>
+          <w:lang w:eastAsia="pt-BR"/>
         </w:rPr>
         <w:drawing>
-          <wp:inline distT="0" distB="0" distL="0" distR="0" wp14:anchorId="32D80AE4" wp14:editId="2F82E251">
-            <wp:extent cx="5274945" cy="3313188"/>
-            <wp:effectExtent l="0" t="0" r="1905" b="1905"/>
-            <wp:docPr id="1734109738" name="drawing"/>
+          <wp:inline distT="0" distB="0" distL="0" distR="0" wp14:anchorId="2A507CE4" wp14:editId="3E8F195F">
+            <wp:extent cx="5362575" cy="2689563"/>
+            <wp:effectExtent l="0" t="0" r="0" b="0"/>
+            <wp:docPr id="4" name="Imagem 4"/>
             <wp:cNvGraphicFramePr>
               <a:graphicFrameLocks xmlns:a="http://schemas.openxmlformats.org/drawingml/2006/main" noChangeAspect="1"/>
             </wp:cNvGraphicFramePr>
@@ -3801,11 +3805,11 @@
               <a:graphicData uri="http://schemas.openxmlformats.org/drawingml/2006/picture">
                 <pic:pic xmlns:pic="http://schemas.openxmlformats.org/drawingml/2006/picture">
                   <pic:nvPicPr>
-                    <pic:cNvPr id="1734109738" name="Picture 1734109738"/>
+                    <pic:cNvPr id="4" name="casos_de_uso_projeto_integrador.drawio.png"/>
                     <pic:cNvPicPr/>
                   </pic:nvPicPr>
                   <pic:blipFill>
-                    <a:blip r:embed="rId16" cstate="print">
+                    <a:blip r:embed="rId16">
                       <a:extLst>
                         <a:ext uri="{28A0092B-C50C-407E-A947-70E740481C1C}">
                           <a14:useLocalDpi xmlns:a14="http://schemas.microsoft.com/office/drawing/2010/main" val="0"/>
@@ -3819,7 +3823,7 @@
                   <pic:spPr>
                     <a:xfrm>
                       <a:off x="0" y="0"/>
-                      <a:ext cx="5277526" cy="3314809"/>
+                      <a:ext cx="5365686" cy="2691123"/>
                     </a:xfrm>
                     <a:prstGeom prst="rect">
                       <a:avLst/>
@@ -3831,6 +3835,8 @@
           </wp:inline>
         </w:drawing>
       </w:r>
+      <w:bookmarkStart w:id="21" w:name="_GoBack"/>
+      <w:bookmarkEnd w:id="21"/>
     </w:p>
     <w:p>
       <w:pPr>
@@ -3849,7 +3855,7 @@
           <w:i w:val="0"/>
         </w:rPr>
       </w:pPr>
-      <w:bookmarkStart w:id="21" w:name="_Toc16793"/>
+      <w:bookmarkStart w:id="22" w:name="_Toc16793"/>
       <w:r>
         <w:rPr>
           <w:i w:val="0"/>
@@ -3865,7 +3871,7 @@
         </w:rPr>
         <w:t>REQUISITOS DE BANCO DE DADOS</w:t>
       </w:r>
-      <w:bookmarkEnd w:id="21"/>
+      <w:bookmarkEnd w:id="22"/>
     </w:p>
     <w:p>
       <w:pPr>
@@ -3876,7 +3882,7 @@
           <w:iCs/>
         </w:rPr>
       </w:pPr>
-      <w:bookmarkStart w:id="22" w:name="_Toc27034"/>
+      <w:bookmarkStart w:id="23" w:name="_Toc27034"/>
       <w:r>
         <w:rPr>
           <w:i w:val="0"/>
@@ -3892,7 +3898,7 @@
         </w:rPr>
         <w:t>MODELO FÍSICO E LÓGICO DA BASE DE DADOS</w:t>
       </w:r>
-      <w:bookmarkEnd w:id="22"/>
+      <w:bookmarkEnd w:id="23"/>
     </w:p>
     <w:p>
       <w:pPr>
@@ -3911,12 +3917,13 @@
       <w:r>
         <w:rPr>
           <w:noProof/>
+          <w:lang w:eastAsia="pt-BR"/>
         </w:rPr>
         <w:drawing>
-          <wp:inline distT="0" distB="0" distL="0" distR="0" wp14:anchorId="1648F0EC" wp14:editId="7EF6CD65">
-            <wp:extent cx="4626751" cy="2470150"/>
-            <wp:effectExtent l="0" t="0" r="2540" b="6350"/>
-            <wp:docPr id="1044458984" name="drawing"/>
+          <wp:inline distT="0" distB="0" distL="0" distR="0" wp14:anchorId="220AB256" wp14:editId="70AD707B">
+            <wp:extent cx="4305300" cy="5445692"/>
+            <wp:effectExtent l="0" t="0" r="0" b="3175"/>
+            <wp:docPr id="3" name="Imagem 3"/>
             <wp:cNvGraphicFramePr>
               <a:graphicFrameLocks xmlns:a="http://schemas.openxmlformats.org/drawingml/2006/main" noChangeAspect="1"/>
             </wp:cNvGraphicFramePr>
@@ -3924,7 +3931,7 @@
               <a:graphicData uri="http://schemas.openxmlformats.org/drawingml/2006/picture">
                 <pic:pic xmlns:pic="http://schemas.openxmlformats.org/drawingml/2006/picture">
                   <pic:nvPicPr>
-                    <pic:cNvPr id="26661863" name="Picture 26661863"/>
+                    <pic:cNvPr id="3" name="Imagem 3"/>
                     <pic:cNvPicPr/>
                   </pic:nvPicPr>
                   <pic:blipFill>
@@ -3942,7 +3949,7 @@
                   <pic:spPr>
                     <a:xfrm>
                       <a:off x="0" y="0"/>
-                      <a:ext cx="4626751" cy="2470150"/>
+                      <a:ext cx="4338060" cy="5487129"/>
                     </a:xfrm>
                     <a:prstGeom prst="rect">
                       <a:avLst/>
@@ -3970,7 +3977,7 @@
           <w:iCs/>
         </w:rPr>
       </w:pPr>
-      <w:bookmarkStart w:id="23" w:name="_Toc16266"/>
+      <w:bookmarkStart w:id="24" w:name="_Toc16266"/>
       <w:r>
         <w:rPr>
           <w:i w:val="0"/>
@@ -3986,7 +3993,7 @@
         </w:rPr>
         <w:t>DICIONÁRIO DE DADOS</w:t>
       </w:r>
-      <w:bookmarkEnd w:id="23"/>
+      <w:bookmarkEnd w:id="24"/>
     </w:p>
     <w:p>
       <w:pPr>
@@ -4016,7 +4023,7 @@
           <w:iCs/>
         </w:rPr>
       </w:pPr>
-      <w:bookmarkStart w:id="24" w:name="_Toc7182"/>
+      <w:bookmarkStart w:id="25" w:name="_Toc7182"/>
       <w:r>
         <w:rPr>
           <w:i w:val="0"/>
@@ -4032,7 +4039,7 @@
         <w:tab/>
         <w:t>SCRIPTS DE CRIAÇÃO DE BANCO DE DADOS E TABELAS</w:t>
       </w:r>
-      <w:bookmarkEnd w:id="24"/>
+      <w:bookmarkEnd w:id="25"/>
     </w:p>
     <w:p>
       <w:pPr>
@@ -4065,21 +4072,21 @@
         <w:pStyle w:val="Ttulo1"/>
         <w:jc w:val="center"/>
       </w:pPr>
-      <w:bookmarkStart w:id="25" w:name="_Toc21242"/>
+      <w:bookmarkStart w:id="26" w:name="_Toc21242"/>
       <w:r>
         <w:lastRenderedPageBreak/>
         <w:t>ANEXOS</w:t>
       </w:r>
-      <w:bookmarkEnd w:id="25"/>
+      <w:bookmarkEnd w:id="26"/>
     </w:p>
     <w:p/>
     <w:p>
-      <w:bookmarkStart w:id="26" w:name="Ata_1"/>
+      <w:bookmarkStart w:id="27" w:name="Ata_1"/>
       <w:r>
         <w:t>Ata 1</w:t>
       </w:r>
     </w:p>
-    <w:bookmarkEnd w:id="26"/>
+    <w:bookmarkEnd w:id="27"/>
     <w:p>
       <w:pPr>
         <w:jc w:val="both"/>
@@ -4091,6 +4098,7 @@
         <w:rPr>
           <w:noProof/>
           <w:color w:val="F6F6F6"/>
+          <w:lang w:eastAsia="pt-BR"/>
         </w:rPr>
         <w:drawing>
           <wp:inline distT="0" distB="0" distL="0" distR="0" wp14:anchorId="2BE6FD17" wp14:editId="779DDA05">
@@ -4136,12 +4144,12 @@
       </w:r>
     </w:p>
     <w:p>
-      <w:bookmarkStart w:id="27" w:name="Ata_2"/>
+      <w:bookmarkStart w:id="28" w:name="Ata_2"/>
       <w:r>
         <w:t>Ata 2</w:t>
       </w:r>
     </w:p>
-    <w:bookmarkEnd w:id="27"/>
+    <w:bookmarkEnd w:id="28"/>
     <w:p>
       <w:pPr>
         <w:jc w:val="both"/>
@@ -4153,6 +4161,7 @@
         <w:rPr>
           <w:noProof/>
           <w:color w:val="F6F6F6"/>
+          <w:lang w:eastAsia="pt-BR"/>
         </w:rPr>
         <w:drawing>
           <wp:inline distT="0" distB="0" distL="0" distR="0" wp14:anchorId="1ABEE6C4" wp14:editId="46424770">
@@ -4216,7 +4225,7 @@
       <w:pPr>
         <w:jc w:val="both"/>
       </w:pPr>
-      <w:bookmarkStart w:id="28" w:name="Ata_3"/>
+      <w:bookmarkStart w:id="29" w:name="Ata_3"/>
       <w:r>
         <w:t>Ata</w:t>
       </w:r>
@@ -4224,7 +4233,7 @@
         <w:t xml:space="preserve"> 3</w:t>
       </w:r>
     </w:p>
-    <w:bookmarkEnd w:id="28"/>
+    <w:bookmarkEnd w:id="29"/>
     <w:p>
       <w:pPr>
         <w:jc w:val="both"/>
@@ -4232,6 +4241,7 @@
       <w:r>
         <w:rPr>
           <w:noProof/>
+          <w:lang w:eastAsia="pt-BR"/>
         </w:rPr>
         <w:drawing>
           <wp:inline distT="0" distB="0" distL="0" distR="0" wp14:anchorId="464CB106" wp14:editId="337CE74B">
@@ -4280,12 +4290,12 @@
       <w:pPr>
         <w:jc w:val="both"/>
       </w:pPr>
-      <w:bookmarkStart w:id="29" w:name="Ata_4"/>
+      <w:bookmarkStart w:id="30" w:name="Ata_4"/>
       <w:r>
         <w:t>Ata 4</w:t>
       </w:r>
     </w:p>
-    <w:bookmarkEnd w:id="29"/>
+    <w:bookmarkEnd w:id="30"/>
     <w:p>
       <w:pPr>
         <w:jc w:val="both"/>
@@ -4293,6 +4303,7 @@
       <w:r>
         <w:rPr>
           <w:noProof/>
+          <w:lang w:eastAsia="pt-BR"/>
         </w:rPr>
         <w:drawing>
           <wp:inline distT="0" distB="0" distL="0" distR="0" wp14:anchorId="58EEF04F" wp14:editId="1AD17F8D">
@@ -4341,16 +4352,17 @@
     <w:p/>
     <w:p/>
     <w:p>
-      <w:bookmarkStart w:id="30" w:name="Ata_5"/>
+      <w:bookmarkStart w:id="31" w:name="Ata_5"/>
       <w:r>
         <w:t>Ata 5</w:t>
       </w:r>
     </w:p>
-    <w:bookmarkEnd w:id="30"/>
+    <w:bookmarkEnd w:id="31"/>
     <w:p>
       <w:r>
         <w:rPr>
           <w:noProof/>
+          <w:lang w:eastAsia="pt-BR"/>
         </w:rPr>
         <w:drawing>
           <wp:inline distT="0" distB="0" distL="0" distR="0" wp14:anchorId="7D1B9FBA" wp14:editId="11F39F5E">
@@ -4399,6 +4411,7 @@
       <w:r>
         <w:rPr>
           <w:noProof/>
+          <w:lang w:eastAsia="pt-BR"/>
         </w:rPr>
         <w:drawing>
           <wp:inline distT="0" distB="0" distL="0" distR="0" wp14:anchorId="786C168F" wp14:editId="21DE2629">
@@ -4455,7 +4468,7 @@
 </file>
 
 <file path=word/endnotes.xml><?xml version="1.0" encoding="utf-8"?>
-<w:endnotes xmlns:wpc="http://schemas.microsoft.com/office/word/2010/wordprocessingCanvas" xmlns:cx="http://schemas.microsoft.com/office/drawing/2014/chartex" xmlns:cx1="http://schemas.microsoft.com/office/drawing/2015/9/8/chartex" xmlns:cx2="http://schemas.microsoft.com/office/drawing/2015/10/21/chartex" xmlns:cx3="http://schemas.microsoft.com/office/drawing/2016/5/9/chartex" xmlns:cx4="http://schemas.microsoft.com/office/drawing/2016/5/10/chartex" xmlns:cx5="http://schemas.microsoft.com/office/drawing/2016/5/11/chartex" xmlns:cx6="http://schemas.microsoft.com/office/drawing/2016/5/12/chartex" xmlns:cx7="http://schemas.microsoft.com/office/drawing/2016/5/13/chartex" xmlns:cx8="http://schemas.microsoft.com/office/drawing/2016/5/14/chartex" xmlns:mc="http://schemas.openxmlformats.org/markup-compatibility/2006" xmlns:aink="http://schemas.microsoft.com/office/drawing/2016/ink" xmlns:am3d="http://schemas.microsoft.com/office/drawing/2017/model3d" xmlns:o="urn:schemas-microsoft-com:office:office" xmlns:oel="http://schemas.microsoft.com/office/2019/extlst" xmlns:r="http://schemas.openxmlformats.org/officeDocument/2006/relationships" xmlns:m="http://schemas.openxmlformats.org/officeDocument/2006/math" xmlns:v="urn:schemas-microsoft-com:vml" xmlns:wp14="http://schemas.microsoft.com/office/word/2010/wordprocessingDrawing" xmlns:wp="http://schemas.openxmlformats.org/drawingml/2006/wordprocessingDrawing" xmlns:w10="urn:schemas-microsoft-com:office:word" xmlns:w="http://schemas.openxmlformats.org/wordprocessingml/2006/main" xmlns:w14="http://schemas.microsoft.com/office/word/2010/wordml" xmlns:w15="http://schemas.microsoft.com/office/word/2012/wordml" xmlns:w16cex="http://schemas.microsoft.com/office/word/2018/wordml/cex" xmlns:w16cid="http://schemas.microsoft.com/office/word/2016/wordml/cid" xmlns:w16="http://schemas.microsoft.com/office/word/2018/wordml" xmlns:w16du="http://schemas.microsoft.com/office/word/2023/wordml/word16du" xmlns:w16sdtdh="http://schemas.microsoft.com/office/word/2020/wordml/sdtdatahash" xmlns:w16sdtfl="http://schemas.microsoft.com/office/word/2024/wordml/sdtformatlock" xmlns:w16se="http://schemas.microsoft.com/office/word/2015/wordml/symex" xmlns:wpg="http://schemas.microsoft.com/office/word/2010/wordprocessingGroup" xmlns:wpi="http://schemas.microsoft.com/office/word/2010/wordprocessingInk" xmlns:wne="http://schemas.microsoft.com/office/word/2006/wordml" xmlns:wps="http://schemas.microsoft.com/office/word/2010/wordprocessingShape" mc:Ignorable="w14 w15 w16se w16cid w16 w16cex w16sdtdh w16sdtfl w16du wp14">
+<w:endnotes xmlns:wpc="http://schemas.microsoft.com/office/word/2010/wordprocessingCanvas" xmlns:cx="http://schemas.microsoft.com/office/drawing/2014/chartex" xmlns:mc="http://schemas.openxmlformats.org/markup-compatibility/2006" xmlns:o="urn:schemas-microsoft-com:office:office" xmlns:r="http://schemas.openxmlformats.org/officeDocument/2006/relationships" xmlns:m="http://schemas.openxmlformats.org/officeDocument/2006/math" xmlns:v="urn:schemas-microsoft-com:vml" xmlns:wp14="http://schemas.microsoft.com/office/word/2010/wordprocessingDrawing" xmlns:wp="http://schemas.openxmlformats.org/drawingml/2006/wordprocessingDrawing" xmlns:w10="urn:schemas-microsoft-com:office:word" xmlns:w="http://schemas.openxmlformats.org/wordprocessingml/2006/main" xmlns:w14="http://schemas.microsoft.com/office/word/2010/wordml" xmlns:w15="http://schemas.microsoft.com/office/word/2012/wordml" xmlns:w16se="http://schemas.microsoft.com/office/word/2015/wordml/symex" xmlns:wpg="http://schemas.microsoft.com/office/word/2010/wordprocessingGroup" xmlns:wpi="http://schemas.microsoft.com/office/word/2010/wordprocessingInk" xmlns:wne="http://schemas.microsoft.com/office/word/2006/wordml" xmlns:wps="http://schemas.microsoft.com/office/word/2010/wordprocessingShape" mc:Ignorable="w14 w15 w16se wp14">
   <w:endnote w:type="separator" w:id="-1">
     <w:p>
       <w:pPr>
@@ -4480,7 +4493,7 @@
 </file>
 
 <file path=word/footer1.xml><?xml version="1.0" encoding="utf-8"?>
-<w:ftr xmlns:wpc="http://schemas.microsoft.com/office/word/2010/wordprocessingCanvas" xmlns:cx="http://schemas.microsoft.com/office/drawing/2014/chartex" xmlns:cx1="http://schemas.microsoft.com/office/drawing/2015/9/8/chartex" xmlns:cx2="http://schemas.microsoft.com/office/drawing/2015/10/21/chartex" xmlns:cx3="http://schemas.microsoft.com/office/drawing/2016/5/9/chartex" xmlns:cx4="http://schemas.microsoft.com/office/drawing/2016/5/10/chartex" xmlns:cx5="http://schemas.microsoft.com/office/drawing/2016/5/11/chartex" xmlns:cx6="http://schemas.microsoft.com/office/drawing/2016/5/12/chartex" xmlns:cx7="http://schemas.microsoft.com/office/drawing/2016/5/13/chartex" xmlns:cx8="http://schemas.microsoft.com/office/drawing/2016/5/14/chartex" xmlns:mc="http://schemas.openxmlformats.org/markup-compatibility/2006" xmlns:aink="http://schemas.microsoft.com/office/drawing/2016/ink" xmlns:am3d="http://schemas.microsoft.com/office/drawing/2017/model3d" xmlns:o="urn:schemas-microsoft-com:office:office" xmlns:oel="http://schemas.microsoft.com/office/2019/extlst" xmlns:r="http://schemas.openxmlformats.org/officeDocument/2006/relationships" xmlns:m="http://schemas.openxmlformats.org/officeDocument/2006/math" xmlns:v="urn:schemas-microsoft-com:vml" xmlns:wp14="http://schemas.microsoft.com/office/word/2010/wordprocessingDrawing" xmlns:wp="http://schemas.openxmlformats.org/drawingml/2006/wordprocessingDrawing" xmlns:w10="urn:schemas-microsoft-com:office:word" xmlns:w="http://schemas.openxmlformats.org/wordprocessingml/2006/main" xmlns:w14="http://schemas.microsoft.com/office/word/2010/wordml" xmlns:w15="http://schemas.microsoft.com/office/word/2012/wordml" xmlns:w16cex="http://schemas.microsoft.com/office/word/2018/wordml/cex" xmlns:w16cid="http://schemas.microsoft.com/office/word/2016/wordml/cid" xmlns:w16="http://schemas.microsoft.com/office/word/2018/wordml" xmlns:w16du="http://schemas.microsoft.com/office/word/2023/wordml/word16du" xmlns:w16sdtdh="http://schemas.microsoft.com/office/word/2020/wordml/sdtdatahash" xmlns:w16sdtfl="http://schemas.microsoft.com/office/word/2024/wordml/sdtformatlock" xmlns:w16se="http://schemas.microsoft.com/office/word/2015/wordml/symex" xmlns:wpg="http://schemas.microsoft.com/office/word/2010/wordprocessingGroup" xmlns:wpi="http://schemas.microsoft.com/office/word/2010/wordprocessingInk" xmlns:wne="http://schemas.microsoft.com/office/word/2006/wordml" xmlns:wps="http://schemas.microsoft.com/office/word/2010/wordprocessingShape" mc:Ignorable="w14 w15 w16se w16cid w16 w16cex w16sdtdh w16sdtfl w16du wp14">
+<w:ftr xmlns:wpc="http://schemas.microsoft.com/office/word/2010/wordprocessingCanvas" xmlns:cx="http://schemas.microsoft.com/office/drawing/2014/chartex" xmlns:mc="http://schemas.openxmlformats.org/markup-compatibility/2006" xmlns:o="urn:schemas-microsoft-com:office:office" xmlns:r="http://schemas.openxmlformats.org/officeDocument/2006/relationships" xmlns:m="http://schemas.openxmlformats.org/officeDocument/2006/math" xmlns:v="urn:schemas-microsoft-com:vml" xmlns:wp14="http://schemas.microsoft.com/office/word/2010/wordprocessingDrawing" xmlns:wp="http://schemas.openxmlformats.org/drawingml/2006/wordprocessingDrawing" xmlns:w10="urn:schemas-microsoft-com:office:word" xmlns:w="http://schemas.openxmlformats.org/wordprocessingml/2006/main" xmlns:w14="http://schemas.microsoft.com/office/word/2010/wordml" xmlns:w15="http://schemas.microsoft.com/office/word/2012/wordml" xmlns:w16se="http://schemas.microsoft.com/office/word/2015/wordml/symex" xmlns:wpg="http://schemas.microsoft.com/office/word/2010/wordprocessingGroup" xmlns:wpi="http://schemas.microsoft.com/office/word/2010/wordprocessingInk" xmlns:wne="http://schemas.microsoft.com/office/word/2006/wordml" xmlns:wps="http://schemas.microsoft.com/office/word/2010/wordprocessingShape" mc:Ignorable="w14 w15 w16se wp14">
   <w:p>
     <w:pPr>
       <w:pStyle w:val="Rodap"/>
@@ -4490,7 +4503,7 @@
 </file>
 
 <file path=word/footnotes.xml><?xml version="1.0" encoding="utf-8"?>
-<w:footnotes xmlns:wpc="http://schemas.microsoft.com/office/word/2010/wordprocessingCanvas" xmlns:cx="http://schemas.microsoft.com/office/drawing/2014/chartex" xmlns:cx1="http://schemas.microsoft.com/office/drawing/2015/9/8/chartex" xmlns:cx2="http://schemas.microsoft.com/office/drawing/2015/10/21/chartex" xmlns:cx3="http://schemas.microsoft.com/office/drawing/2016/5/9/chartex" xmlns:cx4="http://schemas.microsoft.com/office/drawing/2016/5/10/chartex" xmlns:cx5="http://schemas.microsoft.com/office/drawing/2016/5/11/chartex" xmlns:cx6="http://schemas.microsoft.com/office/drawing/2016/5/12/chartex" xmlns:cx7="http://schemas.microsoft.com/office/drawing/2016/5/13/chartex" xmlns:cx8="http://schemas.microsoft.com/office/drawing/2016/5/14/chartex" xmlns:mc="http://schemas.openxmlformats.org/markup-compatibility/2006" xmlns:aink="http://schemas.microsoft.com/office/drawing/2016/ink" xmlns:am3d="http://schemas.microsoft.com/office/drawing/2017/model3d" xmlns:o="urn:schemas-microsoft-com:office:office" xmlns:oel="http://schemas.microsoft.com/office/2019/extlst" xmlns:r="http://schemas.openxmlformats.org/officeDocument/2006/relationships" xmlns:m="http://schemas.openxmlformats.org/officeDocument/2006/math" xmlns:v="urn:schemas-microsoft-com:vml" xmlns:wp14="http://schemas.microsoft.com/office/word/2010/wordprocessingDrawing" xmlns:wp="http://schemas.openxmlformats.org/drawingml/2006/wordprocessingDrawing" xmlns:w10="urn:schemas-microsoft-com:office:word" xmlns:w="http://schemas.openxmlformats.org/wordprocessingml/2006/main" xmlns:w14="http://schemas.microsoft.com/office/word/2010/wordml" xmlns:w15="http://schemas.microsoft.com/office/word/2012/wordml" xmlns:w16cex="http://schemas.microsoft.com/office/word/2018/wordml/cex" xmlns:w16cid="http://schemas.microsoft.com/office/word/2016/wordml/cid" xmlns:w16="http://schemas.microsoft.com/office/word/2018/wordml" xmlns:w16du="http://schemas.microsoft.com/office/word/2023/wordml/word16du" xmlns:w16sdtdh="http://schemas.microsoft.com/office/word/2020/wordml/sdtdatahash" xmlns:w16sdtfl="http://schemas.microsoft.com/office/word/2024/wordml/sdtformatlock" xmlns:w16se="http://schemas.microsoft.com/office/word/2015/wordml/symex" xmlns:wpg="http://schemas.microsoft.com/office/word/2010/wordprocessingGroup" xmlns:wpi="http://schemas.microsoft.com/office/word/2010/wordprocessingInk" xmlns:wne="http://schemas.microsoft.com/office/word/2006/wordml" xmlns:wps="http://schemas.microsoft.com/office/word/2010/wordprocessingShape" mc:Ignorable="w14 w15 w16se w16cid w16 w16cex w16sdtdh w16sdtfl w16du wp14">
+<w:footnotes xmlns:wpc="http://schemas.microsoft.com/office/word/2010/wordprocessingCanvas" xmlns:cx="http://schemas.microsoft.com/office/drawing/2014/chartex" xmlns:mc="http://schemas.openxmlformats.org/markup-compatibility/2006" xmlns:o="urn:schemas-microsoft-com:office:office" xmlns:r="http://schemas.openxmlformats.org/officeDocument/2006/relationships" xmlns:m="http://schemas.openxmlformats.org/officeDocument/2006/math" xmlns:v="urn:schemas-microsoft-com:vml" xmlns:wp14="http://schemas.microsoft.com/office/word/2010/wordprocessingDrawing" xmlns:wp="http://schemas.openxmlformats.org/drawingml/2006/wordprocessingDrawing" xmlns:w10="urn:schemas-microsoft-com:office:word" xmlns:w="http://schemas.openxmlformats.org/wordprocessingml/2006/main" xmlns:w14="http://schemas.microsoft.com/office/word/2010/wordml" xmlns:w15="http://schemas.microsoft.com/office/word/2012/wordml" xmlns:w16se="http://schemas.microsoft.com/office/word/2015/wordml/symex" xmlns:wpg="http://schemas.microsoft.com/office/word/2010/wordprocessingGroup" xmlns:wpi="http://schemas.microsoft.com/office/word/2010/wordprocessingInk" xmlns:wne="http://schemas.microsoft.com/office/word/2006/wordml" xmlns:wps="http://schemas.microsoft.com/office/word/2010/wordprocessingShape" mc:Ignorable="w14 w15 w16se wp14">
   <w:footnote w:type="separator" w:id="-1">
     <w:p>
       <w:r>
@@ -4509,7 +4522,7 @@
 </file>
 
 <file path=word/header1.xml><?xml version="1.0" encoding="utf-8"?>
-<w:hdr xmlns:wpc="http://schemas.microsoft.com/office/word/2010/wordprocessingCanvas" xmlns:cx="http://schemas.microsoft.com/office/drawing/2014/chartex" xmlns:cx1="http://schemas.microsoft.com/office/drawing/2015/9/8/chartex" xmlns:cx2="http://schemas.microsoft.com/office/drawing/2015/10/21/chartex" xmlns:cx3="http://schemas.microsoft.com/office/drawing/2016/5/9/chartex" xmlns:cx4="http://schemas.microsoft.com/office/drawing/2016/5/10/chartex" xmlns:cx5="http://schemas.microsoft.com/office/drawing/2016/5/11/chartex" xmlns:cx6="http://schemas.microsoft.com/office/drawing/2016/5/12/chartex" xmlns:cx7="http://schemas.microsoft.com/office/drawing/2016/5/13/chartex" xmlns:cx8="http://schemas.microsoft.com/office/drawing/2016/5/14/chartex" xmlns:mc="http://schemas.openxmlformats.org/markup-compatibility/2006" xmlns:aink="http://schemas.microsoft.com/office/drawing/2016/ink" xmlns:am3d="http://schemas.microsoft.com/office/drawing/2017/model3d" xmlns:o="urn:schemas-microsoft-com:office:office" xmlns:oel="http://schemas.microsoft.com/office/2019/extlst" xmlns:r="http://schemas.openxmlformats.org/officeDocument/2006/relationships" xmlns:m="http://schemas.openxmlformats.org/officeDocument/2006/math" xmlns:v="urn:schemas-microsoft-com:vml" xmlns:wp14="http://schemas.microsoft.com/office/word/2010/wordprocessingDrawing" xmlns:wp="http://schemas.openxmlformats.org/drawingml/2006/wordprocessingDrawing" xmlns:w10="urn:schemas-microsoft-com:office:word" xmlns:w="http://schemas.openxmlformats.org/wordprocessingml/2006/main" xmlns:w14="http://schemas.microsoft.com/office/word/2010/wordml" xmlns:w15="http://schemas.microsoft.com/office/word/2012/wordml" xmlns:w16cex="http://schemas.microsoft.com/office/word/2018/wordml/cex" xmlns:w16cid="http://schemas.microsoft.com/office/word/2016/wordml/cid" xmlns:w16="http://schemas.microsoft.com/office/word/2018/wordml" xmlns:w16du="http://schemas.microsoft.com/office/word/2023/wordml/word16du" xmlns:w16sdtdh="http://schemas.microsoft.com/office/word/2020/wordml/sdtdatahash" xmlns:w16sdtfl="http://schemas.microsoft.com/office/word/2024/wordml/sdtformatlock" xmlns:w16se="http://schemas.microsoft.com/office/word/2015/wordml/symex" xmlns:wpg="http://schemas.microsoft.com/office/word/2010/wordprocessingGroup" xmlns:wpi="http://schemas.microsoft.com/office/word/2010/wordprocessingInk" xmlns:wne="http://schemas.microsoft.com/office/word/2006/wordml" xmlns:wps="http://schemas.microsoft.com/office/word/2010/wordprocessingShape" mc:Ignorable="w14 w15 w16se w16cid w16 w16cex w16sdtdh w16sdtfl w16du wp14">
+<w:hdr xmlns:wpc="http://schemas.microsoft.com/office/word/2010/wordprocessingCanvas" xmlns:cx="http://schemas.microsoft.com/office/drawing/2014/chartex" xmlns:mc="http://schemas.openxmlformats.org/markup-compatibility/2006" xmlns:o="urn:schemas-microsoft-com:office:office" xmlns:r="http://schemas.openxmlformats.org/officeDocument/2006/relationships" xmlns:m="http://schemas.openxmlformats.org/officeDocument/2006/math" xmlns:v="urn:schemas-microsoft-com:vml" xmlns:wp14="http://schemas.microsoft.com/office/word/2010/wordprocessingDrawing" xmlns:wp="http://schemas.openxmlformats.org/drawingml/2006/wordprocessingDrawing" xmlns:w10="urn:schemas-microsoft-com:office:word" xmlns:w="http://schemas.openxmlformats.org/wordprocessingml/2006/main" xmlns:w14="http://schemas.microsoft.com/office/word/2010/wordml" xmlns:w15="http://schemas.microsoft.com/office/word/2012/wordml" xmlns:w16se="http://schemas.microsoft.com/office/word/2015/wordml/symex" xmlns:wpg="http://schemas.microsoft.com/office/word/2010/wordprocessingGroup" xmlns:wpi="http://schemas.microsoft.com/office/word/2010/wordprocessingInk" xmlns:wne="http://schemas.microsoft.com/office/word/2006/wordml" xmlns:wps="http://schemas.microsoft.com/office/word/2010/wordprocessingShape" mc:Ignorable="w14 w15 w16se wp14">
   <w:p>
     <w:pPr>
       <w:pStyle w:val="Cabealho"/>
@@ -4525,7 +4538,7 @@
 </file>
 
 <file path=word/header2.xml><?xml version="1.0" encoding="utf-8"?>
-<w:hdr xmlns:wpc="http://schemas.microsoft.com/office/word/2010/wordprocessingCanvas" xmlns:cx="http://schemas.microsoft.com/office/drawing/2014/chartex" xmlns:cx1="http://schemas.microsoft.com/office/drawing/2015/9/8/chartex" xmlns:cx2="http://schemas.microsoft.com/office/drawing/2015/10/21/chartex" xmlns:cx3="http://schemas.microsoft.com/office/drawing/2016/5/9/chartex" xmlns:cx4="http://schemas.microsoft.com/office/drawing/2016/5/10/chartex" xmlns:cx5="http://schemas.microsoft.com/office/drawing/2016/5/11/chartex" xmlns:cx6="http://schemas.microsoft.com/office/drawing/2016/5/12/chartex" xmlns:cx7="http://schemas.microsoft.com/office/drawing/2016/5/13/chartex" xmlns:cx8="http://schemas.microsoft.com/office/drawing/2016/5/14/chartex" xmlns:mc="http://schemas.openxmlformats.org/markup-compatibility/2006" xmlns:aink="http://schemas.microsoft.com/office/drawing/2016/ink" xmlns:am3d="http://schemas.microsoft.com/office/drawing/2017/model3d" xmlns:o="urn:schemas-microsoft-com:office:office" xmlns:oel="http://schemas.microsoft.com/office/2019/extlst" xmlns:r="http://schemas.openxmlformats.org/officeDocument/2006/relationships" xmlns:m="http://schemas.openxmlformats.org/officeDocument/2006/math" xmlns:v="urn:schemas-microsoft-com:vml" xmlns:wp14="http://schemas.microsoft.com/office/word/2010/wordprocessingDrawing" xmlns:wp="http://schemas.openxmlformats.org/drawingml/2006/wordprocessingDrawing" xmlns:w10="urn:schemas-microsoft-com:office:word" xmlns:w="http://schemas.openxmlformats.org/wordprocessingml/2006/main" xmlns:w14="http://schemas.microsoft.com/office/word/2010/wordml" xmlns:w15="http://schemas.microsoft.com/office/word/2012/wordml" xmlns:w16cex="http://schemas.microsoft.com/office/word/2018/wordml/cex" xmlns:w16cid="http://schemas.microsoft.com/office/word/2016/wordml/cid" xmlns:w16="http://schemas.microsoft.com/office/word/2018/wordml" xmlns:w16du="http://schemas.microsoft.com/office/word/2023/wordml/word16du" xmlns:w16sdtdh="http://schemas.microsoft.com/office/word/2020/wordml/sdtdatahash" xmlns:w16sdtfl="http://schemas.microsoft.com/office/word/2024/wordml/sdtformatlock" xmlns:w16se="http://schemas.microsoft.com/office/word/2015/wordml/symex" xmlns:wpg="http://schemas.microsoft.com/office/word/2010/wordprocessingGroup" xmlns:wpi="http://schemas.microsoft.com/office/word/2010/wordprocessingInk" xmlns:wne="http://schemas.microsoft.com/office/word/2006/wordml" xmlns:wps="http://schemas.microsoft.com/office/word/2010/wordprocessingShape" mc:Ignorable="w14 w15 w16se w16cid w16 w16cex w16sdtdh w16sdtfl w16du wp14">
+<w:hdr xmlns:wpc="http://schemas.microsoft.com/office/word/2010/wordprocessingCanvas" xmlns:cx="http://schemas.microsoft.com/office/drawing/2014/chartex" xmlns:mc="http://schemas.openxmlformats.org/markup-compatibility/2006" xmlns:o="urn:schemas-microsoft-com:office:office" xmlns:r="http://schemas.openxmlformats.org/officeDocument/2006/relationships" xmlns:m="http://schemas.openxmlformats.org/officeDocument/2006/math" xmlns:v="urn:schemas-microsoft-com:vml" xmlns:wp14="http://schemas.microsoft.com/office/word/2010/wordprocessingDrawing" xmlns:wp="http://schemas.openxmlformats.org/drawingml/2006/wordprocessingDrawing" xmlns:w10="urn:schemas-microsoft-com:office:word" xmlns:w="http://schemas.openxmlformats.org/wordprocessingml/2006/main" xmlns:w14="http://schemas.microsoft.com/office/word/2010/wordml" xmlns:w15="http://schemas.microsoft.com/office/word/2012/wordml" xmlns:w16se="http://schemas.microsoft.com/office/word/2015/wordml/symex" xmlns:wpg="http://schemas.microsoft.com/office/word/2010/wordprocessingGroup" xmlns:wpi="http://schemas.microsoft.com/office/word/2010/wordprocessingInk" xmlns:wne="http://schemas.microsoft.com/office/word/2006/wordml" xmlns:wps="http://schemas.microsoft.com/office/word/2010/wordprocessingShape" mc:Ignorable="w14 w15 w16se wp14">
   <w:sdt>
     <w:sdtPr>
       <w:id w:val="-1699001773"/>
@@ -4569,10 +4582,11 @@
         </w:r>
         <w:r>
           <w:rPr>
+            <w:noProof/>
             <w:sz w:val="20"/>
             <w:szCs w:val="20"/>
           </w:rPr>
-          <w:t>15</w:t>
+          <w:t>13</w:t>
         </w:r>
         <w:r>
           <w:rPr>
@@ -4593,7 +4607,7 @@
 </file>
 
 <file path=word/header3.xml><?xml version="1.0" encoding="utf-8"?>
-<w:hdr xmlns:wpc="http://schemas.microsoft.com/office/word/2010/wordprocessingCanvas" xmlns:cx="http://schemas.microsoft.com/office/drawing/2014/chartex" xmlns:cx1="http://schemas.microsoft.com/office/drawing/2015/9/8/chartex" xmlns:cx2="http://schemas.microsoft.com/office/drawing/2015/10/21/chartex" xmlns:cx3="http://schemas.microsoft.com/office/drawing/2016/5/9/chartex" xmlns:cx4="http://schemas.microsoft.com/office/drawing/2016/5/10/chartex" xmlns:cx5="http://schemas.microsoft.com/office/drawing/2016/5/11/chartex" xmlns:cx6="http://schemas.microsoft.com/office/drawing/2016/5/12/chartex" xmlns:cx7="http://schemas.microsoft.com/office/drawing/2016/5/13/chartex" xmlns:cx8="http://schemas.microsoft.com/office/drawing/2016/5/14/chartex" xmlns:mc="http://schemas.openxmlformats.org/markup-compatibility/2006" xmlns:aink="http://schemas.microsoft.com/office/drawing/2016/ink" xmlns:am3d="http://schemas.microsoft.com/office/drawing/2017/model3d" xmlns:o="urn:schemas-microsoft-com:office:office" xmlns:oel="http://schemas.microsoft.com/office/2019/extlst" xmlns:r="http://schemas.openxmlformats.org/officeDocument/2006/relationships" xmlns:m="http://schemas.openxmlformats.org/officeDocument/2006/math" xmlns:v="urn:schemas-microsoft-com:vml" xmlns:wp14="http://schemas.microsoft.com/office/word/2010/wordprocessingDrawing" xmlns:wp="http://schemas.openxmlformats.org/drawingml/2006/wordprocessingDrawing" xmlns:w10="urn:schemas-microsoft-com:office:word" xmlns:w="http://schemas.openxmlformats.org/wordprocessingml/2006/main" xmlns:w14="http://schemas.microsoft.com/office/word/2010/wordml" xmlns:w15="http://schemas.microsoft.com/office/word/2012/wordml" xmlns:w16cex="http://schemas.microsoft.com/office/word/2018/wordml/cex" xmlns:w16cid="http://schemas.microsoft.com/office/word/2016/wordml/cid" xmlns:w16="http://schemas.microsoft.com/office/word/2018/wordml" xmlns:w16du="http://schemas.microsoft.com/office/word/2023/wordml/word16du" xmlns:w16sdtdh="http://schemas.microsoft.com/office/word/2020/wordml/sdtdatahash" xmlns:w16sdtfl="http://schemas.microsoft.com/office/word/2024/wordml/sdtformatlock" xmlns:w16se="http://schemas.microsoft.com/office/word/2015/wordml/symex" xmlns:wpg="http://schemas.microsoft.com/office/word/2010/wordprocessingGroup" xmlns:wpi="http://schemas.microsoft.com/office/word/2010/wordprocessingInk" xmlns:wne="http://schemas.microsoft.com/office/word/2006/wordml" xmlns:wps="http://schemas.microsoft.com/office/word/2010/wordprocessingShape" mc:Ignorable="w14 w15 w16se w16cid w16 w16cex w16sdtdh w16sdtfl w16du wp14">
+<w:hdr xmlns:wpc="http://schemas.microsoft.com/office/word/2010/wordprocessingCanvas" xmlns:cx="http://schemas.microsoft.com/office/drawing/2014/chartex" xmlns:mc="http://schemas.openxmlformats.org/markup-compatibility/2006" xmlns:o="urn:schemas-microsoft-com:office:office" xmlns:r="http://schemas.openxmlformats.org/officeDocument/2006/relationships" xmlns:m="http://schemas.openxmlformats.org/officeDocument/2006/math" xmlns:v="urn:schemas-microsoft-com:vml" xmlns:wp14="http://schemas.microsoft.com/office/word/2010/wordprocessingDrawing" xmlns:wp="http://schemas.openxmlformats.org/drawingml/2006/wordprocessingDrawing" xmlns:w10="urn:schemas-microsoft-com:office:word" xmlns:w="http://schemas.openxmlformats.org/wordprocessingml/2006/main" xmlns:w14="http://schemas.microsoft.com/office/word/2010/wordml" xmlns:w15="http://schemas.microsoft.com/office/word/2012/wordml" xmlns:w16se="http://schemas.microsoft.com/office/word/2015/wordml/symex" xmlns:wpg="http://schemas.microsoft.com/office/word/2010/wordprocessingGroup" xmlns:wpi="http://schemas.microsoft.com/office/word/2010/wordprocessingInk" xmlns:wne="http://schemas.microsoft.com/office/word/2006/wordml" xmlns:wps="http://schemas.microsoft.com/office/word/2010/wordprocessingShape" mc:Ignorable="w14 w15 w16se wp14">
   <w:sdt>
     <w:sdtPr>
       <w:id w:val="958228592"/>
@@ -4637,10 +4651,11 @@
         </w:r>
         <w:r>
           <w:rPr>
+            <w:noProof/>
             <w:sz w:val="20"/>
             <w:szCs w:val="20"/>
           </w:rPr>
-          <w:t>16</w:t>
+          <w:t>14</w:t>
         </w:r>
         <w:r>
           <w:rPr>
@@ -4673,7 +4688,7 @@
 </file>
 
 <file path=word/numbering.xml><?xml version="1.0" encoding="utf-8"?>
-<w:numbering xmlns:wpc="http://schemas.microsoft.com/office/word/2010/wordprocessingCanvas" xmlns:cx="http://schemas.microsoft.com/office/drawing/2014/chartex" xmlns:cx1="http://schemas.microsoft.com/office/drawing/2015/9/8/chartex" xmlns:cx2="http://schemas.microsoft.com/office/drawing/2015/10/21/chartex" xmlns:cx3="http://schemas.microsoft.com/office/drawing/2016/5/9/chartex" xmlns:cx4="http://schemas.microsoft.com/office/drawing/2016/5/10/chartex" xmlns:cx5="http://schemas.microsoft.com/office/drawing/2016/5/11/chartex" xmlns:cx6="http://schemas.microsoft.com/office/drawing/2016/5/12/chartex" xmlns:cx7="http://schemas.microsoft.com/office/drawing/2016/5/13/chartex" xmlns:cx8="http://schemas.microsoft.com/office/drawing/2016/5/14/chartex" xmlns:mc="http://schemas.openxmlformats.org/markup-compatibility/2006" xmlns:aink="http://schemas.microsoft.com/office/drawing/2016/ink" xmlns:am3d="http://schemas.microsoft.com/office/drawing/2017/model3d" xmlns:o="urn:schemas-microsoft-com:office:office" xmlns:oel="http://schemas.microsoft.com/office/2019/extlst" xmlns:r="http://schemas.openxmlformats.org/officeDocument/2006/relationships" xmlns:m="http://schemas.openxmlformats.org/officeDocument/2006/math" xmlns:v="urn:schemas-microsoft-com:vml" xmlns:wp14="http://schemas.microsoft.com/office/word/2010/wordprocessingDrawing" xmlns:wp="http://schemas.openxmlformats.org/drawingml/2006/wordprocessingDrawing" xmlns:w10="urn:schemas-microsoft-com:office:word" xmlns:w="http://schemas.openxmlformats.org/wordprocessingml/2006/main" xmlns:w14="http://schemas.microsoft.com/office/word/2010/wordml" xmlns:w15="http://schemas.microsoft.com/office/word/2012/wordml" xmlns:w16cex="http://schemas.microsoft.com/office/word/2018/wordml/cex" xmlns:w16cid="http://schemas.microsoft.com/office/word/2016/wordml/cid" xmlns:w16="http://schemas.microsoft.com/office/word/2018/wordml" xmlns:w16du="http://schemas.microsoft.com/office/word/2023/wordml/word16du" xmlns:w16sdtdh="http://schemas.microsoft.com/office/word/2020/wordml/sdtdatahash" xmlns:w16sdtfl="http://schemas.microsoft.com/office/word/2024/wordml/sdtformatlock" xmlns:w16se="http://schemas.microsoft.com/office/word/2015/wordml/symex" xmlns:wpg="http://schemas.microsoft.com/office/word/2010/wordprocessingGroup" xmlns:wpi="http://schemas.microsoft.com/office/word/2010/wordprocessingInk" xmlns:wne="http://schemas.microsoft.com/office/word/2006/wordml" xmlns:wps="http://schemas.microsoft.com/office/word/2010/wordprocessingShape" mc:Ignorable="w14 w15 w16se w16cid w16 w16cex w16sdtdh w16sdtfl w16du wp14">
+<w:numbering xmlns:wpc="http://schemas.microsoft.com/office/word/2010/wordprocessingCanvas" xmlns:cx="http://schemas.microsoft.com/office/drawing/2014/chartex" xmlns:mc="http://schemas.openxmlformats.org/markup-compatibility/2006" xmlns:o="urn:schemas-microsoft-com:office:office" xmlns:r="http://schemas.openxmlformats.org/officeDocument/2006/relationships" xmlns:m="http://schemas.openxmlformats.org/officeDocument/2006/math" xmlns:v="urn:schemas-microsoft-com:vml" xmlns:wp14="http://schemas.microsoft.com/office/word/2010/wordprocessingDrawing" xmlns:wp="http://schemas.openxmlformats.org/drawingml/2006/wordprocessingDrawing" xmlns:w10="urn:schemas-microsoft-com:office:word" xmlns:w="http://schemas.openxmlformats.org/wordprocessingml/2006/main" xmlns:w14="http://schemas.microsoft.com/office/word/2010/wordml" xmlns:w15="http://schemas.microsoft.com/office/word/2012/wordml" xmlns:w16se="http://schemas.microsoft.com/office/word/2015/wordml/symex" xmlns:wpg="http://schemas.microsoft.com/office/word/2010/wordprocessingGroup" xmlns:wpi="http://schemas.microsoft.com/office/word/2010/wordprocessingInk" xmlns:wne="http://schemas.microsoft.com/office/word/2006/wordml" xmlns:wps="http://schemas.microsoft.com/office/word/2010/wordprocessingShape" mc:Ignorable="w14 w15 w16se wp14">
   <w:abstractNum w:abstractNumId="0" w15:restartNumberingAfterBreak="0">
     <w:nsid w:val="0359FF69"/>
     <w:multiLevelType w:val="hybridMultilevel"/>
@@ -4901,6 +4916,119 @@
     </w:lvl>
   </w:abstractNum>
   <w:abstractNum w:abstractNumId="2" w15:restartNumberingAfterBreak="0">
+    <w:nsid w:val="0E2C702E"/>
+    <w:multiLevelType w:val="hybridMultilevel"/>
+    <w:tmpl w:val="E9028D2A"/>
+    <w:lvl w:ilvl="0" w:tplc="04160001">
+      <w:start w:val="1"/>
+      <w:numFmt w:val="bullet"/>
+      <w:lvlText w:val=""/>
+      <w:lvlJc w:val="left"/>
+      <w:pPr>
+        <w:ind w:left="1571" w:hanging="360"/>
+      </w:pPr>
+      <w:rPr>
+        <w:rFonts w:ascii="Symbol" w:hAnsi="Symbol" w:hint="default"/>
+      </w:rPr>
+    </w:lvl>
+    <w:lvl w:ilvl="1" w:tplc="04160003" w:tentative="1">
+      <w:start w:val="1"/>
+      <w:numFmt w:val="bullet"/>
+      <w:lvlText w:val="o"/>
+      <w:lvlJc w:val="left"/>
+      <w:pPr>
+        <w:ind w:left="2291" w:hanging="360"/>
+      </w:pPr>
+      <w:rPr>
+        <w:rFonts w:ascii="Courier New" w:hAnsi="Courier New" w:cs="Courier New" w:hint="default"/>
+      </w:rPr>
+    </w:lvl>
+    <w:lvl w:ilvl="2" w:tplc="04160005" w:tentative="1">
+      <w:start w:val="1"/>
+      <w:numFmt w:val="bullet"/>
+      <w:lvlText w:val=""/>
+      <w:lvlJc w:val="left"/>
+      <w:pPr>
+        <w:ind w:left="3011" w:hanging="360"/>
+      </w:pPr>
+      <w:rPr>
+        <w:rFonts w:ascii="Wingdings" w:hAnsi="Wingdings" w:hint="default"/>
+      </w:rPr>
+    </w:lvl>
+    <w:lvl w:ilvl="3" w:tplc="04160001" w:tentative="1">
+      <w:start w:val="1"/>
+      <w:numFmt w:val="bullet"/>
+      <w:lvlText w:val=""/>
+      <w:lvlJc w:val="left"/>
+      <w:pPr>
+        <w:ind w:left="3731" w:hanging="360"/>
+      </w:pPr>
+      <w:rPr>
+        <w:rFonts w:ascii="Symbol" w:hAnsi="Symbol" w:hint="default"/>
+      </w:rPr>
+    </w:lvl>
+    <w:lvl w:ilvl="4" w:tplc="04160003" w:tentative="1">
+      <w:start w:val="1"/>
+      <w:numFmt w:val="bullet"/>
+      <w:lvlText w:val="o"/>
+      <w:lvlJc w:val="left"/>
+      <w:pPr>
+        <w:ind w:left="4451" w:hanging="360"/>
+      </w:pPr>
+      <w:rPr>
+        <w:rFonts w:ascii="Courier New" w:hAnsi="Courier New" w:cs="Courier New" w:hint="default"/>
+      </w:rPr>
+    </w:lvl>
+    <w:lvl w:ilvl="5" w:tplc="04160005" w:tentative="1">
+      <w:start w:val="1"/>
+      <w:numFmt w:val="bullet"/>
+      <w:lvlText w:val=""/>
+      <w:lvlJc w:val="left"/>
+      <w:pPr>
+        <w:ind w:left="5171" w:hanging="360"/>
+      </w:pPr>
+      <w:rPr>
+        <w:rFonts w:ascii="Wingdings" w:hAnsi="Wingdings" w:hint="default"/>
+      </w:rPr>
+    </w:lvl>
+    <w:lvl w:ilvl="6" w:tplc="04160001" w:tentative="1">
+      <w:start w:val="1"/>
+      <w:numFmt w:val="bullet"/>
+      <w:lvlText w:val=""/>
+      <w:lvlJc w:val="left"/>
+      <w:pPr>
+        <w:ind w:left="5891" w:hanging="360"/>
+      </w:pPr>
+      <w:rPr>
+        <w:rFonts w:ascii="Symbol" w:hAnsi="Symbol" w:hint="default"/>
+      </w:rPr>
+    </w:lvl>
+    <w:lvl w:ilvl="7" w:tplc="04160003" w:tentative="1">
+      <w:start w:val="1"/>
+      <w:numFmt w:val="bullet"/>
+      <w:lvlText w:val="o"/>
+      <w:lvlJc w:val="left"/>
+      <w:pPr>
+        <w:ind w:left="6611" w:hanging="360"/>
+      </w:pPr>
+      <w:rPr>
+        <w:rFonts w:ascii="Courier New" w:hAnsi="Courier New" w:cs="Courier New" w:hint="default"/>
+      </w:rPr>
+    </w:lvl>
+    <w:lvl w:ilvl="8" w:tplc="04160005" w:tentative="1">
+      <w:start w:val="1"/>
+      <w:numFmt w:val="bullet"/>
+      <w:lvlText w:val=""/>
+      <w:lvlJc w:val="left"/>
+      <w:pPr>
+        <w:ind w:left="7331" w:hanging="360"/>
+      </w:pPr>
+      <w:rPr>
+        <w:rFonts w:ascii="Wingdings" w:hAnsi="Wingdings" w:hint="default"/>
+      </w:rPr>
+    </w:lvl>
+  </w:abstractNum>
+  <w:abstractNum w:abstractNumId="3" w15:restartNumberingAfterBreak="0">
     <w:nsid w:val="1428A9F3"/>
     <w:multiLevelType w:val="hybridMultilevel"/>
     <w:tmpl w:val="E0582C40"/>
@@ -5013,7 +5141,7 @@
       </w:rPr>
     </w:lvl>
   </w:abstractNum>
-  <w:abstractNum w:abstractNumId="3" w15:restartNumberingAfterBreak="0">
+  <w:abstractNum w:abstractNumId="4" w15:restartNumberingAfterBreak="0">
     <w:nsid w:val="1906B896"/>
     <w:multiLevelType w:val="hybridMultilevel"/>
     <w:tmpl w:val="73447F8E"/>
@@ -5126,7 +5254,120 @@
       </w:rPr>
     </w:lvl>
   </w:abstractNum>
-  <w:abstractNum w:abstractNumId="4" w15:restartNumberingAfterBreak="0">
+  <w:abstractNum w:abstractNumId="5" w15:restartNumberingAfterBreak="0">
+    <w:nsid w:val="1E640A2F"/>
+    <w:multiLevelType w:val="hybridMultilevel"/>
+    <w:tmpl w:val="E1BA566A"/>
+    <w:lvl w:ilvl="0" w:tplc="04160001">
+      <w:start w:val="1"/>
+      <w:numFmt w:val="bullet"/>
+      <w:lvlText w:val=""/>
+      <w:lvlJc w:val="left"/>
+      <w:pPr>
+        <w:ind w:left="720" w:hanging="360"/>
+      </w:pPr>
+      <w:rPr>
+        <w:rFonts w:ascii="Symbol" w:hAnsi="Symbol" w:hint="default"/>
+      </w:rPr>
+    </w:lvl>
+    <w:lvl w:ilvl="1" w:tplc="04160003" w:tentative="1">
+      <w:start w:val="1"/>
+      <w:numFmt w:val="bullet"/>
+      <w:lvlText w:val="o"/>
+      <w:lvlJc w:val="left"/>
+      <w:pPr>
+        <w:ind w:left="1440" w:hanging="360"/>
+      </w:pPr>
+      <w:rPr>
+        <w:rFonts w:ascii="Courier New" w:hAnsi="Courier New" w:cs="Courier New" w:hint="default"/>
+      </w:rPr>
+    </w:lvl>
+    <w:lvl w:ilvl="2" w:tplc="04160005" w:tentative="1">
+      <w:start w:val="1"/>
+      <w:numFmt w:val="bullet"/>
+      <w:lvlText w:val=""/>
+      <w:lvlJc w:val="left"/>
+      <w:pPr>
+        <w:ind w:left="2160" w:hanging="360"/>
+      </w:pPr>
+      <w:rPr>
+        <w:rFonts w:ascii="Wingdings" w:hAnsi="Wingdings" w:hint="default"/>
+      </w:rPr>
+    </w:lvl>
+    <w:lvl w:ilvl="3" w:tplc="04160001" w:tentative="1">
+      <w:start w:val="1"/>
+      <w:numFmt w:val="bullet"/>
+      <w:lvlText w:val=""/>
+      <w:lvlJc w:val="left"/>
+      <w:pPr>
+        <w:ind w:left="2880" w:hanging="360"/>
+      </w:pPr>
+      <w:rPr>
+        <w:rFonts w:ascii="Symbol" w:hAnsi="Symbol" w:hint="default"/>
+      </w:rPr>
+    </w:lvl>
+    <w:lvl w:ilvl="4" w:tplc="04160003" w:tentative="1">
+      <w:start w:val="1"/>
+      <w:numFmt w:val="bullet"/>
+      <w:lvlText w:val="o"/>
+      <w:lvlJc w:val="left"/>
+      <w:pPr>
+        <w:ind w:left="3600" w:hanging="360"/>
+      </w:pPr>
+      <w:rPr>
+        <w:rFonts w:ascii="Courier New" w:hAnsi="Courier New" w:cs="Courier New" w:hint="default"/>
+      </w:rPr>
+    </w:lvl>
+    <w:lvl w:ilvl="5" w:tplc="04160005" w:tentative="1">
+      <w:start w:val="1"/>
+      <w:numFmt w:val="bullet"/>
+      <w:lvlText w:val=""/>
+      <w:lvlJc w:val="left"/>
+      <w:pPr>
+        <w:ind w:left="4320" w:hanging="360"/>
+      </w:pPr>
+      <w:rPr>
+        <w:rFonts w:ascii="Wingdings" w:hAnsi="Wingdings" w:hint="default"/>
+      </w:rPr>
+    </w:lvl>
+    <w:lvl w:ilvl="6" w:tplc="04160001" w:tentative="1">
+      <w:start w:val="1"/>
+      <w:numFmt w:val="bullet"/>
+      <w:lvlText w:val=""/>
+      <w:lvlJc w:val="left"/>
+      <w:pPr>
+        <w:ind w:left="5040" w:hanging="360"/>
+      </w:pPr>
+      <w:rPr>
+        <w:rFonts w:ascii="Symbol" w:hAnsi="Symbol" w:hint="default"/>
+      </w:rPr>
+    </w:lvl>
+    <w:lvl w:ilvl="7" w:tplc="04160003" w:tentative="1">
+      <w:start w:val="1"/>
+      <w:numFmt w:val="bullet"/>
+      <w:lvlText w:val="o"/>
+      <w:lvlJc w:val="left"/>
+      <w:pPr>
+        <w:ind w:left="5760" w:hanging="360"/>
+      </w:pPr>
+      <w:rPr>
+        <w:rFonts w:ascii="Courier New" w:hAnsi="Courier New" w:cs="Courier New" w:hint="default"/>
+      </w:rPr>
+    </w:lvl>
+    <w:lvl w:ilvl="8" w:tplc="04160005" w:tentative="1">
+      <w:start w:val="1"/>
+      <w:numFmt w:val="bullet"/>
+      <w:lvlText w:val=""/>
+      <w:lvlJc w:val="left"/>
+      <w:pPr>
+        <w:ind w:left="6480" w:hanging="360"/>
+      </w:pPr>
+      <w:rPr>
+        <w:rFonts w:ascii="Wingdings" w:hAnsi="Wingdings" w:hint="default"/>
+      </w:rPr>
+    </w:lvl>
+  </w:abstractNum>
+  <w:abstractNum w:abstractNumId="6" w15:restartNumberingAfterBreak="0">
     <w:nsid w:val="1E7B14E5"/>
     <w:multiLevelType w:val="hybridMultilevel"/>
     <w:tmpl w:val="71600324"/>
@@ -5239,7 +5480,7 @@
       </w:rPr>
     </w:lvl>
   </w:abstractNum>
-  <w:abstractNum w:abstractNumId="5" w15:restartNumberingAfterBreak="0">
+  <w:abstractNum w:abstractNumId="7" w15:restartNumberingAfterBreak="0">
     <w:nsid w:val="2D8B5972"/>
     <w:multiLevelType w:val="hybridMultilevel"/>
     <w:tmpl w:val="63D41E74"/>
@@ -5352,7 +5593,7 @@
       </w:rPr>
     </w:lvl>
   </w:abstractNum>
-  <w:abstractNum w:abstractNumId="6" w15:restartNumberingAfterBreak="0">
+  <w:abstractNum w:abstractNumId="8" w15:restartNumberingAfterBreak="0">
     <w:nsid w:val="2E4AB3C5"/>
     <w:multiLevelType w:val="hybridMultilevel"/>
     <w:tmpl w:val="F78E9C6C"/>
@@ -5465,7 +5706,7 @@
       </w:rPr>
     </w:lvl>
   </w:abstractNum>
-  <w:abstractNum w:abstractNumId="7" w15:restartNumberingAfterBreak="0">
+  <w:abstractNum w:abstractNumId="9" w15:restartNumberingAfterBreak="0">
     <w:nsid w:val="2E580FDE"/>
     <w:multiLevelType w:val="multilevel"/>
     <w:tmpl w:val="C7127E38"/>
@@ -5578,7 +5819,7 @@
       </w:pPr>
     </w:lvl>
   </w:abstractNum>
-  <w:abstractNum w:abstractNumId="8" w15:restartNumberingAfterBreak="0">
+  <w:abstractNum w:abstractNumId="10" w15:restartNumberingAfterBreak="0">
     <w:nsid w:val="49587503"/>
     <w:multiLevelType w:val="hybridMultilevel"/>
     <w:tmpl w:val="775EE202"/>
@@ -5691,7 +5932,7 @@
       </w:rPr>
     </w:lvl>
   </w:abstractNum>
-  <w:abstractNum w:abstractNumId="9" w15:restartNumberingAfterBreak="0">
+  <w:abstractNum w:abstractNumId="11" w15:restartNumberingAfterBreak="0">
     <w:nsid w:val="52B479C2"/>
     <w:multiLevelType w:val="hybridMultilevel"/>
     <w:tmpl w:val="361AEDCA"/>
@@ -5804,7 +6045,7 @@
       </w:rPr>
     </w:lvl>
   </w:abstractNum>
-  <w:abstractNum w:abstractNumId="10" w15:restartNumberingAfterBreak="0">
+  <w:abstractNum w:abstractNumId="12" w15:restartNumberingAfterBreak="0">
     <w:nsid w:val="53FA52DF"/>
     <w:multiLevelType w:val="hybridMultilevel"/>
     <w:tmpl w:val="8212948C"/>
@@ -5893,7 +6134,120 @@
       </w:pPr>
     </w:lvl>
   </w:abstractNum>
-  <w:abstractNum w:abstractNumId="11" w15:restartNumberingAfterBreak="0">
+  <w:abstractNum w:abstractNumId="13" w15:restartNumberingAfterBreak="0">
+    <w:nsid w:val="58CC648C"/>
+    <w:multiLevelType w:val="hybridMultilevel"/>
+    <w:tmpl w:val="354056DA"/>
+    <w:lvl w:ilvl="0" w:tplc="04160001">
+      <w:start w:val="1"/>
+      <w:numFmt w:val="bullet"/>
+      <w:lvlText w:val=""/>
+      <w:lvlJc w:val="left"/>
+      <w:pPr>
+        <w:ind w:left="720" w:hanging="360"/>
+      </w:pPr>
+      <w:rPr>
+        <w:rFonts w:ascii="Symbol" w:hAnsi="Symbol" w:hint="default"/>
+      </w:rPr>
+    </w:lvl>
+    <w:lvl w:ilvl="1" w:tplc="04160003" w:tentative="1">
+      <w:start w:val="1"/>
+      <w:numFmt w:val="bullet"/>
+      <w:lvlText w:val="o"/>
+      <w:lvlJc w:val="left"/>
+      <w:pPr>
+        <w:ind w:left="1440" w:hanging="360"/>
+      </w:pPr>
+      <w:rPr>
+        <w:rFonts w:ascii="Courier New" w:hAnsi="Courier New" w:cs="Courier New" w:hint="default"/>
+      </w:rPr>
+    </w:lvl>
+    <w:lvl w:ilvl="2" w:tplc="04160005" w:tentative="1">
+      <w:start w:val="1"/>
+      <w:numFmt w:val="bullet"/>
+      <w:lvlText w:val=""/>
+      <w:lvlJc w:val="left"/>
+      <w:pPr>
+        <w:ind w:left="2160" w:hanging="360"/>
+      </w:pPr>
+      <w:rPr>
+        <w:rFonts w:ascii="Wingdings" w:hAnsi="Wingdings" w:hint="default"/>
+      </w:rPr>
+    </w:lvl>
+    <w:lvl w:ilvl="3" w:tplc="04160001" w:tentative="1">
+      <w:start w:val="1"/>
+      <w:numFmt w:val="bullet"/>
+      <w:lvlText w:val=""/>
+      <w:lvlJc w:val="left"/>
+      <w:pPr>
+        <w:ind w:left="2880" w:hanging="360"/>
+      </w:pPr>
+      <w:rPr>
+        <w:rFonts w:ascii="Symbol" w:hAnsi="Symbol" w:hint="default"/>
+      </w:rPr>
+    </w:lvl>
+    <w:lvl w:ilvl="4" w:tplc="04160003" w:tentative="1">
+      <w:start w:val="1"/>
+      <w:numFmt w:val="bullet"/>
+      <w:lvlText w:val="o"/>
+      <w:lvlJc w:val="left"/>
+      <w:pPr>
+        <w:ind w:left="3600" w:hanging="360"/>
+      </w:pPr>
+      <w:rPr>
+        <w:rFonts w:ascii="Courier New" w:hAnsi="Courier New" w:cs="Courier New" w:hint="default"/>
+      </w:rPr>
+    </w:lvl>
+    <w:lvl w:ilvl="5" w:tplc="04160005" w:tentative="1">
+      <w:start w:val="1"/>
+      <w:numFmt w:val="bullet"/>
+      <w:lvlText w:val=""/>
+      <w:lvlJc w:val="left"/>
+      <w:pPr>
+        <w:ind w:left="4320" w:hanging="360"/>
+      </w:pPr>
+      <w:rPr>
+        <w:rFonts w:ascii="Wingdings" w:hAnsi="Wingdings" w:hint="default"/>
+      </w:rPr>
+    </w:lvl>
+    <w:lvl w:ilvl="6" w:tplc="04160001" w:tentative="1">
+      <w:start w:val="1"/>
+      <w:numFmt w:val="bullet"/>
+      <w:lvlText w:val=""/>
+      <w:lvlJc w:val="left"/>
+      <w:pPr>
+        <w:ind w:left="5040" w:hanging="360"/>
+      </w:pPr>
+      <w:rPr>
+        <w:rFonts w:ascii="Symbol" w:hAnsi="Symbol" w:hint="default"/>
+      </w:rPr>
+    </w:lvl>
+    <w:lvl w:ilvl="7" w:tplc="04160003" w:tentative="1">
+      <w:start w:val="1"/>
+      <w:numFmt w:val="bullet"/>
+      <w:lvlText w:val="o"/>
+      <w:lvlJc w:val="left"/>
+      <w:pPr>
+        <w:ind w:left="5760" w:hanging="360"/>
+      </w:pPr>
+      <w:rPr>
+        <w:rFonts w:ascii="Courier New" w:hAnsi="Courier New" w:cs="Courier New" w:hint="default"/>
+      </w:rPr>
+    </w:lvl>
+    <w:lvl w:ilvl="8" w:tplc="04160005" w:tentative="1">
+      <w:start w:val="1"/>
+      <w:numFmt w:val="bullet"/>
+      <w:lvlText w:val=""/>
+      <w:lvlJc w:val="left"/>
+      <w:pPr>
+        <w:ind w:left="6480" w:hanging="360"/>
+      </w:pPr>
+      <w:rPr>
+        <w:rFonts w:ascii="Wingdings" w:hAnsi="Wingdings" w:hint="default"/>
+      </w:rPr>
+    </w:lvl>
+  </w:abstractNum>
+  <w:abstractNum w:abstractNumId="14" w15:restartNumberingAfterBreak="0">
     <w:nsid w:val="5AB6F6E3"/>
     <w:multiLevelType w:val="hybridMultilevel"/>
     <w:tmpl w:val="805A867C"/>
@@ -6006,7 +6360,7 @@
       </w:rPr>
     </w:lvl>
   </w:abstractNum>
-  <w:abstractNum w:abstractNumId="12" w15:restartNumberingAfterBreak="0">
+  <w:abstractNum w:abstractNumId="15" w15:restartNumberingAfterBreak="0">
     <w:nsid w:val="5D5DC71D"/>
     <w:multiLevelType w:val="hybridMultilevel"/>
     <w:tmpl w:val="C8B6695E"/>
@@ -6119,7 +6473,7 @@
       </w:rPr>
     </w:lvl>
   </w:abstractNum>
-  <w:abstractNum w:abstractNumId="13" w15:restartNumberingAfterBreak="0">
+  <w:abstractNum w:abstractNumId="16" w15:restartNumberingAfterBreak="0">
     <w:nsid w:val="70226238"/>
     <w:multiLevelType w:val="hybridMultilevel"/>
     <w:tmpl w:val="3520886A"/>
@@ -6232,7 +6586,7 @@
       </w:rPr>
     </w:lvl>
   </w:abstractNum>
-  <w:abstractNum w:abstractNumId="14" w15:restartNumberingAfterBreak="0">
+  <w:abstractNum w:abstractNumId="17" w15:restartNumberingAfterBreak="0">
     <w:nsid w:val="78C6E0F9"/>
     <w:multiLevelType w:val="hybridMultilevel"/>
     <w:tmpl w:val="43AEB4A4"/>
@@ -6345,7 +6699,7 @@
       </w:rPr>
     </w:lvl>
   </w:abstractNum>
-  <w:abstractNum w:abstractNumId="15" w15:restartNumberingAfterBreak="0">
+  <w:abstractNum w:abstractNumId="18" w15:restartNumberingAfterBreak="0">
     <w:nsid w:val="7B007F78"/>
     <w:multiLevelType w:val="hybridMultilevel"/>
     <w:tmpl w:val="845E85BC"/>
@@ -6458,7 +6812,7 @@
       </w:rPr>
     </w:lvl>
   </w:abstractNum>
-  <w:abstractNum w:abstractNumId="16" w15:restartNumberingAfterBreak="0">
+  <w:abstractNum w:abstractNumId="19" w15:restartNumberingAfterBreak="0">
     <w:nsid w:val="7F58207E"/>
     <w:multiLevelType w:val="hybridMultilevel"/>
     <w:tmpl w:val="8CF2AE86"/>
@@ -6571,62 +6925,71 @@
       </w:rPr>
     </w:lvl>
   </w:abstractNum>
-  <w:num w:numId="1" w16cid:durableId="134838477">
+  <w:num w:numId="1">
+    <w:abstractNumId w:val="4"/>
+  </w:num>
+  <w:num w:numId="2">
+    <w:abstractNumId w:val="8"/>
+  </w:num>
+  <w:num w:numId="3">
+    <w:abstractNumId w:val="0"/>
+  </w:num>
+  <w:num w:numId="4">
+    <w:abstractNumId w:val="7"/>
+  </w:num>
+  <w:num w:numId="5">
+    <w:abstractNumId w:val="15"/>
+  </w:num>
+  <w:num w:numId="6">
+    <w:abstractNumId w:val="14"/>
+  </w:num>
+  <w:num w:numId="7">
+    <w:abstractNumId w:val="16"/>
+  </w:num>
+  <w:num w:numId="8">
     <w:abstractNumId w:val="3"/>
   </w:num>
-  <w:num w:numId="2" w16cid:durableId="1161434063">
+  <w:num w:numId="9">
+    <w:abstractNumId w:val="17"/>
+  </w:num>
+  <w:num w:numId="10">
+    <w:abstractNumId w:val="1"/>
+  </w:num>
+  <w:num w:numId="11">
+    <w:abstractNumId w:val="18"/>
+  </w:num>
+  <w:num w:numId="12">
+    <w:abstractNumId w:val="19"/>
+  </w:num>
+  <w:num w:numId="13">
+    <w:abstractNumId w:val="12"/>
+  </w:num>
+  <w:num w:numId="14">
+    <w:abstractNumId w:val="10"/>
+  </w:num>
+  <w:num w:numId="15">
+    <w:abstractNumId w:val="9"/>
+  </w:num>
+  <w:num w:numId="16">
+    <w:abstractNumId w:val="11"/>
+  </w:num>
+  <w:num w:numId="17">
     <w:abstractNumId w:val="6"/>
   </w:num>
-  <w:num w:numId="3" w16cid:durableId="1442452040">
-    <w:abstractNumId w:val="0"/>
+  <w:num w:numId="18">
+    <w:abstractNumId w:val="2"/>
   </w:num>
-  <w:num w:numId="4" w16cid:durableId="702219057">
-    <w:abstractNumId w:val="5"/>
-  </w:num>
-  <w:num w:numId="5" w16cid:durableId="792094114">
-    <w:abstractNumId w:val="12"/>
-  </w:num>
-  <w:num w:numId="6" w16cid:durableId="1388525438">
-    <w:abstractNumId w:val="11"/>
-  </w:num>
-  <w:num w:numId="7" w16cid:durableId="419562942">
+  <w:num w:numId="19">
     <w:abstractNumId w:val="13"/>
   </w:num>
-  <w:num w:numId="8" w16cid:durableId="769160836">
-    <w:abstractNumId w:val="2"/>
-  </w:num>
-  <w:num w:numId="9" w16cid:durableId="142309040">
-    <w:abstractNumId w:val="14"/>
-  </w:num>
-  <w:num w:numId="10" w16cid:durableId="1272400176">
-    <w:abstractNumId w:val="1"/>
-  </w:num>
-  <w:num w:numId="11" w16cid:durableId="1572545847">
-    <w:abstractNumId w:val="15"/>
-  </w:num>
-  <w:num w:numId="12" w16cid:durableId="1512600163">
-    <w:abstractNumId w:val="16"/>
-  </w:num>
-  <w:num w:numId="13" w16cid:durableId="1936130706">
-    <w:abstractNumId w:val="10"/>
-  </w:num>
-  <w:num w:numId="14" w16cid:durableId="1444807861">
-    <w:abstractNumId w:val="8"/>
-  </w:num>
-  <w:num w:numId="15" w16cid:durableId="1224297964">
-    <w:abstractNumId w:val="7"/>
-  </w:num>
-  <w:num w:numId="16" w16cid:durableId="1987321262">
-    <w:abstractNumId w:val="9"/>
-  </w:num>
-  <w:num w:numId="17" w16cid:durableId="1760560585">
-    <w:abstractNumId w:val="4"/>
+  <w:num w:numId="20">
+    <w:abstractNumId w:val="5"/>
   </w:num>
 </w:numbering>
 </file>
 
 <file path=word/styles.xml><?xml version="1.0" encoding="utf-8"?>
-<w:styles xmlns:mc="http://schemas.openxmlformats.org/markup-compatibility/2006" xmlns:r="http://schemas.openxmlformats.org/officeDocument/2006/relationships" xmlns:w="http://schemas.openxmlformats.org/wordprocessingml/2006/main" xmlns:w14="http://schemas.microsoft.com/office/word/2010/wordml" xmlns:w15="http://schemas.microsoft.com/office/word/2012/wordml" xmlns:w16cex="http://schemas.microsoft.com/office/word/2018/wordml/cex" xmlns:w16cid="http://schemas.microsoft.com/office/word/2016/wordml/cid" xmlns:w16="http://schemas.microsoft.com/office/word/2018/wordml" xmlns:w16du="http://schemas.microsoft.com/office/word/2023/wordml/word16du" xmlns:w16sdtdh="http://schemas.microsoft.com/office/word/2020/wordml/sdtdatahash" xmlns:w16sdtfl="http://schemas.microsoft.com/office/word/2024/wordml/sdtformatlock" xmlns:w16se="http://schemas.microsoft.com/office/word/2015/wordml/symex" mc:Ignorable="w14 w15 w16se w16cid w16 w16cex w16sdtdh w16sdtfl w16du">
+<w:styles xmlns:mc="http://schemas.openxmlformats.org/markup-compatibility/2006" xmlns:r="http://schemas.openxmlformats.org/officeDocument/2006/relationships" xmlns:w="http://schemas.openxmlformats.org/wordprocessingml/2006/main" xmlns:w14="http://schemas.microsoft.com/office/word/2010/wordml" xmlns:w15="http://schemas.microsoft.com/office/word/2012/wordml" xmlns:w16se="http://schemas.microsoft.com/office/word/2015/wordml/symex" mc:Ignorable="w14 w15 w16se">
   <w:docDefaults>
     <w:rPrDefault>
       <w:rPr>
@@ -6636,7 +6999,7 @@
     </w:rPrDefault>
     <w:pPrDefault/>
   </w:docDefaults>
-  <w:latentStyles w:defLockedState="0" w:defUIPriority="99" w:defSemiHidden="0" w:defUnhideWhenUsed="0" w:defQFormat="0" w:count="376">
+  <w:latentStyles w:defLockedState="0" w:defUIPriority="99" w:defSemiHidden="0" w:defUnhideWhenUsed="0" w:defQFormat="0" w:count="371">
     <w:lsdException w:name="Normal" w:uiPriority="0" w:qFormat="1"/>
     <w:lsdException w:name="heading 1" w:uiPriority="9" w:qFormat="1"/>
     <w:lsdException w:name="heading 2" w:uiPriority="9" w:unhideWhenUsed="1" w:qFormat="1"/>
@@ -7008,11 +7371,6 @@
     <w:lsdException w:name="List Table 5 Dark Accent 6" w:uiPriority="50"/>
     <w:lsdException w:name="List Table 6 Colorful Accent 6" w:uiPriority="51"/>
     <w:lsdException w:name="List Table 7 Colorful Accent 6" w:uiPriority="52"/>
-    <w:lsdException w:name="Mention" w:semiHidden="1" w:unhideWhenUsed="1"/>
-    <w:lsdException w:name="Smart Hyperlink" w:semiHidden="1" w:unhideWhenUsed="1"/>
-    <w:lsdException w:name="Hashtag" w:semiHidden="1" w:unhideWhenUsed="1"/>
-    <w:lsdException w:name="Unresolved Mention" w:semiHidden="1" w:unhideWhenUsed="1"/>
-    <w:lsdException w:name="Smart Link" w:semiHidden="1" w:unhideWhenUsed="1"/>
   </w:latentStyles>
   <w:style w:type="paragraph" w:default="1" w:styleId="Normal">
     <w:name w:val="Normal"/>
@@ -7933,7 +8291,7 @@
     <w:uiPriority w:val="99"/>
     <w:qFormat/>
   </w:style>
-  <w:style w:type="character" w:styleId="MenoPendente">
+  <w:style w:type="character" w:customStyle="1" w:styleId="UnresolvedMention">
     <w:name w:val="Unresolved Mention"/>
     <w:basedOn w:val="Fontepargpadro"/>
     <w:uiPriority w:val="99"/>
@@ -7943,6 +8301,54 @@
     <w:rPr>
       <w:color w:val="605E5C"/>
       <w:shd w:val="clear" w:color="auto" w:fill="E1DFDD"/>
+    </w:rPr>
+  </w:style>
+  <w:style w:type="paragraph" w:styleId="Pr-formataoHTML">
+    <w:name w:val="HTML Preformatted"/>
+    <w:basedOn w:val="Normal"/>
+    <w:link w:val="Pr-formataoHTMLChar"/>
+    <w:uiPriority w:val="99"/>
+    <w:semiHidden/>
+    <w:unhideWhenUsed/>
+    <w:rsid w:val="00950457"/>
+    <w:pPr>
+      <w:tabs>
+        <w:tab w:val="left" w:pos="916"/>
+        <w:tab w:val="left" w:pos="1832"/>
+        <w:tab w:val="left" w:pos="2748"/>
+        <w:tab w:val="left" w:pos="3664"/>
+        <w:tab w:val="left" w:pos="4580"/>
+        <w:tab w:val="left" w:pos="5496"/>
+        <w:tab w:val="left" w:pos="6412"/>
+        <w:tab w:val="left" w:pos="7328"/>
+        <w:tab w:val="left" w:pos="8244"/>
+        <w:tab w:val="left" w:pos="9160"/>
+        <w:tab w:val="left" w:pos="10076"/>
+        <w:tab w:val="left" w:pos="10992"/>
+        <w:tab w:val="left" w:pos="11908"/>
+        <w:tab w:val="left" w:pos="12824"/>
+        <w:tab w:val="left" w:pos="13740"/>
+        <w:tab w:val="left" w:pos="14656"/>
+      </w:tabs>
+      <w:spacing w:line="240" w:lineRule="auto"/>
+      <w:contextualSpacing w:val="0"/>
+    </w:pPr>
+    <w:rPr>
+      <w:rFonts w:ascii="Courier New" w:eastAsia="Times New Roman" w:hAnsi="Courier New" w:cs="Courier New"/>
+      <w:sz w:val="20"/>
+      <w:szCs w:val="20"/>
+      <w:lang w:eastAsia="pt-BR"/>
+    </w:rPr>
+  </w:style>
+  <w:style w:type="character" w:customStyle="1" w:styleId="Pr-formataoHTMLChar">
+    <w:name w:val="Pré-formatação HTML Char"/>
+    <w:basedOn w:val="Fontepargpadro"/>
+    <w:link w:val="Pr-formataoHTML"/>
+    <w:uiPriority w:val="99"/>
+    <w:semiHidden/>
+    <w:rsid w:val="00950457"/>
+    <w:rPr>
+      <w:rFonts w:ascii="Courier New" w:eastAsia="Times New Roman" w:hAnsi="Courier New" w:cs="Courier New"/>
     </w:rPr>
   </w:style>
 </w:styles>
@@ -8178,7 +8584,7 @@
 </file>
 
 <file path=customXml/itemProps1.xml><?xml version="1.0" encoding="utf-8"?>
-<ds:datastoreItem xmlns:ds="http://schemas.openxmlformats.org/officeDocument/2006/customXml" ds:itemID="{9821D1BB-382E-4180-9D0A-8338E371FB5A}">
+<ds:datastoreItem xmlns:ds="http://schemas.openxmlformats.org/officeDocument/2006/customXml" ds:itemID="{EE8685F5-AC58-4690-BC84-9B3BAA5F780E}">
   <ds:schemaRefs>
     <ds:schemaRef ds:uri="http://schemas.openxmlformats.org/officeDocument/2006/bibliography"/>
   </ds:schemaRefs>

</xml_diff>

<commit_message>
Adicionando alguns materiais para o Github - 13/04/2026
</commit_message>
<xml_diff>
--- a/Terceiro_Semestre/Projeto_Integrador/Documentação/Modelo_Projeto_Integrador_principal.docx
+++ b/Terceiro_Semestre/Projeto_Integrador/Documentação/Modelo_Projeto_Integrador_principal.docx
@@ -1,6 +1,6 @@
 
 <file path=word/document.xml><?xml version="1.0" encoding="utf-8"?>
-<w:document xmlns:wpc="http://schemas.microsoft.com/office/word/2010/wordprocessingCanvas" xmlns:cx="http://schemas.microsoft.com/office/drawing/2014/chartex" xmlns:mc="http://schemas.openxmlformats.org/markup-compatibility/2006" xmlns:o="urn:schemas-microsoft-com:office:office" xmlns:r="http://schemas.openxmlformats.org/officeDocument/2006/relationships" xmlns:m="http://schemas.openxmlformats.org/officeDocument/2006/math" xmlns:v="urn:schemas-microsoft-com:vml" xmlns:wp14="http://schemas.microsoft.com/office/word/2010/wordprocessingDrawing" xmlns:wp="http://schemas.openxmlformats.org/drawingml/2006/wordprocessingDrawing" xmlns:w10="urn:schemas-microsoft-com:office:word" xmlns:w="http://schemas.openxmlformats.org/wordprocessingml/2006/main" xmlns:w14="http://schemas.microsoft.com/office/word/2010/wordml" xmlns:w15="http://schemas.microsoft.com/office/word/2012/wordml" xmlns:w16se="http://schemas.microsoft.com/office/word/2015/wordml/symex" xmlns:wpg="http://schemas.microsoft.com/office/word/2010/wordprocessingGroup" xmlns:wpi="http://schemas.microsoft.com/office/word/2010/wordprocessingInk" xmlns:wne="http://schemas.microsoft.com/office/word/2006/wordml" xmlns:wps="http://schemas.microsoft.com/office/word/2010/wordprocessingShape" mc:Ignorable="w14 w15 w16se wp14">
+<w:document xmlns:wpc="http://schemas.microsoft.com/office/word/2010/wordprocessingCanvas" xmlns:cx="http://schemas.microsoft.com/office/drawing/2014/chartex" xmlns:cx1="http://schemas.microsoft.com/office/drawing/2015/9/8/chartex" xmlns:cx2="http://schemas.microsoft.com/office/drawing/2015/10/21/chartex" xmlns:cx3="http://schemas.microsoft.com/office/drawing/2016/5/9/chartex" xmlns:cx4="http://schemas.microsoft.com/office/drawing/2016/5/10/chartex" xmlns:cx5="http://schemas.microsoft.com/office/drawing/2016/5/11/chartex" xmlns:cx6="http://schemas.microsoft.com/office/drawing/2016/5/12/chartex" xmlns:cx7="http://schemas.microsoft.com/office/drawing/2016/5/13/chartex" xmlns:cx8="http://schemas.microsoft.com/office/drawing/2016/5/14/chartex" xmlns:mc="http://schemas.openxmlformats.org/markup-compatibility/2006" xmlns:aink="http://schemas.microsoft.com/office/drawing/2016/ink" xmlns:am3d="http://schemas.microsoft.com/office/drawing/2017/model3d" xmlns:o="urn:schemas-microsoft-com:office:office" xmlns:r="http://schemas.openxmlformats.org/officeDocument/2006/relationships" xmlns:m="http://schemas.openxmlformats.org/officeDocument/2006/math" xmlns:v="urn:schemas-microsoft-com:vml" xmlns:wp14="http://schemas.microsoft.com/office/word/2010/wordprocessingDrawing" xmlns:wp="http://schemas.openxmlformats.org/drawingml/2006/wordprocessingDrawing" xmlns:w10="urn:schemas-microsoft-com:office:word" xmlns:w="http://schemas.openxmlformats.org/wordprocessingml/2006/main" xmlns:w14="http://schemas.microsoft.com/office/word/2010/wordml" xmlns:w15="http://schemas.microsoft.com/office/word/2012/wordml" xmlns:w16cex="http://schemas.microsoft.com/office/word/2018/wordml/cex" xmlns:w16cid="http://schemas.microsoft.com/office/word/2016/wordml/cid" xmlns:w16="http://schemas.microsoft.com/office/word/2018/wordml" xmlns:w16sdtdh="http://schemas.microsoft.com/office/word/2020/wordml/sdtdatahash" xmlns:w16se="http://schemas.microsoft.com/office/word/2015/wordml/symex" xmlns:wpg="http://schemas.microsoft.com/office/word/2010/wordprocessingGroup" xmlns:wpi="http://schemas.microsoft.com/office/word/2010/wordprocessingInk" xmlns:wne="http://schemas.microsoft.com/office/word/2006/wordml" xmlns:wps="http://schemas.microsoft.com/office/word/2010/wordprocessingShape" mc:Ignorable="w14 w15 w16se w16cid w16 w16cex w16sdtdh wp14">
   <w:body>
     <w:p>
       <w:pPr>
@@ -2312,22 +2312,12 @@
     </w:p>
     <w:p>
       <w:pPr>
-        <w:pStyle w:val="PargrafodaLista"/>
-        <w:numPr>
-          <w:ilvl w:val="0"/>
-          <w:numId w:val="18"/>
-        </w:numPr>
-        <w:jc w:val="both"/>
-      </w:pPr>
-      <w:r>
-        <w:t>RF: Requisitos Funcionais.</w:t>
-      </w:r>
-    </w:p>
-    <w:p>
-      <w:pPr>
         <w:ind w:left="851"/>
         <w:jc w:val="both"/>
       </w:pPr>
+      <w:r>
+        <w:t>Não Aplicável.</w:t>
+      </w:r>
     </w:p>
     <w:p>
       <w:pPr>
@@ -2575,6 +2565,7 @@
         <w:jc w:val="both"/>
       </w:pPr>
       <w:r>
+        <w:lastRenderedPageBreak/>
         <w:t>Validação de capacidade do laboratório</w:t>
       </w:r>
       <w:r>
@@ -3721,8 +3712,8 @@
           <w:lang w:eastAsia="pt-BR"/>
         </w:rPr>
         <w:drawing>
-          <wp:inline distT="0" distB="0" distL="0" distR="0" wp14:anchorId="675E87CB" wp14:editId="63A21E2B">
-            <wp:extent cx="5246077" cy="3316492"/>
+          <wp:inline distT="0" distB="0" distL="0" distR="0" wp14:anchorId="675E87CB" wp14:editId="52B09C67">
+            <wp:extent cx="5093984" cy="3323399"/>
             <wp:effectExtent l="0" t="0" r="0" b="0"/>
             <wp:docPr id="568772802" name="drawing"/>
             <wp:cNvGraphicFramePr>
@@ -3750,7 +3741,7 @@
                   <pic:spPr>
                     <a:xfrm>
                       <a:off x="0" y="0"/>
-                      <a:ext cx="5257003" cy="3323399"/>
+                      <a:ext cx="5093984" cy="3323399"/>
                     </a:xfrm>
                     <a:prstGeom prst="rect">
                       <a:avLst/>
@@ -3835,43 +3826,41 @@
           </wp:inline>
         </w:drawing>
       </w:r>
-      <w:bookmarkStart w:id="21" w:name="_GoBack"/>
+    </w:p>
+    <w:p>
+      <w:pPr>
+        <w:pStyle w:val="Ttulo3"/>
+        <w:jc w:val="both"/>
+        <w:rPr>
+          <w:i w:val="0"/>
+        </w:rPr>
+      </w:pPr>
+    </w:p>
+    <w:p>
+      <w:pPr>
+        <w:pStyle w:val="Ttulo3"/>
+        <w:jc w:val="both"/>
+        <w:rPr>
+          <w:i w:val="0"/>
+        </w:rPr>
+      </w:pPr>
+      <w:bookmarkStart w:id="21" w:name="_Toc16793"/>
+      <w:r>
+        <w:rPr>
+          <w:i w:val="0"/>
+        </w:rPr>
+        <w:t>3.4</w:t>
+      </w:r>
+      <w:r>
+        <w:tab/>
+      </w:r>
+      <w:r>
+        <w:rPr>
+          <w:i w:val="0"/>
+        </w:rPr>
+        <w:t>REQUISITOS DE BANCO DE DADOS</w:t>
+      </w:r>
       <w:bookmarkEnd w:id="21"/>
-    </w:p>
-    <w:p>
-      <w:pPr>
-        <w:pStyle w:val="Ttulo3"/>
-        <w:jc w:val="both"/>
-        <w:rPr>
-          <w:i w:val="0"/>
-        </w:rPr>
-      </w:pPr>
-    </w:p>
-    <w:p>
-      <w:pPr>
-        <w:pStyle w:val="Ttulo3"/>
-        <w:jc w:val="both"/>
-        <w:rPr>
-          <w:i w:val="0"/>
-        </w:rPr>
-      </w:pPr>
-      <w:bookmarkStart w:id="22" w:name="_Toc16793"/>
-      <w:r>
-        <w:rPr>
-          <w:i w:val="0"/>
-        </w:rPr>
-        <w:t>3.4</w:t>
-      </w:r>
-      <w:r>
-        <w:tab/>
-      </w:r>
-      <w:r>
-        <w:rPr>
-          <w:i w:val="0"/>
-        </w:rPr>
-        <w:t>REQUISITOS DE BANCO DE DADOS</w:t>
-      </w:r>
-      <w:bookmarkEnd w:id="22"/>
     </w:p>
     <w:p>
       <w:pPr>
@@ -3882,7 +3871,7 @@
           <w:iCs/>
         </w:rPr>
       </w:pPr>
-      <w:bookmarkStart w:id="23" w:name="_Toc27034"/>
+      <w:bookmarkStart w:id="22" w:name="_Toc27034"/>
       <w:r>
         <w:rPr>
           <w:i w:val="0"/>
@@ -3898,7 +3887,7 @@
         </w:rPr>
         <w:t>MODELO FÍSICO E LÓGICO DA BASE DE DADOS</w:t>
       </w:r>
-      <w:bookmarkEnd w:id="23"/>
+      <w:bookmarkEnd w:id="22"/>
     </w:p>
     <w:p>
       <w:pPr>
@@ -3977,7 +3966,7 @@
           <w:iCs/>
         </w:rPr>
       </w:pPr>
-      <w:bookmarkStart w:id="24" w:name="_Toc16266"/>
+      <w:bookmarkStart w:id="23" w:name="_Toc16266"/>
       <w:r>
         <w:rPr>
           <w:i w:val="0"/>
@@ -3993,7 +3982,7 @@
         </w:rPr>
         <w:t>DICIONÁRIO DE DADOS</w:t>
       </w:r>
-      <w:bookmarkEnd w:id="24"/>
+      <w:bookmarkEnd w:id="23"/>
     </w:p>
     <w:p>
       <w:pPr>
@@ -4023,7 +4012,7 @@
           <w:iCs/>
         </w:rPr>
       </w:pPr>
-      <w:bookmarkStart w:id="25" w:name="_Toc7182"/>
+      <w:bookmarkStart w:id="24" w:name="_Toc7182"/>
       <w:r>
         <w:rPr>
           <w:i w:val="0"/>
@@ -4039,7 +4028,7 @@
         <w:tab/>
         <w:t>SCRIPTS DE CRIAÇÃO DE BANCO DE DADOS E TABELAS</w:t>
       </w:r>
-      <w:bookmarkEnd w:id="25"/>
+      <w:bookmarkEnd w:id="24"/>
     </w:p>
     <w:p>
       <w:pPr>
@@ -4072,21 +4061,21 @@
         <w:pStyle w:val="Ttulo1"/>
         <w:jc w:val="center"/>
       </w:pPr>
-      <w:bookmarkStart w:id="26" w:name="_Toc21242"/>
+      <w:bookmarkStart w:id="25" w:name="_Toc21242"/>
       <w:r>
         <w:lastRenderedPageBreak/>
         <w:t>ANEXOS</w:t>
       </w:r>
-      <w:bookmarkEnd w:id="26"/>
+      <w:bookmarkEnd w:id="25"/>
     </w:p>
     <w:p/>
     <w:p>
-      <w:bookmarkStart w:id="27" w:name="Ata_1"/>
+      <w:bookmarkStart w:id="26" w:name="Ata_1"/>
       <w:r>
         <w:t>Ata 1</w:t>
       </w:r>
     </w:p>
-    <w:bookmarkEnd w:id="27"/>
+    <w:bookmarkEnd w:id="26"/>
     <w:p>
       <w:pPr>
         <w:jc w:val="both"/>
@@ -4144,12 +4133,12 @@
       </w:r>
     </w:p>
     <w:p>
-      <w:bookmarkStart w:id="28" w:name="Ata_2"/>
+      <w:bookmarkStart w:id="27" w:name="Ata_2"/>
       <w:r>
         <w:t>Ata 2</w:t>
       </w:r>
     </w:p>
-    <w:bookmarkEnd w:id="28"/>
+    <w:bookmarkEnd w:id="27"/>
     <w:p>
       <w:pPr>
         <w:jc w:val="both"/>
@@ -4225,7 +4214,7 @@
       <w:pPr>
         <w:jc w:val="both"/>
       </w:pPr>
-      <w:bookmarkStart w:id="29" w:name="Ata_3"/>
+      <w:bookmarkStart w:id="28" w:name="Ata_3"/>
       <w:r>
         <w:t>Ata</w:t>
       </w:r>
@@ -4233,7 +4222,7 @@
         <w:t xml:space="preserve"> 3</w:t>
       </w:r>
     </w:p>
-    <w:bookmarkEnd w:id="29"/>
+    <w:bookmarkEnd w:id="28"/>
     <w:p>
       <w:pPr>
         <w:jc w:val="both"/>
@@ -4290,12 +4279,12 @@
       <w:pPr>
         <w:jc w:val="both"/>
       </w:pPr>
-      <w:bookmarkStart w:id="30" w:name="Ata_4"/>
+      <w:bookmarkStart w:id="29" w:name="Ata_4"/>
       <w:r>
         <w:t>Ata 4</w:t>
       </w:r>
     </w:p>
-    <w:bookmarkEnd w:id="30"/>
+    <w:bookmarkEnd w:id="29"/>
     <w:p>
       <w:pPr>
         <w:jc w:val="both"/>
@@ -4352,12 +4341,12 @@
     <w:p/>
     <w:p/>
     <w:p>
-      <w:bookmarkStart w:id="31" w:name="Ata_5"/>
+      <w:bookmarkStart w:id="30" w:name="Ata_5"/>
       <w:r>
         <w:t>Ata 5</w:t>
       </w:r>
     </w:p>
-    <w:bookmarkEnd w:id="31"/>
+    <w:bookmarkEnd w:id="30"/>
     <w:p>
       <w:r>
         <w:rPr>
@@ -4468,7 +4457,7 @@
 </file>
 
 <file path=word/endnotes.xml><?xml version="1.0" encoding="utf-8"?>
-<w:endnotes xmlns:wpc="http://schemas.microsoft.com/office/word/2010/wordprocessingCanvas" xmlns:cx="http://schemas.microsoft.com/office/drawing/2014/chartex" xmlns:mc="http://schemas.openxmlformats.org/markup-compatibility/2006" xmlns:o="urn:schemas-microsoft-com:office:office" xmlns:r="http://schemas.openxmlformats.org/officeDocument/2006/relationships" xmlns:m="http://schemas.openxmlformats.org/officeDocument/2006/math" xmlns:v="urn:schemas-microsoft-com:vml" xmlns:wp14="http://schemas.microsoft.com/office/word/2010/wordprocessingDrawing" xmlns:wp="http://schemas.openxmlformats.org/drawingml/2006/wordprocessingDrawing" xmlns:w10="urn:schemas-microsoft-com:office:word" xmlns:w="http://schemas.openxmlformats.org/wordprocessingml/2006/main" xmlns:w14="http://schemas.microsoft.com/office/word/2010/wordml" xmlns:w15="http://schemas.microsoft.com/office/word/2012/wordml" xmlns:w16se="http://schemas.microsoft.com/office/word/2015/wordml/symex" xmlns:wpg="http://schemas.microsoft.com/office/word/2010/wordprocessingGroup" xmlns:wpi="http://schemas.microsoft.com/office/word/2010/wordprocessingInk" xmlns:wne="http://schemas.microsoft.com/office/word/2006/wordml" xmlns:wps="http://schemas.microsoft.com/office/word/2010/wordprocessingShape" mc:Ignorable="w14 w15 w16se wp14">
+<w:endnotes xmlns:wpc="http://schemas.microsoft.com/office/word/2010/wordprocessingCanvas" xmlns:cx="http://schemas.microsoft.com/office/drawing/2014/chartex" xmlns:cx1="http://schemas.microsoft.com/office/drawing/2015/9/8/chartex" xmlns:cx2="http://schemas.microsoft.com/office/drawing/2015/10/21/chartex" xmlns:cx3="http://schemas.microsoft.com/office/drawing/2016/5/9/chartex" xmlns:cx4="http://schemas.microsoft.com/office/drawing/2016/5/10/chartex" xmlns:cx5="http://schemas.microsoft.com/office/drawing/2016/5/11/chartex" xmlns:cx6="http://schemas.microsoft.com/office/drawing/2016/5/12/chartex" xmlns:cx7="http://schemas.microsoft.com/office/drawing/2016/5/13/chartex" xmlns:cx8="http://schemas.microsoft.com/office/drawing/2016/5/14/chartex" xmlns:mc="http://schemas.openxmlformats.org/markup-compatibility/2006" xmlns:aink="http://schemas.microsoft.com/office/drawing/2016/ink" xmlns:am3d="http://schemas.microsoft.com/office/drawing/2017/model3d" xmlns:o="urn:schemas-microsoft-com:office:office" xmlns:r="http://schemas.openxmlformats.org/officeDocument/2006/relationships" xmlns:m="http://schemas.openxmlformats.org/officeDocument/2006/math" xmlns:v="urn:schemas-microsoft-com:vml" xmlns:wp14="http://schemas.microsoft.com/office/word/2010/wordprocessingDrawing" xmlns:wp="http://schemas.openxmlformats.org/drawingml/2006/wordprocessingDrawing" xmlns:w10="urn:schemas-microsoft-com:office:word" xmlns:w="http://schemas.openxmlformats.org/wordprocessingml/2006/main" xmlns:w14="http://schemas.microsoft.com/office/word/2010/wordml" xmlns:w15="http://schemas.microsoft.com/office/word/2012/wordml" xmlns:w16cex="http://schemas.microsoft.com/office/word/2018/wordml/cex" xmlns:w16cid="http://schemas.microsoft.com/office/word/2016/wordml/cid" xmlns:w16="http://schemas.microsoft.com/office/word/2018/wordml" xmlns:w16sdtdh="http://schemas.microsoft.com/office/word/2020/wordml/sdtdatahash" xmlns:w16se="http://schemas.microsoft.com/office/word/2015/wordml/symex" xmlns:wpg="http://schemas.microsoft.com/office/word/2010/wordprocessingGroup" xmlns:wpi="http://schemas.microsoft.com/office/word/2010/wordprocessingInk" xmlns:wne="http://schemas.microsoft.com/office/word/2006/wordml" xmlns:wps="http://schemas.microsoft.com/office/word/2010/wordprocessingShape" mc:Ignorable="w14 w15 w16se w16cid w16 w16cex w16sdtdh wp14">
   <w:endnote w:type="separator" w:id="-1">
     <w:p>
       <w:pPr>
@@ -4493,7 +4482,7 @@
 </file>
 
 <file path=word/footer1.xml><?xml version="1.0" encoding="utf-8"?>
-<w:ftr xmlns:wpc="http://schemas.microsoft.com/office/word/2010/wordprocessingCanvas" xmlns:cx="http://schemas.microsoft.com/office/drawing/2014/chartex" xmlns:mc="http://schemas.openxmlformats.org/markup-compatibility/2006" xmlns:o="urn:schemas-microsoft-com:office:office" xmlns:r="http://schemas.openxmlformats.org/officeDocument/2006/relationships" xmlns:m="http://schemas.openxmlformats.org/officeDocument/2006/math" xmlns:v="urn:schemas-microsoft-com:vml" xmlns:wp14="http://schemas.microsoft.com/office/word/2010/wordprocessingDrawing" xmlns:wp="http://schemas.openxmlformats.org/drawingml/2006/wordprocessingDrawing" xmlns:w10="urn:schemas-microsoft-com:office:word" xmlns:w="http://schemas.openxmlformats.org/wordprocessingml/2006/main" xmlns:w14="http://schemas.microsoft.com/office/word/2010/wordml" xmlns:w15="http://schemas.microsoft.com/office/word/2012/wordml" xmlns:w16se="http://schemas.microsoft.com/office/word/2015/wordml/symex" xmlns:wpg="http://schemas.microsoft.com/office/word/2010/wordprocessingGroup" xmlns:wpi="http://schemas.microsoft.com/office/word/2010/wordprocessingInk" xmlns:wne="http://schemas.microsoft.com/office/word/2006/wordml" xmlns:wps="http://schemas.microsoft.com/office/word/2010/wordprocessingShape" mc:Ignorable="w14 w15 w16se wp14">
+<w:ftr xmlns:wpc="http://schemas.microsoft.com/office/word/2010/wordprocessingCanvas" xmlns:cx="http://schemas.microsoft.com/office/drawing/2014/chartex" xmlns:cx1="http://schemas.microsoft.com/office/drawing/2015/9/8/chartex" xmlns:cx2="http://schemas.microsoft.com/office/drawing/2015/10/21/chartex" xmlns:cx3="http://schemas.microsoft.com/office/drawing/2016/5/9/chartex" xmlns:cx4="http://schemas.microsoft.com/office/drawing/2016/5/10/chartex" xmlns:cx5="http://schemas.microsoft.com/office/drawing/2016/5/11/chartex" xmlns:cx6="http://schemas.microsoft.com/office/drawing/2016/5/12/chartex" xmlns:cx7="http://schemas.microsoft.com/office/drawing/2016/5/13/chartex" xmlns:cx8="http://schemas.microsoft.com/office/drawing/2016/5/14/chartex" xmlns:mc="http://schemas.openxmlformats.org/markup-compatibility/2006" xmlns:aink="http://schemas.microsoft.com/office/drawing/2016/ink" xmlns:am3d="http://schemas.microsoft.com/office/drawing/2017/model3d" xmlns:o="urn:schemas-microsoft-com:office:office" xmlns:r="http://schemas.openxmlformats.org/officeDocument/2006/relationships" xmlns:m="http://schemas.openxmlformats.org/officeDocument/2006/math" xmlns:v="urn:schemas-microsoft-com:vml" xmlns:wp14="http://schemas.microsoft.com/office/word/2010/wordprocessingDrawing" xmlns:wp="http://schemas.openxmlformats.org/drawingml/2006/wordprocessingDrawing" xmlns:w10="urn:schemas-microsoft-com:office:word" xmlns:w="http://schemas.openxmlformats.org/wordprocessingml/2006/main" xmlns:w14="http://schemas.microsoft.com/office/word/2010/wordml" xmlns:w15="http://schemas.microsoft.com/office/word/2012/wordml" xmlns:w16cex="http://schemas.microsoft.com/office/word/2018/wordml/cex" xmlns:w16cid="http://schemas.microsoft.com/office/word/2016/wordml/cid" xmlns:w16="http://schemas.microsoft.com/office/word/2018/wordml" xmlns:w16sdtdh="http://schemas.microsoft.com/office/word/2020/wordml/sdtdatahash" xmlns:w16se="http://schemas.microsoft.com/office/word/2015/wordml/symex" xmlns:wpg="http://schemas.microsoft.com/office/word/2010/wordprocessingGroup" xmlns:wpi="http://schemas.microsoft.com/office/word/2010/wordprocessingInk" xmlns:wne="http://schemas.microsoft.com/office/word/2006/wordml" xmlns:wps="http://schemas.microsoft.com/office/word/2010/wordprocessingShape" mc:Ignorable="w14 w15 w16se w16cid w16 w16cex w16sdtdh wp14">
   <w:p>
     <w:pPr>
       <w:pStyle w:val="Rodap"/>
@@ -4503,7 +4492,7 @@
 </file>
 
 <file path=word/footnotes.xml><?xml version="1.0" encoding="utf-8"?>
-<w:footnotes xmlns:wpc="http://schemas.microsoft.com/office/word/2010/wordprocessingCanvas" xmlns:cx="http://schemas.microsoft.com/office/drawing/2014/chartex" xmlns:mc="http://schemas.openxmlformats.org/markup-compatibility/2006" xmlns:o="urn:schemas-microsoft-com:office:office" xmlns:r="http://schemas.openxmlformats.org/officeDocument/2006/relationships" xmlns:m="http://schemas.openxmlformats.org/officeDocument/2006/math" xmlns:v="urn:schemas-microsoft-com:vml" xmlns:wp14="http://schemas.microsoft.com/office/word/2010/wordprocessingDrawing" xmlns:wp="http://schemas.openxmlformats.org/drawingml/2006/wordprocessingDrawing" xmlns:w10="urn:schemas-microsoft-com:office:word" xmlns:w="http://schemas.openxmlformats.org/wordprocessingml/2006/main" xmlns:w14="http://schemas.microsoft.com/office/word/2010/wordml" xmlns:w15="http://schemas.microsoft.com/office/word/2012/wordml" xmlns:w16se="http://schemas.microsoft.com/office/word/2015/wordml/symex" xmlns:wpg="http://schemas.microsoft.com/office/word/2010/wordprocessingGroup" xmlns:wpi="http://schemas.microsoft.com/office/word/2010/wordprocessingInk" xmlns:wne="http://schemas.microsoft.com/office/word/2006/wordml" xmlns:wps="http://schemas.microsoft.com/office/word/2010/wordprocessingShape" mc:Ignorable="w14 w15 w16se wp14">
+<w:footnotes xmlns:wpc="http://schemas.microsoft.com/office/word/2010/wordprocessingCanvas" xmlns:cx="http://schemas.microsoft.com/office/drawing/2014/chartex" xmlns:cx1="http://schemas.microsoft.com/office/drawing/2015/9/8/chartex" xmlns:cx2="http://schemas.microsoft.com/office/drawing/2015/10/21/chartex" xmlns:cx3="http://schemas.microsoft.com/office/drawing/2016/5/9/chartex" xmlns:cx4="http://schemas.microsoft.com/office/drawing/2016/5/10/chartex" xmlns:cx5="http://schemas.microsoft.com/office/drawing/2016/5/11/chartex" xmlns:cx6="http://schemas.microsoft.com/office/drawing/2016/5/12/chartex" xmlns:cx7="http://schemas.microsoft.com/office/drawing/2016/5/13/chartex" xmlns:cx8="http://schemas.microsoft.com/office/drawing/2016/5/14/chartex" xmlns:mc="http://schemas.openxmlformats.org/markup-compatibility/2006" xmlns:aink="http://schemas.microsoft.com/office/drawing/2016/ink" xmlns:am3d="http://schemas.microsoft.com/office/drawing/2017/model3d" xmlns:o="urn:schemas-microsoft-com:office:office" xmlns:r="http://schemas.openxmlformats.org/officeDocument/2006/relationships" xmlns:m="http://schemas.openxmlformats.org/officeDocument/2006/math" xmlns:v="urn:schemas-microsoft-com:vml" xmlns:wp14="http://schemas.microsoft.com/office/word/2010/wordprocessingDrawing" xmlns:wp="http://schemas.openxmlformats.org/drawingml/2006/wordprocessingDrawing" xmlns:w10="urn:schemas-microsoft-com:office:word" xmlns:w="http://schemas.openxmlformats.org/wordprocessingml/2006/main" xmlns:w14="http://schemas.microsoft.com/office/word/2010/wordml" xmlns:w15="http://schemas.microsoft.com/office/word/2012/wordml" xmlns:w16cex="http://schemas.microsoft.com/office/word/2018/wordml/cex" xmlns:w16cid="http://schemas.microsoft.com/office/word/2016/wordml/cid" xmlns:w16="http://schemas.microsoft.com/office/word/2018/wordml" xmlns:w16sdtdh="http://schemas.microsoft.com/office/word/2020/wordml/sdtdatahash" xmlns:w16se="http://schemas.microsoft.com/office/word/2015/wordml/symex" xmlns:wpg="http://schemas.microsoft.com/office/word/2010/wordprocessingGroup" xmlns:wpi="http://schemas.microsoft.com/office/word/2010/wordprocessingInk" xmlns:wne="http://schemas.microsoft.com/office/word/2006/wordml" xmlns:wps="http://schemas.microsoft.com/office/word/2010/wordprocessingShape" mc:Ignorable="w14 w15 w16se w16cid w16 w16cex w16sdtdh wp14">
   <w:footnote w:type="separator" w:id="-1">
     <w:p>
       <w:r>
@@ -4522,7 +4511,7 @@
 </file>
 
 <file path=word/header1.xml><?xml version="1.0" encoding="utf-8"?>
-<w:hdr xmlns:wpc="http://schemas.microsoft.com/office/word/2010/wordprocessingCanvas" xmlns:cx="http://schemas.microsoft.com/office/drawing/2014/chartex" xmlns:mc="http://schemas.openxmlformats.org/markup-compatibility/2006" xmlns:o="urn:schemas-microsoft-com:office:office" xmlns:r="http://schemas.openxmlformats.org/officeDocument/2006/relationships" xmlns:m="http://schemas.openxmlformats.org/officeDocument/2006/math" xmlns:v="urn:schemas-microsoft-com:vml" xmlns:wp14="http://schemas.microsoft.com/office/word/2010/wordprocessingDrawing" xmlns:wp="http://schemas.openxmlformats.org/drawingml/2006/wordprocessingDrawing" xmlns:w10="urn:schemas-microsoft-com:office:word" xmlns:w="http://schemas.openxmlformats.org/wordprocessingml/2006/main" xmlns:w14="http://schemas.microsoft.com/office/word/2010/wordml" xmlns:w15="http://schemas.microsoft.com/office/word/2012/wordml" xmlns:w16se="http://schemas.microsoft.com/office/word/2015/wordml/symex" xmlns:wpg="http://schemas.microsoft.com/office/word/2010/wordprocessingGroup" xmlns:wpi="http://schemas.microsoft.com/office/word/2010/wordprocessingInk" xmlns:wne="http://schemas.microsoft.com/office/word/2006/wordml" xmlns:wps="http://schemas.microsoft.com/office/word/2010/wordprocessingShape" mc:Ignorable="w14 w15 w16se wp14">
+<w:hdr xmlns:wpc="http://schemas.microsoft.com/office/word/2010/wordprocessingCanvas" xmlns:cx="http://schemas.microsoft.com/office/drawing/2014/chartex" xmlns:cx1="http://schemas.microsoft.com/office/drawing/2015/9/8/chartex" xmlns:cx2="http://schemas.microsoft.com/office/drawing/2015/10/21/chartex" xmlns:cx3="http://schemas.microsoft.com/office/drawing/2016/5/9/chartex" xmlns:cx4="http://schemas.microsoft.com/office/drawing/2016/5/10/chartex" xmlns:cx5="http://schemas.microsoft.com/office/drawing/2016/5/11/chartex" xmlns:cx6="http://schemas.microsoft.com/office/drawing/2016/5/12/chartex" xmlns:cx7="http://schemas.microsoft.com/office/drawing/2016/5/13/chartex" xmlns:cx8="http://schemas.microsoft.com/office/drawing/2016/5/14/chartex" xmlns:mc="http://schemas.openxmlformats.org/markup-compatibility/2006" xmlns:aink="http://schemas.microsoft.com/office/drawing/2016/ink" xmlns:am3d="http://schemas.microsoft.com/office/drawing/2017/model3d" xmlns:o="urn:schemas-microsoft-com:office:office" xmlns:r="http://schemas.openxmlformats.org/officeDocument/2006/relationships" xmlns:m="http://schemas.openxmlformats.org/officeDocument/2006/math" xmlns:v="urn:schemas-microsoft-com:vml" xmlns:wp14="http://schemas.microsoft.com/office/word/2010/wordprocessingDrawing" xmlns:wp="http://schemas.openxmlformats.org/drawingml/2006/wordprocessingDrawing" xmlns:w10="urn:schemas-microsoft-com:office:word" xmlns:w="http://schemas.openxmlformats.org/wordprocessingml/2006/main" xmlns:w14="http://schemas.microsoft.com/office/word/2010/wordml" xmlns:w15="http://schemas.microsoft.com/office/word/2012/wordml" xmlns:w16cex="http://schemas.microsoft.com/office/word/2018/wordml/cex" xmlns:w16cid="http://schemas.microsoft.com/office/word/2016/wordml/cid" xmlns:w16="http://schemas.microsoft.com/office/word/2018/wordml" xmlns:w16sdtdh="http://schemas.microsoft.com/office/word/2020/wordml/sdtdatahash" xmlns:w16se="http://schemas.microsoft.com/office/word/2015/wordml/symex" xmlns:wpg="http://schemas.microsoft.com/office/word/2010/wordprocessingGroup" xmlns:wpi="http://schemas.microsoft.com/office/word/2010/wordprocessingInk" xmlns:wne="http://schemas.microsoft.com/office/word/2006/wordml" xmlns:wps="http://schemas.microsoft.com/office/word/2010/wordprocessingShape" mc:Ignorable="w14 w15 w16se w16cid w16 w16cex w16sdtdh wp14">
   <w:p>
     <w:pPr>
       <w:pStyle w:val="Cabealho"/>
@@ -4538,7 +4527,7 @@
 </file>
 
 <file path=word/header2.xml><?xml version="1.0" encoding="utf-8"?>
-<w:hdr xmlns:wpc="http://schemas.microsoft.com/office/word/2010/wordprocessingCanvas" xmlns:cx="http://schemas.microsoft.com/office/drawing/2014/chartex" xmlns:mc="http://schemas.openxmlformats.org/markup-compatibility/2006" xmlns:o="urn:schemas-microsoft-com:office:office" xmlns:r="http://schemas.openxmlformats.org/officeDocument/2006/relationships" xmlns:m="http://schemas.openxmlformats.org/officeDocument/2006/math" xmlns:v="urn:schemas-microsoft-com:vml" xmlns:wp14="http://schemas.microsoft.com/office/word/2010/wordprocessingDrawing" xmlns:wp="http://schemas.openxmlformats.org/drawingml/2006/wordprocessingDrawing" xmlns:w10="urn:schemas-microsoft-com:office:word" xmlns:w="http://schemas.openxmlformats.org/wordprocessingml/2006/main" xmlns:w14="http://schemas.microsoft.com/office/word/2010/wordml" xmlns:w15="http://schemas.microsoft.com/office/word/2012/wordml" xmlns:w16se="http://schemas.microsoft.com/office/word/2015/wordml/symex" xmlns:wpg="http://schemas.microsoft.com/office/word/2010/wordprocessingGroup" xmlns:wpi="http://schemas.microsoft.com/office/word/2010/wordprocessingInk" xmlns:wne="http://schemas.microsoft.com/office/word/2006/wordml" xmlns:wps="http://schemas.microsoft.com/office/word/2010/wordprocessingShape" mc:Ignorable="w14 w15 w16se wp14">
+<w:hdr xmlns:wpc="http://schemas.microsoft.com/office/word/2010/wordprocessingCanvas" xmlns:cx="http://schemas.microsoft.com/office/drawing/2014/chartex" xmlns:cx1="http://schemas.microsoft.com/office/drawing/2015/9/8/chartex" xmlns:cx2="http://schemas.microsoft.com/office/drawing/2015/10/21/chartex" xmlns:cx3="http://schemas.microsoft.com/office/drawing/2016/5/9/chartex" xmlns:cx4="http://schemas.microsoft.com/office/drawing/2016/5/10/chartex" xmlns:cx5="http://schemas.microsoft.com/office/drawing/2016/5/11/chartex" xmlns:cx6="http://schemas.microsoft.com/office/drawing/2016/5/12/chartex" xmlns:cx7="http://schemas.microsoft.com/office/drawing/2016/5/13/chartex" xmlns:cx8="http://schemas.microsoft.com/office/drawing/2016/5/14/chartex" xmlns:mc="http://schemas.openxmlformats.org/markup-compatibility/2006" xmlns:aink="http://schemas.microsoft.com/office/drawing/2016/ink" xmlns:am3d="http://schemas.microsoft.com/office/drawing/2017/model3d" xmlns:o="urn:schemas-microsoft-com:office:office" xmlns:r="http://schemas.openxmlformats.org/officeDocument/2006/relationships" xmlns:m="http://schemas.openxmlformats.org/officeDocument/2006/math" xmlns:v="urn:schemas-microsoft-com:vml" xmlns:wp14="http://schemas.microsoft.com/office/word/2010/wordprocessingDrawing" xmlns:wp="http://schemas.openxmlformats.org/drawingml/2006/wordprocessingDrawing" xmlns:w10="urn:schemas-microsoft-com:office:word" xmlns:w="http://schemas.openxmlformats.org/wordprocessingml/2006/main" xmlns:w14="http://schemas.microsoft.com/office/word/2010/wordml" xmlns:w15="http://schemas.microsoft.com/office/word/2012/wordml" xmlns:w16cex="http://schemas.microsoft.com/office/word/2018/wordml/cex" xmlns:w16cid="http://schemas.microsoft.com/office/word/2016/wordml/cid" xmlns:w16="http://schemas.microsoft.com/office/word/2018/wordml" xmlns:w16sdtdh="http://schemas.microsoft.com/office/word/2020/wordml/sdtdatahash" xmlns:w16se="http://schemas.microsoft.com/office/word/2015/wordml/symex" xmlns:wpg="http://schemas.microsoft.com/office/word/2010/wordprocessingGroup" xmlns:wpi="http://schemas.microsoft.com/office/word/2010/wordprocessingInk" xmlns:wne="http://schemas.microsoft.com/office/word/2006/wordml" xmlns:wps="http://schemas.microsoft.com/office/word/2010/wordprocessingShape" mc:Ignorable="w14 w15 w16se w16cid w16 w16cex w16sdtdh wp14">
   <w:sdt>
     <w:sdtPr>
       <w:id w:val="-1699001773"/>
@@ -4607,7 +4596,7 @@
 </file>
 
 <file path=word/header3.xml><?xml version="1.0" encoding="utf-8"?>
-<w:hdr xmlns:wpc="http://schemas.microsoft.com/office/word/2010/wordprocessingCanvas" xmlns:cx="http://schemas.microsoft.com/office/drawing/2014/chartex" xmlns:mc="http://schemas.openxmlformats.org/markup-compatibility/2006" xmlns:o="urn:schemas-microsoft-com:office:office" xmlns:r="http://schemas.openxmlformats.org/officeDocument/2006/relationships" xmlns:m="http://schemas.openxmlformats.org/officeDocument/2006/math" xmlns:v="urn:schemas-microsoft-com:vml" xmlns:wp14="http://schemas.microsoft.com/office/word/2010/wordprocessingDrawing" xmlns:wp="http://schemas.openxmlformats.org/drawingml/2006/wordprocessingDrawing" xmlns:w10="urn:schemas-microsoft-com:office:word" xmlns:w="http://schemas.openxmlformats.org/wordprocessingml/2006/main" xmlns:w14="http://schemas.microsoft.com/office/word/2010/wordml" xmlns:w15="http://schemas.microsoft.com/office/word/2012/wordml" xmlns:w16se="http://schemas.microsoft.com/office/word/2015/wordml/symex" xmlns:wpg="http://schemas.microsoft.com/office/word/2010/wordprocessingGroup" xmlns:wpi="http://schemas.microsoft.com/office/word/2010/wordprocessingInk" xmlns:wne="http://schemas.microsoft.com/office/word/2006/wordml" xmlns:wps="http://schemas.microsoft.com/office/word/2010/wordprocessingShape" mc:Ignorable="w14 w15 w16se wp14">
+<w:hdr xmlns:wpc="http://schemas.microsoft.com/office/word/2010/wordprocessingCanvas" xmlns:cx="http://schemas.microsoft.com/office/drawing/2014/chartex" xmlns:cx1="http://schemas.microsoft.com/office/drawing/2015/9/8/chartex" xmlns:cx2="http://schemas.microsoft.com/office/drawing/2015/10/21/chartex" xmlns:cx3="http://schemas.microsoft.com/office/drawing/2016/5/9/chartex" xmlns:cx4="http://schemas.microsoft.com/office/drawing/2016/5/10/chartex" xmlns:cx5="http://schemas.microsoft.com/office/drawing/2016/5/11/chartex" xmlns:cx6="http://schemas.microsoft.com/office/drawing/2016/5/12/chartex" xmlns:cx7="http://schemas.microsoft.com/office/drawing/2016/5/13/chartex" xmlns:cx8="http://schemas.microsoft.com/office/drawing/2016/5/14/chartex" xmlns:mc="http://schemas.openxmlformats.org/markup-compatibility/2006" xmlns:aink="http://schemas.microsoft.com/office/drawing/2016/ink" xmlns:am3d="http://schemas.microsoft.com/office/drawing/2017/model3d" xmlns:o="urn:schemas-microsoft-com:office:office" xmlns:r="http://schemas.openxmlformats.org/officeDocument/2006/relationships" xmlns:m="http://schemas.openxmlformats.org/officeDocument/2006/math" xmlns:v="urn:schemas-microsoft-com:vml" xmlns:wp14="http://schemas.microsoft.com/office/word/2010/wordprocessingDrawing" xmlns:wp="http://schemas.openxmlformats.org/drawingml/2006/wordprocessingDrawing" xmlns:w10="urn:schemas-microsoft-com:office:word" xmlns:w="http://schemas.openxmlformats.org/wordprocessingml/2006/main" xmlns:w14="http://schemas.microsoft.com/office/word/2010/wordml" xmlns:w15="http://schemas.microsoft.com/office/word/2012/wordml" xmlns:w16cex="http://schemas.microsoft.com/office/word/2018/wordml/cex" xmlns:w16cid="http://schemas.microsoft.com/office/word/2016/wordml/cid" xmlns:w16="http://schemas.microsoft.com/office/word/2018/wordml" xmlns:w16sdtdh="http://schemas.microsoft.com/office/word/2020/wordml/sdtdatahash" xmlns:w16se="http://schemas.microsoft.com/office/word/2015/wordml/symex" xmlns:wpg="http://schemas.microsoft.com/office/word/2010/wordprocessingGroup" xmlns:wpi="http://schemas.microsoft.com/office/word/2010/wordprocessingInk" xmlns:wne="http://schemas.microsoft.com/office/word/2006/wordml" xmlns:wps="http://schemas.microsoft.com/office/word/2010/wordprocessingShape" mc:Ignorable="w14 w15 w16se w16cid w16 w16cex w16sdtdh wp14">
   <w:sdt>
     <w:sdtPr>
       <w:id w:val="958228592"/>
@@ -4688,7 +4677,7 @@
 </file>
 
 <file path=word/numbering.xml><?xml version="1.0" encoding="utf-8"?>
-<w:numbering xmlns:wpc="http://schemas.microsoft.com/office/word/2010/wordprocessingCanvas" xmlns:cx="http://schemas.microsoft.com/office/drawing/2014/chartex" xmlns:mc="http://schemas.openxmlformats.org/markup-compatibility/2006" xmlns:o="urn:schemas-microsoft-com:office:office" xmlns:r="http://schemas.openxmlformats.org/officeDocument/2006/relationships" xmlns:m="http://schemas.openxmlformats.org/officeDocument/2006/math" xmlns:v="urn:schemas-microsoft-com:vml" xmlns:wp14="http://schemas.microsoft.com/office/word/2010/wordprocessingDrawing" xmlns:wp="http://schemas.openxmlformats.org/drawingml/2006/wordprocessingDrawing" xmlns:w10="urn:schemas-microsoft-com:office:word" xmlns:w="http://schemas.openxmlformats.org/wordprocessingml/2006/main" xmlns:w14="http://schemas.microsoft.com/office/word/2010/wordml" xmlns:w15="http://schemas.microsoft.com/office/word/2012/wordml" xmlns:w16se="http://schemas.microsoft.com/office/word/2015/wordml/symex" xmlns:wpg="http://schemas.microsoft.com/office/word/2010/wordprocessingGroup" xmlns:wpi="http://schemas.microsoft.com/office/word/2010/wordprocessingInk" xmlns:wne="http://schemas.microsoft.com/office/word/2006/wordml" xmlns:wps="http://schemas.microsoft.com/office/word/2010/wordprocessingShape" mc:Ignorable="w14 w15 w16se wp14">
+<w:numbering xmlns:wpc="http://schemas.microsoft.com/office/word/2010/wordprocessingCanvas" xmlns:cx="http://schemas.microsoft.com/office/drawing/2014/chartex" xmlns:cx1="http://schemas.microsoft.com/office/drawing/2015/9/8/chartex" xmlns:cx2="http://schemas.microsoft.com/office/drawing/2015/10/21/chartex" xmlns:cx3="http://schemas.microsoft.com/office/drawing/2016/5/9/chartex" xmlns:cx4="http://schemas.microsoft.com/office/drawing/2016/5/10/chartex" xmlns:cx5="http://schemas.microsoft.com/office/drawing/2016/5/11/chartex" xmlns:cx6="http://schemas.microsoft.com/office/drawing/2016/5/12/chartex" xmlns:cx7="http://schemas.microsoft.com/office/drawing/2016/5/13/chartex" xmlns:cx8="http://schemas.microsoft.com/office/drawing/2016/5/14/chartex" xmlns:mc="http://schemas.openxmlformats.org/markup-compatibility/2006" xmlns:aink="http://schemas.microsoft.com/office/drawing/2016/ink" xmlns:am3d="http://schemas.microsoft.com/office/drawing/2017/model3d" xmlns:o="urn:schemas-microsoft-com:office:office" xmlns:r="http://schemas.openxmlformats.org/officeDocument/2006/relationships" xmlns:m="http://schemas.openxmlformats.org/officeDocument/2006/math" xmlns:v="urn:schemas-microsoft-com:vml" xmlns:wp14="http://schemas.microsoft.com/office/word/2010/wordprocessingDrawing" xmlns:wp="http://schemas.openxmlformats.org/drawingml/2006/wordprocessingDrawing" xmlns:w10="urn:schemas-microsoft-com:office:word" xmlns:w="http://schemas.openxmlformats.org/wordprocessingml/2006/main" xmlns:w14="http://schemas.microsoft.com/office/word/2010/wordml" xmlns:w15="http://schemas.microsoft.com/office/word/2012/wordml" xmlns:w16cex="http://schemas.microsoft.com/office/word/2018/wordml/cex" xmlns:w16cid="http://schemas.microsoft.com/office/word/2016/wordml/cid" xmlns:w16="http://schemas.microsoft.com/office/word/2018/wordml" xmlns:w16sdtdh="http://schemas.microsoft.com/office/word/2020/wordml/sdtdatahash" xmlns:w16se="http://schemas.microsoft.com/office/word/2015/wordml/symex" xmlns:wpg="http://schemas.microsoft.com/office/word/2010/wordprocessingGroup" xmlns:wpi="http://schemas.microsoft.com/office/word/2010/wordprocessingInk" xmlns:wne="http://schemas.microsoft.com/office/word/2006/wordml" xmlns:wps="http://schemas.microsoft.com/office/word/2010/wordprocessingShape" mc:Ignorable="w14 w15 w16se w16cid w16 w16cex w16sdtdh wp14">
   <w:abstractNum w:abstractNumId="0" w15:restartNumberingAfterBreak="0">
     <w:nsid w:val="0359FF69"/>
     <w:multiLevelType w:val="hybridMultilevel"/>
@@ -6989,7 +6978,7 @@
 </file>
 
 <file path=word/styles.xml><?xml version="1.0" encoding="utf-8"?>
-<w:styles xmlns:mc="http://schemas.openxmlformats.org/markup-compatibility/2006" xmlns:r="http://schemas.openxmlformats.org/officeDocument/2006/relationships" xmlns:w="http://schemas.openxmlformats.org/wordprocessingml/2006/main" xmlns:w14="http://schemas.microsoft.com/office/word/2010/wordml" xmlns:w15="http://schemas.microsoft.com/office/word/2012/wordml" xmlns:w16se="http://schemas.microsoft.com/office/word/2015/wordml/symex" mc:Ignorable="w14 w15 w16se">
+<w:styles xmlns:mc="http://schemas.openxmlformats.org/markup-compatibility/2006" xmlns:r="http://schemas.openxmlformats.org/officeDocument/2006/relationships" xmlns:w="http://schemas.openxmlformats.org/wordprocessingml/2006/main" xmlns:w14="http://schemas.microsoft.com/office/word/2010/wordml" xmlns:w15="http://schemas.microsoft.com/office/word/2012/wordml" xmlns:w16cex="http://schemas.microsoft.com/office/word/2018/wordml/cex" xmlns:w16cid="http://schemas.microsoft.com/office/word/2016/wordml/cid" xmlns:w16="http://schemas.microsoft.com/office/word/2018/wordml" xmlns:w16sdtdh="http://schemas.microsoft.com/office/word/2020/wordml/sdtdatahash" xmlns:w16se="http://schemas.microsoft.com/office/word/2015/wordml/symex" mc:Ignorable="w14 w15 w16se w16cid w16 w16cex w16sdtdh">
   <w:docDefaults>
     <w:rPrDefault>
       <w:rPr>
@@ -6999,7 +6988,7 @@
     </w:rPrDefault>
     <w:pPrDefault/>
   </w:docDefaults>
-  <w:latentStyles w:defLockedState="0" w:defUIPriority="99" w:defSemiHidden="0" w:defUnhideWhenUsed="0" w:defQFormat="0" w:count="371">
+  <w:latentStyles w:defLockedState="0" w:defUIPriority="99" w:defSemiHidden="0" w:defUnhideWhenUsed="0" w:defQFormat="0" w:count="376">
     <w:lsdException w:name="Normal" w:uiPriority="0" w:qFormat="1"/>
     <w:lsdException w:name="heading 1" w:uiPriority="9" w:qFormat="1"/>
     <w:lsdException w:name="heading 2" w:uiPriority="9" w:unhideWhenUsed="1" w:qFormat="1"/>
@@ -7105,7 +7094,7 @@
     <w:lsdException w:name="HTML Sample" w:semiHidden="1" w:unhideWhenUsed="1"/>
     <w:lsdException w:name="HTML Typewriter" w:semiHidden="1" w:unhideWhenUsed="1"/>
     <w:lsdException w:name="HTML Variable" w:semiHidden="1" w:unhideWhenUsed="1"/>
-    <w:lsdException w:name="Normal Table" w:semiHidden="1" w:unhideWhenUsed="1" w:qFormat="1"/>
+    <w:lsdException w:name="Normal Table" w:qFormat="1"/>
     <w:lsdException w:name="annotation subject" w:semiHidden="1" w:unhideWhenUsed="1" w:qFormat="1"/>
     <w:lsdException w:name="No List" w:semiHidden="1" w:unhideWhenUsed="1"/>
     <w:lsdException w:name="Outline List 1" w:semiHidden="1" w:unhideWhenUsed="1"/>
@@ -7148,11 +7137,8 @@
     <w:lsdException w:name="Table Contemporary" w:semiHidden="1" w:unhideWhenUsed="1"/>
     <w:lsdException w:name="Table Elegant" w:semiHidden="1" w:unhideWhenUsed="1"/>
     <w:lsdException w:name="Table Professional" w:semiHidden="1" w:unhideWhenUsed="1"/>
-    <w:lsdException w:name="Table Subtle 1" w:semiHidden="1" w:unhideWhenUsed="1"/>
     <w:lsdException w:name="Table Subtle 2" w:semiHidden="1" w:unhideWhenUsed="1"/>
     <w:lsdException w:name="Table Web 1" w:semiHidden="1" w:unhideWhenUsed="1"/>
-    <w:lsdException w:name="Table Web 2" w:semiHidden="1" w:unhideWhenUsed="1"/>
-    <w:lsdException w:name="Table Web 3" w:semiHidden="1" w:unhideWhenUsed="1"/>
     <w:lsdException w:name="Balloon Text" w:semiHidden="1" w:unhideWhenUsed="1" w:qFormat="1"/>
     <w:lsdException w:name="Table Grid" w:uiPriority="59"/>
     <w:lsdException w:name="Table Theme" w:semiHidden="1" w:unhideWhenUsed="1"/>
@@ -7173,10 +7159,6 @@
     <w:lsdException w:name="Colorful List"/>
     <w:lsdException w:name="Colorful Grid"/>
     <w:lsdException w:name="Light Shading Accent 1"/>
-    <w:lsdException w:name="Light List Accent 1"/>
-    <w:lsdException w:name="Light Grid Accent 1"/>
-    <w:lsdException w:name="Medium Shading 1 Accent 1"/>
-    <w:lsdException w:name="Medium Shading 2 Accent 1"/>
     <w:lsdException w:name="Medium List 1 Accent 1"/>
     <w:lsdException w:name="Revision" w:semiHidden="1" w:unhideWhenUsed="1"/>
     <w:lsdException w:name="List Paragraph" w:uiPriority="34" w:qFormat="1"/>
@@ -7255,11 +7237,6 @@
     <w:lsdException w:name="Medium List 2 Accent 6"/>
     <w:lsdException w:name="Medium Grid 1 Accent 6"/>
     <w:lsdException w:name="Medium Grid 2 Accent 6"/>
-    <w:lsdException w:name="Medium Grid 3 Accent 6"/>
-    <w:lsdException w:name="Dark List Accent 6"/>
-    <w:lsdException w:name="Colorful Shading Accent 6"/>
-    <w:lsdException w:name="Colorful List Accent 6"/>
-    <w:lsdException w:name="Colorful Grid Accent 6"/>
     <w:lsdException w:name="Subtle Emphasis" w:uiPriority="19" w:qFormat="1"/>
     <w:lsdException w:name="Intense Emphasis" w:uiPriority="21" w:qFormat="1"/>
     <w:lsdException w:name="Subtle Reference" w:uiPriority="31" w:qFormat="1"/>
@@ -7371,6 +7348,11 @@
     <w:lsdException w:name="List Table 5 Dark Accent 6" w:uiPriority="50"/>
     <w:lsdException w:name="List Table 6 Colorful Accent 6" w:uiPriority="51"/>
     <w:lsdException w:name="List Table 7 Colorful Accent 6" w:uiPriority="52"/>
+    <w:lsdException w:name="Mention" w:semiHidden="1" w:unhideWhenUsed="1"/>
+    <w:lsdException w:name="Smart Hyperlink" w:semiHidden="1" w:unhideWhenUsed="1"/>
+    <w:lsdException w:name="Hashtag" w:semiHidden="1" w:unhideWhenUsed="1"/>
+    <w:lsdException w:name="Unresolved Mention" w:semiHidden="1" w:unhideWhenUsed="1"/>
+    <w:lsdException w:name="Smart Link" w:semiHidden="1" w:unhideWhenUsed="1"/>
   </w:latentStyles>
   <w:style w:type="paragraph" w:default="1" w:styleId="Normal">
     <w:name w:val="Normal"/>
@@ -8291,8 +8273,8 @@
     <w:uiPriority w:val="99"/>
     <w:qFormat/>
   </w:style>
-  <w:style w:type="character" w:customStyle="1" w:styleId="UnresolvedMention">
-    <w:name w:val="Unresolved Mention"/>
+  <w:style w:type="character" w:customStyle="1" w:styleId="MenoPendente1">
+    <w:name w:val="Menção Pendente1"/>
     <w:basedOn w:val="Fontepargpadro"/>
     <w:uiPriority w:val="99"/>
     <w:semiHidden/>

</xml_diff>

<commit_message>
Adicionando o documento atualizado para o Github - 13/04/2026
</commit_message>
<xml_diff>
--- a/Terceiro_Semestre/Projeto_Integrador/Documentação/Modelo_Projeto_Integrador_principal.docx
+++ b/Terceiro_Semestre/Projeto_Integrador/Documentação/Modelo_Projeto_Integrador_principal.docx
@@ -2312,11 +2312,15 @@
     </w:p>
     <w:p>
       <w:pPr>
-        <w:ind w:left="851"/>
-        <w:jc w:val="both"/>
-      </w:pPr>
-      <w:r>
-        <w:t>Não Aplicável.</w:t>
+        <w:pStyle w:val="PargrafodaLista"/>
+        <w:numPr>
+          <w:ilvl w:val="0"/>
+          <w:numId w:val="21"/>
+        </w:numPr>
+        <w:jc w:val="both"/>
+      </w:pPr>
+      <w:r>
+        <w:t>RF: Requisito Funcional.</w:t>
       </w:r>
     </w:p>
     <w:p>
@@ -3829,12 +3833,636 @@
     </w:p>
     <w:p>
       <w:pPr>
-        <w:pStyle w:val="Ttulo3"/>
-        <w:jc w:val="both"/>
-        <w:rPr>
-          <w:i w:val="0"/>
-        </w:rPr>
-      </w:pPr>
+        <w:pStyle w:val="PargrafodaLista"/>
+        <w:numPr>
+          <w:ilvl w:val="0"/>
+          <w:numId w:val="22"/>
+        </w:numPr>
+        <w:rPr>
+          <w:b/>
+          <w:bCs/>
+        </w:rPr>
+      </w:pPr>
+      <w:r>
+        <w:rPr>
+          <w:b/>
+          <w:bCs/>
+        </w:rPr>
+        <w:t>RF01 - Autenticar usuário</w:t>
+      </w:r>
+    </w:p>
+    <w:p>
+      <w:pPr>
+        <w:pStyle w:val="PargrafodaLista"/>
+      </w:pPr>
+      <w:r>
+        <w:t>Atores: Diretor Acadêmico, Coordenador e Responsável do TI.</w:t>
+      </w:r>
+    </w:p>
+    <w:p>
+      <w:pPr>
+        <w:pStyle w:val="PargrafodaLista"/>
+      </w:pPr>
+      <w:r>
+        <w:t xml:space="preserve">Descrição: </w:t>
+      </w:r>
+      <w:r>
+        <w:t>O sistema deve permitir a autenticação de cada usuário conforme suas permissões de acesso.</w:t>
+      </w:r>
+    </w:p>
+    <w:p>
+      <w:pPr>
+        <w:pStyle w:val="PargrafodaLista"/>
+        <w:numPr>
+          <w:ilvl w:val="0"/>
+          <w:numId w:val="22"/>
+        </w:numPr>
+        <w:rPr>
+          <w:b/>
+          <w:bCs/>
+        </w:rPr>
+      </w:pPr>
+      <w:r>
+        <w:rPr>
+          <w:b/>
+          <w:bCs/>
+        </w:rPr>
+        <w:t>RF02 - Cadastrar laboratório</w:t>
+      </w:r>
+    </w:p>
+    <w:p>
+      <w:pPr>
+        <w:pStyle w:val="PargrafodaLista"/>
+      </w:pPr>
+      <w:r>
+        <w:t>Ator</w:t>
+      </w:r>
+      <w:r>
+        <w:t xml:space="preserve">: Diretor Acadêmico. </w:t>
+      </w:r>
+    </w:p>
+    <w:p>
+      <w:pPr>
+        <w:pStyle w:val="PargrafodaLista"/>
+      </w:pPr>
+      <w:r>
+        <w:t>Descrição: O sistema permitirá realizar os cadastros de laboratório da faculdade.</w:t>
+      </w:r>
+    </w:p>
+    <w:p>
+      <w:pPr>
+        <w:pStyle w:val="PargrafodaLista"/>
+        <w:numPr>
+          <w:ilvl w:val="0"/>
+          <w:numId w:val="22"/>
+        </w:numPr>
+        <w:rPr>
+          <w:b/>
+          <w:bCs/>
+        </w:rPr>
+      </w:pPr>
+      <w:r>
+        <w:rPr>
+          <w:b/>
+          <w:bCs/>
+        </w:rPr>
+        <w:lastRenderedPageBreak/>
+        <w:t>RF03 - Informar quantidade de computadores</w:t>
+      </w:r>
+    </w:p>
+    <w:p>
+      <w:pPr>
+        <w:pStyle w:val="PargrafodaLista"/>
+      </w:pPr>
+      <w:r>
+        <w:t>Ator: Diretor Acadêmico.</w:t>
+      </w:r>
+    </w:p>
+    <w:p>
+      <w:pPr>
+        <w:pStyle w:val="PargrafodaLista"/>
+      </w:pPr>
+      <w:r>
+        <w:t>Descrição: Deve ser informado a quantidade de computadores em cada laboratório.</w:t>
+      </w:r>
+    </w:p>
+    <w:p>
+      <w:pPr>
+        <w:pStyle w:val="PargrafodaLista"/>
+        <w:numPr>
+          <w:ilvl w:val="0"/>
+          <w:numId w:val="22"/>
+        </w:numPr>
+        <w:rPr>
+          <w:b/>
+          <w:bCs/>
+        </w:rPr>
+      </w:pPr>
+      <w:r>
+        <w:rPr>
+          <w:b/>
+          <w:bCs/>
+        </w:rPr>
+        <w:t>RF04 - Definir capacidade de alunos</w:t>
+      </w:r>
+    </w:p>
+    <w:p>
+      <w:pPr>
+        <w:pStyle w:val="PargrafodaLista"/>
+      </w:pPr>
+      <w:r>
+        <w:t>Ator: Diretor Acadêmico.</w:t>
+      </w:r>
+    </w:p>
+    <w:p>
+      <w:pPr>
+        <w:pStyle w:val="PargrafodaLista"/>
+      </w:pPr>
+      <w:r>
+        <w:t>Descrição: Deve ser informado a quantidade suportada de alunos em cada laboratório.</w:t>
+      </w:r>
+    </w:p>
+    <w:p>
+      <w:pPr>
+        <w:pStyle w:val="PargrafodaLista"/>
+        <w:numPr>
+          <w:ilvl w:val="0"/>
+          <w:numId w:val="22"/>
+        </w:numPr>
+        <w:rPr>
+          <w:b/>
+          <w:bCs/>
+        </w:rPr>
+      </w:pPr>
+      <w:r>
+        <w:rPr>
+          <w:b/>
+          <w:bCs/>
+        </w:rPr>
+        <w:t>RF05 - Aprovar Alocação</w:t>
+      </w:r>
+    </w:p>
+    <w:p>
+      <w:pPr>
+        <w:pStyle w:val="PargrafodaLista"/>
+      </w:pPr>
+      <w:r>
+        <w:t>Ator: Diretor Acadêmico.</w:t>
+      </w:r>
+    </w:p>
+    <w:p>
+      <w:pPr>
+        <w:pStyle w:val="PargrafodaLista"/>
+      </w:pPr>
+      <w:r>
+        <w:t xml:space="preserve">Descrição: </w:t>
+      </w:r>
+      <w:r>
+        <w:t>Deverá ser aprovado ou recusado as solicitações de alocação dos coordenadores.</w:t>
+      </w:r>
+    </w:p>
+    <w:p>
+      <w:pPr>
+        <w:pStyle w:val="PargrafodaLista"/>
+        <w:numPr>
+          <w:ilvl w:val="0"/>
+          <w:numId w:val="22"/>
+        </w:numPr>
+        <w:rPr>
+          <w:b/>
+          <w:bCs/>
+        </w:rPr>
+      </w:pPr>
+      <w:r>
+        <w:rPr>
+          <w:b/>
+          <w:bCs/>
+        </w:rPr>
+        <w:t xml:space="preserve">RF06 - Cadastrar </w:t>
+      </w:r>
+      <w:r>
+        <w:rPr>
+          <w:b/>
+          <w:bCs/>
+        </w:rPr>
+        <w:t>Coordenador</w:t>
+      </w:r>
+    </w:p>
+    <w:p>
+      <w:pPr>
+        <w:pStyle w:val="PargrafodaLista"/>
+      </w:pPr>
+      <w:r>
+        <w:t>Ator: Diretor Acadêmico.</w:t>
+      </w:r>
+    </w:p>
+    <w:p>
+      <w:pPr>
+        <w:pStyle w:val="PargrafodaLista"/>
+        <w:tabs>
+          <w:tab w:val="left" w:pos="2673"/>
+        </w:tabs>
+      </w:pPr>
+      <w:r>
+        <w:t>Descrição: O sistema permitirá o cadastro de usuários do tipo “Coordenador”.</w:t>
+      </w:r>
+    </w:p>
+    <w:p>
+      <w:pPr>
+        <w:pStyle w:val="PargrafodaLista"/>
+        <w:numPr>
+          <w:ilvl w:val="0"/>
+          <w:numId w:val="22"/>
+        </w:numPr>
+        <w:rPr>
+          <w:b/>
+          <w:bCs/>
+        </w:rPr>
+      </w:pPr>
+      <w:r>
+        <w:rPr>
+          <w:b/>
+          <w:bCs/>
+        </w:rPr>
+        <w:t>RF0</w:t>
+      </w:r>
+      <w:r>
+        <w:rPr>
+          <w:b/>
+          <w:bCs/>
+        </w:rPr>
+        <w:t>7</w:t>
+      </w:r>
+      <w:r>
+        <w:rPr>
+          <w:b/>
+          <w:bCs/>
+        </w:rPr>
+        <w:t xml:space="preserve"> - Cadastrar Responsável do TI</w:t>
+      </w:r>
+    </w:p>
+    <w:p>
+      <w:pPr>
+        <w:pStyle w:val="PargrafodaLista"/>
+      </w:pPr>
+      <w:r>
+        <w:t>Ator: Diretor Acadêmico.</w:t>
+      </w:r>
+    </w:p>
+    <w:p>
+      <w:pPr>
+        <w:pStyle w:val="PargrafodaLista"/>
+        <w:tabs>
+          <w:tab w:val="left" w:pos="2673"/>
+        </w:tabs>
+      </w:pPr>
+      <w:r>
+        <w:t>Descrição: O sistema permitirá o cadastro de usuários do tipo “Responsável de TI”.</w:t>
+      </w:r>
+    </w:p>
+    <w:p>
+      <w:pPr>
+        <w:pStyle w:val="PargrafodaLista"/>
+        <w:numPr>
+          <w:ilvl w:val="0"/>
+          <w:numId w:val="22"/>
+        </w:numPr>
+        <w:rPr>
+          <w:b/>
+          <w:bCs/>
+        </w:rPr>
+      </w:pPr>
+      <w:r>
+        <w:rPr>
+          <w:b/>
+          <w:bCs/>
+        </w:rPr>
+        <w:t>RF0</w:t>
+      </w:r>
+      <w:r>
+        <w:rPr>
+          <w:b/>
+          <w:bCs/>
+        </w:rPr>
+        <w:t>8</w:t>
+      </w:r>
+      <w:r>
+        <w:rPr>
+          <w:b/>
+          <w:bCs/>
+        </w:rPr>
+        <w:t xml:space="preserve"> </w:t>
+      </w:r>
+      <w:r>
+        <w:rPr>
+          <w:b/>
+          <w:bCs/>
+        </w:rPr>
+        <w:t>-</w:t>
+      </w:r>
+      <w:r>
+        <w:rPr>
+          <w:b/>
+          <w:bCs/>
+        </w:rPr>
+        <w:t xml:space="preserve"> </w:t>
+      </w:r>
+      <w:r>
+        <w:rPr>
+          <w:b/>
+          <w:bCs/>
+        </w:rPr>
+        <w:t>Monitorar Alterações dos Usuários</w:t>
+      </w:r>
+    </w:p>
+    <w:p>
+      <w:pPr>
+        <w:pStyle w:val="PargrafodaLista"/>
+      </w:pPr>
+      <w:r>
+        <w:t>Ator: Diretor Acadêmico.</w:t>
+      </w:r>
+    </w:p>
+    <w:p>
+      <w:pPr>
+        <w:pStyle w:val="PargrafodaLista"/>
+        <w:tabs>
+          <w:tab w:val="left" w:pos="2673"/>
+        </w:tabs>
+      </w:pPr>
+      <w:r>
+        <w:t xml:space="preserve">Descrição: O sistema </w:t>
+      </w:r>
+      <w:r>
+        <w:t>deverá apresentar todas as alterações feitas pelos usuários.</w:t>
+      </w:r>
+    </w:p>
+    <w:p>
+      <w:pPr>
+        <w:pStyle w:val="PargrafodaLista"/>
+        <w:numPr>
+          <w:ilvl w:val="0"/>
+          <w:numId w:val="22"/>
+        </w:numPr>
+      </w:pPr>
+      <w:r>
+        <w:rPr>
+          <w:b/>
+          <w:bCs/>
+        </w:rPr>
+        <w:t>RF0</w:t>
+      </w:r>
+      <w:r>
+        <w:rPr>
+          <w:b/>
+          <w:bCs/>
+        </w:rPr>
+        <w:t>9</w:t>
+      </w:r>
+      <w:r>
+        <w:rPr>
+          <w:b/>
+          <w:bCs/>
+        </w:rPr>
+        <w:t xml:space="preserve"> - Cadastrar disciplina</w:t>
+      </w:r>
+      <w:r>
+        <w:br/>
+        <w:t>Ator: Coordenador</w:t>
+      </w:r>
+      <w:r>
+        <w:br/>
+        <w:t>Descrição: O sistema deve permitir que o coordenador cadastre uma nova disciplina informando seus dados básicos.</w:t>
+      </w:r>
+    </w:p>
+    <w:p>
+      <w:pPr>
+        <w:pStyle w:val="PargrafodaLista"/>
+        <w:numPr>
+          <w:ilvl w:val="0"/>
+          <w:numId w:val="22"/>
+        </w:numPr>
+        <w:rPr>
+          <w:b/>
+          <w:bCs/>
+        </w:rPr>
+      </w:pPr>
+      <w:r>
+        <w:rPr>
+          <w:b/>
+          <w:bCs/>
+        </w:rPr>
+        <w:t>RF06 - Informar quantidade de alunos</w:t>
+      </w:r>
+    </w:p>
+    <w:p>
+      <w:pPr>
+        <w:pStyle w:val="PargrafodaLista"/>
+      </w:pPr>
+      <w:r>
+        <w:t>Ator: Coordenador.</w:t>
+      </w:r>
+    </w:p>
+    <w:p>
+      <w:pPr>
+        <w:pStyle w:val="PargrafodaLista"/>
+        <w:numPr>
+          <w:ilvl w:val="0"/>
+          <w:numId w:val="22"/>
+        </w:numPr>
+        <w:rPr>
+          <w:b/>
+          <w:bCs/>
+        </w:rPr>
+      </w:pPr>
+      <w:r>
+        <w:rPr>
+          <w:b/>
+          <w:bCs/>
+        </w:rPr>
+        <w:t>RF07 - Definir horário da disciplina</w:t>
+      </w:r>
+    </w:p>
+    <w:p>
+      <w:pPr>
+        <w:pStyle w:val="PargrafodaLista"/>
+        <w:numPr>
+          <w:ilvl w:val="0"/>
+          <w:numId w:val="22"/>
+        </w:numPr>
+        <w:rPr>
+          <w:b/>
+          <w:bCs/>
+        </w:rPr>
+      </w:pPr>
+      <w:r>
+        <w:rPr>
+          <w:b/>
+          <w:bCs/>
+        </w:rPr>
+        <w:t>RF08 - Vincular softwares à disciplina</w:t>
+      </w:r>
+    </w:p>
+    <w:p>
+      <w:pPr>
+        <w:pStyle w:val="PargrafodaLista"/>
+        <w:numPr>
+          <w:ilvl w:val="0"/>
+          <w:numId w:val="22"/>
+        </w:numPr>
+        <w:rPr>
+          <w:b/>
+          <w:bCs/>
+        </w:rPr>
+      </w:pPr>
+      <w:r>
+        <w:rPr>
+          <w:b/>
+          <w:bCs/>
+        </w:rPr>
+        <w:t>RF09 - Solicitar alocação de laboratório</w:t>
+      </w:r>
+    </w:p>
+    <w:p>
+      <w:pPr>
+        <w:pStyle w:val="PargrafodaLista"/>
+        <w:numPr>
+          <w:ilvl w:val="0"/>
+          <w:numId w:val="22"/>
+        </w:numPr>
+        <w:rPr>
+          <w:b/>
+          <w:bCs/>
+        </w:rPr>
+      </w:pPr>
+      <w:r>
+        <w:rPr>
+          <w:b/>
+          <w:bCs/>
+        </w:rPr>
+        <w:t>RF10 - Aprovar alocação</w:t>
+      </w:r>
+    </w:p>
+    <w:p>
+      <w:pPr>
+        <w:pStyle w:val="PargrafodaLista"/>
+        <w:numPr>
+          <w:ilvl w:val="0"/>
+          <w:numId w:val="22"/>
+        </w:numPr>
+        <w:rPr>
+          <w:b/>
+          <w:bCs/>
+        </w:rPr>
+      </w:pPr>
+      <w:r>
+        <w:rPr>
+          <w:b/>
+          <w:bCs/>
+        </w:rPr>
+        <w:t>RF11 - Solicitar divisão de turma</w:t>
+      </w:r>
+    </w:p>
+    <w:p>
+      <w:pPr>
+        <w:pStyle w:val="PargrafodaLista"/>
+        <w:numPr>
+          <w:ilvl w:val="0"/>
+          <w:numId w:val="22"/>
+        </w:numPr>
+        <w:rPr>
+          <w:b/>
+          <w:bCs/>
+        </w:rPr>
+      </w:pPr>
+      <w:r>
+        <w:rPr>
+          <w:b/>
+          <w:bCs/>
+        </w:rPr>
+        <w:t>RF12 - Aprovar divisão de turma</w:t>
+      </w:r>
+    </w:p>
+    <w:p>
+      <w:pPr>
+        <w:pStyle w:val="PargrafodaLista"/>
+        <w:numPr>
+          <w:ilvl w:val="0"/>
+          <w:numId w:val="22"/>
+        </w:numPr>
+        <w:rPr>
+          <w:b/>
+          <w:bCs/>
+        </w:rPr>
+      </w:pPr>
+      <w:r>
+        <w:rPr>
+          <w:b/>
+          <w:bCs/>
+        </w:rPr>
+        <w:t>RF13 - Cadastrar software</w:t>
+      </w:r>
+    </w:p>
+    <w:p>
+      <w:pPr>
+        <w:pStyle w:val="PargrafodaLista"/>
+        <w:numPr>
+          <w:ilvl w:val="0"/>
+          <w:numId w:val="22"/>
+        </w:numPr>
+        <w:rPr>
+          <w:b/>
+          <w:bCs/>
+        </w:rPr>
+      </w:pPr>
+      <w:r>
+        <w:rPr>
+          <w:b/>
+          <w:bCs/>
+        </w:rPr>
+        <w:t>RF14 - Atualizar software</w:t>
+      </w:r>
+    </w:p>
+    <w:p>
+      <w:pPr>
+        <w:pStyle w:val="PargrafodaLista"/>
+        <w:numPr>
+          <w:ilvl w:val="0"/>
+          <w:numId w:val="22"/>
+        </w:numPr>
+        <w:rPr>
+          <w:b/>
+          <w:bCs/>
+        </w:rPr>
+      </w:pPr>
+      <w:r>
+        <w:rPr>
+          <w:b/>
+          <w:bCs/>
+        </w:rPr>
+        <w:lastRenderedPageBreak/>
+        <w:t>RF15 - Remover software</w:t>
+      </w:r>
+    </w:p>
+    <w:p>
+      <w:pPr>
+        <w:pStyle w:val="PargrafodaLista"/>
+        <w:numPr>
+          <w:ilvl w:val="0"/>
+          <w:numId w:val="22"/>
+        </w:numPr>
+        <w:rPr>
+          <w:b/>
+          <w:bCs/>
+        </w:rPr>
+      </w:pPr>
+      <w:r>
+        <w:rPr>
+          <w:b/>
+          <w:bCs/>
+        </w:rPr>
+        <w:t>RF16 - Consultar softwares por laboratório</w:t>
+      </w:r>
     </w:p>
     <w:p>
       <w:pPr>
@@ -3894,7 +4522,6 @@
         <w:ind w:left="851"/>
       </w:pPr>
       <w:r>
-        <w:lastRenderedPageBreak/>
         <w:t xml:space="preserve">Diagrama </w:t>
       </w:r>
       <w:r>
@@ -4679,6 +5306,119 @@
 <file path=word/numbering.xml><?xml version="1.0" encoding="utf-8"?>
 <w:numbering xmlns:wpc="http://schemas.microsoft.com/office/word/2010/wordprocessingCanvas" xmlns:cx="http://schemas.microsoft.com/office/drawing/2014/chartex" xmlns:cx1="http://schemas.microsoft.com/office/drawing/2015/9/8/chartex" xmlns:cx2="http://schemas.microsoft.com/office/drawing/2015/10/21/chartex" xmlns:cx3="http://schemas.microsoft.com/office/drawing/2016/5/9/chartex" xmlns:cx4="http://schemas.microsoft.com/office/drawing/2016/5/10/chartex" xmlns:cx5="http://schemas.microsoft.com/office/drawing/2016/5/11/chartex" xmlns:cx6="http://schemas.microsoft.com/office/drawing/2016/5/12/chartex" xmlns:cx7="http://schemas.microsoft.com/office/drawing/2016/5/13/chartex" xmlns:cx8="http://schemas.microsoft.com/office/drawing/2016/5/14/chartex" xmlns:mc="http://schemas.openxmlformats.org/markup-compatibility/2006" xmlns:aink="http://schemas.microsoft.com/office/drawing/2016/ink" xmlns:am3d="http://schemas.microsoft.com/office/drawing/2017/model3d" xmlns:o="urn:schemas-microsoft-com:office:office" xmlns:r="http://schemas.openxmlformats.org/officeDocument/2006/relationships" xmlns:m="http://schemas.openxmlformats.org/officeDocument/2006/math" xmlns:v="urn:schemas-microsoft-com:vml" xmlns:wp14="http://schemas.microsoft.com/office/word/2010/wordprocessingDrawing" xmlns:wp="http://schemas.openxmlformats.org/drawingml/2006/wordprocessingDrawing" xmlns:w10="urn:schemas-microsoft-com:office:word" xmlns:w="http://schemas.openxmlformats.org/wordprocessingml/2006/main" xmlns:w14="http://schemas.microsoft.com/office/word/2010/wordml" xmlns:w15="http://schemas.microsoft.com/office/word/2012/wordml" xmlns:w16cex="http://schemas.microsoft.com/office/word/2018/wordml/cex" xmlns:w16cid="http://schemas.microsoft.com/office/word/2016/wordml/cid" xmlns:w16="http://schemas.microsoft.com/office/word/2018/wordml" xmlns:w16sdtdh="http://schemas.microsoft.com/office/word/2020/wordml/sdtdatahash" xmlns:w16se="http://schemas.microsoft.com/office/word/2015/wordml/symex" xmlns:wpg="http://schemas.microsoft.com/office/word/2010/wordprocessingGroup" xmlns:wpi="http://schemas.microsoft.com/office/word/2010/wordprocessingInk" xmlns:wne="http://schemas.microsoft.com/office/word/2006/wordml" xmlns:wps="http://schemas.microsoft.com/office/word/2010/wordprocessingShape" mc:Ignorable="w14 w15 w16se w16cid w16 w16cex w16sdtdh wp14">
   <w:abstractNum w:abstractNumId="0" w15:restartNumberingAfterBreak="0">
+    <w:nsid w:val="00AB5A76"/>
+    <w:multiLevelType w:val="hybridMultilevel"/>
+    <w:tmpl w:val="4FAE2F46"/>
+    <w:lvl w:ilvl="0" w:tplc="04160001">
+      <w:start w:val="1"/>
+      <w:numFmt w:val="bullet"/>
+      <w:lvlText w:val=""/>
+      <w:lvlJc w:val="left"/>
+      <w:pPr>
+        <w:ind w:left="1571" w:hanging="360"/>
+      </w:pPr>
+      <w:rPr>
+        <w:rFonts w:ascii="Symbol" w:hAnsi="Symbol" w:hint="default"/>
+      </w:rPr>
+    </w:lvl>
+    <w:lvl w:ilvl="1" w:tplc="04160003" w:tentative="1">
+      <w:start w:val="1"/>
+      <w:numFmt w:val="bullet"/>
+      <w:lvlText w:val="o"/>
+      <w:lvlJc w:val="left"/>
+      <w:pPr>
+        <w:ind w:left="2291" w:hanging="360"/>
+      </w:pPr>
+      <w:rPr>
+        <w:rFonts w:ascii="Courier New" w:hAnsi="Courier New" w:cs="Courier New" w:hint="default"/>
+      </w:rPr>
+    </w:lvl>
+    <w:lvl w:ilvl="2" w:tplc="04160005" w:tentative="1">
+      <w:start w:val="1"/>
+      <w:numFmt w:val="bullet"/>
+      <w:lvlText w:val=""/>
+      <w:lvlJc w:val="left"/>
+      <w:pPr>
+        <w:ind w:left="3011" w:hanging="360"/>
+      </w:pPr>
+      <w:rPr>
+        <w:rFonts w:ascii="Wingdings" w:hAnsi="Wingdings" w:hint="default"/>
+      </w:rPr>
+    </w:lvl>
+    <w:lvl w:ilvl="3" w:tplc="04160001" w:tentative="1">
+      <w:start w:val="1"/>
+      <w:numFmt w:val="bullet"/>
+      <w:lvlText w:val=""/>
+      <w:lvlJc w:val="left"/>
+      <w:pPr>
+        <w:ind w:left="3731" w:hanging="360"/>
+      </w:pPr>
+      <w:rPr>
+        <w:rFonts w:ascii="Symbol" w:hAnsi="Symbol" w:hint="default"/>
+      </w:rPr>
+    </w:lvl>
+    <w:lvl w:ilvl="4" w:tplc="04160003" w:tentative="1">
+      <w:start w:val="1"/>
+      <w:numFmt w:val="bullet"/>
+      <w:lvlText w:val="o"/>
+      <w:lvlJc w:val="left"/>
+      <w:pPr>
+        <w:ind w:left="4451" w:hanging="360"/>
+      </w:pPr>
+      <w:rPr>
+        <w:rFonts w:ascii="Courier New" w:hAnsi="Courier New" w:cs="Courier New" w:hint="default"/>
+      </w:rPr>
+    </w:lvl>
+    <w:lvl w:ilvl="5" w:tplc="04160005" w:tentative="1">
+      <w:start w:val="1"/>
+      <w:numFmt w:val="bullet"/>
+      <w:lvlText w:val=""/>
+      <w:lvlJc w:val="left"/>
+      <w:pPr>
+        <w:ind w:left="5171" w:hanging="360"/>
+      </w:pPr>
+      <w:rPr>
+        <w:rFonts w:ascii="Wingdings" w:hAnsi="Wingdings" w:hint="default"/>
+      </w:rPr>
+    </w:lvl>
+    <w:lvl w:ilvl="6" w:tplc="04160001" w:tentative="1">
+      <w:start w:val="1"/>
+      <w:numFmt w:val="bullet"/>
+      <w:lvlText w:val=""/>
+      <w:lvlJc w:val="left"/>
+      <w:pPr>
+        <w:ind w:left="5891" w:hanging="360"/>
+      </w:pPr>
+      <w:rPr>
+        <w:rFonts w:ascii="Symbol" w:hAnsi="Symbol" w:hint="default"/>
+      </w:rPr>
+    </w:lvl>
+    <w:lvl w:ilvl="7" w:tplc="04160003" w:tentative="1">
+      <w:start w:val="1"/>
+      <w:numFmt w:val="bullet"/>
+      <w:lvlText w:val="o"/>
+      <w:lvlJc w:val="left"/>
+      <w:pPr>
+        <w:ind w:left="6611" w:hanging="360"/>
+      </w:pPr>
+      <w:rPr>
+        <w:rFonts w:ascii="Courier New" w:hAnsi="Courier New" w:cs="Courier New" w:hint="default"/>
+      </w:rPr>
+    </w:lvl>
+    <w:lvl w:ilvl="8" w:tplc="04160005" w:tentative="1">
+      <w:start w:val="1"/>
+      <w:numFmt w:val="bullet"/>
+      <w:lvlText w:val=""/>
+      <w:lvlJc w:val="left"/>
+      <w:pPr>
+        <w:ind w:left="7331" w:hanging="360"/>
+      </w:pPr>
+      <w:rPr>
+        <w:rFonts w:ascii="Wingdings" w:hAnsi="Wingdings" w:hint="default"/>
+      </w:rPr>
+    </w:lvl>
+  </w:abstractNum>
+  <w:abstractNum w:abstractNumId="1" w15:restartNumberingAfterBreak="0">
     <w:nsid w:val="0359FF69"/>
     <w:multiLevelType w:val="hybridMultilevel"/>
     <w:tmpl w:val="32486D86"/>
@@ -4791,7 +5531,7 @@
       </w:rPr>
     </w:lvl>
   </w:abstractNum>
-  <w:abstractNum w:abstractNumId="1" w15:restartNumberingAfterBreak="0">
+  <w:abstractNum w:abstractNumId="2" w15:restartNumberingAfterBreak="0">
     <w:nsid w:val="05030474"/>
     <w:multiLevelType w:val="hybridMultilevel"/>
     <w:tmpl w:val="F0408AC8"/>
@@ -4904,7 +5644,7 @@
       </w:rPr>
     </w:lvl>
   </w:abstractNum>
-  <w:abstractNum w:abstractNumId="2" w15:restartNumberingAfterBreak="0">
+  <w:abstractNum w:abstractNumId="3" w15:restartNumberingAfterBreak="0">
     <w:nsid w:val="0E2C702E"/>
     <w:multiLevelType w:val="hybridMultilevel"/>
     <w:tmpl w:val="E9028D2A"/>
@@ -5017,7 +5757,7 @@
       </w:rPr>
     </w:lvl>
   </w:abstractNum>
-  <w:abstractNum w:abstractNumId="3" w15:restartNumberingAfterBreak="0">
+  <w:abstractNum w:abstractNumId="4" w15:restartNumberingAfterBreak="0">
     <w:nsid w:val="1428A9F3"/>
     <w:multiLevelType w:val="hybridMultilevel"/>
     <w:tmpl w:val="E0582C40"/>
@@ -5130,7 +5870,7 @@
       </w:rPr>
     </w:lvl>
   </w:abstractNum>
-  <w:abstractNum w:abstractNumId="4" w15:restartNumberingAfterBreak="0">
+  <w:abstractNum w:abstractNumId="5" w15:restartNumberingAfterBreak="0">
     <w:nsid w:val="1906B896"/>
     <w:multiLevelType w:val="hybridMultilevel"/>
     <w:tmpl w:val="73447F8E"/>
@@ -5243,7 +5983,120 @@
       </w:rPr>
     </w:lvl>
   </w:abstractNum>
-  <w:abstractNum w:abstractNumId="5" w15:restartNumberingAfterBreak="0">
+  <w:abstractNum w:abstractNumId="6" w15:restartNumberingAfterBreak="0">
+    <w:nsid w:val="1A9E4A3A"/>
+    <w:multiLevelType w:val="hybridMultilevel"/>
+    <w:tmpl w:val="F3A0E576"/>
+    <w:lvl w:ilvl="0" w:tplc="04160001">
+      <w:start w:val="1"/>
+      <w:numFmt w:val="bullet"/>
+      <w:lvlText w:val=""/>
+      <w:lvlJc w:val="left"/>
+      <w:pPr>
+        <w:ind w:left="720" w:hanging="360"/>
+      </w:pPr>
+      <w:rPr>
+        <w:rFonts w:ascii="Symbol" w:hAnsi="Symbol" w:hint="default"/>
+      </w:rPr>
+    </w:lvl>
+    <w:lvl w:ilvl="1" w:tplc="04160003" w:tentative="1">
+      <w:start w:val="1"/>
+      <w:numFmt w:val="bullet"/>
+      <w:lvlText w:val="o"/>
+      <w:lvlJc w:val="left"/>
+      <w:pPr>
+        <w:ind w:left="1440" w:hanging="360"/>
+      </w:pPr>
+      <w:rPr>
+        <w:rFonts w:ascii="Courier New" w:hAnsi="Courier New" w:cs="Courier New" w:hint="default"/>
+      </w:rPr>
+    </w:lvl>
+    <w:lvl w:ilvl="2" w:tplc="04160005" w:tentative="1">
+      <w:start w:val="1"/>
+      <w:numFmt w:val="bullet"/>
+      <w:lvlText w:val=""/>
+      <w:lvlJc w:val="left"/>
+      <w:pPr>
+        <w:ind w:left="2160" w:hanging="360"/>
+      </w:pPr>
+      <w:rPr>
+        <w:rFonts w:ascii="Wingdings" w:hAnsi="Wingdings" w:hint="default"/>
+      </w:rPr>
+    </w:lvl>
+    <w:lvl w:ilvl="3" w:tplc="04160001" w:tentative="1">
+      <w:start w:val="1"/>
+      <w:numFmt w:val="bullet"/>
+      <w:lvlText w:val=""/>
+      <w:lvlJc w:val="left"/>
+      <w:pPr>
+        <w:ind w:left="2880" w:hanging="360"/>
+      </w:pPr>
+      <w:rPr>
+        <w:rFonts w:ascii="Symbol" w:hAnsi="Symbol" w:hint="default"/>
+      </w:rPr>
+    </w:lvl>
+    <w:lvl w:ilvl="4" w:tplc="04160003" w:tentative="1">
+      <w:start w:val="1"/>
+      <w:numFmt w:val="bullet"/>
+      <w:lvlText w:val="o"/>
+      <w:lvlJc w:val="left"/>
+      <w:pPr>
+        <w:ind w:left="3600" w:hanging="360"/>
+      </w:pPr>
+      <w:rPr>
+        <w:rFonts w:ascii="Courier New" w:hAnsi="Courier New" w:cs="Courier New" w:hint="default"/>
+      </w:rPr>
+    </w:lvl>
+    <w:lvl w:ilvl="5" w:tplc="04160005" w:tentative="1">
+      <w:start w:val="1"/>
+      <w:numFmt w:val="bullet"/>
+      <w:lvlText w:val=""/>
+      <w:lvlJc w:val="left"/>
+      <w:pPr>
+        <w:ind w:left="4320" w:hanging="360"/>
+      </w:pPr>
+      <w:rPr>
+        <w:rFonts w:ascii="Wingdings" w:hAnsi="Wingdings" w:hint="default"/>
+      </w:rPr>
+    </w:lvl>
+    <w:lvl w:ilvl="6" w:tplc="04160001" w:tentative="1">
+      <w:start w:val="1"/>
+      <w:numFmt w:val="bullet"/>
+      <w:lvlText w:val=""/>
+      <w:lvlJc w:val="left"/>
+      <w:pPr>
+        <w:ind w:left="5040" w:hanging="360"/>
+      </w:pPr>
+      <w:rPr>
+        <w:rFonts w:ascii="Symbol" w:hAnsi="Symbol" w:hint="default"/>
+      </w:rPr>
+    </w:lvl>
+    <w:lvl w:ilvl="7" w:tplc="04160003" w:tentative="1">
+      <w:start w:val="1"/>
+      <w:numFmt w:val="bullet"/>
+      <w:lvlText w:val="o"/>
+      <w:lvlJc w:val="left"/>
+      <w:pPr>
+        <w:ind w:left="5760" w:hanging="360"/>
+      </w:pPr>
+      <w:rPr>
+        <w:rFonts w:ascii="Courier New" w:hAnsi="Courier New" w:cs="Courier New" w:hint="default"/>
+      </w:rPr>
+    </w:lvl>
+    <w:lvl w:ilvl="8" w:tplc="04160005" w:tentative="1">
+      <w:start w:val="1"/>
+      <w:numFmt w:val="bullet"/>
+      <w:lvlText w:val=""/>
+      <w:lvlJc w:val="left"/>
+      <w:pPr>
+        <w:ind w:left="6480" w:hanging="360"/>
+      </w:pPr>
+      <w:rPr>
+        <w:rFonts w:ascii="Wingdings" w:hAnsi="Wingdings" w:hint="default"/>
+      </w:rPr>
+    </w:lvl>
+  </w:abstractNum>
+  <w:abstractNum w:abstractNumId="7" w15:restartNumberingAfterBreak="0">
     <w:nsid w:val="1E640A2F"/>
     <w:multiLevelType w:val="hybridMultilevel"/>
     <w:tmpl w:val="E1BA566A"/>
@@ -5356,7 +6209,7 @@
       </w:rPr>
     </w:lvl>
   </w:abstractNum>
-  <w:abstractNum w:abstractNumId="6" w15:restartNumberingAfterBreak="0">
+  <w:abstractNum w:abstractNumId="8" w15:restartNumberingAfterBreak="0">
     <w:nsid w:val="1E7B14E5"/>
     <w:multiLevelType w:val="hybridMultilevel"/>
     <w:tmpl w:val="71600324"/>
@@ -5469,7 +6322,7 @@
       </w:rPr>
     </w:lvl>
   </w:abstractNum>
-  <w:abstractNum w:abstractNumId="7" w15:restartNumberingAfterBreak="0">
+  <w:abstractNum w:abstractNumId="9" w15:restartNumberingAfterBreak="0">
     <w:nsid w:val="2D8B5972"/>
     <w:multiLevelType w:val="hybridMultilevel"/>
     <w:tmpl w:val="63D41E74"/>
@@ -5582,7 +6435,7 @@
       </w:rPr>
     </w:lvl>
   </w:abstractNum>
-  <w:abstractNum w:abstractNumId="8" w15:restartNumberingAfterBreak="0">
+  <w:abstractNum w:abstractNumId="10" w15:restartNumberingAfterBreak="0">
     <w:nsid w:val="2E4AB3C5"/>
     <w:multiLevelType w:val="hybridMultilevel"/>
     <w:tmpl w:val="F78E9C6C"/>
@@ -5695,7 +6548,7 @@
       </w:rPr>
     </w:lvl>
   </w:abstractNum>
-  <w:abstractNum w:abstractNumId="9" w15:restartNumberingAfterBreak="0">
+  <w:abstractNum w:abstractNumId="11" w15:restartNumberingAfterBreak="0">
     <w:nsid w:val="2E580FDE"/>
     <w:multiLevelType w:val="multilevel"/>
     <w:tmpl w:val="C7127E38"/>
@@ -5808,7 +6661,7 @@
       </w:pPr>
     </w:lvl>
   </w:abstractNum>
-  <w:abstractNum w:abstractNumId="10" w15:restartNumberingAfterBreak="0">
+  <w:abstractNum w:abstractNumId="12" w15:restartNumberingAfterBreak="0">
     <w:nsid w:val="49587503"/>
     <w:multiLevelType w:val="hybridMultilevel"/>
     <w:tmpl w:val="775EE202"/>
@@ -5921,7 +6774,7 @@
       </w:rPr>
     </w:lvl>
   </w:abstractNum>
-  <w:abstractNum w:abstractNumId="11" w15:restartNumberingAfterBreak="0">
+  <w:abstractNum w:abstractNumId="13" w15:restartNumberingAfterBreak="0">
     <w:nsid w:val="52B479C2"/>
     <w:multiLevelType w:val="hybridMultilevel"/>
     <w:tmpl w:val="361AEDCA"/>
@@ -6034,7 +6887,7 @@
       </w:rPr>
     </w:lvl>
   </w:abstractNum>
-  <w:abstractNum w:abstractNumId="12" w15:restartNumberingAfterBreak="0">
+  <w:abstractNum w:abstractNumId="14" w15:restartNumberingAfterBreak="0">
     <w:nsid w:val="53FA52DF"/>
     <w:multiLevelType w:val="hybridMultilevel"/>
     <w:tmpl w:val="8212948C"/>
@@ -6123,7 +6976,7 @@
       </w:pPr>
     </w:lvl>
   </w:abstractNum>
-  <w:abstractNum w:abstractNumId="13" w15:restartNumberingAfterBreak="0">
+  <w:abstractNum w:abstractNumId="15" w15:restartNumberingAfterBreak="0">
     <w:nsid w:val="58CC648C"/>
     <w:multiLevelType w:val="hybridMultilevel"/>
     <w:tmpl w:val="354056DA"/>
@@ -6236,7 +7089,7 @@
       </w:rPr>
     </w:lvl>
   </w:abstractNum>
-  <w:abstractNum w:abstractNumId="14" w15:restartNumberingAfterBreak="0">
+  <w:abstractNum w:abstractNumId="16" w15:restartNumberingAfterBreak="0">
     <w:nsid w:val="5AB6F6E3"/>
     <w:multiLevelType w:val="hybridMultilevel"/>
     <w:tmpl w:val="805A867C"/>
@@ -6349,7 +7202,7 @@
       </w:rPr>
     </w:lvl>
   </w:abstractNum>
-  <w:abstractNum w:abstractNumId="15" w15:restartNumberingAfterBreak="0">
+  <w:abstractNum w:abstractNumId="17" w15:restartNumberingAfterBreak="0">
     <w:nsid w:val="5D5DC71D"/>
     <w:multiLevelType w:val="hybridMultilevel"/>
     <w:tmpl w:val="C8B6695E"/>
@@ -6462,7 +7315,7 @@
       </w:rPr>
     </w:lvl>
   </w:abstractNum>
-  <w:abstractNum w:abstractNumId="16" w15:restartNumberingAfterBreak="0">
+  <w:abstractNum w:abstractNumId="18" w15:restartNumberingAfterBreak="0">
     <w:nsid w:val="70226238"/>
     <w:multiLevelType w:val="hybridMultilevel"/>
     <w:tmpl w:val="3520886A"/>
@@ -6575,7 +7428,7 @@
       </w:rPr>
     </w:lvl>
   </w:abstractNum>
-  <w:abstractNum w:abstractNumId="17" w15:restartNumberingAfterBreak="0">
+  <w:abstractNum w:abstractNumId="19" w15:restartNumberingAfterBreak="0">
     <w:nsid w:val="78C6E0F9"/>
     <w:multiLevelType w:val="hybridMultilevel"/>
     <w:tmpl w:val="43AEB4A4"/>
@@ -6688,7 +7541,7 @@
       </w:rPr>
     </w:lvl>
   </w:abstractNum>
-  <w:abstractNum w:abstractNumId="18" w15:restartNumberingAfterBreak="0">
+  <w:abstractNum w:abstractNumId="20" w15:restartNumberingAfterBreak="0">
     <w:nsid w:val="7B007F78"/>
     <w:multiLevelType w:val="hybridMultilevel"/>
     <w:tmpl w:val="845E85BC"/>
@@ -6801,7 +7654,7 @@
       </w:rPr>
     </w:lvl>
   </w:abstractNum>
-  <w:abstractNum w:abstractNumId="19" w15:restartNumberingAfterBreak="0">
+  <w:abstractNum w:abstractNumId="21" w15:restartNumberingAfterBreak="0">
     <w:nsid w:val="7F58207E"/>
     <w:multiLevelType w:val="hybridMultilevel"/>
     <w:tmpl w:val="8CF2AE86"/>
@@ -6915,64 +7768,70 @@
     </w:lvl>
   </w:abstractNum>
   <w:num w:numId="1">
+    <w:abstractNumId w:val="5"/>
+  </w:num>
+  <w:num w:numId="2">
+    <w:abstractNumId w:val="10"/>
+  </w:num>
+  <w:num w:numId="3">
+    <w:abstractNumId w:val="1"/>
+  </w:num>
+  <w:num w:numId="4">
+    <w:abstractNumId w:val="9"/>
+  </w:num>
+  <w:num w:numId="5">
+    <w:abstractNumId w:val="17"/>
+  </w:num>
+  <w:num w:numId="6">
+    <w:abstractNumId w:val="16"/>
+  </w:num>
+  <w:num w:numId="7">
+    <w:abstractNumId w:val="18"/>
+  </w:num>
+  <w:num w:numId="8">
     <w:abstractNumId w:val="4"/>
   </w:num>
-  <w:num w:numId="2">
+  <w:num w:numId="9">
+    <w:abstractNumId w:val="19"/>
+  </w:num>
+  <w:num w:numId="10">
+    <w:abstractNumId w:val="2"/>
+  </w:num>
+  <w:num w:numId="11">
+    <w:abstractNumId w:val="20"/>
+  </w:num>
+  <w:num w:numId="12">
+    <w:abstractNumId w:val="21"/>
+  </w:num>
+  <w:num w:numId="13">
+    <w:abstractNumId w:val="14"/>
+  </w:num>
+  <w:num w:numId="14">
+    <w:abstractNumId w:val="12"/>
+  </w:num>
+  <w:num w:numId="15">
+    <w:abstractNumId w:val="11"/>
+  </w:num>
+  <w:num w:numId="16">
+    <w:abstractNumId w:val="13"/>
+  </w:num>
+  <w:num w:numId="17">
     <w:abstractNumId w:val="8"/>
   </w:num>
-  <w:num w:numId="3">
+  <w:num w:numId="18">
+    <w:abstractNumId w:val="3"/>
+  </w:num>
+  <w:num w:numId="19">
+    <w:abstractNumId w:val="15"/>
+  </w:num>
+  <w:num w:numId="20">
+    <w:abstractNumId w:val="7"/>
+  </w:num>
+  <w:num w:numId="21">
     <w:abstractNumId w:val="0"/>
   </w:num>
-  <w:num w:numId="4">
-    <w:abstractNumId w:val="7"/>
-  </w:num>
-  <w:num w:numId="5">
-    <w:abstractNumId w:val="15"/>
-  </w:num>
-  <w:num w:numId="6">
-    <w:abstractNumId w:val="14"/>
-  </w:num>
-  <w:num w:numId="7">
-    <w:abstractNumId w:val="16"/>
-  </w:num>
-  <w:num w:numId="8">
-    <w:abstractNumId w:val="3"/>
-  </w:num>
-  <w:num w:numId="9">
-    <w:abstractNumId w:val="17"/>
-  </w:num>
-  <w:num w:numId="10">
-    <w:abstractNumId w:val="1"/>
-  </w:num>
-  <w:num w:numId="11">
-    <w:abstractNumId w:val="18"/>
-  </w:num>
-  <w:num w:numId="12">
-    <w:abstractNumId w:val="19"/>
-  </w:num>
-  <w:num w:numId="13">
-    <w:abstractNumId w:val="12"/>
-  </w:num>
-  <w:num w:numId="14">
-    <w:abstractNumId w:val="10"/>
-  </w:num>
-  <w:num w:numId="15">
-    <w:abstractNumId w:val="9"/>
-  </w:num>
-  <w:num w:numId="16">
-    <w:abstractNumId w:val="11"/>
-  </w:num>
-  <w:num w:numId="17">
+  <w:num w:numId="22">
     <w:abstractNumId w:val="6"/>
-  </w:num>
-  <w:num w:numId="18">
-    <w:abstractNumId w:val="2"/>
-  </w:num>
-  <w:num w:numId="19">
-    <w:abstractNumId w:val="13"/>
-  </w:num>
-  <w:num w:numId="20">
-    <w:abstractNumId w:val="5"/>
   </w:num>
 </w:numbering>
 </file>
@@ -7094,7 +7953,7 @@
     <w:lsdException w:name="HTML Sample" w:semiHidden="1" w:unhideWhenUsed="1"/>
     <w:lsdException w:name="HTML Typewriter" w:semiHidden="1" w:unhideWhenUsed="1"/>
     <w:lsdException w:name="HTML Variable" w:semiHidden="1" w:unhideWhenUsed="1"/>
-    <w:lsdException w:name="Normal Table" w:qFormat="1"/>
+    <w:lsdException w:name="Normal Table" w:semiHidden="1" w:unhideWhenUsed="1" w:qFormat="1"/>
     <w:lsdException w:name="annotation subject" w:semiHidden="1" w:unhideWhenUsed="1" w:qFormat="1"/>
     <w:lsdException w:name="No List" w:semiHidden="1" w:unhideWhenUsed="1"/>
     <w:lsdException w:name="Outline List 1" w:semiHidden="1" w:unhideWhenUsed="1"/>
@@ -7137,8 +7996,11 @@
     <w:lsdException w:name="Table Contemporary" w:semiHidden="1" w:unhideWhenUsed="1"/>
     <w:lsdException w:name="Table Elegant" w:semiHidden="1" w:unhideWhenUsed="1"/>
     <w:lsdException w:name="Table Professional" w:semiHidden="1" w:unhideWhenUsed="1"/>
+    <w:lsdException w:name="Table Subtle 1" w:semiHidden="1" w:unhideWhenUsed="1"/>
     <w:lsdException w:name="Table Subtle 2" w:semiHidden="1" w:unhideWhenUsed="1"/>
     <w:lsdException w:name="Table Web 1" w:semiHidden="1" w:unhideWhenUsed="1"/>
+    <w:lsdException w:name="Table Web 2" w:semiHidden="1" w:unhideWhenUsed="1"/>
+    <w:lsdException w:name="Table Web 3" w:semiHidden="1" w:unhideWhenUsed="1"/>
     <w:lsdException w:name="Balloon Text" w:semiHidden="1" w:unhideWhenUsed="1" w:qFormat="1"/>
     <w:lsdException w:name="Table Grid" w:uiPriority="59"/>
     <w:lsdException w:name="Table Theme" w:semiHidden="1" w:unhideWhenUsed="1"/>
@@ -7159,6 +8021,10 @@
     <w:lsdException w:name="Colorful List"/>
     <w:lsdException w:name="Colorful Grid"/>
     <w:lsdException w:name="Light Shading Accent 1"/>
+    <w:lsdException w:name="Light List Accent 1"/>
+    <w:lsdException w:name="Light Grid Accent 1"/>
+    <w:lsdException w:name="Medium Shading 1 Accent 1"/>
+    <w:lsdException w:name="Medium Shading 2 Accent 1"/>
     <w:lsdException w:name="Medium List 1 Accent 1"/>
     <w:lsdException w:name="Revision" w:semiHidden="1" w:unhideWhenUsed="1"/>
     <w:lsdException w:name="List Paragraph" w:uiPriority="34" w:qFormat="1"/>
@@ -7237,6 +8103,11 @@
     <w:lsdException w:name="Medium List 2 Accent 6"/>
     <w:lsdException w:name="Medium Grid 1 Accent 6"/>
     <w:lsdException w:name="Medium Grid 2 Accent 6"/>
+    <w:lsdException w:name="Medium Grid 3 Accent 6"/>
+    <w:lsdException w:name="Dark List Accent 6"/>
+    <w:lsdException w:name="Colorful Shading Accent 6"/>
+    <w:lsdException w:name="Colorful List Accent 6"/>
+    <w:lsdException w:name="Colorful Grid Accent 6"/>
     <w:lsdException w:name="Subtle Emphasis" w:uiPriority="19" w:qFormat="1"/>
     <w:lsdException w:name="Intense Emphasis" w:uiPriority="21" w:qFormat="1"/>
     <w:lsdException w:name="Subtle Reference" w:uiPriority="31" w:qFormat="1"/>

</xml_diff>

<commit_message>
Enviando a documentação do projeto para o Github - 14/04/2026
</commit_message>
<xml_diff>
--- a/Terceiro_Semestre/Projeto_Integrador/Documentação/Modelo_Projeto_Integrador_principal.docx
+++ b/Terceiro_Semestre/Projeto_Integrador/Documentação/Modelo_Projeto_Integrador_principal.docx
@@ -1,6 +1,6 @@
 
 <file path=word/document.xml><?xml version="1.0" encoding="utf-8"?>
-<w:document xmlns:wpc="http://schemas.microsoft.com/office/word/2010/wordprocessingCanvas" xmlns:cx="http://schemas.microsoft.com/office/drawing/2014/chartex" xmlns:cx1="http://schemas.microsoft.com/office/drawing/2015/9/8/chartex" xmlns:cx2="http://schemas.microsoft.com/office/drawing/2015/10/21/chartex" xmlns:cx3="http://schemas.microsoft.com/office/drawing/2016/5/9/chartex" xmlns:cx4="http://schemas.microsoft.com/office/drawing/2016/5/10/chartex" xmlns:cx5="http://schemas.microsoft.com/office/drawing/2016/5/11/chartex" xmlns:cx6="http://schemas.microsoft.com/office/drawing/2016/5/12/chartex" xmlns:cx7="http://schemas.microsoft.com/office/drawing/2016/5/13/chartex" xmlns:cx8="http://schemas.microsoft.com/office/drawing/2016/5/14/chartex" xmlns:mc="http://schemas.openxmlformats.org/markup-compatibility/2006" xmlns:aink="http://schemas.microsoft.com/office/drawing/2016/ink" xmlns:am3d="http://schemas.microsoft.com/office/drawing/2017/model3d" xmlns:o="urn:schemas-microsoft-com:office:office" xmlns:r="http://schemas.openxmlformats.org/officeDocument/2006/relationships" xmlns:m="http://schemas.openxmlformats.org/officeDocument/2006/math" xmlns:v="urn:schemas-microsoft-com:vml" xmlns:wp14="http://schemas.microsoft.com/office/word/2010/wordprocessingDrawing" xmlns:wp="http://schemas.openxmlformats.org/drawingml/2006/wordprocessingDrawing" xmlns:w10="urn:schemas-microsoft-com:office:word" xmlns:w="http://schemas.openxmlformats.org/wordprocessingml/2006/main" xmlns:w14="http://schemas.microsoft.com/office/word/2010/wordml" xmlns:w15="http://schemas.microsoft.com/office/word/2012/wordml" xmlns:w16cex="http://schemas.microsoft.com/office/word/2018/wordml/cex" xmlns:w16cid="http://schemas.microsoft.com/office/word/2016/wordml/cid" xmlns:w16="http://schemas.microsoft.com/office/word/2018/wordml" xmlns:w16sdtdh="http://schemas.microsoft.com/office/word/2020/wordml/sdtdatahash" xmlns:w16se="http://schemas.microsoft.com/office/word/2015/wordml/symex" xmlns:wpg="http://schemas.microsoft.com/office/word/2010/wordprocessingGroup" xmlns:wpi="http://schemas.microsoft.com/office/word/2010/wordprocessingInk" xmlns:wne="http://schemas.microsoft.com/office/word/2006/wordml" xmlns:wps="http://schemas.microsoft.com/office/word/2010/wordprocessingShape" mc:Ignorable="w14 w15 w16se w16cid w16 w16cex w16sdtdh wp14">
+<w:document xmlns:wpc="http://schemas.microsoft.com/office/word/2010/wordprocessingCanvas" xmlns:cx="http://schemas.microsoft.com/office/drawing/2014/chartex" xmlns:mc="http://schemas.openxmlformats.org/markup-compatibility/2006" xmlns:o="urn:schemas-microsoft-com:office:office" xmlns:r="http://schemas.openxmlformats.org/officeDocument/2006/relationships" xmlns:m="http://schemas.openxmlformats.org/officeDocument/2006/math" xmlns:v="urn:schemas-microsoft-com:vml" xmlns:wp14="http://schemas.microsoft.com/office/word/2010/wordprocessingDrawing" xmlns:wp="http://schemas.openxmlformats.org/drawingml/2006/wordprocessingDrawing" xmlns:w10="urn:schemas-microsoft-com:office:word" xmlns:w="http://schemas.openxmlformats.org/wordprocessingml/2006/main" xmlns:w14="http://schemas.microsoft.com/office/word/2010/wordml" xmlns:w15="http://schemas.microsoft.com/office/word/2012/wordml" xmlns:w16se="http://schemas.microsoft.com/office/word/2015/wordml/symex" xmlns:wpg="http://schemas.microsoft.com/office/word/2010/wordprocessingGroup" xmlns:wpi="http://schemas.microsoft.com/office/word/2010/wordprocessingInk" xmlns:wne="http://schemas.microsoft.com/office/word/2006/wordml" xmlns:wps="http://schemas.microsoft.com/office/word/2010/wordprocessingShape" mc:Ignorable="w14 w15 w16se wp14">
   <w:body>
     <w:p>
       <w:pPr>
@@ -3347,15 +3347,7 @@
         <w:t xml:space="preserve">, versão 12.0. </w:t>
       </w:r>
       <w:r>
-        <w:t xml:space="preserve">Com </w:t>
-      </w:r>
-      <w:proofErr w:type="spellStart"/>
-      <w:r>
-        <w:t>auxilio</w:t>
-      </w:r>
-      <w:proofErr w:type="spellEnd"/>
-      <w:r>
-        <w:t xml:space="preserve"> do Framework .NET Core LTS 8</w:t>
+        <w:t>Com auxilio do Framework .NET Core LTS 8</w:t>
       </w:r>
     </w:p>
     <w:p>
@@ -3789,9 +3781,9 @@
           <w:lang w:eastAsia="pt-BR"/>
         </w:rPr>
         <w:drawing>
-          <wp:inline distT="0" distB="0" distL="0" distR="0" wp14:anchorId="2A507CE4" wp14:editId="3E8F195F">
-            <wp:extent cx="5362575" cy="2689563"/>
-            <wp:effectExtent l="0" t="0" r="0" b="0"/>
+          <wp:inline distT="0" distB="0" distL="0" distR="0" wp14:anchorId="2A507CE4" wp14:editId="7887DF02">
+            <wp:extent cx="5365686" cy="2395167"/>
+            <wp:effectExtent l="0" t="0" r="6985" b="5715"/>
             <wp:docPr id="4" name="Imagem 4"/>
             <wp:cNvGraphicFramePr>
               <a:graphicFrameLocks xmlns:a="http://schemas.openxmlformats.org/drawingml/2006/main" noChangeAspect="1"/>
@@ -3818,7 +3810,7 @@
                   <pic:spPr>
                     <a:xfrm>
                       <a:off x="0" y="0"/>
-                      <a:ext cx="5365686" cy="2691123"/>
+                      <a:ext cx="5365686" cy="2395167"/>
                     </a:xfrm>
                     <a:prstGeom prst="rect">
                       <a:avLst/>
@@ -3895,10 +3887,7 @@
         <w:pStyle w:val="PargrafodaLista"/>
       </w:pPr>
       <w:r>
-        <w:t>Ator</w:t>
-      </w:r>
-      <w:r>
-        <w:t xml:space="preserve">: Diretor Acadêmico. </w:t>
+        <w:t xml:space="preserve">Ator: Diretor Acadêmico. </w:t>
       </w:r>
     </w:p>
     <w:p>
@@ -3926,15 +3915,15 @@
           <w:b/>
           <w:bCs/>
         </w:rPr>
+        <w:t>RF03 - Informar quantidade de computadores</w:t>
+      </w:r>
+    </w:p>
+    <w:p>
+      <w:pPr>
+        <w:pStyle w:val="PargrafodaLista"/>
+      </w:pPr>
+      <w:r>
         <w:lastRenderedPageBreak/>
-        <w:t>RF03 - Informar quantidade de computadores</w:t>
-      </w:r>
-    </w:p>
-    <w:p>
-      <w:pPr>
-        <w:pStyle w:val="PargrafodaLista"/>
-      </w:pPr>
-      <w:r>
         <w:t>Ator: Diretor Acadêmico.</w:t>
       </w:r>
     </w:p>
@@ -4015,10 +4004,7 @@
         <w:pStyle w:val="PargrafodaLista"/>
       </w:pPr>
       <w:r>
-        <w:t xml:space="preserve">Descrição: </w:t>
-      </w:r>
-      <w:r>
-        <w:t>Deverá ser aprovado ou recusado as solicitações de alocação dos coordenadores.</w:t>
+        <w:t>Descrição: Deverá ser aprovado ou recusado as solicitações de alocação dos coordenadores.</w:t>
       </w:r>
     </w:p>
     <w:p>
@@ -4252,7 +4238,14 @@
           <w:b/>
           <w:bCs/>
         </w:rPr>
-        <w:t>RF06 - Informar quantidade de alunos</w:t>
+        <w:t>RF10</w:t>
+      </w:r>
+      <w:r>
+        <w:rPr>
+          <w:b/>
+          <w:bCs/>
+        </w:rPr>
+        <w:t xml:space="preserve"> - Informar quantidade de alunos</w:t>
       </w:r>
     </w:p>
     <w:p>
@@ -4261,6 +4254,14 @@
       </w:pPr>
       <w:r>
         <w:t>Ator: Coordenador.</w:t>
+      </w:r>
+    </w:p>
+    <w:p>
+      <w:pPr>
+        <w:pStyle w:val="PargrafodaLista"/>
+      </w:pPr>
+      <w:r>
+        <w:t>Descrição: O sistema deve permitir o cadastro da quantidade de alunos para cada disciplina.</w:t>
       </w:r>
     </w:p>
     <w:p>
@@ -4280,7 +4281,36 @@
           <w:b/>
           <w:bCs/>
         </w:rPr>
-        <w:t>RF07 - Definir horário da disciplina</w:t>
+        <w:t>RF11</w:t>
+      </w:r>
+      <w:r>
+        <w:rPr>
+          <w:b/>
+          <w:bCs/>
+        </w:rPr>
+        <w:t xml:space="preserve"> - Vincular softwares à disciplina</w:t>
+      </w:r>
+    </w:p>
+    <w:p>
+      <w:pPr>
+        <w:pStyle w:val="PargrafodaLista"/>
+      </w:pPr>
+      <w:r>
+        <w:t>Ator: Coordenador.</w:t>
+      </w:r>
+    </w:p>
+    <w:p>
+      <w:pPr>
+        <w:pStyle w:val="PargrafodaLista"/>
+      </w:pPr>
+      <w:r>
+        <w:t>Descrição: O</w:t>
+      </w:r>
+      <w:r>
+        <w:t xml:space="preserve"> sistema deve permitir a vinculação dos os softwares instalados com </w:t>
+      </w:r>
+      <w:r>
+        <w:t>cada disciplina.</w:t>
       </w:r>
     </w:p>
     <w:p>
@@ -4300,7 +4330,33 @@
           <w:b/>
           <w:bCs/>
         </w:rPr>
-        <w:t>RF08 - Vincular softwares à disciplina</w:t>
+        <w:t>RF12</w:t>
+      </w:r>
+      <w:r>
+        <w:rPr>
+          <w:b/>
+          <w:bCs/>
+        </w:rPr>
+        <w:t xml:space="preserve"> - Solicitar alocação de laboratório</w:t>
+      </w:r>
+    </w:p>
+    <w:p>
+      <w:pPr>
+        <w:pStyle w:val="PargrafodaLista"/>
+      </w:pPr>
+      <w:r>
+        <w:t>Ator: Coordenador.</w:t>
+      </w:r>
+    </w:p>
+    <w:p>
+      <w:pPr>
+        <w:pStyle w:val="PargrafodaLista"/>
+      </w:pPr>
+      <w:r>
+        <w:t xml:space="preserve">Descrição: O sistema deve permitir a </w:t>
+      </w:r>
+      <w:r>
+        <w:t>solicitação de alocação dos laboratórios.</w:t>
       </w:r>
     </w:p>
     <w:p>
@@ -4320,7 +4376,65 @@
           <w:b/>
           <w:bCs/>
         </w:rPr>
-        <w:t>RF09 - Solicitar alocação de laboratório</w:t>
+        <w:lastRenderedPageBreak/>
+        <w:t>R</w:t>
+      </w:r>
+      <w:r>
+        <w:rPr>
+          <w:b/>
+          <w:bCs/>
+        </w:rPr>
+        <w:t>F13</w:t>
+      </w:r>
+      <w:r>
+        <w:rPr>
+          <w:b/>
+          <w:bCs/>
+        </w:rPr>
+        <w:t xml:space="preserve"> </w:t>
+      </w:r>
+      <w:r>
+        <w:rPr>
+          <w:b/>
+          <w:bCs/>
+        </w:rPr>
+        <w:t>–</w:t>
+      </w:r>
+      <w:r>
+        <w:rPr>
+          <w:b/>
+          <w:bCs/>
+        </w:rPr>
+        <w:t xml:space="preserve"> </w:t>
+      </w:r>
+      <w:r>
+        <w:rPr>
+          <w:b/>
+          <w:bCs/>
+        </w:rPr>
+        <w:t>Filtrar Software por Laboratórios</w:t>
+      </w:r>
+    </w:p>
+    <w:p>
+      <w:pPr>
+        <w:pStyle w:val="PargrafodaLista"/>
+      </w:pPr>
+      <w:r>
+        <w:t>Ator: Coordenador.</w:t>
+      </w:r>
+    </w:p>
+    <w:p>
+      <w:pPr>
+        <w:pStyle w:val="PargrafodaLista"/>
+        <w:rPr>
+          <w:u w:val="single"/>
+        </w:rPr>
+      </w:pPr>
+      <w:r>
+        <w:t xml:space="preserve">Descrição: O sistema deve permitir a </w:t>
+      </w:r>
+      <w:r>
+        <w:t>filtragem dos softwares por cada laboratório.</w:t>
       </w:r>
     </w:p>
     <w:p>
@@ -4340,7 +4454,46 @@
           <w:b/>
           <w:bCs/>
         </w:rPr>
-        <w:t>RF10 - Aprovar alocação</w:t>
+        <w:t>RF1</w:t>
+      </w:r>
+      <w:r>
+        <w:rPr>
+          <w:b/>
+          <w:bCs/>
+        </w:rPr>
+        <w:t>3</w:t>
+      </w:r>
+      <w:r>
+        <w:rPr>
+          <w:b/>
+          <w:bCs/>
+        </w:rPr>
+        <w:t xml:space="preserve"> - Cadastrar software</w:t>
+      </w:r>
+    </w:p>
+    <w:p>
+      <w:pPr>
+        <w:pStyle w:val="PargrafodaLista"/>
+      </w:pPr>
+      <w:r>
+        <w:t xml:space="preserve">Ator: </w:t>
+      </w:r>
+      <w:r>
+        <w:t>Responsável de TI.</w:t>
+      </w:r>
+    </w:p>
+    <w:p>
+      <w:pPr>
+        <w:pStyle w:val="PargrafodaLista"/>
+        <w:rPr>
+          <w:u w:val="single"/>
+        </w:rPr>
+      </w:pPr>
+      <w:r>
+        <w:t xml:space="preserve">Descrição: O sistema deve permitir </w:t>
+      </w:r>
+      <w:r>
+        <w:t>o cadastro de softwares no sistema.</w:t>
       </w:r>
     </w:p>
     <w:p>
@@ -4360,7 +4513,46 @@
           <w:b/>
           <w:bCs/>
         </w:rPr>
-        <w:t>RF11 - Solicitar divisão de turma</w:t>
+        <w:t>RF1</w:t>
+      </w:r>
+      <w:r>
+        <w:rPr>
+          <w:b/>
+          <w:bCs/>
+        </w:rPr>
+        <w:t>4</w:t>
+      </w:r>
+      <w:r>
+        <w:rPr>
+          <w:b/>
+          <w:bCs/>
+        </w:rPr>
+        <w:t xml:space="preserve"> - Atualizar software</w:t>
+      </w:r>
+    </w:p>
+    <w:p>
+      <w:pPr>
+        <w:pStyle w:val="PargrafodaLista"/>
+      </w:pPr>
+      <w:r>
+        <w:t>Ator: Responsável de TI.</w:t>
+      </w:r>
+    </w:p>
+    <w:p>
+      <w:pPr>
+        <w:pStyle w:val="PargrafodaLista"/>
+        <w:rPr>
+          <w:u w:val="single"/>
+        </w:rPr>
+      </w:pPr>
+      <w:r>
+        <w:t xml:space="preserve">Descrição: O sistema deve permitir </w:t>
+      </w:r>
+      <w:r>
+        <w:t xml:space="preserve">a atualização dos registros </w:t>
+      </w:r>
+      <w:r>
+        <w:t>de softwares no sistema.</w:t>
       </w:r>
     </w:p>
     <w:p>
@@ -4380,7 +4572,39 @@
           <w:b/>
           <w:bCs/>
         </w:rPr>
-        <w:t>RF12 - Aprovar divisão de turma</w:t>
+        <w:t>RF15</w:t>
+      </w:r>
+      <w:r>
+        <w:rPr>
+          <w:b/>
+          <w:bCs/>
+        </w:rPr>
+        <w:t xml:space="preserve"> - Remover software</w:t>
+      </w:r>
+    </w:p>
+    <w:p>
+      <w:pPr>
+        <w:pStyle w:val="PargrafodaLista"/>
+      </w:pPr>
+      <w:r>
+        <w:t>Ator: Responsável de TI.</w:t>
+      </w:r>
+    </w:p>
+    <w:p>
+      <w:pPr>
+        <w:pStyle w:val="PargrafodaLista"/>
+        <w:rPr>
+          <w:u w:val="single"/>
+        </w:rPr>
+      </w:pPr>
+      <w:r>
+        <w:t xml:space="preserve">Descrição: O sistema deve permitir a </w:t>
+      </w:r>
+      <w:r>
+        <w:t>remoção</w:t>
+      </w:r>
+      <w:r>
+        <w:t xml:space="preserve"> dos registros de softwares no sistema.</w:t>
       </w:r>
     </w:p>
     <w:p>
@@ -4400,69 +4624,68 @@
           <w:b/>
           <w:bCs/>
         </w:rPr>
-        <w:t>RF13 - Cadastrar software</w:t>
-      </w:r>
-    </w:p>
-    <w:p>
-      <w:pPr>
-        <w:pStyle w:val="PargrafodaLista"/>
-        <w:numPr>
-          <w:ilvl w:val="0"/>
-          <w:numId w:val="22"/>
-        </w:numPr>
+        <w:t>RF1</w:t>
+      </w:r>
+      <w:r>
         <w:rPr>
           <w:b/>
           <w:bCs/>
         </w:rPr>
-      </w:pPr>
+        <w:t>6</w:t>
+      </w:r>
       <w:r>
         <w:rPr>
           <w:b/>
           <w:bCs/>
         </w:rPr>
-        <w:t>RF14 - Atualizar software</w:t>
+        <w:t xml:space="preserve"> - Consultar softwares por laboratório</w:t>
       </w:r>
     </w:p>
     <w:p>
       <w:pPr>
         <w:pStyle w:val="PargrafodaLista"/>
-        <w:numPr>
-          <w:ilvl w:val="0"/>
-          <w:numId w:val="22"/>
-        </w:numPr>
+      </w:pPr>
+      <w:r>
+        <w:t>Ator: Responsável de TI.</w:t>
+      </w:r>
+    </w:p>
+    <w:p>
+      <w:pPr>
+        <w:pStyle w:val="PargrafodaLista"/>
+        <w:rPr>
+          <w:u w:val="single"/>
+        </w:rPr>
+      </w:pPr>
+      <w:r>
+        <w:t xml:space="preserve">Descrição: O sistema deve permitir a </w:t>
+      </w:r>
+      <w:proofErr w:type="spellStart"/>
+      <w:r>
+        <w:t>cosulta</w:t>
+      </w:r>
+      <w:proofErr w:type="spellEnd"/>
+      <w:r>
+        <w:t xml:space="preserve"> dos </w:t>
+      </w:r>
+      <w:r>
+        <w:t xml:space="preserve">softwares </w:t>
+      </w:r>
+      <w:r>
+        <w:t>registrados por laboratório</w:t>
+      </w:r>
+      <w:r>
+        <w:t>.</w:t>
+      </w:r>
+    </w:p>
+    <w:p>
+      <w:pPr>
         <w:rPr>
           <w:b/>
           <w:bCs/>
         </w:rPr>
       </w:pPr>
-      <w:r>
-        <w:rPr>
-          <w:b/>
-          <w:bCs/>
-        </w:rPr>
-        <w:lastRenderedPageBreak/>
-        <w:t>RF15 - Remover software</w:t>
-      </w:r>
-    </w:p>
-    <w:p>
-      <w:pPr>
-        <w:pStyle w:val="PargrafodaLista"/>
-        <w:numPr>
-          <w:ilvl w:val="0"/>
-          <w:numId w:val="22"/>
-        </w:numPr>
-        <w:rPr>
-          <w:b/>
-          <w:bCs/>
-        </w:rPr>
-      </w:pPr>
-      <w:r>
-        <w:rPr>
-          <w:b/>
-          <w:bCs/>
-        </w:rPr>
-        <w:t>RF16 - Consultar softwares por laboratório</w:t>
-      </w:r>
+      <w:bookmarkStart w:id="21" w:name="_GoBack"/>
+      <w:bookmarkEnd w:id="21"/>
     </w:p>
     <w:p>
       <w:pPr>
@@ -4472,7 +4695,7 @@
           <w:i w:val="0"/>
         </w:rPr>
       </w:pPr>
-      <w:bookmarkStart w:id="21" w:name="_Toc16793"/>
+      <w:bookmarkStart w:id="22" w:name="_Toc16793"/>
       <w:r>
         <w:rPr>
           <w:i w:val="0"/>
@@ -4488,7 +4711,7 @@
         </w:rPr>
         <w:t>REQUISITOS DE BANCO DE DADOS</w:t>
       </w:r>
-      <w:bookmarkEnd w:id="21"/>
+      <w:bookmarkEnd w:id="22"/>
     </w:p>
     <w:p>
       <w:pPr>
@@ -4499,7 +4722,7 @@
           <w:iCs/>
         </w:rPr>
       </w:pPr>
-      <w:bookmarkStart w:id="22" w:name="_Toc27034"/>
+      <w:bookmarkStart w:id="23" w:name="_Toc27034"/>
       <w:r>
         <w:rPr>
           <w:i w:val="0"/>
@@ -4515,13 +4738,14 @@
         </w:rPr>
         <w:t>MODELO FÍSICO E LÓGICO DA BASE DE DADOS</w:t>
       </w:r>
-      <w:bookmarkEnd w:id="22"/>
+      <w:bookmarkEnd w:id="23"/>
     </w:p>
     <w:p>
       <w:pPr>
         <w:ind w:left="851"/>
       </w:pPr>
       <w:r>
+        <w:lastRenderedPageBreak/>
         <w:t xml:space="preserve">Diagrama </w:t>
       </w:r>
       <w:r>
@@ -4593,7 +4817,7 @@
           <w:iCs/>
         </w:rPr>
       </w:pPr>
-      <w:bookmarkStart w:id="23" w:name="_Toc16266"/>
+      <w:bookmarkStart w:id="24" w:name="_Toc16266"/>
       <w:r>
         <w:rPr>
           <w:i w:val="0"/>
@@ -4609,7 +4833,7 @@
         </w:rPr>
         <w:t>DICIONÁRIO DE DADOS</w:t>
       </w:r>
-      <w:bookmarkEnd w:id="23"/>
+      <w:bookmarkEnd w:id="24"/>
     </w:p>
     <w:p>
       <w:pPr>
@@ -4639,7 +4863,7 @@
           <w:iCs/>
         </w:rPr>
       </w:pPr>
-      <w:bookmarkStart w:id="24" w:name="_Toc7182"/>
+      <w:bookmarkStart w:id="25" w:name="_Toc7182"/>
       <w:r>
         <w:rPr>
           <w:i w:val="0"/>
@@ -4655,7 +4879,7 @@
         <w:tab/>
         <w:t>SCRIPTS DE CRIAÇÃO DE BANCO DE DADOS E TABELAS</w:t>
       </w:r>
-      <w:bookmarkEnd w:id="24"/>
+      <w:bookmarkEnd w:id="25"/>
     </w:p>
     <w:p>
       <w:pPr>
@@ -4688,21 +4912,21 @@
         <w:pStyle w:val="Ttulo1"/>
         <w:jc w:val="center"/>
       </w:pPr>
-      <w:bookmarkStart w:id="25" w:name="_Toc21242"/>
+      <w:bookmarkStart w:id="26" w:name="_Toc21242"/>
       <w:r>
         <w:lastRenderedPageBreak/>
         <w:t>ANEXOS</w:t>
       </w:r>
-      <w:bookmarkEnd w:id="25"/>
+      <w:bookmarkEnd w:id="26"/>
     </w:p>
     <w:p/>
     <w:p>
-      <w:bookmarkStart w:id="26" w:name="Ata_1"/>
+      <w:bookmarkStart w:id="27" w:name="Ata_1"/>
       <w:r>
         <w:t>Ata 1</w:t>
       </w:r>
     </w:p>
-    <w:bookmarkEnd w:id="26"/>
+    <w:bookmarkEnd w:id="27"/>
     <w:p>
       <w:pPr>
         <w:jc w:val="both"/>
@@ -4760,12 +4984,12 @@
       </w:r>
     </w:p>
     <w:p>
-      <w:bookmarkStart w:id="27" w:name="Ata_2"/>
+      <w:bookmarkStart w:id="28" w:name="Ata_2"/>
       <w:r>
         <w:t>Ata 2</w:t>
       </w:r>
     </w:p>
-    <w:bookmarkEnd w:id="27"/>
+    <w:bookmarkEnd w:id="28"/>
     <w:p>
       <w:pPr>
         <w:jc w:val="both"/>
@@ -4841,7 +5065,7 @@
       <w:pPr>
         <w:jc w:val="both"/>
       </w:pPr>
-      <w:bookmarkStart w:id="28" w:name="Ata_3"/>
+      <w:bookmarkStart w:id="29" w:name="Ata_3"/>
       <w:r>
         <w:t>Ata</w:t>
       </w:r>
@@ -4849,7 +5073,7 @@
         <w:t xml:space="preserve"> 3</w:t>
       </w:r>
     </w:p>
-    <w:bookmarkEnd w:id="28"/>
+    <w:bookmarkEnd w:id="29"/>
     <w:p>
       <w:pPr>
         <w:jc w:val="both"/>
@@ -4906,12 +5130,12 @@
       <w:pPr>
         <w:jc w:val="both"/>
       </w:pPr>
-      <w:bookmarkStart w:id="29" w:name="Ata_4"/>
+      <w:bookmarkStart w:id="30" w:name="Ata_4"/>
       <w:r>
         <w:t>Ata 4</w:t>
       </w:r>
     </w:p>
-    <w:bookmarkEnd w:id="29"/>
+    <w:bookmarkEnd w:id="30"/>
     <w:p>
       <w:pPr>
         <w:jc w:val="both"/>
@@ -4968,12 +5192,12 @@
     <w:p/>
     <w:p/>
     <w:p>
-      <w:bookmarkStart w:id="30" w:name="Ata_5"/>
+      <w:bookmarkStart w:id="31" w:name="Ata_5"/>
       <w:r>
         <w:t>Ata 5</w:t>
       </w:r>
     </w:p>
-    <w:bookmarkEnd w:id="30"/>
+    <w:bookmarkEnd w:id="31"/>
     <w:p>
       <w:r>
         <w:rPr>
@@ -5084,7 +5308,7 @@
 </file>
 
 <file path=word/endnotes.xml><?xml version="1.0" encoding="utf-8"?>
-<w:endnotes xmlns:wpc="http://schemas.microsoft.com/office/word/2010/wordprocessingCanvas" xmlns:cx="http://schemas.microsoft.com/office/drawing/2014/chartex" xmlns:cx1="http://schemas.microsoft.com/office/drawing/2015/9/8/chartex" xmlns:cx2="http://schemas.microsoft.com/office/drawing/2015/10/21/chartex" xmlns:cx3="http://schemas.microsoft.com/office/drawing/2016/5/9/chartex" xmlns:cx4="http://schemas.microsoft.com/office/drawing/2016/5/10/chartex" xmlns:cx5="http://schemas.microsoft.com/office/drawing/2016/5/11/chartex" xmlns:cx6="http://schemas.microsoft.com/office/drawing/2016/5/12/chartex" xmlns:cx7="http://schemas.microsoft.com/office/drawing/2016/5/13/chartex" xmlns:cx8="http://schemas.microsoft.com/office/drawing/2016/5/14/chartex" xmlns:mc="http://schemas.openxmlformats.org/markup-compatibility/2006" xmlns:aink="http://schemas.microsoft.com/office/drawing/2016/ink" xmlns:am3d="http://schemas.microsoft.com/office/drawing/2017/model3d" xmlns:o="urn:schemas-microsoft-com:office:office" xmlns:r="http://schemas.openxmlformats.org/officeDocument/2006/relationships" xmlns:m="http://schemas.openxmlformats.org/officeDocument/2006/math" xmlns:v="urn:schemas-microsoft-com:vml" xmlns:wp14="http://schemas.microsoft.com/office/word/2010/wordprocessingDrawing" xmlns:wp="http://schemas.openxmlformats.org/drawingml/2006/wordprocessingDrawing" xmlns:w10="urn:schemas-microsoft-com:office:word" xmlns:w="http://schemas.openxmlformats.org/wordprocessingml/2006/main" xmlns:w14="http://schemas.microsoft.com/office/word/2010/wordml" xmlns:w15="http://schemas.microsoft.com/office/word/2012/wordml" xmlns:w16cex="http://schemas.microsoft.com/office/word/2018/wordml/cex" xmlns:w16cid="http://schemas.microsoft.com/office/word/2016/wordml/cid" xmlns:w16="http://schemas.microsoft.com/office/word/2018/wordml" xmlns:w16sdtdh="http://schemas.microsoft.com/office/word/2020/wordml/sdtdatahash" xmlns:w16se="http://schemas.microsoft.com/office/word/2015/wordml/symex" xmlns:wpg="http://schemas.microsoft.com/office/word/2010/wordprocessingGroup" xmlns:wpi="http://schemas.microsoft.com/office/word/2010/wordprocessingInk" xmlns:wne="http://schemas.microsoft.com/office/word/2006/wordml" xmlns:wps="http://schemas.microsoft.com/office/word/2010/wordprocessingShape" mc:Ignorable="w14 w15 w16se w16cid w16 w16cex w16sdtdh wp14">
+<w:endnotes xmlns:wpc="http://schemas.microsoft.com/office/word/2010/wordprocessingCanvas" xmlns:cx="http://schemas.microsoft.com/office/drawing/2014/chartex" xmlns:mc="http://schemas.openxmlformats.org/markup-compatibility/2006" xmlns:o="urn:schemas-microsoft-com:office:office" xmlns:r="http://schemas.openxmlformats.org/officeDocument/2006/relationships" xmlns:m="http://schemas.openxmlformats.org/officeDocument/2006/math" xmlns:v="urn:schemas-microsoft-com:vml" xmlns:wp14="http://schemas.microsoft.com/office/word/2010/wordprocessingDrawing" xmlns:wp="http://schemas.openxmlformats.org/drawingml/2006/wordprocessingDrawing" xmlns:w10="urn:schemas-microsoft-com:office:word" xmlns:w="http://schemas.openxmlformats.org/wordprocessingml/2006/main" xmlns:w14="http://schemas.microsoft.com/office/word/2010/wordml" xmlns:w15="http://schemas.microsoft.com/office/word/2012/wordml" xmlns:w16se="http://schemas.microsoft.com/office/word/2015/wordml/symex" xmlns:wpg="http://schemas.microsoft.com/office/word/2010/wordprocessingGroup" xmlns:wpi="http://schemas.microsoft.com/office/word/2010/wordprocessingInk" xmlns:wne="http://schemas.microsoft.com/office/word/2006/wordml" xmlns:wps="http://schemas.microsoft.com/office/word/2010/wordprocessingShape" mc:Ignorable="w14 w15 w16se wp14">
   <w:endnote w:type="separator" w:id="-1">
     <w:p>
       <w:pPr>
@@ -5109,7 +5333,7 @@
 </file>
 
 <file path=word/footer1.xml><?xml version="1.0" encoding="utf-8"?>
-<w:ftr xmlns:wpc="http://schemas.microsoft.com/office/word/2010/wordprocessingCanvas" xmlns:cx="http://schemas.microsoft.com/office/drawing/2014/chartex" xmlns:cx1="http://schemas.microsoft.com/office/drawing/2015/9/8/chartex" xmlns:cx2="http://schemas.microsoft.com/office/drawing/2015/10/21/chartex" xmlns:cx3="http://schemas.microsoft.com/office/drawing/2016/5/9/chartex" xmlns:cx4="http://schemas.microsoft.com/office/drawing/2016/5/10/chartex" xmlns:cx5="http://schemas.microsoft.com/office/drawing/2016/5/11/chartex" xmlns:cx6="http://schemas.microsoft.com/office/drawing/2016/5/12/chartex" xmlns:cx7="http://schemas.microsoft.com/office/drawing/2016/5/13/chartex" xmlns:cx8="http://schemas.microsoft.com/office/drawing/2016/5/14/chartex" xmlns:mc="http://schemas.openxmlformats.org/markup-compatibility/2006" xmlns:aink="http://schemas.microsoft.com/office/drawing/2016/ink" xmlns:am3d="http://schemas.microsoft.com/office/drawing/2017/model3d" xmlns:o="urn:schemas-microsoft-com:office:office" xmlns:r="http://schemas.openxmlformats.org/officeDocument/2006/relationships" xmlns:m="http://schemas.openxmlformats.org/officeDocument/2006/math" xmlns:v="urn:schemas-microsoft-com:vml" xmlns:wp14="http://schemas.microsoft.com/office/word/2010/wordprocessingDrawing" xmlns:wp="http://schemas.openxmlformats.org/drawingml/2006/wordprocessingDrawing" xmlns:w10="urn:schemas-microsoft-com:office:word" xmlns:w="http://schemas.openxmlformats.org/wordprocessingml/2006/main" xmlns:w14="http://schemas.microsoft.com/office/word/2010/wordml" xmlns:w15="http://schemas.microsoft.com/office/word/2012/wordml" xmlns:w16cex="http://schemas.microsoft.com/office/word/2018/wordml/cex" xmlns:w16cid="http://schemas.microsoft.com/office/word/2016/wordml/cid" xmlns:w16="http://schemas.microsoft.com/office/word/2018/wordml" xmlns:w16sdtdh="http://schemas.microsoft.com/office/word/2020/wordml/sdtdatahash" xmlns:w16se="http://schemas.microsoft.com/office/word/2015/wordml/symex" xmlns:wpg="http://schemas.microsoft.com/office/word/2010/wordprocessingGroup" xmlns:wpi="http://schemas.microsoft.com/office/word/2010/wordprocessingInk" xmlns:wne="http://schemas.microsoft.com/office/word/2006/wordml" xmlns:wps="http://schemas.microsoft.com/office/word/2010/wordprocessingShape" mc:Ignorable="w14 w15 w16se w16cid w16 w16cex w16sdtdh wp14">
+<w:ftr xmlns:wpc="http://schemas.microsoft.com/office/word/2010/wordprocessingCanvas" xmlns:cx="http://schemas.microsoft.com/office/drawing/2014/chartex" xmlns:mc="http://schemas.openxmlformats.org/markup-compatibility/2006" xmlns:o="urn:schemas-microsoft-com:office:office" xmlns:r="http://schemas.openxmlformats.org/officeDocument/2006/relationships" xmlns:m="http://schemas.openxmlformats.org/officeDocument/2006/math" xmlns:v="urn:schemas-microsoft-com:vml" xmlns:wp14="http://schemas.microsoft.com/office/word/2010/wordprocessingDrawing" xmlns:wp="http://schemas.openxmlformats.org/drawingml/2006/wordprocessingDrawing" xmlns:w10="urn:schemas-microsoft-com:office:word" xmlns:w="http://schemas.openxmlformats.org/wordprocessingml/2006/main" xmlns:w14="http://schemas.microsoft.com/office/word/2010/wordml" xmlns:w15="http://schemas.microsoft.com/office/word/2012/wordml" xmlns:w16se="http://schemas.microsoft.com/office/word/2015/wordml/symex" xmlns:wpg="http://schemas.microsoft.com/office/word/2010/wordprocessingGroup" xmlns:wpi="http://schemas.microsoft.com/office/word/2010/wordprocessingInk" xmlns:wne="http://schemas.microsoft.com/office/word/2006/wordml" xmlns:wps="http://schemas.microsoft.com/office/word/2010/wordprocessingShape" mc:Ignorable="w14 w15 w16se wp14">
   <w:p>
     <w:pPr>
       <w:pStyle w:val="Rodap"/>
@@ -5119,7 +5343,7 @@
 </file>
 
 <file path=word/footnotes.xml><?xml version="1.0" encoding="utf-8"?>
-<w:footnotes xmlns:wpc="http://schemas.microsoft.com/office/word/2010/wordprocessingCanvas" xmlns:cx="http://schemas.microsoft.com/office/drawing/2014/chartex" xmlns:cx1="http://schemas.microsoft.com/office/drawing/2015/9/8/chartex" xmlns:cx2="http://schemas.microsoft.com/office/drawing/2015/10/21/chartex" xmlns:cx3="http://schemas.microsoft.com/office/drawing/2016/5/9/chartex" xmlns:cx4="http://schemas.microsoft.com/office/drawing/2016/5/10/chartex" xmlns:cx5="http://schemas.microsoft.com/office/drawing/2016/5/11/chartex" xmlns:cx6="http://schemas.microsoft.com/office/drawing/2016/5/12/chartex" xmlns:cx7="http://schemas.microsoft.com/office/drawing/2016/5/13/chartex" xmlns:cx8="http://schemas.microsoft.com/office/drawing/2016/5/14/chartex" xmlns:mc="http://schemas.openxmlformats.org/markup-compatibility/2006" xmlns:aink="http://schemas.microsoft.com/office/drawing/2016/ink" xmlns:am3d="http://schemas.microsoft.com/office/drawing/2017/model3d" xmlns:o="urn:schemas-microsoft-com:office:office" xmlns:r="http://schemas.openxmlformats.org/officeDocument/2006/relationships" xmlns:m="http://schemas.openxmlformats.org/officeDocument/2006/math" xmlns:v="urn:schemas-microsoft-com:vml" xmlns:wp14="http://schemas.microsoft.com/office/word/2010/wordprocessingDrawing" xmlns:wp="http://schemas.openxmlformats.org/drawingml/2006/wordprocessingDrawing" xmlns:w10="urn:schemas-microsoft-com:office:word" xmlns:w="http://schemas.openxmlformats.org/wordprocessingml/2006/main" xmlns:w14="http://schemas.microsoft.com/office/word/2010/wordml" xmlns:w15="http://schemas.microsoft.com/office/word/2012/wordml" xmlns:w16cex="http://schemas.microsoft.com/office/word/2018/wordml/cex" xmlns:w16cid="http://schemas.microsoft.com/office/word/2016/wordml/cid" xmlns:w16="http://schemas.microsoft.com/office/word/2018/wordml" xmlns:w16sdtdh="http://schemas.microsoft.com/office/word/2020/wordml/sdtdatahash" xmlns:w16se="http://schemas.microsoft.com/office/word/2015/wordml/symex" xmlns:wpg="http://schemas.microsoft.com/office/word/2010/wordprocessingGroup" xmlns:wpi="http://schemas.microsoft.com/office/word/2010/wordprocessingInk" xmlns:wne="http://schemas.microsoft.com/office/word/2006/wordml" xmlns:wps="http://schemas.microsoft.com/office/word/2010/wordprocessingShape" mc:Ignorable="w14 w15 w16se w16cid w16 w16cex w16sdtdh wp14">
+<w:footnotes xmlns:wpc="http://schemas.microsoft.com/office/word/2010/wordprocessingCanvas" xmlns:cx="http://schemas.microsoft.com/office/drawing/2014/chartex" xmlns:mc="http://schemas.openxmlformats.org/markup-compatibility/2006" xmlns:o="urn:schemas-microsoft-com:office:office" xmlns:r="http://schemas.openxmlformats.org/officeDocument/2006/relationships" xmlns:m="http://schemas.openxmlformats.org/officeDocument/2006/math" xmlns:v="urn:schemas-microsoft-com:vml" xmlns:wp14="http://schemas.microsoft.com/office/word/2010/wordprocessingDrawing" xmlns:wp="http://schemas.openxmlformats.org/drawingml/2006/wordprocessingDrawing" xmlns:w10="urn:schemas-microsoft-com:office:word" xmlns:w="http://schemas.openxmlformats.org/wordprocessingml/2006/main" xmlns:w14="http://schemas.microsoft.com/office/word/2010/wordml" xmlns:w15="http://schemas.microsoft.com/office/word/2012/wordml" xmlns:w16se="http://schemas.microsoft.com/office/word/2015/wordml/symex" xmlns:wpg="http://schemas.microsoft.com/office/word/2010/wordprocessingGroup" xmlns:wpi="http://schemas.microsoft.com/office/word/2010/wordprocessingInk" xmlns:wne="http://schemas.microsoft.com/office/word/2006/wordml" xmlns:wps="http://schemas.microsoft.com/office/word/2010/wordprocessingShape" mc:Ignorable="w14 w15 w16se wp14">
   <w:footnote w:type="separator" w:id="-1">
     <w:p>
       <w:r>
@@ -5138,7 +5362,7 @@
 </file>
 
 <file path=word/header1.xml><?xml version="1.0" encoding="utf-8"?>
-<w:hdr xmlns:wpc="http://schemas.microsoft.com/office/word/2010/wordprocessingCanvas" xmlns:cx="http://schemas.microsoft.com/office/drawing/2014/chartex" xmlns:cx1="http://schemas.microsoft.com/office/drawing/2015/9/8/chartex" xmlns:cx2="http://schemas.microsoft.com/office/drawing/2015/10/21/chartex" xmlns:cx3="http://schemas.microsoft.com/office/drawing/2016/5/9/chartex" xmlns:cx4="http://schemas.microsoft.com/office/drawing/2016/5/10/chartex" xmlns:cx5="http://schemas.microsoft.com/office/drawing/2016/5/11/chartex" xmlns:cx6="http://schemas.microsoft.com/office/drawing/2016/5/12/chartex" xmlns:cx7="http://schemas.microsoft.com/office/drawing/2016/5/13/chartex" xmlns:cx8="http://schemas.microsoft.com/office/drawing/2016/5/14/chartex" xmlns:mc="http://schemas.openxmlformats.org/markup-compatibility/2006" xmlns:aink="http://schemas.microsoft.com/office/drawing/2016/ink" xmlns:am3d="http://schemas.microsoft.com/office/drawing/2017/model3d" xmlns:o="urn:schemas-microsoft-com:office:office" xmlns:r="http://schemas.openxmlformats.org/officeDocument/2006/relationships" xmlns:m="http://schemas.openxmlformats.org/officeDocument/2006/math" xmlns:v="urn:schemas-microsoft-com:vml" xmlns:wp14="http://schemas.microsoft.com/office/word/2010/wordprocessingDrawing" xmlns:wp="http://schemas.openxmlformats.org/drawingml/2006/wordprocessingDrawing" xmlns:w10="urn:schemas-microsoft-com:office:word" xmlns:w="http://schemas.openxmlformats.org/wordprocessingml/2006/main" xmlns:w14="http://schemas.microsoft.com/office/word/2010/wordml" xmlns:w15="http://schemas.microsoft.com/office/word/2012/wordml" xmlns:w16cex="http://schemas.microsoft.com/office/word/2018/wordml/cex" xmlns:w16cid="http://schemas.microsoft.com/office/word/2016/wordml/cid" xmlns:w16="http://schemas.microsoft.com/office/word/2018/wordml" xmlns:w16sdtdh="http://schemas.microsoft.com/office/word/2020/wordml/sdtdatahash" xmlns:w16se="http://schemas.microsoft.com/office/word/2015/wordml/symex" xmlns:wpg="http://schemas.microsoft.com/office/word/2010/wordprocessingGroup" xmlns:wpi="http://schemas.microsoft.com/office/word/2010/wordprocessingInk" xmlns:wne="http://schemas.microsoft.com/office/word/2006/wordml" xmlns:wps="http://schemas.microsoft.com/office/word/2010/wordprocessingShape" mc:Ignorable="w14 w15 w16se w16cid w16 w16cex w16sdtdh wp14">
+<w:hdr xmlns:wpc="http://schemas.microsoft.com/office/word/2010/wordprocessingCanvas" xmlns:cx="http://schemas.microsoft.com/office/drawing/2014/chartex" xmlns:mc="http://schemas.openxmlformats.org/markup-compatibility/2006" xmlns:o="urn:schemas-microsoft-com:office:office" xmlns:r="http://schemas.openxmlformats.org/officeDocument/2006/relationships" xmlns:m="http://schemas.openxmlformats.org/officeDocument/2006/math" xmlns:v="urn:schemas-microsoft-com:vml" xmlns:wp14="http://schemas.microsoft.com/office/word/2010/wordprocessingDrawing" xmlns:wp="http://schemas.openxmlformats.org/drawingml/2006/wordprocessingDrawing" xmlns:w10="urn:schemas-microsoft-com:office:word" xmlns:w="http://schemas.openxmlformats.org/wordprocessingml/2006/main" xmlns:w14="http://schemas.microsoft.com/office/word/2010/wordml" xmlns:w15="http://schemas.microsoft.com/office/word/2012/wordml" xmlns:w16se="http://schemas.microsoft.com/office/word/2015/wordml/symex" xmlns:wpg="http://schemas.microsoft.com/office/word/2010/wordprocessingGroup" xmlns:wpi="http://schemas.microsoft.com/office/word/2010/wordprocessingInk" xmlns:wne="http://schemas.microsoft.com/office/word/2006/wordml" xmlns:wps="http://schemas.microsoft.com/office/word/2010/wordprocessingShape" mc:Ignorable="w14 w15 w16se wp14">
   <w:p>
     <w:pPr>
       <w:pStyle w:val="Cabealho"/>
@@ -5154,7 +5378,7 @@
 </file>
 
 <file path=word/header2.xml><?xml version="1.0" encoding="utf-8"?>
-<w:hdr xmlns:wpc="http://schemas.microsoft.com/office/word/2010/wordprocessingCanvas" xmlns:cx="http://schemas.microsoft.com/office/drawing/2014/chartex" xmlns:cx1="http://schemas.microsoft.com/office/drawing/2015/9/8/chartex" xmlns:cx2="http://schemas.microsoft.com/office/drawing/2015/10/21/chartex" xmlns:cx3="http://schemas.microsoft.com/office/drawing/2016/5/9/chartex" xmlns:cx4="http://schemas.microsoft.com/office/drawing/2016/5/10/chartex" xmlns:cx5="http://schemas.microsoft.com/office/drawing/2016/5/11/chartex" xmlns:cx6="http://schemas.microsoft.com/office/drawing/2016/5/12/chartex" xmlns:cx7="http://schemas.microsoft.com/office/drawing/2016/5/13/chartex" xmlns:cx8="http://schemas.microsoft.com/office/drawing/2016/5/14/chartex" xmlns:mc="http://schemas.openxmlformats.org/markup-compatibility/2006" xmlns:aink="http://schemas.microsoft.com/office/drawing/2016/ink" xmlns:am3d="http://schemas.microsoft.com/office/drawing/2017/model3d" xmlns:o="urn:schemas-microsoft-com:office:office" xmlns:r="http://schemas.openxmlformats.org/officeDocument/2006/relationships" xmlns:m="http://schemas.openxmlformats.org/officeDocument/2006/math" xmlns:v="urn:schemas-microsoft-com:vml" xmlns:wp14="http://schemas.microsoft.com/office/word/2010/wordprocessingDrawing" xmlns:wp="http://schemas.openxmlformats.org/drawingml/2006/wordprocessingDrawing" xmlns:w10="urn:schemas-microsoft-com:office:word" xmlns:w="http://schemas.openxmlformats.org/wordprocessingml/2006/main" xmlns:w14="http://schemas.microsoft.com/office/word/2010/wordml" xmlns:w15="http://schemas.microsoft.com/office/word/2012/wordml" xmlns:w16cex="http://schemas.microsoft.com/office/word/2018/wordml/cex" xmlns:w16cid="http://schemas.microsoft.com/office/word/2016/wordml/cid" xmlns:w16="http://schemas.microsoft.com/office/word/2018/wordml" xmlns:w16sdtdh="http://schemas.microsoft.com/office/word/2020/wordml/sdtdatahash" xmlns:w16se="http://schemas.microsoft.com/office/word/2015/wordml/symex" xmlns:wpg="http://schemas.microsoft.com/office/word/2010/wordprocessingGroup" xmlns:wpi="http://schemas.microsoft.com/office/word/2010/wordprocessingInk" xmlns:wne="http://schemas.microsoft.com/office/word/2006/wordml" xmlns:wps="http://schemas.microsoft.com/office/word/2010/wordprocessingShape" mc:Ignorable="w14 w15 w16se w16cid w16 w16cex w16sdtdh wp14">
+<w:hdr xmlns:wpc="http://schemas.microsoft.com/office/word/2010/wordprocessingCanvas" xmlns:cx="http://schemas.microsoft.com/office/drawing/2014/chartex" xmlns:mc="http://schemas.openxmlformats.org/markup-compatibility/2006" xmlns:o="urn:schemas-microsoft-com:office:office" xmlns:r="http://schemas.openxmlformats.org/officeDocument/2006/relationships" xmlns:m="http://schemas.openxmlformats.org/officeDocument/2006/math" xmlns:v="urn:schemas-microsoft-com:vml" xmlns:wp14="http://schemas.microsoft.com/office/word/2010/wordprocessingDrawing" xmlns:wp="http://schemas.openxmlformats.org/drawingml/2006/wordprocessingDrawing" xmlns:w10="urn:schemas-microsoft-com:office:word" xmlns:w="http://schemas.openxmlformats.org/wordprocessingml/2006/main" xmlns:w14="http://schemas.microsoft.com/office/word/2010/wordml" xmlns:w15="http://schemas.microsoft.com/office/word/2012/wordml" xmlns:w16se="http://schemas.microsoft.com/office/word/2015/wordml/symex" xmlns:wpg="http://schemas.microsoft.com/office/word/2010/wordprocessingGroup" xmlns:wpi="http://schemas.microsoft.com/office/word/2010/wordprocessingInk" xmlns:wne="http://schemas.microsoft.com/office/word/2006/wordml" xmlns:wps="http://schemas.microsoft.com/office/word/2010/wordprocessingShape" mc:Ignorable="w14 w15 w16se wp14">
   <w:sdt>
     <w:sdtPr>
       <w:id w:val="-1699001773"/>
@@ -5202,7 +5426,7 @@
             <w:sz w:val="20"/>
             <w:szCs w:val="20"/>
           </w:rPr>
-          <w:t>13</w:t>
+          <w:t>14</w:t>
         </w:r>
         <w:r>
           <w:rPr>
@@ -5223,7 +5447,7 @@
 </file>
 
 <file path=word/header3.xml><?xml version="1.0" encoding="utf-8"?>
-<w:hdr xmlns:wpc="http://schemas.microsoft.com/office/word/2010/wordprocessingCanvas" xmlns:cx="http://schemas.microsoft.com/office/drawing/2014/chartex" xmlns:cx1="http://schemas.microsoft.com/office/drawing/2015/9/8/chartex" xmlns:cx2="http://schemas.microsoft.com/office/drawing/2015/10/21/chartex" xmlns:cx3="http://schemas.microsoft.com/office/drawing/2016/5/9/chartex" xmlns:cx4="http://schemas.microsoft.com/office/drawing/2016/5/10/chartex" xmlns:cx5="http://schemas.microsoft.com/office/drawing/2016/5/11/chartex" xmlns:cx6="http://schemas.microsoft.com/office/drawing/2016/5/12/chartex" xmlns:cx7="http://schemas.microsoft.com/office/drawing/2016/5/13/chartex" xmlns:cx8="http://schemas.microsoft.com/office/drawing/2016/5/14/chartex" xmlns:mc="http://schemas.openxmlformats.org/markup-compatibility/2006" xmlns:aink="http://schemas.microsoft.com/office/drawing/2016/ink" xmlns:am3d="http://schemas.microsoft.com/office/drawing/2017/model3d" xmlns:o="urn:schemas-microsoft-com:office:office" xmlns:r="http://schemas.openxmlformats.org/officeDocument/2006/relationships" xmlns:m="http://schemas.openxmlformats.org/officeDocument/2006/math" xmlns:v="urn:schemas-microsoft-com:vml" xmlns:wp14="http://schemas.microsoft.com/office/word/2010/wordprocessingDrawing" xmlns:wp="http://schemas.openxmlformats.org/drawingml/2006/wordprocessingDrawing" xmlns:w10="urn:schemas-microsoft-com:office:word" xmlns:w="http://schemas.openxmlformats.org/wordprocessingml/2006/main" xmlns:w14="http://schemas.microsoft.com/office/word/2010/wordml" xmlns:w15="http://schemas.microsoft.com/office/word/2012/wordml" xmlns:w16cex="http://schemas.microsoft.com/office/word/2018/wordml/cex" xmlns:w16cid="http://schemas.microsoft.com/office/word/2016/wordml/cid" xmlns:w16="http://schemas.microsoft.com/office/word/2018/wordml" xmlns:w16sdtdh="http://schemas.microsoft.com/office/word/2020/wordml/sdtdatahash" xmlns:w16se="http://schemas.microsoft.com/office/word/2015/wordml/symex" xmlns:wpg="http://schemas.microsoft.com/office/word/2010/wordprocessingGroup" xmlns:wpi="http://schemas.microsoft.com/office/word/2010/wordprocessingInk" xmlns:wne="http://schemas.microsoft.com/office/word/2006/wordml" xmlns:wps="http://schemas.microsoft.com/office/word/2010/wordprocessingShape" mc:Ignorable="w14 w15 w16se w16cid w16 w16cex w16sdtdh wp14">
+<w:hdr xmlns:wpc="http://schemas.microsoft.com/office/word/2010/wordprocessingCanvas" xmlns:cx="http://schemas.microsoft.com/office/drawing/2014/chartex" xmlns:mc="http://schemas.openxmlformats.org/markup-compatibility/2006" xmlns:o="urn:schemas-microsoft-com:office:office" xmlns:r="http://schemas.openxmlformats.org/officeDocument/2006/relationships" xmlns:m="http://schemas.openxmlformats.org/officeDocument/2006/math" xmlns:v="urn:schemas-microsoft-com:vml" xmlns:wp14="http://schemas.microsoft.com/office/word/2010/wordprocessingDrawing" xmlns:wp="http://schemas.openxmlformats.org/drawingml/2006/wordprocessingDrawing" xmlns:w10="urn:schemas-microsoft-com:office:word" xmlns:w="http://schemas.openxmlformats.org/wordprocessingml/2006/main" xmlns:w14="http://schemas.microsoft.com/office/word/2010/wordml" xmlns:w15="http://schemas.microsoft.com/office/word/2012/wordml" xmlns:w16se="http://schemas.microsoft.com/office/word/2015/wordml/symex" xmlns:wpg="http://schemas.microsoft.com/office/word/2010/wordprocessingGroup" xmlns:wpi="http://schemas.microsoft.com/office/word/2010/wordprocessingInk" xmlns:wne="http://schemas.microsoft.com/office/word/2006/wordml" xmlns:wps="http://schemas.microsoft.com/office/word/2010/wordprocessingShape" mc:Ignorable="w14 w15 w16se wp14">
   <w:sdt>
     <w:sdtPr>
       <w:id w:val="958228592"/>
@@ -5271,7 +5495,7 @@
             <w:sz w:val="20"/>
             <w:szCs w:val="20"/>
           </w:rPr>
-          <w:t>14</w:t>
+          <w:t>4</w:t>
         </w:r>
         <w:r>
           <w:rPr>
@@ -5304,7 +5528,7 @@
 </file>
 
 <file path=word/numbering.xml><?xml version="1.0" encoding="utf-8"?>
-<w:numbering xmlns:wpc="http://schemas.microsoft.com/office/word/2010/wordprocessingCanvas" xmlns:cx="http://schemas.microsoft.com/office/drawing/2014/chartex" xmlns:cx1="http://schemas.microsoft.com/office/drawing/2015/9/8/chartex" xmlns:cx2="http://schemas.microsoft.com/office/drawing/2015/10/21/chartex" xmlns:cx3="http://schemas.microsoft.com/office/drawing/2016/5/9/chartex" xmlns:cx4="http://schemas.microsoft.com/office/drawing/2016/5/10/chartex" xmlns:cx5="http://schemas.microsoft.com/office/drawing/2016/5/11/chartex" xmlns:cx6="http://schemas.microsoft.com/office/drawing/2016/5/12/chartex" xmlns:cx7="http://schemas.microsoft.com/office/drawing/2016/5/13/chartex" xmlns:cx8="http://schemas.microsoft.com/office/drawing/2016/5/14/chartex" xmlns:mc="http://schemas.openxmlformats.org/markup-compatibility/2006" xmlns:aink="http://schemas.microsoft.com/office/drawing/2016/ink" xmlns:am3d="http://schemas.microsoft.com/office/drawing/2017/model3d" xmlns:o="urn:schemas-microsoft-com:office:office" xmlns:r="http://schemas.openxmlformats.org/officeDocument/2006/relationships" xmlns:m="http://schemas.openxmlformats.org/officeDocument/2006/math" xmlns:v="urn:schemas-microsoft-com:vml" xmlns:wp14="http://schemas.microsoft.com/office/word/2010/wordprocessingDrawing" xmlns:wp="http://schemas.openxmlformats.org/drawingml/2006/wordprocessingDrawing" xmlns:w10="urn:schemas-microsoft-com:office:word" xmlns:w="http://schemas.openxmlformats.org/wordprocessingml/2006/main" xmlns:w14="http://schemas.microsoft.com/office/word/2010/wordml" xmlns:w15="http://schemas.microsoft.com/office/word/2012/wordml" xmlns:w16cex="http://schemas.microsoft.com/office/word/2018/wordml/cex" xmlns:w16cid="http://schemas.microsoft.com/office/word/2016/wordml/cid" xmlns:w16="http://schemas.microsoft.com/office/word/2018/wordml" xmlns:w16sdtdh="http://schemas.microsoft.com/office/word/2020/wordml/sdtdatahash" xmlns:w16se="http://schemas.microsoft.com/office/word/2015/wordml/symex" xmlns:wpg="http://schemas.microsoft.com/office/word/2010/wordprocessingGroup" xmlns:wpi="http://schemas.microsoft.com/office/word/2010/wordprocessingInk" xmlns:wne="http://schemas.microsoft.com/office/word/2006/wordml" xmlns:wps="http://schemas.microsoft.com/office/word/2010/wordprocessingShape" mc:Ignorable="w14 w15 w16se w16cid w16 w16cex w16sdtdh wp14">
+<w:numbering xmlns:wpc="http://schemas.microsoft.com/office/word/2010/wordprocessingCanvas" xmlns:cx="http://schemas.microsoft.com/office/drawing/2014/chartex" xmlns:mc="http://schemas.openxmlformats.org/markup-compatibility/2006" xmlns:o="urn:schemas-microsoft-com:office:office" xmlns:r="http://schemas.openxmlformats.org/officeDocument/2006/relationships" xmlns:m="http://schemas.openxmlformats.org/officeDocument/2006/math" xmlns:v="urn:schemas-microsoft-com:vml" xmlns:wp14="http://schemas.microsoft.com/office/word/2010/wordprocessingDrawing" xmlns:wp="http://schemas.openxmlformats.org/drawingml/2006/wordprocessingDrawing" xmlns:w10="urn:schemas-microsoft-com:office:word" xmlns:w="http://schemas.openxmlformats.org/wordprocessingml/2006/main" xmlns:w14="http://schemas.microsoft.com/office/word/2010/wordml" xmlns:w15="http://schemas.microsoft.com/office/word/2012/wordml" xmlns:w16se="http://schemas.microsoft.com/office/word/2015/wordml/symex" xmlns:wpg="http://schemas.microsoft.com/office/word/2010/wordprocessingGroup" xmlns:wpi="http://schemas.microsoft.com/office/word/2010/wordprocessingInk" xmlns:wne="http://schemas.microsoft.com/office/word/2006/wordml" xmlns:wps="http://schemas.microsoft.com/office/word/2010/wordprocessingShape" mc:Ignorable="w14 w15 w16se wp14">
   <w:abstractNum w:abstractNumId="0" w15:restartNumberingAfterBreak="0">
     <w:nsid w:val="00AB5A76"/>
     <w:multiLevelType w:val="hybridMultilevel"/>
@@ -7837,7 +8061,7 @@
 </file>
 
 <file path=word/styles.xml><?xml version="1.0" encoding="utf-8"?>
-<w:styles xmlns:mc="http://schemas.openxmlformats.org/markup-compatibility/2006" xmlns:r="http://schemas.openxmlformats.org/officeDocument/2006/relationships" xmlns:w="http://schemas.openxmlformats.org/wordprocessingml/2006/main" xmlns:w14="http://schemas.microsoft.com/office/word/2010/wordml" xmlns:w15="http://schemas.microsoft.com/office/word/2012/wordml" xmlns:w16cex="http://schemas.microsoft.com/office/word/2018/wordml/cex" xmlns:w16cid="http://schemas.microsoft.com/office/word/2016/wordml/cid" xmlns:w16="http://schemas.microsoft.com/office/word/2018/wordml" xmlns:w16sdtdh="http://schemas.microsoft.com/office/word/2020/wordml/sdtdatahash" xmlns:w16se="http://schemas.microsoft.com/office/word/2015/wordml/symex" mc:Ignorable="w14 w15 w16se w16cid w16 w16cex w16sdtdh">
+<w:styles xmlns:mc="http://schemas.openxmlformats.org/markup-compatibility/2006" xmlns:r="http://schemas.openxmlformats.org/officeDocument/2006/relationships" xmlns:w="http://schemas.openxmlformats.org/wordprocessingml/2006/main" xmlns:w14="http://schemas.microsoft.com/office/word/2010/wordml" xmlns:w15="http://schemas.microsoft.com/office/word/2012/wordml" xmlns:w16se="http://schemas.microsoft.com/office/word/2015/wordml/symex" mc:Ignorable="w14 w15 w16se">
   <w:docDefaults>
     <w:rPrDefault>
       <w:rPr>
@@ -7847,7 +8071,7 @@
     </w:rPrDefault>
     <w:pPrDefault/>
   </w:docDefaults>
-  <w:latentStyles w:defLockedState="0" w:defUIPriority="99" w:defSemiHidden="0" w:defUnhideWhenUsed="0" w:defQFormat="0" w:count="376">
+  <w:latentStyles w:defLockedState="0" w:defUIPriority="99" w:defSemiHidden="0" w:defUnhideWhenUsed="0" w:defQFormat="0" w:count="371">
     <w:lsdException w:name="Normal" w:uiPriority="0" w:qFormat="1"/>
     <w:lsdException w:name="heading 1" w:uiPriority="9" w:qFormat="1"/>
     <w:lsdException w:name="heading 2" w:uiPriority="9" w:unhideWhenUsed="1" w:qFormat="1"/>
@@ -8219,11 +8443,6 @@
     <w:lsdException w:name="List Table 5 Dark Accent 6" w:uiPriority="50"/>
     <w:lsdException w:name="List Table 6 Colorful Accent 6" w:uiPriority="51"/>
     <w:lsdException w:name="List Table 7 Colorful Accent 6" w:uiPriority="52"/>
-    <w:lsdException w:name="Mention" w:semiHidden="1" w:unhideWhenUsed="1"/>
-    <w:lsdException w:name="Smart Hyperlink" w:semiHidden="1" w:unhideWhenUsed="1"/>
-    <w:lsdException w:name="Hashtag" w:semiHidden="1" w:unhideWhenUsed="1"/>
-    <w:lsdException w:name="Unresolved Mention" w:semiHidden="1" w:unhideWhenUsed="1"/>
-    <w:lsdException w:name="Smart Link" w:semiHidden="1" w:unhideWhenUsed="1"/>
   </w:latentStyles>
   <w:style w:type="paragraph" w:default="1" w:styleId="Normal">
     <w:name w:val="Normal"/>
@@ -9437,7 +9656,7 @@
 </file>
 
 <file path=customXml/itemProps1.xml><?xml version="1.0" encoding="utf-8"?>
-<ds:datastoreItem xmlns:ds="http://schemas.openxmlformats.org/officeDocument/2006/customXml" ds:itemID="{EE8685F5-AC58-4690-BC84-9B3BAA5F780E}">
+<ds:datastoreItem xmlns:ds="http://schemas.openxmlformats.org/officeDocument/2006/customXml" ds:itemID="{304375EA-F9CA-49B2-940F-4F75A375B12E}">
   <ds:schemaRefs>
     <ds:schemaRef ds:uri="http://schemas.openxmlformats.org/officeDocument/2006/bibliography"/>
   </ds:schemaRefs>

</xml_diff>

<commit_message>
Adicionando o documento atualizado com os dicionários de dados - 14/04/2026
</commit_message>
<xml_diff>
--- a/Terceiro_Semestre/Projeto_Integrador/Documentação/Modelo_Projeto_Integrador_principal.docx
+++ b/Terceiro_Semestre/Projeto_Integrador/Documentação/Modelo_Projeto_Integrador_principal.docx
@@ -1,6 +1,6 @@
 
 <file path=word/document.xml><?xml version="1.0" encoding="utf-8"?>
-<w:document xmlns:wpc="http://schemas.microsoft.com/office/word/2010/wordprocessingCanvas" xmlns:cx="http://schemas.microsoft.com/office/drawing/2014/chartex" xmlns:mc="http://schemas.openxmlformats.org/markup-compatibility/2006" xmlns:o="urn:schemas-microsoft-com:office:office" xmlns:r="http://schemas.openxmlformats.org/officeDocument/2006/relationships" xmlns:m="http://schemas.openxmlformats.org/officeDocument/2006/math" xmlns:v="urn:schemas-microsoft-com:vml" xmlns:wp14="http://schemas.microsoft.com/office/word/2010/wordprocessingDrawing" xmlns:wp="http://schemas.openxmlformats.org/drawingml/2006/wordprocessingDrawing" xmlns:w10="urn:schemas-microsoft-com:office:word" xmlns:w="http://schemas.openxmlformats.org/wordprocessingml/2006/main" xmlns:w14="http://schemas.microsoft.com/office/word/2010/wordml" xmlns:w15="http://schemas.microsoft.com/office/word/2012/wordml" xmlns:w16se="http://schemas.microsoft.com/office/word/2015/wordml/symex" xmlns:wpg="http://schemas.microsoft.com/office/word/2010/wordprocessingGroup" xmlns:wpi="http://schemas.microsoft.com/office/word/2010/wordprocessingInk" xmlns:wne="http://schemas.microsoft.com/office/word/2006/wordml" xmlns:wps="http://schemas.microsoft.com/office/word/2010/wordprocessingShape" mc:Ignorable="w14 w15 w16se wp14">
+<w:document xmlns:wpc="http://schemas.microsoft.com/office/word/2010/wordprocessingCanvas" xmlns:cx="http://schemas.microsoft.com/office/drawing/2014/chartex" xmlns:cx1="http://schemas.microsoft.com/office/drawing/2015/9/8/chartex" xmlns:cx2="http://schemas.microsoft.com/office/drawing/2015/10/21/chartex" xmlns:cx3="http://schemas.microsoft.com/office/drawing/2016/5/9/chartex" xmlns:cx4="http://schemas.microsoft.com/office/drawing/2016/5/10/chartex" xmlns:cx5="http://schemas.microsoft.com/office/drawing/2016/5/11/chartex" xmlns:cx6="http://schemas.microsoft.com/office/drawing/2016/5/12/chartex" xmlns:cx7="http://schemas.microsoft.com/office/drawing/2016/5/13/chartex" xmlns:cx8="http://schemas.microsoft.com/office/drawing/2016/5/14/chartex" xmlns:mc="http://schemas.openxmlformats.org/markup-compatibility/2006" xmlns:aink="http://schemas.microsoft.com/office/drawing/2016/ink" xmlns:am3d="http://schemas.microsoft.com/office/drawing/2017/model3d" xmlns:o="urn:schemas-microsoft-com:office:office" xmlns:r="http://schemas.openxmlformats.org/officeDocument/2006/relationships" xmlns:m="http://schemas.openxmlformats.org/officeDocument/2006/math" xmlns:v="urn:schemas-microsoft-com:vml" xmlns:wp14="http://schemas.microsoft.com/office/word/2010/wordprocessingDrawing" xmlns:wp="http://schemas.openxmlformats.org/drawingml/2006/wordprocessingDrawing" xmlns:w10="urn:schemas-microsoft-com:office:word" xmlns:w="http://schemas.openxmlformats.org/wordprocessingml/2006/main" xmlns:w14="http://schemas.microsoft.com/office/word/2010/wordml" xmlns:w15="http://schemas.microsoft.com/office/word/2012/wordml" xmlns:w16cex="http://schemas.microsoft.com/office/word/2018/wordml/cex" xmlns:w16cid="http://schemas.microsoft.com/office/word/2016/wordml/cid" xmlns:w16="http://schemas.microsoft.com/office/word/2018/wordml" xmlns:w16sdtdh="http://schemas.microsoft.com/office/word/2020/wordml/sdtdatahash" xmlns:w16se="http://schemas.microsoft.com/office/word/2015/wordml/symex" xmlns:wpg="http://schemas.microsoft.com/office/word/2010/wordprocessingGroup" xmlns:wpi="http://schemas.microsoft.com/office/word/2010/wordprocessingInk" xmlns:wne="http://schemas.microsoft.com/office/word/2006/wordml" xmlns:wps="http://schemas.microsoft.com/office/word/2010/wordprocessingShape" mc:Ignorable="w14 w15 w16se w16cid w16 w16cex w16sdtdh wp14">
   <w:body>
     <w:p>
       <w:pPr>
@@ -3236,9 +3236,17 @@
         </w:rPr>
         <w:lastRenderedPageBreak/>
         <w:drawing>
-          <wp:inline distT="0" distB="0" distL="0" distR="0" wp14:anchorId="4811D009" wp14:editId="0150D74F">
-            <wp:extent cx="9533169" cy="2407462"/>
+          <wp:anchor distT="0" distB="0" distL="114300" distR="114300" simplePos="0" relativeHeight="251658240" behindDoc="0" locked="0" layoutInCell="1" allowOverlap="1" wp14:anchorId="4811D009" wp14:editId="23D037D5">
+            <wp:simplePos x="0" y="0"/>
+            <wp:positionH relativeFrom="page">
+              <wp:align>center</wp:align>
+            </wp:positionH>
+            <wp:positionV relativeFrom="paragraph">
+              <wp:posOffset>3562985</wp:posOffset>
+            </wp:positionV>
+            <wp:extent cx="9532620" cy="2407285"/>
             <wp:effectExtent l="317" t="0" r="0" b="0"/>
+            <wp:wrapSquare wrapText="bothSides"/>
             <wp:docPr id="1" name="Imagem 1"/>
             <wp:cNvGraphicFramePr>
               <a:graphicFrameLocks xmlns:a="http://schemas.openxmlformats.org/drawingml/2006/main" noChangeAspect="1"/>
@@ -3251,7 +3259,13 @@
                     <pic:cNvPicPr/>
                   </pic:nvPicPr>
                   <pic:blipFill>
-                    <a:blip r:embed="rId14"/>
+                    <a:blip r:embed="rId14">
+                      <a:extLst>
+                        <a:ext uri="{28A0092B-C50C-407E-A947-70E740481C1C}">
+                          <a14:useLocalDpi xmlns:a14="http://schemas.microsoft.com/office/drawing/2010/main" val="0"/>
+                        </a:ext>
+                      </a:extLst>
+                    </a:blip>
                     <a:stretch>
                       <a:fillRect/>
                     </a:stretch>
@@ -3259,7 +3273,7 @@
                   <pic:spPr>
                     <a:xfrm rot="16200000">
                       <a:off x="0" y="0"/>
-                      <a:ext cx="9564129" cy="2415281"/>
+                      <a:ext cx="9532620" cy="2407285"/>
                     </a:xfrm>
                     <a:prstGeom prst="rect">
                       <a:avLst/>
@@ -3268,7 +3282,7 @@
                 </pic:pic>
               </a:graphicData>
             </a:graphic>
-          </wp:inline>
+          </wp:anchor>
         </w:drawing>
       </w:r>
       <w:r>
@@ -3682,8 +3696,6 @@
       </w:pPr>
       <w:r>
         <w:rPr>
-          <w:b w:val="0"/>
-          <w:bCs w:val="0"/>
           <w:i w:val="0"/>
           <w:iCs/>
         </w:rPr>
@@ -3757,6 +3769,12 @@
           <w:iCs/>
         </w:rPr>
         <w:br/>
+      </w:r>
+      <w:r>
+        <w:rPr>
+          <w:i w:val="0"/>
+          <w:iCs/>
+        </w:rPr>
         <w:t>Diagrama de Casos de Uso:</w:t>
       </w:r>
     </w:p>
@@ -4304,13 +4322,7 @@
         <w:pStyle w:val="PargrafodaLista"/>
       </w:pPr>
       <w:r>
-        <w:t>Descrição: O</w:t>
-      </w:r>
-      <w:r>
-        <w:t xml:space="preserve"> sistema deve permitir a vinculação dos os softwares instalados com </w:t>
-      </w:r>
-      <w:r>
-        <w:t>cada disciplina.</w:t>
+        <w:t>Descrição: O sistema deve permitir a vinculação dos os softwares instalados com cada disciplina.</w:t>
       </w:r>
     </w:p>
     <w:p>
@@ -4353,10 +4365,7 @@
         <w:pStyle w:val="PargrafodaLista"/>
       </w:pPr>
       <w:r>
-        <w:t xml:space="preserve">Descrição: O sistema deve permitir a </w:t>
-      </w:r>
-      <w:r>
-        <w:t>solicitação de alocação dos laboratórios.</w:t>
+        <w:t>Descrição: O sistema deve permitir a solicitação de alocação dos laboratórios.</w:t>
       </w:r>
     </w:p>
     <w:p>
@@ -4377,41 +4386,34 @@
           <w:bCs/>
         </w:rPr>
         <w:lastRenderedPageBreak/>
-        <w:t>R</w:t>
+        <w:t>RF13</w:t>
       </w:r>
       <w:r>
         <w:rPr>
           <w:b/>
           <w:bCs/>
         </w:rPr>
-        <w:t>F13</w:t>
+        <w:t xml:space="preserve"> </w:t>
       </w:r>
       <w:r>
         <w:rPr>
           <w:b/>
           <w:bCs/>
         </w:rPr>
-        <w:t xml:space="preserve"> </w:t>
+        <w:t>–</w:t>
       </w:r>
       <w:r>
         <w:rPr>
           <w:b/>
           <w:bCs/>
         </w:rPr>
-        <w:t>–</w:t>
+        <w:t xml:space="preserve"> </w:t>
       </w:r>
       <w:r>
         <w:rPr>
           <w:b/>
           <w:bCs/>
         </w:rPr>
-        <w:t xml:space="preserve"> </w:t>
-      </w:r>
-      <w:r>
-        <w:rPr>
-          <w:b/>
-          <w:bCs/>
-        </w:rPr>
         <w:t>Filtrar Software por Laboratórios</w:t>
       </w:r>
     </w:p>
@@ -4431,10 +4433,7 @@
         </w:rPr>
       </w:pPr>
       <w:r>
-        <w:t xml:space="preserve">Descrição: O sistema deve permitir a </w:t>
-      </w:r>
-      <w:r>
-        <w:t>filtragem dos softwares por cada laboratório.</w:t>
+        <w:t>Descrição: O sistema deve permitir a filtragem dos softwares por cada laboratório.</w:t>
       </w:r>
     </w:p>
     <w:p>
@@ -4476,10 +4475,7 @@
         <w:pStyle w:val="PargrafodaLista"/>
       </w:pPr>
       <w:r>
-        <w:t xml:space="preserve">Ator: </w:t>
-      </w:r>
-      <w:r>
-        <w:t>Responsável de TI.</w:t>
+        <w:t>Ator: Responsável de TI.</w:t>
       </w:r>
     </w:p>
     <w:p>
@@ -4490,10 +4486,7 @@
         </w:rPr>
       </w:pPr>
       <w:r>
-        <w:t xml:space="preserve">Descrição: O sistema deve permitir </w:t>
-      </w:r>
-      <w:r>
-        <w:t>o cadastro de softwares no sistema.</w:t>
+        <w:t>Descrição: O sistema deve permitir o cadastro de softwares no sistema.</w:t>
       </w:r>
     </w:p>
     <w:p>
@@ -4546,13 +4539,7 @@
         </w:rPr>
       </w:pPr>
       <w:r>
-        <w:t xml:space="preserve">Descrição: O sistema deve permitir </w:t>
-      </w:r>
-      <w:r>
-        <w:t xml:space="preserve">a atualização dos registros </w:t>
-      </w:r>
-      <w:r>
-        <w:t>de softwares no sistema.</w:t>
+        <w:t>Descrição: O sistema deve permitir a atualização dos registros de softwares no sistema.</w:t>
       </w:r>
     </w:p>
     <w:p>
@@ -4598,13 +4585,7 @@
         </w:rPr>
       </w:pPr>
       <w:r>
-        <w:t xml:space="preserve">Descrição: O sistema deve permitir a </w:t>
-      </w:r>
-      <w:r>
-        <w:t>remoção</w:t>
-      </w:r>
-      <w:r>
-        <w:t xml:space="preserve"> dos registros de softwares no sistema.</w:t>
+        <w:t>Descrição: O sistema deve permitir a remoção dos registros de softwares no sistema.</w:t>
       </w:r>
     </w:p>
     <w:p>
@@ -4665,16 +4646,7 @@
       </w:r>
       <w:proofErr w:type="spellEnd"/>
       <w:r>
-        <w:t xml:space="preserve"> dos </w:t>
-      </w:r>
-      <w:r>
-        <w:t xml:space="preserve">softwares </w:t>
-      </w:r>
-      <w:r>
-        <w:t>registrados por laboratório</w:t>
-      </w:r>
-      <w:r>
-        <w:t>.</w:t>
+        <w:t xml:space="preserve"> dos softwares registrados por laboratório.</w:t>
       </w:r>
     </w:p>
     <w:p>
@@ -4684,34 +4656,32 @@
           <w:bCs/>
         </w:rPr>
       </w:pPr>
-      <w:bookmarkStart w:id="21" w:name="_GoBack"/>
+    </w:p>
+    <w:p>
+      <w:pPr>
+        <w:pStyle w:val="Ttulo3"/>
+        <w:jc w:val="both"/>
+        <w:rPr>
+          <w:i w:val="0"/>
+        </w:rPr>
+      </w:pPr>
+      <w:bookmarkStart w:id="21" w:name="_Toc16793"/>
+      <w:r>
+        <w:rPr>
+          <w:i w:val="0"/>
+        </w:rPr>
+        <w:t>3.4</w:t>
+      </w:r>
+      <w:r>
+        <w:tab/>
+      </w:r>
+      <w:r>
+        <w:rPr>
+          <w:i w:val="0"/>
+        </w:rPr>
+        <w:t>REQUISITOS DE BANCO DE DADOS</w:t>
+      </w:r>
       <w:bookmarkEnd w:id="21"/>
-    </w:p>
-    <w:p>
-      <w:pPr>
-        <w:pStyle w:val="Ttulo3"/>
-        <w:jc w:val="both"/>
-        <w:rPr>
-          <w:i w:val="0"/>
-        </w:rPr>
-      </w:pPr>
-      <w:bookmarkStart w:id="22" w:name="_Toc16793"/>
-      <w:r>
-        <w:rPr>
-          <w:i w:val="0"/>
-        </w:rPr>
-        <w:t>3.4</w:t>
-      </w:r>
-      <w:r>
-        <w:tab/>
-      </w:r>
-      <w:r>
-        <w:rPr>
-          <w:i w:val="0"/>
-        </w:rPr>
-        <w:t>REQUISITOS DE BANCO DE DADOS</w:t>
-      </w:r>
-      <w:bookmarkEnd w:id="22"/>
     </w:p>
     <w:p>
       <w:pPr>
@@ -4722,7 +4692,7 @@
           <w:iCs/>
         </w:rPr>
       </w:pPr>
-      <w:bookmarkStart w:id="23" w:name="_Toc27034"/>
+      <w:bookmarkStart w:id="22" w:name="_Toc27034"/>
       <w:r>
         <w:rPr>
           <w:i w:val="0"/>
@@ -4738,17 +4708,25 @@
         </w:rPr>
         <w:t>MODELO FÍSICO E LÓGICO DA BASE DE DADOS</w:t>
       </w:r>
-      <w:bookmarkEnd w:id="23"/>
+      <w:bookmarkEnd w:id="22"/>
     </w:p>
     <w:p>
       <w:pPr>
         <w:ind w:left="851"/>
       </w:pPr>
       <w:r>
+        <w:rPr>
+          <w:b/>
+          <w:bCs/>
+        </w:rPr>
         <w:lastRenderedPageBreak/>
         <w:t xml:space="preserve">Diagrama </w:t>
       </w:r>
       <w:r>
+        <w:rPr>
+          <w:b/>
+          <w:bCs/>
+        </w:rPr>
         <w:t>de Entidade e Relacionamento</w:t>
       </w:r>
       <w:r>
@@ -4760,9 +4738,9 @@
           <w:lang w:eastAsia="pt-BR"/>
         </w:rPr>
         <w:drawing>
-          <wp:inline distT="0" distB="0" distL="0" distR="0" wp14:anchorId="220AB256" wp14:editId="70AD707B">
-            <wp:extent cx="4305300" cy="5445692"/>
-            <wp:effectExtent l="0" t="0" r="0" b="3175"/>
+          <wp:inline distT="0" distB="0" distL="0" distR="0" wp14:anchorId="220AB256" wp14:editId="516DC60A">
+            <wp:extent cx="4336699" cy="5487129"/>
+            <wp:effectExtent l="0" t="0" r="6985" b="0"/>
             <wp:docPr id="3" name="Imagem 3"/>
             <wp:cNvGraphicFramePr>
               <a:graphicFrameLocks xmlns:a="http://schemas.openxmlformats.org/drawingml/2006/main" noChangeAspect="1"/>
@@ -4789,7 +4767,7 @@
                   <pic:spPr>
                     <a:xfrm>
                       <a:off x="0" y="0"/>
-                      <a:ext cx="4338060" cy="5487129"/>
+                      <a:ext cx="4336699" cy="5487129"/>
                     </a:xfrm>
                     <a:prstGeom prst="rect">
                       <a:avLst/>
@@ -4814,10 +4792,9 @@
         <w:jc w:val="both"/>
         <w:rPr>
           <w:i w:val="0"/>
-          <w:iCs/>
-        </w:rPr>
-      </w:pPr>
-      <w:bookmarkStart w:id="24" w:name="_Toc16266"/>
+        </w:rPr>
+      </w:pPr>
+      <w:bookmarkStart w:id="23" w:name="_Toc16266"/>
       <w:r>
         <w:rPr>
           <w:i w:val="0"/>
@@ -4833,27 +4810,490 @@
         </w:rPr>
         <w:t>DICIONÁRIO DE DADOS</w:t>
       </w:r>
-      <w:bookmarkEnd w:id="24"/>
-    </w:p>
-    <w:p>
-      <w:pPr>
-        <w:jc w:val="both"/>
-        <w:rPr>
-          <w:highlight w:val="yellow"/>
-        </w:rPr>
-      </w:pPr>
-      <w:r>
-        <w:rPr>
-          <w:highlight w:val="yellow"/>
-        </w:rPr>
-        <w:t>Verificar modelo presente no Moodle</w:t>
-      </w:r>
-    </w:p>
-    <w:p>
-      <w:pPr>
-        <w:jc w:val="both"/>
-      </w:pPr>
-    </w:p>
+      <w:bookmarkEnd w:id="23"/>
+    </w:p>
+    <w:p>
+      <w:pPr>
+        <w:rPr>
+          <w:b/>
+          <w:bCs/>
+        </w:rPr>
+      </w:pPr>
+      <w:r>
+        <w:rPr>
+          <w:b/>
+          <w:bCs/>
+        </w:rPr>
+        <w:t>1. Tabela Laboratório</w:t>
+      </w:r>
+    </w:p>
+    <w:p>
+      <w:r>
+        <w:rPr>
+          <w:noProof/>
+        </w:rPr>
+        <w:drawing>
+          <wp:inline distT="0" distB="0" distL="0" distR="0" wp14:anchorId="2EA7A7F6" wp14:editId="213091E0">
+            <wp:extent cx="5760720" cy="1036955"/>
+            <wp:effectExtent l="0" t="0" r="0" b="0"/>
+            <wp:docPr id="2" name="Imagem 2"/>
+            <wp:cNvGraphicFramePr>
+              <a:graphicFrameLocks xmlns:a="http://schemas.openxmlformats.org/drawingml/2006/main" noChangeAspect="1"/>
+            </wp:cNvGraphicFramePr>
+            <a:graphic xmlns:a="http://schemas.openxmlformats.org/drawingml/2006/main">
+              <a:graphicData uri="http://schemas.openxmlformats.org/drawingml/2006/picture">
+                <pic:pic xmlns:pic="http://schemas.openxmlformats.org/drawingml/2006/picture">
+                  <pic:nvPicPr>
+                    <pic:cNvPr id="2" name="Imagem 2"/>
+                    <pic:cNvPicPr/>
+                  </pic:nvPicPr>
+                  <pic:blipFill>
+                    <a:blip r:embed="rId18">
+                      <a:extLst>
+                        <a:ext uri="{28A0092B-C50C-407E-A947-70E740481C1C}">
+                          <a14:useLocalDpi xmlns:a14="http://schemas.microsoft.com/office/drawing/2010/main" val="0"/>
+                        </a:ext>
+                      </a:extLst>
+                    </a:blip>
+                    <a:stretch>
+                      <a:fillRect/>
+                    </a:stretch>
+                  </pic:blipFill>
+                  <pic:spPr>
+                    <a:xfrm>
+                      <a:off x="0" y="0"/>
+                      <a:ext cx="5760720" cy="1036955"/>
+                    </a:xfrm>
+                    <a:prstGeom prst="rect">
+                      <a:avLst/>
+                    </a:prstGeom>
+                  </pic:spPr>
+                </pic:pic>
+              </a:graphicData>
+            </a:graphic>
+          </wp:inline>
+        </w:drawing>
+      </w:r>
+    </w:p>
+    <w:p/>
+    <w:p/>
+    <w:p/>
+    <w:p/>
+    <w:p>
+      <w:pPr>
+        <w:rPr>
+          <w:b/>
+          <w:bCs/>
+        </w:rPr>
+      </w:pPr>
+      <w:r>
+        <w:rPr>
+          <w:b/>
+          <w:bCs/>
+        </w:rPr>
+        <w:lastRenderedPageBreak/>
+        <w:t>2. Tabela</w:t>
+      </w:r>
+      <w:r>
+        <w:rPr>
+          <w:b/>
+          <w:bCs/>
+        </w:rPr>
+        <w:t xml:space="preserve"> Usuários</w:t>
+      </w:r>
+    </w:p>
+    <w:p>
+      <w:r>
+        <w:rPr>
+          <w:noProof/>
+        </w:rPr>
+        <w:drawing>
+          <wp:inline distT="0" distB="0" distL="0" distR="0" wp14:anchorId="32AD5C31" wp14:editId="7246D2DE">
+            <wp:extent cx="5760720" cy="897890"/>
+            <wp:effectExtent l="0" t="0" r="0" b="0"/>
+            <wp:docPr id="5" name="Imagem 5"/>
+            <wp:cNvGraphicFramePr>
+              <a:graphicFrameLocks xmlns:a="http://schemas.openxmlformats.org/drawingml/2006/main" noChangeAspect="1"/>
+            </wp:cNvGraphicFramePr>
+            <a:graphic xmlns:a="http://schemas.openxmlformats.org/drawingml/2006/main">
+              <a:graphicData uri="http://schemas.openxmlformats.org/drawingml/2006/picture">
+                <pic:pic xmlns:pic="http://schemas.openxmlformats.org/drawingml/2006/picture">
+                  <pic:nvPicPr>
+                    <pic:cNvPr id="5" name="Imagem 5"/>
+                    <pic:cNvPicPr/>
+                  </pic:nvPicPr>
+                  <pic:blipFill>
+                    <a:blip r:embed="rId19">
+                      <a:extLst>
+                        <a:ext uri="{28A0092B-C50C-407E-A947-70E740481C1C}">
+                          <a14:useLocalDpi xmlns:a14="http://schemas.microsoft.com/office/drawing/2010/main" val="0"/>
+                        </a:ext>
+                      </a:extLst>
+                    </a:blip>
+                    <a:stretch>
+                      <a:fillRect/>
+                    </a:stretch>
+                  </pic:blipFill>
+                  <pic:spPr>
+                    <a:xfrm>
+                      <a:off x="0" y="0"/>
+                      <a:ext cx="5760720" cy="897890"/>
+                    </a:xfrm>
+                    <a:prstGeom prst="rect">
+                      <a:avLst/>
+                    </a:prstGeom>
+                  </pic:spPr>
+                </pic:pic>
+              </a:graphicData>
+            </a:graphic>
+          </wp:inline>
+        </w:drawing>
+      </w:r>
+    </w:p>
+    <w:p>
+      <w:pPr>
+        <w:rPr>
+          <w:b/>
+          <w:bCs/>
+        </w:rPr>
+      </w:pPr>
+      <w:r>
+        <w:rPr>
+          <w:b/>
+          <w:bCs/>
+        </w:rPr>
+        <w:t>3. Tabela Software</w:t>
+      </w:r>
+    </w:p>
+    <w:p>
+      <w:r>
+        <w:rPr>
+          <w:noProof/>
+        </w:rPr>
+        <w:drawing>
+          <wp:inline distT="0" distB="0" distL="0" distR="0" wp14:anchorId="5A0A9D17" wp14:editId="5CF45672">
+            <wp:extent cx="5760720" cy="654685"/>
+            <wp:effectExtent l="0" t="0" r="0" b="0"/>
+            <wp:docPr id="6" name="Imagem 6"/>
+            <wp:cNvGraphicFramePr>
+              <a:graphicFrameLocks xmlns:a="http://schemas.openxmlformats.org/drawingml/2006/main" noChangeAspect="1"/>
+            </wp:cNvGraphicFramePr>
+            <a:graphic xmlns:a="http://schemas.openxmlformats.org/drawingml/2006/main">
+              <a:graphicData uri="http://schemas.openxmlformats.org/drawingml/2006/picture">
+                <pic:pic xmlns:pic="http://schemas.openxmlformats.org/drawingml/2006/picture">
+                  <pic:nvPicPr>
+                    <pic:cNvPr id="6" name="Imagem 6"/>
+                    <pic:cNvPicPr/>
+                  </pic:nvPicPr>
+                  <pic:blipFill>
+                    <a:blip r:embed="rId20">
+                      <a:extLst>
+                        <a:ext uri="{28A0092B-C50C-407E-A947-70E740481C1C}">
+                          <a14:useLocalDpi xmlns:a14="http://schemas.microsoft.com/office/drawing/2010/main" val="0"/>
+                        </a:ext>
+                      </a:extLst>
+                    </a:blip>
+                    <a:stretch>
+                      <a:fillRect/>
+                    </a:stretch>
+                  </pic:blipFill>
+                  <pic:spPr>
+                    <a:xfrm>
+                      <a:off x="0" y="0"/>
+                      <a:ext cx="5760720" cy="654685"/>
+                    </a:xfrm>
+                    <a:prstGeom prst="rect">
+                      <a:avLst/>
+                    </a:prstGeom>
+                  </pic:spPr>
+                </pic:pic>
+              </a:graphicData>
+            </a:graphic>
+          </wp:inline>
+        </w:drawing>
+      </w:r>
+    </w:p>
+    <w:p>
+      <w:pPr>
+        <w:rPr>
+          <w:b/>
+          <w:bCs/>
+        </w:rPr>
+      </w:pPr>
+      <w:r>
+        <w:rPr>
+          <w:b/>
+          <w:bCs/>
+        </w:rPr>
+        <w:t>4. Tabela Disciplina</w:t>
+      </w:r>
+    </w:p>
+    <w:p>
+      <w:r>
+        <w:rPr>
+          <w:noProof/>
+        </w:rPr>
+        <w:drawing>
+          <wp:inline distT="0" distB="0" distL="0" distR="0" wp14:anchorId="61B11120" wp14:editId="2C9CE03E">
+            <wp:extent cx="5760720" cy="819150"/>
+            <wp:effectExtent l="0" t="0" r="0" b="0"/>
+            <wp:docPr id="7" name="Imagem 7"/>
+            <wp:cNvGraphicFramePr>
+              <a:graphicFrameLocks xmlns:a="http://schemas.openxmlformats.org/drawingml/2006/main" noChangeAspect="1"/>
+            </wp:cNvGraphicFramePr>
+            <a:graphic xmlns:a="http://schemas.openxmlformats.org/drawingml/2006/main">
+              <a:graphicData uri="http://schemas.openxmlformats.org/drawingml/2006/picture">
+                <pic:pic xmlns:pic="http://schemas.openxmlformats.org/drawingml/2006/picture">
+                  <pic:nvPicPr>
+                    <pic:cNvPr id="7" name="Imagem 7"/>
+                    <pic:cNvPicPr/>
+                  </pic:nvPicPr>
+                  <pic:blipFill>
+                    <a:blip r:embed="rId21">
+                      <a:extLst>
+                        <a:ext uri="{28A0092B-C50C-407E-A947-70E740481C1C}">
+                          <a14:useLocalDpi xmlns:a14="http://schemas.microsoft.com/office/drawing/2010/main" val="0"/>
+                        </a:ext>
+                      </a:extLst>
+                    </a:blip>
+                    <a:stretch>
+                      <a:fillRect/>
+                    </a:stretch>
+                  </pic:blipFill>
+                  <pic:spPr>
+                    <a:xfrm>
+                      <a:off x="0" y="0"/>
+                      <a:ext cx="5760720" cy="819150"/>
+                    </a:xfrm>
+                    <a:prstGeom prst="rect">
+                      <a:avLst/>
+                    </a:prstGeom>
+                  </pic:spPr>
+                </pic:pic>
+              </a:graphicData>
+            </a:graphic>
+          </wp:inline>
+        </w:drawing>
+      </w:r>
+    </w:p>
+    <w:p>
+      <w:pPr>
+        <w:rPr>
+          <w:b/>
+          <w:bCs/>
+        </w:rPr>
+      </w:pPr>
+      <w:r>
+        <w:rPr>
+          <w:b/>
+          <w:bCs/>
+        </w:rPr>
+        <w:t>5. Tabela Alocação</w:t>
+      </w:r>
+    </w:p>
+    <w:p>
+      <w:r>
+        <w:rPr>
+          <w:noProof/>
+        </w:rPr>
+        <w:drawing>
+          <wp:inline distT="0" distB="0" distL="0" distR="0" wp14:anchorId="4DC00A87" wp14:editId="11BEE019">
+            <wp:extent cx="5760720" cy="1146810"/>
+            <wp:effectExtent l="0" t="0" r="0" b="0"/>
+            <wp:docPr id="8" name="Imagem 8"/>
+            <wp:cNvGraphicFramePr>
+              <a:graphicFrameLocks xmlns:a="http://schemas.openxmlformats.org/drawingml/2006/main" noChangeAspect="1"/>
+            </wp:cNvGraphicFramePr>
+            <a:graphic xmlns:a="http://schemas.openxmlformats.org/drawingml/2006/main">
+              <a:graphicData uri="http://schemas.openxmlformats.org/drawingml/2006/picture">
+                <pic:pic xmlns:pic="http://schemas.openxmlformats.org/drawingml/2006/picture">
+                  <pic:nvPicPr>
+                    <pic:cNvPr id="8" name="Imagem 8"/>
+                    <pic:cNvPicPr/>
+                  </pic:nvPicPr>
+                  <pic:blipFill>
+                    <a:blip r:embed="rId22">
+                      <a:extLst>
+                        <a:ext uri="{28A0092B-C50C-407E-A947-70E740481C1C}">
+                          <a14:useLocalDpi xmlns:a14="http://schemas.microsoft.com/office/drawing/2010/main" val="0"/>
+                        </a:ext>
+                      </a:extLst>
+                    </a:blip>
+                    <a:stretch>
+                      <a:fillRect/>
+                    </a:stretch>
+                  </pic:blipFill>
+                  <pic:spPr>
+                    <a:xfrm>
+                      <a:off x="0" y="0"/>
+                      <a:ext cx="5760720" cy="1146810"/>
+                    </a:xfrm>
+                    <a:prstGeom prst="rect">
+                      <a:avLst/>
+                    </a:prstGeom>
+                  </pic:spPr>
+                </pic:pic>
+              </a:graphicData>
+            </a:graphic>
+          </wp:inline>
+        </w:drawing>
+      </w:r>
+    </w:p>
+    <w:p>
+      <w:pPr>
+        <w:rPr>
+          <w:b/>
+          <w:bCs/>
+        </w:rPr>
+      </w:pPr>
+      <w:r>
+        <w:rPr>
+          <w:b/>
+          <w:bCs/>
+        </w:rPr>
+        <w:t xml:space="preserve">6. Tabela Laboratório </w:t>
+      </w:r>
+      <w:r>
+        <w:rPr>
+          <w:b/>
+          <w:bCs/>
+        </w:rPr>
+        <w:t>-</w:t>
+      </w:r>
+      <w:r>
+        <w:rPr>
+          <w:b/>
+          <w:bCs/>
+        </w:rPr>
+        <w:t xml:space="preserve"> Software</w:t>
+      </w:r>
+    </w:p>
+    <w:p>
+      <w:r>
+        <w:rPr>
+          <w:noProof/>
+        </w:rPr>
+        <w:drawing>
+          <wp:inline distT="0" distB="0" distL="0" distR="0" wp14:anchorId="6EF7DC13" wp14:editId="24C2DE6C">
+            <wp:extent cx="5760720" cy="500380"/>
+            <wp:effectExtent l="0" t="0" r="0" b="0"/>
+            <wp:docPr id="9" name="Imagem 9"/>
+            <wp:cNvGraphicFramePr>
+              <a:graphicFrameLocks xmlns:a="http://schemas.openxmlformats.org/drawingml/2006/main" noChangeAspect="1"/>
+            </wp:cNvGraphicFramePr>
+            <a:graphic xmlns:a="http://schemas.openxmlformats.org/drawingml/2006/main">
+              <a:graphicData uri="http://schemas.openxmlformats.org/drawingml/2006/picture">
+                <pic:pic xmlns:pic="http://schemas.openxmlformats.org/drawingml/2006/picture">
+                  <pic:nvPicPr>
+                    <pic:cNvPr id="9" name="Imagem 9"/>
+                    <pic:cNvPicPr/>
+                  </pic:nvPicPr>
+                  <pic:blipFill>
+                    <a:blip r:embed="rId23">
+                      <a:extLst>
+                        <a:ext uri="{28A0092B-C50C-407E-A947-70E740481C1C}">
+                          <a14:useLocalDpi xmlns:a14="http://schemas.microsoft.com/office/drawing/2010/main" val="0"/>
+                        </a:ext>
+                      </a:extLst>
+                    </a:blip>
+                    <a:stretch>
+                      <a:fillRect/>
+                    </a:stretch>
+                  </pic:blipFill>
+                  <pic:spPr>
+                    <a:xfrm>
+                      <a:off x="0" y="0"/>
+                      <a:ext cx="5760720" cy="500380"/>
+                    </a:xfrm>
+                    <a:prstGeom prst="rect">
+                      <a:avLst/>
+                    </a:prstGeom>
+                  </pic:spPr>
+                </pic:pic>
+              </a:graphicData>
+            </a:graphic>
+          </wp:inline>
+        </w:drawing>
+      </w:r>
+    </w:p>
+    <w:p>
+      <w:pPr>
+        <w:rPr>
+          <w:b/>
+          <w:bCs/>
+        </w:rPr>
+      </w:pPr>
+      <w:r>
+        <w:rPr>
+          <w:b/>
+          <w:bCs/>
+        </w:rPr>
+        <w:t xml:space="preserve">7. Tabela Software </w:t>
+      </w:r>
+      <w:r>
+        <w:rPr>
+          <w:b/>
+          <w:bCs/>
+        </w:rPr>
+        <w:t>–</w:t>
+      </w:r>
+      <w:r>
+        <w:rPr>
+          <w:b/>
+          <w:bCs/>
+        </w:rPr>
+        <w:t xml:space="preserve"> Disciplina</w:t>
+      </w:r>
+    </w:p>
+    <w:p>
+      <w:r>
+        <w:rPr>
+          <w:noProof/>
+        </w:rPr>
+        <w:drawing>
+          <wp:inline distT="0" distB="0" distL="0" distR="0" wp14:anchorId="0FA3CA38" wp14:editId="6399FF64">
+            <wp:extent cx="5760720" cy="470535"/>
+            <wp:effectExtent l="0" t="0" r="0" b="5715"/>
+            <wp:docPr id="10" name="Imagem 10"/>
+            <wp:cNvGraphicFramePr>
+              <a:graphicFrameLocks xmlns:a="http://schemas.openxmlformats.org/drawingml/2006/main" noChangeAspect="1"/>
+            </wp:cNvGraphicFramePr>
+            <a:graphic xmlns:a="http://schemas.openxmlformats.org/drawingml/2006/main">
+              <a:graphicData uri="http://schemas.openxmlformats.org/drawingml/2006/picture">
+                <pic:pic xmlns:pic="http://schemas.openxmlformats.org/drawingml/2006/picture">
+                  <pic:nvPicPr>
+                    <pic:cNvPr id="10" name="Imagem 10"/>
+                    <pic:cNvPicPr/>
+                  </pic:nvPicPr>
+                  <pic:blipFill>
+                    <a:blip r:embed="rId24">
+                      <a:extLst>
+                        <a:ext uri="{28A0092B-C50C-407E-A947-70E740481C1C}">
+                          <a14:useLocalDpi xmlns:a14="http://schemas.microsoft.com/office/drawing/2010/main" val="0"/>
+                        </a:ext>
+                      </a:extLst>
+                    </a:blip>
+                    <a:stretch>
+                      <a:fillRect/>
+                    </a:stretch>
+                  </pic:blipFill>
+                  <pic:spPr>
+                    <a:xfrm>
+                      <a:off x="0" y="0"/>
+                      <a:ext cx="5760720" cy="470535"/>
+                    </a:xfrm>
+                    <a:prstGeom prst="rect">
+                      <a:avLst/>
+                    </a:prstGeom>
+                  </pic:spPr>
+                </pic:pic>
+              </a:graphicData>
+            </a:graphic>
+          </wp:inline>
+        </w:drawing>
+      </w:r>
+    </w:p>
+    <w:p/>
     <w:p>
       <w:pPr>
         <w:pStyle w:val="Ttulo3"/>
@@ -4863,7 +5303,7 @@
           <w:iCs/>
         </w:rPr>
       </w:pPr>
-      <w:bookmarkStart w:id="25" w:name="_Toc7182"/>
+      <w:bookmarkStart w:id="24" w:name="_Toc7182"/>
       <w:r>
         <w:rPr>
           <w:i w:val="0"/>
@@ -4879,7 +5319,7 @@
         <w:tab/>
         <w:t>SCRIPTS DE CRIAÇÃO DE BANCO DE DADOS E TABELAS</w:t>
       </w:r>
-      <w:bookmarkEnd w:id="25"/>
+      <w:bookmarkEnd w:id="24"/>
     </w:p>
     <w:p>
       <w:pPr>
@@ -4896,11 +5336,11 @@
           <w:rFonts w:cs="Times New Roman"/>
         </w:rPr>
         <w:sectPr>
-          <w:headerReference w:type="default" r:id="rId18"/>
-          <w:headerReference w:type="first" r:id="rId19"/>
-          <w:footerReference w:type="first" r:id="rId20"/>
+          <w:headerReference w:type="default" r:id="rId25"/>
+          <w:headerReference w:type="first" r:id="rId26"/>
+          <w:footerReference w:type="first" r:id="rId27"/>
           <w:pgSz w:w="11907" w:h="16839"/>
-          <w:pgMar w:top="1701" w:right="1134" w:bottom="1134" w:left="1701" w:header="737" w:footer="720" w:gutter="0"/>
+          <w:pgMar w:top="1701" w:right="1134" w:bottom="1134" w:left="1701" w:header="567" w:footer="720" w:gutter="0"/>
           <w:cols w:space="708"/>
           <w:titlePg/>
           <w:docGrid w:linePitch="326"/>
@@ -4912,21 +5352,21 @@
         <w:pStyle w:val="Ttulo1"/>
         <w:jc w:val="center"/>
       </w:pPr>
-      <w:bookmarkStart w:id="26" w:name="_Toc21242"/>
+      <w:bookmarkStart w:id="25" w:name="_Toc21242"/>
       <w:r>
         <w:lastRenderedPageBreak/>
         <w:t>ANEXOS</w:t>
       </w:r>
-      <w:bookmarkEnd w:id="26"/>
+      <w:bookmarkEnd w:id="25"/>
     </w:p>
     <w:p/>
     <w:p>
-      <w:bookmarkStart w:id="27" w:name="Ata_1"/>
+      <w:bookmarkStart w:id="26" w:name="Ata_1"/>
       <w:r>
         <w:t>Ata 1</w:t>
       </w:r>
     </w:p>
-    <w:bookmarkEnd w:id="27"/>
+    <w:bookmarkEnd w:id="26"/>
     <w:p>
       <w:pPr>
         <w:jc w:val="both"/>
@@ -4956,7 +5396,7 @@
                     <pic:cNvPicPr/>
                   </pic:nvPicPr>
                   <pic:blipFill>
-                    <a:blip r:embed="rId21">
+                    <a:blip r:embed="rId28">
                       <a:extLst>
                         <a:ext uri="{28A0092B-C50C-407E-A947-70E740481C1C}">
                           <a14:useLocalDpi xmlns:a14="http://schemas.microsoft.com/office/drawing/2010/main"/>
@@ -4984,12 +5424,12 @@
       </w:r>
     </w:p>
     <w:p>
-      <w:bookmarkStart w:id="28" w:name="Ata_2"/>
+      <w:bookmarkStart w:id="27" w:name="Ata_2"/>
       <w:r>
         <w:t>Ata 2</w:t>
       </w:r>
     </w:p>
-    <w:bookmarkEnd w:id="28"/>
+    <w:bookmarkEnd w:id="27"/>
     <w:p>
       <w:pPr>
         <w:jc w:val="both"/>
@@ -5019,7 +5459,7 @@
                     <pic:cNvPicPr/>
                   </pic:nvPicPr>
                   <pic:blipFill>
-                    <a:blip r:embed="rId22">
+                    <a:blip r:embed="rId29">
                       <a:extLst>
                         <a:ext uri="{28A0092B-C50C-407E-A947-70E740481C1C}">
                           <a14:useLocalDpi xmlns:a14="http://schemas.microsoft.com/office/drawing/2010/main"/>
@@ -5065,7 +5505,7 @@
       <w:pPr>
         <w:jc w:val="both"/>
       </w:pPr>
-      <w:bookmarkStart w:id="29" w:name="Ata_3"/>
+      <w:bookmarkStart w:id="28" w:name="Ata_3"/>
       <w:r>
         <w:t>Ata</w:t>
       </w:r>
@@ -5073,7 +5513,7 @@
         <w:t xml:space="preserve"> 3</w:t>
       </w:r>
     </w:p>
-    <w:bookmarkEnd w:id="29"/>
+    <w:bookmarkEnd w:id="28"/>
     <w:p>
       <w:pPr>
         <w:jc w:val="both"/>
@@ -5099,7 +5539,7 @@
                     <pic:cNvPicPr/>
                   </pic:nvPicPr>
                   <pic:blipFill>
-                    <a:blip r:embed="rId23">
+                    <a:blip r:embed="rId30">
                       <a:extLst>
                         <a:ext uri="{28A0092B-C50C-407E-A947-70E740481C1C}">
                           <a14:useLocalDpi xmlns:a14="http://schemas.microsoft.com/office/drawing/2010/main"/>
@@ -5130,12 +5570,12 @@
       <w:pPr>
         <w:jc w:val="both"/>
       </w:pPr>
-      <w:bookmarkStart w:id="30" w:name="Ata_4"/>
+      <w:bookmarkStart w:id="29" w:name="Ata_4"/>
       <w:r>
         <w:t>Ata 4</w:t>
       </w:r>
     </w:p>
-    <w:bookmarkEnd w:id="30"/>
+    <w:bookmarkEnd w:id="29"/>
     <w:p>
       <w:pPr>
         <w:jc w:val="both"/>
@@ -5161,7 +5601,7 @@
                     <pic:cNvPicPr/>
                   </pic:nvPicPr>
                   <pic:blipFill>
-                    <a:blip r:embed="rId24">
+                    <a:blip r:embed="rId31">
                       <a:extLst>
                         <a:ext uri="{28A0092B-C50C-407E-A947-70E740481C1C}">
                           <a14:useLocalDpi xmlns:a14="http://schemas.microsoft.com/office/drawing/2010/main"/>
@@ -5192,12 +5632,12 @@
     <w:p/>
     <w:p/>
     <w:p>
-      <w:bookmarkStart w:id="31" w:name="Ata_5"/>
+      <w:bookmarkStart w:id="30" w:name="Ata_5"/>
       <w:r>
         <w:t>Ata 5</w:t>
       </w:r>
     </w:p>
-    <w:bookmarkEnd w:id="31"/>
+    <w:bookmarkEnd w:id="30"/>
     <w:p>
       <w:r>
         <w:rPr>
@@ -5220,7 +5660,7 @@
                     <pic:cNvPicPr/>
                   </pic:nvPicPr>
                   <pic:blipFill>
-                    <a:blip r:embed="rId25" cstate="print">
+                    <a:blip r:embed="rId32" cstate="print">
                       <a:extLst>
                         <a:ext uri="{28A0092B-C50C-407E-A947-70E740481C1C}">
                           <a14:useLocalDpi xmlns:a14="http://schemas.microsoft.com/office/drawing/2010/main" val="0"/>
@@ -5269,7 +5709,7 @@
                     <pic:cNvPicPr/>
                   </pic:nvPicPr>
                   <pic:blipFill>
-                    <a:blip r:embed="rId26">
+                    <a:blip r:embed="rId33">
                       <a:extLst>
                         <a:ext uri="{28A0092B-C50C-407E-A947-70E740481C1C}">
                           <a14:useLocalDpi xmlns:a14="http://schemas.microsoft.com/office/drawing/2010/main" val="0"/>
@@ -5308,7 +5748,7 @@
 </file>
 
 <file path=word/endnotes.xml><?xml version="1.0" encoding="utf-8"?>
-<w:endnotes xmlns:wpc="http://schemas.microsoft.com/office/word/2010/wordprocessingCanvas" xmlns:cx="http://schemas.microsoft.com/office/drawing/2014/chartex" xmlns:mc="http://schemas.openxmlformats.org/markup-compatibility/2006" xmlns:o="urn:schemas-microsoft-com:office:office" xmlns:r="http://schemas.openxmlformats.org/officeDocument/2006/relationships" xmlns:m="http://schemas.openxmlformats.org/officeDocument/2006/math" xmlns:v="urn:schemas-microsoft-com:vml" xmlns:wp14="http://schemas.microsoft.com/office/word/2010/wordprocessingDrawing" xmlns:wp="http://schemas.openxmlformats.org/drawingml/2006/wordprocessingDrawing" xmlns:w10="urn:schemas-microsoft-com:office:word" xmlns:w="http://schemas.openxmlformats.org/wordprocessingml/2006/main" xmlns:w14="http://schemas.microsoft.com/office/word/2010/wordml" xmlns:w15="http://schemas.microsoft.com/office/word/2012/wordml" xmlns:w16se="http://schemas.microsoft.com/office/word/2015/wordml/symex" xmlns:wpg="http://schemas.microsoft.com/office/word/2010/wordprocessingGroup" xmlns:wpi="http://schemas.microsoft.com/office/word/2010/wordprocessingInk" xmlns:wne="http://schemas.microsoft.com/office/word/2006/wordml" xmlns:wps="http://schemas.microsoft.com/office/word/2010/wordprocessingShape" mc:Ignorable="w14 w15 w16se wp14">
+<w:endnotes xmlns:wpc="http://schemas.microsoft.com/office/word/2010/wordprocessingCanvas" xmlns:cx="http://schemas.microsoft.com/office/drawing/2014/chartex" xmlns:cx1="http://schemas.microsoft.com/office/drawing/2015/9/8/chartex" xmlns:cx2="http://schemas.microsoft.com/office/drawing/2015/10/21/chartex" xmlns:cx3="http://schemas.microsoft.com/office/drawing/2016/5/9/chartex" xmlns:cx4="http://schemas.microsoft.com/office/drawing/2016/5/10/chartex" xmlns:cx5="http://schemas.microsoft.com/office/drawing/2016/5/11/chartex" xmlns:cx6="http://schemas.microsoft.com/office/drawing/2016/5/12/chartex" xmlns:cx7="http://schemas.microsoft.com/office/drawing/2016/5/13/chartex" xmlns:cx8="http://schemas.microsoft.com/office/drawing/2016/5/14/chartex" xmlns:mc="http://schemas.openxmlformats.org/markup-compatibility/2006" xmlns:aink="http://schemas.microsoft.com/office/drawing/2016/ink" xmlns:am3d="http://schemas.microsoft.com/office/drawing/2017/model3d" xmlns:o="urn:schemas-microsoft-com:office:office" xmlns:r="http://schemas.openxmlformats.org/officeDocument/2006/relationships" xmlns:m="http://schemas.openxmlformats.org/officeDocument/2006/math" xmlns:v="urn:schemas-microsoft-com:vml" xmlns:wp14="http://schemas.microsoft.com/office/word/2010/wordprocessingDrawing" xmlns:wp="http://schemas.openxmlformats.org/drawingml/2006/wordprocessingDrawing" xmlns:w10="urn:schemas-microsoft-com:office:word" xmlns:w="http://schemas.openxmlformats.org/wordprocessingml/2006/main" xmlns:w14="http://schemas.microsoft.com/office/word/2010/wordml" xmlns:w15="http://schemas.microsoft.com/office/word/2012/wordml" xmlns:w16cex="http://schemas.microsoft.com/office/word/2018/wordml/cex" xmlns:w16cid="http://schemas.microsoft.com/office/word/2016/wordml/cid" xmlns:w16="http://schemas.microsoft.com/office/word/2018/wordml" xmlns:w16sdtdh="http://schemas.microsoft.com/office/word/2020/wordml/sdtdatahash" xmlns:w16se="http://schemas.microsoft.com/office/word/2015/wordml/symex" xmlns:wpg="http://schemas.microsoft.com/office/word/2010/wordprocessingGroup" xmlns:wpi="http://schemas.microsoft.com/office/word/2010/wordprocessingInk" xmlns:wne="http://schemas.microsoft.com/office/word/2006/wordml" xmlns:wps="http://schemas.microsoft.com/office/word/2010/wordprocessingShape" mc:Ignorable="w14 w15 w16se w16cid w16 w16cex w16sdtdh wp14">
   <w:endnote w:type="separator" w:id="-1">
     <w:p>
       <w:pPr>
@@ -5333,7 +5773,7 @@
 </file>
 
 <file path=word/footer1.xml><?xml version="1.0" encoding="utf-8"?>
-<w:ftr xmlns:wpc="http://schemas.microsoft.com/office/word/2010/wordprocessingCanvas" xmlns:cx="http://schemas.microsoft.com/office/drawing/2014/chartex" xmlns:mc="http://schemas.openxmlformats.org/markup-compatibility/2006" xmlns:o="urn:schemas-microsoft-com:office:office" xmlns:r="http://schemas.openxmlformats.org/officeDocument/2006/relationships" xmlns:m="http://schemas.openxmlformats.org/officeDocument/2006/math" xmlns:v="urn:schemas-microsoft-com:vml" xmlns:wp14="http://schemas.microsoft.com/office/word/2010/wordprocessingDrawing" xmlns:wp="http://schemas.openxmlformats.org/drawingml/2006/wordprocessingDrawing" xmlns:w10="urn:schemas-microsoft-com:office:word" xmlns:w="http://schemas.openxmlformats.org/wordprocessingml/2006/main" xmlns:w14="http://schemas.microsoft.com/office/word/2010/wordml" xmlns:w15="http://schemas.microsoft.com/office/word/2012/wordml" xmlns:w16se="http://schemas.microsoft.com/office/word/2015/wordml/symex" xmlns:wpg="http://schemas.microsoft.com/office/word/2010/wordprocessingGroup" xmlns:wpi="http://schemas.microsoft.com/office/word/2010/wordprocessingInk" xmlns:wne="http://schemas.microsoft.com/office/word/2006/wordml" xmlns:wps="http://schemas.microsoft.com/office/word/2010/wordprocessingShape" mc:Ignorable="w14 w15 w16se wp14">
+<w:ftr xmlns:wpc="http://schemas.microsoft.com/office/word/2010/wordprocessingCanvas" xmlns:cx="http://schemas.microsoft.com/office/drawing/2014/chartex" xmlns:cx1="http://schemas.microsoft.com/office/drawing/2015/9/8/chartex" xmlns:cx2="http://schemas.microsoft.com/office/drawing/2015/10/21/chartex" xmlns:cx3="http://schemas.microsoft.com/office/drawing/2016/5/9/chartex" xmlns:cx4="http://schemas.microsoft.com/office/drawing/2016/5/10/chartex" xmlns:cx5="http://schemas.microsoft.com/office/drawing/2016/5/11/chartex" xmlns:cx6="http://schemas.microsoft.com/office/drawing/2016/5/12/chartex" xmlns:cx7="http://schemas.microsoft.com/office/drawing/2016/5/13/chartex" xmlns:cx8="http://schemas.microsoft.com/office/drawing/2016/5/14/chartex" xmlns:mc="http://schemas.openxmlformats.org/markup-compatibility/2006" xmlns:aink="http://schemas.microsoft.com/office/drawing/2016/ink" xmlns:am3d="http://schemas.microsoft.com/office/drawing/2017/model3d" xmlns:o="urn:schemas-microsoft-com:office:office" xmlns:r="http://schemas.openxmlformats.org/officeDocument/2006/relationships" xmlns:m="http://schemas.openxmlformats.org/officeDocument/2006/math" xmlns:v="urn:schemas-microsoft-com:vml" xmlns:wp14="http://schemas.microsoft.com/office/word/2010/wordprocessingDrawing" xmlns:wp="http://schemas.openxmlformats.org/drawingml/2006/wordprocessingDrawing" xmlns:w10="urn:schemas-microsoft-com:office:word" xmlns:w="http://schemas.openxmlformats.org/wordprocessingml/2006/main" xmlns:w14="http://schemas.microsoft.com/office/word/2010/wordml" xmlns:w15="http://schemas.microsoft.com/office/word/2012/wordml" xmlns:w16cex="http://schemas.microsoft.com/office/word/2018/wordml/cex" xmlns:w16cid="http://schemas.microsoft.com/office/word/2016/wordml/cid" xmlns:w16="http://schemas.microsoft.com/office/word/2018/wordml" xmlns:w16sdtdh="http://schemas.microsoft.com/office/word/2020/wordml/sdtdatahash" xmlns:w16se="http://schemas.microsoft.com/office/word/2015/wordml/symex" xmlns:wpg="http://schemas.microsoft.com/office/word/2010/wordprocessingGroup" xmlns:wpi="http://schemas.microsoft.com/office/word/2010/wordprocessingInk" xmlns:wne="http://schemas.microsoft.com/office/word/2006/wordml" xmlns:wps="http://schemas.microsoft.com/office/word/2010/wordprocessingShape" mc:Ignorable="w14 w15 w16se w16cid w16 w16cex w16sdtdh wp14">
   <w:p>
     <w:pPr>
       <w:pStyle w:val="Rodap"/>
@@ -5343,7 +5783,7 @@
 </file>
 
 <file path=word/footnotes.xml><?xml version="1.0" encoding="utf-8"?>
-<w:footnotes xmlns:wpc="http://schemas.microsoft.com/office/word/2010/wordprocessingCanvas" xmlns:cx="http://schemas.microsoft.com/office/drawing/2014/chartex" xmlns:mc="http://schemas.openxmlformats.org/markup-compatibility/2006" xmlns:o="urn:schemas-microsoft-com:office:office" xmlns:r="http://schemas.openxmlformats.org/officeDocument/2006/relationships" xmlns:m="http://schemas.openxmlformats.org/officeDocument/2006/math" xmlns:v="urn:schemas-microsoft-com:vml" xmlns:wp14="http://schemas.microsoft.com/office/word/2010/wordprocessingDrawing" xmlns:wp="http://schemas.openxmlformats.org/drawingml/2006/wordprocessingDrawing" xmlns:w10="urn:schemas-microsoft-com:office:word" xmlns:w="http://schemas.openxmlformats.org/wordprocessingml/2006/main" xmlns:w14="http://schemas.microsoft.com/office/word/2010/wordml" xmlns:w15="http://schemas.microsoft.com/office/word/2012/wordml" xmlns:w16se="http://schemas.microsoft.com/office/word/2015/wordml/symex" xmlns:wpg="http://schemas.microsoft.com/office/word/2010/wordprocessingGroup" xmlns:wpi="http://schemas.microsoft.com/office/word/2010/wordprocessingInk" xmlns:wne="http://schemas.microsoft.com/office/word/2006/wordml" xmlns:wps="http://schemas.microsoft.com/office/word/2010/wordprocessingShape" mc:Ignorable="w14 w15 w16se wp14">
+<w:footnotes xmlns:wpc="http://schemas.microsoft.com/office/word/2010/wordprocessingCanvas" xmlns:cx="http://schemas.microsoft.com/office/drawing/2014/chartex" xmlns:cx1="http://schemas.microsoft.com/office/drawing/2015/9/8/chartex" xmlns:cx2="http://schemas.microsoft.com/office/drawing/2015/10/21/chartex" xmlns:cx3="http://schemas.microsoft.com/office/drawing/2016/5/9/chartex" xmlns:cx4="http://schemas.microsoft.com/office/drawing/2016/5/10/chartex" xmlns:cx5="http://schemas.microsoft.com/office/drawing/2016/5/11/chartex" xmlns:cx6="http://schemas.microsoft.com/office/drawing/2016/5/12/chartex" xmlns:cx7="http://schemas.microsoft.com/office/drawing/2016/5/13/chartex" xmlns:cx8="http://schemas.microsoft.com/office/drawing/2016/5/14/chartex" xmlns:mc="http://schemas.openxmlformats.org/markup-compatibility/2006" xmlns:aink="http://schemas.microsoft.com/office/drawing/2016/ink" xmlns:am3d="http://schemas.microsoft.com/office/drawing/2017/model3d" xmlns:o="urn:schemas-microsoft-com:office:office" xmlns:r="http://schemas.openxmlformats.org/officeDocument/2006/relationships" xmlns:m="http://schemas.openxmlformats.org/officeDocument/2006/math" xmlns:v="urn:schemas-microsoft-com:vml" xmlns:wp14="http://schemas.microsoft.com/office/word/2010/wordprocessingDrawing" xmlns:wp="http://schemas.openxmlformats.org/drawingml/2006/wordprocessingDrawing" xmlns:w10="urn:schemas-microsoft-com:office:word" xmlns:w="http://schemas.openxmlformats.org/wordprocessingml/2006/main" xmlns:w14="http://schemas.microsoft.com/office/word/2010/wordml" xmlns:w15="http://schemas.microsoft.com/office/word/2012/wordml" xmlns:w16cex="http://schemas.microsoft.com/office/word/2018/wordml/cex" xmlns:w16cid="http://schemas.microsoft.com/office/word/2016/wordml/cid" xmlns:w16="http://schemas.microsoft.com/office/word/2018/wordml" xmlns:w16sdtdh="http://schemas.microsoft.com/office/word/2020/wordml/sdtdatahash" xmlns:w16se="http://schemas.microsoft.com/office/word/2015/wordml/symex" xmlns:wpg="http://schemas.microsoft.com/office/word/2010/wordprocessingGroup" xmlns:wpi="http://schemas.microsoft.com/office/word/2010/wordprocessingInk" xmlns:wne="http://schemas.microsoft.com/office/word/2006/wordml" xmlns:wps="http://schemas.microsoft.com/office/word/2010/wordprocessingShape" mc:Ignorable="w14 w15 w16se w16cid w16 w16cex w16sdtdh wp14">
   <w:footnote w:type="separator" w:id="-1">
     <w:p>
       <w:r>
@@ -5362,7 +5802,7 @@
 </file>
 
 <file path=word/header1.xml><?xml version="1.0" encoding="utf-8"?>
-<w:hdr xmlns:wpc="http://schemas.microsoft.com/office/word/2010/wordprocessingCanvas" xmlns:cx="http://schemas.microsoft.com/office/drawing/2014/chartex" xmlns:mc="http://schemas.openxmlformats.org/markup-compatibility/2006" xmlns:o="urn:schemas-microsoft-com:office:office" xmlns:r="http://schemas.openxmlformats.org/officeDocument/2006/relationships" xmlns:m="http://schemas.openxmlformats.org/officeDocument/2006/math" xmlns:v="urn:schemas-microsoft-com:vml" xmlns:wp14="http://schemas.microsoft.com/office/word/2010/wordprocessingDrawing" xmlns:wp="http://schemas.openxmlformats.org/drawingml/2006/wordprocessingDrawing" xmlns:w10="urn:schemas-microsoft-com:office:word" xmlns:w="http://schemas.openxmlformats.org/wordprocessingml/2006/main" xmlns:w14="http://schemas.microsoft.com/office/word/2010/wordml" xmlns:w15="http://schemas.microsoft.com/office/word/2012/wordml" xmlns:w16se="http://schemas.microsoft.com/office/word/2015/wordml/symex" xmlns:wpg="http://schemas.microsoft.com/office/word/2010/wordprocessingGroup" xmlns:wpi="http://schemas.microsoft.com/office/word/2010/wordprocessingInk" xmlns:wne="http://schemas.microsoft.com/office/word/2006/wordml" xmlns:wps="http://schemas.microsoft.com/office/word/2010/wordprocessingShape" mc:Ignorable="w14 w15 w16se wp14">
+<w:hdr xmlns:wpc="http://schemas.microsoft.com/office/word/2010/wordprocessingCanvas" xmlns:cx="http://schemas.microsoft.com/office/drawing/2014/chartex" xmlns:cx1="http://schemas.microsoft.com/office/drawing/2015/9/8/chartex" xmlns:cx2="http://schemas.microsoft.com/office/drawing/2015/10/21/chartex" xmlns:cx3="http://schemas.microsoft.com/office/drawing/2016/5/9/chartex" xmlns:cx4="http://schemas.microsoft.com/office/drawing/2016/5/10/chartex" xmlns:cx5="http://schemas.microsoft.com/office/drawing/2016/5/11/chartex" xmlns:cx6="http://schemas.microsoft.com/office/drawing/2016/5/12/chartex" xmlns:cx7="http://schemas.microsoft.com/office/drawing/2016/5/13/chartex" xmlns:cx8="http://schemas.microsoft.com/office/drawing/2016/5/14/chartex" xmlns:mc="http://schemas.openxmlformats.org/markup-compatibility/2006" xmlns:aink="http://schemas.microsoft.com/office/drawing/2016/ink" xmlns:am3d="http://schemas.microsoft.com/office/drawing/2017/model3d" xmlns:o="urn:schemas-microsoft-com:office:office" xmlns:r="http://schemas.openxmlformats.org/officeDocument/2006/relationships" xmlns:m="http://schemas.openxmlformats.org/officeDocument/2006/math" xmlns:v="urn:schemas-microsoft-com:vml" xmlns:wp14="http://schemas.microsoft.com/office/word/2010/wordprocessingDrawing" xmlns:wp="http://schemas.openxmlformats.org/drawingml/2006/wordprocessingDrawing" xmlns:w10="urn:schemas-microsoft-com:office:word" xmlns:w="http://schemas.openxmlformats.org/wordprocessingml/2006/main" xmlns:w14="http://schemas.microsoft.com/office/word/2010/wordml" xmlns:w15="http://schemas.microsoft.com/office/word/2012/wordml" xmlns:w16cex="http://schemas.microsoft.com/office/word/2018/wordml/cex" xmlns:w16cid="http://schemas.microsoft.com/office/word/2016/wordml/cid" xmlns:w16="http://schemas.microsoft.com/office/word/2018/wordml" xmlns:w16sdtdh="http://schemas.microsoft.com/office/word/2020/wordml/sdtdatahash" xmlns:w16se="http://schemas.microsoft.com/office/word/2015/wordml/symex" xmlns:wpg="http://schemas.microsoft.com/office/word/2010/wordprocessingGroup" xmlns:wpi="http://schemas.microsoft.com/office/word/2010/wordprocessingInk" xmlns:wne="http://schemas.microsoft.com/office/word/2006/wordml" xmlns:wps="http://schemas.microsoft.com/office/word/2010/wordprocessingShape" mc:Ignorable="w14 w15 w16se w16cid w16 w16cex w16sdtdh wp14">
   <w:p>
     <w:pPr>
       <w:pStyle w:val="Cabealho"/>
@@ -5378,7 +5818,7 @@
 </file>
 
 <file path=word/header2.xml><?xml version="1.0" encoding="utf-8"?>
-<w:hdr xmlns:wpc="http://schemas.microsoft.com/office/word/2010/wordprocessingCanvas" xmlns:cx="http://schemas.microsoft.com/office/drawing/2014/chartex" xmlns:mc="http://schemas.openxmlformats.org/markup-compatibility/2006" xmlns:o="urn:schemas-microsoft-com:office:office" xmlns:r="http://schemas.openxmlformats.org/officeDocument/2006/relationships" xmlns:m="http://schemas.openxmlformats.org/officeDocument/2006/math" xmlns:v="urn:schemas-microsoft-com:vml" xmlns:wp14="http://schemas.microsoft.com/office/word/2010/wordprocessingDrawing" xmlns:wp="http://schemas.openxmlformats.org/drawingml/2006/wordprocessingDrawing" xmlns:w10="urn:schemas-microsoft-com:office:word" xmlns:w="http://schemas.openxmlformats.org/wordprocessingml/2006/main" xmlns:w14="http://schemas.microsoft.com/office/word/2010/wordml" xmlns:w15="http://schemas.microsoft.com/office/word/2012/wordml" xmlns:w16se="http://schemas.microsoft.com/office/word/2015/wordml/symex" xmlns:wpg="http://schemas.microsoft.com/office/word/2010/wordprocessingGroup" xmlns:wpi="http://schemas.microsoft.com/office/word/2010/wordprocessingInk" xmlns:wne="http://schemas.microsoft.com/office/word/2006/wordml" xmlns:wps="http://schemas.microsoft.com/office/word/2010/wordprocessingShape" mc:Ignorable="w14 w15 w16se wp14">
+<w:hdr xmlns:wpc="http://schemas.microsoft.com/office/word/2010/wordprocessingCanvas" xmlns:cx="http://schemas.microsoft.com/office/drawing/2014/chartex" xmlns:cx1="http://schemas.microsoft.com/office/drawing/2015/9/8/chartex" xmlns:cx2="http://schemas.microsoft.com/office/drawing/2015/10/21/chartex" xmlns:cx3="http://schemas.microsoft.com/office/drawing/2016/5/9/chartex" xmlns:cx4="http://schemas.microsoft.com/office/drawing/2016/5/10/chartex" xmlns:cx5="http://schemas.microsoft.com/office/drawing/2016/5/11/chartex" xmlns:cx6="http://schemas.microsoft.com/office/drawing/2016/5/12/chartex" xmlns:cx7="http://schemas.microsoft.com/office/drawing/2016/5/13/chartex" xmlns:cx8="http://schemas.microsoft.com/office/drawing/2016/5/14/chartex" xmlns:mc="http://schemas.openxmlformats.org/markup-compatibility/2006" xmlns:aink="http://schemas.microsoft.com/office/drawing/2016/ink" xmlns:am3d="http://schemas.microsoft.com/office/drawing/2017/model3d" xmlns:o="urn:schemas-microsoft-com:office:office" xmlns:r="http://schemas.openxmlformats.org/officeDocument/2006/relationships" xmlns:m="http://schemas.openxmlformats.org/officeDocument/2006/math" xmlns:v="urn:schemas-microsoft-com:vml" xmlns:wp14="http://schemas.microsoft.com/office/word/2010/wordprocessingDrawing" xmlns:wp="http://schemas.openxmlformats.org/drawingml/2006/wordprocessingDrawing" xmlns:w10="urn:schemas-microsoft-com:office:word" xmlns:w="http://schemas.openxmlformats.org/wordprocessingml/2006/main" xmlns:w14="http://schemas.microsoft.com/office/word/2010/wordml" xmlns:w15="http://schemas.microsoft.com/office/word/2012/wordml" xmlns:w16cex="http://schemas.microsoft.com/office/word/2018/wordml/cex" xmlns:w16cid="http://schemas.microsoft.com/office/word/2016/wordml/cid" xmlns:w16="http://schemas.microsoft.com/office/word/2018/wordml" xmlns:w16sdtdh="http://schemas.microsoft.com/office/word/2020/wordml/sdtdatahash" xmlns:w16se="http://schemas.microsoft.com/office/word/2015/wordml/symex" xmlns:wpg="http://schemas.microsoft.com/office/word/2010/wordprocessingGroup" xmlns:wpi="http://schemas.microsoft.com/office/word/2010/wordprocessingInk" xmlns:wne="http://schemas.microsoft.com/office/word/2006/wordml" xmlns:wps="http://schemas.microsoft.com/office/word/2010/wordprocessingShape" mc:Ignorable="w14 w15 w16se w16cid w16 w16cex w16sdtdh wp14">
   <w:sdt>
     <w:sdtPr>
       <w:id w:val="-1699001773"/>
@@ -5447,7 +5887,7 @@
 </file>
 
 <file path=word/header3.xml><?xml version="1.0" encoding="utf-8"?>
-<w:hdr xmlns:wpc="http://schemas.microsoft.com/office/word/2010/wordprocessingCanvas" xmlns:cx="http://schemas.microsoft.com/office/drawing/2014/chartex" xmlns:mc="http://schemas.openxmlformats.org/markup-compatibility/2006" xmlns:o="urn:schemas-microsoft-com:office:office" xmlns:r="http://schemas.openxmlformats.org/officeDocument/2006/relationships" xmlns:m="http://schemas.openxmlformats.org/officeDocument/2006/math" xmlns:v="urn:schemas-microsoft-com:vml" xmlns:wp14="http://schemas.microsoft.com/office/word/2010/wordprocessingDrawing" xmlns:wp="http://schemas.openxmlformats.org/drawingml/2006/wordprocessingDrawing" xmlns:w10="urn:schemas-microsoft-com:office:word" xmlns:w="http://schemas.openxmlformats.org/wordprocessingml/2006/main" xmlns:w14="http://schemas.microsoft.com/office/word/2010/wordml" xmlns:w15="http://schemas.microsoft.com/office/word/2012/wordml" xmlns:w16se="http://schemas.microsoft.com/office/word/2015/wordml/symex" xmlns:wpg="http://schemas.microsoft.com/office/word/2010/wordprocessingGroup" xmlns:wpi="http://schemas.microsoft.com/office/word/2010/wordprocessingInk" xmlns:wne="http://schemas.microsoft.com/office/word/2006/wordml" xmlns:wps="http://schemas.microsoft.com/office/word/2010/wordprocessingShape" mc:Ignorable="w14 w15 w16se wp14">
+<w:hdr xmlns:wpc="http://schemas.microsoft.com/office/word/2010/wordprocessingCanvas" xmlns:cx="http://schemas.microsoft.com/office/drawing/2014/chartex" xmlns:cx1="http://schemas.microsoft.com/office/drawing/2015/9/8/chartex" xmlns:cx2="http://schemas.microsoft.com/office/drawing/2015/10/21/chartex" xmlns:cx3="http://schemas.microsoft.com/office/drawing/2016/5/9/chartex" xmlns:cx4="http://schemas.microsoft.com/office/drawing/2016/5/10/chartex" xmlns:cx5="http://schemas.microsoft.com/office/drawing/2016/5/11/chartex" xmlns:cx6="http://schemas.microsoft.com/office/drawing/2016/5/12/chartex" xmlns:cx7="http://schemas.microsoft.com/office/drawing/2016/5/13/chartex" xmlns:cx8="http://schemas.microsoft.com/office/drawing/2016/5/14/chartex" xmlns:mc="http://schemas.openxmlformats.org/markup-compatibility/2006" xmlns:aink="http://schemas.microsoft.com/office/drawing/2016/ink" xmlns:am3d="http://schemas.microsoft.com/office/drawing/2017/model3d" xmlns:o="urn:schemas-microsoft-com:office:office" xmlns:r="http://schemas.openxmlformats.org/officeDocument/2006/relationships" xmlns:m="http://schemas.openxmlformats.org/officeDocument/2006/math" xmlns:v="urn:schemas-microsoft-com:vml" xmlns:wp14="http://schemas.microsoft.com/office/word/2010/wordprocessingDrawing" xmlns:wp="http://schemas.openxmlformats.org/drawingml/2006/wordprocessingDrawing" xmlns:w10="urn:schemas-microsoft-com:office:word" xmlns:w="http://schemas.openxmlformats.org/wordprocessingml/2006/main" xmlns:w14="http://schemas.microsoft.com/office/word/2010/wordml" xmlns:w15="http://schemas.microsoft.com/office/word/2012/wordml" xmlns:w16cex="http://schemas.microsoft.com/office/word/2018/wordml/cex" xmlns:w16cid="http://schemas.microsoft.com/office/word/2016/wordml/cid" xmlns:w16="http://schemas.microsoft.com/office/word/2018/wordml" xmlns:w16sdtdh="http://schemas.microsoft.com/office/word/2020/wordml/sdtdatahash" xmlns:w16se="http://schemas.microsoft.com/office/word/2015/wordml/symex" xmlns:wpg="http://schemas.microsoft.com/office/word/2010/wordprocessingGroup" xmlns:wpi="http://schemas.microsoft.com/office/word/2010/wordprocessingInk" xmlns:wne="http://schemas.microsoft.com/office/word/2006/wordml" xmlns:wps="http://schemas.microsoft.com/office/word/2010/wordprocessingShape" mc:Ignorable="w14 w15 w16se w16cid w16 w16cex w16sdtdh wp14">
   <w:sdt>
     <w:sdtPr>
       <w:id w:val="958228592"/>
@@ -5528,7 +5968,7 @@
 </file>
 
 <file path=word/numbering.xml><?xml version="1.0" encoding="utf-8"?>
-<w:numbering xmlns:wpc="http://schemas.microsoft.com/office/word/2010/wordprocessingCanvas" xmlns:cx="http://schemas.microsoft.com/office/drawing/2014/chartex" xmlns:mc="http://schemas.openxmlformats.org/markup-compatibility/2006" xmlns:o="urn:schemas-microsoft-com:office:office" xmlns:r="http://schemas.openxmlformats.org/officeDocument/2006/relationships" xmlns:m="http://schemas.openxmlformats.org/officeDocument/2006/math" xmlns:v="urn:schemas-microsoft-com:vml" xmlns:wp14="http://schemas.microsoft.com/office/word/2010/wordprocessingDrawing" xmlns:wp="http://schemas.openxmlformats.org/drawingml/2006/wordprocessingDrawing" xmlns:w10="urn:schemas-microsoft-com:office:word" xmlns:w="http://schemas.openxmlformats.org/wordprocessingml/2006/main" xmlns:w14="http://schemas.microsoft.com/office/word/2010/wordml" xmlns:w15="http://schemas.microsoft.com/office/word/2012/wordml" xmlns:w16se="http://schemas.microsoft.com/office/word/2015/wordml/symex" xmlns:wpg="http://schemas.microsoft.com/office/word/2010/wordprocessingGroup" xmlns:wpi="http://schemas.microsoft.com/office/word/2010/wordprocessingInk" xmlns:wne="http://schemas.microsoft.com/office/word/2006/wordml" xmlns:wps="http://schemas.microsoft.com/office/word/2010/wordprocessingShape" mc:Ignorable="w14 w15 w16se wp14">
+<w:numbering xmlns:wpc="http://schemas.microsoft.com/office/word/2010/wordprocessingCanvas" xmlns:cx="http://schemas.microsoft.com/office/drawing/2014/chartex" xmlns:cx1="http://schemas.microsoft.com/office/drawing/2015/9/8/chartex" xmlns:cx2="http://schemas.microsoft.com/office/drawing/2015/10/21/chartex" xmlns:cx3="http://schemas.microsoft.com/office/drawing/2016/5/9/chartex" xmlns:cx4="http://schemas.microsoft.com/office/drawing/2016/5/10/chartex" xmlns:cx5="http://schemas.microsoft.com/office/drawing/2016/5/11/chartex" xmlns:cx6="http://schemas.microsoft.com/office/drawing/2016/5/12/chartex" xmlns:cx7="http://schemas.microsoft.com/office/drawing/2016/5/13/chartex" xmlns:cx8="http://schemas.microsoft.com/office/drawing/2016/5/14/chartex" xmlns:mc="http://schemas.openxmlformats.org/markup-compatibility/2006" xmlns:aink="http://schemas.microsoft.com/office/drawing/2016/ink" xmlns:am3d="http://schemas.microsoft.com/office/drawing/2017/model3d" xmlns:o="urn:schemas-microsoft-com:office:office" xmlns:r="http://schemas.openxmlformats.org/officeDocument/2006/relationships" xmlns:m="http://schemas.openxmlformats.org/officeDocument/2006/math" xmlns:v="urn:schemas-microsoft-com:vml" xmlns:wp14="http://schemas.microsoft.com/office/word/2010/wordprocessingDrawing" xmlns:wp="http://schemas.openxmlformats.org/drawingml/2006/wordprocessingDrawing" xmlns:w10="urn:schemas-microsoft-com:office:word" xmlns:w="http://schemas.openxmlformats.org/wordprocessingml/2006/main" xmlns:w14="http://schemas.microsoft.com/office/word/2010/wordml" xmlns:w15="http://schemas.microsoft.com/office/word/2012/wordml" xmlns:w16cex="http://schemas.microsoft.com/office/word/2018/wordml/cex" xmlns:w16cid="http://schemas.microsoft.com/office/word/2016/wordml/cid" xmlns:w16="http://schemas.microsoft.com/office/word/2018/wordml" xmlns:w16sdtdh="http://schemas.microsoft.com/office/word/2020/wordml/sdtdatahash" xmlns:w16se="http://schemas.microsoft.com/office/word/2015/wordml/symex" xmlns:wpg="http://schemas.microsoft.com/office/word/2010/wordprocessingGroup" xmlns:wpi="http://schemas.microsoft.com/office/word/2010/wordprocessingInk" xmlns:wne="http://schemas.microsoft.com/office/word/2006/wordml" xmlns:wps="http://schemas.microsoft.com/office/word/2010/wordprocessingShape" mc:Ignorable="w14 w15 w16se w16cid w16 w16cex w16sdtdh wp14">
   <w:abstractNum w:abstractNumId="0" w15:restartNumberingAfterBreak="0">
     <w:nsid w:val="00AB5A76"/>
     <w:multiLevelType w:val="hybridMultilevel"/>
@@ -8061,7 +8501,7 @@
 </file>
 
 <file path=word/styles.xml><?xml version="1.0" encoding="utf-8"?>
-<w:styles xmlns:mc="http://schemas.openxmlformats.org/markup-compatibility/2006" xmlns:r="http://schemas.openxmlformats.org/officeDocument/2006/relationships" xmlns:w="http://schemas.openxmlformats.org/wordprocessingml/2006/main" xmlns:w14="http://schemas.microsoft.com/office/word/2010/wordml" xmlns:w15="http://schemas.microsoft.com/office/word/2012/wordml" xmlns:w16se="http://schemas.microsoft.com/office/word/2015/wordml/symex" mc:Ignorable="w14 w15 w16se">
+<w:styles xmlns:mc="http://schemas.openxmlformats.org/markup-compatibility/2006" xmlns:r="http://schemas.openxmlformats.org/officeDocument/2006/relationships" xmlns:w="http://schemas.openxmlformats.org/wordprocessingml/2006/main" xmlns:w14="http://schemas.microsoft.com/office/word/2010/wordml" xmlns:w15="http://schemas.microsoft.com/office/word/2012/wordml" xmlns:w16cex="http://schemas.microsoft.com/office/word/2018/wordml/cex" xmlns:w16cid="http://schemas.microsoft.com/office/word/2016/wordml/cid" xmlns:w16="http://schemas.microsoft.com/office/word/2018/wordml" xmlns:w16sdtdh="http://schemas.microsoft.com/office/word/2020/wordml/sdtdatahash" xmlns:w16se="http://schemas.microsoft.com/office/word/2015/wordml/symex" mc:Ignorable="w14 w15 w16se w16cid w16 w16cex w16sdtdh">
   <w:docDefaults>
     <w:rPrDefault>
       <w:rPr>
@@ -8071,7 +8511,7 @@
     </w:rPrDefault>
     <w:pPrDefault/>
   </w:docDefaults>
-  <w:latentStyles w:defLockedState="0" w:defUIPriority="99" w:defSemiHidden="0" w:defUnhideWhenUsed="0" w:defQFormat="0" w:count="371">
+  <w:latentStyles w:defLockedState="0" w:defUIPriority="99" w:defSemiHidden="0" w:defUnhideWhenUsed="0" w:defQFormat="0" w:count="376">
     <w:lsdException w:name="Normal" w:uiPriority="0" w:qFormat="1"/>
     <w:lsdException w:name="heading 1" w:uiPriority="9" w:qFormat="1"/>
     <w:lsdException w:name="heading 2" w:uiPriority="9" w:unhideWhenUsed="1" w:qFormat="1"/>
@@ -8177,7 +8617,7 @@
     <w:lsdException w:name="HTML Sample" w:semiHidden="1" w:unhideWhenUsed="1"/>
     <w:lsdException w:name="HTML Typewriter" w:semiHidden="1" w:unhideWhenUsed="1"/>
     <w:lsdException w:name="HTML Variable" w:semiHidden="1" w:unhideWhenUsed="1"/>
-    <w:lsdException w:name="Normal Table" w:semiHidden="1" w:unhideWhenUsed="1" w:qFormat="1"/>
+    <w:lsdException w:name="Normal Table" w:qFormat="1"/>
     <w:lsdException w:name="annotation subject" w:semiHidden="1" w:unhideWhenUsed="1" w:qFormat="1"/>
     <w:lsdException w:name="No List" w:semiHidden="1" w:unhideWhenUsed="1"/>
     <w:lsdException w:name="Outline List 1" w:semiHidden="1" w:unhideWhenUsed="1"/>
@@ -8220,11 +8660,8 @@
     <w:lsdException w:name="Table Contemporary" w:semiHidden="1" w:unhideWhenUsed="1"/>
     <w:lsdException w:name="Table Elegant" w:semiHidden="1" w:unhideWhenUsed="1"/>
     <w:lsdException w:name="Table Professional" w:semiHidden="1" w:unhideWhenUsed="1"/>
-    <w:lsdException w:name="Table Subtle 1" w:semiHidden="1" w:unhideWhenUsed="1"/>
     <w:lsdException w:name="Table Subtle 2" w:semiHidden="1" w:unhideWhenUsed="1"/>
     <w:lsdException w:name="Table Web 1" w:semiHidden="1" w:unhideWhenUsed="1"/>
-    <w:lsdException w:name="Table Web 2" w:semiHidden="1" w:unhideWhenUsed="1"/>
-    <w:lsdException w:name="Table Web 3" w:semiHidden="1" w:unhideWhenUsed="1"/>
     <w:lsdException w:name="Balloon Text" w:semiHidden="1" w:unhideWhenUsed="1" w:qFormat="1"/>
     <w:lsdException w:name="Table Grid" w:uiPriority="59"/>
     <w:lsdException w:name="Table Theme" w:semiHidden="1" w:unhideWhenUsed="1"/>
@@ -8245,10 +8682,6 @@
     <w:lsdException w:name="Colorful List"/>
     <w:lsdException w:name="Colorful Grid"/>
     <w:lsdException w:name="Light Shading Accent 1"/>
-    <w:lsdException w:name="Light List Accent 1"/>
-    <w:lsdException w:name="Light Grid Accent 1"/>
-    <w:lsdException w:name="Medium Shading 1 Accent 1"/>
-    <w:lsdException w:name="Medium Shading 2 Accent 1"/>
     <w:lsdException w:name="Medium List 1 Accent 1"/>
     <w:lsdException w:name="Revision" w:semiHidden="1" w:unhideWhenUsed="1"/>
     <w:lsdException w:name="List Paragraph" w:uiPriority="34" w:qFormat="1"/>
@@ -8327,11 +8760,6 @@
     <w:lsdException w:name="Medium List 2 Accent 6"/>
     <w:lsdException w:name="Medium Grid 1 Accent 6"/>
     <w:lsdException w:name="Medium Grid 2 Accent 6"/>
-    <w:lsdException w:name="Medium Grid 3 Accent 6"/>
-    <w:lsdException w:name="Dark List Accent 6"/>
-    <w:lsdException w:name="Colorful Shading Accent 6"/>
-    <w:lsdException w:name="Colorful List Accent 6"/>
-    <w:lsdException w:name="Colorful Grid Accent 6"/>
     <w:lsdException w:name="Subtle Emphasis" w:uiPriority="19" w:qFormat="1"/>
     <w:lsdException w:name="Intense Emphasis" w:uiPriority="21" w:qFormat="1"/>
     <w:lsdException w:name="Subtle Reference" w:uiPriority="31" w:qFormat="1"/>
@@ -8443,6 +8871,11 @@
     <w:lsdException w:name="List Table 5 Dark Accent 6" w:uiPriority="50"/>
     <w:lsdException w:name="List Table 6 Colorful Accent 6" w:uiPriority="51"/>
     <w:lsdException w:name="List Table 7 Colorful Accent 6" w:uiPriority="52"/>
+    <w:lsdException w:name="Mention" w:semiHidden="1" w:unhideWhenUsed="1"/>
+    <w:lsdException w:name="Smart Hyperlink" w:semiHidden="1" w:unhideWhenUsed="1"/>
+    <w:lsdException w:name="Hashtag" w:semiHidden="1" w:unhideWhenUsed="1"/>
+    <w:lsdException w:name="Unresolved Mention" w:semiHidden="1" w:unhideWhenUsed="1"/>
+    <w:lsdException w:name="Smart Link" w:semiHidden="1" w:unhideWhenUsed="1"/>
   </w:latentStyles>
   <w:style w:type="paragraph" w:default="1" w:styleId="Normal">
     <w:name w:val="Normal"/>

</xml_diff>

<commit_message>
Atualizando os arquivos e a documentação dos projetos - 17/04/2026
</commit_message>
<xml_diff>
--- a/Terceiro_Semestre/Projeto_Integrador/Documentação/Modelo_Projeto_Integrador_principal.docx
+++ b/Terceiro_Semestre/Projeto_Integrador/Documentação/Modelo_Projeto_Integrador_principal.docx
@@ -3720,8 +3720,8 @@
           <w:lang w:eastAsia="pt-BR"/>
         </w:rPr>
         <w:drawing>
-          <wp:inline distT="0" distB="0" distL="0" distR="0" wp14:anchorId="675E87CB" wp14:editId="52B09C67">
-            <wp:extent cx="5093984" cy="3323399"/>
+          <wp:inline distT="0" distB="0" distL="0" distR="0" wp14:anchorId="675E87CB" wp14:editId="136409C4">
+            <wp:extent cx="4996527" cy="3323399"/>
             <wp:effectExtent l="0" t="0" r="0" b="0"/>
             <wp:docPr id="568772802" name="drawing"/>
             <wp:cNvGraphicFramePr>
@@ -3749,7 +3749,7 @@
                   <pic:spPr>
                     <a:xfrm>
                       <a:off x="0" y="0"/>
-                      <a:ext cx="5093984" cy="3323399"/>
+                      <a:ext cx="4996527" cy="3323399"/>
                     </a:xfrm>
                     <a:prstGeom prst="rect">
                       <a:avLst/>
@@ -4738,9 +4738,9 @@
           <w:lang w:eastAsia="pt-BR"/>
         </w:rPr>
         <w:drawing>
-          <wp:inline distT="0" distB="0" distL="0" distR="0" wp14:anchorId="220AB256" wp14:editId="516DC60A">
-            <wp:extent cx="4336699" cy="5487129"/>
-            <wp:effectExtent l="0" t="0" r="6985" b="0"/>
+          <wp:inline distT="0" distB="0" distL="0" distR="0" wp14:anchorId="220AB256" wp14:editId="2F366C53">
+            <wp:extent cx="4225636" cy="5522672"/>
+            <wp:effectExtent l="0" t="0" r="3810" b="1905"/>
             <wp:docPr id="3" name="Imagem 3"/>
             <wp:cNvGraphicFramePr>
               <a:graphicFrameLocks xmlns:a="http://schemas.openxmlformats.org/drawingml/2006/main" noChangeAspect="1"/>
@@ -4767,7 +4767,7 @@
                   <pic:spPr>
                     <a:xfrm>
                       <a:off x="0" y="0"/>
-                      <a:ext cx="4336699" cy="5487129"/>
+                      <a:ext cx="4226750" cy="5524128"/>
                     </a:xfrm>
                     <a:prstGeom prst="rect">
                       <a:avLst/>
@@ -4833,8 +4833,8 @@
           <w:noProof/>
         </w:rPr>
         <w:drawing>
-          <wp:inline distT="0" distB="0" distL="0" distR="0" wp14:anchorId="2EA7A7F6" wp14:editId="213091E0">
-            <wp:extent cx="5760720" cy="1036955"/>
+          <wp:inline distT="0" distB="0" distL="0" distR="0" wp14:anchorId="2EA7A7F6" wp14:editId="46BA0DFA">
+            <wp:extent cx="5705459" cy="1036955"/>
             <wp:effectExtent l="0" t="0" r="0" b="0"/>
             <wp:docPr id="2" name="Imagem 2"/>
             <wp:cNvGraphicFramePr>
@@ -4862,7 +4862,7 @@
                   <pic:spPr>
                     <a:xfrm>
                       <a:off x="0" y="0"/>
-                      <a:ext cx="5760720" cy="1036955"/>
+                      <a:ext cx="5705459" cy="1036955"/>
                     </a:xfrm>
                     <a:prstGeom prst="rect">
                       <a:avLst/>
@@ -4908,8 +4908,8 @@
           <w:noProof/>
         </w:rPr>
         <w:drawing>
-          <wp:inline distT="0" distB="0" distL="0" distR="0" wp14:anchorId="32AD5C31" wp14:editId="7246D2DE">
-            <wp:extent cx="5760720" cy="897890"/>
+          <wp:inline distT="0" distB="0" distL="0" distR="0" wp14:anchorId="32AD5C31" wp14:editId="1EF6CC0A">
+            <wp:extent cx="5772150" cy="1009679"/>
             <wp:effectExtent l="0" t="0" r="0" b="0"/>
             <wp:docPr id="5" name="Imagem 5"/>
             <wp:cNvGraphicFramePr>
@@ -4937,7 +4937,7 @@
                   <pic:spPr>
                     <a:xfrm>
                       <a:off x="0" y="0"/>
-                      <a:ext cx="5760720" cy="897890"/>
+                      <a:ext cx="5796962" cy="1014019"/>
                     </a:xfrm>
                     <a:prstGeom prst="rect">
                       <a:avLst/>
@@ -5034,8 +5034,8 @@
           <w:noProof/>
         </w:rPr>
         <w:drawing>
-          <wp:inline distT="0" distB="0" distL="0" distR="0" wp14:anchorId="61B11120" wp14:editId="2C9CE03E">
-            <wp:extent cx="5760720" cy="819150"/>
+          <wp:inline distT="0" distB="0" distL="0" distR="0" wp14:anchorId="61B11120" wp14:editId="585983E6">
+            <wp:extent cx="5760720" cy="748492"/>
             <wp:effectExtent l="0" t="0" r="0" b="0"/>
             <wp:docPr id="7" name="Imagem 7"/>
             <wp:cNvGraphicFramePr>
@@ -5063,7 +5063,7 @@
                   <pic:spPr>
                     <a:xfrm>
                       <a:off x="0" y="0"/>
-                      <a:ext cx="5760720" cy="819150"/>
+                      <a:ext cx="5760720" cy="748492"/>
                     </a:xfrm>
                     <a:prstGeom prst="rect">
                       <a:avLst/>
@@ -5089,6 +5089,13 @@
           <w:bCs/>
         </w:rPr>
         <w:t>5. Tabela Alocação</w:t>
+      </w:r>
+      <w:r>
+        <w:rPr>
+          <w:b/>
+          <w:bCs/>
+        </w:rPr>
+        <w:t xml:space="preserve"> </w:t>
       </w:r>
     </w:p>
     <w:p>
@@ -5323,11 +5330,2218 @@
     </w:p>
     <w:p>
       <w:pPr>
-        <w:jc w:val="both"/>
-      </w:pPr>
-      <w:r>
+        <w:rPr>
+          <w:b/>
+          <w:bCs/>
+        </w:rPr>
+      </w:pPr>
+      <w:r>
+        <w:br/>
+      </w:r>
+      <w:r>
+        <w:rPr>
+          <w:b/>
+          <w:bCs/>
+        </w:rPr>
+        <w:t>LABORATÓRIOS</w:t>
+      </w:r>
+      <w:r>
+        <w:rPr>
+          <w:b/>
+          <w:bCs/>
+        </w:rPr>
+        <w:t>:</w:t>
+      </w:r>
+    </w:p>
+    <w:p/>
+    <w:p>
+      <w:r>
+        <w:t xml:space="preserve">CREATE TABLE </w:t>
+      </w:r>
+      <w:proofErr w:type="spellStart"/>
+      <w:r>
+        <w:t>laboratorio</w:t>
+      </w:r>
+      <w:proofErr w:type="spellEnd"/>
+      <w:r>
+        <w:t xml:space="preserve"> (</w:t>
+      </w:r>
+    </w:p>
+    <w:p>
+      <w:r>
+        <w:t xml:space="preserve">    </w:t>
+      </w:r>
+      <w:proofErr w:type="spellStart"/>
+      <w:r>
+        <w:t>id_laboratorio</w:t>
+      </w:r>
+      <w:proofErr w:type="spellEnd"/>
+      <w:r>
+        <w:t xml:space="preserve"> SERIAL PRIMARY KEY,</w:t>
+      </w:r>
+    </w:p>
+    <w:p>
+      <w:r>
+        <w:t xml:space="preserve">    </w:t>
+      </w:r>
+      <w:proofErr w:type="spellStart"/>
+      <w:r>
+        <w:t>numero_laboratorio</w:t>
+      </w:r>
+      <w:proofErr w:type="spellEnd"/>
+      <w:r>
+        <w:t xml:space="preserve"> INTEGER NOT NULL,</w:t>
+      </w:r>
+    </w:p>
+    <w:p>
+      <w:r>
+        <w:lastRenderedPageBreak/>
+        <w:t xml:space="preserve">    </w:t>
+      </w:r>
+      <w:proofErr w:type="spellStart"/>
+      <w:r>
+        <w:t>qtde_computador</w:t>
+      </w:r>
+      <w:proofErr w:type="spellEnd"/>
+      <w:r>
+        <w:t xml:space="preserve"> INTEGER NOT NULL,</w:t>
+      </w:r>
+    </w:p>
+    <w:p>
+      <w:r>
+        <w:t xml:space="preserve">    </w:t>
+      </w:r>
+      <w:proofErr w:type="spellStart"/>
+      <w:r>
+        <w:t>capacidade_max_aluno</w:t>
+      </w:r>
+      <w:proofErr w:type="spellEnd"/>
+      <w:r>
+        <w:t xml:space="preserve"> INTEGER NOT NULL,</w:t>
+      </w:r>
+    </w:p>
+    <w:p>
+      <w:pPr>
+        <w:rPr>
+          <w:lang w:val="en-US"/>
+        </w:rPr>
+      </w:pPr>
+      <w:r>
+        <w:t xml:space="preserve">    </w:t>
+      </w:r>
+      <w:proofErr w:type="spellStart"/>
+      <w:r>
+        <w:rPr>
+          <w:lang w:val="en-US"/>
+        </w:rPr>
+        <w:t>bloco</w:t>
+      </w:r>
+      <w:proofErr w:type="spellEnd"/>
+      <w:r>
+        <w:rPr>
+          <w:lang w:val="en-US"/>
+        </w:rPr>
+        <w:t xml:space="preserve"> </w:t>
+      </w:r>
+      <w:proofErr w:type="gramStart"/>
+      <w:r>
+        <w:rPr>
+          <w:lang w:val="en-US"/>
+        </w:rPr>
+        <w:t>CHAR(</w:t>
+      </w:r>
+      <w:proofErr w:type="gramEnd"/>
+      <w:r>
+        <w:rPr>
+          <w:lang w:val="en-US"/>
+        </w:rPr>
+        <w:t>2) NOT NULL</w:t>
+      </w:r>
+    </w:p>
+    <w:p>
+      <w:pPr>
+        <w:rPr>
+          <w:lang w:val="en-US"/>
+        </w:rPr>
+      </w:pPr>
+      <w:r>
+        <w:rPr>
+          <w:lang w:val="en-US"/>
+        </w:rPr>
+        <w:t>);</w:t>
+      </w:r>
+    </w:p>
+    <w:p>
+      <w:pPr>
+        <w:rPr>
+          <w:b/>
+          <w:bCs/>
+          <w:lang w:val="en-US"/>
+        </w:rPr>
+      </w:pPr>
+      <w:r>
+        <w:rPr>
+          <w:b/>
+          <w:bCs/>
+          <w:lang w:val="en-US"/>
+        </w:rPr>
+        <w:t>USUÁRIO</w:t>
+      </w:r>
+      <w:r>
+        <w:rPr>
+          <w:b/>
+          <w:bCs/>
+          <w:lang w:val="en-US"/>
+        </w:rPr>
+        <w:t>:</w:t>
+      </w:r>
+    </w:p>
+    <w:p>
+      <w:pPr>
+        <w:rPr>
+          <w:lang w:val="en-US"/>
+        </w:rPr>
+      </w:pPr>
+    </w:p>
+    <w:p>
+      <w:pPr>
+        <w:rPr>
+          <w:lang w:val="en-US"/>
+        </w:rPr>
+      </w:pPr>
+      <w:r>
+        <w:rPr>
+          <w:lang w:val="en-US"/>
+        </w:rPr>
+        <w:t xml:space="preserve">CREATE TABLE </w:t>
+      </w:r>
+      <w:proofErr w:type="spellStart"/>
+      <w:r>
+        <w:rPr>
+          <w:lang w:val="en-US"/>
+        </w:rPr>
+        <w:t>usuario</w:t>
+      </w:r>
+      <w:proofErr w:type="spellEnd"/>
+      <w:r>
+        <w:rPr>
+          <w:lang w:val="en-US"/>
+        </w:rPr>
+        <w:t xml:space="preserve"> (</w:t>
+      </w:r>
+    </w:p>
+    <w:p>
+      <w:pPr>
+        <w:rPr>
+          <w:lang w:val="en-US"/>
+        </w:rPr>
+      </w:pPr>
+      <w:r>
+        <w:rPr>
+          <w:lang w:val="en-US"/>
+        </w:rPr>
+        <w:t xml:space="preserve">    </w:t>
+      </w:r>
+      <w:proofErr w:type="spellStart"/>
+      <w:r>
+        <w:rPr>
+          <w:lang w:val="en-US"/>
+        </w:rPr>
+        <w:t>id_usuario</w:t>
+      </w:r>
+      <w:proofErr w:type="spellEnd"/>
+      <w:r>
+        <w:rPr>
+          <w:lang w:val="en-US"/>
+        </w:rPr>
+        <w:t xml:space="preserve"> SERIAL PRIMARY KEY,</w:t>
+      </w:r>
+    </w:p>
+    <w:p>
+      <w:pPr>
+        <w:rPr>
+          <w:lang w:val="en-US"/>
+        </w:rPr>
+      </w:pPr>
+      <w:r>
+        <w:rPr>
+          <w:lang w:val="en-US"/>
+        </w:rPr>
+        <w:t xml:space="preserve">    re INTEGER NOT NULL UNIQUE,</w:t>
+      </w:r>
+    </w:p>
+    <w:p>
+      <w:pPr>
+        <w:rPr>
+          <w:lang w:val="en-US"/>
+        </w:rPr>
+      </w:pPr>
+      <w:r>
+        <w:rPr>
+          <w:lang w:val="en-US"/>
+        </w:rPr>
+        <w:t xml:space="preserve">    </w:t>
+      </w:r>
+      <w:proofErr w:type="spellStart"/>
+      <w:r>
+        <w:rPr>
+          <w:lang w:val="en-US"/>
+        </w:rPr>
+        <w:t>nome</w:t>
+      </w:r>
+      <w:proofErr w:type="spellEnd"/>
+      <w:r>
+        <w:rPr>
+          <w:lang w:val="en-US"/>
+        </w:rPr>
+        <w:t xml:space="preserve"> </w:t>
+      </w:r>
+      <w:proofErr w:type="gramStart"/>
+      <w:r>
+        <w:rPr>
+          <w:lang w:val="en-US"/>
+        </w:rPr>
+        <w:t>VARCHAR(</w:t>
+      </w:r>
+      <w:proofErr w:type="gramEnd"/>
+      <w:r>
+        <w:rPr>
+          <w:lang w:val="en-US"/>
+        </w:rPr>
+        <w:t>50</w:t>
+      </w:r>
+      <w:r>
+        <w:rPr>
+          <w:lang w:val="en-US"/>
+        </w:rPr>
+        <w:t>) NOT NULL,</w:t>
+      </w:r>
+    </w:p>
+    <w:p>
+      <w:pPr>
+        <w:rPr>
+          <w:lang w:val="en-US"/>
+        </w:rPr>
+      </w:pPr>
+      <w:r>
+        <w:rPr>
+          <w:lang w:val="en-US"/>
+        </w:rPr>
+        <w:t xml:space="preserve">    </w:t>
+      </w:r>
+      <w:proofErr w:type="spellStart"/>
+      <w:r>
+        <w:rPr>
+          <w:lang w:val="en-US"/>
+        </w:rPr>
+        <w:t>senha</w:t>
+      </w:r>
+      <w:proofErr w:type="spellEnd"/>
+      <w:r>
+        <w:rPr>
+          <w:lang w:val="en-US"/>
+        </w:rPr>
+        <w:t xml:space="preserve"> </w:t>
+      </w:r>
+      <w:proofErr w:type="gramStart"/>
+      <w:r>
+        <w:rPr>
+          <w:lang w:val="en-US"/>
+        </w:rPr>
+        <w:t>VARCHAR(</w:t>
+      </w:r>
+      <w:proofErr w:type="gramEnd"/>
+      <w:r>
+        <w:rPr>
+          <w:lang w:val="en-US"/>
+        </w:rPr>
+        <w:t>8</w:t>
+      </w:r>
+      <w:r>
+        <w:rPr>
+          <w:lang w:val="en-US"/>
+        </w:rPr>
+        <w:t>) NOT NULL,</w:t>
+      </w:r>
+    </w:p>
+    <w:p>
+      <w:pPr>
+        <w:rPr>
+          <w:lang w:val="en-US"/>
+        </w:rPr>
+      </w:pPr>
+      <w:r>
+        <w:rPr>
+          <w:lang w:val="en-US"/>
+        </w:rPr>
+        <w:t xml:space="preserve">    </w:t>
+      </w:r>
+      <w:proofErr w:type="spellStart"/>
+      <w:r>
+        <w:rPr>
+          <w:lang w:val="en-US"/>
+        </w:rPr>
+        <w:t>tipo_usuario</w:t>
+      </w:r>
+      <w:proofErr w:type="spellEnd"/>
+      <w:r>
+        <w:rPr>
+          <w:lang w:val="en-US"/>
+        </w:rPr>
+        <w:t xml:space="preserve"> </w:t>
+      </w:r>
+      <w:proofErr w:type="gramStart"/>
+      <w:r>
+        <w:rPr>
+          <w:lang w:val="en-US"/>
+        </w:rPr>
+        <w:t>VARCHAR(</w:t>
+      </w:r>
+      <w:proofErr w:type="gramEnd"/>
+      <w:r>
+        <w:rPr>
+          <w:lang w:val="en-US"/>
+        </w:rPr>
+        <w:t>30</w:t>
+      </w:r>
+      <w:r>
+        <w:rPr>
+          <w:lang w:val="en-US"/>
+        </w:rPr>
+        <w:t>) NOT NULL,</w:t>
+      </w:r>
+    </w:p>
+    <w:p>
+      <w:pPr>
+        <w:rPr>
+          <w:lang w:val="en-US"/>
+        </w:rPr>
+      </w:pPr>
+      <w:r>
+        <w:rPr>
+          <w:lang w:val="en-US"/>
+        </w:rPr>
+        <w:t xml:space="preserve">   email </w:t>
+      </w:r>
+      <w:proofErr w:type="gramStart"/>
+      <w:r>
+        <w:rPr>
+          <w:lang w:val="en-US"/>
+        </w:rPr>
+        <w:t>VARCHAR(</w:t>
+      </w:r>
+      <w:proofErr w:type="gramEnd"/>
+      <w:r>
+        <w:rPr>
+          <w:lang w:val="en-US"/>
+        </w:rPr>
+        <w:t>20) NOT NULL,</w:t>
+      </w:r>
+      <w:r>
+        <w:rPr>
+          <w:lang w:val="en-US"/>
+        </w:rPr>
         <w:tab/>
-        <w:t>Coloque aqui os scripts de criação do banco de dados e tabelas.</w:t>
+      </w:r>
+    </w:p>
+    <w:p>
+      <w:pPr>
+        <w:rPr>
+          <w:lang w:val="en-US"/>
+        </w:rPr>
+      </w:pPr>
+      <w:r>
+        <w:rPr>
+          <w:lang w:val="en-US"/>
+        </w:rPr>
+        <w:t>);</w:t>
+      </w:r>
+    </w:p>
+    <w:p>
+      <w:pPr>
+        <w:rPr>
+          <w:lang w:val="en-US"/>
+        </w:rPr>
+      </w:pPr>
+    </w:p>
+    <w:p>
+      <w:pPr>
+        <w:rPr>
+          <w:b/>
+          <w:bCs/>
+          <w:lang w:val="en-US"/>
+        </w:rPr>
+      </w:pPr>
+      <w:r>
+        <w:rPr>
+          <w:b/>
+          <w:bCs/>
+          <w:lang w:val="en-US"/>
+        </w:rPr>
+        <w:t>SOFTWARE</w:t>
+      </w:r>
+      <w:r>
+        <w:rPr>
+          <w:b/>
+          <w:bCs/>
+          <w:lang w:val="en-US"/>
+        </w:rPr>
+        <w:t>:</w:t>
+      </w:r>
+    </w:p>
+    <w:p>
+      <w:pPr>
+        <w:rPr>
+          <w:lang w:val="en-US"/>
+        </w:rPr>
+      </w:pPr>
+    </w:p>
+    <w:p>
+      <w:pPr>
+        <w:rPr>
+          <w:lang w:val="en-US"/>
+        </w:rPr>
+      </w:pPr>
+      <w:r>
+        <w:rPr>
+          <w:lang w:val="en-US"/>
+        </w:rPr>
+        <w:t>CREATE TABLE software (</w:t>
+      </w:r>
+    </w:p>
+    <w:p>
+      <w:pPr>
+        <w:rPr>
+          <w:lang w:val="en-US"/>
+        </w:rPr>
+      </w:pPr>
+      <w:r>
+        <w:rPr>
+          <w:lang w:val="en-US"/>
+        </w:rPr>
+        <w:t xml:space="preserve">    </w:t>
+      </w:r>
+      <w:proofErr w:type="spellStart"/>
+      <w:r>
+        <w:rPr>
+          <w:lang w:val="en-US"/>
+        </w:rPr>
+        <w:t>id_software</w:t>
+      </w:r>
+      <w:proofErr w:type="spellEnd"/>
+      <w:r>
+        <w:rPr>
+          <w:lang w:val="en-US"/>
+        </w:rPr>
+        <w:t xml:space="preserve"> SERIAL PRIMARY KEY,</w:t>
+      </w:r>
+    </w:p>
+    <w:p>
+      <w:pPr>
+        <w:rPr>
+          <w:lang w:val="en-US"/>
+        </w:rPr>
+      </w:pPr>
+      <w:r>
+        <w:rPr>
+          <w:lang w:val="en-US"/>
+        </w:rPr>
+        <w:t xml:space="preserve">    </w:t>
+      </w:r>
+      <w:proofErr w:type="spellStart"/>
+      <w:r>
+        <w:rPr>
+          <w:lang w:val="en-US"/>
+        </w:rPr>
+        <w:t>nome_software</w:t>
+      </w:r>
+      <w:proofErr w:type="spellEnd"/>
+      <w:r>
+        <w:rPr>
+          <w:lang w:val="en-US"/>
+        </w:rPr>
+        <w:t xml:space="preserve"> </w:t>
+      </w:r>
+      <w:proofErr w:type="gramStart"/>
+      <w:r>
+        <w:rPr>
+          <w:lang w:val="en-US"/>
+        </w:rPr>
+        <w:t>VARCHAR(</w:t>
+      </w:r>
+      <w:proofErr w:type="gramEnd"/>
+      <w:r>
+        <w:rPr>
+          <w:lang w:val="en-US"/>
+        </w:rPr>
+        <w:t>50</w:t>
+      </w:r>
+      <w:r>
+        <w:rPr>
+          <w:lang w:val="en-US"/>
+        </w:rPr>
+        <w:t>) NOT NULL,</w:t>
+      </w:r>
+    </w:p>
+    <w:p>
+      <w:r>
+        <w:rPr>
+          <w:lang w:val="en-US"/>
+        </w:rPr>
+        <w:t xml:space="preserve">    </w:t>
+      </w:r>
+      <w:proofErr w:type="spellStart"/>
+      <w:r>
+        <w:t>versao</w:t>
+      </w:r>
+      <w:proofErr w:type="spellEnd"/>
+      <w:r>
+        <w:t xml:space="preserve"> </w:t>
+      </w:r>
+      <w:proofErr w:type="gramStart"/>
+      <w:r>
+        <w:t>VARCHAR(</w:t>
+      </w:r>
+      <w:proofErr w:type="gramEnd"/>
+      <w:r>
+        <w:t>30</w:t>
+      </w:r>
+      <w:r>
+        <w:t>) NOT NULL</w:t>
+      </w:r>
+    </w:p>
+    <w:p>
+      <w:r>
+        <w:t>);</w:t>
+      </w:r>
+    </w:p>
+    <w:p/>
+    <w:p>
+      <w:pPr>
+        <w:rPr>
+          <w:b/>
+          <w:bCs/>
+        </w:rPr>
+      </w:pPr>
+      <w:r>
+        <w:rPr>
+          <w:b/>
+          <w:bCs/>
+        </w:rPr>
+        <w:t>DISCIPLINA</w:t>
+      </w:r>
+      <w:r>
+        <w:rPr>
+          <w:b/>
+          <w:bCs/>
+        </w:rPr>
+        <w:t>:</w:t>
+      </w:r>
+    </w:p>
+    <w:p/>
+    <w:p>
+      <w:r>
+        <w:t>CREATE TABLE disciplina (</w:t>
+      </w:r>
+    </w:p>
+    <w:p>
+      <w:r>
+        <w:t xml:space="preserve">    </w:t>
+      </w:r>
+      <w:proofErr w:type="spellStart"/>
+      <w:r>
+        <w:t>id_disciplina</w:t>
+      </w:r>
+      <w:proofErr w:type="spellEnd"/>
+      <w:r>
+        <w:t xml:space="preserve"> SERIAL PRIMARY KEY,</w:t>
+      </w:r>
+    </w:p>
+    <w:p>
+      <w:r>
+        <w:t xml:space="preserve">    </w:t>
+      </w:r>
+      <w:proofErr w:type="spellStart"/>
+      <w:r>
+        <w:t>nome_disciplina</w:t>
+      </w:r>
+      <w:proofErr w:type="spellEnd"/>
+      <w:r>
+        <w:t xml:space="preserve"> </w:t>
+      </w:r>
+      <w:proofErr w:type="gramStart"/>
+      <w:r>
+        <w:t>VARCHAR(</w:t>
+      </w:r>
+      <w:proofErr w:type="gramEnd"/>
+      <w:r>
+        <w:t>50</w:t>
+      </w:r>
+      <w:r>
+        <w:t>) NOT NULL,</w:t>
+      </w:r>
+    </w:p>
+    <w:p>
+      <w:pPr>
+        <w:rPr>
+          <w:lang w:val="en-US"/>
+        </w:rPr>
+      </w:pPr>
+      <w:r>
+        <w:t xml:space="preserve">    </w:t>
+      </w:r>
+      <w:proofErr w:type="spellStart"/>
+      <w:r>
+        <w:rPr>
+          <w:lang w:val="en-US"/>
+        </w:rPr>
+        <w:t>id_usuario</w:t>
+      </w:r>
+      <w:proofErr w:type="spellEnd"/>
+      <w:r>
+        <w:rPr>
+          <w:lang w:val="en-US"/>
+        </w:rPr>
+        <w:t xml:space="preserve"> INTEGER NOT NULL,</w:t>
+      </w:r>
+    </w:p>
+    <w:p>
+      <w:r>
+        <w:rPr>
+          <w:lang w:val="en-US"/>
+        </w:rPr>
+        <w:t xml:space="preserve">    </w:t>
+      </w:r>
+      <w:proofErr w:type="spellStart"/>
+      <w:r>
+        <w:t>qtde_alunos</w:t>
+      </w:r>
+      <w:proofErr w:type="spellEnd"/>
+      <w:r>
+        <w:t xml:space="preserve"> INTEGER NOT NULL,</w:t>
+      </w:r>
+    </w:p>
+    <w:p/>
+    <w:p>
+      <w:pPr>
+        <w:rPr>
+          <w:lang w:val="en-US"/>
+        </w:rPr>
+      </w:pPr>
+      <w:r>
+        <w:t xml:space="preserve">    </w:t>
+      </w:r>
+      <w:r>
+        <w:rPr>
+          <w:lang w:val="en-US"/>
+        </w:rPr>
+        <w:t xml:space="preserve">CONSTRAINT </w:t>
+      </w:r>
+      <w:proofErr w:type="spellStart"/>
+      <w:r>
+        <w:rPr>
+          <w:lang w:val="en-US"/>
+        </w:rPr>
+        <w:t>fk_disciplina_usuario</w:t>
+      </w:r>
+      <w:proofErr w:type="spellEnd"/>
+    </w:p>
+    <w:p>
+      <w:pPr>
+        <w:rPr>
+          <w:lang w:val="en-US"/>
+        </w:rPr>
+      </w:pPr>
+      <w:r>
+        <w:rPr>
+          <w:lang w:val="en-US"/>
+        </w:rPr>
+        <w:t xml:space="preserve">        FOREIGN KEY (</w:t>
+      </w:r>
+      <w:proofErr w:type="spellStart"/>
+      <w:r>
+        <w:rPr>
+          <w:lang w:val="en-US"/>
+        </w:rPr>
+        <w:t>id_usuario</w:t>
+      </w:r>
+      <w:proofErr w:type="spellEnd"/>
+      <w:r>
+        <w:rPr>
+          <w:lang w:val="en-US"/>
+        </w:rPr>
+        <w:t>)</w:t>
+      </w:r>
+    </w:p>
+    <w:p>
+      <w:pPr>
+        <w:rPr>
+          <w:lang w:val="en-US"/>
+        </w:rPr>
+      </w:pPr>
+      <w:r>
+        <w:rPr>
+          <w:lang w:val="en-US"/>
+        </w:rPr>
+        <w:t xml:space="preserve">        REFERENCES </w:t>
+      </w:r>
+      <w:proofErr w:type="spellStart"/>
+      <w:r>
+        <w:rPr>
+          <w:lang w:val="en-US"/>
+        </w:rPr>
+        <w:t>usuario</w:t>
+      </w:r>
+      <w:proofErr w:type="spellEnd"/>
+      <w:r>
+        <w:rPr>
+          <w:lang w:val="en-US"/>
+        </w:rPr>
+        <w:t>(</w:t>
+      </w:r>
+      <w:proofErr w:type="spellStart"/>
+      <w:r>
+        <w:rPr>
+          <w:lang w:val="en-US"/>
+        </w:rPr>
+        <w:t>id_usuario</w:t>
+      </w:r>
+      <w:proofErr w:type="spellEnd"/>
+      <w:r>
+        <w:rPr>
+          <w:lang w:val="en-US"/>
+        </w:rPr>
+        <w:t>)</w:t>
+      </w:r>
+    </w:p>
+    <w:p>
+      <w:pPr>
+        <w:rPr>
+          <w:lang w:val="en-US"/>
+        </w:rPr>
+      </w:pPr>
+      <w:r>
+        <w:rPr>
+          <w:lang w:val="en-US"/>
+        </w:rPr>
+        <w:lastRenderedPageBreak/>
+        <w:t xml:space="preserve">        ON UPDATE CASCADE</w:t>
+      </w:r>
+    </w:p>
+    <w:p>
+      <w:pPr>
+        <w:rPr>
+          <w:lang w:val="en-US"/>
+        </w:rPr>
+      </w:pPr>
+      <w:r>
+        <w:rPr>
+          <w:lang w:val="en-US"/>
+        </w:rPr>
+        <w:t xml:space="preserve">        ON DELETE RESTRICT</w:t>
+      </w:r>
+    </w:p>
+    <w:p>
+      <w:pPr>
+        <w:rPr>
+          <w:lang w:val="en-US"/>
+        </w:rPr>
+      </w:pPr>
+      <w:r>
+        <w:rPr>
+          <w:lang w:val="en-US"/>
+        </w:rPr>
+        <w:t>);</w:t>
+      </w:r>
+    </w:p>
+    <w:p>
+      <w:pPr>
+        <w:rPr>
+          <w:lang w:val="en-US"/>
+        </w:rPr>
+      </w:pPr>
+    </w:p>
+    <w:p>
+      <w:pPr>
+        <w:rPr>
+          <w:b/>
+          <w:bCs/>
+          <w:lang w:val="en-US"/>
+        </w:rPr>
+      </w:pPr>
+      <w:r>
+        <w:rPr>
+          <w:b/>
+          <w:bCs/>
+          <w:lang w:val="en-US"/>
+        </w:rPr>
+        <w:t>ALOCAÇÃO</w:t>
+      </w:r>
+      <w:r>
+        <w:rPr>
+          <w:b/>
+          <w:bCs/>
+          <w:lang w:val="en-US"/>
+        </w:rPr>
+        <w:t>:</w:t>
+      </w:r>
+    </w:p>
+    <w:p>
+      <w:pPr>
+        <w:rPr>
+          <w:lang w:val="en-US"/>
+        </w:rPr>
+      </w:pPr>
+    </w:p>
+    <w:p>
+      <w:pPr>
+        <w:rPr>
+          <w:lang w:val="en-US"/>
+        </w:rPr>
+      </w:pPr>
+      <w:r>
+        <w:rPr>
+          <w:lang w:val="en-US"/>
+        </w:rPr>
+        <w:t xml:space="preserve">CREATE TABLE </w:t>
+      </w:r>
+      <w:proofErr w:type="spellStart"/>
+      <w:r>
+        <w:rPr>
+          <w:lang w:val="en-US"/>
+        </w:rPr>
+        <w:t>alocacao</w:t>
+      </w:r>
+      <w:proofErr w:type="spellEnd"/>
+      <w:r>
+        <w:rPr>
+          <w:lang w:val="en-US"/>
+        </w:rPr>
+        <w:t xml:space="preserve"> (</w:t>
+      </w:r>
+    </w:p>
+    <w:p>
+      <w:pPr>
+        <w:rPr>
+          <w:lang w:val="en-US"/>
+        </w:rPr>
+      </w:pPr>
+      <w:r>
+        <w:rPr>
+          <w:lang w:val="en-US"/>
+        </w:rPr>
+        <w:t xml:space="preserve">    </w:t>
+      </w:r>
+      <w:proofErr w:type="spellStart"/>
+      <w:r>
+        <w:rPr>
+          <w:lang w:val="en-US"/>
+        </w:rPr>
+        <w:t>id_alocacao</w:t>
+      </w:r>
+      <w:proofErr w:type="spellEnd"/>
+      <w:r>
+        <w:rPr>
+          <w:lang w:val="en-US"/>
+        </w:rPr>
+        <w:t xml:space="preserve"> SERIAL PRIMARY KEY,</w:t>
+      </w:r>
+    </w:p>
+    <w:p>
+      <w:pPr>
+        <w:rPr>
+          <w:lang w:val="en-US"/>
+        </w:rPr>
+      </w:pPr>
+      <w:r>
+        <w:rPr>
+          <w:lang w:val="en-US"/>
+        </w:rPr>
+        <w:t xml:space="preserve">    data DATE NOT NULL,</w:t>
+      </w:r>
+    </w:p>
+    <w:p>
+      <w:pPr>
+        <w:rPr>
+          <w:lang w:val="en-US"/>
+        </w:rPr>
+      </w:pPr>
+      <w:r>
+        <w:rPr>
+          <w:lang w:val="en-US"/>
+        </w:rPr>
+        <w:t xml:space="preserve">    </w:t>
+      </w:r>
+      <w:proofErr w:type="spellStart"/>
+      <w:r>
+        <w:rPr>
+          <w:lang w:val="en-US"/>
+        </w:rPr>
+        <w:t>horario_inicio</w:t>
+      </w:r>
+      <w:proofErr w:type="spellEnd"/>
+      <w:r>
+        <w:rPr>
+          <w:lang w:val="en-US"/>
+        </w:rPr>
+        <w:t xml:space="preserve"> TIME NOT NULL,</w:t>
+      </w:r>
+    </w:p>
+    <w:p>
+      <w:pPr>
+        <w:rPr>
+          <w:lang w:val="en-US"/>
+        </w:rPr>
+      </w:pPr>
+      <w:r>
+        <w:rPr>
+          <w:lang w:val="en-US"/>
+        </w:rPr>
+        <w:t xml:space="preserve">    </w:t>
+      </w:r>
+      <w:proofErr w:type="spellStart"/>
+      <w:r>
+        <w:rPr>
+          <w:lang w:val="en-US"/>
+        </w:rPr>
+        <w:t>horario_fim</w:t>
+      </w:r>
+      <w:proofErr w:type="spellEnd"/>
+      <w:r>
+        <w:rPr>
+          <w:lang w:val="en-US"/>
+        </w:rPr>
+        <w:t xml:space="preserve"> TIME NOT NULL,</w:t>
+      </w:r>
+    </w:p>
+    <w:p>
+      <w:pPr>
+        <w:rPr>
+          <w:lang w:val="en-US"/>
+        </w:rPr>
+      </w:pPr>
+      <w:r>
+        <w:rPr>
+          <w:lang w:val="en-US"/>
+        </w:rPr>
+        <w:t xml:space="preserve">    </w:t>
+      </w:r>
+      <w:proofErr w:type="spellStart"/>
+      <w:r>
+        <w:rPr>
+          <w:lang w:val="en-US"/>
+        </w:rPr>
+        <w:t>status_aprovacao</w:t>
+      </w:r>
+      <w:proofErr w:type="spellEnd"/>
+      <w:r>
+        <w:rPr>
+          <w:lang w:val="en-US"/>
+        </w:rPr>
+        <w:t xml:space="preserve"> </w:t>
+      </w:r>
+      <w:proofErr w:type="gramStart"/>
+      <w:r>
+        <w:rPr>
+          <w:lang w:val="en-US"/>
+        </w:rPr>
+        <w:t>VARCHAR(</w:t>
+      </w:r>
+      <w:proofErr w:type="gramEnd"/>
+      <w:r>
+        <w:rPr>
+          <w:lang w:val="en-US"/>
+        </w:rPr>
+        <w:t>30) NOT NULL,</w:t>
+      </w:r>
+    </w:p>
+    <w:p>
+      <w:pPr>
+        <w:rPr>
+          <w:lang w:val="en-US"/>
+        </w:rPr>
+      </w:pPr>
+      <w:r>
+        <w:rPr>
+          <w:lang w:val="en-US"/>
+        </w:rPr>
+        <w:t xml:space="preserve">    </w:t>
+      </w:r>
+      <w:proofErr w:type="spellStart"/>
+      <w:r>
+        <w:rPr>
+          <w:lang w:val="en-US"/>
+        </w:rPr>
+        <w:t>id_disciplina</w:t>
+      </w:r>
+      <w:proofErr w:type="spellEnd"/>
+      <w:r>
+        <w:rPr>
+          <w:lang w:val="en-US"/>
+        </w:rPr>
+        <w:t xml:space="preserve"> INTEGER NOT NULL,</w:t>
+      </w:r>
+    </w:p>
+    <w:p>
+      <w:pPr>
+        <w:rPr>
+          <w:lang w:val="en-US"/>
+        </w:rPr>
+      </w:pPr>
+      <w:r>
+        <w:rPr>
+          <w:lang w:val="en-US"/>
+        </w:rPr>
+        <w:t xml:space="preserve">    </w:t>
+      </w:r>
+      <w:proofErr w:type="spellStart"/>
+      <w:r>
+        <w:rPr>
+          <w:lang w:val="en-US"/>
+        </w:rPr>
+        <w:t>id_laboratorio</w:t>
+      </w:r>
+      <w:proofErr w:type="spellEnd"/>
+      <w:r>
+        <w:rPr>
+          <w:lang w:val="en-US"/>
+        </w:rPr>
+        <w:t xml:space="preserve"> INTEGER NOT NULL,</w:t>
+      </w:r>
+    </w:p>
+    <w:p>
+      <w:pPr>
+        <w:rPr>
+          <w:lang w:val="en-US"/>
+        </w:rPr>
+      </w:pPr>
+      <w:r>
+        <w:rPr>
+          <w:lang w:val="en-US"/>
+        </w:rPr>
+        <w:t xml:space="preserve">    </w:t>
+      </w:r>
+      <w:proofErr w:type="spellStart"/>
+      <w:r>
+        <w:rPr>
+          <w:lang w:val="en-US"/>
+        </w:rPr>
+        <w:t>id_usuario</w:t>
+      </w:r>
+      <w:proofErr w:type="spellEnd"/>
+      <w:r>
+        <w:rPr>
+          <w:lang w:val="en-US"/>
+        </w:rPr>
+        <w:t xml:space="preserve"> INTEGER NOT NULL,</w:t>
+      </w:r>
+    </w:p>
+    <w:p>
+      <w:pPr>
+        <w:rPr>
+          <w:lang w:val="en-US"/>
+        </w:rPr>
+      </w:pPr>
+    </w:p>
+    <w:p>
+      <w:r>
+        <w:rPr>
+          <w:lang w:val="en-US"/>
+        </w:rPr>
+        <w:t xml:space="preserve">    </w:t>
+      </w:r>
+      <w:r>
+        <w:t xml:space="preserve">CONSTRAINT </w:t>
+      </w:r>
+      <w:proofErr w:type="spellStart"/>
+      <w:r>
+        <w:t>fk_alocacao_disciplina</w:t>
+      </w:r>
+      <w:proofErr w:type="spellEnd"/>
+    </w:p>
+    <w:p>
+      <w:r>
+        <w:t xml:space="preserve">        FOREIGN KEY (</w:t>
+      </w:r>
+      <w:proofErr w:type="spellStart"/>
+      <w:r>
+        <w:t>id_disciplina</w:t>
+      </w:r>
+      <w:proofErr w:type="spellEnd"/>
+      <w:r>
+        <w:t>)</w:t>
+      </w:r>
+    </w:p>
+    <w:p>
+      <w:r>
+        <w:t xml:space="preserve">        REFERENCES disciplina(</w:t>
+      </w:r>
+      <w:proofErr w:type="spellStart"/>
+      <w:r>
+        <w:t>id_disciplina</w:t>
+      </w:r>
+      <w:proofErr w:type="spellEnd"/>
+      <w:r>
+        <w:t>)</w:t>
+      </w:r>
+    </w:p>
+    <w:p>
+      <w:pPr>
+        <w:rPr>
+          <w:lang w:val="en-US"/>
+        </w:rPr>
+      </w:pPr>
+      <w:r>
+        <w:t xml:space="preserve">        </w:t>
+      </w:r>
+      <w:r>
+        <w:rPr>
+          <w:lang w:val="en-US"/>
+        </w:rPr>
+        <w:t>ON UPDATE CASCADE</w:t>
+      </w:r>
+    </w:p>
+    <w:p>
+      <w:pPr>
+        <w:rPr>
+          <w:lang w:val="en-US"/>
+        </w:rPr>
+      </w:pPr>
+      <w:r>
+        <w:rPr>
+          <w:lang w:val="en-US"/>
+        </w:rPr>
+        <w:t xml:space="preserve">        ON DELETE RESTRICT,</w:t>
+      </w:r>
+    </w:p>
+    <w:p>
+      <w:pPr>
+        <w:rPr>
+          <w:lang w:val="en-US"/>
+        </w:rPr>
+      </w:pPr>
+    </w:p>
+    <w:p>
+      <w:pPr>
+        <w:rPr>
+          <w:lang w:val="en-US"/>
+        </w:rPr>
+      </w:pPr>
+      <w:r>
+        <w:rPr>
+          <w:lang w:val="en-US"/>
+        </w:rPr>
+        <w:t xml:space="preserve">    CONSTRAINT </w:t>
+      </w:r>
+      <w:proofErr w:type="spellStart"/>
+      <w:r>
+        <w:rPr>
+          <w:lang w:val="en-US"/>
+        </w:rPr>
+        <w:t>fk_alocacao_laboratorio</w:t>
+      </w:r>
+      <w:proofErr w:type="spellEnd"/>
+    </w:p>
+    <w:p>
+      <w:pPr>
+        <w:rPr>
+          <w:lang w:val="en-US"/>
+        </w:rPr>
+      </w:pPr>
+      <w:r>
+        <w:rPr>
+          <w:lang w:val="en-US"/>
+        </w:rPr>
+        <w:t xml:space="preserve">        FOREIGN KEY (</w:t>
+      </w:r>
+      <w:proofErr w:type="spellStart"/>
+      <w:r>
+        <w:rPr>
+          <w:lang w:val="en-US"/>
+        </w:rPr>
+        <w:t>id_laboratorio</w:t>
+      </w:r>
+      <w:proofErr w:type="spellEnd"/>
+      <w:r>
+        <w:rPr>
+          <w:lang w:val="en-US"/>
+        </w:rPr>
+        <w:t>)</w:t>
+      </w:r>
+    </w:p>
+    <w:p>
+      <w:pPr>
+        <w:rPr>
+          <w:lang w:val="en-US"/>
+        </w:rPr>
+      </w:pPr>
+      <w:r>
+        <w:rPr>
+          <w:lang w:val="en-US"/>
+        </w:rPr>
+        <w:t xml:space="preserve">        REFERENCES </w:t>
+      </w:r>
+      <w:proofErr w:type="spellStart"/>
+      <w:r>
+        <w:rPr>
+          <w:lang w:val="en-US"/>
+        </w:rPr>
+        <w:t>laboratorio</w:t>
+      </w:r>
+      <w:proofErr w:type="spellEnd"/>
+      <w:r>
+        <w:rPr>
+          <w:lang w:val="en-US"/>
+        </w:rPr>
+        <w:t>(</w:t>
+      </w:r>
+      <w:proofErr w:type="spellStart"/>
+      <w:r>
+        <w:rPr>
+          <w:lang w:val="en-US"/>
+        </w:rPr>
+        <w:t>id_laboratorio</w:t>
+      </w:r>
+      <w:proofErr w:type="spellEnd"/>
+      <w:r>
+        <w:rPr>
+          <w:lang w:val="en-US"/>
+        </w:rPr>
+        <w:t>)</w:t>
+      </w:r>
+    </w:p>
+    <w:p>
+      <w:pPr>
+        <w:rPr>
+          <w:lang w:val="en-US"/>
+        </w:rPr>
+      </w:pPr>
+      <w:r>
+        <w:rPr>
+          <w:lang w:val="en-US"/>
+        </w:rPr>
+        <w:t xml:space="preserve">        ON UPDATE CASCADE</w:t>
+      </w:r>
+    </w:p>
+    <w:p>
+      <w:pPr>
+        <w:rPr>
+          <w:lang w:val="en-US"/>
+        </w:rPr>
+      </w:pPr>
+      <w:r>
+        <w:rPr>
+          <w:lang w:val="en-US"/>
+        </w:rPr>
+        <w:t xml:space="preserve">        ON DELETE RESTRICT,</w:t>
+      </w:r>
+    </w:p>
+    <w:p>
+      <w:pPr>
+        <w:rPr>
+          <w:lang w:val="en-US"/>
+        </w:rPr>
+      </w:pPr>
+    </w:p>
+    <w:p>
+      <w:pPr>
+        <w:rPr>
+          <w:lang w:val="en-US"/>
+        </w:rPr>
+      </w:pPr>
+      <w:r>
+        <w:rPr>
+          <w:lang w:val="en-US"/>
+        </w:rPr>
+        <w:t xml:space="preserve">    CONSTRAINT </w:t>
+      </w:r>
+      <w:proofErr w:type="spellStart"/>
+      <w:r>
+        <w:rPr>
+          <w:lang w:val="en-US"/>
+        </w:rPr>
+        <w:t>fk_alocacao_usuario</w:t>
+      </w:r>
+      <w:proofErr w:type="spellEnd"/>
+    </w:p>
+    <w:p>
+      <w:pPr>
+        <w:rPr>
+          <w:lang w:val="en-US"/>
+        </w:rPr>
+      </w:pPr>
+      <w:r>
+        <w:rPr>
+          <w:lang w:val="en-US"/>
+        </w:rPr>
+        <w:t xml:space="preserve">        FOREIGN KEY (</w:t>
+      </w:r>
+      <w:proofErr w:type="spellStart"/>
+      <w:r>
+        <w:rPr>
+          <w:lang w:val="en-US"/>
+        </w:rPr>
+        <w:t>id_usuario</w:t>
+      </w:r>
+      <w:proofErr w:type="spellEnd"/>
+      <w:r>
+        <w:rPr>
+          <w:lang w:val="en-US"/>
+        </w:rPr>
+        <w:t>)</w:t>
+      </w:r>
+    </w:p>
+    <w:p>
+      <w:pPr>
+        <w:rPr>
+          <w:lang w:val="en-US"/>
+        </w:rPr>
+      </w:pPr>
+      <w:r>
+        <w:rPr>
+          <w:lang w:val="en-US"/>
+        </w:rPr>
+        <w:t xml:space="preserve">        REFERENCES </w:t>
+      </w:r>
+      <w:proofErr w:type="spellStart"/>
+      <w:r>
+        <w:rPr>
+          <w:lang w:val="en-US"/>
+        </w:rPr>
+        <w:t>usuario</w:t>
+      </w:r>
+      <w:proofErr w:type="spellEnd"/>
+      <w:r>
+        <w:rPr>
+          <w:lang w:val="en-US"/>
+        </w:rPr>
+        <w:t>(</w:t>
+      </w:r>
+      <w:proofErr w:type="spellStart"/>
+      <w:r>
+        <w:rPr>
+          <w:lang w:val="en-US"/>
+        </w:rPr>
+        <w:t>id_usuario</w:t>
+      </w:r>
+      <w:proofErr w:type="spellEnd"/>
+      <w:r>
+        <w:rPr>
+          <w:lang w:val="en-US"/>
+        </w:rPr>
+        <w:t>)</w:t>
+      </w:r>
+    </w:p>
+    <w:p>
+      <w:pPr>
+        <w:rPr>
+          <w:lang w:val="en-US"/>
+        </w:rPr>
+      </w:pPr>
+      <w:r>
+        <w:rPr>
+          <w:lang w:val="en-US"/>
+        </w:rPr>
+        <w:t xml:space="preserve">        ON UPDATE CASCADE</w:t>
+      </w:r>
+    </w:p>
+    <w:p>
+      <w:pPr>
+        <w:rPr>
+          <w:lang w:val="en-US"/>
+        </w:rPr>
+      </w:pPr>
+      <w:r>
+        <w:rPr>
+          <w:lang w:val="en-US"/>
+        </w:rPr>
+        <w:t xml:space="preserve">        ON DELETE RESTRICT</w:t>
+      </w:r>
+    </w:p>
+    <w:p>
+      <w:pPr>
+        <w:rPr>
+          <w:lang w:val="en-US"/>
+        </w:rPr>
+      </w:pPr>
+      <w:r>
+        <w:rPr>
+          <w:lang w:val="en-US"/>
+        </w:rPr>
+        <w:t>);</w:t>
+      </w:r>
+    </w:p>
+    <w:p>
+      <w:pPr>
+        <w:rPr>
+          <w:lang w:val="en-US"/>
+        </w:rPr>
+      </w:pPr>
+    </w:p>
+    <w:p>
+      <w:pPr>
+        <w:rPr>
+          <w:b/>
+          <w:bCs/>
+          <w:lang w:val="en-US"/>
+        </w:rPr>
+      </w:pPr>
+      <w:r>
+        <w:rPr>
+          <w:b/>
+          <w:bCs/>
+          <w:lang w:val="en-US"/>
+        </w:rPr>
+        <w:t>LABORATÓRIO-SOFTWARE (</w:t>
+      </w:r>
+      <w:proofErr w:type="gramStart"/>
+      <w:r>
+        <w:rPr>
+          <w:b/>
+          <w:bCs/>
+          <w:lang w:val="en-US"/>
+        </w:rPr>
+        <w:t>N:N</w:t>
+      </w:r>
+      <w:proofErr w:type="gramEnd"/>
+      <w:r>
+        <w:rPr>
+          <w:b/>
+          <w:bCs/>
+          <w:lang w:val="en-US"/>
+        </w:rPr>
+        <w:t>)</w:t>
+      </w:r>
+      <w:r>
+        <w:rPr>
+          <w:b/>
+          <w:bCs/>
+          <w:lang w:val="en-US"/>
+        </w:rPr>
+        <w:t>:</w:t>
+      </w:r>
+    </w:p>
+    <w:p>
+      <w:pPr>
+        <w:rPr>
+          <w:lang w:val="en-US"/>
+        </w:rPr>
+      </w:pPr>
+    </w:p>
+    <w:p>
+      <w:pPr>
+        <w:rPr>
+          <w:lang w:val="en-US"/>
+        </w:rPr>
+      </w:pPr>
+      <w:r>
+        <w:rPr>
+          <w:lang w:val="en-US"/>
+        </w:rPr>
+        <w:t xml:space="preserve">CREATE TABLE </w:t>
+      </w:r>
+      <w:proofErr w:type="spellStart"/>
+      <w:r>
+        <w:rPr>
+          <w:lang w:val="en-US"/>
+        </w:rPr>
+        <w:t>laboratorio_software</w:t>
+      </w:r>
+      <w:proofErr w:type="spellEnd"/>
+      <w:r>
+        <w:rPr>
+          <w:lang w:val="en-US"/>
+        </w:rPr>
+        <w:t xml:space="preserve"> (</w:t>
+      </w:r>
+    </w:p>
+    <w:p>
+      <w:pPr>
+        <w:rPr>
+          <w:lang w:val="en-US"/>
+        </w:rPr>
+      </w:pPr>
+      <w:r>
+        <w:rPr>
+          <w:lang w:val="en-US"/>
+        </w:rPr>
+        <w:t xml:space="preserve">    </w:t>
+      </w:r>
+      <w:proofErr w:type="spellStart"/>
+      <w:r>
+        <w:rPr>
+          <w:lang w:val="en-US"/>
+        </w:rPr>
+        <w:t>id_software</w:t>
+      </w:r>
+      <w:proofErr w:type="spellEnd"/>
+      <w:r>
+        <w:rPr>
+          <w:lang w:val="en-US"/>
+        </w:rPr>
+        <w:t xml:space="preserve"> INTEGER NOT NULL,</w:t>
+      </w:r>
+    </w:p>
+    <w:p>
+      <w:pPr>
+        <w:rPr>
+          <w:lang w:val="en-US"/>
+        </w:rPr>
+      </w:pPr>
+      <w:r>
+        <w:rPr>
+          <w:lang w:val="en-US"/>
+        </w:rPr>
+        <w:t xml:space="preserve">    </w:t>
+      </w:r>
+      <w:proofErr w:type="spellStart"/>
+      <w:r>
+        <w:rPr>
+          <w:lang w:val="en-US"/>
+        </w:rPr>
+        <w:t>id_laboratorio</w:t>
+      </w:r>
+      <w:proofErr w:type="spellEnd"/>
+      <w:r>
+        <w:rPr>
+          <w:lang w:val="en-US"/>
+        </w:rPr>
+        <w:t xml:space="preserve"> INTEGER NOT NULL,</w:t>
+      </w:r>
+    </w:p>
+    <w:p>
+      <w:pPr>
+        <w:rPr>
+          <w:lang w:val="en-US"/>
+        </w:rPr>
+      </w:pPr>
+    </w:p>
+    <w:p>
+      <w:pPr>
+        <w:rPr>
+          <w:lang w:val="en-US"/>
+        </w:rPr>
+      </w:pPr>
+      <w:r>
+        <w:rPr>
+          <w:lang w:val="en-US"/>
+        </w:rPr>
+        <w:t xml:space="preserve">    CONSTRAINT </w:t>
+      </w:r>
+      <w:proofErr w:type="spellStart"/>
+      <w:r>
+        <w:rPr>
+          <w:lang w:val="en-US"/>
+        </w:rPr>
+        <w:t>pk_laboratorio_software</w:t>
+      </w:r>
+      <w:proofErr w:type="spellEnd"/>
+    </w:p>
+    <w:p>
+      <w:pPr>
+        <w:rPr>
+          <w:lang w:val="en-US"/>
+        </w:rPr>
+      </w:pPr>
+      <w:r>
+        <w:rPr>
+          <w:lang w:val="en-US"/>
+        </w:rPr>
+        <w:t xml:space="preserve">        PRIMARY KEY (</w:t>
+      </w:r>
+      <w:proofErr w:type="spellStart"/>
+      <w:r>
+        <w:rPr>
+          <w:lang w:val="en-US"/>
+        </w:rPr>
+        <w:t>id_software</w:t>
+      </w:r>
+      <w:proofErr w:type="spellEnd"/>
+      <w:r>
+        <w:rPr>
+          <w:lang w:val="en-US"/>
+        </w:rPr>
+        <w:t xml:space="preserve">, </w:t>
+      </w:r>
+      <w:proofErr w:type="spellStart"/>
+      <w:r>
+        <w:rPr>
+          <w:lang w:val="en-US"/>
+        </w:rPr>
+        <w:t>id_laboratorio</w:t>
+      </w:r>
+      <w:proofErr w:type="spellEnd"/>
+      <w:r>
+        <w:rPr>
+          <w:lang w:val="en-US"/>
+        </w:rPr>
+        <w:t>),</w:t>
+      </w:r>
+    </w:p>
+    <w:p>
+      <w:pPr>
+        <w:rPr>
+          <w:lang w:val="en-US"/>
+        </w:rPr>
+      </w:pPr>
+    </w:p>
+    <w:p>
+      <w:pPr>
+        <w:rPr>
+          <w:lang w:val="en-US"/>
+        </w:rPr>
+      </w:pPr>
+      <w:r>
+        <w:rPr>
+          <w:lang w:val="en-US"/>
+        </w:rPr>
+        <w:t xml:space="preserve">    CONSTRAINT </w:t>
+      </w:r>
+      <w:proofErr w:type="spellStart"/>
+      <w:r>
+        <w:rPr>
+          <w:lang w:val="en-US"/>
+        </w:rPr>
+        <w:t>fk_labsoft_software</w:t>
+      </w:r>
+      <w:proofErr w:type="spellEnd"/>
+    </w:p>
+    <w:p>
+      <w:pPr>
+        <w:rPr>
+          <w:lang w:val="en-US"/>
+        </w:rPr>
+      </w:pPr>
+      <w:r>
+        <w:rPr>
+          <w:lang w:val="en-US"/>
+        </w:rPr>
+        <w:t xml:space="preserve">        FOREIGN KEY (</w:t>
+      </w:r>
+      <w:proofErr w:type="spellStart"/>
+      <w:r>
+        <w:rPr>
+          <w:lang w:val="en-US"/>
+        </w:rPr>
+        <w:t>id_software</w:t>
+      </w:r>
+      <w:proofErr w:type="spellEnd"/>
+      <w:r>
+        <w:rPr>
+          <w:lang w:val="en-US"/>
+        </w:rPr>
+        <w:t>)</w:t>
+      </w:r>
+    </w:p>
+    <w:p>
+      <w:pPr>
+        <w:rPr>
+          <w:lang w:val="en-US"/>
+        </w:rPr>
+      </w:pPr>
+      <w:r>
+        <w:rPr>
+          <w:lang w:val="en-US"/>
+        </w:rPr>
+        <w:t xml:space="preserve">        REFERENCES software(</w:t>
+      </w:r>
+      <w:proofErr w:type="spellStart"/>
+      <w:r>
+        <w:rPr>
+          <w:lang w:val="en-US"/>
+        </w:rPr>
+        <w:t>id_software</w:t>
+      </w:r>
+      <w:proofErr w:type="spellEnd"/>
+      <w:r>
+        <w:rPr>
+          <w:lang w:val="en-US"/>
+        </w:rPr>
+        <w:t>)</w:t>
+      </w:r>
+    </w:p>
+    <w:p>
+      <w:pPr>
+        <w:rPr>
+          <w:lang w:val="en-US"/>
+        </w:rPr>
+      </w:pPr>
+      <w:r>
+        <w:rPr>
+          <w:lang w:val="en-US"/>
+        </w:rPr>
+        <w:t xml:space="preserve">        ON UPDATE CASCADE</w:t>
+      </w:r>
+    </w:p>
+    <w:p>
+      <w:pPr>
+        <w:rPr>
+          <w:lang w:val="en-US"/>
+        </w:rPr>
+      </w:pPr>
+      <w:r>
+        <w:rPr>
+          <w:lang w:val="en-US"/>
+        </w:rPr>
+        <w:t xml:space="preserve">        ON DELETE CASCADE,</w:t>
+      </w:r>
+    </w:p>
+    <w:p>
+      <w:pPr>
+        <w:rPr>
+          <w:lang w:val="en-US"/>
+        </w:rPr>
+      </w:pPr>
+    </w:p>
+    <w:p>
+      <w:pPr>
+        <w:rPr>
+          <w:lang w:val="en-US"/>
+        </w:rPr>
+      </w:pPr>
+      <w:r>
+        <w:rPr>
+          <w:lang w:val="en-US"/>
+        </w:rPr>
+        <w:t xml:space="preserve">    CONSTRAINT </w:t>
+      </w:r>
+      <w:proofErr w:type="spellStart"/>
+      <w:r>
+        <w:rPr>
+          <w:lang w:val="en-US"/>
+        </w:rPr>
+        <w:t>fk_labsoft_laboratorio</w:t>
+      </w:r>
+      <w:proofErr w:type="spellEnd"/>
+    </w:p>
+    <w:p>
+      <w:pPr>
+        <w:rPr>
+          <w:lang w:val="en-US"/>
+        </w:rPr>
+      </w:pPr>
+      <w:r>
+        <w:rPr>
+          <w:lang w:val="en-US"/>
+        </w:rPr>
+        <w:t xml:space="preserve">        FOREIGN KEY (</w:t>
+      </w:r>
+      <w:proofErr w:type="spellStart"/>
+      <w:r>
+        <w:rPr>
+          <w:lang w:val="en-US"/>
+        </w:rPr>
+        <w:t>id_laboratorio</w:t>
+      </w:r>
+      <w:proofErr w:type="spellEnd"/>
+      <w:r>
+        <w:rPr>
+          <w:lang w:val="en-US"/>
+        </w:rPr>
+        <w:t>)</w:t>
+      </w:r>
+    </w:p>
+    <w:p>
+      <w:r>
+        <w:rPr>
+          <w:lang w:val="en-US"/>
+        </w:rPr>
+        <w:t xml:space="preserve">        </w:t>
+      </w:r>
+      <w:r>
+        <w:t xml:space="preserve">REFERENCES </w:t>
+      </w:r>
+      <w:proofErr w:type="spellStart"/>
+      <w:r>
+        <w:t>laboratorio</w:t>
+      </w:r>
+      <w:proofErr w:type="spellEnd"/>
+      <w:r>
+        <w:t>(</w:t>
+      </w:r>
+      <w:proofErr w:type="spellStart"/>
+      <w:r>
+        <w:t>id_laboratorio</w:t>
+      </w:r>
+      <w:proofErr w:type="spellEnd"/>
+      <w:r>
+        <w:t>)</w:t>
+      </w:r>
+    </w:p>
+    <w:p>
+      <w:r>
+        <w:t xml:space="preserve">        ON UPDATE CASCADE</w:t>
+      </w:r>
+    </w:p>
+    <w:p>
+      <w:r>
+        <w:t xml:space="preserve">        ON DELETE CASCADE</w:t>
+      </w:r>
+    </w:p>
+    <w:p>
+      <w:r>
+        <w:t>);</w:t>
+      </w:r>
+    </w:p>
+    <w:p/>
+    <w:p>
+      <w:pPr>
+        <w:rPr>
+          <w:b/>
+          <w:bCs/>
+        </w:rPr>
+      </w:pPr>
+      <w:r>
+        <w:rPr>
+          <w:b/>
+          <w:bCs/>
+        </w:rPr>
+        <w:t>SOFTWARE-DISCIPLINA (N:N)</w:t>
+      </w:r>
+      <w:r>
+        <w:rPr>
+          <w:b/>
+          <w:bCs/>
+        </w:rPr>
+        <w:t>:</w:t>
+      </w:r>
+    </w:p>
+    <w:p/>
+    <w:p>
+      <w:pPr>
+        <w:rPr>
+          <w:lang w:val="en-US"/>
+        </w:rPr>
+      </w:pPr>
+      <w:r>
+        <w:rPr>
+          <w:lang w:val="en-US"/>
+        </w:rPr>
+        <w:t xml:space="preserve">CREATE TABLE </w:t>
+      </w:r>
+      <w:proofErr w:type="spellStart"/>
+      <w:r>
+        <w:rPr>
+          <w:lang w:val="en-US"/>
+        </w:rPr>
+        <w:t>software_disciplinas</w:t>
+      </w:r>
+      <w:proofErr w:type="spellEnd"/>
+      <w:r>
+        <w:rPr>
+          <w:lang w:val="en-US"/>
+        </w:rPr>
+        <w:t xml:space="preserve"> (</w:t>
+      </w:r>
+    </w:p>
+    <w:p>
+      <w:pPr>
+        <w:rPr>
+          <w:lang w:val="en-US"/>
+        </w:rPr>
+      </w:pPr>
+      <w:r>
+        <w:rPr>
+          <w:lang w:val="en-US"/>
+        </w:rPr>
+        <w:t xml:space="preserve">    </w:t>
+      </w:r>
+      <w:proofErr w:type="spellStart"/>
+      <w:r>
+        <w:rPr>
+          <w:lang w:val="en-US"/>
+        </w:rPr>
+        <w:t>id_software</w:t>
+      </w:r>
+      <w:proofErr w:type="spellEnd"/>
+      <w:r>
+        <w:rPr>
+          <w:lang w:val="en-US"/>
+        </w:rPr>
+        <w:t xml:space="preserve"> INTEGER NOT NULL,</w:t>
+      </w:r>
+    </w:p>
+    <w:p>
+      <w:pPr>
+        <w:rPr>
+          <w:lang w:val="en-US"/>
+        </w:rPr>
+      </w:pPr>
+      <w:r>
+        <w:rPr>
+          <w:lang w:val="en-US"/>
+        </w:rPr>
+        <w:t xml:space="preserve">    </w:t>
+      </w:r>
+      <w:proofErr w:type="spellStart"/>
+      <w:r>
+        <w:rPr>
+          <w:lang w:val="en-US"/>
+        </w:rPr>
+        <w:t>id_disciplina</w:t>
+      </w:r>
+      <w:proofErr w:type="spellEnd"/>
+      <w:r>
+        <w:rPr>
+          <w:lang w:val="en-US"/>
+        </w:rPr>
+        <w:t xml:space="preserve"> INTEGER NOT NULL,</w:t>
+      </w:r>
+    </w:p>
+    <w:p>
+      <w:pPr>
+        <w:rPr>
+          <w:lang w:val="en-US"/>
+        </w:rPr>
+      </w:pPr>
+    </w:p>
+    <w:p>
+      <w:pPr>
+        <w:rPr>
+          <w:lang w:val="en-US"/>
+        </w:rPr>
+      </w:pPr>
+      <w:r>
+        <w:rPr>
+          <w:lang w:val="en-US"/>
+        </w:rPr>
+        <w:t xml:space="preserve">    CONSTRAINT </w:t>
+      </w:r>
+      <w:proofErr w:type="spellStart"/>
+      <w:r>
+        <w:rPr>
+          <w:lang w:val="en-US"/>
+        </w:rPr>
+        <w:t>pk_software_disciplinas</w:t>
+      </w:r>
+      <w:proofErr w:type="spellEnd"/>
+    </w:p>
+    <w:p>
+      <w:pPr>
+        <w:rPr>
+          <w:lang w:val="en-US"/>
+        </w:rPr>
+      </w:pPr>
+      <w:r>
+        <w:rPr>
+          <w:lang w:val="en-US"/>
+        </w:rPr>
+        <w:t xml:space="preserve">        PRIMARY KEY (</w:t>
+      </w:r>
+      <w:proofErr w:type="spellStart"/>
+      <w:r>
+        <w:rPr>
+          <w:lang w:val="en-US"/>
+        </w:rPr>
+        <w:t>id_software</w:t>
+      </w:r>
+      <w:proofErr w:type="spellEnd"/>
+      <w:r>
+        <w:rPr>
+          <w:lang w:val="en-US"/>
+        </w:rPr>
+        <w:t xml:space="preserve">, </w:t>
+      </w:r>
+      <w:proofErr w:type="spellStart"/>
+      <w:r>
+        <w:rPr>
+          <w:lang w:val="en-US"/>
+        </w:rPr>
+        <w:t>id_disciplina</w:t>
+      </w:r>
+      <w:proofErr w:type="spellEnd"/>
+      <w:r>
+        <w:rPr>
+          <w:lang w:val="en-US"/>
+        </w:rPr>
+        <w:t>),</w:t>
+      </w:r>
+    </w:p>
+    <w:p>
+      <w:pPr>
+        <w:rPr>
+          <w:lang w:val="en-US"/>
+        </w:rPr>
+      </w:pPr>
+    </w:p>
+    <w:p>
+      <w:pPr>
+        <w:rPr>
+          <w:lang w:val="en-US"/>
+        </w:rPr>
+      </w:pPr>
+      <w:r>
+        <w:rPr>
+          <w:lang w:val="en-US"/>
+        </w:rPr>
+        <w:t xml:space="preserve">    CONSTRAINT </w:t>
+      </w:r>
+      <w:proofErr w:type="spellStart"/>
+      <w:r>
+        <w:rPr>
+          <w:lang w:val="en-US"/>
+        </w:rPr>
+        <w:t>fk_softdisc_software</w:t>
+      </w:r>
+      <w:proofErr w:type="spellEnd"/>
+    </w:p>
+    <w:p>
+      <w:pPr>
+        <w:rPr>
+          <w:lang w:val="en-US"/>
+        </w:rPr>
+      </w:pPr>
+      <w:r>
+        <w:rPr>
+          <w:lang w:val="en-US"/>
+        </w:rPr>
+        <w:t xml:space="preserve">        FOREIGN KEY (</w:t>
+      </w:r>
+      <w:proofErr w:type="spellStart"/>
+      <w:r>
+        <w:rPr>
+          <w:lang w:val="en-US"/>
+        </w:rPr>
+        <w:t>id_software</w:t>
+      </w:r>
+      <w:proofErr w:type="spellEnd"/>
+      <w:r>
+        <w:rPr>
+          <w:lang w:val="en-US"/>
+        </w:rPr>
+        <w:t>)</w:t>
+      </w:r>
+    </w:p>
+    <w:p>
+      <w:pPr>
+        <w:rPr>
+          <w:lang w:val="en-US"/>
+        </w:rPr>
+      </w:pPr>
+      <w:r>
+        <w:rPr>
+          <w:lang w:val="en-US"/>
+        </w:rPr>
+        <w:lastRenderedPageBreak/>
+        <w:t xml:space="preserve">        REFERENCES software(</w:t>
+      </w:r>
+      <w:proofErr w:type="spellStart"/>
+      <w:r>
+        <w:rPr>
+          <w:lang w:val="en-US"/>
+        </w:rPr>
+        <w:t>id_software</w:t>
+      </w:r>
+      <w:proofErr w:type="spellEnd"/>
+      <w:r>
+        <w:rPr>
+          <w:lang w:val="en-US"/>
+        </w:rPr>
+        <w:t>)</w:t>
+      </w:r>
+    </w:p>
+    <w:p>
+      <w:pPr>
+        <w:rPr>
+          <w:lang w:val="en-US"/>
+        </w:rPr>
+      </w:pPr>
+      <w:r>
+        <w:rPr>
+          <w:lang w:val="en-US"/>
+        </w:rPr>
+        <w:t xml:space="preserve">        ON UPDATE CASCADE</w:t>
+      </w:r>
+    </w:p>
+    <w:p>
+      <w:pPr>
+        <w:rPr>
+          <w:lang w:val="en-US"/>
+        </w:rPr>
+      </w:pPr>
+      <w:r>
+        <w:rPr>
+          <w:lang w:val="en-US"/>
+        </w:rPr>
+        <w:t xml:space="preserve">        ON DELETE CASCADE,</w:t>
+      </w:r>
+    </w:p>
+    <w:p>
+      <w:pPr>
+        <w:rPr>
+          <w:lang w:val="en-US"/>
+        </w:rPr>
+      </w:pPr>
+    </w:p>
+    <w:p>
+      <w:r>
+        <w:rPr>
+          <w:lang w:val="en-US"/>
+        </w:rPr>
+        <w:t xml:space="preserve">    </w:t>
+      </w:r>
+      <w:r>
+        <w:t xml:space="preserve">CONSTRAINT </w:t>
+      </w:r>
+      <w:proofErr w:type="spellStart"/>
+      <w:r>
+        <w:t>fk_softdisc_disciplina</w:t>
+      </w:r>
+      <w:proofErr w:type="spellEnd"/>
+    </w:p>
+    <w:p>
+      <w:r>
+        <w:t xml:space="preserve">        FOREIGN KEY (</w:t>
+      </w:r>
+      <w:proofErr w:type="spellStart"/>
+      <w:r>
+        <w:t>id_disciplina</w:t>
+      </w:r>
+      <w:proofErr w:type="spellEnd"/>
+      <w:r>
+        <w:t>)</w:t>
+      </w:r>
+    </w:p>
+    <w:p>
+      <w:r>
+        <w:t xml:space="preserve">        REFERENCES disciplina(</w:t>
+      </w:r>
+      <w:proofErr w:type="spellStart"/>
+      <w:r>
+        <w:t>id_disciplina</w:t>
+      </w:r>
+      <w:proofErr w:type="spellEnd"/>
+      <w:r>
+        <w:t>)</w:t>
+      </w:r>
+    </w:p>
+    <w:p>
+      <w:pPr>
+        <w:rPr>
+          <w:lang w:val="en-US"/>
+        </w:rPr>
+      </w:pPr>
+      <w:r>
+        <w:t xml:space="preserve">        </w:t>
+      </w:r>
+      <w:r>
+        <w:rPr>
+          <w:lang w:val="en-US"/>
+        </w:rPr>
+        <w:t>ON UPDATE CASCADE</w:t>
+      </w:r>
+    </w:p>
+    <w:p>
+      <w:pPr>
+        <w:rPr>
+          <w:lang w:val="en-US"/>
+        </w:rPr>
+      </w:pPr>
+      <w:r>
+        <w:rPr>
+          <w:lang w:val="en-US"/>
+        </w:rPr>
+        <w:t xml:space="preserve">        ON DELETE CASCADE</w:t>
       </w:r>
     </w:p>
     <w:p>
@@ -5346,6 +7560,9 @@
           <w:docGrid w:linePitch="326"/>
         </w:sectPr>
       </w:pPr>
+      <w:r>
+        <w:t>);</w:t>
+      </w:r>
     </w:p>
     <w:p>
       <w:pPr>
@@ -8617,7 +10834,7 @@
     <w:lsdException w:name="HTML Sample" w:semiHidden="1" w:unhideWhenUsed="1"/>
     <w:lsdException w:name="HTML Typewriter" w:semiHidden="1" w:unhideWhenUsed="1"/>
     <w:lsdException w:name="HTML Variable" w:semiHidden="1" w:unhideWhenUsed="1"/>
-    <w:lsdException w:name="Normal Table" w:qFormat="1"/>
+    <w:lsdException w:name="Normal Table" w:semiHidden="1" w:unhideWhenUsed="1" w:qFormat="1"/>
     <w:lsdException w:name="annotation subject" w:semiHidden="1" w:unhideWhenUsed="1" w:qFormat="1"/>
     <w:lsdException w:name="No List" w:semiHidden="1" w:unhideWhenUsed="1"/>
     <w:lsdException w:name="Outline List 1" w:semiHidden="1" w:unhideWhenUsed="1"/>
@@ -8660,8 +10877,11 @@
     <w:lsdException w:name="Table Contemporary" w:semiHidden="1" w:unhideWhenUsed="1"/>
     <w:lsdException w:name="Table Elegant" w:semiHidden="1" w:unhideWhenUsed="1"/>
     <w:lsdException w:name="Table Professional" w:semiHidden="1" w:unhideWhenUsed="1"/>
+    <w:lsdException w:name="Table Subtle 1" w:semiHidden="1" w:unhideWhenUsed="1"/>
     <w:lsdException w:name="Table Subtle 2" w:semiHidden="1" w:unhideWhenUsed="1"/>
     <w:lsdException w:name="Table Web 1" w:semiHidden="1" w:unhideWhenUsed="1"/>
+    <w:lsdException w:name="Table Web 2" w:semiHidden="1" w:unhideWhenUsed="1"/>
+    <w:lsdException w:name="Table Web 3" w:semiHidden="1" w:unhideWhenUsed="1"/>
     <w:lsdException w:name="Balloon Text" w:semiHidden="1" w:unhideWhenUsed="1" w:qFormat="1"/>
     <w:lsdException w:name="Table Grid" w:uiPriority="59"/>
     <w:lsdException w:name="Table Theme" w:semiHidden="1" w:unhideWhenUsed="1"/>
@@ -8682,6 +10902,10 @@
     <w:lsdException w:name="Colorful List"/>
     <w:lsdException w:name="Colorful Grid"/>
     <w:lsdException w:name="Light Shading Accent 1"/>
+    <w:lsdException w:name="Light List Accent 1"/>
+    <w:lsdException w:name="Light Grid Accent 1"/>
+    <w:lsdException w:name="Medium Shading 1 Accent 1"/>
+    <w:lsdException w:name="Medium Shading 2 Accent 1"/>
     <w:lsdException w:name="Medium List 1 Accent 1"/>
     <w:lsdException w:name="Revision" w:semiHidden="1" w:unhideWhenUsed="1"/>
     <w:lsdException w:name="List Paragraph" w:uiPriority="34" w:qFormat="1"/>
@@ -8760,6 +10984,11 @@
     <w:lsdException w:name="Medium List 2 Accent 6"/>
     <w:lsdException w:name="Medium Grid 1 Accent 6"/>
     <w:lsdException w:name="Medium Grid 2 Accent 6"/>
+    <w:lsdException w:name="Medium Grid 3 Accent 6"/>
+    <w:lsdException w:name="Dark List Accent 6"/>
+    <w:lsdException w:name="Colorful Shading Accent 6"/>
+    <w:lsdException w:name="Colorful List Accent 6"/>
+    <w:lsdException w:name="Colorful Grid Accent 6"/>
     <w:lsdException w:name="Subtle Emphasis" w:uiPriority="19" w:qFormat="1"/>
     <w:lsdException w:name="Intense Emphasis" w:uiPriority="21" w:qFormat="1"/>
     <w:lsdException w:name="Subtle Reference" w:uiPriority="31" w:qFormat="1"/>

</xml_diff>

<commit_message>
Atualizando a documentação do projeto integrador - 17/04/2026
</commit_message>
<xml_diff>
--- a/Terceiro_Semestre/Projeto_Integrador/Documentação/Modelo_Projeto_Integrador_principal.docx
+++ b/Terceiro_Semestre/Projeto_Integrador/Documentação/Modelo_Projeto_Integrador_principal.docx
@@ -4908,9 +4908,9 @@
           <w:noProof/>
         </w:rPr>
         <w:drawing>
-          <wp:inline distT="0" distB="0" distL="0" distR="0" wp14:anchorId="32AD5C31" wp14:editId="1EF6CC0A">
-            <wp:extent cx="5772150" cy="1009679"/>
-            <wp:effectExtent l="0" t="0" r="0" b="0"/>
+          <wp:inline distT="0" distB="0" distL="0" distR="0" wp14:anchorId="32AD5C31" wp14:editId="6792FE72">
+            <wp:extent cx="5766953" cy="1014019"/>
+            <wp:effectExtent l="0" t="0" r="5715" b="0"/>
             <wp:docPr id="5" name="Imagem 5"/>
             <wp:cNvGraphicFramePr>
               <a:graphicFrameLocks xmlns:a="http://schemas.openxmlformats.org/drawingml/2006/main" noChangeAspect="1"/>
@@ -4937,7 +4937,7 @@
                   <pic:spPr>
                     <a:xfrm>
                       <a:off x="0" y="0"/>
-                      <a:ext cx="5796962" cy="1014019"/>
+                      <a:ext cx="5766953" cy="1014019"/>
                     </a:xfrm>
                     <a:prstGeom prst="rect">
                       <a:avLst/>
@@ -4971,8 +4971,8 @@
           <w:noProof/>
         </w:rPr>
         <w:drawing>
-          <wp:inline distT="0" distB="0" distL="0" distR="0" wp14:anchorId="5A0A9D17" wp14:editId="5CF45672">
-            <wp:extent cx="5760720" cy="654685"/>
+          <wp:inline distT="0" distB="0" distL="0" distR="0" wp14:anchorId="5A0A9D17" wp14:editId="25F20DE9">
+            <wp:extent cx="5754102" cy="654685"/>
             <wp:effectExtent l="0" t="0" r="0" b="0"/>
             <wp:docPr id="6" name="Imagem 6"/>
             <wp:cNvGraphicFramePr>
@@ -5000,7 +5000,7 @@
                   <pic:spPr>
                     <a:xfrm>
                       <a:off x="0" y="0"/>
-                      <a:ext cx="5760720" cy="654685"/>
+                      <a:ext cx="5754102" cy="654685"/>
                     </a:xfrm>
                     <a:prstGeom prst="rect">
                       <a:avLst/>
@@ -5343,191 +5343,474 @@
           <w:b/>
           <w:bCs/>
         </w:rPr>
-        <w:t>LABORATÓRIOS</w:t>
-      </w:r>
-      <w:r>
+        <w:t>LABORATÓRIOS:</w:t>
+      </w:r>
+    </w:p>
+    <w:p/>
+    <w:p>
+      <w:r>
+        <w:t xml:space="preserve">CREATE TABLE </w:t>
+      </w:r>
+      <w:proofErr w:type="spellStart"/>
+      <w:r>
+        <w:t>laboratorio</w:t>
+      </w:r>
+      <w:proofErr w:type="spellEnd"/>
+      <w:r>
+        <w:t xml:space="preserve"> (</w:t>
+      </w:r>
+    </w:p>
+    <w:p>
+      <w:r>
+        <w:t xml:space="preserve">    </w:t>
+      </w:r>
+      <w:proofErr w:type="spellStart"/>
+      <w:r>
+        <w:t>id_laboratorio</w:t>
+      </w:r>
+      <w:proofErr w:type="spellEnd"/>
+      <w:r>
+        <w:t xml:space="preserve"> SERIAL PRIMARY KEY,</w:t>
+      </w:r>
+    </w:p>
+    <w:p>
+      <w:r>
+        <w:t xml:space="preserve">    </w:t>
+      </w:r>
+      <w:proofErr w:type="spellStart"/>
+      <w:r>
+        <w:t>numero_laboratorio</w:t>
+      </w:r>
+      <w:proofErr w:type="spellEnd"/>
+      <w:r>
+        <w:t xml:space="preserve"> INTEGER NOT NULL,</w:t>
+      </w:r>
+    </w:p>
+    <w:p>
+      <w:r>
+        <w:lastRenderedPageBreak/>
+        <w:t xml:space="preserve">    </w:t>
+      </w:r>
+      <w:proofErr w:type="spellStart"/>
+      <w:r>
+        <w:t>qtde_computador</w:t>
+      </w:r>
+      <w:proofErr w:type="spellEnd"/>
+      <w:r>
+        <w:t xml:space="preserve"> INTEGER NOT NULL,</w:t>
+      </w:r>
+    </w:p>
+    <w:p>
+      <w:r>
+        <w:t xml:space="preserve">    </w:t>
+      </w:r>
+      <w:proofErr w:type="spellStart"/>
+      <w:r>
+        <w:t>capacidade_max_aluno</w:t>
+      </w:r>
+      <w:proofErr w:type="spellEnd"/>
+      <w:r>
+        <w:t xml:space="preserve"> INTEGER NOT NULL,</w:t>
+      </w:r>
+    </w:p>
+    <w:p>
+      <w:pPr>
+        <w:rPr>
+          <w:lang w:val="en-US"/>
+        </w:rPr>
+      </w:pPr>
+      <w:r>
+        <w:t xml:space="preserve">    </w:t>
+      </w:r>
+      <w:proofErr w:type="spellStart"/>
+      <w:r>
+        <w:rPr>
+          <w:lang w:val="en-US"/>
+        </w:rPr>
+        <w:t>bloco</w:t>
+      </w:r>
+      <w:proofErr w:type="spellEnd"/>
+      <w:r>
+        <w:rPr>
+          <w:lang w:val="en-US"/>
+        </w:rPr>
+        <w:t xml:space="preserve"> </w:t>
+      </w:r>
+      <w:proofErr w:type="gramStart"/>
+      <w:r>
+        <w:rPr>
+          <w:lang w:val="en-US"/>
+        </w:rPr>
+        <w:t>CHAR(</w:t>
+      </w:r>
+      <w:proofErr w:type="gramEnd"/>
+      <w:r>
+        <w:rPr>
+          <w:lang w:val="en-US"/>
+        </w:rPr>
+        <w:t>2) NOT NULL</w:t>
+      </w:r>
+    </w:p>
+    <w:p>
+      <w:pPr>
+        <w:rPr>
+          <w:lang w:val="en-US"/>
+        </w:rPr>
+      </w:pPr>
+      <w:r>
+        <w:rPr>
+          <w:lang w:val="en-US"/>
+        </w:rPr>
+        <w:t>);</w:t>
+      </w:r>
+    </w:p>
+    <w:p>
+      <w:pPr>
         <w:rPr>
           <w:b/>
           <w:bCs/>
-        </w:rPr>
-        <w:t>:</w:t>
-      </w:r>
-    </w:p>
-    <w:p/>
-    <w:p>
-      <w:r>
-        <w:t xml:space="preserve">CREATE TABLE </w:t>
-      </w:r>
-      <w:proofErr w:type="spellStart"/>
-      <w:r>
-        <w:t>laboratorio</w:t>
-      </w:r>
-      <w:proofErr w:type="spellEnd"/>
-      <w:r>
-        <w:t xml:space="preserve"> (</w:t>
-      </w:r>
-    </w:p>
-    <w:p>
-      <w:r>
-        <w:t xml:space="preserve">    </w:t>
-      </w:r>
-      <w:proofErr w:type="spellStart"/>
-      <w:r>
-        <w:t>id_laboratorio</w:t>
-      </w:r>
-      <w:proofErr w:type="spellEnd"/>
-      <w:r>
-        <w:t xml:space="preserve"> SERIAL PRIMARY KEY,</w:t>
-      </w:r>
-    </w:p>
-    <w:p>
-      <w:r>
-        <w:t xml:space="preserve">    </w:t>
-      </w:r>
-      <w:proofErr w:type="spellStart"/>
-      <w:r>
-        <w:t>numero_laboratorio</w:t>
-      </w:r>
-      <w:proofErr w:type="spellEnd"/>
-      <w:r>
-        <w:t xml:space="preserve"> INTEGER NOT NULL,</w:t>
-      </w:r>
-    </w:p>
-    <w:p>
-      <w:r>
-        <w:lastRenderedPageBreak/>
-        <w:t xml:space="preserve">    </w:t>
-      </w:r>
-      <w:proofErr w:type="spellStart"/>
-      <w:r>
-        <w:t>qtde_computador</w:t>
-      </w:r>
-      <w:proofErr w:type="spellEnd"/>
-      <w:r>
-        <w:t xml:space="preserve"> INTEGER NOT NULL,</w:t>
-      </w:r>
-    </w:p>
-    <w:p>
-      <w:r>
-        <w:t xml:space="preserve">    </w:t>
-      </w:r>
-      <w:proofErr w:type="spellStart"/>
-      <w:r>
-        <w:t>capacidade_max_aluno</w:t>
-      </w:r>
-      <w:proofErr w:type="spellEnd"/>
-      <w:r>
-        <w:t xml:space="preserve"> INTEGER NOT NULL,</w:t>
-      </w:r>
-    </w:p>
-    <w:p>
-      <w:pPr>
-        <w:rPr>
-          <w:lang w:val="en-US"/>
-        </w:rPr>
-      </w:pPr>
-      <w:r>
-        <w:t xml:space="preserve">    </w:t>
-      </w:r>
-      <w:proofErr w:type="spellStart"/>
-      <w:r>
-        <w:rPr>
-          <w:lang w:val="en-US"/>
-        </w:rPr>
-        <w:t>bloco</w:t>
-      </w:r>
-      <w:proofErr w:type="spellEnd"/>
-      <w:r>
-        <w:rPr>
-          <w:lang w:val="en-US"/>
-        </w:rPr>
-        <w:t xml:space="preserve"> </w:t>
-      </w:r>
-      <w:proofErr w:type="gramStart"/>
-      <w:r>
-        <w:rPr>
-          <w:lang w:val="en-US"/>
-        </w:rPr>
-        <w:t>CHAR(</w:t>
-      </w:r>
-      <w:proofErr w:type="gramEnd"/>
-      <w:r>
-        <w:rPr>
-          <w:lang w:val="en-US"/>
-        </w:rPr>
-        <w:t>2) NOT NULL</w:t>
-      </w:r>
-    </w:p>
-    <w:p>
-      <w:pPr>
-        <w:rPr>
-          <w:lang w:val="en-US"/>
-        </w:rPr>
-      </w:pPr>
-      <w:r>
-        <w:rPr>
-          <w:lang w:val="en-US"/>
-        </w:rPr>
-        <w:t>);</w:t>
-      </w:r>
-    </w:p>
-    <w:p>
-      <w:pPr>
+          <w:lang w:val="en-US"/>
+        </w:rPr>
+      </w:pPr>
+      <w:r>
         <w:rPr>
           <w:b/>
           <w:bCs/>
           <w:lang w:val="en-US"/>
         </w:rPr>
-      </w:pPr>
-      <w:r>
+        <w:t>USUÁRIO:</w:t>
+      </w:r>
+    </w:p>
+    <w:p>
+      <w:pPr>
+        <w:rPr>
+          <w:lang w:val="en-US"/>
+        </w:rPr>
+      </w:pPr>
+    </w:p>
+    <w:p>
+      <w:pPr>
+        <w:rPr>
+          <w:lang w:val="en-US"/>
+        </w:rPr>
+      </w:pPr>
+      <w:r>
+        <w:rPr>
+          <w:lang w:val="en-US"/>
+        </w:rPr>
+        <w:t xml:space="preserve">CREATE TABLE </w:t>
+      </w:r>
+      <w:proofErr w:type="spellStart"/>
+      <w:r>
+        <w:rPr>
+          <w:lang w:val="en-US"/>
+        </w:rPr>
+        <w:t>usuario</w:t>
+      </w:r>
+      <w:proofErr w:type="spellEnd"/>
+      <w:r>
+        <w:rPr>
+          <w:lang w:val="en-US"/>
+        </w:rPr>
+        <w:t xml:space="preserve"> (</w:t>
+      </w:r>
+    </w:p>
+    <w:p>
+      <w:pPr>
+        <w:rPr>
+          <w:lang w:val="en-US"/>
+        </w:rPr>
+      </w:pPr>
+      <w:r>
+        <w:rPr>
+          <w:lang w:val="en-US"/>
+        </w:rPr>
+        <w:t xml:space="preserve">    </w:t>
+      </w:r>
+      <w:proofErr w:type="spellStart"/>
+      <w:r>
+        <w:rPr>
+          <w:lang w:val="en-US"/>
+        </w:rPr>
+        <w:t>id_usuario</w:t>
+      </w:r>
+      <w:proofErr w:type="spellEnd"/>
+      <w:r>
+        <w:rPr>
+          <w:lang w:val="en-US"/>
+        </w:rPr>
+        <w:t xml:space="preserve"> SERIAL PRIMARY KEY,</w:t>
+      </w:r>
+    </w:p>
+    <w:p>
+      <w:pPr>
+        <w:rPr>
+          <w:lang w:val="en-US"/>
+        </w:rPr>
+      </w:pPr>
+      <w:r>
+        <w:rPr>
+          <w:lang w:val="en-US"/>
+        </w:rPr>
+        <w:t xml:space="preserve">    re INTEGER NOT NULL UNIQUE,</w:t>
+      </w:r>
+    </w:p>
+    <w:p>
+      <w:pPr>
+        <w:rPr>
+          <w:lang w:val="en-US"/>
+        </w:rPr>
+      </w:pPr>
+      <w:r>
+        <w:rPr>
+          <w:lang w:val="en-US"/>
+        </w:rPr>
+        <w:t xml:space="preserve">    </w:t>
+      </w:r>
+      <w:proofErr w:type="spellStart"/>
+      <w:r>
+        <w:rPr>
+          <w:lang w:val="en-US"/>
+        </w:rPr>
+        <w:t>nome</w:t>
+      </w:r>
+      <w:proofErr w:type="spellEnd"/>
+      <w:r>
+        <w:rPr>
+          <w:lang w:val="en-US"/>
+        </w:rPr>
+        <w:t xml:space="preserve"> </w:t>
+      </w:r>
+      <w:proofErr w:type="gramStart"/>
+      <w:r>
+        <w:rPr>
+          <w:lang w:val="en-US"/>
+        </w:rPr>
+        <w:t>VARCHAR(</w:t>
+      </w:r>
+      <w:proofErr w:type="gramEnd"/>
+      <w:r>
+        <w:rPr>
+          <w:lang w:val="en-US"/>
+        </w:rPr>
+        <w:t>50</w:t>
+      </w:r>
+      <w:r>
+        <w:rPr>
+          <w:lang w:val="en-US"/>
+        </w:rPr>
+        <w:t>) NOT NULL,</w:t>
+      </w:r>
+    </w:p>
+    <w:p>
+      <w:pPr>
+        <w:rPr>
+          <w:lang w:val="en-US"/>
+        </w:rPr>
+      </w:pPr>
+      <w:r>
+        <w:rPr>
+          <w:lang w:val="en-US"/>
+        </w:rPr>
+        <w:t xml:space="preserve">    </w:t>
+      </w:r>
+      <w:proofErr w:type="spellStart"/>
+      <w:r>
+        <w:rPr>
+          <w:lang w:val="en-US"/>
+        </w:rPr>
+        <w:t>senha</w:t>
+      </w:r>
+      <w:proofErr w:type="spellEnd"/>
+      <w:r>
+        <w:rPr>
+          <w:lang w:val="en-US"/>
+        </w:rPr>
+        <w:t xml:space="preserve"> </w:t>
+      </w:r>
+      <w:proofErr w:type="gramStart"/>
+      <w:r>
+        <w:rPr>
+          <w:lang w:val="en-US"/>
+        </w:rPr>
+        <w:t>VARCHAR(</w:t>
+      </w:r>
+      <w:proofErr w:type="gramEnd"/>
+      <w:r>
+        <w:rPr>
+          <w:lang w:val="en-US"/>
+        </w:rPr>
+        <w:t>8</w:t>
+      </w:r>
+      <w:r>
+        <w:rPr>
+          <w:lang w:val="en-US"/>
+        </w:rPr>
+        <w:t>) NOT NULL,</w:t>
+      </w:r>
+    </w:p>
+    <w:p>
+      <w:pPr>
+        <w:rPr>
+          <w:lang w:val="en-US"/>
+        </w:rPr>
+      </w:pPr>
+      <w:r>
+        <w:rPr>
+          <w:lang w:val="en-US"/>
+        </w:rPr>
+        <w:t xml:space="preserve">    </w:t>
+      </w:r>
+      <w:proofErr w:type="spellStart"/>
+      <w:r>
+        <w:rPr>
+          <w:lang w:val="en-US"/>
+        </w:rPr>
+        <w:t>tipo_usuario</w:t>
+      </w:r>
+      <w:proofErr w:type="spellEnd"/>
+      <w:r>
+        <w:rPr>
+          <w:lang w:val="en-US"/>
+        </w:rPr>
+        <w:t xml:space="preserve"> </w:t>
+      </w:r>
+      <w:proofErr w:type="gramStart"/>
+      <w:r>
+        <w:rPr>
+          <w:lang w:val="en-US"/>
+        </w:rPr>
+        <w:t>VARCHAR(</w:t>
+      </w:r>
+      <w:proofErr w:type="gramEnd"/>
+      <w:r>
+        <w:rPr>
+          <w:lang w:val="en-US"/>
+        </w:rPr>
+        <w:t>30</w:t>
+      </w:r>
+      <w:r>
+        <w:rPr>
+          <w:lang w:val="en-US"/>
+        </w:rPr>
+        <w:t>) NOT NULL,</w:t>
+      </w:r>
+    </w:p>
+    <w:p>
+      <w:pPr>
+        <w:rPr>
+          <w:lang w:val="en-US"/>
+        </w:rPr>
+      </w:pPr>
+      <w:r>
+        <w:rPr>
+          <w:lang w:val="en-US"/>
+        </w:rPr>
+        <w:t xml:space="preserve">   email </w:t>
+      </w:r>
+      <w:proofErr w:type="gramStart"/>
+      <w:r>
+        <w:rPr>
+          <w:lang w:val="en-US"/>
+        </w:rPr>
+        <w:t>VARCHAR(</w:t>
+      </w:r>
+      <w:proofErr w:type="gramEnd"/>
+      <w:r>
+        <w:rPr>
+          <w:lang w:val="en-US"/>
+        </w:rPr>
+        <w:t>20) NOT NULL,</w:t>
+      </w:r>
+      <w:r>
+        <w:rPr>
+          <w:lang w:val="en-US"/>
+        </w:rPr>
+        <w:tab/>
+      </w:r>
+    </w:p>
+    <w:p>
+      <w:pPr>
+        <w:rPr>
+          <w:lang w:val="en-US"/>
+        </w:rPr>
+      </w:pPr>
+      <w:r>
+        <w:rPr>
+          <w:lang w:val="en-US"/>
+        </w:rPr>
+        <w:t>);</w:t>
+      </w:r>
+    </w:p>
+    <w:p>
+      <w:pPr>
+        <w:rPr>
+          <w:lang w:val="en-US"/>
+        </w:rPr>
+      </w:pPr>
+    </w:p>
+    <w:p>
+      <w:pPr>
         <w:rPr>
           <w:b/>
           <w:bCs/>
           <w:lang w:val="en-US"/>
         </w:rPr>
-        <w:t>USUÁRIO</w:t>
-      </w:r>
+      </w:pPr>
       <w:r>
         <w:rPr>
           <w:b/>
           <w:bCs/>
           <w:lang w:val="en-US"/>
         </w:rPr>
-        <w:t>:</w:t>
-      </w:r>
-    </w:p>
-    <w:p>
-      <w:pPr>
-        <w:rPr>
-          <w:lang w:val="en-US"/>
-        </w:rPr>
-      </w:pPr>
-    </w:p>
-    <w:p>
-      <w:pPr>
-        <w:rPr>
-          <w:lang w:val="en-US"/>
-        </w:rPr>
-      </w:pPr>
-      <w:r>
-        <w:rPr>
-          <w:lang w:val="en-US"/>
-        </w:rPr>
-        <w:t xml:space="preserve">CREATE TABLE </w:t>
+        <w:t>SOFTWARE:</w:t>
+      </w:r>
+    </w:p>
+    <w:p>
+      <w:pPr>
+        <w:rPr>
+          <w:lang w:val="en-US"/>
+        </w:rPr>
+      </w:pPr>
+    </w:p>
+    <w:p>
+      <w:pPr>
+        <w:rPr>
+          <w:lang w:val="en-US"/>
+        </w:rPr>
+      </w:pPr>
+      <w:r>
+        <w:rPr>
+          <w:lang w:val="en-US"/>
+        </w:rPr>
+        <w:t>CREATE TABLE software (</w:t>
+      </w:r>
+    </w:p>
+    <w:p>
+      <w:pPr>
+        <w:rPr>
+          <w:lang w:val="en-US"/>
+        </w:rPr>
+      </w:pPr>
+      <w:r>
+        <w:rPr>
+          <w:lang w:val="en-US"/>
+        </w:rPr>
+        <w:t xml:space="preserve">    </w:t>
       </w:r>
       <w:proofErr w:type="spellStart"/>
       <w:r>
         <w:rPr>
           <w:lang w:val="en-US"/>
         </w:rPr>
-        <w:t>usuario</w:t>
+        <w:t>id_software</w:t>
       </w:r>
       <w:proofErr w:type="spellEnd"/>
       <w:r>
         <w:rPr>
           <w:lang w:val="en-US"/>
         </w:rPr>
-        <w:t xml:space="preserve"> (</w:t>
+        <w:t xml:space="preserve"> SERIAL PRIMARY KEY,</w:t>
       </w:r>
     </w:p>
     <w:p>
@@ -5547,35 +5830,37 @@
         <w:rPr>
           <w:lang w:val="en-US"/>
         </w:rPr>
-        <w:t>id_usuario</w:t>
+        <w:t>nome_software</w:t>
       </w:r>
       <w:proofErr w:type="spellEnd"/>
       <w:r>
         <w:rPr>
           <w:lang w:val="en-US"/>
         </w:rPr>
-        <w:t xml:space="preserve"> SERIAL PRIMARY KEY,</w:t>
-      </w:r>
-    </w:p>
-    <w:p>
-      <w:pPr>
-        <w:rPr>
-          <w:lang w:val="en-US"/>
-        </w:rPr>
-      </w:pPr>
-      <w:r>
-        <w:rPr>
-          <w:lang w:val="en-US"/>
-        </w:rPr>
-        <w:t xml:space="preserve">    re INTEGER NOT NULL UNIQUE,</w:t>
-      </w:r>
-    </w:p>
-    <w:p>
-      <w:pPr>
-        <w:rPr>
-          <w:lang w:val="en-US"/>
-        </w:rPr>
-      </w:pPr>
+        <w:t xml:space="preserve"> </w:t>
+      </w:r>
+      <w:proofErr w:type="gramStart"/>
+      <w:r>
+        <w:rPr>
+          <w:lang w:val="en-US"/>
+        </w:rPr>
+        <w:t>VARCHAR(</w:t>
+      </w:r>
+      <w:proofErr w:type="gramEnd"/>
+      <w:r>
+        <w:rPr>
+          <w:lang w:val="en-US"/>
+        </w:rPr>
+        <w:t>50</w:t>
+      </w:r>
+      <w:r>
+        <w:rPr>
+          <w:lang w:val="en-US"/>
+        </w:rPr>
+        <w:t>) NOT NULL,</w:t>
+      </w:r>
+    </w:p>
+    <w:p>
       <w:r>
         <w:rPr>
           <w:lang w:val="en-US"/>
@@ -5584,606 +5869,283 @@
       </w:r>
       <w:proofErr w:type="spellStart"/>
       <w:r>
-        <w:rPr>
-          <w:lang w:val="en-US"/>
-        </w:rPr>
-        <w:t>nome</w:t>
+        <w:t>versao</w:t>
       </w:r>
       <w:proofErr w:type="spellEnd"/>
       <w:r>
-        <w:rPr>
-          <w:lang w:val="en-US"/>
-        </w:rPr>
         <w:t xml:space="preserve"> </w:t>
       </w:r>
       <w:proofErr w:type="gramStart"/>
       <w:r>
-        <w:rPr>
-          <w:lang w:val="en-US"/>
-        </w:rPr>
         <w:t>VARCHAR(</w:t>
       </w:r>
       <w:proofErr w:type="gramEnd"/>
       <w:r>
-        <w:rPr>
-          <w:lang w:val="en-US"/>
-        </w:rPr>
-        <w:t>50</w:t>
-      </w:r>
-      <w:r>
-        <w:rPr>
-          <w:lang w:val="en-US"/>
-        </w:rPr>
-        <w:t>) NOT NULL,</w:t>
-      </w:r>
-    </w:p>
-    <w:p>
-      <w:pPr>
-        <w:rPr>
-          <w:lang w:val="en-US"/>
-        </w:rPr>
-      </w:pPr>
-      <w:r>
-        <w:rPr>
-          <w:lang w:val="en-US"/>
-        </w:rPr>
-        <w:t xml:space="preserve">    </w:t>
-      </w:r>
-      <w:proofErr w:type="spellStart"/>
-      <w:r>
-        <w:rPr>
-          <w:lang w:val="en-US"/>
-        </w:rPr>
-        <w:t>senha</w:t>
-      </w:r>
-      <w:proofErr w:type="spellEnd"/>
-      <w:r>
-        <w:rPr>
-          <w:lang w:val="en-US"/>
-        </w:rPr>
-        <w:t xml:space="preserve"> </w:t>
-      </w:r>
-      <w:proofErr w:type="gramStart"/>
-      <w:r>
-        <w:rPr>
-          <w:lang w:val="en-US"/>
-        </w:rPr>
-        <w:t>VARCHAR(</w:t>
-      </w:r>
-      <w:proofErr w:type="gramEnd"/>
-      <w:r>
-        <w:rPr>
-          <w:lang w:val="en-US"/>
-        </w:rPr>
-        <w:t>8</w:t>
-      </w:r>
-      <w:r>
-        <w:rPr>
-          <w:lang w:val="en-US"/>
-        </w:rPr>
-        <w:t>) NOT NULL,</w:t>
-      </w:r>
-    </w:p>
-    <w:p>
-      <w:pPr>
-        <w:rPr>
-          <w:lang w:val="en-US"/>
-        </w:rPr>
-      </w:pPr>
-      <w:r>
-        <w:rPr>
-          <w:lang w:val="en-US"/>
-        </w:rPr>
-        <w:t xml:space="preserve">    </w:t>
-      </w:r>
-      <w:proofErr w:type="spellStart"/>
-      <w:r>
-        <w:rPr>
-          <w:lang w:val="en-US"/>
-        </w:rPr>
-        <w:t>tipo_usuario</w:t>
-      </w:r>
-      <w:proofErr w:type="spellEnd"/>
-      <w:r>
-        <w:rPr>
-          <w:lang w:val="en-US"/>
-        </w:rPr>
-        <w:t xml:space="preserve"> </w:t>
-      </w:r>
-      <w:proofErr w:type="gramStart"/>
-      <w:r>
-        <w:rPr>
-          <w:lang w:val="en-US"/>
-        </w:rPr>
-        <w:t>VARCHAR(</w:t>
-      </w:r>
-      <w:proofErr w:type="gramEnd"/>
-      <w:r>
-        <w:rPr>
-          <w:lang w:val="en-US"/>
-        </w:rPr>
         <w:t>30</w:t>
       </w:r>
       <w:r>
-        <w:rPr>
-          <w:lang w:val="en-US"/>
-        </w:rPr>
-        <w:t>) NOT NULL,</w:t>
-      </w:r>
-    </w:p>
-    <w:p>
-      <w:pPr>
-        <w:rPr>
-          <w:lang w:val="en-US"/>
-        </w:rPr>
-      </w:pPr>
-      <w:r>
-        <w:rPr>
-          <w:lang w:val="en-US"/>
-        </w:rPr>
-        <w:t xml:space="preserve">   email </w:t>
-      </w:r>
-      <w:proofErr w:type="gramStart"/>
-      <w:r>
-        <w:rPr>
-          <w:lang w:val="en-US"/>
-        </w:rPr>
-        <w:t>VARCHAR(</w:t>
-      </w:r>
-      <w:proofErr w:type="gramEnd"/>
-      <w:r>
-        <w:rPr>
-          <w:lang w:val="en-US"/>
-        </w:rPr>
-        <w:t>20) NOT NULL,</w:t>
-      </w:r>
-      <w:r>
-        <w:rPr>
-          <w:lang w:val="en-US"/>
-        </w:rPr>
-        <w:tab/>
-      </w:r>
-    </w:p>
-    <w:p>
-      <w:pPr>
-        <w:rPr>
-          <w:lang w:val="en-US"/>
-        </w:rPr>
-      </w:pPr>
-      <w:r>
-        <w:rPr>
-          <w:lang w:val="en-US"/>
-        </w:rPr>
+        <w:t>) NOT NULL</w:t>
+      </w:r>
+    </w:p>
+    <w:p>
+      <w:r>
         <w:t>);</w:t>
       </w:r>
     </w:p>
-    <w:p>
-      <w:pPr>
-        <w:rPr>
-          <w:lang w:val="en-US"/>
-        </w:rPr>
-      </w:pPr>
-    </w:p>
+    <w:p/>
     <w:p>
       <w:pPr>
         <w:rPr>
           <w:b/>
           <w:bCs/>
-          <w:lang w:val="en-US"/>
         </w:rPr>
       </w:pPr>
       <w:r>
         <w:rPr>
           <w:b/>
           <w:bCs/>
-          <w:lang w:val="en-US"/>
-        </w:rPr>
-        <w:t>SOFTWARE</w:t>
-      </w:r>
-      <w:r>
+        </w:rPr>
+        <w:t>DISCIPLINA:</w:t>
+      </w:r>
+    </w:p>
+    <w:p/>
+    <w:p>
+      <w:r>
+        <w:t>CREATE TABLE disciplina (</w:t>
+      </w:r>
+    </w:p>
+    <w:p>
+      <w:r>
+        <w:t xml:space="preserve">    </w:t>
+      </w:r>
+      <w:proofErr w:type="spellStart"/>
+      <w:r>
+        <w:t>id_disciplina</w:t>
+      </w:r>
+      <w:proofErr w:type="spellEnd"/>
+      <w:r>
+        <w:t xml:space="preserve"> SERIAL PRIMARY KEY,</w:t>
+      </w:r>
+    </w:p>
+    <w:p>
+      <w:r>
+        <w:t xml:space="preserve">    </w:t>
+      </w:r>
+      <w:proofErr w:type="spellStart"/>
+      <w:r>
+        <w:t>nome_disciplina</w:t>
+      </w:r>
+      <w:proofErr w:type="spellEnd"/>
+      <w:r>
+        <w:t xml:space="preserve"> </w:t>
+      </w:r>
+      <w:proofErr w:type="gramStart"/>
+      <w:r>
+        <w:t>VARCHAR(</w:t>
+      </w:r>
+      <w:proofErr w:type="gramEnd"/>
+      <w:r>
+        <w:t>50</w:t>
+      </w:r>
+      <w:r>
+        <w:t>) NOT NULL,</w:t>
+      </w:r>
+    </w:p>
+    <w:p>
+      <w:pPr>
+        <w:rPr>
+          <w:lang w:val="en-US"/>
+        </w:rPr>
+      </w:pPr>
+      <w:r>
+        <w:t xml:space="preserve">    </w:t>
+      </w:r>
+      <w:proofErr w:type="spellStart"/>
+      <w:r>
+        <w:rPr>
+          <w:lang w:val="en-US"/>
+        </w:rPr>
+        <w:t>id_usuario</w:t>
+      </w:r>
+      <w:proofErr w:type="spellEnd"/>
+      <w:r>
+        <w:rPr>
+          <w:lang w:val="en-US"/>
+        </w:rPr>
+        <w:t xml:space="preserve"> INTEGER NOT NULL,</w:t>
+      </w:r>
+    </w:p>
+    <w:p>
+      <w:r>
+        <w:rPr>
+          <w:lang w:val="en-US"/>
+        </w:rPr>
+        <w:t xml:space="preserve">    </w:t>
+      </w:r>
+      <w:proofErr w:type="spellStart"/>
+      <w:r>
+        <w:t>qtde_alunos</w:t>
+      </w:r>
+      <w:proofErr w:type="spellEnd"/>
+      <w:r>
+        <w:t xml:space="preserve"> INTEGER NOT NULL,</w:t>
+      </w:r>
+    </w:p>
+    <w:p/>
+    <w:p>
+      <w:pPr>
+        <w:rPr>
+          <w:lang w:val="en-US"/>
+        </w:rPr>
+      </w:pPr>
+      <w:r>
+        <w:t xml:space="preserve">    </w:t>
+      </w:r>
+      <w:r>
+        <w:rPr>
+          <w:lang w:val="en-US"/>
+        </w:rPr>
+        <w:t xml:space="preserve">CONSTRAINT </w:t>
+      </w:r>
+      <w:proofErr w:type="spellStart"/>
+      <w:r>
+        <w:rPr>
+          <w:lang w:val="en-US"/>
+        </w:rPr>
+        <w:t>fk_disciplina_usuario</w:t>
+      </w:r>
+      <w:proofErr w:type="spellEnd"/>
+    </w:p>
+    <w:p>
+      <w:pPr>
+        <w:rPr>
+          <w:lang w:val="en-US"/>
+        </w:rPr>
+      </w:pPr>
+      <w:r>
+        <w:rPr>
+          <w:lang w:val="en-US"/>
+        </w:rPr>
+        <w:t xml:space="preserve">        FOREIGN KEY (</w:t>
+      </w:r>
+      <w:proofErr w:type="spellStart"/>
+      <w:r>
+        <w:rPr>
+          <w:lang w:val="en-US"/>
+        </w:rPr>
+        <w:t>id_usuario</w:t>
+      </w:r>
+      <w:proofErr w:type="spellEnd"/>
+      <w:r>
+        <w:rPr>
+          <w:lang w:val="en-US"/>
+        </w:rPr>
+        <w:t>)</w:t>
+      </w:r>
+    </w:p>
+    <w:p>
+      <w:pPr>
+        <w:rPr>
+          <w:lang w:val="en-US"/>
+        </w:rPr>
+      </w:pPr>
+      <w:r>
+        <w:rPr>
+          <w:lang w:val="en-US"/>
+        </w:rPr>
+        <w:t xml:space="preserve">        REFERENCES </w:t>
+      </w:r>
+      <w:proofErr w:type="spellStart"/>
+      <w:r>
+        <w:rPr>
+          <w:lang w:val="en-US"/>
+        </w:rPr>
+        <w:t>usuario</w:t>
+      </w:r>
+      <w:proofErr w:type="spellEnd"/>
+      <w:r>
+        <w:rPr>
+          <w:lang w:val="en-US"/>
+        </w:rPr>
+        <w:t>(</w:t>
+      </w:r>
+      <w:proofErr w:type="spellStart"/>
+      <w:r>
+        <w:rPr>
+          <w:lang w:val="en-US"/>
+        </w:rPr>
+        <w:t>id_usuario</w:t>
+      </w:r>
+      <w:proofErr w:type="spellEnd"/>
+      <w:r>
+        <w:rPr>
+          <w:lang w:val="en-US"/>
+        </w:rPr>
+        <w:t>)</w:t>
+      </w:r>
+    </w:p>
+    <w:p>
+      <w:pPr>
+        <w:rPr>
+          <w:lang w:val="en-US"/>
+        </w:rPr>
+      </w:pPr>
+      <w:r>
+        <w:rPr>
+          <w:lang w:val="en-US"/>
+        </w:rPr>
+        <w:lastRenderedPageBreak/>
+        <w:t xml:space="preserve">        ON UPDATE CASCADE</w:t>
+      </w:r>
+    </w:p>
+    <w:p>
+      <w:pPr>
+        <w:rPr>
+          <w:lang w:val="en-US"/>
+        </w:rPr>
+      </w:pPr>
+      <w:r>
+        <w:rPr>
+          <w:lang w:val="en-US"/>
+        </w:rPr>
+        <w:t xml:space="preserve">        ON DELETE RESTRICT</w:t>
+      </w:r>
+    </w:p>
+    <w:p>
+      <w:pPr>
+        <w:rPr>
+          <w:lang w:val="en-US"/>
+        </w:rPr>
+      </w:pPr>
+      <w:r>
+        <w:rPr>
+          <w:lang w:val="en-US"/>
+        </w:rPr>
+        <w:t>);</w:t>
+      </w:r>
+    </w:p>
+    <w:p>
+      <w:pPr>
+        <w:rPr>
+          <w:lang w:val="en-US"/>
+        </w:rPr>
+      </w:pPr>
+    </w:p>
+    <w:p>
+      <w:pPr>
         <w:rPr>
           <w:b/>
           <w:bCs/>
           <w:lang w:val="en-US"/>
         </w:rPr>
-        <w:t>:</w:t>
-      </w:r>
-    </w:p>
-    <w:p>
-      <w:pPr>
-        <w:rPr>
-          <w:lang w:val="en-US"/>
-        </w:rPr>
-      </w:pPr>
-    </w:p>
-    <w:p>
-      <w:pPr>
-        <w:rPr>
-          <w:lang w:val="en-US"/>
-        </w:rPr>
-      </w:pPr>
-      <w:r>
-        <w:rPr>
-          <w:lang w:val="en-US"/>
-        </w:rPr>
-        <w:t>CREATE TABLE software (</w:t>
-      </w:r>
-    </w:p>
-    <w:p>
-      <w:pPr>
-        <w:rPr>
-          <w:lang w:val="en-US"/>
-        </w:rPr>
-      </w:pPr>
-      <w:r>
-        <w:rPr>
-          <w:lang w:val="en-US"/>
-        </w:rPr>
-        <w:t xml:space="preserve">    </w:t>
-      </w:r>
-      <w:proofErr w:type="spellStart"/>
-      <w:r>
-        <w:rPr>
-          <w:lang w:val="en-US"/>
-        </w:rPr>
-        <w:t>id_software</w:t>
-      </w:r>
-      <w:proofErr w:type="spellEnd"/>
-      <w:r>
-        <w:rPr>
-          <w:lang w:val="en-US"/>
-        </w:rPr>
-        <w:t xml:space="preserve"> SERIAL PRIMARY KEY,</w:t>
-      </w:r>
-    </w:p>
-    <w:p>
-      <w:pPr>
-        <w:rPr>
-          <w:lang w:val="en-US"/>
-        </w:rPr>
-      </w:pPr>
-      <w:r>
-        <w:rPr>
-          <w:lang w:val="en-US"/>
-        </w:rPr>
-        <w:t xml:space="preserve">    </w:t>
-      </w:r>
-      <w:proofErr w:type="spellStart"/>
-      <w:r>
-        <w:rPr>
-          <w:lang w:val="en-US"/>
-        </w:rPr>
-        <w:t>nome_software</w:t>
-      </w:r>
-      <w:proofErr w:type="spellEnd"/>
-      <w:r>
-        <w:rPr>
-          <w:lang w:val="en-US"/>
-        </w:rPr>
-        <w:t xml:space="preserve"> </w:t>
-      </w:r>
-      <w:proofErr w:type="gramStart"/>
-      <w:r>
-        <w:rPr>
-          <w:lang w:val="en-US"/>
-        </w:rPr>
-        <w:t>VARCHAR(</w:t>
-      </w:r>
-      <w:proofErr w:type="gramEnd"/>
-      <w:r>
-        <w:rPr>
-          <w:lang w:val="en-US"/>
-        </w:rPr>
-        <w:t>50</w:t>
-      </w:r>
-      <w:r>
-        <w:rPr>
-          <w:lang w:val="en-US"/>
-        </w:rPr>
-        <w:t>) NOT NULL,</w:t>
-      </w:r>
-    </w:p>
-    <w:p>
-      <w:r>
-        <w:rPr>
-          <w:lang w:val="en-US"/>
-        </w:rPr>
-        <w:t xml:space="preserve">    </w:t>
-      </w:r>
-      <w:proofErr w:type="spellStart"/>
-      <w:r>
-        <w:t>versao</w:t>
-      </w:r>
-      <w:proofErr w:type="spellEnd"/>
-      <w:r>
-        <w:t xml:space="preserve"> </w:t>
-      </w:r>
-      <w:proofErr w:type="gramStart"/>
-      <w:r>
-        <w:t>VARCHAR(</w:t>
-      </w:r>
-      <w:proofErr w:type="gramEnd"/>
-      <w:r>
-        <w:t>30</w:t>
-      </w:r>
-      <w:r>
-        <w:t>) NOT NULL</w:t>
-      </w:r>
-    </w:p>
-    <w:p>
-      <w:r>
-        <w:t>);</w:t>
-      </w:r>
-    </w:p>
-    <w:p/>
-    <w:p>
-      <w:pPr>
+      </w:pPr>
+      <w:r>
         <w:rPr>
           <w:b/>
           <w:bCs/>
-        </w:rPr>
-      </w:pPr>
-      <w:r>
-        <w:rPr>
-          <w:b/>
-          <w:bCs/>
-        </w:rPr>
-        <w:t>DISCIPLINA</w:t>
-      </w:r>
-      <w:r>
-        <w:rPr>
-          <w:b/>
-          <w:bCs/>
-        </w:rPr>
-        <w:t>:</w:t>
-      </w:r>
-    </w:p>
-    <w:p/>
-    <w:p>
-      <w:r>
-        <w:t>CREATE TABLE disciplina (</w:t>
-      </w:r>
-    </w:p>
-    <w:p>
-      <w:r>
-        <w:t xml:space="preserve">    </w:t>
-      </w:r>
-      <w:proofErr w:type="spellStart"/>
-      <w:r>
-        <w:t>id_disciplina</w:t>
-      </w:r>
-      <w:proofErr w:type="spellEnd"/>
-      <w:r>
-        <w:t xml:space="preserve"> SERIAL PRIMARY KEY,</w:t>
-      </w:r>
-    </w:p>
-    <w:p>
-      <w:r>
-        <w:t xml:space="preserve">    </w:t>
-      </w:r>
-      <w:proofErr w:type="spellStart"/>
-      <w:r>
-        <w:t>nome_disciplina</w:t>
-      </w:r>
-      <w:proofErr w:type="spellEnd"/>
-      <w:r>
-        <w:t xml:space="preserve"> </w:t>
-      </w:r>
-      <w:proofErr w:type="gramStart"/>
-      <w:r>
-        <w:t>VARCHAR(</w:t>
-      </w:r>
-      <w:proofErr w:type="gramEnd"/>
-      <w:r>
-        <w:t>50</w:t>
-      </w:r>
-      <w:r>
-        <w:t>) NOT NULL,</w:t>
-      </w:r>
-    </w:p>
-    <w:p>
-      <w:pPr>
-        <w:rPr>
-          <w:lang w:val="en-US"/>
-        </w:rPr>
-      </w:pPr>
-      <w:r>
-        <w:t xml:space="preserve">    </w:t>
-      </w:r>
-      <w:proofErr w:type="spellStart"/>
-      <w:r>
-        <w:rPr>
-          <w:lang w:val="en-US"/>
-        </w:rPr>
-        <w:t>id_usuario</w:t>
-      </w:r>
-      <w:proofErr w:type="spellEnd"/>
-      <w:r>
-        <w:rPr>
-          <w:lang w:val="en-US"/>
-        </w:rPr>
-        <w:t xml:space="preserve"> INTEGER NOT NULL,</w:t>
-      </w:r>
-    </w:p>
-    <w:p>
-      <w:r>
-        <w:rPr>
-          <w:lang w:val="en-US"/>
-        </w:rPr>
-        <w:t xml:space="preserve">    </w:t>
-      </w:r>
-      <w:proofErr w:type="spellStart"/>
-      <w:r>
-        <w:t>qtde_alunos</w:t>
-      </w:r>
-      <w:proofErr w:type="spellEnd"/>
-      <w:r>
-        <w:t xml:space="preserve"> INTEGER NOT NULL,</w:t>
-      </w:r>
-    </w:p>
-    <w:p/>
-    <w:p>
-      <w:pPr>
-        <w:rPr>
-          <w:lang w:val="en-US"/>
-        </w:rPr>
-      </w:pPr>
-      <w:r>
-        <w:t xml:space="preserve">    </w:t>
-      </w:r>
-      <w:r>
-        <w:rPr>
-          <w:lang w:val="en-US"/>
-        </w:rPr>
-        <w:t xml:space="preserve">CONSTRAINT </w:t>
-      </w:r>
-      <w:proofErr w:type="spellStart"/>
-      <w:r>
-        <w:rPr>
-          <w:lang w:val="en-US"/>
-        </w:rPr>
-        <w:t>fk_disciplina_usuario</w:t>
-      </w:r>
-      <w:proofErr w:type="spellEnd"/>
-    </w:p>
-    <w:p>
-      <w:pPr>
-        <w:rPr>
-          <w:lang w:val="en-US"/>
-        </w:rPr>
-      </w:pPr>
-      <w:r>
-        <w:rPr>
-          <w:lang w:val="en-US"/>
-        </w:rPr>
-        <w:t xml:space="preserve">        FOREIGN KEY (</w:t>
-      </w:r>
-      <w:proofErr w:type="spellStart"/>
-      <w:r>
-        <w:rPr>
-          <w:lang w:val="en-US"/>
-        </w:rPr>
-        <w:t>id_usuario</w:t>
-      </w:r>
-      <w:proofErr w:type="spellEnd"/>
-      <w:r>
-        <w:rPr>
-          <w:lang w:val="en-US"/>
-        </w:rPr>
-        <w:t>)</w:t>
-      </w:r>
-    </w:p>
-    <w:p>
-      <w:pPr>
-        <w:rPr>
-          <w:lang w:val="en-US"/>
-        </w:rPr>
-      </w:pPr>
-      <w:r>
-        <w:rPr>
-          <w:lang w:val="en-US"/>
-        </w:rPr>
-        <w:t xml:space="preserve">        REFERENCES </w:t>
-      </w:r>
-      <w:proofErr w:type="spellStart"/>
-      <w:r>
-        <w:rPr>
-          <w:lang w:val="en-US"/>
-        </w:rPr>
-        <w:t>usuario</w:t>
-      </w:r>
-      <w:proofErr w:type="spellEnd"/>
-      <w:r>
-        <w:rPr>
-          <w:lang w:val="en-US"/>
-        </w:rPr>
-        <w:t>(</w:t>
-      </w:r>
-      <w:proofErr w:type="spellStart"/>
-      <w:r>
-        <w:rPr>
-          <w:lang w:val="en-US"/>
-        </w:rPr>
-        <w:t>id_usuario</w:t>
-      </w:r>
-      <w:proofErr w:type="spellEnd"/>
-      <w:r>
-        <w:rPr>
-          <w:lang w:val="en-US"/>
-        </w:rPr>
-        <w:t>)</w:t>
-      </w:r>
-    </w:p>
-    <w:p>
-      <w:pPr>
-        <w:rPr>
-          <w:lang w:val="en-US"/>
-        </w:rPr>
-      </w:pPr>
-      <w:r>
-        <w:rPr>
-          <w:lang w:val="en-US"/>
-        </w:rPr>
-        <w:lastRenderedPageBreak/>
-        <w:t xml:space="preserve">        ON UPDATE CASCADE</w:t>
-      </w:r>
-    </w:p>
-    <w:p>
-      <w:pPr>
-        <w:rPr>
-          <w:lang w:val="en-US"/>
-        </w:rPr>
-      </w:pPr>
-      <w:r>
-        <w:rPr>
-          <w:lang w:val="en-US"/>
-        </w:rPr>
-        <w:t xml:space="preserve">        ON DELETE RESTRICT</w:t>
-      </w:r>
-    </w:p>
-    <w:p>
-      <w:pPr>
-        <w:rPr>
-          <w:lang w:val="en-US"/>
-        </w:rPr>
-      </w:pPr>
-      <w:r>
-        <w:rPr>
-          <w:lang w:val="en-US"/>
-        </w:rPr>
-        <w:t>);</w:t>
-      </w:r>
-    </w:p>
-    <w:p>
-      <w:pPr>
-        <w:rPr>
-          <w:lang w:val="en-US"/>
-        </w:rPr>
-      </w:pPr>
-    </w:p>
-    <w:p>
-      <w:pPr>
-        <w:rPr>
-          <w:b/>
-          <w:bCs/>
-          <w:lang w:val="en-US"/>
-        </w:rPr>
-      </w:pPr>
-      <w:r>
-        <w:rPr>
-          <w:b/>
-          <w:bCs/>
-          <w:lang w:val="en-US"/>
-        </w:rPr>
-        <w:t>ALOCAÇÃO</w:t>
-      </w:r>
-      <w:r>
-        <w:rPr>
-          <w:b/>
-          <w:bCs/>
-          <w:lang w:val="en-US"/>
-        </w:rPr>
-        <w:t>:</w:t>
+          <w:lang w:val="en-US"/>
+        </w:rPr>
+        <w:t>ALOCAÇÃO:</w:t>
       </w:r>
     </w:p>
     <w:p>

</xml_diff>

<commit_message>
Enviando o documento revisado pelo professor - 17/04/2026
</commit_message>
<xml_diff>
--- a/Terceiro_Semestre/Projeto_Integrador/Documentação/Modelo_Projeto_Integrador_principal.docx
+++ b/Terceiro_Semestre/Projeto_Integrador/Documentação/Modelo_Projeto_Integrador_principal.docx
@@ -2111,7 +2111,25 @@
         <w:t xml:space="preserve"> </w:t>
       </w:r>
       <w:r>
-        <w:t>O mesmo por sua vez possuí total c</w:t>
+        <w:t>O mesmo</w:t>
+      </w:r>
+      <w:r>
+        <w:t>,</w:t>
+      </w:r>
+      <w:r>
+        <w:t xml:space="preserve"> por sua vez</w:t>
+      </w:r>
+      <w:r>
+        <w:t>,</w:t>
+      </w:r>
+      <w:r>
+        <w:t xml:space="preserve"> possu</w:t>
+      </w:r>
+      <w:r>
+        <w:t>i</w:t>
+      </w:r>
+      <w:r>
+        <w:t xml:space="preserve"> total c</w:t>
       </w:r>
       <w:r>
         <w:t xml:space="preserve">ontrole e monitoramento </w:t>
@@ -2325,11 +2343,32 @@
     </w:p>
     <w:p>
       <w:pPr>
+        <w:jc w:val="both"/>
+      </w:pPr>
+    </w:p>
+    <w:p>
+      <w:pPr>
+        <w:spacing w:line="240" w:lineRule="auto"/>
+        <w:contextualSpacing w:val="0"/>
+        <w:rPr>
+          <w:rFonts w:asciiTheme="majorHAnsi" w:eastAsiaTheme="majorEastAsia" w:hAnsiTheme="majorHAnsi" w:cstheme="majorBidi"/>
+          <w:b/>
+          <w:bCs/>
+          <w:szCs w:val="28"/>
+        </w:rPr>
+      </w:pPr>
+      <w:bookmarkStart w:id="5" w:name="_Toc26631"/>
+      <w:r>
+        <w:br w:type="page"/>
+      </w:r>
+    </w:p>
+    <w:p>
+      <w:pPr>
         <w:pStyle w:val="Ttulo1"/>
         <w:jc w:val="both"/>
       </w:pPr>
-      <w:bookmarkStart w:id="5" w:name="_Toc26631"/>
-      <w:r>
+      <w:r>
+        <w:lastRenderedPageBreak/>
         <w:t>2</w:t>
       </w:r>
       <w:r>
@@ -2569,7 +2608,6 @@
         <w:jc w:val="both"/>
       </w:pPr>
       <w:r>
-        <w:lastRenderedPageBreak/>
         <w:t>Validação de capacidade do laboratório</w:t>
       </w:r>
       <w:r>
@@ -2582,6 +2620,7 @@
         <w:jc w:val="both"/>
       </w:pPr>
       <w:r>
+        <w:lastRenderedPageBreak/>
         <w:t>O sistema verifica se a quantidade de computadores do laboratório é suficiente para atender o número de alunos matriculados, respeitando a regra de no máximo dois alunos por computador.</w:t>
       </w:r>
     </w:p>
@@ -3139,7 +3178,13 @@
       </w:pPr>
       <w:r>
         <w:lastRenderedPageBreak/>
-        <w:t xml:space="preserve">Interface com navegador web: Nosso sistema terá a capacidade de se adequar aos diferentes navegadores, como Google, Microsoft Edge, Opera e Brave. O Projeto será desenvolvido seguindo as seguintes versões dos navegadores:  </w:t>
+        <w:t xml:space="preserve">Interface com navegador web: Nosso sistema terá a capacidade de se adequar aos diferentes navegadores, como Google, Microsoft Edge, Opera e Brave. O Projeto será desenvolvido seguindo as seguintes versões </w:t>
+      </w:r>
+      <w:r>
+        <w:t xml:space="preserve">mínimas </w:t>
+      </w:r>
+      <w:r>
+        <w:t xml:space="preserve">dos navegadores:  </w:t>
       </w:r>
     </w:p>
     <w:p>
@@ -3202,52 +3247,43 @@
     </w:p>
     <w:p>
       <w:pPr>
-        <w:pStyle w:val="Ttulo2"/>
-        <w:jc w:val="both"/>
-      </w:pPr>
-      <w:bookmarkStart w:id="13" w:name="_Toc18518"/>
-      <w:r>
-        <w:t>2.7</w:t>
-      </w:r>
-      <w:r>
-        <w:tab/>
-      </w:r>
-      <w:r>
-        <w:t>CRONOGRAMA</w:t>
-      </w:r>
-      <w:bookmarkStart w:id="14" w:name="_Toc22143"/>
-      <w:bookmarkEnd w:id="13"/>
-    </w:p>
-    <w:p>
-      <w:pPr>
         <w:spacing w:line="240" w:lineRule="auto"/>
         <w:contextualSpacing w:val="0"/>
         <w:rPr>
           <w:rFonts w:asciiTheme="majorHAnsi" w:eastAsiaTheme="majorEastAsia" w:hAnsiTheme="majorHAnsi" w:cstheme="majorBidi"/>
           <w:b/>
           <w:bCs/>
-          <w:szCs w:val="28"/>
-        </w:rPr>
+          <w:szCs w:val="26"/>
+        </w:rPr>
+      </w:pPr>
+      <w:bookmarkStart w:id="13" w:name="_Toc18518"/>
+      <w:r>
+        <w:br w:type="page"/>
+      </w:r>
+    </w:p>
+    <w:p>
+      <w:pPr>
+        <w:pStyle w:val="Ttulo2"/>
+        <w:jc w:val="both"/>
       </w:pPr>
       <w:r>
         <w:rPr>
           <w:noProof/>
-          <w:lang w:eastAsia="pt-BR"/>
         </w:rPr>
         <w:lastRenderedPageBreak/>
         <w:drawing>
-          <wp:anchor distT="0" distB="0" distL="114300" distR="114300" simplePos="0" relativeHeight="251658240" behindDoc="0" locked="0" layoutInCell="1" allowOverlap="1" wp14:anchorId="4811D009" wp14:editId="23D037D5">
+          <wp:anchor distT="0" distB="0" distL="114300" distR="114300" simplePos="0" relativeHeight="251659264" behindDoc="0" locked="0" layoutInCell="1" allowOverlap="0" wp14:anchorId="4F43A484" wp14:editId="71C6C383">
             <wp:simplePos x="0" y="0"/>
-            <wp:positionH relativeFrom="page">
-              <wp:align>center</wp:align>
+            <wp:positionH relativeFrom="margin">
+              <wp:align>left</wp:align>
             </wp:positionH>
-            <wp:positionV relativeFrom="paragraph">
-              <wp:posOffset>3562985</wp:posOffset>
+            <wp:positionV relativeFrom="page">
+              <wp:posOffset>1437640</wp:posOffset>
             </wp:positionV>
-            <wp:extent cx="9532620" cy="2407285"/>
-            <wp:effectExtent l="317" t="0" r="0" b="0"/>
-            <wp:wrapSquare wrapText="bothSides"/>
-            <wp:docPr id="1" name="Imagem 1"/>
+            <wp:extent cx="2188800" cy="8650800"/>
+            <wp:effectExtent l="0" t="0" r="2540" b="0"/>
+            <wp:wrapTopAndBottom/>
+            <wp:docPr id="11" name="Imagem 11"/>
             <wp:cNvGraphicFramePr>
               <a:graphicFrameLocks xmlns:a="http://schemas.openxmlformats.org/drawingml/2006/main" noChangeAspect="1"/>
             </wp:cNvGraphicFramePr>
@@ -3255,8 +3291,10 @@
               <a:graphicData uri="http://schemas.openxmlformats.org/drawingml/2006/picture">
                 <pic:pic xmlns:pic="http://schemas.openxmlformats.org/drawingml/2006/picture">
                   <pic:nvPicPr>
-                    <pic:cNvPr id="1" name=""/>
-                    <pic:cNvPicPr/>
+                    <pic:cNvPr id="0" name="Picture 2"/>
+                    <pic:cNvPicPr>
+                      <a:picLocks noChangeAspect="1" noChangeArrowheads="1"/>
+                    </pic:cNvPicPr>
                   </pic:nvPicPr>
                   <pic:blipFill>
                     <a:blip r:embed="rId14">
@@ -3266,25 +3304,44 @@
                         </a:ext>
                       </a:extLst>
                     </a:blip>
+                    <a:srcRect/>
                     <a:stretch>
                       <a:fillRect/>
                     </a:stretch>
                   </pic:blipFill>
-                  <pic:spPr>
-                    <a:xfrm rot="16200000">
+                  <pic:spPr bwMode="auto">
+                    <a:xfrm>
                       <a:off x="0" y="0"/>
-                      <a:ext cx="9532620" cy="2407285"/>
+                      <a:ext cx="2188800" cy="8650800"/>
                     </a:xfrm>
                     <a:prstGeom prst="rect">
                       <a:avLst/>
                     </a:prstGeom>
+                    <a:noFill/>
                   </pic:spPr>
                 </pic:pic>
               </a:graphicData>
             </a:graphic>
+            <wp14:sizeRelH relativeFrom="margin">
+              <wp14:pctWidth>0</wp14:pctWidth>
+            </wp14:sizeRelH>
+            <wp14:sizeRelV relativeFrom="margin">
+              <wp14:pctHeight>0</wp14:pctHeight>
+            </wp14:sizeRelV>
           </wp:anchor>
         </w:drawing>
       </w:r>
+      <w:r>
+        <w:t>2.7</w:t>
+      </w:r>
+      <w:r>
+        <w:tab/>
+      </w:r>
+      <w:r>
+        <w:t>CRONOGRAMA</w:t>
+      </w:r>
+      <w:bookmarkStart w:id="14" w:name="_Toc22143"/>
+      <w:bookmarkEnd w:id="13"/>
       <w:r>
         <w:br w:type="page"/>
       </w:r>
@@ -8057,11 +8114,6 @@
       </w:p>
     </w:sdtContent>
   </w:sdt>
-  <w:p>
-    <w:pPr>
-      <w:pStyle w:val="Cabealho"/>
-    </w:pPr>
-  </w:p>
 </w:hdr>
 </file>
 

</xml_diff>

<commit_message>
Adicionando o documento atualizado para o Github - 20/04/2026
</commit_message>
<xml_diff>
--- a/Terceiro_Semestre/Projeto_Integrador/Documentação/Modelo_Projeto_Integrador_principal.docx
+++ b/Terceiro_Semestre/Projeto_Integrador/Documentação/Modelo_Projeto_Integrador_principal.docx
@@ -1,6 +1,6 @@
 
 <file path=word/document.xml><?xml version="1.0" encoding="utf-8"?>
-<w:document xmlns:wpc="http://schemas.microsoft.com/office/word/2010/wordprocessingCanvas" xmlns:cx="http://schemas.microsoft.com/office/drawing/2014/chartex" xmlns:cx1="http://schemas.microsoft.com/office/drawing/2015/9/8/chartex" xmlns:cx2="http://schemas.microsoft.com/office/drawing/2015/10/21/chartex" xmlns:cx3="http://schemas.microsoft.com/office/drawing/2016/5/9/chartex" xmlns:cx4="http://schemas.microsoft.com/office/drawing/2016/5/10/chartex" xmlns:cx5="http://schemas.microsoft.com/office/drawing/2016/5/11/chartex" xmlns:cx6="http://schemas.microsoft.com/office/drawing/2016/5/12/chartex" xmlns:cx7="http://schemas.microsoft.com/office/drawing/2016/5/13/chartex" xmlns:cx8="http://schemas.microsoft.com/office/drawing/2016/5/14/chartex" xmlns:mc="http://schemas.openxmlformats.org/markup-compatibility/2006" xmlns:aink="http://schemas.microsoft.com/office/drawing/2016/ink" xmlns:am3d="http://schemas.microsoft.com/office/drawing/2017/model3d" xmlns:o="urn:schemas-microsoft-com:office:office" xmlns:oel="http://schemas.microsoft.com/office/2019/extlst" xmlns:r="http://schemas.openxmlformats.org/officeDocument/2006/relationships" xmlns:m="http://schemas.openxmlformats.org/officeDocument/2006/math" xmlns:v="urn:schemas-microsoft-com:vml" xmlns:wp14="http://schemas.microsoft.com/office/word/2010/wordprocessingDrawing" xmlns:wp="http://schemas.openxmlformats.org/drawingml/2006/wordprocessingDrawing" xmlns:w10="urn:schemas-microsoft-com:office:word" xmlns:w="http://schemas.openxmlformats.org/wordprocessingml/2006/main" xmlns:w14="http://schemas.microsoft.com/office/word/2010/wordml" xmlns:w15="http://schemas.microsoft.com/office/word/2012/wordml" xmlns:w16cex="http://schemas.microsoft.com/office/word/2018/wordml/cex" xmlns:w16cid="http://schemas.microsoft.com/office/word/2016/wordml/cid" xmlns:w16="http://schemas.microsoft.com/office/word/2018/wordml" xmlns:w16du="http://schemas.microsoft.com/office/word/2023/wordml/word16du" xmlns:w16sdtdh="http://schemas.microsoft.com/office/word/2020/wordml/sdtdatahash" xmlns:w16sdtfl="http://schemas.microsoft.com/office/word/2024/wordml/sdtformatlock" xmlns:w16se="http://schemas.microsoft.com/office/word/2015/wordml/symex" xmlns:wpg="http://schemas.microsoft.com/office/word/2010/wordprocessingGroup" xmlns:wpi="http://schemas.microsoft.com/office/word/2010/wordprocessingInk" xmlns:wne="http://schemas.microsoft.com/office/word/2006/wordml" xmlns:wps="http://schemas.microsoft.com/office/word/2010/wordprocessingShape" mc:Ignorable="w14 w15 w16se w16cid w16 w16cex w16sdtdh w16sdtfl w16du wp14">
+<w:document xmlns:wpc="http://schemas.microsoft.com/office/word/2010/wordprocessingCanvas" xmlns:cx="http://schemas.microsoft.com/office/drawing/2014/chartex" xmlns:mc="http://schemas.openxmlformats.org/markup-compatibility/2006" xmlns:o="urn:schemas-microsoft-com:office:office" xmlns:r="http://schemas.openxmlformats.org/officeDocument/2006/relationships" xmlns:m="http://schemas.openxmlformats.org/officeDocument/2006/math" xmlns:v="urn:schemas-microsoft-com:vml" xmlns:wp14="http://schemas.microsoft.com/office/word/2010/wordprocessingDrawing" xmlns:wp="http://schemas.openxmlformats.org/drawingml/2006/wordprocessingDrawing" xmlns:w10="urn:schemas-microsoft-com:office:word" xmlns:w="http://schemas.openxmlformats.org/wordprocessingml/2006/main" xmlns:w14="http://schemas.microsoft.com/office/word/2010/wordml" xmlns:w15="http://schemas.microsoft.com/office/word/2012/wordml" xmlns:w16se="http://schemas.microsoft.com/office/word/2015/wordml/symex" xmlns:wpg="http://schemas.microsoft.com/office/word/2010/wordprocessingGroup" xmlns:wpi="http://schemas.microsoft.com/office/word/2010/wordprocessingInk" xmlns:wne="http://schemas.microsoft.com/office/word/2006/wordml" xmlns:wps="http://schemas.microsoft.com/office/word/2010/wordprocessingShape" mc:Ignorable="w14 w15 w16se wp14">
   <w:body>
     <w:p>
       <w:pPr>
@@ -3234,6 +3234,7 @@
       <w:r>
         <w:rPr>
           <w:noProof/>
+          <w:lang w:eastAsia="pt-BR"/>
         </w:rPr>
         <w:lastRenderedPageBreak/>
         <w:drawing>
@@ -3912,18 +3913,25 @@
         <w:pStyle w:val="PargrafodaLista"/>
       </w:pPr>
       <w:r>
-        <w:t>Atores: Diretor Acadêmico, Coordenador e Responsável do TI.</w:t>
-      </w:r>
-    </w:p>
-    <w:p>
-      <w:pPr>
-        <w:pStyle w:val="PargrafodaLista"/>
-      </w:pPr>
-      <w:r>
-        <w:t xml:space="preserve">Descrição: </w:t>
-      </w:r>
-      <w:r>
-        <w:t>O sistema deve permitir a autenticação de cada usuário conforme suas permissões de acesso.</w:t>
+        <w:rPr>
+          <w:rStyle w:val="Forte"/>
+        </w:rPr>
+        <w:t>Atores:</w:t>
+      </w:r>
+      <w:r>
+        <w:t xml:space="preserve"> Diretor Acadêmico, Coordenador e Responsável de TI</w:t>
+      </w:r>
+      <w:r>
+        <w:br/>
+      </w:r>
+      <w:r>
+        <w:rPr>
+          <w:rStyle w:val="Forte"/>
+        </w:rPr>
+        <w:t>Descrição:</w:t>
+      </w:r>
+      <w:r>
+        <w:t xml:space="preserve"> O sistema deve permitir a autenticação dos usuários conforme seus perfis de acesso.</w:t>
       </w:r>
     </w:p>
     <w:p>
@@ -3933,10 +3941,6 @@
           <w:ilvl w:val="0"/>
           <w:numId w:val="22"/>
         </w:numPr>
-        <w:rPr>
-          <w:b/>
-          <w:bCs/>
-        </w:rPr>
       </w:pPr>
       <w:r>
         <w:rPr>
@@ -3951,15 +3955,25 @@
         <w:pStyle w:val="PargrafodaLista"/>
       </w:pPr>
       <w:r>
-        <w:t xml:space="preserve">Ator: Diretor Acadêmico. </w:t>
-      </w:r>
-    </w:p>
-    <w:p>
-      <w:pPr>
-        <w:pStyle w:val="PargrafodaLista"/>
-      </w:pPr>
-      <w:r>
-        <w:t>Descrição: O sistema permitirá realizar os cadastros de laboratório da faculdade.</w:t>
+        <w:rPr>
+          <w:rStyle w:val="Forte"/>
+        </w:rPr>
+        <w:t>Ator:</w:t>
+      </w:r>
+      <w:r>
+        <w:t xml:space="preserve"> Diretor Acadêmico</w:t>
+      </w:r>
+      <w:r>
+        <w:br/>
+      </w:r>
+      <w:r>
+        <w:rPr>
+          <w:rStyle w:val="Forte"/>
+        </w:rPr>
+        <w:t>Descrição:</w:t>
+      </w:r>
+      <w:r>
+        <w:t xml:space="preserve"> O sistema deve permitir o cadastro de laboratórios de informática.</w:t>
       </w:r>
     </w:p>
     <w:p>
@@ -3987,8 +4001,14 @@
         <w:pStyle w:val="PargrafodaLista"/>
       </w:pPr>
       <w:r>
+        <w:rPr>
+          <w:b/>
+        </w:rPr>
         <w:lastRenderedPageBreak/>
-        <w:t>Ator: Diretor Acadêmico.</w:t>
+        <w:t>Ator:</w:t>
+      </w:r>
+      <w:r>
+        <w:t xml:space="preserve"> Diretor Acadêmico.</w:t>
       </w:r>
     </w:p>
     <w:p>
@@ -3996,7 +4016,16 @@
         <w:pStyle w:val="PargrafodaLista"/>
       </w:pPr>
       <w:r>
-        <w:t>Descrição: Deve ser informado a quantidade de computadores em cada laboratório.</w:t>
+        <w:rPr>
+          <w:b/>
+        </w:rPr>
+        <w:t>Descrição:</w:t>
+      </w:r>
+      <w:r>
+        <w:t xml:space="preserve"> </w:t>
+      </w:r>
+      <w:r>
+        <w:t>O sistema deve permitir informar a quantidade de computadores de cada laboratório.</w:t>
       </w:r>
     </w:p>
     <w:p>
@@ -4024,7 +4053,13 @@
         <w:pStyle w:val="PargrafodaLista"/>
       </w:pPr>
       <w:r>
-        <w:t>Ator: Diretor Acadêmico.</w:t>
+        <w:rPr>
+          <w:b/>
+        </w:rPr>
+        <w:t>Ator:</w:t>
+      </w:r>
+      <w:r>
+        <w:t xml:space="preserve"> Diretor Acadêmico.</w:t>
       </w:r>
     </w:p>
     <w:p>
@@ -4032,7 +4067,13 @@
         <w:pStyle w:val="PargrafodaLista"/>
       </w:pPr>
       <w:r>
-        <w:t>Descrição: Deve ser informado a quantidade suportada de alunos em cada laboratório.</w:t>
+        <w:rPr>
+          <w:b/>
+        </w:rPr>
+        <w:t xml:space="preserve">Descrição: </w:t>
+      </w:r>
+      <w:r>
+        <w:t>O sistema deve permitir definir a capacidade máxima de alunos por laboratório.</w:t>
       </w:r>
     </w:p>
     <w:p>
@@ -4060,7 +4101,13 @@
         <w:pStyle w:val="PargrafodaLista"/>
       </w:pPr>
       <w:r>
-        <w:t>Ator: Diretor Acadêmico.</w:t>
+        <w:rPr>
+          <w:b/>
+        </w:rPr>
+        <w:t>Ator:</w:t>
+      </w:r>
+      <w:r>
+        <w:t xml:space="preserve"> Diretor Acadêmico.</w:t>
       </w:r>
     </w:p>
     <w:p>
@@ -4068,7 +4115,16 @@
         <w:pStyle w:val="PargrafodaLista"/>
       </w:pPr>
       <w:r>
-        <w:t>Descrição: Deverá ser aprovado ou recusado as solicitações de alocação dos coordenadores.</w:t>
+        <w:rPr>
+          <w:b/>
+        </w:rPr>
+        <w:t>Descrição:</w:t>
+      </w:r>
+      <w:r>
+        <w:t xml:space="preserve"> </w:t>
+      </w:r>
+      <w:r>
+        <w:t>O sistema deve permitir aprovar ou reprovar solicitações de alocação de laboratórios.</w:t>
       </w:r>
     </w:p>
     <w:p>
@@ -4103,7 +4159,13 @@
         <w:pStyle w:val="PargrafodaLista"/>
       </w:pPr>
       <w:r>
-        <w:t>Ator: Diretor Acadêmico.</w:t>
+        <w:rPr>
+          <w:b/>
+        </w:rPr>
+        <w:t>Ator:</w:t>
+      </w:r>
+      <w:r>
+        <w:t xml:space="preserve"> Diretor Acadêmico.</w:t>
       </w:r>
     </w:p>
     <w:p>
@@ -4114,7 +4176,16 @@
         </w:tabs>
       </w:pPr>
       <w:r>
-        <w:t>Descrição: O sistema permitirá o cadastro de usuários do tipo “Coordenador”.</w:t>
+        <w:rPr>
+          <w:b/>
+        </w:rPr>
+        <w:t>Descrição:</w:t>
+      </w:r>
+      <w:r>
+        <w:t xml:space="preserve"> </w:t>
+      </w:r>
+      <w:r>
+        <w:t>O sistema deve permitir o cadastro de usuários do tipo coordenador.</w:t>
       </w:r>
     </w:p>
     <w:p>
@@ -4156,7 +4227,13 @@
         <w:pStyle w:val="PargrafodaLista"/>
       </w:pPr>
       <w:r>
-        <w:t>Ator: Diretor Acadêmico.</w:t>
+        <w:rPr>
+          <w:b/>
+        </w:rPr>
+        <w:t>Ator:</w:t>
+      </w:r>
+      <w:r>
+        <w:t xml:space="preserve"> Diretor Acadêmico.</w:t>
       </w:r>
     </w:p>
     <w:p>
@@ -4167,7 +4244,16 @@
         </w:tabs>
       </w:pPr>
       <w:r>
-        <w:t>Descrição: O sistema permitirá o cadastro de usuários do tipo “Responsável de TI”.</w:t>
+        <w:rPr>
+          <w:b/>
+        </w:rPr>
+        <w:t>Descrição:</w:t>
+      </w:r>
+      <w:r>
+        <w:t xml:space="preserve"> </w:t>
+      </w:r>
+      <w:r>
+        <w:t>O sistema deve permitir o cadastro de usuários do tipo responsável de TI.</w:t>
       </w:r>
     </w:p>
     <w:p>
@@ -4230,7 +4316,13 @@
         <w:pStyle w:val="PargrafodaLista"/>
       </w:pPr>
       <w:r>
-        <w:t>Ator: Diretor Acadêmico.</w:t>
+        <w:rPr>
+          <w:b/>
+        </w:rPr>
+        <w:t>Ator:</w:t>
+      </w:r>
+      <w:r>
+        <w:t xml:space="preserve"> Diretor Acadêmico.</w:t>
       </w:r>
     </w:p>
     <w:p>
@@ -4241,10 +4333,16 @@
         </w:tabs>
       </w:pPr>
       <w:r>
-        <w:t xml:space="preserve">Descrição: O sistema </w:t>
-      </w:r>
-      <w:r>
-        <w:t>deverá apresentar todas as alterações feitas pelos usuários.</w:t>
+        <w:rPr>
+          <w:b/>
+        </w:rPr>
+        <w:t>Descrição:</w:t>
+      </w:r>
+      <w:r>
+        <w:t xml:space="preserve"> </w:t>
+      </w:r>
+      <w:r>
+        <w:t>O sistema deve permitir visualizar as alterações realizadas pelos usuários.</w:t>
       </w:r>
     </w:p>
     <w:p>
@@ -4278,11 +4376,27 @@
       </w:r>
       <w:r>
         <w:br/>
-        <w:t>Ator: Coordenador</w:t>
+      </w:r>
+      <w:r>
+        <w:rPr>
+          <w:b/>
+        </w:rPr>
+        <w:t>Ator:</w:t>
+      </w:r>
+      <w:r>
+        <w:t xml:space="preserve"> Coordenador</w:t>
       </w:r>
       <w:r>
         <w:br/>
-        <w:t>Descrição: O sistema deve permitir que o coordenador cadastre uma nova disciplina informando seus dados básicos.</w:t>
+      </w:r>
+      <w:r>
+        <w:rPr>
+          <w:b/>
+        </w:rPr>
+        <w:t xml:space="preserve">Descrição: </w:t>
+      </w:r>
+      <w:r>
+        <w:t>O sistema deve permitir o cadastro de disciplinas com seus dados básicos.</w:t>
       </w:r>
     </w:p>
     <w:p>
@@ -4317,7 +4431,13 @@
         <w:pStyle w:val="PargrafodaLista"/>
       </w:pPr>
       <w:r>
-        <w:t>Ator: Coordenador.</w:t>
+        <w:rPr>
+          <w:b/>
+        </w:rPr>
+        <w:t>Ator:</w:t>
+      </w:r>
+      <w:r>
+        <w:t xml:space="preserve"> Coordenador.</w:t>
       </w:r>
     </w:p>
     <w:p>
@@ -4325,7 +4445,16 @@
         <w:pStyle w:val="PargrafodaLista"/>
       </w:pPr>
       <w:r>
-        <w:t>Descrição: O sistema deve permitir o cadastro da quantidade de alunos para cada disciplina.</w:t>
+        <w:rPr>
+          <w:b/>
+        </w:rPr>
+        <w:t>Descrição:</w:t>
+      </w:r>
+      <w:r>
+        <w:t xml:space="preserve"> </w:t>
+      </w:r>
+      <w:r>
+        <w:t>O sistema deve permitir informar a quantidade de alunos matriculados em cada disciplina.</w:t>
       </w:r>
     </w:p>
     <w:p>
@@ -4360,7 +4489,13 @@
         <w:pStyle w:val="PargrafodaLista"/>
       </w:pPr>
       <w:r>
-        <w:t>Ator: Coordenador.</w:t>
+        <w:rPr>
+          <w:b/>
+        </w:rPr>
+        <w:t>Ator:</w:t>
+      </w:r>
+      <w:r>
+        <w:t xml:space="preserve"> Coordenador.</w:t>
       </w:r>
     </w:p>
     <w:p>
@@ -4368,7 +4503,16 @@
         <w:pStyle w:val="PargrafodaLista"/>
       </w:pPr>
       <w:r>
-        <w:t>Descrição: O sistema deve permitir a vinculação dos os softwares instalados com cada disciplina.</w:t>
+        <w:rPr>
+          <w:b/>
+        </w:rPr>
+        <w:t>Descrição:</w:t>
+      </w:r>
+      <w:r>
+        <w:t xml:space="preserve"> </w:t>
+      </w:r>
+      <w:r>
+        <w:t>O sistema deve permitir vincular os softwares necessários a cada disciplina.</w:t>
       </w:r>
     </w:p>
     <w:p>
@@ -4403,7 +4547,13 @@
         <w:pStyle w:val="PargrafodaLista"/>
       </w:pPr>
       <w:r>
-        <w:t>Ator: Coordenador.</w:t>
+        <w:rPr>
+          <w:b/>
+        </w:rPr>
+        <w:t>Ator:</w:t>
+      </w:r>
+      <w:r>
+        <w:t xml:space="preserve"> Coordenador.</w:t>
       </w:r>
     </w:p>
     <w:p>
@@ -4411,7 +4561,17 @@
         <w:pStyle w:val="PargrafodaLista"/>
       </w:pPr>
       <w:r>
-        <w:t>Descrição: O sistema deve permitir a solicitação de alocação dos laboratórios.</w:t>
+        <w:rPr>
+          <w:b/>
+        </w:rPr>
+        <w:lastRenderedPageBreak/>
+        <w:t>Descrição:</w:t>
+      </w:r>
+      <w:r>
+        <w:t xml:space="preserve"> </w:t>
+      </w:r>
+      <w:r>
+        <w:t>O sistema deve permitir solicitar a alocação de laboratórios para as disciplinas.</w:t>
       </w:r>
     </w:p>
     <w:p>
@@ -4431,7 +4591,6 @@
           <w:b/>
           <w:bCs/>
         </w:rPr>
-        <w:lastRenderedPageBreak/>
         <w:t>RF13</w:t>
       </w:r>
       <w:r>
@@ -4479,7 +4638,10 @@
         </w:rPr>
       </w:pPr>
       <w:r>
-        <w:t>Descrição: O sistema deve permitir a filtragem dos softwares por cada laboratório.</w:t>
+        <w:t xml:space="preserve">Descrição: </w:t>
+      </w:r>
+      <w:r>
+        <w:t>O sistema deve permitir filtrar os softwares disponíveis por laboratório.</w:t>
       </w:r>
     </w:p>
     <w:p>
@@ -4506,7 +4668,7 @@
           <w:b/>
           <w:bCs/>
         </w:rPr>
-        <w:t>3</w:t>
+        <w:t>4</w:t>
       </w:r>
       <w:r>
         <w:rPr>
@@ -4521,7 +4683,13 @@
         <w:pStyle w:val="PargrafodaLista"/>
       </w:pPr>
       <w:r>
-        <w:t>Ator: Responsável de TI.</w:t>
+        <w:rPr>
+          <w:b/>
+        </w:rPr>
+        <w:t>Ator:</w:t>
+      </w:r>
+      <w:r>
+        <w:t xml:space="preserve"> Responsável de TI.</w:t>
       </w:r>
     </w:p>
     <w:p>
@@ -4532,7 +4700,16 @@
         </w:rPr>
       </w:pPr>
       <w:r>
-        <w:t>Descrição: O sistema deve permitir o cadastro de softwares no sistema.</w:t>
+        <w:rPr>
+          <w:b/>
+        </w:rPr>
+        <w:t>Descrição:</w:t>
+      </w:r>
+      <w:r>
+        <w:t xml:space="preserve"> </w:t>
+      </w:r>
+      <w:r>
+        <w:t>O sistema deve permitir o cadastro de softwares.</w:t>
       </w:r>
     </w:p>
     <w:p>
@@ -4559,7 +4736,7 @@
           <w:b/>
           <w:bCs/>
         </w:rPr>
-        <w:t>4</w:t>
+        <w:t>5</w:t>
       </w:r>
       <w:r>
         <w:rPr>
@@ -4574,7 +4751,13 @@
         <w:pStyle w:val="PargrafodaLista"/>
       </w:pPr>
       <w:r>
-        <w:t>Ator: Responsável de TI.</w:t>
+        <w:rPr>
+          <w:b/>
+        </w:rPr>
+        <w:t>Ator:</w:t>
+      </w:r>
+      <w:r>
+        <w:t xml:space="preserve"> Responsável de TI.</w:t>
       </w:r>
     </w:p>
     <w:p>
@@ -4585,7 +4768,16 @@
         </w:rPr>
       </w:pPr>
       <w:r>
-        <w:t>Descrição: O sistema deve permitir a atualização dos registros de softwares no sistema.</w:t>
+        <w:rPr>
+          <w:b/>
+        </w:rPr>
+        <w:t>Descrição:</w:t>
+      </w:r>
+      <w:r>
+        <w:t xml:space="preserve"> </w:t>
+      </w:r>
+      <w:r>
+        <w:t>O sistema deve permitir a atualização dos dados dos softwares.</w:t>
       </w:r>
     </w:p>
     <w:p>
@@ -4605,7 +4797,7 @@
           <w:b/>
           <w:bCs/>
         </w:rPr>
-        <w:t>RF15</w:t>
+        <w:t>RF16</w:t>
       </w:r>
       <w:r>
         <w:rPr>
@@ -4620,7 +4812,13 @@
         <w:pStyle w:val="PargrafodaLista"/>
       </w:pPr>
       <w:r>
-        <w:t>Ator: Responsável de TI.</w:t>
+        <w:rPr>
+          <w:b/>
+        </w:rPr>
+        <w:t>Ator:</w:t>
+      </w:r>
+      <w:r>
+        <w:t xml:space="preserve"> Responsável de TI.</w:t>
       </w:r>
     </w:p>
     <w:p>
@@ -4631,7 +4829,16 @@
         </w:rPr>
       </w:pPr>
       <w:r>
-        <w:t>Descrição: O sistema deve permitir a remoção dos registros de softwares no sistema.</w:t>
+        <w:rPr>
+          <w:b/>
+        </w:rPr>
+        <w:t>Descrição:</w:t>
+      </w:r>
+      <w:r>
+        <w:t xml:space="preserve"> </w:t>
+      </w:r>
+      <w:r>
+        <w:t>O sistema deve permitir a remoção de softwares.</w:t>
       </w:r>
     </w:p>
     <w:p>
@@ -4658,7 +4865,7 @@
           <w:b/>
           <w:bCs/>
         </w:rPr>
-        <w:t>6</w:t>
+        <w:t>7</w:t>
       </w:r>
       <w:r>
         <w:rPr>
@@ -4673,7 +4880,13 @@
         <w:pStyle w:val="PargrafodaLista"/>
       </w:pPr>
       <w:r>
-        <w:t>Ator: Responsável de TI.</w:t>
+        <w:rPr>
+          <w:b/>
+        </w:rPr>
+        <w:t>Ator:</w:t>
+      </w:r>
+      <w:r>
+        <w:t xml:space="preserve"> Responsável de TI.</w:t>
       </w:r>
     </w:p>
     <w:p>
@@ -4684,16 +4897,19 @@
         </w:rPr>
       </w:pPr>
       <w:r>
-        <w:t xml:space="preserve">Descrição: O sistema deve permitir a </w:t>
-      </w:r>
-      <w:proofErr w:type="spellStart"/>
-      <w:r>
-        <w:t>cosulta</w:t>
-      </w:r>
-      <w:proofErr w:type="spellEnd"/>
-      <w:r>
-        <w:t xml:space="preserve"> dos softwares registrados por laboratório.</w:t>
-      </w:r>
+        <w:rPr>
+          <w:b/>
+        </w:rPr>
+        <w:t>Descrição:</w:t>
+      </w:r>
+      <w:r>
+        <w:t xml:space="preserve"> </w:t>
+      </w:r>
+      <w:r>
+        <w:t>O sistema deve permitir consultar os softwares disponíveis em cada laboratório.</w:t>
+      </w:r>
+      <w:bookmarkStart w:id="20" w:name="_GoBack"/>
+      <w:bookmarkEnd w:id="20"/>
     </w:p>
     <w:p>
       <w:pPr>
@@ -4711,7 +4927,7 @@
           <w:i w:val="0"/>
         </w:rPr>
       </w:pPr>
-      <w:bookmarkStart w:id="20" w:name="_Toc16793"/>
+      <w:bookmarkStart w:id="21" w:name="_Toc16793"/>
       <w:r>
         <w:rPr>
           <w:i w:val="0"/>
@@ -4727,7 +4943,7 @@
         </w:rPr>
         <w:t>REQUISITOS DE BANCO DE DADOS</w:t>
       </w:r>
-      <w:bookmarkEnd w:id="20"/>
+      <w:bookmarkEnd w:id="21"/>
     </w:p>
     <w:p>
       <w:pPr>
@@ -4738,7 +4954,7 @@
           <w:iCs/>
         </w:rPr>
       </w:pPr>
-      <w:bookmarkStart w:id="21" w:name="_Toc27034"/>
+      <w:bookmarkStart w:id="22" w:name="_Toc27034"/>
       <w:r>
         <w:rPr>
           <w:i w:val="0"/>
@@ -4754,7 +4970,7 @@
         </w:rPr>
         <w:t>MODELO FÍSICO E LÓGICO DA BASE DE DADOS</w:t>
       </w:r>
-      <w:bookmarkEnd w:id="21"/>
+      <w:bookmarkEnd w:id="22"/>
     </w:p>
     <w:p>
       <w:pPr>
@@ -4840,7 +5056,7 @@
           <w:i w:val="0"/>
         </w:rPr>
       </w:pPr>
-      <w:bookmarkStart w:id="22" w:name="_Toc16266"/>
+      <w:bookmarkStart w:id="23" w:name="_Toc16266"/>
       <w:r>
         <w:rPr>
           <w:i w:val="0"/>
@@ -4856,7 +5072,7 @@
         </w:rPr>
         <w:t>DICIONÁRIO DE DADOS</w:t>
       </w:r>
-      <w:bookmarkEnd w:id="22"/>
+      <w:bookmarkEnd w:id="23"/>
     </w:p>
     <w:p>
       <w:pPr>
@@ -4877,6 +5093,7 @@
       <w:r>
         <w:rPr>
           <w:noProof/>
+          <w:lang w:eastAsia="pt-BR"/>
         </w:rPr>
         <w:drawing>
           <wp:inline distT="0" distB="0" distL="0" distR="0" wp14:anchorId="2EA7A7F6" wp14:editId="245AAF5C">
@@ -4951,6 +5168,7 @@
       <w:r>
         <w:rPr>
           <w:noProof/>
+          <w:lang w:eastAsia="pt-BR"/>
         </w:rPr>
         <w:drawing>
           <wp:inline distT="0" distB="0" distL="0" distR="0" wp14:anchorId="32AD5C31" wp14:editId="2B34D1A0">
@@ -5021,6 +5239,7 @@
           <w:b/>
           <w:bCs/>
           <w:noProof/>
+          <w:lang w:eastAsia="pt-BR"/>
         </w:rPr>
         <w:drawing>
           <wp:inline distT="0" distB="0" distL="0" distR="0" wp14:anchorId="0C2017A5" wp14:editId="1B2D12BE">
@@ -5091,6 +5310,7 @@
       <w:r>
         <w:rPr>
           <w:noProof/>
+          <w:lang w:eastAsia="pt-BR"/>
         </w:rPr>
         <w:drawing>
           <wp:inline distT="0" distB="0" distL="0" distR="0" wp14:anchorId="5A0A9D17" wp14:editId="16ABC7E0">
@@ -5161,6 +5381,7 @@
       <w:r>
         <w:rPr>
           <w:noProof/>
+          <w:lang w:eastAsia="pt-BR"/>
         </w:rPr>
         <w:drawing>
           <wp:inline distT="0" distB="0" distL="0" distR="0" wp14:anchorId="61B11120" wp14:editId="5D264626">
@@ -5238,6 +5459,7 @@
       <w:r>
         <w:rPr>
           <w:noProof/>
+          <w:lang w:eastAsia="pt-BR"/>
         </w:rPr>
         <w:drawing>
           <wp:inline distT="0" distB="0" distL="0" distR="0" wp14:anchorId="4DC00A87" wp14:editId="09F65E97">
@@ -5322,6 +5544,7 @@
       <w:r>
         <w:rPr>
           <w:noProof/>
+          <w:lang w:eastAsia="pt-BR"/>
         </w:rPr>
         <w:drawing>
           <wp:inline distT="0" distB="0" distL="0" distR="0" wp14:anchorId="6EF7DC13" wp14:editId="17F6DF7B">
@@ -5406,6 +5629,7 @@
       <w:r>
         <w:rPr>
           <w:noProof/>
+          <w:lang w:eastAsia="pt-BR"/>
         </w:rPr>
         <w:drawing>
           <wp:inline distT="0" distB="0" distL="0" distR="0" wp14:anchorId="0FA3CA38" wp14:editId="412C4E93">
@@ -5460,7 +5684,7 @@
           <w:iCs/>
         </w:rPr>
       </w:pPr>
-      <w:bookmarkStart w:id="23" w:name="_Toc7182"/>
+      <w:bookmarkStart w:id="24" w:name="_Toc7182"/>
       <w:r>
         <w:rPr>
           <w:i w:val="0"/>
@@ -5476,7 +5700,7 @@
         <w:tab/>
         <w:t>SCRIPTS DE CRIAÇÃO DE BANCO DE DADOS E TABELAS</w:t>
       </w:r>
-      <w:bookmarkEnd w:id="23"/>
+      <w:bookmarkEnd w:id="24"/>
     </w:p>
     <w:p>
       <w:pPr>
@@ -6269,21 +6493,7 @@
         <w:rPr>
           <w:lang w:val="en-US"/>
         </w:rPr>
-        <w:t xml:space="preserve"> </w:t>
-      </w:r>
-      <w:proofErr w:type="gramStart"/>
-      <w:r>
-        <w:rPr>
-          <w:lang w:val="en-US"/>
-        </w:rPr>
-        <w:t>VARCHAR(</w:t>
-      </w:r>
-      <w:proofErr w:type="gramEnd"/>
-      <w:r>
-        <w:rPr>
-          <w:lang w:val="en-US"/>
-        </w:rPr>
-        <w:t>50) NOT NULL,</w:t>
+        <w:t xml:space="preserve"> VARCHAR(50) NOT NULL,</w:t>
       </w:r>
       <w:r>
         <w:rPr>
@@ -6309,36 +6519,15 @@
         <w:rPr>
           <w:lang w:val="en-US"/>
         </w:rPr>
-        <w:t xml:space="preserve"> </w:t>
-      </w:r>
-      <w:proofErr w:type="gramStart"/>
-      <w:r>
-        <w:rPr>
-          <w:lang w:val="en-US"/>
-        </w:rPr>
-        <w:t>VARCHAR(</w:t>
-      </w:r>
-      <w:proofErr w:type="gramEnd"/>
-      <w:r>
-        <w:rPr>
-          <w:lang w:val="en-US"/>
-        </w:rPr>
-        <w:t>30) NOT NULL</w:t>
+        <w:t xml:space="preserve"> VARCHAR(30) NOT NULL</w:t>
       </w:r>
       <w:r>
         <w:rPr>
           <w:lang w:val="en-US"/>
         </w:rPr>
         <w:br/>
-      </w:r>
-      <w:proofErr w:type="gramStart"/>
-      <w:r>
-        <w:rPr>
-          <w:lang w:val="en-US"/>
-        </w:rPr>
         <w:t>);</w:t>
       </w:r>
-      <w:proofErr w:type="gramEnd"/>
     </w:p>
     <w:p>
       <w:pPr>
@@ -6393,15 +6582,7 @@
       </w:r>
       <w:proofErr w:type="spellEnd"/>
       <w:r>
-        <w:t xml:space="preserve"> </w:t>
-      </w:r>
-      <w:proofErr w:type="gramStart"/>
-      <w:r>
-        <w:t>VARCHAR(</w:t>
-      </w:r>
-      <w:proofErr w:type="gramEnd"/>
-      <w:r>
-        <w:t>50) NOT NULL,</w:t>
+        <w:t xml:space="preserve"> VARCHAR(50) NOT NULL,</w:t>
       </w:r>
       <w:r>
         <w:br/>
@@ -7157,14 +7338,12 @@
           <w:lang w:val="en-US"/>
         </w:rPr>
       </w:pPr>
-      <w:proofErr w:type="gramStart"/>
       <w:r>
         <w:rPr>
           <w:lang w:val="en-US"/>
         </w:rPr>
         <w:t>);</w:t>
       </w:r>
-      <w:proofErr w:type="gramEnd"/>
     </w:p>
     <w:p>
       <w:pPr>
@@ -7589,14 +7768,12 @@
           <w:lang w:val="en-US"/>
         </w:rPr>
       </w:pPr>
-      <w:proofErr w:type="gramStart"/>
       <w:r>
         <w:rPr>
           <w:lang w:val="en-US"/>
         </w:rPr>
         <w:t>);</w:t>
       </w:r>
-      <w:proofErr w:type="gramEnd"/>
     </w:p>
     <w:p/>
     <w:p>
@@ -7931,21 +8108,21 @@
         <w:pStyle w:val="Ttulo1"/>
         <w:jc w:val="center"/>
       </w:pPr>
-      <w:bookmarkStart w:id="24" w:name="_Toc21242"/>
+      <w:bookmarkStart w:id="25" w:name="_Toc21242"/>
       <w:r>
         <w:lastRenderedPageBreak/>
         <w:t>ANEXOS</w:t>
       </w:r>
-      <w:bookmarkEnd w:id="24"/>
+      <w:bookmarkEnd w:id="25"/>
     </w:p>
     <w:p/>
     <w:p>
-      <w:bookmarkStart w:id="25" w:name="Ata_1"/>
+      <w:bookmarkStart w:id="26" w:name="Ata_1"/>
       <w:r>
         <w:t>Ata 1</w:t>
       </w:r>
     </w:p>
-    <w:bookmarkEnd w:id="25"/>
+    <w:bookmarkEnd w:id="26"/>
     <w:p>
       <w:pPr>
         <w:jc w:val="both"/>
@@ -8003,12 +8180,12 @@
       </w:r>
     </w:p>
     <w:p>
-      <w:bookmarkStart w:id="26" w:name="Ata_2"/>
+      <w:bookmarkStart w:id="27" w:name="Ata_2"/>
       <w:r>
         <w:t>Ata 2</w:t>
       </w:r>
     </w:p>
-    <w:bookmarkEnd w:id="26"/>
+    <w:bookmarkEnd w:id="27"/>
     <w:p>
       <w:pPr>
         <w:jc w:val="both"/>
@@ -8084,7 +8261,7 @@
       <w:pPr>
         <w:jc w:val="both"/>
       </w:pPr>
-      <w:bookmarkStart w:id="27" w:name="Ata_3"/>
+      <w:bookmarkStart w:id="28" w:name="Ata_3"/>
       <w:r>
         <w:t>Ata</w:t>
       </w:r>
@@ -8092,7 +8269,7 @@
         <w:t xml:space="preserve"> 3</w:t>
       </w:r>
     </w:p>
-    <w:bookmarkEnd w:id="27"/>
+    <w:bookmarkEnd w:id="28"/>
     <w:p>
       <w:pPr>
         <w:jc w:val="both"/>
@@ -8149,12 +8326,12 @@
       <w:pPr>
         <w:jc w:val="both"/>
       </w:pPr>
-      <w:bookmarkStart w:id="28" w:name="Ata_4"/>
+      <w:bookmarkStart w:id="29" w:name="Ata_4"/>
       <w:r>
         <w:t>Ata 4</w:t>
       </w:r>
     </w:p>
-    <w:bookmarkEnd w:id="28"/>
+    <w:bookmarkEnd w:id="29"/>
     <w:p>
       <w:pPr>
         <w:jc w:val="both"/>
@@ -8211,12 +8388,12 @@
     <w:p/>
     <w:p/>
     <w:p>
-      <w:bookmarkStart w:id="29" w:name="Ata_5"/>
+      <w:bookmarkStart w:id="30" w:name="Ata_5"/>
       <w:r>
         <w:t>Ata 5</w:t>
       </w:r>
     </w:p>
-    <w:bookmarkEnd w:id="29"/>
+    <w:bookmarkEnd w:id="30"/>
     <w:p>
       <w:r>
         <w:rPr>
@@ -8327,7 +8504,7 @@
 </file>
 
 <file path=word/endnotes.xml><?xml version="1.0" encoding="utf-8"?>
-<w:endnotes xmlns:wpc="http://schemas.microsoft.com/office/word/2010/wordprocessingCanvas" xmlns:cx="http://schemas.microsoft.com/office/drawing/2014/chartex" xmlns:cx1="http://schemas.microsoft.com/office/drawing/2015/9/8/chartex" xmlns:cx2="http://schemas.microsoft.com/office/drawing/2015/10/21/chartex" xmlns:cx3="http://schemas.microsoft.com/office/drawing/2016/5/9/chartex" xmlns:cx4="http://schemas.microsoft.com/office/drawing/2016/5/10/chartex" xmlns:cx5="http://schemas.microsoft.com/office/drawing/2016/5/11/chartex" xmlns:cx6="http://schemas.microsoft.com/office/drawing/2016/5/12/chartex" xmlns:cx7="http://schemas.microsoft.com/office/drawing/2016/5/13/chartex" xmlns:cx8="http://schemas.microsoft.com/office/drawing/2016/5/14/chartex" xmlns:mc="http://schemas.openxmlformats.org/markup-compatibility/2006" xmlns:aink="http://schemas.microsoft.com/office/drawing/2016/ink" xmlns:am3d="http://schemas.microsoft.com/office/drawing/2017/model3d" xmlns:o="urn:schemas-microsoft-com:office:office" xmlns:oel="http://schemas.microsoft.com/office/2019/extlst" xmlns:r="http://schemas.openxmlformats.org/officeDocument/2006/relationships" xmlns:m="http://schemas.openxmlformats.org/officeDocument/2006/math" xmlns:v="urn:schemas-microsoft-com:vml" xmlns:wp14="http://schemas.microsoft.com/office/word/2010/wordprocessingDrawing" xmlns:wp="http://schemas.openxmlformats.org/drawingml/2006/wordprocessingDrawing" xmlns:w10="urn:schemas-microsoft-com:office:word" xmlns:w="http://schemas.openxmlformats.org/wordprocessingml/2006/main" xmlns:w14="http://schemas.microsoft.com/office/word/2010/wordml" xmlns:w15="http://schemas.microsoft.com/office/word/2012/wordml" xmlns:w16cex="http://schemas.microsoft.com/office/word/2018/wordml/cex" xmlns:w16cid="http://schemas.microsoft.com/office/word/2016/wordml/cid" xmlns:w16="http://schemas.microsoft.com/office/word/2018/wordml" xmlns:w16du="http://schemas.microsoft.com/office/word/2023/wordml/word16du" xmlns:w16sdtdh="http://schemas.microsoft.com/office/word/2020/wordml/sdtdatahash" xmlns:w16sdtfl="http://schemas.microsoft.com/office/word/2024/wordml/sdtformatlock" xmlns:w16se="http://schemas.microsoft.com/office/word/2015/wordml/symex" xmlns:wpg="http://schemas.microsoft.com/office/word/2010/wordprocessingGroup" xmlns:wpi="http://schemas.microsoft.com/office/word/2010/wordprocessingInk" xmlns:wne="http://schemas.microsoft.com/office/word/2006/wordml" xmlns:wps="http://schemas.microsoft.com/office/word/2010/wordprocessingShape" mc:Ignorable="w14 w15 w16se w16cid w16 w16cex w16sdtdh w16sdtfl w16du wp14">
+<w:endnotes xmlns:wpc="http://schemas.microsoft.com/office/word/2010/wordprocessingCanvas" xmlns:cx="http://schemas.microsoft.com/office/drawing/2014/chartex" xmlns:mc="http://schemas.openxmlformats.org/markup-compatibility/2006" xmlns:o="urn:schemas-microsoft-com:office:office" xmlns:r="http://schemas.openxmlformats.org/officeDocument/2006/relationships" xmlns:m="http://schemas.openxmlformats.org/officeDocument/2006/math" xmlns:v="urn:schemas-microsoft-com:vml" xmlns:wp14="http://schemas.microsoft.com/office/word/2010/wordprocessingDrawing" xmlns:wp="http://schemas.openxmlformats.org/drawingml/2006/wordprocessingDrawing" xmlns:w10="urn:schemas-microsoft-com:office:word" xmlns:w="http://schemas.openxmlformats.org/wordprocessingml/2006/main" xmlns:w14="http://schemas.microsoft.com/office/word/2010/wordml" xmlns:w15="http://schemas.microsoft.com/office/word/2012/wordml" xmlns:w16se="http://schemas.microsoft.com/office/word/2015/wordml/symex" xmlns:wpg="http://schemas.microsoft.com/office/word/2010/wordprocessingGroup" xmlns:wpi="http://schemas.microsoft.com/office/word/2010/wordprocessingInk" xmlns:wne="http://schemas.microsoft.com/office/word/2006/wordml" xmlns:wps="http://schemas.microsoft.com/office/word/2010/wordprocessingShape" mc:Ignorable="w14 w15 w16se wp14">
   <w:endnote w:type="separator" w:id="-1">
     <w:p>
       <w:pPr>
@@ -8352,7 +8529,7 @@
 </file>
 
 <file path=word/footer1.xml><?xml version="1.0" encoding="utf-8"?>
-<w:ftr xmlns:wpc="http://schemas.microsoft.com/office/word/2010/wordprocessingCanvas" xmlns:cx="http://schemas.microsoft.com/office/drawing/2014/chartex" xmlns:cx1="http://schemas.microsoft.com/office/drawing/2015/9/8/chartex" xmlns:cx2="http://schemas.microsoft.com/office/drawing/2015/10/21/chartex" xmlns:cx3="http://schemas.microsoft.com/office/drawing/2016/5/9/chartex" xmlns:cx4="http://schemas.microsoft.com/office/drawing/2016/5/10/chartex" xmlns:cx5="http://schemas.microsoft.com/office/drawing/2016/5/11/chartex" xmlns:cx6="http://schemas.microsoft.com/office/drawing/2016/5/12/chartex" xmlns:cx7="http://schemas.microsoft.com/office/drawing/2016/5/13/chartex" xmlns:cx8="http://schemas.microsoft.com/office/drawing/2016/5/14/chartex" xmlns:mc="http://schemas.openxmlformats.org/markup-compatibility/2006" xmlns:aink="http://schemas.microsoft.com/office/drawing/2016/ink" xmlns:am3d="http://schemas.microsoft.com/office/drawing/2017/model3d" xmlns:o="urn:schemas-microsoft-com:office:office" xmlns:oel="http://schemas.microsoft.com/office/2019/extlst" xmlns:r="http://schemas.openxmlformats.org/officeDocument/2006/relationships" xmlns:m="http://schemas.openxmlformats.org/officeDocument/2006/math" xmlns:v="urn:schemas-microsoft-com:vml" xmlns:wp14="http://schemas.microsoft.com/office/word/2010/wordprocessingDrawing" xmlns:wp="http://schemas.openxmlformats.org/drawingml/2006/wordprocessingDrawing" xmlns:w10="urn:schemas-microsoft-com:office:word" xmlns:w="http://schemas.openxmlformats.org/wordprocessingml/2006/main" xmlns:w14="http://schemas.microsoft.com/office/word/2010/wordml" xmlns:w15="http://schemas.microsoft.com/office/word/2012/wordml" xmlns:w16cex="http://schemas.microsoft.com/office/word/2018/wordml/cex" xmlns:w16cid="http://schemas.microsoft.com/office/word/2016/wordml/cid" xmlns:w16="http://schemas.microsoft.com/office/word/2018/wordml" xmlns:w16du="http://schemas.microsoft.com/office/word/2023/wordml/word16du" xmlns:w16sdtdh="http://schemas.microsoft.com/office/word/2020/wordml/sdtdatahash" xmlns:w16sdtfl="http://schemas.microsoft.com/office/word/2024/wordml/sdtformatlock" xmlns:w16se="http://schemas.microsoft.com/office/word/2015/wordml/symex" xmlns:wpg="http://schemas.microsoft.com/office/word/2010/wordprocessingGroup" xmlns:wpi="http://schemas.microsoft.com/office/word/2010/wordprocessingInk" xmlns:wne="http://schemas.microsoft.com/office/word/2006/wordml" xmlns:wps="http://schemas.microsoft.com/office/word/2010/wordprocessingShape" mc:Ignorable="w14 w15 w16se w16cid w16 w16cex w16sdtdh w16sdtfl w16du wp14">
+<w:ftr xmlns:wpc="http://schemas.microsoft.com/office/word/2010/wordprocessingCanvas" xmlns:cx="http://schemas.microsoft.com/office/drawing/2014/chartex" xmlns:mc="http://schemas.openxmlformats.org/markup-compatibility/2006" xmlns:o="urn:schemas-microsoft-com:office:office" xmlns:r="http://schemas.openxmlformats.org/officeDocument/2006/relationships" xmlns:m="http://schemas.openxmlformats.org/officeDocument/2006/math" xmlns:v="urn:schemas-microsoft-com:vml" xmlns:wp14="http://schemas.microsoft.com/office/word/2010/wordprocessingDrawing" xmlns:wp="http://schemas.openxmlformats.org/drawingml/2006/wordprocessingDrawing" xmlns:w10="urn:schemas-microsoft-com:office:word" xmlns:w="http://schemas.openxmlformats.org/wordprocessingml/2006/main" xmlns:w14="http://schemas.microsoft.com/office/word/2010/wordml" xmlns:w15="http://schemas.microsoft.com/office/word/2012/wordml" xmlns:w16se="http://schemas.microsoft.com/office/word/2015/wordml/symex" xmlns:wpg="http://schemas.microsoft.com/office/word/2010/wordprocessingGroup" xmlns:wpi="http://schemas.microsoft.com/office/word/2010/wordprocessingInk" xmlns:wne="http://schemas.microsoft.com/office/word/2006/wordml" xmlns:wps="http://schemas.microsoft.com/office/word/2010/wordprocessingShape" mc:Ignorable="w14 w15 w16se wp14">
   <w:p>
     <w:pPr>
       <w:pStyle w:val="Rodap"/>
@@ -8362,7 +8539,7 @@
 </file>
 
 <file path=word/footnotes.xml><?xml version="1.0" encoding="utf-8"?>
-<w:footnotes xmlns:wpc="http://schemas.microsoft.com/office/word/2010/wordprocessingCanvas" xmlns:cx="http://schemas.microsoft.com/office/drawing/2014/chartex" xmlns:cx1="http://schemas.microsoft.com/office/drawing/2015/9/8/chartex" xmlns:cx2="http://schemas.microsoft.com/office/drawing/2015/10/21/chartex" xmlns:cx3="http://schemas.microsoft.com/office/drawing/2016/5/9/chartex" xmlns:cx4="http://schemas.microsoft.com/office/drawing/2016/5/10/chartex" xmlns:cx5="http://schemas.microsoft.com/office/drawing/2016/5/11/chartex" xmlns:cx6="http://schemas.microsoft.com/office/drawing/2016/5/12/chartex" xmlns:cx7="http://schemas.microsoft.com/office/drawing/2016/5/13/chartex" xmlns:cx8="http://schemas.microsoft.com/office/drawing/2016/5/14/chartex" xmlns:mc="http://schemas.openxmlformats.org/markup-compatibility/2006" xmlns:aink="http://schemas.microsoft.com/office/drawing/2016/ink" xmlns:am3d="http://schemas.microsoft.com/office/drawing/2017/model3d" xmlns:o="urn:schemas-microsoft-com:office:office" xmlns:oel="http://schemas.microsoft.com/office/2019/extlst" xmlns:r="http://schemas.openxmlformats.org/officeDocument/2006/relationships" xmlns:m="http://schemas.openxmlformats.org/officeDocument/2006/math" xmlns:v="urn:schemas-microsoft-com:vml" xmlns:wp14="http://schemas.microsoft.com/office/word/2010/wordprocessingDrawing" xmlns:wp="http://schemas.openxmlformats.org/drawingml/2006/wordprocessingDrawing" xmlns:w10="urn:schemas-microsoft-com:office:word" xmlns:w="http://schemas.openxmlformats.org/wordprocessingml/2006/main" xmlns:w14="http://schemas.microsoft.com/office/word/2010/wordml" xmlns:w15="http://schemas.microsoft.com/office/word/2012/wordml" xmlns:w16cex="http://schemas.microsoft.com/office/word/2018/wordml/cex" xmlns:w16cid="http://schemas.microsoft.com/office/word/2016/wordml/cid" xmlns:w16="http://schemas.microsoft.com/office/word/2018/wordml" xmlns:w16du="http://schemas.microsoft.com/office/word/2023/wordml/word16du" xmlns:w16sdtdh="http://schemas.microsoft.com/office/word/2020/wordml/sdtdatahash" xmlns:w16sdtfl="http://schemas.microsoft.com/office/word/2024/wordml/sdtformatlock" xmlns:w16se="http://schemas.microsoft.com/office/word/2015/wordml/symex" xmlns:wpg="http://schemas.microsoft.com/office/word/2010/wordprocessingGroup" xmlns:wpi="http://schemas.microsoft.com/office/word/2010/wordprocessingInk" xmlns:wne="http://schemas.microsoft.com/office/word/2006/wordml" xmlns:wps="http://schemas.microsoft.com/office/word/2010/wordprocessingShape" mc:Ignorable="w14 w15 w16se w16cid w16 w16cex w16sdtdh w16sdtfl w16du wp14">
+<w:footnotes xmlns:wpc="http://schemas.microsoft.com/office/word/2010/wordprocessingCanvas" xmlns:cx="http://schemas.microsoft.com/office/drawing/2014/chartex" xmlns:mc="http://schemas.openxmlformats.org/markup-compatibility/2006" xmlns:o="urn:schemas-microsoft-com:office:office" xmlns:r="http://schemas.openxmlformats.org/officeDocument/2006/relationships" xmlns:m="http://schemas.openxmlformats.org/officeDocument/2006/math" xmlns:v="urn:schemas-microsoft-com:vml" xmlns:wp14="http://schemas.microsoft.com/office/word/2010/wordprocessingDrawing" xmlns:wp="http://schemas.openxmlformats.org/drawingml/2006/wordprocessingDrawing" xmlns:w10="urn:schemas-microsoft-com:office:word" xmlns:w="http://schemas.openxmlformats.org/wordprocessingml/2006/main" xmlns:w14="http://schemas.microsoft.com/office/word/2010/wordml" xmlns:w15="http://schemas.microsoft.com/office/word/2012/wordml" xmlns:w16se="http://schemas.microsoft.com/office/word/2015/wordml/symex" xmlns:wpg="http://schemas.microsoft.com/office/word/2010/wordprocessingGroup" xmlns:wpi="http://schemas.microsoft.com/office/word/2010/wordprocessingInk" xmlns:wne="http://schemas.microsoft.com/office/word/2006/wordml" xmlns:wps="http://schemas.microsoft.com/office/word/2010/wordprocessingShape" mc:Ignorable="w14 w15 w16se wp14">
   <w:footnote w:type="separator" w:id="-1">
     <w:p>
       <w:r>
@@ -8381,7 +8558,7 @@
 </file>
 
 <file path=word/header1.xml><?xml version="1.0" encoding="utf-8"?>
-<w:hdr xmlns:wpc="http://schemas.microsoft.com/office/word/2010/wordprocessingCanvas" xmlns:cx="http://schemas.microsoft.com/office/drawing/2014/chartex" xmlns:cx1="http://schemas.microsoft.com/office/drawing/2015/9/8/chartex" xmlns:cx2="http://schemas.microsoft.com/office/drawing/2015/10/21/chartex" xmlns:cx3="http://schemas.microsoft.com/office/drawing/2016/5/9/chartex" xmlns:cx4="http://schemas.microsoft.com/office/drawing/2016/5/10/chartex" xmlns:cx5="http://schemas.microsoft.com/office/drawing/2016/5/11/chartex" xmlns:cx6="http://schemas.microsoft.com/office/drawing/2016/5/12/chartex" xmlns:cx7="http://schemas.microsoft.com/office/drawing/2016/5/13/chartex" xmlns:cx8="http://schemas.microsoft.com/office/drawing/2016/5/14/chartex" xmlns:mc="http://schemas.openxmlformats.org/markup-compatibility/2006" xmlns:aink="http://schemas.microsoft.com/office/drawing/2016/ink" xmlns:am3d="http://schemas.microsoft.com/office/drawing/2017/model3d" xmlns:o="urn:schemas-microsoft-com:office:office" xmlns:oel="http://schemas.microsoft.com/office/2019/extlst" xmlns:r="http://schemas.openxmlformats.org/officeDocument/2006/relationships" xmlns:m="http://schemas.openxmlformats.org/officeDocument/2006/math" xmlns:v="urn:schemas-microsoft-com:vml" xmlns:wp14="http://schemas.microsoft.com/office/word/2010/wordprocessingDrawing" xmlns:wp="http://schemas.openxmlformats.org/drawingml/2006/wordprocessingDrawing" xmlns:w10="urn:schemas-microsoft-com:office:word" xmlns:w="http://schemas.openxmlformats.org/wordprocessingml/2006/main" xmlns:w14="http://schemas.microsoft.com/office/word/2010/wordml" xmlns:w15="http://schemas.microsoft.com/office/word/2012/wordml" xmlns:w16cex="http://schemas.microsoft.com/office/word/2018/wordml/cex" xmlns:w16cid="http://schemas.microsoft.com/office/word/2016/wordml/cid" xmlns:w16="http://schemas.microsoft.com/office/word/2018/wordml" xmlns:w16du="http://schemas.microsoft.com/office/word/2023/wordml/word16du" xmlns:w16sdtdh="http://schemas.microsoft.com/office/word/2020/wordml/sdtdatahash" xmlns:w16sdtfl="http://schemas.microsoft.com/office/word/2024/wordml/sdtformatlock" xmlns:w16se="http://schemas.microsoft.com/office/word/2015/wordml/symex" xmlns:wpg="http://schemas.microsoft.com/office/word/2010/wordprocessingGroup" xmlns:wpi="http://schemas.microsoft.com/office/word/2010/wordprocessingInk" xmlns:wne="http://schemas.microsoft.com/office/word/2006/wordml" xmlns:wps="http://schemas.microsoft.com/office/word/2010/wordprocessingShape" mc:Ignorable="w14 w15 w16se w16cid w16 w16cex w16sdtdh w16sdtfl w16du wp14">
+<w:hdr xmlns:wpc="http://schemas.microsoft.com/office/word/2010/wordprocessingCanvas" xmlns:cx="http://schemas.microsoft.com/office/drawing/2014/chartex" xmlns:mc="http://schemas.openxmlformats.org/markup-compatibility/2006" xmlns:o="urn:schemas-microsoft-com:office:office" xmlns:r="http://schemas.openxmlformats.org/officeDocument/2006/relationships" xmlns:m="http://schemas.openxmlformats.org/officeDocument/2006/math" xmlns:v="urn:schemas-microsoft-com:vml" xmlns:wp14="http://schemas.microsoft.com/office/word/2010/wordprocessingDrawing" xmlns:wp="http://schemas.openxmlformats.org/drawingml/2006/wordprocessingDrawing" xmlns:w10="urn:schemas-microsoft-com:office:word" xmlns:w="http://schemas.openxmlformats.org/wordprocessingml/2006/main" xmlns:w14="http://schemas.microsoft.com/office/word/2010/wordml" xmlns:w15="http://schemas.microsoft.com/office/word/2012/wordml" xmlns:w16se="http://schemas.microsoft.com/office/word/2015/wordml/symex" xmlns:wpg="http://schemas.microsoft.com/office/word/2010/wordprocessingGroup" xmlns:wpi="http://schemas.microsoft.com/office/word/2010/wordprocessingInk" xmlns:wne="http://schemas.microsoft.com/office/word/2006/wordml" xmlns:wps="http://schemas.microsoft.com/office/word/2010/wordprocessingShape" mc:Ignorable="w14 w15 w16se wp14">
   <w:p>
     <w:pPr>
       <w:pStyle w:val="Cabealho"/>
@@ -8397,7 +8574,7 @@
 </file>
 
 <file path=word/header2.xml><?xml version="1.0" encoding="utf-8"?>
-<w:hdr xmlns:wpc="http://schemas.microsoft.com/office/word/2010/wordprocessingCanvas" xmlns:cx="http://schemas.microsoft.com/office/drawing/2014/chartex" xmlns:cx1="http://schemas.microsoft.com/office/drawing/2015/9/8/chartex" xmlns:cx2="http://schemas.microsoft.com/office/drawing/2015/10/21/chartex" xmlns:cx3="http://schemas.microsoft.com/office/drawing/2016/5/9/chartex" xmlns:cx4="http://schemas.microsoft.com/office/drawing/2016/5/10/chartex" xmlns:cx5="http://schemas.microsoft.com/office/drawing/2016/5/11/chartex" xmlns:cx6="http://schemas.microsoft.com/office/drawing/2016/5/12/chartex" xmlns:cx7="http://schemas.microsoft.com/office/drawing/2016/5/13/chartex" xmlns:cx8="http://schemas.microsoft.com/office/drawing/2016/5/14/chartex" xmlns:mc="http://schemas.openxmlformats.org/markup-compatibility/2006" xmlns:aink="http://schemas.microsoft.com/office/drawing/2016/ink" xmlns:am3d="http://schemas.microsoft.com/office/drawing/2017/model3d" xmlns:o="urn:schemas-microsoft-com:office:office" xmlns:oel="http://schemas.microsoft.com/office/2019/extlst" xmlns:r="http://schemas.openxmlformats.org/officeDocument/2006/relationships" xmlns:m="http://schemas.openxmlformats.org/officeDocument/2006/math" xmlns:v="urn:schemas-microsoft-com:vml" xmlns:wp14="http://schemas.microsoft.com/office/word/2010/wordprocessingDrawing" xmlns:wp="http://schemas.openxmlformats.org/drawingml/2006/wordprocessingDrawing" xmlns:w10="urn:schemas-microsoft-com:office:word" xmlns:w="http://schemas.openxmlformats.org/wordprocessingml/2006/main" xmlns:w14="http://schemas.microsoft.com/office/word/2010/wordml" xmlns:w15="http://schemas.microsoft.com/office/word/2012/wordml" xmlns:w16cex="http://schemas.microsoft.com/office/word/2018/wordml/cex" xmlns:w16cid="http://schemas.microsoft.com/office/word/2016/wordml/cid" xmlns:w16="http://schemas.microsoft.com/office/word/2018/wordml" xmlns:w16du="http://schemas.microsoft.com/office/word/2023/wordml/word16du" xmlns:w16sdtdh="http://schemas.microsoft.com/office/word/2020/wordml/sdtdatahash" xmlns:w16sdtfl="http://schemas.microsoft.com/office/word/2024/wordml/sdtformatlock" xmlns:w16se="http://schemas.microsoft.com/office/word/2015/wordml/symex" xmlns:wpg="http://schemas.microsoft.com/office/word/2010/wordprocessingGroup" xmlns:wpi="http://schemas.microsoft.com/office/word/2010/wordprocessingInk" xmlns:wne="http://schemas.microsoft.com/office/word/2006/wordml" xmlns:wps="http://schemas.microsoft.com/office/word/2010/wordprocessingShape" mc:Ignorable="w14 w15 w16se w16cid w16 w16cex w16sdtdh w16sdtfl w16du wp14">
+<w:hdr xmlns:wpc="http://schemas.microsoft.com/office/word/2010/wordprocessingCanvas" xmlns:cx="http://schemas.microsoft.com/office/drawing/2014/chartex" xmlns:mc="http://schemas.openxmlformats.org/markup-compatibility/2006" xmlns:o="urn:schemas-microsoft-com:office:office" xmlns:r="http://schemas.openxmlformats.org/officeDocument/2006/relationships" xmlns:m="http://schemas.openxmlformats.org/officeDocument/2006/math" xmlns:v="urn:schemas-microsoft-com:vml" xmlns:wp14="http://schemas.microsoft.com/office/word/2010/wordprocessingDrawing" xmlns:wp="http://schemas.openxmlformats.org/drawingml/2006/wordprocessingDrawing" xmlns:w10="urn:schemas-microsoft-com:office:word" xmlns:w="http://schemas.openxmlformats.org/wordprocessingml/2006/main" xmlns:w14="http://schemas.microsoft.com/office/word/2010/wordml" xmlns:w15="http://schemas.microsoft.com/office/word/2012/wordml" xmlns:w16se="http://schemas.microsoft.com/office/word/2015/wordml/symex" xmlns:wpg="http://schemas.microsoft.com/office/word/2010/wordprocessingGroup" xmlns:wpi="http://schemas.microsoft.com/office/word/2010/wordprocessingInk" xmlns:wne="http://schemas.microsoft.com/office/word/2006/wordml" xmlns:wps="http://schemas.microsoft.com/office/word/2010/wordprocessingShape" mc:Ignorable="w14 w15 w16se wp14">
   <w:sdt>
     <w:sdtPr>
       <w:id w:val="-1699001773"/>
@@ -8445,7 +8622,7 @@
             <w:sz w:val="20"/>
             <w:szCs w:val="20"/>
           </w:rPr>
-          <w:t>14</w:t>
+          <w:t>15</w:t>
         </w:r>
         <w:r>
           <w:rPr>
@@ -8461,7 +8638,7 @@
 </file>
 
 <file path=word/header3.xml><?xml version="1.0" encoding="utf-8"?>
-<w:hdr xmlns:wpc="http://schemas.microsoft.com/office/word/2010/wordprocessingCanvas" xmlns:cx="http://schemas.microsoft.com/office/drawing/2014/chartex" xmlns:cx1="http://schemas.microsoft.com/office/drawing/2015/9/8/chartex" xmlns:cx2="http://schemas.microsoft.com/office/drawing/2015/10/21/chartex" xmlns:cx3="http://schemas.microsoft.com/office/drawing/2016/5/9/chartex" xmlns:cx4="http://schemas.microsoft.com/office/drawing/2016/5/10/chartex" xmlns:cx5="http://schemas.microsoft.com/office/drawing/2016/5/11/chartex" xmlns:cx6="http://schemas.microsoft.com/office/drawing/2016/5/12/chartex" xmlns:cx7="http://schemas.microsoft.com/office/drawing/2016/5/13/chartex" xmlns:cx8="http://schemas.microsoft.com/office/drawing/2016/5/14/chartex" xmlns:mc="http://schemas.openxmlformats.org/markup-compatibility/2006" xmlns:aink="http://schemas.microsoft.com/office/drawing/2016/ink" xmlns:am3d="http://schemas.microsoft.com/office/drawing/2017/model3d" xmlns:o="urn:schemas-microsoft-com:office:office" xmlns:oel="http://schemas.microsoft.com/office/2019/extlst" xmlns:r="http://schemas.openxmlformats.org/officeDocument/2006/relationships" xmlns:m="http://schemas.openxmlformats.org/officeDocument/2006/math" xmlns:v="urn:schemas-microsoft-com:vml" xmlns:wp14="http://schemas.microsoft.com/office/word/2010/wordprocessingDrawing" xmlns:wp="http://schemas.openxmlformats.org/drawingml/2006/wordprocessingDrawing" xmlns:w10="urn:schemas-microsoft-com:office:word" xmlns:w="http://schemas.openxmlformats.org/wordprocessingml/2006/main" xmlns:w14="http://schemas.microsoft.com/office/word/2010/wordml" xmlns:w15="http://schemas.microsoft.com/office/word/2012/wordml" xmlns:w16cex="http://schemas.microsoft.com/office/word/2018/wordml/cex" xmlns:w16cid="http://schemas.microsoft.com/office/word/2016/wordml/cid" xmlns:w16="http://schemas.microsoft.com/office/word/2018/wordml" xmlns:w16du="http://schemas.microsoft.com/office/word/2023/wordml/word16du" xmlns:w16sdtdh="http://schemas.microsoft.com/office/word/2020/wordml/sdtdatahash" xmlns:w16sdtfl="http://schemas.microsoft.com/office/word/2024/wordml/sdtformatlock" xmlns:w16se="http://schemas.microsoft.com/office/word/2015/wordml/symex" xmlns:wpg="http://schemas.microsoft.com/office/word/2010/wordprocessingGroup" xmlns:wpi="http://schemas.microsoft.com/office/word/2010/wordprocessingInk" xmlns:wne="http://schemas.microsoft.com/office/word/2006/wordml" xmlns:wps="http://schemas.microsoft.com/office/word/2010/wordprocessingShape" mc:Ignorable="w14 w15 w16se w16cid w16 w16cex w16sdtdh w16sdtfl w16du wp14">
+<w:hdr xmlns:wpc="http://schemas.microsoft.com/office/word/2010/wordprocessingCanvas" xmlns:cx="http://schemas.microsoft.com/office/drawing/2014/chartex" xmlns:mc="http://schemas.openxmlformats.org/markup-compatibility/2006" xmlns:o="urn:schemas-microsoft-com:office:office" xmlns:r="http://schemas.openxmlformats.org/officeDocument/2006/relationships" xmlns:m="http://schemas.openxmlformats.org/officeDocument/2006/math" xmlns:v="urn:schemas-microsoft-com:vml" xmlns:wp14="http://schemas.microsoft.com/office/word/2010/wordprocessingDrawing" xmlns:wp="http://schemas.openxmlformats.org/drawingml/2006/wordprocessingDrawing" xmlns:w10="urn:schemas-microsoft-com:office:word" xmlns:w="http://schemas.openxmlformats.org/wordprocessingml/2006/main" xmlns:w14="http://schemas.microsoft.com/office/word/2010/wordml" xmlns:w15="http://schemas.microsoft.com/office/word/2012/wordml" xmlns:w16se="http://schemas.microsoft.com/office/word/2015/wordml/symex" xmlns:wpg="http://schemas.microsoft.com/office/word/2010/wordprocessingGroup" xmlns:wpi="http://schemas.microsoft.com/office/word/2010/wordprocessingInk" xmlns:wne="http://schemas.microsoft.com/office/word/2006/wordml" xmlns:wps="http://schemas.microsoft.com/office/word/2010/wordprocessingShape" mc:Ignorable="w14 w15 w16se wp14">
   <w:sdt>
     <w:sdtPr>
       <w:id w:val="958228592"/>
@@ -8509,7 +8686,7 @@
             <w:sz w:val="20"/>
             <w:szCs w:val="20"/>
           </w:rPr>
-          <w:t>4</w:t>
+          <w:t>22</w:t>
         </w:r>
         <w:r>
           <w:rPr>
@@ -8538,7 +8715,7 @@
 </file>
 
 <file path=word/numbering.xml><?xml version="1.0" encoding="utf-8"?>
-<w:numbering xmlns:wpc="http://schemas.microsoft.com/office/word/2010/wordprocessingCanvas" xmlns:cx="http://schemas.microsoft.com/office/drawing/2014/chartex" xmlns:cx1="http://schemas.microsoft.com/office/drawing/2015/9/8/chartex" xmlns:cx2="http://schemas.microsoft.com/office/drawing/2015/10/21/chartex" xmlns:cx3="http://schemas.microsoft.com/office/drawing/2016/5/9/chartex" xmlns:cx4="http://schemas.microsoft.com/office/drawing/2016/5/10/chartex" xmlns:cx5="http://schemas.microsoft.com/office/drawing/2016/5/11/chartex" xmlns:cx6="http://schemas.microsoft.com/office/drawing/2016/5/12/chartex" xmlns:cx7="http://schemas.microsoft.com/office/drawing/2016/5/13/chartex" xmlns:cx8="http://schemas.microsoft.com/office/drawing/2016/5/14/chartex" xmlns:mc="http://schemas.openxmlformats.org/markup-compatibility/2006" xmlns:aink="http://schemas.microsoft.com/office/drawing/2016/ink" xmlns:am3d="http://schemas.microsoft.com/office/drawing/2017/model3d" xmlns:o="urn:schemas-microsoft-com:office:office" xmlns:oel="http://schemas.microsoft.com/office/2019/extlst" xmlns:r="http://schemas.openxmlformats.org/officeDocument/2006/relationships" xmlns:m="http://schemas.openxmlformats.org/officeDocument/2006/math" xmlns:v="urn:schemas-microsoft-com:vml" xmlns:wp14="http://schemas.microsoft.com/office/word/2010/wordprocessingDrawing" xmlns:wp="http://schemas.openxmlformats.org/drawingml/2006/wordprocessingDrawing" xmlns:w10="urn:schemas-microsoft-com:office:word" xmlns:w="http://schemas.openxmlformats.org/wordprocessingml/2006/main" xmlns:w14="http://schemas.microsoft.com/office/word/2010/wordml" xmlns:w15="http://schemas.microsoft.com/office/word/2012/wordml" xmlns:w16cex="http://schemas.microsoft.com/office/word/2018/wordml/cex" xmlns:w16cid="http://schemas.microsoft.com/office/word/2016/wordml/cid" xmlns:w16="http://schemas.microsoft.com/office/word/2018/wordml" xmlns:w16du="http://schemas.microsoft.com/office/word/2023/wordml/word16du" xmlns:w16sdtdh="http://schemas.microsoft.com/office/word/2020/wordml/sdtdatahash" xmlns:w16sdtfl="http://schemas.microsoft.com/office/word/2024/wordml/sdtformatlock" xmlns:w16se="http://schemas.microsoft.com/office/word/2015/wordml/symex" xmlns:wpg="http://schemas.microsoft.com/office/word/2010/wordprocessingGroup" xmlns:wpi="http://schemas.microsoft.com/office/word/2010/wordprocessingInk" xmlns:wne="http://schemas.microsoft.com/office/word/2006/wordml" xmlns:wps="http://schemas.microsoft.com/office/word/2010/wordprocessingShape" mc:Ignorable="w14 w15 w16se w16cid w16 w16cex w16sdtdh w16sdtfl w16du wp14">
+<w:numbering xmlns:wpc="http://schemas.microsoft.com/office/word/2010/wordprocessingCanvas" xmlns:cx="http://schemas.microsoft.com/office/drawing/2014/chartex" xmlns:mc="http://schemas.openxmlformats.org/markup-compatibility/2006" xmlns:o="urn:schemas-microsoft-com:office:office" xmlns:r="http://schemas.openxmlformats.org/officeDocument/2006/relationships" xmlns:m="http://schemas.openxmlformats.org/officeDocument/2006/math" xmlns:v="urn:schemas-microsoft-com:vml" xmlns:wp14="http://schemas.microsoft.com/office/word/2010/wordprocessingDrawing" xmlns:wp="http://schemas.openxmlformats.org/drawingml/2006/wordprocessingDrawing" xmlns:w10="urn:schemas-microsoft-com:office:word" xmlns:w="http://schemas.openxmlformats.org/wordprocessingml/2006/main" xmlns:w14="http://schemas.microsoft.com/office/word/2010/wordml" xmlns:w15="http://schemas.microsoft.com/office/word/2012/wordml" xmlns:w16se="http://schemas.microsoft.com/office/word/2015/wordml/symex" xmlns:wpg="http://schemas.microsoft.com/office/word/2010/wordprocessingGroup" xmlns:wpi="http://schemas.microsoft.com/office/word/2010/wordprocessingInk" xmlns:wne="http://schemas.microsoft.com/office/word/2006/wordml" xmlns:wps="http://schemas.microsoft.com/office/word/2010/wordprocessingShape" mc:Ignorable="w14 w15 w16se wp14">
   <w:abstractNum w:abstractNumId="0" w15:restartNumberingAfterBreak="0">
     <w:nsid w:val="00AB5A76"/>
     <w:multiLevelType w:val="hybridMultilevel"/>
@@ -9333,7 +9510,7 @@
   <w:abstractNum w:abstractNumId="7" w15:restartNumberingAfterBreak="0">
     <w:nsid w:val="1A9E4A3A"/>
     <w:multiLevelType w:val="hybridMultilevel"/>
-    <w:tmpl w:val="F3A0E576"/>
+    <w:tmpl w:val="475033BE"/>
     <w:lvl w:ilvl="0" w:tplc="04160001">
       <w:start w:val="1"/>
       <w:numFmt w:val="bullet"/>
@@ -11340,86 +11517,86 @@
       </w:rPr>
     </w:lvl>
   </w:abstractNum>
-  <w:num w:numId="1" w16cid:durableId="1391878316">
+  <w:num w:numId="1">
     <w:abstractNumId w:val="6"/>
   </w:num>
-  <w:num w:numId="2" w16cid:durableId="1999840760">
+  <w:num w:numId="2">
     <w:abstractNumId w:val="11"/>
   </w:num>
-  <w:num w:numId="3" w16cid:durableId="844132717">
+  <w:num w:numId="3">
     <w:abstractNumId w:val="1"/>
   </w:num>
-  <w:num w:numId="4" w16cid:durableId="416026489">
+  <w:num w:numId="4">
     <w:abstractNumId w:val="10"/>
   </w:num>
-  <w:num w:numId="5" w16cid:durableId="1614827268">
+  <w:num w:numId="5">
     <w:abstractNumId w:val="20"/>
   </w:num>
-  <w:num w:numId="6" w16cid:durableId="384305432">
+  <w:num w:numId="6">
     <w:abstractNumId w:val="19"/>
   </w:num>
-  <w:num w:numId="7" w16cid:durableId="1920871006">
+  <w:num w:numId="7">
     <w:abstractNumId w:val="21"/>
   </w:num>
-  <w:num w:numId="8" w16cid:durableId="1582638965">
+  <w:num w:numId="8">
     <w:abstractNumId w:val="4"/>
   </w:num>
-  <w:num w:numId="9" w16cid:durableId="1164201422">
+  <w:num w:numId="9">
     <w:abstractNumId w:val="22"/>
   </w:num>
-  <w:num w:numId="10" w16cid:durableId="1168517985">
+  <w:num w:numId="10">
     <w:abstractNumId w:val="2"/>
   </w:num>
-  <w:num w:numId="11" w16cid:durableId="422191558">
+  <w:num w:numId="11">
     <w:abstractNumId w:val="23"/>
   </w:num>
-  <w:num w:numId="12" w16cid:durableId="218831984">
+  <w:num w:numId="12">
     <w:abstractNumId w:val="24"/>
   </w:num>
-  <w:num w:numId="13" w16cid:durableId="311180230">
+  <w:num w:numId="13">
     <w:abstractNumId w:val="16"/>
   </w:num>
-  <w:num w:numId="14" w16cid:durableId="381711604">
+  <w:num w:numId="14">
     <w:abstractNumId w:val="14"/>
   </w:num>
-  <w:num w:numId="15" w16cid:durableId="1101413200">
+  <w:num w:numId="15">
     <w:abstractNumId w:val="12"/>
   </w:num>
-  <w:num w:numId="16" w16cid:durableId="1801728214">
+  <w:num w:numId="16">
     <w:abstractNumId w:val="15"/>
   </w:num>
-  <w:num w:numId="17" w16cid:durableId="740522202">
+  <w:num w:numId="17">
     <w:abstractNumId w:val="9"/>
   </w:num>
-  <w:num w:numId="18" w16cid:durableId="2098403571">
+  <w:num w:numId="18">
     <w:abstractNumId w:val="3"/>
   </w:num>
-  <w:num w:numId="19" w16cid:durableId="1999072756">
+  <w:num w:numId="19">
     <w:abstractNumId w:val="18"/>
   </w:num>
-  <w:num w:numId="20" w16cid:durableId="590234696">
+  <w:num w:numId="20">
     <w:abstractNumId w:val="8"/>
   </w:num>
-  <w:num w:numId="21" w16cid:durableId="1550730252">
+  <w:num w:numId="21">
     <w:abstractNumId w:val="0"/>
   </w:num>
-  <w:num w:numId="22" w16cid:durableId="483548465">
+  <w:num w:numId="22">
     <w:abstractNumId w:val="7"/>
   </w:num>
-  <w:num w:numId="23" w16cid:durableId="419522687">
+  <w:num w:numId="23">
     <w:abstractNumId w:val="5"/>
   </w:num>
-  <w:num w:numId="24" w16cid:durableId="153375711">
+  <w:num w:numId="24">
     <w:abstractNumId w:val="17"/>
   </w:num>
-  <w:num w:numId="25" w16cid:durableId="174809279">
+  <w:num w:numId="25">
     <w:abstractNumId w:val="13"/>
   </w:num>
 </w:numbering>
 </file>
 
 <file path=word/styles.xml><?xml version="1.0" encoding="utf-8"?>
-<w:styles xmlns:mc="http://schemas.openxmlformats.org/markup-compatibility/2006" xmlns:r="http://schemas.openxmlformats.org/officeDocument/2006/relationships" xmlns:w="http://schemas.openxmlformats.org/wordprocessingml/2006/main" xmlns:w14="http://schemas.microsoft.com/office/word/2010/wordml" xmlns:w15="http://schemas.microsoft.com/office/word/2012/wordml" xmlns:w16cex="http://schemas.microsoft.com/office/word/2018/wordml/cex" xmlns:w16cid="http://schemas.microsoft.com/office/word/2016/wordml/cid" xmlns:w16="http://schemas.microsoft.com/office/word/2018/wordml" xmlns:w16du="http://schemas.microsoft.com/office/word/2023/wordml/word16du" xmlns:w16sdtdh="http://schemas.microsoft.com/office/word/2020/wordml/sdtdatahash" xmlns:w16sdtfl="http://schemas.microsoft.com/office/word/2024/wordml/sdtformatlock" xmlns:w16se="http://schemas.microsoft.com/office/word/2015/wordml/symex" mc:Ignorable="w14 w15 w16se w16cid w16 w16cex w16sdtdh w16sdtfl w16du">
+<w:styles xmlns:mc="http://schemas.openxmlformats.org/markup-compatibility/2006" xmlns:r="http://schemas.openxmlformats.org/officeDocument/2006/relationships" xmlns:w="http://schemas.openxmlformats.org/wordprocessingml/2006/main" xmlns:w14="http://schemas.microsoft.com/office/word/2010/wordml" xmlns:w15="http://schemas.microsoft.com/office/word/2012/wordml" xmlns:w16se="http://schemas.microsoft.com/office/word/2015/wordml/symex" mc:Ignorable="w14 w15 w16se">
   <w:docDefaults>
     <w:rPrDefault>
       <w:rPr>
@@ -11429,7 +11606,7 @@
     </w:rPrDefault>
     <w:pPrDefault/>
   </w:docDefaults>
-  <w:latentStyles w:defLockedState="0" w:defUIPriority="99" w:defSemiHidden="0" w:defUnhideWhenUsed="0" w:defQFormat="0" w:count="376">
+  <w:latentStyles w:defLockedState="0" w:defUIPriority="99" w:defSemiHidden="0" w:defUnhideWhenUsed="0" w:defQFormat="0" w:count="371">
     <w:lsdException w:name="Normal" w:uiPriority="0" w:qFormat="1"/>
     <w:lsdException w:name="heading 1" w:uiPriority="9" w:qFormat="1"/>
     <w:lsdException w:name="heading 2" w:uiPriority="9" w:unhideWhenUsed="1" w:qFormat="1"/>
@@ -11801,11 +11978,6 @@
     <w:lsdException w:name="List Table 5 Dark Accent 6" w:uiPriority="50"/>
     <w:lsdException w:name="List Table 6 Colorful Accent 6" w:uiPriority="51"/>
     <w:lsdException w:name="List Table 7 Colorful Accent 6" w:uiPriority="52"/>
-    <w:lsdException w:name="Mention" w:semiHidden="1" w:unhideWhenUsed="1"/>
-    <w:lsdException w:name="Smart Hyperlink" w:semiHidden="1" w:unhideWhenUsed="1"/>
-    <w:lsdException w:name="Hashtag" w:semiHidden="1" w:unhideWhenUsed="1"/>
-    <w:lsdException w:name="Unresolved Mention" w:semiHidden="1" w:unhideWhenUsed="1"/>
-    <w:lsdException w:name="Smart Link" w:semiHidden="1" w:unhideWhenUsed="1"/>
   </w:latentStyles>
   <w:style w:type="paragraph" w:default="1" w:styleId="Normal">
     <w:name w:val="Normal"/>
@@ -11984,6 +12156,7 @@
   <w:style w:type="character" w:default="1" w:styleId="Fontepargpadro">
     <w:name w:val="Default Paragraph Font"/>
     <w:uiPriority w:val="1"/>
+    <w:semiHidden/>
     <w:unhideWhenUsed/>
   </w:style>
   <w:style w:type="table" w:default="1" w:styleId="Tabelanormal">
@@ -12785,7 +12958,7 @@
       <w:rFonts w:ascii="Courier New" w:eastAsia="Times New Roman" w:hAnsi="Courier New" w:cs="Courier New"/>
     </w:rPr>
   </w:style>
-  <w:style w:type="character" w:styleId="MenoPendente">
+  <w:style w:type="character" w:customStyle="1" w:styleId="UnresolvedMention">
     <w:name w:val="Unresolved Mention"/>
     <w:basedOn w:val="Fontepargpadro"/>
     <w:uiPriority w:val="99"/>
@@ -13030,7 +13203,7 @@
 </file>
 
 <file path=customXml/itemProps1.xml><?xml version="1.0" encoding="utf-8"?>
-<ds:datastoreItem xmlns:ds="http://schemas.openxmlformats.org/officeDocument/2006/customXml" ds:itemID="{304375EA-F9CA-49B2-940F-4F75A375B12E}">
+<ds:datastoreItem xmlns:ds="http://schemas.openxmlformats.org/officeDocument/2006/customXml" ds:itemID="{F378F67F-B58E-4D52-B5BC-8FD384A0F951}">
   <ds:schemaRefs>
     <ds:schemaRef ds:uri="http://schemas.openxmlformats.org/officeDocument/2006/bibliography"/>
   </ds:schemaRefs>

</xml_diff>

<commit_message>
Atualizando a documentação e corrigindo o diagrama de casos de uso - 21/04/2026
</commit_message>
<xml_diff>
--- a/Terceiro_Semestre/Projeto_Integrador/Documentação/Modelo_Projeto_Integrador_principal.docx
+++ b/Terceiro_Semestre/Projeto_Integrador/Documentação/Modelo_Projeto_Integrador_principal.docx
@@ -1,6 +1,6 @@
 
 <file path=word/document.xml><?xml version="1.0" encoding="utf-8"?>
-<w:document xmlns:wpc="http://schemas.microsoft.com/office/word/2010/wordprocessingCanvas" xmlns:cx="http://schemas.microsoft.com/office/drawing/2014/chartex" xmlns:mc="http://schemas.openxmlformats.org/markup-compatibility/2006" xmlns:o="urn:schemas-microsoft-com:office:office" xmlns:r="http://schemas.openxmlformats.org/officeDocument/2006/relationships" xmlns:m="http://schemas.openxmlformats.org/officeDocument/2006/math" xmlns:v="urn:schemas-microsoft-com:vml" xmlns:wp14="http://schemas.microsoft.com/office/word/2010/wordprocessingDrawing" xmlns:wp="http://schemas.openxmlformats.org/drawingml/2006/wordprocessingDrawing" xmlns:w10="urn:schemas-microsoft-com:office:word" xmlns:w="http://schemas.openxmlformats.org/wordprocessingml/2006/main" xmlns:w14="http://schemas.microsoft.com/office/word/2010/wordml" xmlns:w15="http://schemas.microsoft.com/office/word/2012/wordml" xmlns:w16se="http://schemas.microsoft.com/office/word/2015/wordml/symex" xmlns:wpg="http://schemas.microsoft.com/office/word/2010/wordprocessingGroup" xmlns:wpi="http://schemas.microsoft.com/office/word/2010/wordprocessingInk" xmlns:wne="http://schemas.microsoft.com/office/word/2006/wordml" xmlns:wps="http://schemas.microsoft.com/office/word/2010/wordprocessingShape" mc:Ignorable="w14 w15 w16se wp14">
+<w:document xmlns:wpc="http://schemas.microsoft.com/office/word/2010/wordprocessingCanvas" xmlns:cx="http://schemas.microsoft.com/office/drawing/2014/chartex" xmlns:cx1="http://schemas.microsoft.com/office/drawing/2015/9/8/chartex" xmlns:cx2="http://schemas.microsoft.com/office/drawing/2015/10/21/chartex" xmlns:cx3="http://schemas.microsoft.com/office/drawing/2016/5/9/chartex" xmlns:cx4="http://schemas.microsoft.com/office/drawing/2016/5/10/chartex" xmlns:cx5="http://schemas.microsoft.com/office/drawing/2016/5/11/chartex" xmlns:cx6="http://schemas.microsoft.com/office/drawing/2016/5/12/chartex" xmlns:cx7="http://schemas.microsoft.com/office/drawing/2016/5/13/chartex" xmlns:cx8="http://schemas.microsoft.com/office/drawing/2016/5/14/chartex" xmlns:mc="http://schemas.openxmlformats.org/markup-compatibility/2006" xmlns:aink="http://schemas.microsoft.com/office/drawing/2016/ink" xmlns:am3d="http://schemas.microsoft.com/office/drawing/2017/model3d" xmlns:o="urn:schemas-microsoft-com:office:office" xmlns:oel="http://schemas.microsoft.com/office/2019/extlst" xmlns:r="http://schemas.openxmlformats.org/officeDocument/2006/relationships" xmlns:m="http://schemas.openxmlformats.org/officeDocument/2006/math" xmlns:v="urn:schemas-microsoft-com:vml" xmlns:wp14="http://schemas.microsoft.com/office/word/2010/wordprocessingDrawing" xmlns:wp="http://schemas.openxmlformats.org/drawingml/2006/wordprocessingDrawing" xmlns:w10="urn:schemas-microsoft-com:office:word" xmlns:w="http://schemas.openxmlformats.org/wordprocessingml/2006/main" xmlns:w14="http://schemas.microsoft.com/office/word/2010/wordml" xmlns:w15="http://schemas.microsoft.com/office/word/2012/wordml" xmlns:w16cex="http://schemas.microsoft.com/office/word/2018/wordml/cex" xmlns:w16cid="http://schemas.microsoft.com/office/word/2016/wordml/cid" xmlns:w16="http://schemas.microsoft.com/office/word/2018/wordml" xmlns:w16du="http://schemas.microsoft.com/office/word/2023/wordml/word16du" xmlns:w16sdtdh="http://schemas.microsoft.com/office/word/2020/wordml/sdtdatahash" xmlns:w16sdtfl="http://schemas.microsoft.com/office/word/2024/wordml/sdtformatlock" xmlns:w16se="http://schemas.microsoft.com/office/word/2015/wordml/symex" xmlns:wpg="http://schemas.microsoft.com/office/word/2010/wordprocessingGroup" xmlns:wpi="http://schemas.microsoft.com/office/word/2010/wordprocessingInk" xmlns:wne="http://schemas.microsoft.com/office/word/2006/wordml" xmlns:wps="http://schemas.microsoft.com/office/word/2010/wordprocessingShape" mc:Ignorable="w14 w15 w16se w16cid w16 w16cex w16sdtdh w16sdtfl w16du wp14">
   <w:body>
     <w:p>
       <w:pPr>
@@ -3238,13 +3238,13 @@
         </w:rPr>
         <w:lastRenderedPageBreak/>
         <w:drawing>
-          <wp:anchor distT="0" distB="0" distL="114300" distR="114300" simplePos="0" relativeHeight="251659264" behindDoc="0" locked="0" layoutInCell="1" allowOverlap="0" wp14:anchorId="4F43A484" wp14:editId="71C6C383">
+          <wp:anchor distT="0" distB="0" distL="114300" distR="114300" simplePos="0" relativeHeight="251659264" behindDoc="0" locked="0" layoutInCell="1" allowOverlap="0" wp14:anchorId="4F43A484" wp14:editId="27A18725">
             <wp:simplePos x="0" y="0"/>
-            <wp:positionH relativeFrom="margin">
-              <wp:align>left</wp:align>
+            <wp:positionH relativeFrom="page">
+              <wp:align>center</wp:align>
             </wp:positionH>
             <wp:positionV relativeFrom="page">
-              <wp:posOffset>1437640</wp:posOffset>
+              <wp:posOffset>1439777</wp:posOffset>
             </wp:positionV>
             <wp:extent cx="2188800" cy="8650800"/>
             <wp:effectExtent l="0" t="0" r="2540" b="0"/>
@@ -3810,6 +3810,13 @@
       </w:r>
       <w:r>
         <w:rPr>
+          <w:i w:val="0"/>
+          <w:iCs/>
+        </w:rPr>
+        <w:br/>
+      </w:r>
+      <w:r>
+        <w:rPr>
           <w:b w:val="0"/>
           <w:bCs w:val="0"/>
           <w:i w:val="0"/>
@@ -3826,30 +3833,131 @@
       </w:r>
     </w:p>
     <w:p>
-      <w:pPr>
-        <w:pStyle w:val="Ttulo3"/>
-        <w:jc w:val="both"/>
-        <w:rPr>
-          <w:b w:val="0"/>
-          <w:bCs w:val="0"/>
-          <w:i w:val="0"/>
-          <w:iCs/>
-        </w:rPr>
-      </w:pPr>
-      <w:r>
-        <w:rPr>
-          <w:b w:val="0"/>
-          <w:bCs w:val="0"/>
-          <w:i w:val="0"/>
-          <w:iCs/>
+      <w:r>
+        <w:rPr>
+          <w:b/>
+          <w:bCs/>
+        </w:rPr>
+        <w:t>Atores:</w:t>
+      </w:r>
+      <w:r>
+        <w:rPr>
+          <w:b/>
+          <w:bCs/>
+        </w:rPr>
+        <w:t xml:space="preserve"> </w:t>
+      </w:r>
+      <w:r>
+        <w:t>Diretor,</w:t>
+      </w:r>
+      <w:r>
+        <w:t xml:space="preserve"> coordenador e responsável d</w:t>
+      </w:r>
+      <w:r>
+        <w:t>e</w:t>
+      </w:r>
+      <w:r>
+        <w:t xml:space="preserve"> TI.</w:t>
+      </w:r>
+    </w:p>
+    <w:p>
+      <w:pPr>
+        <w:pStyle w:val="PargrafodaLista"/>
+        <w:numPr>
+          <w:ilvl w:val="0"/>
+          <w:numId w:val="22"/>
+        </w:numPr>
+        <w:rPr>
+          <w:b/>
+          <w:bCs/>
+        </w:rPr>
+      </w:pPr>
+      <w:r>
+        <w:rPr>
+          <w:b/>
+          <w:bCs/>
+        </w:rPr>
+        <w:t>RF01 - Autenticar usuário</w:t>
+      </w:r>
+    </w:p>
+    <w:p>
+      <w:pPr>
+        <w:pStyle w:val="PargrafodaLista"/>
+      </w:pPr>
+      <w:r>
+        <w:rPr>
+          <w:rStyle w:val="Forte"/>
+        </w:rPr>
+        <w:t>Atores:</w:t>
+      </w:r>
+      <w:r>
+        <w:t xml:space="preserve"> Diretor Acadêmico, Coordenador e Responsável de TI</w:t>
+      </w:r>
+      <w:r>
+        <w:br/>
+      </w:r>
+      <w:r>
+        <w:rPr>
+          <w:rStyle w:val="Forte"/>
+        </w:rPr>
+        <w:t>Descrição:</w:t>
+      </w:r>
+      <w:r>
+        <w:t xml:space="preserve"> O sistema deve permitir a autenticação dos usuários conforme seus perfis de acesso.</w:t>
+      </w:r>
+    </w:p>
+    <w:p>
+      <w:pPr>
+        <w:spacing w:line="240" w:lineRule="auto"/>
+        <w:contextualSpacing w:val="0"/>
+        <w:rPr>
+          <w:rStyle w:val="Forte"/>
+        </w:rPr>
+      </w:pPr>
+      <w:r>
+        <w:rPr>
+          <w:rStyle w:val="Forte"/>
+        </w:rPr>
+        <w:br w:type="page"/>
+      </w:r>
+    </w:p>
+    <w:p>
+      <w:pPr>
+        <w:pStyle w:val="PargrafodaLista"/>
+        <w:rPr>
+          <w:u w:val="single"/>
+        </w:rPr>
+      </w:pPr>
+      <w:r>
+        <w:rPr>
+          <w:b/>
+          <w:bCs/>
+        </w:rPr>
+        <w:lastRenderedPageBreak/>
+        <w:t>Ator:</w:t>
+      </w:r>
+      <w:r>
+        <w:t xml:space="preserve"> Diretor Acadêmico</w:t>
+      </w:r>
+    </w:p>
+    <w:p>
+      <w:r>
+        <w:rPr>
           <w:noProof/>
-          <w:lang w:eastAsia="pt-BR"/>
         </w:rPr>
         <w:drawing>
-          <wp:inline distT="0" distB="0" distL="0" distR="0" wp14:anchorId="2A507CE4" wp14:editId="7887DF02">
-            <wp:extent cx="5365686" cy="2395167"/>
-            <wp:effectExtent l="0" t="0" r="6985" b="5715"/>
-            <wp:docPr id="4" name="Imagem 4"/>
+          <wp:anchor distT="0" distB="0" distL="114300" distR="114300" simplePos="0" relativeHeight="251660288" behindDoc="1" locked="0" layoutInCell="1" allowOverlap="1" wp14:anchorId="2A5BC031" wp14:editId="08BE3FE0">
+            <wp:simplePos x="0" y="0"/>
+            <wp:positionH relativeFrom="page">
+              <wp:align>center</wp:align>
+            </wp:positionH>
+            <wp:positionV relativeFrom="paragraph">
+              <wp:posOffset>0</wp:posOffset>
+            </wp:positionV>
+            <wp:extent cx="2072640" cy="5379720"/>
+            <wp:effectExtent l="0" t="0" r="3810" b="0"/>
+            <wp:wrapTopAndBottom/>
+            <wp:docPr id="219989828" name="Imagem 1"/>
             <wp:cNvGraphicFramePr>
               <a:graphicFrameLocks xmlns:a="http://schemas.openxmlformats.org/drawingml/2006/main" noChangeAspect="1"/>
             </wp:cNvGraphicFramePr>
@@ -3857,7 +3965,7 @@
               <a:graphicData uri="http://schemas.openxmlformats.org/drawingml/2006/picture">
                 <pic:pic xmlns:pic="http://schemas.openxmlformats.org/drawingml/2006/picture">
                   <pic:nvPicPr>
-                    <pic:cNvPr id="4" name="casos_de_uso_projeto_integrador.drawio.png"/>
+                    <pic:cNvPr id="219989828" name="Imagem 219989828"/>
                     <pic:cNvPicPr/>
                   </pic:nvPicPr>
                   <pic:blipFill>
@@ -3875,7 +3983,7 @@
                   <pic:spPr>
                     <a:xfrm>
                       <a:off x="0" y="0"/>
-                      <a:ext cx="5365686" cy="2395167"/>
+                      <a:ext cx="2072640" cy="5379720"/>
                     </a:xfrm>
                     <a:prstGeom prst="rect">
                       <a:avLst/>
@@ -3884,7 +3992,7 @@
                 </pic:pic>
               </a:graphicData>
             </a:graphic>
-          </wp:inline>
+          </wp:anchor>
         </w:drawing>
       </w:r>
     </w:p>
@@ -3895,17 +4003,13 @@
           <w:ilvl w:val="0"/>
           <w:numId w:val="22"/>
         </w:numPr>
-        <w:rPr>
-          <w:b/>
-          <w:bCs/>
-        </w:rPr>
-      </w:pPr>
-      <w:r>
-        <w:rPr>
-          <w:b/>
-          <w:bCs/>
-        </w:rPr>
-        <w:t>RF01 - Autenticar usuário</w:t>
+      </w:pPr>
+      <w:r>
+        <w:rPr>
+          <w:b/>
+          <w:bCs/>
+        </w:rPr>
+        <w:t>RF02 - Cadastrar laboratório</w:t>
       </w:r>
     </w:p>
     <w:p>
@@ -3916,10 +4020,10 @@
         <w:rPr>
           <w:rStyle w:val="Forte"/>
         </w:rPr>
-        <w:t>Atores:</w:t>
-      </w:r>
-      <w:r>
-        <w:t xml:space="preserve"> Diretor Acadêmico, Coordenador e Responsável de TI</w:t>
+        <w:t>Ator:</w:t>
+      </w:r>
+      <w:r>
+        <w:t xml:space="preserve"> Diretor Acadêmico</w:t>
       </w:r>
       <w:r>
         <w:br/>
@@ -3931,7 +4035,7 @@
         <w:t>Descrição:</w:t>
       </w:r>
       <w:r>
-        <w:t xml:space="preserve"> O sistema deve permitir a autenticação dos usuários conforme seus perfis de acesso.</w:t>
+        <w:t xml:space="preserve"> O sistema deve permitir o cadastro de laboratórios de informática.</w:t>
       </w:r>
     </w:p>
     <w:p>
@@ -3941,13 +4045,17 @@
           <w:ilvl w:val="0"/>
           <w:numId w:val="22"/>
         </w:numPr>
-      </w:pPr>
-      <w:r>
-        <w:rPr>
-          <w:b/>
-          <w:bCs/>
-        </w:rPr>
-        <w:t>RF02 - Cadastrar laboratório</w:t>
+        <w:rPr>
+          <w:b/>
+          <w:bCs/>
+        </w:rPr>
+      </w:pPr>
+      <w:r>
+        <w:rPr>
+          <w:b/>
+          <w:bCs/>
+        </w:rPr>
+        <w:t>RF03 - Informar quantidade de computadores</w:t>
       </w:r>
     </w:p>
     <w:p>
@@ -3956,24 +4064,29 @@
       </w:pPr>
       <w:r>
         <w:rPr>
-          <w:rStyle w:val="Forte"/>
+          <w:b/>
         </w:rPr>
         <w:t>Ator:</w:t>
       </w:r>
       <w:r>
-        <w:t xml:space="preserve"> Diretor Acadêmico</w:t>
-      </w:r>
-      <w:r>
-        <w:br/>
-      </w:r>
-      <w:r>
-        <w:rPr>
-          <w:rStyle w:val="Forte"/>
+        <w:t xml:space="preserve"> Diretor Acadêmico.</w:t>
+      </w:r>
+    </w:p>
+    <w:p>
+      <w:pPr>
+        <w:pStyle w:val="PargrafodaLista"/>
+      </w:pPr>
+      <w:r>
+        <w:rPr>
+          <w:b/>
         </w:rPr>
         <w:t>Descrição:</w:t>
       </w:r>
       <w:r>
-        <w:t xml:space="preserve"> O sistema deve permitir o cadastro de laboratórios de informática.</w:t>
+        <w:t xml:space="preserve"> </w:t>
+      </w:r>
+      <w:r>
+        <w:t>O sistema deve permitir informar a quantidade de computadores de cada laboratório.</w:t>
       </w:r>
     </w:p>
     <w:p>
@@ -3993,7 +4106,7 @@
           <w:b/>
           <w:bCs/>
         </w:rPr>
-        <w:t>RF03 - Informar quantidade de computadores</w:t>
+        <w:t>RF04 - Definir capacidade de alunos</w:t>
       </w:r>
     </w:p>
     <w:p>
@@ -4004,7 +4117,6 @@
         <w:rPr>
           <w:b/>
         </w:rPr>
-        <w:lastRenderedPageBreak/>
         <w:t>Ator:</w:t>
       </w:r>
       <w:r>
@@ -4019,13 +4131,10 @@
         <w:rPr>
           <w:b/>
         </w:rPr>
-        <w:t>Descrição:</w:t>
-      </w:r>
-      <w:r>
-        <w:t xml:space="preserve"> </w:t>
-      </w:r>
-      <w:r>
-        <w:t>O sistema deve permitir informar a quantidade de computadores de cada laboratório.</w:t>
+        <w:t xml:space="preserve">Descrição: </w:t>
+      </w:r>
+      <w:r>
+        <w:t>O sistema deve permitir definir a capacidade máxima de alunos por laboratório.</w:t>
       </w:r>
     </w:p>
     <w:p>
@@ -4045,7 +4154,8 @@
           <w:b/>
           <w:bCs/>
         </w:rPr>
-        <w:t>RF04 - Definir capacidade de alunos</w:t>
+        <w:lastRenderedPageBreak/>
+        <w:t>RF05 - Aprovar Alocação</w:t>
       </w:r>
     </w:p>
     <w:p>
@@ -4070,10 +4180,13 @@
         <w:rPr>
           <w:b/>
         </w:rPr>
-        <w:t xml:space="preserve">Descrição: </w:t>
-      </w:r>
-      <w:r>
-        <w:t>O sistema deve permitir definir a capacidade máxima de alunos por laboratório.</w:t>
+        <w:t>Descrição:</w:t>
+      </w:r>
+      <w:r>
+        <w:t xml:space="preserve"> </w:t>
+      </w:r>
+      <w:r>
+        <w:t>O sistema deve permitir aprovar ou reprovar solicitações de alocação de laboratórios.</w:t>
       </w:r>
     </w:p>
     <w:p>
@@ -4093,7 +4206,14 @@
           <w:b/>
           <w:bCs/>
         </w:rPr>
-        <w:t>RF05 - Aprovar Alocação</w:t>
+        <w:t xml:space="preserve">RF06 - Cadastrar </w:t>
+      </w:r>
+      <w:r>
+        <w:rPr>
+          <w:b/>
+          <w:bCs/>
+        </w:rPr>
+        <w:t>Coordenador</w:t>
       </w:r>
     </w:p>
     <w:p>
@@ -4113,6 +4233,9 @@
     <w:p>
       <w:pPr>
         <w:pStyle w:val="PargrafodaLista"/>
+        <w:tabs>
+          <w:tab w:val="left" w:pos="2673"/>
+        </w:tabs>
       </w:pPr>
       <w:r>
         <w:rPr>
@@ -4124,7 +4247,7 @@
         <w:t xml:space="preserve"> </w:t>
       </w:r>
       <w:r>
-        <w:t>O sistema deve permitir aprovar ou reprovar solicitações de alocação de laboratórios.</w:t>
+        <w:t>O sistema deve permitir o cadastro de usuários do tipo coordenador.</w:t>
       </w:r>
     </w:p>
     <w:p>
@@ -4144,14 +4267,21 @@
           <w:b/>
           <w:bCs/>
         </w:rPr>
-        <w:t xml:space="preserve">RF06 - Cadastrar </w:t>
-      </w:r>
-      <w:r>
-        <w:rPr>
-          <w:b/>
-          <w:bCs/>
-        </w:rPr>
-        <w:t>Coordenador</w:t>
+        <w:t>RF0</w:t>
+      </w:r>
+      <w:r>
+        <w:rPr>
+          <w:b/>
+          <w:bCs/>
+        </w:rPr>
+        <w:t>7</w:t>
+      </w:r>
+      <w:r>
+        <w:rPr>
+          <w:b/>
+          <w:bCs/>
+        </w:rPr>
+        <w:t xml:space="preserve"> - Cadastrar Responsável do TI</w:t>
       </w:r>
     </w:p>
     <w:p>
@@ -4185,7 +4315,7 @@
         <w:t xml:space="preserve"> </w:t>
       </w:r>
       <w:r>
-        <w:t>O sistema deve permitir o cadastro de usuários do tipo coordenador.</w:t>
+        <w:t>O sistema deve permitir o cadastro de usuários do tipo responsável de TI.</w:t>
       </w:r>
     </w:p>
     <w:p>
@@ -4212,14 +4342,35 @@
           <w:b/>
           <w:bCs/>
         </w:rPr>
-        <w:t>7</w:t>
-      </w:r>
-      <w:r>
-        <w:rPr>
-          <w:b/>
-          <w:bCs/>
-        </w:rPr>
-        <w:t xml:space="preserve"> - Cadastrar Responsável do TI</w:t>
+        <w:t>8</w:t>
+      </w:r>
+      <w:r>
+        <w:rPr>
+          <w:b/>
+          <w:bCs/>
+        </w:rPr>
+        <w:t xml:space="preserve"> </w:t>
+      </w:r>
+      <w:r>
+        <w:rPr>
+          <w:b/>
+          <w:bCs/>
+        </w:rPr>
+        <w:t>-</w:t>
+      </w:r>
+      <w:r>
+        <w:rPr>
+          <w:b/>
+          <w:bCs/>
+        </w:rPr>
+        <w:t xml:space="preserve"> </w:t>
+      </w:r>
+      <w:r>
+        <w:rPr>
+          <w:b/>
+          <w:bCs/>
+        </w:rPr>
+        <w:t>Monitorar Alterações dos Usuários</w:t>
       </w:r>
     </w:p>
     <w:p>
@@ -4253,7 +4404,87 @@
         <w:t xml:space="preserve"> </w:t>
       </w:r>
       <w:r>
-        <w:t>O sistema deve permitir o cadastro de usuários do tipo responsável de TI.</w:t>
+        <w:t>O sistema deve permitir visualizar as alterações realizadas pelos usuários.</w:t>
+      </w:r>
+    </w:p>
+    <w:p>
+      <w:pPr>
+        <w:pStyle w:val="PargrafodaLista"/>
+        <w:tabs>
+          <w:tab w:val="left" w:pos="2673"/>
+        </w:tabs>
+      </w:pPr>
+    </w:p>
+    <w:p>
+      <w:pPr>
+        <w:pStyle w:val="PargrafodaLista"/>
+        <w:tabs>
+          <w:tab w:val="left" w:pos="2673"/>
+        </w:tabs>
+      </w:pPr>
+      <w:r>
+        <w:rPr>
+          <w:noProof/>
+        </w:rPr>
+        <w:drawing>
+          <wp:anchor distT="0" distB="0" distL="114300" distR="114300" simplePos="0" relativeHeight="251661312" behindDoc="0" locked="0" layoutInCell="1" allowOverlap="1" wp14:anchorId="7161466E" wp14:editId="2E96E315">
+            <wp:simplePos x="0" y="0"/>
+            <wp:positionH relativeFrom="margin">
+              <wp:align>center</wp:align>
+            </wp:positionH>
+            <wp:positionV relativeFrom="paragraph">
+              <wp:posOffset>238125</wp:posOffset>
+            </wp:positionV>
+            <wp:extent cx="2308860" cy="4724400"/>
+            <wp:effectExtent l="0" t="0" r="0" b="0"/>
+            <wp:wrapTopAndBottom/>
+            <wp:docPr id="639381757" name="Imagem 2"/>
+            <wp:cNvGraphicFramePr>
+              <a:graphicFrameLocks xmlns:a="http://schemas.openxmlformats.org/drawingml/2006/main" noChangeAspect="1"/>
+            </wp:cNvGraphicFramePr>
+            <a:graphic xmlns:a="http://schemas.openxmlformats.org/drawingml/2006/main">
+              <a:graphicData uri="http://schemas.openxmlformats.org/drawingml/2006/picture">
+                <pic:pic xmlns:pic="http://schemas.openxmlformats.org/drawingml/2006/picture">
+                  <pic:nvPicPr>
+                    <pic:cNvPr id="639381757" name="Imagem 639381757"/>
+                    <pic:cNvPicPr/>
+                  </pic:nvPicPr>
+                  <pic:blipFill>
+                    <a:blip r:embed="rId17">
+                      <a:extLst>
+                        <a:ext uri="{28A0092B-C50C-407E-A947-70E740481C1C}">
+                          <a14:useLocalDpi xmlns:a14="http://schemas.microsoft.com/office/drawing/2010/main" val="0"/>
+                        </a:ext>
+                      </a:extLst>
+                    </a:blip>
+                    <a:stretch>
+                      <a:fillRect/>
+                    </a:stretch>
+                  </pic:blipFill>
+                  <pic:spPr>
+                    <a:xfrm>
+                      <a:off x="0" y="0"/>
+                      <a:ext cx="2308860" cy="4724400"/>
+                    </a:xfrm>
+                    <a:prstGeom prst="rect">
+                      <a:avLst/>
+                    </a:prstGeom>
+                  </pic:spPr>
+                </pic:pic>
+              </a:graphicData>
+            </a:graphic>
+          </wp:anchor>
+        </w:drawing>
+      </w:r>
+      <w:r>
+        <w:rPr>
+          <w:b/>
+          <w:bCs/>
+        </w:rPr>
+        <w:t>Ator:</w:t>
+      </w:r>
+      <w:r>
+        <w:t xml:space="preserve"> Coordenador</w:t>
       </w:r>
     </w:p>
     <w:p>
@@ -4263,16 +4494,13 @@
           <w:ilvl w:val="0"/>
           <w:numId w:val="22"/>
         </w:numPr>
-        <w:rPr>
-          <w:b/>
-          <w:bCs/>
-        </w:rPr>
-      </w:pPr>
-      <w:r>
-        <w:rPr>
-          <w:b/>
-          <w:bCs/>
-        </w:rPr>
+      </w:pPr>
+      <w:r>
+        <w:rPr>
+          <w:b/>
+          <w:bCs/>
+        </w:rPr>
+        <w:lastRenderedPageBreak/>
         <w:t>RF0</w:t>
       </w:r>
       <w:r>
@@ -4280,41 +4508,18 @@
           <w:b/>
           <w:bCs/>
         </w:rPr>
-        <w:t>8</w:t>
-      </w:r>
-      <w:r>
-        <w:rPr>
-          <w:b/>
-          <w:bCs/>
-        </w:rPr>
-        <w:t xml:space="preserve"> </w:t>
-      </w:r>
-      <w:r>
-        <w:rPr>
-          <w:b/>
-          <w:bCs/>
-        </w:rPr>
-        <w:t>-</w:t>
-      </w:r>
-      <w:r>
-        <w:rPr>
-          <w:b/>
-          <w:bCs/>
-        </w:rPr>
-        <w:t xml:space="preserve"> </w:t>
-      </w:r>
-      <w:r>
-        <w:rPr>
-          <w:b/>
-          <w:bCs/>
-        </w:rPr>
-        <w:t>Monitorar Alterações dos Usuários</w:t>
-      </w:r>
-    </w:p>
-    <w:p>
-      <w:pPr>
-        <w:pStyle w:val="PargrafodaLista"/>
-      </w:pPr>
+        <w:t>9</w:t>
+      </w:r>
+      <w:r>
+        <w:rPr>
+          <w:b/>
+          <w:bCs/>
+        </w:rPr>
+        <w:t xml:space="preserve"> - Cadastrar disciplina</w:t>
+      </w:r>
+      <w:r>
+        <w:br/>
+      </w:r>
       <w:r>
         <w:rPr>
           <w:b/>
@@ -4322,27 +4527,19 @@
         <w:t>Ator:</w:t>
       </w:r>
       <w:r>
-        <w:t xml:space="preserve"> Diretor Acadêmico.</w:t>
-      </w:r>
-    </w:p>
-    <w:p>
-      <w:pPr>
-        <w:pStyle w:val="PargrafodaLista"/>
-        <w:tabs>
-          <w:tab w:val="left" w:pos="2673"/>
-        </w:tabs>
-      </w:pPr>
-      <w:r>
-        <w:rPr>
-          <w:b/>
-        </w:rPr>
-        <w:t>Descrição:</w:t>
-      </w:r>
-      <w:r>
-        <w:t xml:space="preserve"> </w:t>
-      </w:r>
-      <w:r>
-        <w:t>O sistema deve permitir visualizar as alterações realizadas pelos usuários.</w:t>
+        <w:t xml:space="preserve"> Coordenador</w:t>
+      </w:r>
+      <w:r>
+        <w:br/>
+      </w:r>
+      <w:r>
+        <w:rPr>
+          <w:b/>
+        </w:rPr>
+        <w:t xml:space="preserve">Descrição: </w:t>
+      </w:r>
+      <w:r>
+        <w:t>O sistema deve permitir o cadastro de disciplinas com seus dados básicos.</w:t>
       </w:r>
     </w:p>
     <w:p>
@@ -4352,31 +4549,30 @@
           <w:ilvl w:val="0"/>
           <w:numId w:val="22"/>
         </w:numPr>
-      </w:pPr>
-      <w:r>
-        <w:rPr>
-          <w:b/>
-          <w:bCs/>
-        </w:rPr>
-        <w:t>RF0</w:t>
-      </w:r>
-      <w:r>
-        <w:rPr>
-          <w:b/>
-          <w:bCs/>
-        </w:rPr>
-        <w:t>9</w:t>
-      </w:r>
-      <w:r>
-        <w:rPr>
-          <w:b/>
-          <w:bCs/>
-        </w:rPr>
-        <w:t xml:space="preserve"> - Cadastrar disciplina</w:t>
-      </w:r>
-      <w:r>
-        <w:br/>
-      </w:r>
+        <w:rPr>
+          <w:b/>
+          <w:bCs/>
+        </w:rPr>
+      </w:pPr>
+      <w:r>
+        <w:rPr>
+          <w:b/>
+          <w:bCs/>
+        </w:rPr>
+        <w:t>RF10</w:t>
+      </w:r>
+      <w:r>
+        <w:rPr>
+          <w:b/>
+          <w:bCs/>
+        </w:rPr>
+        <w:t xml:space="preserve"> - Informar quantidade de alunos</w:t>
+      </w:r>
+    </w:p>
+    <w:p>
+      <w:pPr>
+        <w:pStyle w:val="PargrafodaLista"/>
+      </w:pPr>
       <w:r>
         <w:rPr>
           <w:b/>
@@ -4384,19 +4580,24 @@
         <w:t>Ator:</w:t>
       </w:r>
       <w:r>
-        <w:t xml:space="preserve"> Coordenador</w:t>
-      </w:r>
-      <w:r>
-        <w:br/>
-      </w:r>
-      <w:r>
-        <w:rPr>
-          <w:b/>
-        </w:rPr>
-        <w:t xml:space="preserve">Descrição: </w:t>
-      </w:r>
-      <w:r>
-        <w:t>O sistema deve permitir o cadastro de disciplinas com seus dados básicos.</w:t>
+        <w:t xml:space="preserve"> Coordenador.</w:t>
+      </w:r>
+    </w:p>
+    <w:p>
+      <w:pPr>
+        <w:pStyle w:val="PargrafodaLista"/>
+      </w:pPr>
+      <w:r>
+        <w:rPr>
+          <w:b/>
+        </w:rPr>
+        <w:t>Descrição:</w:t>
+      </w:r>
+      <w:r>
+        <w:t xml:space="preserve"> </w:t>
+      </w:r>
+      <w:r>
+        <w:t>O sistema deve permitir informar a quantidade de alunos matriculados em cada disciplina.</w:t>
       </w:r>
     </w:p>
     <w:p>
@@ -4416,14 +4617,14 @@
           <w:b/>
           <w:bCs/>
         </w:rPr>
-        <w:t>RF10</w:t>
-      </w:r>
-      <w:r>
-        <w:rPr>
-          <w:b/>
-          <w:bCs/>
-        </w:rPr>
-        <w:t xml:space="preserve"> - Informar quantidade de alunos</w:t>
+        <w:t>RF11</w:t>
+      </w:r>
+      <w:r>
+        <w:rPr>
+          <w:b/>
+          <w:bCs/>
+        </w:rPr>
+        <w:t xml:space="preserve"> - Vincular softwares à disciplina</w:t>
       </w:r>
     </w:p>
     <w:p>
@@ -4454,7 +4655,7 @@
         <w:t xml:space="preserve"> </w:t>
       </w:r>
       <w:r>
-        <w:t>O sistema deve permitir informar a quantidade de alunos matriculados em cada disciplina.</w:t>
+        <w:t>O sistema deve permitir vincular os softwares necessários a cada disciplina.</w:t>
       </w:r>
     </w:p>
     <w:p>
@@ -4474,14 +4675,14 @@
           <w:b/>
           <w:bCs/>
         </w:rPr>
-        <w:t>RF11</w:t>
-      </w:r>
-      <w:r>
-        <w:rPr>
-          <w:b/>
-          <w:bCs/>
-        </w:rPr>
-        <w:t xml:space="preserve"> - Vincular softwares à disciplina</w:t>
+        <w:t>RF12</w:t>
+      </w:r>
+      <w:r>
+        <w:rPr>
+          <w:b/>
+          <w:bCs/>
+        </w:rPr>
+        <w:t xml:space="preserve"> - Solicitar alocação de laboratório</w:t>
       </w:r>
     </w:p>
     <w:p>
@@ -4512,7 +4713,27 @@
         <w:t xml:space="preserve"> </w:t>
       </w:r>
       <w:r>
-        <w:t>O sistema deve permitir vincular os softwares necessários a cada disciplina.</w:t>
+        <w:t>O sistema deve permitir solicitar a alocação de laboratórios para as disciplinas.</w:t>
+      </w:r>
+    </w:p>
+    <w:p>
+      <w:pPr>
+        <w:pStyle w:val="PargrafodaLista"/>
+      </w:pPr>
+    </w:p>
+    <w:p>
+      <w:pPr>
+        <w:pStyle w:val="PargrafodaLista"/>
+      </w:pPr>
+      <w:r>
+        <w:rPr>
+          <w:b/>
+          <w:bCs/>
+        </w:rPr>
+        <w:t>Atores:</w:t>
+      </w:r>
+      <w:r>
+        <w:t xml:space="preserve"> Coordenador e responsável de TI:</w:t>
       </w:r>
     </w:p>
     <w:p>
@@ -4532,14 +4753,35 @@
           <w:b/>
           <w:bCs/>
         </w:rPr>
-        <w:t>RF12</w:t>
-      </w:r>
-      <w:r>
-        <w:rPr>
-          <w:b/>
-          <w:bCs/>
-        </w:rPr>
-        <w:t xml:space="preserve"> - Solicitar alocação de laboratório</w:t>
+        <w:t>RF13</w:t>
+      </w:r>
+      <w:r>
+        <w:rPr>
+          <w:b/>
+          <w:bCs/>
+        </w:rPr>
+        <w:t xml:space="preserve"> </w:t>
+      </w:r>
+      <w:r>
+        <w:rPr>
+          <w:b/>
+          <w:bCs/>
+        </w:rPr>
+        <w:t>–</w:t>
+      </w:r>
+      <w:r>
+        <w:rPr>
+          <w:b/>
+          <w:bCs/>
+        </w:rPr>
+        <w:t xml:space="preserve"> </w:t>
+      </w:r>
+      <w:r>
+        <w:rPr>
+          <w:b/>
+          <w:bCs/>
+        </w:rPr>
+        <w:t>Filtrar Software por Laboratórios</w:t>
       </w:r>
     </w:p>
     <w:p>
@@ -4547,31 +4789,105 @@
         <w:pStyle w:val="PargrafodaLista"/>
       </w:pPr>
       <w:r>
-        <w:rPr>
-          <w:b/>
+        <w:t>Ator: Coordenador</w:t>
+      </w:r>
+      <w:r>
+        <w:t xml:space="preserve"> e </w:t>
+      </w:r>
+      <w:r>
+        <w:t>Responsável de TI.</w:t>
+      </w:r>
+    </w:p>
+    <w:p>
+      <w:pPr>
+        <w:pStyle w:val="PargrafodaLista"/>
+      </w:pPr>
+      <w:proofErr w:type="spellStart"/>
+      <w:r>
+        <w:t>Descrição</w:t>
+      </w:r>
+      <w:proofErr w:type="spellEnd"/>
+      <w:r>
+        <w:t xml:space="preserve">: </w:t>
+      </w:r>
+      <w:r>
+        <w:t>O sistema deve permitir filtrar os softwares disponíveis por laboratório.</w:t>
+      </w:r>
+      <w:r>
+        <w:br/>
+      </w:r>
+    </w:p>
+    <w:p>
+      <w:pPr>
+        <w:pStyle w:val="PargrafodaLista"/>
+      </w:pPr>
+      <w:r>
+        <w:rPr>
+          <w:noProof/>
+        </w:rPr>
+        <w:lastRenderedPageBreak/>
+        <w:drawing>
+          <wp:anchor distT="0" distB="0" distL="114300" distR="114300" simplePos="0" relativeHeight="251662336" behindDoc="0" locked="0" layoutInCell="1" allowOverlap="1" wp14:anchorId="70C4E604" wp14:editId="7245E8EA">
+            <wp:simplePos x="0" y="0"/>
+            <wp:positionH relativeFrom="page">
+              <wp:align>center</wp:align>
+            </wp:positionH>
+            <wp:positionV relativeFrom="paragraph">
+              <wp:posOffset>285115</wp:posOffset>
+            </wp:positionV>
+            <wp:extent cx="2705100" cy="3863340"/>
+            <wp:effectExtent l="0" t="0" r="0" b="3810"/>
+            <wp:wrapTopAndBottom/>
+            <wp:docPr id="834560516" name="Imagem 3"/>
+            <wp:cNvGraphicFramePr>
+              <a:graphicFrameLocks xmlns:a="http://schemas.openxmlformats.org/drawingml/2006/main" noChangeAspect="1"/>
+            </wp:cNvGraphicFramePr>
+            <a:graphic xmlns:a="http://schemas.openxmlformats.org/drawingml/2006/main">
+              <a:graphicData uri="http://schemas.openxmlformats.org/drawingml/2006/picture">
+                <pic:pic xmlns:pic="http://schemas.openxmlformats.org/drawingml/2006/picture">
+                  <pic:nvPicPr>
+                    <pic:cNvPr id="834560516" name="Imagem 834560516"/>
+                    <pic:cNvPicPr/>
+                  </pic:nvPicPr>
+                  <pic:blipFill>
+                    <a:blip r:embed="rId18">
+                      <a:extLst>
+                        <a:ext uri="{28A0092B-C50C-407E-A947-70E740481C1C}">
+                          <a14:useLocalDpi xmlns:a14="http://schemas.microsoft.com/office/drawing/2010/main" val="0"/>
+                        </a:ext>
+                      </a:extLst>
+                    </a:blip>
+                    <a:stretch>
+                      <a:fillRect/>
+                    </a:stretch>
+                  </pic:blipFill>
+                  <pic:spPr>
+                    <a:xfrm>
+                      <a:off x="0" y="0"/>
+                      <a:ext cx="2705100" cy="3863340"/>
+                    </a:xfrm>
+                    <a:prstGeom prst="rect">
+                      <a:avLst/>
+                    </a:prstGeom>
+                  </pic:spPr>
+                </pic:pic>
+              </a:graphicData>
+            </a:graphic>
+          </wp:anchor>
+        </w:drawing>
+      </w:r>
+      <w:r>
+        <w:rPr>
+          <w:b/>
+          <w:bCs/>
         </w:rPr>
         <w:t>Ator:</w:t>
       </w:r>
       <w:r>
-        <w:t xml:space="preserve"> Coordenador.</w:t>
-      </w:r>
-    </w:p>
-    <w:p>
-      <w:pPr>
-        <w:pStyle w:val="PargrafodaLista"/>
-      </w:pPr>
-      <w:r>
-        <w:rPr>
-          <w:b/>
-        </w:rPr>
-        <w:lastRenderedPageBreak/>
-        <w:t>Descrição:</w:t>
-      </w:r>
-      <w:r>
-        <w:t xml:space="preserve"> </w:t>
-      </w:r>
-      <w:r>
-        <w:t>O sistema deve permitir solicitar a alocação de laboratórios para as disciplinas.</w:t>
+        <w:t xml:space="preserve"> Responsável de TI</w:t>
+      </w:r>
+      <w:r>
+        <w:br/>
       </w:r>
     </w:p>
     <w:p>
@@ -4591,57 +4907,55 @@
           <w:b/>
           <w:bCs/>
         </w:rPr>
-        <w:t>RF13</w:t>
-      </w:r>
-      <w:r>
-        <w:rPr>
-          <w:b/>
-          <w:bCs/>
-        </w:rPr>
+        <w:t>RF1</w:t>
+      </w:r>
+      <w:r>
+        <w:rPr>
+          <w:b/>
+          <w:bCs/>
+        </w:rPr>
+        <w:t>4</w:t>
+      </w:r>
+      <w:r>
+        <w:rPr>
+          <w:b/>
+          <w:bCs/>
+        </w:rPr>
+        <w:t xml:space="preserve"> - Cadastrar software</w:t>
+      </w:r>
+    </w:p>
+    <w:p>
+      <w:pPr>
+        <w:pStyle w:val="PargrafodaLista"/>
+      </w:pPr>
+      <w:r>
+        <w:rPr>
+          <w:b/>
+        </w:rPr>
+        <w:t>Ator:</w:t>
+      </w:r>
+      <w:r>
+        <w:t xml:space="preserve"> Responsável de TI.</w:t>
+      </w:r>
+    </w:p>
+    <w:p>
+      <w:pPr>
+        <w:pStyle w:val="PargrafodaLista"/>
+        <w:rPr>
+          <w:u w:val="single"/>
+        </w:rPr>
+      </w:pPr>
+      <w:r>
+        <w:rPr>
+          <w:b/>
+        </w:rPr>
+        <w:t>Descrição:</w:t>
+      </w:r>
+      <w:r>
         <w:t xml:space="preserve"> </w:t>
       </w:r>
       <w:r>
-        <w:rPr>
-          <w:b/>
-          <w:bCs/>
-        </w:rPr>
-        <w:t>–</w:t>
-      </w:r>
-      <w:r>
-        <w:rPr>
-          <w:b/>
-          <w:bCs/>
-        </w:rPr>
-        <w:t xml:space="preserve"> </w:t>
-      </w:r>
-      <w:r>
-        <w:rPr>
-          <w:b/>
-          <w:bCs/>
-        </w:rPr>
-        <w:t>Filtrar Software por Laboratórios</w:t>
-      </w:r>
-    </w:p>
-    <w:p>
-      <w:pPr>
-        <w:pStyle w:val="PargrafodaLista"/>
-      </w:pPr>
-      <w:r>
-        <w:t>Ator: Coordenador.</w:t>
-      </w:r>
-    </w:p>
-    <w:p>
-      <w:pPr>
-        <w:pStyle w:val="PargrafodaLista"/>
-        <w:rPr>
-          <w:u w:val="single"/>
-        </w:rPr>
-      </w:pPr>
-      <w:r>
-        <w:t xml:space="preserve">Descrição: </w:t>
-      </w:r>
-      <w:r>
-        <w:t>O sistema deve permitir filtrar os softwares disponíveis por laboratório.</w:t>
+        <w:t>O sistema deve permitir o cadastro de softwares.</w:t>
       </w:r>
     </w:p>
     <w:p>
@@ -4668,14 +4982,14 @@
           <w:b/>
           <w:bCs/>
         </w:rPr>
-        <w:t>4</w:t>
-      </w:r>
-      <w:r>
-        <w:rPr>
-          <w:b/>
-          <w:bCs/>
-        </w:rPr>
-        <w:t xml:space="preserve"> - Cadastrar software</w:t>
+        <w:t>5</w:t>
+      </w:r>
+      <w:r>
+        <w:rPr>
+          <w:b/>
+          <w:bCs/>
+        </w:rPr>
+        <w:t xml:space="preserve"> - Atualizar software</w:t>
       </w:r>
     </w:p>
     <w:p>
@@ -4709,7 +5023,7 @@
         <w:t xml:space="preserve"> </w:t>
       </w:r>
       <w:r>
-        <w:t>O sistema deve permitir o cadastro de softwares.</w:t>
+        <w:t>O sistema deve permitir a atualização dos dados dos softwares.</w:t>
       </w:r>
     </w:p>
     <w:p>
@@ -4729,21 +5043,14 @@
           <w:b/>
           <w:bCs/>
         </w:rPr>
-        <w:t>RF1</w:t>
-      </w:r>
-      <w:r>
-        <w:rPr>
-          <w:b/>
-          <w:bCs/>
-        </w:rPr>
-        <w:t>5</w:t>
-      </w:r>
-      <w:r>
-        <w:rPr>
-          <w:b/>
-          <w:bCs/>
-        </w:rPr>
-        <w:t xml:space="preserve"> - Atualizar software</w:t>
+        <w:t>RF16</w:t>
+      </w:r>
+      <w:r>
+        <w:rPr>
+          <w:b/>
+          <w:bCs/>
+        </w:rPr>
+        <w:t xml:space="preserve"> - Remover software</w:t>
       </w:r>
     </w:p>
     <w:p>
@@ -4763,159 +5070,24 @@
     <w:p>
       <w:pPr>
         <w:pStyle w:val="PargrafodaLista"/>
+      </w:pPr>
+      <w:r>
+        <w:rPr>
+          <w:b/>
+        </w:rPr>
+        <w:t>Descrição:</w:t>
+      </w:r>
+      <w:r>
+        <w:t xml:space="preserve"> </w:t>
+      </w:r>
+      <w:r>
+        <w:t>O sistema deve permitir a remoção de softwares.</w:t>
+      </w:r>
+    </w:p>
+    <w:p>
+      <w:pPr>
         <w:rPr>
           <w:u w:val="single"/>
-        </w:rPr>
-      </w:pPr>
-      <w:r>
-        <w:rPr>
-          <w:b/>
-        </w:rPr>
-        <w:t>Descrição:</w:t>
-      </w:r>
-      <w:r>
-        <w:t xml:space="preserve"> </w:t>
-      </w:r>
-      <w:r>
-        <w:t>O sistema deve permitir a atualização dos dados dos softwares.</w:t>
-      </w:r>
-    </w:p>
-    <w:p>
-      <w:pPr>
-        <w:pStyle w:val="PargrafodaLista"/>
-        <w:numPr>
-          <w:ilvl w:val="0"/>
-          <w:numId w:val="22"/>
-        </w:numPr>
-        <w:rPr>
-          <w:b/>
-          <w:bCs/>
-        </w:rPr>
-      </w:pPr>
-      <w:r>
-        <w:rPr>
-          <w:b/>
-          <w:bCs/>
-        </w:rPr>
-        <w:t>RF16</w:t>
-      </w:r>
-      <w:r>
-        <w:rPr>
-          <w:b/>
-          <w:bCs/>
-        </w:rPr>
-        <w:t xml:space="preserve"> - Remover software</w:t>
-      </w:r>
-    </w:p>
-    <w:p>
-      <w:pPr>
-        <w:pStyle w:val="PargrafodaLista"/>
-      </w:pPr>
-      <w:r>
-        <w:rPr>
-          <w:b/>
-        </w:rPr>
-        <w:t>Ator:</w:t>
-      </w:r>
-      <w:r>
-        <w:t xml:space="preserve"> Responsável de TI.</w:t>
-      </w:r>
-    </w:p>
-    <w:p>
-      <w:pPr>
-        <w:pStyle w:val="PargrafodaLista"/>
-        <w:rPr>
-          <w:u w:val="single"/>
-        </w:rPr>
-      </w:pPr>
-      <w:r>
-        <w:rPr>
-          <w:b/>
-        </w:rPr>
-        <w:t>Descrição:</w:t>
-      </w:r>
-      <w:r>
-        <w:t xml:space="preserve"> </w:t>
-      </w:r>
-      <w:r>
-        <w:t>O sistema deve permitir a remoção de softwares.</w:t>
-      </w:r>
-    </w:p>
-    <w:p>
-      <w:pPr>
-        <w:pStyle w:val="PargrafodaLista"/>
-        <w:numPr>
-          <w:ilvl w:val="0"/>
-          <w:numId w:val="22"/>
-        </w:numPr>
-        <w:rPr>
-          <w:b/>
-          <w:bCs/>
-        </w:rPr>
-      </w:pPr>
-      <w:r>
-        <w:rPr>
-          <w:b/>
-          <w:bCs/>
-        </w:rPr>
-        <w:t>RF1</w:t>
-      </w:r>
-      <w:r>
-        <w:rPr>
-          <w:b/>
-          <w:bCs/>
-        </w:rPr>
-        <w:t>7</w:t>
-      </w:r>
-      <w:r>
-        <w:rPr>
-          <w:b/>
-          <w:bCs/>
-        </w:rPr>
-        <w:t xml:space="preserve"> - Consultar softwares por laboratório</w:t>
-      </w:r>
-    </w:p>
-    <w:p>
-      <w:pPr>
-        <w:pStyle w:val="PargrafodaLista"/>
-      </w:pPr>
-      <w:r>
-        <w:rPr>
-          <w:b/>
-        </w:rPr>
-        <w:t>Ator:</w:t>
-      </w:r>
-      <w:r>
-        <w:t xml:space="preserve"> Responsável de TI.</w:t>
-      </w:r>
-    </w:p>
-    <w:p>
-      <w:pPr>
-        <w:pStyle w:val="PargrafodaLista"/>
-        <w:rPr>
-          <w:u w:val="single"/>
-        </w:rPr>
-      </w:pPr>
-      <w:r>
-        <w:rPr>
-          <w:b/>
-        </w:rPr>
-        <w:t>Descrição:</w:t>
-      </w:r>
-      <w:r>
-        <w:t xml:space="preserve"> </w:t>
-      </w:r>
-      <w:r>
-        <w:t>O sistema deve permitir consultar os softwares disponíveis em cada laboratório.</w:t>
-      </w:r>
-      <w:bookmarkStart w:id="20" w:name="_GoBack"/>
-      <w:bookmarkEnd w:id="20"/>
-    </w:p>
-    <w:p>
-      <w:pPr>
-        <w:rPr>
-          <w:b/>
-          <w:bCs/>
         </w:rPr>
       </w:pPr>
     </w:p>
@@ -4927,7 +5099,7 @@
           <w:i w:val="0"/>
         </w:rPr>
       </w:pPr>
-      <w:bookmarkStart w:id="21" w:name="_Toc16793"/>
+      <w:bookmarkStart w:id="20" w:name="_Toc16793"/>
       <w:r>
         <w:rPr>
           <w:i w:val="0"/>
@@ -4943,7 +5115,7 @@
         </w:rPr>
         <w:t>REQUISITOS DE BANCO DE DADOS</w:t>
       </w:r>
-      <w:bookmarkEnd w:id="21"/>
+      <w:bookmarkEnd w:id="20"/>
     </w:p>
     <w:p>
       <w:pPr>
@@ -4954,7 +5126,7 @@
           <w:iCs/>
         </w:rPr>
       </w:pPr>
-      <w:bookmarkStart w:id="22" w:name="_Toc27034"/>
+      <w:bookmarkStart w:id="21" w:name="_Toc27034"/>
       <w:r>
         <w:rPr>
           <w:i w:val="0"/>
@@ -4970,7 +5142,7 @@
         </w:rPr>
         <w:t>MODELO FÍSICO E LÓGICO DA BASE DE DADOS</w:t>
       </w:r>
-      <w:bookmarkEnd w:id="22"/>
+      <w:bookmarkEnd w:id="21"/>
     </w:p>
     <w:p>
       <w:pPr>
@@ -5015,7 +5187,7 @@
                     <pic:cNvPicPr/>
                   </pic:nvPicPr>
                   <pic:blipFill>
-                    <a:blip r:embed="rId17">
+                    <a:blip r:embed="rId19">
                       <a:extLst>
                         <a:ext uri="{28A0092B-C50C-407E-A947-70E740481C1C}">
                           <a14:useLocalDpi xmlns:a14="http://schemas.microsoft.com/office/drawing/2010/main" val="0"/>
@@ -5056,7 +5228,7 @@
           <w:i w:val="0"/>
         </w:rPr>
       </w:pPr>
-      <w:bookmarkStart w:id="23" w:name="_Toc16266"/>
+      <w:bookmarkStart w:id="22" w:name="_Toc16266"/>
       <w:r>
         <w:rPr>
           <w:i w:val="0"/>
@@ -5072,7 +5244,7 @@
         </w:rPr>
         <w:t>DICIONÁRIO DE DADOS</w:t>
       </w:r>
-      <w:bookmarkEnd w:id="23"/>
+      <w:bookmarkEnd w:id="22"/>
     </w:p>
     <w:p>
       <w:pPr>
@@ -5096,7 +5268,7 @@
           <w:lang w:eastAsia="pt-BR"/>
         </w:rPr>
         <w:drawing>
-          <wp:inline distT="0" distB="0" distL="0" distR="0" wp14:anchorId="2EA7A7F6" wp14:editId="245AAF5C">
+          <wp:inline distT="0" distB="0" distL="0" distR="0" wp14:anchorId="2EA7A7F6" wp14:editId="09CBE727">
             <wp:extent cx="5839814" cy="1418493"/>
             <wp:effectExtent l="0" t="0" r="0" b="0"/>
             <wp:docPr id="2" name="Imagem 2"/>
@@ -5111,7 +5283,7 @@
                     <pic:cNvPicPr/>
                   </pic:nvPicPr>
                   <pic:blipFill>
-                    <a:blip r:embed="rId18" cstate="print">
+                    <a:blip r:embed="rId20" cstate="print">
                       <a:extLst>
                         <a:ext uri="{28A0092B-C50C-407E-A947-70E740481C1C}">
                           <a14:useLocalDpi xmlns:a14="http://schemas.microsoft.com/office/drawing/2010/main" val="0"/>
@@ -5171,7 +5343,7 @@
           <w:lang w:eastAsia="pt-BR"/>
         </w:rPr>
         <w:drawing>
-          <wp:inline distT="0" distB="0" distL="0" distR="0" wp14:anchorId="32AD5C31" wp14:editId="2B34D1A0">
+          <wp:inline distT="0" distB="0" distL="0" distR="0" wp14:anchorId="32AD5C31" wp14:editId="6FEA47A8">
             <wp:extent cx="5737189" cy="1154723"/>
             <wp:effectExtent l="0" t="0" r="0" b="7620"/>
             <wp:docPr id="5" name="Imagem 5"/>
@@ -5186,7 +5358,7 @@
                     <pic:cNvPicPr/>
                   </pic:nvPicPr>
                   <pic:blipFill>
-                    <a:blip r:embed="rId19" cstate="print">
+                    <a:blip r:embed="rId21" cstate="print">
                       <a:extLst>
                         <a:ext uri="{28A0092B-C50C-407E-A947-70E740481C1C}">
                           <a14:useLocalDpi xmlns:a14="http://schemas.microsoft.com/office/drawing/2010/main" val="0"/>
@@ -5242,7 +5414,7 @@
           <w:lang w:eastAsia="pt-BR"/>
         </w:rPr>
         <w:drawing>
-          <wp:inline distT="0" distB="0" distL="0" distR="0" wp14:anchorId="0C2017A5" wp14:editId="1B2D12BE">
+          <wp:inline distT="0" distB="0" distL="0" distR="0" wp14:anchorId="0C2017A5" wp14:editId="22CB64E4">
             <wp:extent cx="5760720" cy="657860"/>
             <wp:effectExtent l="0" t="0" r="0" b="8890"/>
             <wp:docPr id="223634582" name="Imagem 1"/>
@@ -5257,7 +5429,7 @@
                     <pic:cNvPicPr/>
                   </pic:nvPicPr>
                   <pic:blipFill>
-                    <a:blip r:embed="rId20" cstate="print">
+                    <a:blip r:embed="rId22" cstate="print">
                       <a:extLst>
                         <a:ext uri="{28A0092B-C50C-407E-A947-70E740481C1C}">
                           <a14:useLocalDpi xmlns:a14="http://schemas.microsoft.com/office/drawing/2010/main" val="0"/>
@@ -5313,7 +5485,7 @@
           <w:lang w:eastAsia="pt-BR"/>
         </w:rPr>
         <w:drawing>
-          <wp:inline distT="0" distB="0" distL="0" distR="0" wp14:anchorId="5A0A9D17" wp14:editId="16ABC7E0">
+          <wp:inline distT="0" distB="0" distL="0" distR="0" wp14:anchorId="5A0A9D17" wp14:editId="1F7D3E4A">
             <wp:extent cx="5755479" cy="773723"/>
             <wp:effectExtent l="0" t="0" r="0" b="7620"/>
             <wp:docPr id="6" name="Imagem 6"/>
@@ -5328,7 +5500,7 @@
                     <pic:cNvPicPr/>
                   </pic:nvPicPr>
                   <pic:blipFill>
-                    <a:blip r:embed="rId21" cstate="print">
+                    <a:blip r:embed="rId23" cstate="print">
                       <a:extLst>
                         <a:ext uri="{28A0092B-C50C-407E-A947-70E740481C1C}">
                           <a14:useLocalDpi xmlns:a14="http://schemas.microsoft.com/office/drawing/2010/main" val="0"/>
@@ -5384,7 +5556,7 @@
           <w:lang w:eastAsia="pt-BR"/>
         </w:rPr>
         <w:drawing>
-          <wp:inline distT="0" distB="0" distL="0" distR="0" wp14:anchorId="61B11120" wp14:editId="5D264626">
+          <wp:inline distT="0" distB="0" distL="0" distR="0" wp14:anchorId="61B11120" wp14:editId="7D0E0FB3">
             <wp:extent cx="5749743" cy="914400"/>
             <wp:effectExtent l="0" t="0" r="3810" b="0"/>
             <wp:docPr id="7" name="Imagem 7"/>
@@ -5399,7 +5571,7 @@
                     <pic:cNvPicPr/>
                   </pic:nvPicPr>
                   <pic:blipFill>
-                    <a:blip r:embed="rId22" cstate="print">
+                    <a:blip r:embed="rId24" cstate="print">
                       <a:extLst>
                         <a:ext uri="{28A0092B-C50C-407E-A947-70E740481C1C}">
                           <a14:useLocalDpi xmlns:a14="http://schemas.microsoft.com/office/drawing/2010/main" val="0"/>
@@ -5462,7 +5634,7 @@
           <w:lang w:eastAsia="pt-BR"/>
         </w:rPr>
         <w:drawing>
-          <wp:inline distT="0" distB="0" distL="0" distR="0" wp14:anchorId="4DC00A87" wp14:editId="09F65E97">
+          <wp:inline distT="0" distB="0" distL="0" distR="0" wp14:anchorId="4DC00A87" wp14:editId="3E63284E">
             <wp:extent cx="5752398" cy="1453661"/>
             <wp:effectExtent l="0" t="0" r="1270" b="0"/>
             <wp:docPr id="8" name="Imagem 8"/>
@@ -5477,7 +5649,7 @@
                     <pic:cNvPicPr/>
                   </pic:nvPicPr>
                   <pic:blipFill>
-                    <a:blip r:embed="rId23" cstate="print">
+                    <a:blip r:embed="rId25" cstate="print">
                       <a:extLst>
                         <a:ext uri="{28A0092B-C50C-407E-A947-70E740481C1C}">
                           <a14:useLocalDpi xmlns:a14="http://schemas.microsoft.com/office/drawing/2010/main" val="0"/>
@@ -5547,7 +5719,7 @@
           <w:lang w:eastAsia="pt-BR"/>
         </w:rPr>
         <w:drawing>
-          <wp:inline distT="0" distB="0" distL="0" distR="0" wp14:anchorId="6EF7DC13" wp14:editId="17F6DF7B">
+          <wp:inline distT="0" distB="0" distL="0" distR="0" wp14:anchorId="6EF7DC13" wp14:editId="4F6059D5">
             <wp:extent cx="5788489" cy="574430"/>
             <wp:effectExtent l="0" t="0" r="3175" b="0"/>
             <wp:docPr id="9" name="Imagem 9"/>
@@ -5562,7 +5734,7 @@
                     <pic:cNvPicPr/>
                   </pic:nvPicPr>
                   <pic:blipFill>
-                    <a:blip r:embed="rId24" cstate="print">
+                    <a:blip r:embed="rId26" cstate="print">
                       <a:extLst>
                         <a:ext uri="{28A0092B-C50C-407E-A947-70E740481C1C}">
                           <a14:useLocalDpi xmlns:a14="http://schemas.microsoft.com/office/drawing/2010/main" val="0"/>
@@ -5632,7 +5804,7 @@
           <w:lang w:eastAsia="pt-BR"/>
         </w:rPr>
         <w:drawing>
-          <wp:inline distT="0" distB="0" distL="0" distR="0" wp14:anchorId="0FA3CA38" wp14:editId="412C4E93">
+          <wp:inline distT="0" distB="0" distL="0" distR="0" wp14:anchorId="0FA3CA38" wp14:editId="4D4E4956">
             <wp:extent cx="5773542" cy="580292"/>
             <wp:effectExtent l="0" t="0" r="0" b="0"/>
             <wp:docPr id="10" name="Imagem 10"/>
@@ -5647,7 +5819,7 @@
                     <pic:cNvPicPr/>
                   </pic:nvPicPr>
                   <pic:blipFill>
-                    <a:blip r:embed="rId25" cstate="print">
+                    <a:blip r:embed="rId27" cstate="print">
                       <a:extLst>
                         <a:ext uri="{28A0092B-C50C-407E-A947-70E740481C1C}">
                           <a14:useLocalDpi xmlns:a14="http://schemas.microsoft.com/office/drawing/2010/main" val="0"/>
@@ -5684,7 +5856,7 @@
           <w:iCs/>
         </w:rPr>
       </w:pPr>
-      <w:bookmarkStart w:id="24" w:name="_Toc7182"/>
+      <w:bookmarkStart w:id="23" w:name="_Toc7182"/>
       <w:r>
         <w:rPr>
           <w:i w:val="0"/>
@@ -5700,7 +5872,7 @@
         <w:tab/>
         <w:t>SCRIPTS DE CRIAÇÃO DE BANCO DE DADOS E TABELAS</w:t>
       </w:r>
-      <w:bookmarkEnd w:id="24"/>
+      <w:bookmarkEnd w:id="23"/>
     </w:p>
     <w:p>
       <w:pPr>
@@ -5987,12 +6159,21 @@
         </w:rPr>
       </w:pPr>
       <w:r>
+        <w:rPr>
+          <w:lang w:val="en-US"/>
+        </w:rPr>
         <w:t>);</w:t>
       </w:r>
       <w:r>
+        <w:rPr>
+          <w:lang w:val="en-US"/>
+        </w:rPr>
         <w:br/>
       </w:r>
       <w:r>
+        <w:rPr>
+          <w:lang w:val="en-US"/>
+        </w:rPr>
         <w:br/>
       </w:r>
       <w:r>
@@ -6541,142 +6722,265 @@
         <w:rPr>
           <w:b/>
           <w:bCs/>
-        </w:rPr>
-      </w:pPr>
-      <w:r>
-        <w:rPr>
-          <w:b/>
-          <w:bCs/>
+          <w:lang w:val="en-US"/>
+        </w:rPr>
+      </w:pPr>
+      <w:r>
+        <w:rPr>
+          <w:b/>
+          <w:bCs/>
+          <w:lang w:val="en-US"/>
         </w:rPr>
         <w:t>DISCIPLINA:</w:t>
       </w:r>
     </w:p>
-    <w:p/>
-    <w:p>
-      <w:r>
-        <w:t>CREATE TABLE disciplina (</w:t>
-      </w:r>
-      <w:r>
+    <w:p>
+      <w:pPr>
+        <w:rPr>
+          <w:lang w:val="en-US"/>
+        </w:rPr>
+      </w:pPr>
+    </w:p>
+    <w:p>
+      <w:pPr>
+        <w:rPr>
+          <w:lang w:val="en-US"/>
+        </w:rPr>
+      </w:pPr>
+      <w:r>
+        <w:rPr>
+          <w:lang w:val="en-US"/>
+        </w:rPr>
+        <w:t xml:space="preserve">CREATE TABLE </w:t>
+      </w:r>
+      <w:proofErr w:type="spellStart"/>
+      <w:r>
+        <w:rPr>
+          <w:lang w:val="en-US"/>
+        </w:rPr>
+        <w:t>disciplina</w:t>
+      </w:r>
+      <w:proofErr w:type="spellEnd"/>
+      <w:r>
+        <w:rPr>
+          <w:lang w:val="en-US"/>
+        </w:rPr>
+        <w:t xml:space="preserve"> (</w:t>
+      </w:r>
+      <w:r>
+        <w:rPr>
+          <w:lang w:val="en-US"/>
+        </w:rPr>
         <w:br/>
-      </w:r>
-      <w:r>
         <w:t xml:space="preserve">   </w:t>
       </w:r>
       <w:proofErr w:type="spellStart"/>
       <w:r>
+        <w:rPr>
+          <w:lang w:val="en-US"/>
+        </w:rPr>
         <w:t>id_disciplina</w:t>
       </w:r>
       <w:proofErr w:type="spellEnd"/>
       <w:r>
+        <w:rPr>
+          <w:lang w:val="en-US"/>
+        </w:rPr>
         <w:t xml:space="preserve"> SERIAL PRIMARY KEY,</w:t>
       </w:r>
       <w:r>
+        <w:rPr>
+          <w:lang w:val="en-US"/>
+        </w:rPr>
         <w:br/>
-      </w:r>
-      <w:r>
         <w:t xml:space="preserve">   </w:t>
       </w:r>
       <w:proofErr w:type="spellStart"/>
       <w:r>
+        <w:rPr>
+          <w:lang w:val="en-US"/>
+        </w:rPr>
         <w:t>nome_disciplina</w:t>
       </w:r>
       <w:proofErr w:type="spellEnd"/>
       <w:r>
-        <w:t xml:space="preserve"> VARCHAR(50) NOT NULL,</w:t>
-      </w:r>
-      <w:r>
+        <w:rPr>
+          <w:lang w:val="en-US"/>
+        </w:rPr>
+        <w:t xml:space="preserve"> </w:t>
+      </w:r>
+      <w:proofErr w:type="gramStart"/>
+      <w:r>
+        <w:rPr>
+          <w:lang w:val="en-US"/>
+        </w:rPr>
+        <w:t>VARCHAR(</w:t>
+      </w:r>
+      <w:proofErr w:type="gramEnd"/>
+      <w:r>
+        <w:rPr>
+          <w:lang w:val="en-US"/>
+        </w:rPr>
+        <w:t>50) NOT NULL,</w:t>
+      </w:r>
+      <w:r>
+        <w:rPr>
+          <w:lang w:val="en-US"/>
+        </w:rPr>
         <w:br/>
-      </w:r>
-      <w:r>
         <w:t xml:space="preserve">   </w:t>
       </w:r>
       <w:proofErr w:type="spellStart"/>
       <w:r>
+        <w:rPr>
+          <w:lang w:val="en-US"/>
+        </w:rPr>
         <w:t>id_usuario</w:t>
       </w:r>
       <w:proofErr w:type="spellEnd"/>
       <w:r>
+        <w:rPr>
+          <w:lang w:val="en-US"/>
+        </w:rPr>
         <w:t xml:space="preserve"> INTEGER NOT NULL,</w:t>
       </w:r>
       <w:r>
+        <w:rPr>
+          <w:lang w:val="en-US"/>
+        </w:rPr>
         <w:br/>
-      </w:r>
-      <w:r>
         <w:t xml:space="preserve">   </w:t>
       </w:r>
       <w:proofErr w:type="spellStart"/>
       <w:r>
+        <w:rPr>
+          <w:lang w:val="en-US"/>
+        </w:rPr>
         <w:t>qtde_alunos</w:t>
       </w:r>
       <w:proofErr w:type="spellEnd"/>
       <w:r>
+        <w:rPr>
+          <w:lang w:val="en-US"/>
+        </w:rPr>
         <w:t xml:space="preserve"> INTEGER NOT NULL CHECK (</w:t>
       </w:r>
       <w:proofErr w:type="spellStart"/>
       <w:r>
+        <w:rPr>
+          <w:lang w:val="en-US"/>
+        </w:rPr>
         <w:t>qtde_alunos</w:t>
       </w:r>
       <w:proofErr w:type="spellEnd"/>
       <w:r>
+        <w:rPr>
+          <w:lang w:val="en-US"/>
+        </w:rPr>
         <w:t xml:space="preserve"> &gt; 0),</w:t>
       </w:r>
       <w:r>
+        <w:rPr>
+          <w:lang w:val="en-US"/>
+        </w:rPr>
         <w:br/>
       </w:r>
       <w:r>
+        <w:rPr>
+          <w:lang w:val="en-US"/>
+        </w:rPr>
         <w:br/>
         <w:t xml:space="preserve">CONSTRAINT </w:t>
       </w:r>
       <w:proofErr w:type="spellStart"/>
       <w:r>
+        <w:rPr>
+          <w:lang w:val="en-US"/>
+        </w:rPr>
         <w:t>fk_disciplina_usuario</w:t>
       </w:r>
       <w:proofErr w:type="spellEnd"/>
       <w:r>
+        <w:rPr>
+          <w:lang w:val="en-US"/>
+        </w:rPr>
         <w:br/>
         <w:t>FOREIGN KEY (</w:t>
       </w:r>
       <w:proofErr w:type="spellStart"/>
       <w:r>
+        <w:rPr>
+          <w:lang w:val="en-US"/>
+        </w:rPr>
         <w:t>id_usuario</w:t>
       </w:r>
       <w:proofErr w:type="spellEnd"/>
       <w:r>
+        <w:rPr>
+          <w:lang w:val="en-US"/>
+        </w:rPr>
         <w:t>)</w:t>
       </w:r>
       <w:r>
+        <w:rPr>
+          <w:lang w:val="en-US"/>
+        </w:rPr>
         <w:br/>
         <w:t xml:space="preserve">REFERENCES </w:t>
       </w:r>
       <w:proofErr w:type="spellStart"/>
       <w:r>
+        <w:rPr>
+          <w:lang w:val="en-US"/>
+        </w:rPr>
         <w:t>usuario</w:t>
       </w:r>
       <w:proofErr w:type="spellEnd"/>
       <w:r>
+        <w:rPr>
+          <w:lang w:val="en-US"/>
+        </w:rPr>
         <w:t>(</w:t>
       </w:r>
       <w:proofErr w:type="spellStart"/>
       <w:r>
+        <w:rPr>
+          <w:lang w:val="en-US"/>
+        </w:rPr>
         <w:t>id_usuario</w:t>
       </w:r>
       <w:proofErr w:type="spellEnd"/>
       <w:r>
+        <w:rPr>
+          <w:lang w:val="en-US"/>
+        </w:rPr>
         <w:t>)</w:t>
       </w:r>
       <w:r>
+        <w:rPr>
+          <w:lang w:val="en-US"/>
+        </w:rPr>
         <w:br/>
         <w:t>ON UPDATE CASCADE</w:t>
       </w:r>
       <w:r>
+        <w:rPr>
+          <w:lang w:val="en-US"/>
+        </w:rPr>
         <w:br/>
         <w:t>ON DELETE RESTRICT</w:t>
       </w:r>
       <w:r>
+        <w:rPr>
+          <w:lang w:val="en-US"/>
+        </w:rPr>
         <w:br/>
         <w:t>);</w:t>
       </w:r>
       <w:r>
+        <w:rPr>
+          <w:lang w:val="en-US"/>
+        </w:rPr>
         <w:br/>
       </w:r>
     </w:p>
@@ -7696,82 +8000,44 @@
       </w:r>
     </w:p>
     <w:p>
-      <w:pPr>
-        <w:rPr>
-          <w:lang w:val="en-US"/>
-        </w:rPr>
-      </w:pPr>
-      <w:r>
-        <w:rPr>
-          <w:lang w:val="en-US"/>
-        </w:rPr>
-        <w:t xml:space="preserve">        REFERENCES </w:t>
+      <w:r>
+        <w:rPr>
+          <w:lang w:val="en-US"/>
+        </w:rPr>
+        <w:t xml:space="preserve">        </w:t>
+      </w:r>
+      <w:r>
+        <w:t xml:space="preserve">REFERENCES </w:t>
       </w:r>
       <w:proofErr w:type="spellStart"/>
       <w:r>
-        <w:rPr>
-          <w:lang w:val="en-US"/>
-        </w:rPr>
         <w:t>laboratorio</w:t>
       </w:r>
       <w:proofErr w:type="spellEnd"/>
       <w:r>
-        <w:rPr>
-          <w:lang w:val="en-US"/>
-        </w:rPr>
         <w:t>(</w:t>
       </w:r>
       <w:proofErr w:type="spellStart"/>
       <w:r>
-        <w:rPr>
-          <w:lang w:val="en-US"/>
-        </w:rPr>
         <w:t>id_laboratorio</w:t>
       </w:r>
       <w:proofErr w:type="spellEnd"/>
       <w:r>
-        <w:rPr>
-          <w:lang w:val="en-US"/>
-        </w:rPr>
         <w:t>)</w:t>
       </w:r>
     </w:p>
     <w:p>
-      <w:pPr>
-        <w:rPr>
-          <w:lang w:val="en-US"/>
-        </w:rPr>
-      </w:pPr>
-      <w:r>
-        <w:rPr>
-          <w:lang w:val="en-US"/>
-        </w:rPr>
+      <w:r>
         <w:t xml:space="preserve">        ON UPDATE CASCADE</w:t>
       </w:r>
     </w:p>
     <w:p>
-      <w:pPr>
-        <w:rPr>
-          <w:lang w:val="en-US"/>
-        </w:rPr>
-      </w:pPr>
-      <w:r>
-        <w:rPr>
-          <w:lang w:val="en-US"/>
-        </w:rPr>
+      <w:r>
         <w:t xml:space="preserve">        ON DELETE CASCADE</w:t>
       </w:r>
     </w:p>
     <w:p>
-      <w:pPr>
-        <w:rPr>
-          <w:lang w:val="en-US"/>
-        </w:rPr>
-      </w:pPr>
-      <w:r>
-        <w:rPr>
-          <w:lang w:val="en-US"/>
-        </w:rPr>
+      <w:r>
         <w:t>);</w:t>
       </w:r>
     </w:p>
@@ -8086,9 +8352,9 @@
           <w:rFonts w:cs="Times New Roman"/>
         </w:rPr>
         <w:sectPr>
-          <w:headerReference w:type="default" r:id="rId26"/>
-          <w:headerReference w:type="first" r:id="rId27"/>
-          <w:footerReference w:type="first" r:id="rId28"/>
+          <w:headerReference w:type="default" r:id="rId28"/>
+          <w:headerReference w:type="first" r:id="rId29"/>
+          <w:footerReference w:type="first" r:id="rId30"/>
           <w:pgSz w:w="11907" w:h="16839"/>
           <w:pgMar w:top="1701" w:right="1134" w:bottom="1134" w:left="1701" w:header="567" w:footer="720" w:gutter="0"/>
           <w:cols w:space="708"/>
@@ -8108,21 +8374,21 @@
         <w:pStyle w:val="Ttulo1"/>
         <w:jc w:val="center"/>
       </w:pPr>
-      <w:bookmarkStart w:id="25" w:name="_Toc21242"/>
+      <w:bookmarkStart w:id="24" w:name="_Toc21242"/>
       <w:r>
         <w:lastRenderedPageBreak/>
         <w:t>ANEXOS</w:t>
       </w:r>
-      <w:bookmarkEnd w:id="25"/>
+      <w:bookmarkEnd w:id="24"/>
     </w:p>
     <w:p/>
     <w:p>
-      <w:bookmarkStart w:id="26" w:name="Ata_1"/>
+      <w:bookmarkStart w:id="25" w:name="Ata_1"/>
       <w:r>
         <w:t>Ata 1</w:t>
       </w:r>
     </w:p>
-    <w:bookmarkEnd w:id="26"/>
+    <w:bookmarkEnd w:id="25"/>
     <w:p>
       <w:pPr>
         <w:jc w:val="both"/>
@@ -8152,7 +8418,7 @@
                     <pic:cNvPicPr/>
                   </pic:nvPicPr>
                   <pic:blipFill>
-                    <a:blip r:embed="rId29">
+                    <a:blip r:embed="rId31">
                       <a:extLst>
                         <a:ext uri="{28A0092B-C50C-407E-A947-70E740481C1C}">
                           <a14:useLocalDpi xmlns:a14="http://schemas.microsoft.com/office/drawing/2010/main"/>
@@ -8180,12 +8446,12 @@
       </w:r>
     </w:p>
     <w:p>
-      <w:bookmarkStart w:id="27" w:name="Ata_2"/>
+      <w:bookmarkStart w:id="26" w:name="Ata_2"/>
       <w:r>
         <w:t>Ata 2</w:t>
       </w:r>
     </w:p>
-    <w:bookmarkEnd w:id="27"/>
+    <w:bookmarkEnd w:id="26"/>
     <w:p>
       <w:pPr>
         <w:jc w:val="both"/>
@@ -8215,7 +8481,7 @@
                     <pic:cNvPicPr/>
                   </pic:nvPicPr>
                   <pic:blipFill>
-                    <a:blip r:embed="rId30">
+                    <a:blip r:embed="rId32">
                       <a:extLst>
                         <a:ext uri="{28A0092B-C50C-407E-A947-70E740481C1C}">
                           <a14:useLocalDpi xmlns:a14="http://schemas.microsoft.com/office/drawing/2010/main"/>
@@ -8261,7 +8527,7 @@
       <w:pPr>
         <w:jc w:val="both"/>
       </w:pPr>
-      <w:bookmarkStart w:id="28" w:name="Ata_3"/>
+      <w:bookmarkStart w:id="27" w:name="Ata_3"/>
       <w:r>
         <w:t>Ata</w:t>
       </w:r>
@@ -8269,7 +8535,7 @@
         <w:t xml:space="preserve"> 3</w:t>
       </w:r>
     </w:p>
-    <w:bookmarkEnd w:id="28"/>
+    <w:bookmarkEnd w:id="27"/>
     <w:p>
       <w:pPr>
         <w:jc w:val="both"/>
@@ -8295,7 +8561,7 @@
                     <pic:cNvPicPr/>
                   </pic:nvPicPr>
                   <pic:blipFill>
-                    <a:blip r:embed="rId31">
+                    <a:blip r:embed="rId33">
                       <a:extLst>
                         <a:ext uri="{28A0092B-C50C-407E-A947-70E740481C1C}">
                           <a14:useLocalDpi xmlns:a14="http://schemas.microsoft.com/office/drawing/2010/main"/>
@@ -8326,12 +8592,12 @@
       <w:pPr>
         <w:jc w:val="both"/>
       </w:pPr>
-      <w:bookmarkStart w:id="29" w:name="Ata_4"/>
+      <w:bookmarkStart w:id="28" w:name="Ata_4"/>
       <w:r>
         <w:t>Ata 4</w:t>
       </w:r>
     </w:p>
-    <w:bookmarkEnd w:id="29"/>
+    <w:bookmarkEnd w:id="28"/>
     <w:p>
       <w:pPr>
         <w:jc w:val="both"/>
@@ -8357,7 +8623,7 @@
                     <pic:cNvPicPr/>
                   </pic:nvPicPr>
                   <pic:blipFill>
-                    <a:blip r:embed="rId32">
+                    <a:blip r:embed="rId34">
                       <a:extLst>
                         <a:ext uri="{28A0092B-C50C-407E-A947-70E740481C1C}">
                           <a14:useLocalDpi xmlns:a14="http://schemas.microsoft.com/office/drawing/2010/main"/>
@@ -8388,12 +8654,12 @@
     <w:p/>
     <w:p/>
     <w:p>
-      <w:bookmarkStart w:id="30" w:name="Ata_5"/>
+      <w:bookmarkStart w:id="29" w:name="Ata_5"/>
       <w:r>
         <w:t>Ata 5</w:t>
       </w:r>
     </w:p>
-    <w:bookmarkEnd w:id="30"/>
+    <w:bookmarkEnd w:id="29"/>
     <w:p>
       <w:r>
         <w:rPr>
@@ -8401,7 +8667,7 @@
           <w:lang w:eastAsia="pt-BR"/>
         </w:rPr>
         <w:drawing>
-          <wp:inline distT="0" distB="0" distL="0" distR="0" wp14:anchorId="7D1B9FBA" wp14:editId="7439137C">
+          <wp:inline distT="0" distB="0" distL="0" distR="0" wp14:anchorId="7D1B9FBA" wp14:editId="454A4538">
             <wp:extent cx="2881439" cy="4064751"/>
             <wp:effectExtent l="0" t="0" r="0" b="0"/>
             <wp:docPr id="1726782481" name="Imagem 2"/>
@@ -8416,7 +8682,7 @@
                     <pic:cNvPicPr/>
                   </pic:nvPicPr>
                   <pic:blipFill>
-                    <a:blip r:embed="rId33" cstate="print">
+                    <a:blip r:embed="rId35" cstate="print">
                       <a:extLst>
                         <a:ext uri="{28A0092B-C50C-407E-A947-70E740481C1C}">
                           <a14:useLocalDpi xmlns:a14="http://schemas.microsoft.com/office/drawing/2010/main" val="0"/>
@@ -8465,7 +8731,7 @@
                     <pic:cNvPicPr/>
                   </pic:nvPicPr>
                   <pic:blipFill>
-                    <a:blip r:embed="rId34">
+                    <a:blip r:embed="rId36">
                       <a:extLst>
                         <a:ext uri="{28A0092B-C50C-407E-A947-70E740481C1C}">
                           <a14:useLocalDpi xmlns:a14="http://schemas.microsoft.com/office/drawing/2010/main" val="0"/>
@@ -8504,7 +8770,7 @@
 </file>
 
 <file path=word/endnotes.xml><?xml version="1.0" encoding="utf-8"?>
-<w:endnotes xmlns:wpc="http://schemas.microsoft.com/office/word/2010/wordprocessingCanvas" xmlns:cx="http://schemas.microsoft.com/office/drawing/2014/chartex" xmlns:mc="http://schemas.openxmlformats.org/markup-compatibility/2006" xmlns:o="urn:schemas-microsoft-com:office:office" xmlns:r="http://schemas.openxmlformats.org/officeDocument/2006/relationships" xmlns:m="http://schemas.openxmlformats.org/officeDocument/2006/math" xmlns:v="urn:schemas-microsoft-com:vml" xmlns:wp14="http://schemas.microsoft.com/office/word/2010/wordprocessingDrawing" xmlns:wp="http://schemas.openxmlformats.org/drawingml/2006/wordprocessingDrawing" xmlns:w10="urn:schemas-microsoft-com:office:word" xmlns:w="http://schemas.openxmlformats.org/wordprocessingml/2006/main" xmlns:w14="http://schemas.microsoft.com/office/word/2010/wordml" xmlns:w15="http://schemas.microsoft.com/office/word/2012/wordml" xmlns:w16se="http://schemas.microsoft.com/office/word/2015/wordml/symex" xmlns:wpg="http://schemas.microsoft.com/office/word/2010/wordprocessingGroup" xmlns:wpi="http://schemas.microsoft.com/office/word/2010/wordprocessingInk" xmlns:wne="http://schemas.microsoft.com/office/word/2006/wordml" xmlns:wps="http://schemas.microsoft.com/office/word/2010/wordprocessingShape" mc:Ignorable="w14 w15 w16se wp14">
+<w:endnotes xmlns:wpc="http://schemas.microsoft.com/office/word/2010/wordprocessingCanvas" xmlns:cx="http://schemas.microsoft.com/office/drawing/2014/chartex" xmlns:cx1="http://schemas.microsoft.com/office/drawing/2015/9/8/chartex" xmlns:cx2="http://schemas.microsoft.com/office/drawing/2015/10/21/chartex" xmlns:cx3="http://schemas.microsoft.com/office/drawing/2016/5/9/chartex" xmlns:cx4="http://schemas.microsoft.com/office/drawing/2016/5/10/chartex" xmlns:cx5="http://schemas.microsoft.com/office/drawing/2016/5/11/chartex" xmlns:cx6="http://schemas.microsoft.com/office/drawing/2016/5/12/chartex" xmlns:cx7="http://schemas.microsoft.com/office/drawing/2016/5/13/chartex" xmlns:cx8="http://schemas.microsoft.com/office/drawing/2016/5/14/chartex" xmlns:mc="http://schemas.openxmlformats.org/markup-compatibility/2006" xmlns:aink="http://schemas.microsoft.com/office/drawing/2016/ink" xmlns:am3d="http://schemas.microsoft.com/office/drawing/2017/model3d" xmlns:o="urn:schemas-microsoft-com:office:office" xmlns:oel="http://schemas.microsoft.com/office/2019/extlst" xmlns:r="http://schemas.openxmlformats.org/officeDocument/2006/relationships" xmlns:m="http://schemas.openxmlformats.org/officeDocument/2006/math" xmlns:v="urn:schemas-microsoft-com:vml" xmlns:wp14="http://schemas.microsoft.com/office/word/2010/wordprocessingDrawing" xmlns:wp="http://schemas.openxmlformats.org/drawingml/2006/wordprocessingDrawing" xmlns:w10="urn:schemas-microsoft-com:office:word" xmlns:w="http://schemas.openxmlformats.org/wordprocessingml/2006/main" xmlns:w14="http://schemas.microsoft.com/office/word/2010/wordml" xmlns:w15="http://schemas.microsoft.com/office/word/2012/wordml" xmlns:w16cex="http://schemas.microsoft.com/office/word/2018/wordml/cex" xmlns:w16cid="http://schemas.microsoft.com/office/word/2016/wordml/cid" xmlns:w16="http://schemas.microsoft.com/office/word/2018/wordml" xmlns:w16du="http://schemas.microsoft.com/office/word/2023/wordml/word16du" xmlns:w16sdtdh="http://schemas.microsoft.com/office/word/2020/wordml/sdtdatahash" xmlns:w16sdtfl="http://schemas.microsoft.com/office/word/2024/wordml/sdtformatlock" xmlns:w16se="http://schemas.microsoft.com/office/word/2015/wordml/symex" xmlns:wpg="http://schemas.microsoft.com/office/word/2010/wordprocessingGroup" xmlns:wpi="http://schemas.microsoft.com/office/word/2010/wordprocessingInk" xmlns:wne="http://schemas.microsoft.com/office/word/2006/wordml" xmlns:wps="http://schemas.microsoft.com/office/word/2010/wordprocessingShape" mc:Ignorable="w14 w15 w16se w16cid w16 w16cex w16sdtdh w16sdtfl w16du wp14">
   <w:endnote w:type="separator" w:id="-1">
     <w:p>
       <w:pPr>
@@ -8529,7 +8795,7 @@
 </file>
 
 <file path=word/footer1.xml><?xml version="1.0" encoding="utf-8"?>
-<w:ftr xmlns:wpc="http://schemas.microsoft.com/office/word/2010/wordprocessingCanvas" xmlns:cx="http://schemas.microsoft.com/office/drawing/2014/chartex" xmlns:mc="http://schemas.openxmlformats.org/markup-compatibility/2006" xmlns:o="urn:schemas-microsoft-com:office:office" xmlns:r="http://schemas.openxmlformats.org/officeDocument/2006/relationships" xmlns:m="http://schemas.openxmlformats.org/officeDocument/2006/math" xmlns:v="urn:schemas-microsoft-com:vml" xmlns:wp14="http://schemas.microsoft.com/office/word/2010/wordprocessingDrawing" xmlns:wp="http://schemas.openxmlformats.org/drawingml/2006/wordprocessingDrawing" xmlns:w10="urn:schemas-microsoft-com:office:word" xmlns:w="http://schemas.openxmlformats.org/wordprocessingml/2006/main" xmlns:w14="http://schemas.microsoft.com/office/word/2010/wordml" xmlns:w15="http://schemas.microsoft.com/office/word/2012/wordml" xmlns:w16se="http://schemas.microsoft.com/office/word/2015/wordml/symex" xmlns:wpg="http://schemas.microsoft.com/office/word/2010/wordprocessingGroup" xmlns:wpi="http://schemas.microsoft.com/office/word/2010/wordprocessingInk" xmlns:wne="http://schemas.microsoft.com/office/word/2006/wordml" xmlns:wps="http://schemas.microsoft.com/office/word/2010/wordprocessingShape" mc:Ignorable="w14 w15 w16se wp14">
+<w:ftr xmlns:wpc="http://schemas.microsoft.com/office/word/2010/wordprocessingCanvas" xmlns:cx="http://schemas.microsoft.com/office/drawing/2014/chartex" xmlns:cx1="http://schemas.microsoft.com/office/drawing/2015/9/8/chartex" xmlns:cx2="http://schemas.microsoft.com/office/drawing/2015/10/21/chartex" xmlns:cx3="http://schemas.microsoft.com/office/drawing/2016/5/9/chartex" xmlns:cx4="http://schemas.microsoft.com/office/drawing/2016/5/10/chartex" xmlns:cx5="http://schemas.microsoft.com/office/drawing/2016/5/11/chartex" xmlns:cx6="http://schemas.microsoft.com/office/drawing/2016/5/12/chartex" xmlns:cx7="http://schemas.microsoft.com/office/drawing/2016/5/13/chartex" xmlns:cx8="http://schemas.microsoft.com/office/drawing/2016/5/14/chartex" xmlns:mc="http://schemas.openxmlformats.org/markup-compatibility/2006" xmlns:aink="http://schemas.microsoft.com/office/drawing/2016/ink" xmlns:am3d="http://schemas.microsoft.com/office/drawing/2017/model3d" xmlns:o="urn:schemas-microsoft-com:office:office" xmlns:oel="http://schemas.microsoft.com/office/2019/extlst" xmlns:r="http://schemas.openxmlformats.org/officeDocument/2006/relationships" xmlns:m="http://schemas.openxmlformats.org/officeDocument/2006/math" xmlns:v="urn:schemas-microsoft-com:vml" xmlns:wp14="http://schemas.microsoft.com/office/word/2010/wordprocessingDrawing" xmlns:wp="http://schemas.openxmlformats.org/drawingml/2006/wordprocessingDrawing" xmlns:w10="urn:schemas-microsoft-com:office:word" xmlns:w="http://schemas.openxmlformats.org/wordprocessingml/2006/main" xmlns:w14="http://schemas.microsoft.com/office/word/2010/wordml" xmlns:w15="http://schemas.microsoft.com/office/word/2012/wordml" xmlns:w16cex="http://schemas.microsoft.com/office/word/2018/wordml/cex" xmlns:w16cid="http://schemas.microsoft.com/office/word/2016/wordml/cid" xmlns:w16="http://schemas.microsoft.com/office/word/2018/wordml" xmlns:w16du="http://schemas.microsoft.com/office/word/2023/wordml/word16du" xmlns:w16sdtdh="http://schemas.microsoft.com/office/word/2020/wordml/sdtdatahash" xmlns:w16sdtfl="http://schemas.microsoft.com/office/word/2024/wordml/sdtformatlock" xmlns:w16se="http://schemas.microsoft.com/office/word/2015/wordml/symex" xmlns:wpg="http://schemas.microsoft.com/office/word/2010/wordprocessingGroup" xmlns:wpi="http://schemas.microsoft.com/office/word/2010/wordprocessingInk" xmlns:wne="http://schemas.microsoft.com/office/word/2006/wordml" xmlns:wps="http://schemas.microsoft.com/office/word/2010/wordprocessingShape" mc:Ignorable="w14 w15 w16se w16cid w16 w16cex w16sdtdh w16sdtfl w16du wp14">
   <w:p>
     <w:pPr>
       <w:pStyle w:val="Rodap"/>
@@ -8539,7 +8805,7 @@
 </file>
 
 <file path=word/footnotes.xml><?xml version="1.0" encoding="utf-8"?>
-<w:footnotes xmlns:wpc="http://schemas.microsoft.com/office/word/2010/wordprocessingCanvas" xmlns:cx="http://schemas.microsoft.com/office/drawing/2014/chartex" xmlns:mc="http://schemas.openxmlformats.org/markup-compatibility/2006" xmlns:o="urn:schemas-microsoft-com:office:office" xmlns:r="http://schemas.openxmlformats.org/officeDocument/2006/relationships" xmlns:m="http://schemas.openxmlformats.org/officeDocument/2006/math" xmlns:v="urn:schemas-microsoft-com:vml" xmlns:wp14="http://schemas.microsoft.com/office/word/2010/wordprocessingDrawing" xmlns:wp="http://schemas.openxmlformats.org/drawingml/2006/wordprocessingDrawing" xmlns:w10="urn:schemas-microsoft-com:office:word" xmlns:w="http://schemas.openxmlformats.org/wordprocessingml/2006/main" xmlns:w14="http://schemas.microsoft.com/office/word/2010/wordml" xmlns:w15="http://schemas.microsoft.com/office/word/2012/wordml" xmlns:w16se="http://schemas.microsoft.com/office/word/2015/wordml/symex" xmlns:wpg="http://schemas.microsoft.com/office/word/2010/wordprocessingGroup" xmlns:wpi="http://schemas.microsoft.com/office/word/2010/wordprocessingInk" xmlns:wne="http://schemas.microsoft.com/office/word/2006/wordml" xmlns:wps="http://schemas.microsoft.com/office/word/2010/wordprocessingShape" mc:Ignorable="w14 w15 w16se wp14">
+<w:footnotes xmlns:wpc="http://schemas.microsoft.com/office/word/2010/wordprocessingCanvas" xmlns:cx="http://schemas.microsoft.com/office/drawing/2014/chartex" xmlns:cx1="http://schemas.microsoft.com/office/drawing/2015/9/8/chartex" xmlns:cx2="http://schemas.microsoft.com/office/drawing/2015/10/21/chartex" xmlns:cx3="http://schemas.microsoft.com/office/drawing/2016/5/9/chartex" xmlns:cx4="http://schemas.microsoft.com/office/drawing/2016/5/10/chartex" xmlns:cx5="http://schemas.microsoft.com/office/drawing/2016/5/11/chartex" xmlns:cx6="http://schemas.microsoft.com/office/drawing/2016/5/12/chartex" xmlns:cx7="http://schemas.microsoft.com/office/drawing/2016/5/13/chartex" xmlns:cx8="http://schemas.microsoft.com/office/drawing/2016/5/14/chartex" xmlns:mc="http://schemas.openxmlformats.org/markup-compatibility/2006" xmlns:aink="http://schemas.microsoft.com/office/drawing/2016/ink" xmlns:am3d="http://schemas.microsoft.com/office/drawing/2017/model3d" xmlns:o="urn:schemas-microsoft-com:office:office" xmlns:oel="http://schemas.microsoft.com/office/2019/extlst" xmlns:r="http://schemas.openxmlformats.org/officeDocument/2006/relationships" xmlns:m="http://schemas.openxmlformats.org/officeDocument/2006/math" xmlns:v="urn:schemas-microsoft-com:vml" xmlns:wp14="http://schemas.microsoft.com/office/word/2010/wordprocessingDrawing" xmlns:wp="http://schemas.openxmlformats.org/drawingml/2006/wordprocessingDrawing" xmlns:w10="urn:schemas-microsoft-com:office:word" xmlns:w="http://schemas.openxmlformats.org/wordprocessingml/2006/main" xmlns:w14="http://schemas.microsoft.com/office/word/2010/wordml" xmlns:w15="http://schemas.microsoft.com/office/word/2012/wordml" xmlns:w16cex="http://schemas.microsoft.com/office/word/2018/wordml/cex" xmlns:w16cid="http://schemas.microsoft.com/office/word/2016/wordml/cid" xmlns:w16="http://schemas.microsoft.com/office/word/2018/wordml" xmlns:w16du="http://schemas.microsoft.com/office/word/2023/wordml/word16du" xmlns:w16sdtdh="http://schemas.microsoft.com/office/word/2020/wordml/sdtdatahash" xmlns:w16sdtfl="http://schemas.microsoft.com/office/word/2024/wordml/sdtformatlock" xmlns:w16se="http://schemas.microsoft.com/office/word/2015/wordml/symex" xmlns:wpg="http://schemas.microsoft.com/office/word/2010/wordprocessingGroup" xmlns:wpi="http://schemas.microsoft.com/office/word/2010/wordprocessingInk" xmlns:wne="http://schemas.microsoft.com/office/word/2006/wordml" xmlns:wps="http://schemas.microsoft.com/office/word/2010/wordprocessingShape" mc:Ignorable="w14 w15 w16se w16cid w16 w16cex w16sdtdh w16sdtfl w16du wp14">
   <w:footnote w:type="separator" w:id="-1">
     <w:p>
       <w:r>
@@ -8558,7 +8824,7 @@
 </file>
 
 <file path=word/header1.xml><?xml version="1.0" encoding="utf-8"?>
-<w:hdr xmlns:wpc="http://schemas.microsoft.com/office/word/2010/wordprocessingCanvas" xmlns:cx="http://schemas.microsoft.com/office/drawing/2014/chartex" xmlns:mc="http://schemas.openxmlformats.org/markup-compatibility/2006" xmlns:o="urn:schemas-microsoft-com:office:office" xmlns:r="http://schemas.openxmlformats.org/officeDocument/2006/relationships" xmlns:m="http://schemas.openxmlformats.org/officeDocument/2006/math" xmlns:v="urn:schemas-microsoft-com:vml" xmlns:wp14="http://schemas.microsoft.com/office/word/2010/wordprocessingDrawing" xmlns:wp="http://schemas.openxmlformats.org/drawingml/2006/wordprocessingDrawing" xmlns:w10="urn:schemas-microsoft-com:office:word" xmlns:w="http://schemas.openxmlformats.org/wordprocessingml/2006/main" xmlns:w14="http://schemas.microsoft.com/office/word/2010/wordml" xmlns:w15="http://schemas.microsoft.com/office/word/2012/wordml" xmlns:w16se="http://schemas.microsoft.com/office/word/2015/wordml/symex" xmlns:wpg="http://schemas.microsoft.com/office/word/2010/wordprocessingGroup" xmlns:wpi="http://schemas.microsoft.com/office/word/2010/wordprocessingInk" xmlns:wne="http://schemas.microsoft.com/office/word/2006/wordml" xmlns:wps="http://schemas.microsoft.com/office/word/2010/wordprocessingShape" mc:Ignorable="w14 w15 w16se wp14">
+<w:hdr xmlns:wpc="http://schemas.microsoft.com/office/word/2010/wordprocessingCanvas" xmlns:cx="http://schemas.microsoft.com/office/drawing/2014/chartex" xmlns:cx1="http://schemas.microsoft.com/office/drawing/2015/9/8/chartex" xmlns:cx2="http://schemas.microsoft.com/office/drawing/2015/10/21/chartex" xmlns:cx3="http://schemas.microsoft.com/office/drawing/2016/5/9/chartex" xmlns:cx4="http://schemas.microsoft.com/office/drawing/2016/5/10/chartex" xmlns:cx5="http://schemas.microsoft.com/office/drawing/2016/5/11/chartex" xmlns:cx6="http://schemas.microsoft.com/office/drawing/2016/5/12/chartex" xmlns:cx7="http://schemas.microsoft.com/office/drawing/2016/5/13/chartex" xmlns:cx8="http://schemas.microsoft.com/office/drawing/2016/5/14/chartex" xmlns:mc="http://schemas.openxmlformats.org/markup-compatibility/2006" xmlns:aink="http://schemas.microsoft.com/office/drawing/2016/ink" xmlns:am3d="http://schemas.microsoft.com/office/drawing/2017/model3d" xmlns:o="urn:schemas-microsoft-com:office:office" xmlns:oel="http://schemas.microsoft.com/office/2019/extlst" xmlns:r="http://schemas.openxmlformats.org/officeDocument/2006/relationships" xmlns:m="http://schemas.openxmlformats.org/officeDocument/2006/math" xmlns:v="urn:schemas-microsoft-com:vml" xmlns:wp14="http://schemas.microsoft.com/office/word/2010/wordprocessingDrawing" xmlns:wp="http://schemas.openxmlformats.org/drawingml/2006/wordprocessingDrawing" xmlns:w10="urn:schemas-microsoft-com:office:word" xmlns:w="http://schemas.openxmlformats.org/wordprocessingml/2006/main" xmlns:w14="http://schemas.microsoft.com/office/word/2010/wordml" xmlns:w15="http://schemas.microsoft.com/office/word/2012/wordml" xmlns:w16cex="http://schemas.microsoft.com/office/word/2018/wordml/cex" xmlns:w16cid="http://schemas.microsoft.com/office/word/2016/wordml/cid" xmlns:w16="http://schemas.microsoft.com/office/word/2018/wordml" xmlns:w16du="http://schemas.microsoft.com/office/word/2023/wordml/word16du" xmlns:w16sdtdh="http://schemas.microsoft.com/office/word/2020/wordml/sdtdatahash" xmlns:w16sdtfl="http://schemas.microsoft.com/office/word/2024/wordml/sdtformatlock" xmlns:w16se="http://schemas.microsoft.com/office/word/2015/wordml/symex" xmlns:wpg="http://schemas.microsoft.com/office/word/2010/wordprocessingGroup" xmlns:wpi="http://schemas.microsoft.com/office/word/2010/wordprocessingInk" xmlns:wne="http://schemas.microsoft.com/office/word/2006/wordml" xmlns:wps="http://schemas.microsoft.com/office/word/2010/wordprocessingShape" mc:Ignorable="w14 w15 w16se w16cid w16 w16cex w16sdtdh w16sdtfl w16du wp14">
   <w:p>
     <w:pPr>
       <w:pStyle w:val="Cabealho"/>
@@ -8574,7 +8840,7 @@
 </file>
 
 <file path=word/header2.xml><?xml version="1.0" encoding="utf-8"?>
-<w:hdr xmlns:wpc="http://schemas.microsoft.com/office/word/2010/wordprocessingCanvas" xmlns:cx="http://schemas.microsoft.com/office/drawing/2014/chartex" xmlns:mc="http://schemas.openxmlformats.org/markup-compatibility/2006" xmlns:o="urn:schemas-microsoft-com:office:office" xmlns:r="http://schemas.openxmlformats.org/officeDocument/2006/relationships" xmlns:m="http://schemas.openxmlformats.org/officeDocument/2006/math" xmlns:v="urn:schemas-microsoft-com:vml" xmlns:wp14="http://schemas.microsoft.com/office/word/2010/wordprocessingDrawing" xmlns:wp="http://schemas.openxmlformats.org/drawingml/2006/wordprocessingDrawing" xmlns:w10="urn:schemas-microsoft-com:office:word" xmlns:w="http://schemas.openxmlformats.org/wordprocessingml/2006/main" xmlns:w14="http://schemas.microsoft.com/office/word/2010/wordml" xmlns:w15="http://schemas.microsoft.com/office/word/2012/wordml" xmlns:w16se="http://schemas.microsoft.com/office/word/2015/wordml/symex" xmlns:wpg="http://schemas.microsoft.com/office/word/2010/wordprocessingGroup" xmlns:wpi="http://schemas.microsoft.com/office/word/2010/wordprocessingInk" xmlns:wne="http://schemas.microsoft.com/office/word/2006/wordml" xmlns:wps="http://schemas.microsoft.com/office/word/2010/wordprocessingShape" mc:Ignorable="w14 w15 w16se wp14">
+<w:hdr xmlns:wpc="http://schemas.microsoft.com/office/word/2010/wordprocessingCanvas" xmlns:cx="http://schemas.microsoft.com/office/drawing/2014/chartex" xmlns:cx1="http://schemas.microsoft.com/office/drawing/2015/9/8/chartex" xmlns:cx2="http://schemas.microsoft.com/office/drawing/2015/10/21/chartex" xmlns:cx3="http://schemas.microsoft.com/office/drawing/2016/5/9/chartex" xmlns:cx4="http://schemas.microsoft.com/office/drawing/2016/5/10/chartex" xmlns:cx5="http://schemas.microsoft.com/office/drawing/2016/5/11/chartex" xmlns:cx6="http://schemas.microsoft.com/office/drawing/2016/5/12/chartex" xmlns:cx7="http://schemas.microsoft.com/office/drawing/2016/5/13/chartex" xmlns:cx8="http://schemas.microsoft.com/office/drawing/2016/5/14/chartex" xmlns:mc="http://schemas.openxmlformats.org/markup-compatibility/2006" xmlns:aink="http://schemas.microsoft.com/office/drawing/2016/ink" xmlns:am3d="http://schemas.microsoft.com/office/drawing/2017/model3d" xmlns:o="urn:schemas-microsoft-com:office:office" xmlns:oel="http://schemas.microsoft.com/office/2019/extlst" xmlns:r="http://schemas.openxmlformats.org/officeDocument/2006/relationships" xmlns:m="http://schemas.openxmlformats.org/officeDocument/2006/math" xmlns:v="urn:schemas-microsoft-com:vml" xmlns:wp14="http://schemas.microsoft.com/office/word/2010/wordprocessingDrawing" xmlns:wp="http://schemas.openxmlformats.org/drawingml/2006/wordprocessingDrawing" xmlns:w10="urn:schemas-microsoft-com:office:word" xmlns:w="http://schemas.openxmlformats.org/wordprocessingml/2006/main" xmlns:w14="http://schemas.microsoft.com/office/word/2010/wordml" xmlns:w15="http://schemas.microsoft.com/office/word/2012/wordml" xmlns:w16cex="http://schemas.microsoft.com/office/word/2018/wordml/cex" xmlns:w16cid="http://schemas.microsoft.com/office/word/2016/wordml/cid" xmlns:w16="http://schemas.microsoft.com/office/word/2018/wordml" xmlns:w16du="http://schemas.microsoft.com/office/word/2023/wordml/word16du" xmlns:w16sdtdh="http://schemas.microsoft.com/office/word/2020/wordml/sdtdatahash" xmlns:w16sdtfl="http://schemas.microsoft.com/office/word/2024/wordml/sdtformatlock" xmlns:w16se="http://schemas.microsoft.com/office/word/2015/wordml/symex" xmlns:wpg="http://schemas.microsoft.com/office/word/2010/wordprocessingGroup" xmlns:wpi="http://schemas.microsoft.com/office/word/2010/wordprocessingInk" xmlns:wne="http://schemas.microsoft.com/office/word/2006/wordml" xmlns:wps="http://schemas.microsoft.com/office/word/2010/wordprocessingShape" mc:Ignorable="w14 w15 w16se w16cid w16 w16cex w16sdtdh w16sdtfl w16du wp14">
   <w:sdt>
     <w:sdtPr>
       <w:id w:val="-1699001773"/>
@@ -8638,7 +8904,7 @@
 </file>
 
 <file path=word/header3.xml><?xml version="1.0" encoding="utf-8"?>
-<w:hdr xmlns:wpc="http://schemas.microsoft.com/office/word/2010/wordprocessingCanvas" xmlns:cx="http://schemas.microsoft.com/office/drawing/2014/chartex" xmlns:mc="http://schemas.openxmlformats.org/markup-compatibility/2006" xmlns:o="urn:schemas-microsoft-com:office:office" xmlns:r="http://schemas.openxmlformats.org/officeDocument/2006/relationships" xmlns:m="http://schemas.openxmlformats.org/officeDocument/2006/math" xmlns:v="urn:schemas-microsoft-com:vml" xmlns:wp14="http://schemas.microsoft.com/office/word/2010/wordprocessingDrawing" xmlns:wp="http://schemas.openxmlformats.org/drawingml/2006/wordprocessingDrawing" xmlns:w10="urn:schemas-microsoft-com:office:word" xmlns:w="http://schemas.openxmlformats.org/wordprocessingml/2006/main" xmlns:w14="http://schemas.microsoft.com/office/word/2010/wordml" xmlns:w15="http://schemas.microsoft.com/office/word/2012/wordml" xmlns:w16se="http://schemas.microsoft.com/office/word/2015/wordml/symex" xmlns:wpg="http://schemas.microsoft.com/office/word/2010/wordprocessingGroup" xmlns:wpi="http://schemas.microsoft.com/office/word/2010/wordprocessingInk" xmlns:wne="http://schemas.microsoft.com/office/word/2006/wordml" xmlns:wps="http://schemas.microsoft.com/office/word/2010/wordprocessingShape" mc:Ignorable="w14 w15 w16se wp14">
+<w:hdr xmlns:wpc="http://schemas.microsoft.com/office/word/2010/wordprocessingCanvas" xmlns:cx="http://schemas.microsoft.com/office/drawing/2014/chartex" xmlns:cx1="http://schemas.microsoft.com/office/drawing/2015/9/8/chartex" xmlns:cx2="http://schemas.microsoft.com/office/drawing/2015/10/21/chartex" xmlns:cx3="http://schemas.microsoft.com/office/drawing/2016/5/9/chartex" xmlns:cx4="http://schemas.microsoft.com/office/drawing/2016/5/10/chartex" xmlns:cx5="http://schemas.microsoft.com/office/drawing/2016/5/11/chartex" xmlns:cx6="http://schemas.microsoft.com/office/drawing/2016/5/12/chartex" xmlns:cx7="http://schemas.microsoft.com/office/drawing/2016/5/13/chartex" xmlns:cx8="http://schemas.microsoft.com/office/drawing/2016/5/14/chartex" xmlns:mc="http://schemas.openxmlformats.org/markup-compatibility/2006" xmlns:aink="http://schemas.microsoft.com/office/drawing/2016/ink" xmlns:am3d="http://schemas.microsoft.com/office/drawing/2017/model3d" xmlns:o="urn:schemas-microsoft-com:office:office" xmlns:oel="http://schemas.microsoft.com/office/2019/extlst" xmlns:r="http://schemas.openxmlformats.org/officeDocument/2006/relationships" xmlns:m="http://schemas.openxmlformats.org/officeDocument/2006/math" xmlns:v="urn:schemas-microsoft-com:vml" xmlns:wp14="http://schemas.microsoft.com/office/word/2010/wordprocessingDrawing" xmlns:wp="http://schemas.openxmlformats.org/drawingml/2006/wordprocessingDrawing" xmlns:w10="urn:schemas-microsoft-com:office:word" xmlns:w="http://schemas.openxmlformats.org/wordprocessingml/2006/main" xmlns:w14="http://schemas.microsoft.com/office/word/2010/wordml" xmlns:w15="http://schemas.microsoft.com/office/word/2012/wordml" xmlns:w16cex="http://schemas.microsoft.com/office/word/2018/wordml/cex" xmlns:w16cid="http://schemas.microsoft.com/office/word/2016/wordml/cid" xmlns:w16="http://schemas.microsoft.com/office/word/2018/wordml" xmlns:w16du="http://schemas.microsoft.com/office/word/2023/wordml/word16du" xmlns:w16sdtdh="http://schemas.microsoft.com/office/word/2020/wordml/sdtdatahash" xmlns:w16sdtfl="http://schemas.microsoft.com/office/word/2024/wordml/sdtformatlock" xmlns:w16se="http://schemas.microsoft.com/office/word/2015/wordml/symex" xmlns:wpg="http://schemas.microsoft.com/office/word/2010/wordprocessingGroup" xmlns:wpi="http://schemas.microsoft.com/office/word/2010/wordprocessingInk" xmlns:wne="http://schemas.microsoft.com/office/word/2006/wordml" xmlns:wps="http://schemas.microsoft.com/office/word/2010/wordprocessingShape" mc:Ignorable="w14 w15 w16se w16cid w16 w16cex w16sdtdh w16sdtfl w16du wp14">
   <w:sdt>
     <w:sdtPr>
       <w:id w:val="958228592"/>
@@ -8715,7 +8981,7 @@
 </file>
 
 <file path=word/numbering.xml><?xml version="1.0" encoding="utf-8"?>
-<w:numbering xmlns:wpc="http://schemas.microsoft.com/office/word/2010/wordprocessingCanvas" xmlns:cx="http://schemas.microsoft.com/office/drawing/2014/chartex" xmlns:mc="http://schemas.openxmlformats.org/markup-compatibility/2006" xmlns:o="urn:schemas-microsoft-com:office:office" xmlns:r="http://schemas.openxmlformats.org/officeDocument/2006/relationships" xmlns:m="http://schemas.openxmlformats.org/officeDocument/2006/math" xmlns:v="urn:schemas-microsoft-com:vml" xmlns:wp14="http://schemas.microsoft.com/office/word/2010/wordprocessingDrawing" xmlns:wp="http://schemas.openxmlformats.org/drawingml/2006/wordprocessingDrawing" xmlns:w10="urn:schemas-microsoft-com:office:word" xmlns:w="http://schemas.openxmlformats.org/wordprocessingml/2006/main" xmlns:w14="http://schemas.microsoft.com/office/word/2010/wordml" xmlns:w15="http://schemas.microsoft.com/office/word/2012/wordml" xmlns:w16se="http://schemas.microsoft.com/office/word/2015/wordml/symex" xmlns:wpg="http://schemas.microsoft.com/office/word/2010/wordprocessingGroup" xmlns:wpi="http://schemas.microsoft.com/office/word/2010/wordprocessingInk" xmlns:wne="http://schemas.microsoft.com/office/word/2006/wordml" xmlns:wps="http://schemas.microsoft.com/office/word/2010/wordprocessingShape" mc:Ignorable="w14 w15 w16se wp14">
+<w:numbering xmlns:wpc="http://schemas.microsoft.com/office/word/2010/wordprocessingCanvas" xmlns:cx="http://schemas.microsoft.com/office/drawing/2014/chartex" xmlns:cx1="http://schemas.microsoft.com/office/drawing/2015/9/8/chartex" xmlns:cx2="http://schemas.microsoft.com/office/drawing/2015/10/21/chartex" xmlns:cx3="http://schemas.microsoft.com/office/drawing/2016/5/9/chartex" xmlns:cx4="http://schemas.microsoft.com/office/drawing/2016/5/10/chartex" xmlns:cx5="http://schemas.microsoft.com/office/drawing/2016/5/11/chartex" xmlns:cx6="http://schemas.microsoft.com/office/drawing/2016/5/12/chartex" xmlns:cx7="http://schemas.microsoft.com/office/drawing/2016/5/13/chartex" xmlns:cx8="http://schemas.microsoft.com/office/drawing/2016/5/14/chartex" xmlns:mc="http://schemas.openxmlformats.org/markup-compatibility/2006" xmlns:aink="http://schemas.microsoft.com/office/drawing/2016/ink" xmlns:am3d="http://schemas.microsoft.com/office/drawing/2017/model3d" xmlns:o="urn:schemas-microsoft-com:office:office" xmlns:oel="http://schemas.microsoft.com/office/2019/extlst" xmlns:r="http://schemas.openxmlformats.org/officeDocument/2006/relationships" xmlns:m="http://schemas.openxmlformats.org/officeDocument/2006/math" xmlns:v="urn:schemas-microsoft-com:vml" xmlns:wp14="http://schemas.microsoft.com/office/word/2010/wordprocessingDrawing" xmlns:wp="http://schemas.openxmlformats.org/drawingml/2006/wordprocessingDrawing" xmlns:w10="urn:schemas-microsoft-com:office:word" xmlns:w="http://schemas.openxmlformats.org/wordprocessingml/2006/main" xmlns:w14="http://schemas.microsoft.com/office/word/2010/wordml" xmlns:w15="http://schemas.microsoft.com/office/word/2012/wordml" xmlns:w16cex="http://schemas.microsoft.com/office/word/2018/wordml/cex" xmlns:w16cid="http://schemas.microsoft.com/office/word/2016/wordml/cid" xmlns:w16="http://schemas.microsoft.com/office/word/2018/wordml" xmlns:w16du="http://schemas.microsoft.com/office/word/2023/wordml/word16du" xmlns:w16sdtdh="http://schemas.microsoft.com/office/word/2020/wordml/sdtdatahash" xmlns:w16sdtfl="http://schemas.microsoft.com/office/word/2024/wordml/sdtformatlock" xmlns:w16se="http://schemas.microsoft.com/office/word/2015/wordml/symex" xmlns:wpg="http://schemas.microsoft.com/office/word/2010/wordprocessingGroup" xmlns:wpi="http://schemas.microsoft.com/office/word/2010/wordprocessingInk" xmlns:wne="http://schemas.microsoft.com/office/word/2006/wordml" xmlns:wps="http://schemas.microsoft.com/office/word/2010/wordprocessingShape" mc:Ignorable="w14 w15 w16se w16cid w16 w16cex w16sdtdh w16sdtfl w16du wp14">
   <w:abstractNum w:abstractNumId="0" w15:restartNumberingAfterBreak="0">
     <w:nsid w:val="00AB5A76"/>
     <w:multiLevelType w:val="hybridMultilevel"/>
@@ -10614,6 +10880,119 @@
     </w:lvl>
   </w:abstractNum>
   <w:abstractNum w:abstractNumId="17" w15:restartNumberingAfterBreak="0">
+    <w:nsid w:val="54F0361D"/>
+    <w:multiLevelType w:val="hybridMultilevel"/>
+    <w:tmpl w:val="4F6C6E4C"/>
+    <w:lvl w:ilvl="0" w:tplc="04160001">
+      <w:start w:val="1"/>
+      <w:numFmt w:val="bullet"/>
+      <w:lvlText w:val=""/>
+      <w:lvlJc w:val="left"/>
+      <w:pPr>
+        <w:ind w:left="720" w:hanging="360"/>
+      </w:pPr>
+      <w:rPr>
+        <w:rFonts w:ascii="Symbol" w:hAnsi="Symbol" w:hint="default"/>
+      </w:rPr>
+    </w:lvl>
+    <w:lvl w:ilvl="1" w:tplc="04160003" w:tentative="1">
+      <w:start w:val="1"/>
+      <w:numFmt w:val="bullet"/>
+      <w:lvlText w:val="o"/>
+      <w:lvlJc w:val="left"/>
+      <w:pPr>
+        <w:ind w:left="1440" w:hanging="360"/>
+      </w:pPr>
+      <w:rPr>
+        <w:rFonts w:ascii="Courier New" w:hAnsi="Courier New" w:cs="Courier New" w:hint="default"/>
+      </w:rPr>
+    </w:lvl>
+    <w:lvl w:ilvl="2" w:tplc="04160005" w:tentative="1">
+      <w:start w:val="1"/>
+      <w:numFmt w:val="bullet"/>
+      <w:lvlText w:val=""/>
+      <w:lvlJc w:val="left"/>
+      <w:pPr>
+        <w:ind w:left="2160" w:hanging="360"/>
+      </w:pPr>
+      <w:rPr>
+        <w:rFonts w:ascii="Wingdings" w:hAnsi="Wingdings" w:hint="default"/>
+      </w:rPr>
+    </w:lvl>
+    <w:lvl w:ilvl="3" w:tplc="04160001" w:tentative="1">
+      <w:start w:val="1"/>
+      <w:numFmt w:val="bullet"/>
+      <w:lvlText w:val=""/>
+      <w:lvlJc w:val="left"/>
+      <w:pPr>
+        <w:ind w:left="2880" w:hanging="360"/>
+      </w:pPr>
+      <w:rPr>
+        <w:rFonts w:ascii="Symbol" w:hAnsi="Symbol" w:hint="default"/>
+      </w:rPr>
+    </w:lvl>
+    <w:lvl w:ilvl="4" w:tplc="04160003" w:tentative="1">
+      <w:start w:val="1"/>
+      <w:numFmt w:val="bullet"/>
+      <w:lvlText w:val="o"/>
+      <w:lvlJc w:val="left"/>
+      <w:pPr>
+        <w:ind w:left="3600" w:hanging="360"/>
+      </w:pPr>
+      <w:rPr>
+        <w:rFonts w:ascii="Courier New" w:hAnsi="Courier New" w:cs="Courier New" w:hint="default"/>
+      </w:rPr>
+    </w:lvl>
+    <w:lvl w:ilvl="5" w:tplc="04160005" w:tentative="1">
+      <w:start w:val="1"/>
+      <w:numFmt w:val="bullet"/>
+      <w:lvlText w:val=""/>
+      <w:lvlJc w:val="left"/>
+      <w:pPr>
+        <w:ind w:left="4320" w:hanging="360"/>
+      </w:pPr>
+      <w:rPr>
+        <w:rFonts w:ascii="Wingdings" w:hAnsi="Wingdings" w:hint="default"/>
+      </w:rPr>
+    </w:lvl>
+    <w:lvl w:ilvl="6" w:tplc="04160001" w:tentative="1">
+      <w:start w:val="1"/>
+      <w:numFmt w:val="bullet"/>
+      <w:lvlText w:val=""/>
+      <w:lvlJc w:val="left"/>
+      <w:pPr>
+        <w:ind w:left="5040" w:hanging="360"/>
+      </w:pPr>
+      <w:rPr>
+        <w:rFonts w:ascii="Symbol" w:hAnsi="Symbol" w:hint="default"/>
+      </w:rPr>
+    </w:lvl>
+    <w:lvl w:ilvl="7" w:tplc="04160003" w:tentative="1">
+      <w:start w:val="1"/>
+      <w:numFmt w:val="bullet"/>
+      <w:lvlText w:val="o"/>
+      <w:lvlJc w:val="left"/>
+      <w:pPr>
+        <w:ind w:left="5760" w:hanging="360"/>
+      </w:pPr>
+      <w:rPr>
+        <w:rFonts w:ascii="Courier New" w:hAnsi="Courier New" w:cs="Courier New" w:hint="default"/>
+      </w:rPr>
+    </w:lvl>
+    <w:lvl w:ilvl="8" w:tplc="04160005" w:tentative="1">
+      <w:start w:val="1"/>
+      <w:numFmt w:val="bullet"/>
+      <w:lvlText w:val=""/>
+      <w:lvlJc w:val="left"/>
+      <w:pPr>
+        <w:ind w:left="6480" w:hanging="360"/>
+      </w:pPr>
+      <w:rPr>
+        <w:rFonts w:ascii="Wingdings" w:hAnsi="Wingdings" w:hint="default"/>
+      </w:rPr>
+    </w:lvl>
+  </w:abstractNum>
+  <w:abstractNum w:abstractNumId="18" w15:restartNumberingAfterBreak="0">
     <w:nsid w:val="57785046"/>
     <w:multiLevelType w:val="hybridMultilevel"/>
     <w:tmpl w:val="C08C567A"/>
@@ -10726,7 +11105,7 @@
       </w:rPr>
     </w:lvl>
   </w:abstractNum>
-  <w:abstractNum w:abstractNumId="18" w15:restartNumberingAfterBreak="0">
+  <w:abstractNum w:abstractNumId="19" w15:restartNumberingAfterBreak="0">
     <w:nsid w:val="58CC648C"/>
     <w:multiLevelType w:val="hybridMultilevel"/>
     <w:tmpl w:val="354056DA"/>
@@ -10839,7 +11218,7 @@
       </w:rPr>
     </w:lvl>
   </w:abstractNum>
-  <w:abstractNum w:abstractNumId="19" w15:restartNumberingAfterBreak="0">
+  <w:abstractNum w:abstractNumId="20" w15:restartNumberingAfterBreak="0">
     <w:nsid w:val="5AB6F6E3"/>
     <w:multiLevelType w:val="hybridMultilevel"/>
     <w:tmpl w:val="805A867C"/>
@@ -10952,7 +11331,7 @@
       </w:rPr>
     </w:lvl>
   </w:abstractNum>
-  <w:abstractNum w:abstractNumId="20" w15:restartNumberingAfterBreak="0">
+  <w:abstractNum w:abstractNumId="21" w15:restartNumberingAfterBreak="0">
     <w:nsid w:val="5D5DC71D"/>
     <w:multiLevelType w:val="hybridMultilevel"/>
     <w:tmpl w:val="C8B6695E"/>
@@ -11065,7 +11444,7 @@
       </w:rPr>
     </w:lvl>
   </w:abstractNum>
-  <w:abstractNum w:abstractNumId="21" w15:restartNumberingAfterBreak="0">
+  <w:abstractNum w:abstractNumId="22" w15:restartNumberingAfterBreak="0">
     <w:nsid w:val="70226238"/>
     <w:multiLevelType w:val="hybridMultilevel"/>
     <w:tmpl w:val="3520886A"/>
@@ -11178,7 +11557,7 @@
       </w:rPr>
     </w:lvl>
   </w:abstractNum>
-  <w:abstractNum w:abstractNumId="22" w15:restartNumberingAfterBreak="0">
+  <w:abstractNum w:abstractNumId="23" w15:restartNumberingAfterBreak="0">
     <w:nsid w:val="78C6E0F9"/>
     <w:multiLevelType w:val="hybridMultilevel"/>
     <w:tmpl w:val="43AEB4A4"/>
@@ -11291,7 +11670,7 @@
       </w:rPr>
     </w:lvl>
   </w:abstractNum>
-  <w:abstractNum w:abstractNumId="23" w15:restartNumberingAfterBreak="0">
+  <w:abstractNum w:abstractNumId="24" w15:restartNumberingAfterBreak="0">
     <w:nsid w:val="7B007F78"/>
     <w:multiLevelType w:val="hybridMultilevel"/>
     <w:tmpl w:val="845E85BC"/>
@@ -11404,7 +11783,7 @@
       </w:rPr>
     </w:lvl>
   </w:abstractNum>
-  <w:abstractNum w:abstractNumId="24" w15:restartNumberingAfterBreak="0">
+  <w:abstractNum w:abstractNumId="25" w15:restartNumberingAfterBreak="0">
     <w:nsid w:val="7F58207E"/>
     <w:multiLevelType w:val="hybridMultilevel"/>
     <w:tmpl w:val="8CF2AE86"/>
@@ -11517,86 +11896,89 @@
       </w:rPr>
     </w:lvl>
   </w:abstractNum>
-  <w:num w:numId="1">
+  <w:num w:numId="1" w16cid:durableId="292565627">
     <w:abstractNumId w:val="6"/>
   </w:num>
-  <w:num w:numId="2">
+  <w:num w:numId="2" w16cid:durableId="1312061582">
     <w:abstractNumId w:val="11"/>
   </w:num>
-  <w:num w:numId="3">
+  <w:num w:numId="3" w16cid:durableId="1710489717">
     <w:abstractNumId w:val="1"/>
   </w:num>
-  <w:num w:numId="4">
+  <w:num w:numId="4" w16cid:durableId="557326752">
     <w:abstractNumId w:val="10"/>
   </w:num>
-  <w:num w:numId="5">
+  <w:num w:numId="5" w16cid:durableId="1547988692">
+    <w:abstractNumId w:val="21"/>
+  </w:num>
+  <w:num w:numId="6" w16cid:durableId="1522935137">
     <w:abstractNumId w:val="20"/>
   </w:num>
-  <w:num w:numId="6">
+  <w:num w:numId="7" w16cid:durableId="2118212896">
+    <w:abstractNumId w:val="22"/>
+  </w:num>
+  <w:num w:numId="8" w16cid:durableId="1131631543">
+    <w:abstractNumId w:val="4"/>
+  </w:num>
+  <w:num w:numId="9" w16cid:durableId="2075345970">
+    <w:abstractNumId w:val="23"/>
+  </w:num>
+  <w:num w:numId="10" w16cid:durableId="199050510">
+    <w:abstractNumId w:val="2"/>
+  </w:num>
+  <w:num w:numId="11" w16cid:durableId="399180704">
+    <w:abstractNumId w:val="24"/>
+  </w:num>
+  <w:num w:numId="12" w16cid:durableId="778835016">
+    <w:abstractNumId w:val="25"/>
+  </w:num>
+  <w:num w:numId="13" w16cid:durableId="936711822">
+    <w:abstractNumId w:val="16"/>
+  </w:num>
+  <w:num w:numId="14" w16cid:durableId="1031417465">
+    <w:abstractNumId w:val="14"/>
+  </w:num>
+  <w:num w:numId="15" w16cid:durableId="81608087">
+    <w:abstractNumId w:val="12"/>
+  </w:num>
+  <w:num w:numId="16" w16cid:durableId="636029299">
+    <w:abstractNumId w:val="15"/>
+  </w:num>
+  <w:num w:numId="17" w16cid:durableId="343557435">
+    <w:abstractNumId w:val="9"/>
+  </w:num>
+  <w:num w:numId="18" w16cid:durableId="222907287">
+    <w:abstractNumId w:val="3"/>
+  </w:num>
+  <w:num w:numId="19" w16cid:durableId="2035954109">
     <w:abstractNumId w:val="19"/>
   </w:num>
-  <w:num w:numId="7">
-    <w:abstractNumId w:val="21"/>
+  <w:num w:numId="20" w16cid:durableId="289554794">
+    <w:abstractNumId w:val="8"/>
   </w:num>
-  <w:num w:numId="8">
-    <w:abstractNumId w:val="4"/>
+  <w:num w:numId="21" w16cid:durableId="1914386974">
+    <w:abstractNumId w:val="0"/>
   </w:num>
-  <w:num w:numId="9">
-    <w:abstractNumId w:val="22"/>
+  <w:num w:numId="22" w16cid:durableId="1214578792">
+    <w:abstractNumId w:val="7"/>
   </w:num>
-  <w:num w:numId="10">
-    <w:abstractNumId w:val="2"/>
+  <w:num w:numId="23" w16cid:durableId="1249729942">
+    <w:abstractNumId w:val="5"/>
   </w:num>
-  <w:num w:numId="11">
-    <w:abstractNumId w:val="23"/>
-  </w:num>
-  <w:num w:numId="12">
-    <w:abstractNumId w:val="24"/>
-  </w:num>
-  <w:num w:numId="13">
-    <w:abstractNumId w:val="16"/>
-  </w:num>
-  <w:num w:numId="14">
-    <w:abstractNumId w:val="14"/>
-  </w:num>
-  <w:num w:numId="15">
-    <w:abstractNumId w:val="12"/>
-  </w:num>
-  <w:num w:numId="16">
-    <w:abstractNumId w:val="15"/>
-  </w:num>
-  <w:num w:numId="17">
-    <w:abstractNumId w:val="9"/>
-  </w:num>
-  <w:num w:numId="18">
-    <w:abstractNumId w:val="3"/>
-  </w:num>
-  <w:num w:numId="19">
+  <w:num w:numId="24" w16cid:durableId="105151554">
     <w:abstractNumId w:val="18"/>
   </w:num>
-  <w:num w:numId="20">
-    <w:abstractNumId w:val="8"/>
+  <w:num w:numId="25" w16cid:durableId="2048984961">
+    <w:abstractNumId w:val="13"/>
   </w:num>
-  <w:num w:numId="21">
-    <w:abstractNumId w:val="0"/>
-  </w:num>
-  <w:num w:numId="22">
-    <w:abstractNumId w:val="7"/>
-  </w:num>
-  <w:num w:numId="23">
-    <w:abstractNumId w:val="5"/>
-  </w:num>
-  <w:num w:numId="24">
+  <w:num w:numId="26" w16cid:durableId="2034190305">
     <w:abstractNumId w:val="17"/>
-  </w:num>
-  <w:num w:numId="25">
-    <w:abstractNumId w:val="13"/>
   </w:num>
 </w:numbering>
 </file>
 
 <file path=word/styles.xml><?xml version="1.0" encoding="utf-8"?>
-<w:styles xmlns:mc="http://schemas.openxmlformats.org/markup-compatibility/2006" xmlns:r="http://schemas.openxmlformats.org/officeDocument/2006/relationships" xmlns:w="http://schemas.openxmlformats.org/wordprocessingml/2006/main" xmlns:w14="http://schemas.microsoft.com/office/word/2010/wordml" xmlns:w15="http://schemas.microsoft.com/office/word/2012/wordml" xmlns:w16se="http://schemas.microsoft.com/office/word/2015/wordml/symex" mc:Ignorable="w14 w15 w16se">
+<w:styles xmlns:mc="http://schemas.openxmlformats.org/markup-compatibility/2006" xmlns:r="http://schemas.openxmlformats.org/officeDocument/2006/relationships" xmlns:w="http://schemas.openxmlformats.org/wordprocessingml/2006/main" xmlns:w14="http://schemas.microsoft.com/office/word/2010/wordml" xmlns:w15="http://schemas.microsoft.com/office/word/2012/wordml" xmlns:w16cex="http://schemas.microsoft.com/office/word/2018/wordml/cex" xmlns:w16cid="http://schemas.microsoft.com/office/word/2016/wordml/cid" xmlns:w16="http://schemas.microsoft.com/office/word/2018/wordml" xmlns:w16du="http://schemas.microsoft.com/office/word/2023/wordml/word16du" xmlns:w16sdtdh="http://schemas.microsoft.com/office/word/2020/wordml/sdtdatahash" xmlns:w16sdtfl="http://schemas.microsoft.com/office/word/2024/wordml/sdtformatlock" xmlns:w16se="http://schemas.microsoft.com/office/word/2015/wordml/symex" mc:Ignorable="w14 w15 w16se w16cid w16 w16cex w16sdtdh w16sdtfl w16du">
   <w:docDefaults>
     <w:rPrDefault>
       <w:rPr>
@@ -11606,7 +11988,7 @@
     </w:rPrDefault>
     <w:pPrDefault/>
   </w:docDefaults>
-  <w:latentStyles w:defLockedState="0" w:defUIPriority="99" w:defSemiHidden="0" w:defUnhideWhenUsed="0" w:defQFormat="0" w:count="371">
+  <w:latentStyles w:defLockedState="0" w:defUIPriority="99" w:defSemiHidden="0" w:defUnhideWhenUsed="0" w:defQFormat="0" w:count="376">
     <w:lsdException w:name="Normal" w:uiPriority="0" w:qFormat="1"/>
     <w:lsdException w:name="heading 1" w:uiPriority="9" w:qFormat="1"/>
     <w:lsdException w:name="heading 2" w:uiPriority="9" w:unhideWhenUsed="1" w:qFormat="1"/>
@@ -11978,6 +12360,11 @@
     <w:lsdException w:name="List Table 5 Dark Accent 6" w:uiPriority="50"/>
     <w:lsdException w:name="List Table 6 Colorful Accent 6" w:uiPriority="51"/>
     <w:lsdException w:name="List Table 7 Colorful Accent 6" w:uiPriority="52"/>
+    <w:lsdException w:name="Mention" w:semiHidden="1" w:unhideWhenUsed="1"/>
+    <w:lsdException w:name="Smart Hyperlink" w:semiHidden="1" w:unhideWhenUsed="1"/>
+    <w:lsdException w:name="Hashtag" w:semiHidden="1" w:unhideWhenUsed="1"/>
+    <w:lsdException w:name="Unresolved Mention" w:semiHidden="1" w:unhideWhenUsed="1"/>
+    <w:lsdException w:name="Smart Link" w:semiHidden="1" w:unhideWhenUsed="1"/>
   </w:latentStyles>
   <w:style w:type="paragraph" w:default="1" w:styleId="Normal">
     <w:name w:val="Normal"/>
@@ -12958,8 +13345,8 @@
       <w:rFonts w:ascii="Courier New" w:eastAsia="Times New Roman" w:hAnsi="Courier New" w:cs="Courier New"/>
     </w:rPr>
   </w:style>
-  <w:style w:type="character" w:customStyle="1" w:styleId="UnresolvedMention">
-    <w:name w:val="Unresolved Mention"/>
+  <w:style w:type="character" w:customStyle="1" w:styleId="MenoPendente2">
+    <w:name w:val="Menção Pendente2"/>
     <w:basedOn w:val="Fontepargpadro"/>
     <w:uiPriority w:val="99"/>
     <w:semiHidden/>

</xml_diff>

<commit_message>
Adicionando o DER para a documentação do projeto integrador - 21/04/2026
</commit_message>
<xml_diff>
--- a/Terceiro_Semestre/Projeto_Integrador/Documentação/Modelo_Projeto_Integrador_principal.docx
+++ b/Terceiro_Semestre/Projeto_Integrador/Documentação/Modelo_Projeto_Integrador_principal.docx
@@ -3923,6 +3923,15 @@
     </w:p>
     <w:p>
       <w:pPr>
+        <w:spacing w:line="240" w:lineRule="auto"/>
+        <w:contextualSpacing w:val="0"/>
+        <w:rPr>
+          <w:rStyle w:val="Forte"/>
+        </w:rPr>
+      </w:pPr>
+    </w:p>
+    <w:p>
+      <w:pPr>
         <w:pStyle w:val="PargrafodaLista"/>
         <w:rPr>
           <w:u w:val="single"/>
@@ -3933,7 +3942,6 @@
           <w:b/>
           <w:bCs/>
         </w:rPr>
-        <w:lastRenderedPageBreak/>
         <w:t>Ator:</w:t>
       </w:r>
       <w:r>
@@ -4131,6 +4139,7 @@
         <w:rPr>
           <w:b/>
         </w:rPr>
+        <w:lastRenderedPageBreak/>
         <w:t xml:space="preserve">Descrição: </w:t>
       </w:r>
       <w:r>
@@ -4154,7 +4163,6 @@
           <w:b/>
           <w:bCs/>
         </w:rPr>
-        <w:lastRenderedPageBreak/>
         <w:t>RF05 - Aprovar Alocação</w:t>
       </w:r>
     </w:p>
@@ -4426,6 +4434,7 @@
         <w:rPr>
           <w:noProof/>
         </w:rPr>
+        <w:lastRenderedPageBreak/>
         <w:drawing>
           <wp:anchor distT="0" distB="0" distL="114300" distR="114300" simplePos="0" relativeHeight="251661312" behindDoc="0" locked="0" layoutInCell="1" allowOverlap="1" wp14:anchorId="7161466E" wp14:editId="2E96E315">
             <wp:simplePos x="0" y="0"/>
@@ -4500,7 +4509,6 @@
           <w:b/>
           <w:bCs/>
         </w:rPr>
-        <w:lastRenderedPageBreak/>
         <w:t>RF0</w:t>
       </w:r>
       <w:r>
@@ -4802,13 +4810,8 @@
       <w:pPr>
         <w:pStyle w:val="PargrafodaLista"/>
       </w:pPr>
-      <w:proofErr w:type="spellStart"/>
-      <w:r>
-        <w:t>Descrição</w:t>
-      </w:r>
-      <w:proofErr w:type="spellEnd"/>
-      <w:r>
-        <w:t xml:space="preserve">: </w:t>
+      <w:r>
+        <w:t xml:space="preserve">Descrição: </w:t>
       </w:r>
       <w:r>
         <w:t>O sistema deve permitir filtrar os softwares disponíveis por laboratório.</w:t>
@@ -4825,7 +4828,6 @@
         <w:rPr>
           <w:noProof/>
         </w:rPr>
-        <w:lastRenderedPageBreak/>
         <w:drawing>
           <wp:anchor distT="0" distB="0" distL="114300" distR="114300" simplePos="0" relativeHeight="251662336" behindDoc="0" locked="0" layoutInCell="1" allowOverlap="1" wp14:anchorId="70C4E604" wp14:editId="7245E8EA">
             <wp:simplePos x="0" y="0"/>
@@ -5131,6 +5133,7 @@
         <w:rPr>
           <w:i w:val="0"/>
         </w:rPr>
+        <w:lastRenderedPageBreak/>
         <w:t>3.4.1</w:t>
       </w:r>
       <w:r>
@@ -5147,13 +5150,15 @@
     <w:p>
       <w:pPr>
         <w:ind w:left="851"/>
-      </w:pPr>
-      <w:r>
-        <w:rPr>
-          <w:b/>
-          <w:bCs/>
-        </w:rPr>
-        <w:lastRenderedPageBreak/>
+        <w:rPr>
+          <w:u w:val="single"/>
+        </w:rPr>
+      </w:pPr>
+      <w:r>
+        <w:rPr>
+          <w:b/>
+          <w:bCs/>
+        </w:rPr>
         <w:t xml:space="preserve">Diagrama </w:t>
       </w:r>
       <w:r>
@@ -5172,9 +5177,9 @@
           <w:lang w:eastAsia="pt-BR"/>
         </w:rPr>
         <w:drawing>
-          <wp:inline distT="0" distB="0" distL="0" distR="0" wp14:anchorId="220AB256" wp14:editId="2F366C53">
-            <wp:extent cx="4225636" cy="5522672"/>
-            <wp:effectExtent l="0" t="0" r="3810" b="1905"/>
+          <wp:inline distT="0" distB="0" distL="0" distR="0" wp14:anchorId="220AB256" wp14:editId="6F7269EF">
+            <wp:extent cx="4695092" cy="2976464"/>
+            <wp:effectExtent l="0" t="0" r="0" b="0"/>
             <wp:docPr id="3" name="Imagem 3"/>
             <wp:cNvGraphicFramePr>
               <a:graphicFrameLocks xmlns:a="http://schemas.openxmlformats.org/drawingml/2006/main" noChangeAspect="1"/>
@@ -5201,7 +5206,7 @@
                   <pic:spPr>
                     <a:xfrm>
                       <a:off x="0" y="0"/>
-                      <a:ext cx="4226750" cy="5524128"/>
+                      <a:ext cx="4701422" cy="2980477"/>
                     </a:xfrm>
                     <a:prstGeom prst="rect">
                       <a:avLst/>
@@ -5268,7 +5273,7 @@
           <w:lang w:eastAsia="pt-BR"/>
         </w:rPr>
         <w:drawing>
-          <wp:inline distT="0" distB="0" distL="0" distR="0" wp14:anchorId="2EA7A7F6" wp14:editId="09CBE727">
+          <wp:inline distT="0" distB="0" distL="0" distR="0" wp14:anchorId="2EA7A7F6" wp14:editId="2CB18543">
             <wp:extent cx="5839814" cy="1418493"/>
             <wp:effectExtent l="0" t="0" r="0" b="0"/>
             <wp:docPr id="2" name="Imagem 2"/>
@@ -5343,7 +5348,7 @@
           <w:lang w:eastAsia="pt-BR"/>
         </w:rPr>
         <w:drawing>
-          <wp:inline distT="0" distB="0" distL="0" distR="0" wp14:anchorId="32AD5C31" wp14:editId="6FEA47A8">
+          <wp:inline distT="0" distB="0" distL="0" distR="0" wp14:anchorId="32AD5C31" wp14:editId="7C35880E">
             <wp:extent cx="5737189" cy="1154723"/>
             <wp:effectExtent l="0" t="0" r="0" b="7620"/>
             <wp:docPr id="5" name="Imagem 5"/>
@@ -5397,6 +5402,7 @@
           <w:b/>
           <w:bCs/>
         </w:rPr>
+        <w:lastRenderedPageBreak/>
         <w:t>3. Tipo Usuário</w:t>
       </w:r>
       <w:r>
@@ -5414,7 +5420,7 @@
           <w:lang w:eastAsia="pt-BR"/>
         </w:rPr>
         <w:drawing>
-          <wp:inline distT="0" distB="0" distL="0" distR="0" wp14:anchorId="0C2017A5" wp14:editId="22CB64E4">
+          <wp:inline distT="0" distB="0" distL="0" distR="0" wp14:anchorId="0C2017A5" wp14:editId="22178AD3">
             <wp:extent cx="5760720" cy="657860"/>
             <wp:effectExtent l="0" t="0" r="0" b="8890"/>
             <wp:docPr id="223634582" name="Imagem 1"/>
@@ -5485,7 +5491,7 @@
           <w:lang w:eastAsia="pt-BR"/>
         </w:rPr>
         <w:drawing>
-          <wp:inline distT="0" distB="0" distL="0" distR="0" wp14:anchorId="5A0A9D17" wp14:editId="1F7D3E4A">
+          <wp:inline distT="0" distB="0" distL="0" distR="0" wp14:anchorId="5A0A9D17" wp14:editId="680EFD47">
             <wp:extent cx="5755479" cy="773723"/>
             <wp:effectExtent l="0" t="0" r="0" b="7620"/>
             <wp:docPr id="6" name="Imagem 6"/>
@@ -5556,7 +5562,7 @@
           <w:lang w:eastAsia="pt-BR"/>
         </w:rPr>
         <w:drawing>
-          <wp:inline distT="0" distB="0" distL="0" distR="0" wp14:anchorId="61B11120" wp14:editId="7D0E0FB3">
+          <wp:inline distT="0" distB="0" distL="0" distR="0" wp14:anchorId="61B11120" wp14:editId="5210C2D3">
             <wp:extent cx="5749743" cy="914400"/>
             <wp:effectExtent l="0" t="0" r="3810" b="0"/>
             <wp:docPr id="7" name="Imagem 7"/>
@@ -5634,7 +5640,7 @@
           <w:lang w:eastAsia="pt-BR"/>
         </w:rPr>
         <w:drawing>
-          <wp:inline distT="0" distB="0" distL="0" distR="0" wp14:anchorId="4DC00A87" wp14:editId="3E63284E">
+          <wp:inline distT="0" distB="0" distL="0" distR="0" wp14:anchorId="4DC00A87" wp14:editId="40CEA15A">
             <wp:extent cx="5752398" cy="1453661"/>
             <wp:effectExtent l="0" t="0" r="1270" b="0"/>
             <wp:docPr id="8" name="Imagem 8"/>
@@ -5719,7 +5725,7 @@
           <w:lang w:eastAsia="pt-BR"/>
         </w:rPr>
         <w:drawing>
-          <wp:inline distT="0" distB="0" distL="0" distR="0" wp14:anchorId="6EF7DC13" wp14:editId="4F6059D5">
+          <wp:inline distT="0" distB="0" distL="0" distR="0" wp14:anchorId="6EF7DC13" wp14:editId="1625BCF4">
             <wp:extent cx="5788489" cy="574430"/>
             <wp:effectExtent l="0" t="0" r="3175" b="0"/>
             <wp:docPr id="9" name="Imagem 9"/>
@@ -5804,7 +5810,7 @@
           <w:lang w:eastAsia="pt-BR"/>
         </w:rPr>
         <w:drawing>
-          <wp:inline distT="0" distB="0" distL="0" distR="0" wp14:anchorId="0FA3CA38" wp14:editId="4D4E4956">
+          <wp:inline distT="0" distB="0" distL="0" distR="0" wp14:anchorId="0FA3CA38" wp14:editId="0B069243">
             <wp:extent cx="5773542" cy="580292"/>
             <wp:effectExtent l="0" t="0" r="0" b="0"/>
             <wp:docPr id="10" name="Imagem 10"/>
@@ -5952,6 +5958,7 @@
         <w:rPr>
           <w:lang w:val="en-US"/>
         </w:rPr>
+        <w:lastRenderedPageBreak/>
         <w:t xml:space="preserve">    </w:t>
       </w:r>
       <w:proofErr w:type="spellStart"/>
@@ -6467,12 +6474,6 @@
           <w:lang w:val="en-US"/>
         </w:rPr>
         <w:br/>
-      </w:r>
-      <w:r>
-        <w:rPr>
-          <w:lang w:val="en-US"/>
-        </w:rPr>
-        <w:lastRenderedPageBreak/>
         <w:t xml:space="preserve">TIPO </w:t>
       </w:r>
       <w:r>
@@ -6602,6 +6603,7 @@
           <w:bCs/>
           <w:lang w:val="en-US"/>
         </w:rPr>
+        <w:lastRenderedPageBreak/>
         <w:t>SOFTWARE:</w:t>
       </w:r>
     </w:p>
@@ -7072,7 +7074,6 @@
         <w:rPr>
           <w:lang w:val="en-US"/>
         </w:rPr>
-        <w:lastRenderedPageBreak/>
         <w:t xml:space="preserve">    data DATE NOT NULL,</w:t>
       </w:r>
     </w:p>
@@ -7230,507 +7231,6 @@
           <w:lang w:val="en-US"/>
         </w:rPr>
         <w:t xml:space="preserve"> INTEGER NOT NULL,</w:t>
-      </w:r>
-    </w:p>
-    <w:p>
-      <w:pPr>
-        <w:rPr>
-          <w:lang w:val="en-US"/>
-        </w:rPr>
-      </w:pPr>
-      <w:r>
-        <w:rPr>
-          <w:lang w:val="en-US"/>
-        </w:rPr>
-        <w:t xml:space="preserve">    </w:t>
-      </w:r>
-      <w:proofErr w:type="spellStart"/>
-      <w:r>
-        <w:rPr>
-          <w:lang w:val="en-US"/>
-        </w:rPr>
-        <w:t>id_usuario</w:t>
-      </w:r>
-      <w:proofErr w:type="spellEnd"/>
-      <w:r>
-        <w:rPr>
-          <w:lang w:val="en-US"/>
-        </w:rPr>
-        <w:t xml:space="preserve"> INTEGER NOT NULL,</w:t>
-      </w:r>
-    </w:p>
-    <w:p>
-      <w:pPr>
-        <w:rPr>
-          <w:lang w:val="en-US"/>
-        </w:rPr>
-      </w:pPr>
-    </w:p>
-    <w:p>
-      <w:pPr>
-        <w:rPr>
-          <w:lang w:val="en-US"/>
-        </w:rPr>
-      </w:pPr>
-      <w:r>
-        <w:rPr>
-          <w:lang w:val="en-US"/>
-        </w:rPr>
-        <w:t xml:space="preserve">    CONSTRAINT </w:t>
-      </w:r>
-      <w:proofErr w:type="spellStart"/>
-      <w:r>
-        <w:rPr>
-          <w:lang w:val="en-US"/>
-        </w:rPr>
-        <w:t>chk_status_aprovacao</w:t>
-      </w:r>
-      <w:proofErr w:type="spellEnd"/>
-    </w:p>
-    <w:p>
-      <w:pPr>
-        <w:rPr>
-          <w:lang w:val="en-US"/>
-        </w:rPr>
-      </w:pPr>
-      <w:r>
-        <w:rPr>
-          <w:lang w:val="en-US"/>
-        </w:rPr>
-        <w:t xml:space="preserve">        CHECK (</w:t>
-      </w:r>
-      <w:proofErr w:type="spellStart"/>
-      <w:r>
-        <w:rPr>
-          <w:lang w:val="en-US"/>
-        </w:rPr>
-        <w:t>status_aprovacao</w:t>
-      </w:r>
-      <w:proofErr w:type="spellEnd"/>
-      <w:r>
-        <w:rPr>
-          <w:lang w:val="en-US"/>
-        </w:rPr>
-        <w:t xml:space="preserve"> IN ('A', 'R', 'P')),</w:t>
-      </w:r>
-    </w:p>
-    <w:p>
-      <w:pPr>
-        <w:rPr>
-          <w:lang w:val="en-US"/>
-        </w:rPr>
-      </w:pPr>
-    </w:p>
-    <w:p>
-      <w:r>
-        <w:rPr>
-          <w:lang w:val="en-US"/>
-        </w:rPr>
-        <w:t xml:space="preserve">    </w:t>
-      </w:r>
-      <w:r>
-        <w:t xml:space="preserve">CONSTRAINT </w:t>
-      </w:r>
-      <w:proofErr w:type="spellStart"/>
-      <w:r>
-        <w:t>fk_alocacao_disciplina</w:t>
-      </w:r>
-      <w:proofErr w:type="spellEnd"/>
-    </w:p>
-    <w:p>
-      <w:r>
-        <w:t xml:space="preserve">        FOREIGN KEY (</w:t>
-      </w:r>
-      <w:proofErr w:type="spellStart"/>
-      <w:r>
-        <w:t>id_disciplina</w:t>
-      </w:r>
-      <w:proofErr w:type="spellEnd"/>
-      <w:r>
-        <w:t>)</w:t>
-      </w:r>
-    </w:p>
-    <w:p>
-      <w:r>
-        <w:t xml:space="preserve">        REFERENCES disciplina(</w:t>
-      </w:r>
-      <w:proofErr w:type="spellStart"/>
-      <w:r>
-        <w:t>id_disciplina</w:t>
-      </w:r>
-      <w:proofErr w:type="spellEnd"/>
-      <w:r>
-        <w:t>)</w:t>
-      </w:r>
-    </w:p>
-    <w:p>
-      <w:pPr>
-        <w:rPr>
-          <w:lang w:val="en-US"/>
-        </w:rPr>
-      </w:pPr>
-      <w:r>
-        <w:t xml:space="preserve">        </w:t>
-      </w:r>
-      <w:r>
-        <w:rPr>
-          <w:lang w:val="en-US"/>
-        </w:rPr>
-        <w:t>ON UPDATE CASCADE</w:t>
-      </w:r>
-    </w:p>
-    <w:p>
-      <w:pPr>
-        <w:rPr>
-          <w:lang w:val="en-US"/>
-        </w:rPr>
-      </w:pPr>
-      <w:r>
-        <w:rPr>
-          <w:lang w:val="en-US"/>
-        </w:rPr>
-        <w:t xml:space="preserve">        ON DELETE RESTRICT,</w:t>
-      </w:r>
-    </w:p>
-    <w:p>
-      <w:pPr>
-        <w:rPr>
-          <w:lang w:val="en-US"/>
-        </w:rPr>
-      </w:pPr>
-    </w:p>
-    <w:p>
-      <w:pPr>
-        <w:rPr>
-          <w:lang w:val="en-US"/>
-        </w:rPr>
-      </w:pPr>
-      <w:r>
-        <w:rPr>
-          <w:lang w:val="en-US"/>
-        </w:rPr>
-        <w:t xml:space="preserve">    CONSTRAINT </w:t>
-      </w:r>
-      <w:proofErr w:type="spellStart"/>
-      <w:r>
-        <w:rPr>
-          <w:lang w:val="en-US"/>
-        </w:rPr>
-        <w:t>fk_alocacao_laboratorio</w:t>
-      </w:r>
-      <w:proofErr w:type="spellEnd"/>
-    </w:p>
-    <w:p>
-      <w:pPr>
-        <w:rPr>
-          <w:lang w:val="en-US"/>
-        </w:rPr>
-      </w:pPr>
-      <w:r>
-        <w:rPr>
-          <w:lang w:val="en-US"/>
-        </w:rPr>
-        <w:t xml:space="preserve">        FOREIGN KEY (</w:t>
-      </w:r>
-      <w:proofErr w:type="spellStart"/>
-      <w:r>
-        <w:rPr>
-          <w:lang w:val="en-US"/>
-        </w:rPr>
-        <w:t>id_laboratorio</w:t>
-      </w:r>
-      <w:proofErr w:type="spellEnd"/>
-      <w:r>
-        <w:rPr>
-          <w:lang w:val="en-US"/>
-        </w:rPr>
-        <w:t>)</w:t>
-      </w:r>
-    </w:p>
-    <w:p>
-      <w:pPr>
-        <w:rPr>
-          <w:lang w:val="en-US"/>
-        </w:rPr>
-      </w:pPr>
-      <w:r>
-        <w:rPr>
-          <w:lang w:val="en-US"/>
-        </w:rPr>
-        <w:t xml:space="preserve">        REFERENCES </w:t>
-      </w:r>
-      <w:proofErr w:type="spellStart"/>
-      <w:r>
-        <w:rPr>
-          <w:lang w:val="en-US"/>
-        </w:rPr>
-        <w:t>laboratorio</w:t>
-      </w:r>
-      <w:proofErr w:type="spellEnd"/>
-      <w:r>
-        <w:rPr>
-          <w:lang w:val="en-US"/>
-        </w:rPr>
-        <w:t>(</w:t>
-      </w:r>
-      <w:proofErr w:type="spellStart"/>
-      <w:r>
-        <w:rPr>
-          <w:lang w:val="en-US"/>
-        </w:rPr>
-        <w:t>id_laboratorio</w:t>
-      </w:r>
-      <w:proofErr w:type="spellEnd"/>
-      <w:r>
-        <w:rPr>
-          <w:lang w:val="en-US"/>
-        </w:rPr>
-        <w:t>)</w:t>
-      </w:r>
-    </w:p>
-    <w:p>
-      <w:pPr>
-        <w:rPr>
-          <w:lang w:val="en-US"/>
-        </w:rPr>
-      </w:pPr>
-      <w:r>
-        <w:rPr>
-          <w:lang w:val="en-US"/>
-        </w:rPr>
-        <w:t xml:space="preserve">        ON UPDATE CASCADE</w:t>
-      </w:r>
-    </w:p>
-    <w:p>
-      <w:pPr>
-        <w:rPr>
-          <w:lang w:val="en-US"/>
-        </w:rPr>
-      </w:pPr>
-      <w:r>
-        <w:rPr>
-          <w:lang w:val="en-US"/>
-        </w:rPr>
-        <w:t xml:space="preserve">        ON DELETE RESTRICT,</w:t>
-      </w:r>
-    </w:p>
-    <w:p>
-      <w:pPr>
-        <w:rPr>
-          <w:lang w:val="en-US"/>
-        </w:rPr>
-      </w:pPr>
-    </w:p>
-    <w:p>
-      <w:pPr>
-        <w:rPr>
-          <w:lang w:val="en-US"/>
-        </w:rPr>
-      </w:pPr>
-      <w:r>
-        <w:rPr>
-          <w:lang w:val="en-US"/>
-        </w:rPr>
-        <w:t xml:space="preserve">    CONSTRAINT </w:t>
-      </w:r>
-      <w:proofErr w:type="spellStart"/>
-      <w:r>
-        <w:rPr>
-          <w:lang w:val="en-US"/>
-        </w:rPr>
-        <w:t>fk_alocacao_usuario</w:t>
-      </w:r>
-      <w:proofErr w:type="spellEnd"/>
-    </w:p>
-    <w:p>
-      <w:pPr>
-        <w:rPr>
-          <w:lang w:val="en-US"/>
-        </w:rPr>
-      </w:pPr>
-      <w:r>
-        <w:rPr>
-          <w:lang w:val="en-US"/>
-        </w:rPr>
-        <w:t xml:space="preserve">        FOREIGN KEY (</w:t>
-      </w:r>
-      <w:proofErr w:type="spellStart"/>
-      <w:r>
-        <w:rPr>
-          <w:lang w:val="en-US"/>
-        </w:rPr>
-        <w:t>id_usuario</w:t>
-      </w:r>
-      <w:proofErr w:type="spellEnd"/>
-      <w:r>
-        <w:rPr>
-          <w:lang w:val="en-US"/>
-        </w:rPr>
-        <w:t>)</w:t>
-      </w:r>
-    </w:p>
-    <w:p>
-      <w:pPr>
-        <w:rPr>
-          <w:lang w:val="en-US"/>
-        </w:rPr>
-      </w:pPr>
-      <w:r>
-        <w:rPr>
-          <w:lang w:val="en-US"/>
-        </w:rPr>
-        <w:t xml:space="preserve">        REFERENCES </w:t>
-      </w:r>
-      <w:proofErr w:type="spellStart"/>
-      <w:r>
-        <w:rPr>
-          <w:lang w:val="en-US"/>
-        </w:rPr>
-        <w:t>usuario</w:t>
-      </w:r>
-      <w:proofErr w:type="spellEnd"/>
-      <w:r>
-        <w:rPr>
-          <w:lang w:val="en-US"/>
-        </w:rPr>
-        <w:t>(</w:t>
-      </w:r>
-      <w:proofErr w:type="spellStart"/>
-      <w:r>
-        <w:rPr>
-          <w:lang w:val="en-US"/>
-        </w:rPr>
-        <w:t>id_usuario</w:t>
-      </w:r>
-      <w:proofErr w:type="spellEnd"/>
-      <w:r>
-        <w:rPr>
-          <w:lang w:val="en-US"/>
-        </w:rPr>
-        <w:t>)</w:t>
-      </w:r>
-    </w:p>
-    <w:p>
-      <w:pPr>
-        <w:rPr>
-          <w:lang w:val="en-US"/>
-        </w:rPr>
-      </w:pPr>
-      <w:r>
-        <w:rPr>
-          <w:lang w:val="en-US"/>
-        </w:rPr>
-        <w:t xml:space="preserve">        ON UPDATE CASCADE</w:t>
-      </w:r>
-    </w:p>
-    <w:p>
-      <w:pPr>
-        <w:rPr>
-          <w:lang w:val="en-US"/>
-        </w:rPr>
-      </w:pPr>
-      <w:r>
-        <w:rPr>
-          <w:lang w:val="en-US"/>
-        </w:rPr>
-        <w:t xml:space="preserve">        ON DELETE RESTRICT</w:t>
-      </w:r>
-    </w:p>
-    <w:p>
-      <w:pPr>
-        <w:rPr>
-          <w:lang w:val="en-US"/>
-        </w:rPr>
-      </w:pPr>
-      <w:r>
-        <w:rPr>
-          <w:lang w:val="en-US"/>
-        </w:rPr>
-        <w:t>);</w:t>
-      </w:r>
-    </w:p>
-    <w:p>
-      <w:pPr>
-        <w:rPr>
-          <w:lang w:val="en-US"/>
-        </w:rPr>
-      </w:pPr>
-    </w:p>
-    <w:p>
-      <w:pPr>
-        <w:rPr>
-          <w:b/>
-          <w:bCs/>
-          <w:lang w:val="en-US"/>
-        </w:rPr>
-      </w:pPr>
-      <w:r>
-        <w:rPr>
-          <w:b/>
-          <w:bCs/>
-          <w:lang w:val="en-US"/>
-        </w:rPr>
-        <w:t>LABORATÓRIO-SOFTWARE (</w:t>
-      </w:r>
-      <w:proofErr w:type="gramStart"/>
-      <w:r>
-        <w:rPr>
-          <w:b/>
-          <w:bCs/>
-          <w:lang w:val="en-US"/>
-        </w:rPr>
-        <w:t>N:N</w:t>
-      </w:r>
-      <w:proofErr w:type="gramEnd"/>
-      <w:r>
-        <w:rPr>
-          <w:b/>
-          <w:bCs/>
-          <w:lang w:val="en-US"/>
-        </w:rPr>
-        <w:t>)</w:t>
-      </w:r>
-      <w:r>
-        <w:rPr>
-          <w:b/>
-          <w:bCs/>
-          <w:lang w:val="en-US"/>
-        </w:rPr>
-        <w:t>:</w:t>
-      </w:r>
-    </w:p>
-    <w:p>
-      <w:pPr>
-        <w:rPr>
-          <w:lang w:val="en-US"/>
-        </w:rPr>
-      </w:pPr>
-    </w:p>
-    <w:p>
-      <w:pPr>
-        <w:rPr>
-          <w:lang w:val="en-US"/>
-        </w:rPr>
-      </w:pPr>
-      <w:r>
-        <w:rPr>
-          <w:lang w:val="en-US"/>
-        </w:rPr>
-        <w:t xml:space="preserve">CREATE TABLE </w:t>
-      </w:r>
-      <w:proofErr w:type="spellStart"/>
-      <w:r>
-        <w:rPr>
-          <w:lang w:val="en-US"/>
-        </w:rPr>
-        <w:t>laboratorio_software</w:t>
-      </w:r>
-      <w:proofErr w:type="spellEnd"/>
-      <w:r>
-        <w:rPr>
-          <w:lang w:val="en-US"/>
-        </w:rPr>
-        <w:t xml:space="preserve"> (</w:t>
       </w:r>
     </w:p>
     <w:p>
@@ -7751,6 +7251,507 @@
         <w:rPr>
           <w:lang w:val="en-US"/>
         </w:rPr>
+        <w:t>id_usuario</w:t>
+      </w:r>
+      <w:proofErr w:type="spellEnd"/>
+      <w:r>
+        <w:rPr>
+          <w:lang w:val="en-US"/>
+        </w:rPr>
+        <w:t xml:space="preserve"> INTEGER NOT NULL,</w:t>
+      </w:r>
+    </w:p>
+    <w:p>
+      <w:pPr>
+        <w:rPr>
+          <w:lang w:val="en-US"/>
+        </w:rPr>
+      </w:pPr>
+    </w:p>
+    <w:p>
+      <w:pPr>
+        <w:rPr>
+          <w:lang w:val="en-US"/>
+        </w:rPr>
+      </w:pPr>
+      <w:r>
+        <w:rPr>
+          <w:lang w:val="en-US"/>
+        </w:rPr>
+        <w:t xml:space="preserve">    CONSTRAINT </w:t>
+      </w:r>
+      <w:proofErr w:type="spellStart"/>
+      <w:r>
+        <w:rPr>
+          <w:lang w:val="en-US"/>
+        </w:rPr>
+        <w:t>chk_status_aprovacao</w:t>
+      </w:r>
+      <w:proofErr w:type="spellEnd"/>
+    </w:p>
+    <w:p>
+      <w:pPr>
+        <w:rPr>
+          <w:lang w:val="en-US"/>
+        </w:rPr>
+      </w:pPr>
+      <w:r>
+        <w:rPr>
+          <w:lang w:val="en-US"/>
+        </w:rPr>
+        <w:t xml:space="preserve">        CHECK (</w:t>
+      </w:r>
+      <w:proofErr w:type="spellStart"/>
+      <w:r>
+        <w:rPr>
+          <w:lang w:val="en-US"/>
+        </w:rPr>
+        <w:t>status_aprovacao</w:t>
+      </w:r>
+      <w:proofErr w:type="spellEnd"/>
+      <w:r>
+        <w:rPr>
+          <w:lang w:val="en-US"/>
+        </w:rPr>
+        <w:t xml:space="preserve"> IN ('A', 'R', 'P')),</w:t>
+      </w:r>
+    </w:p>
+    <w:p>
+      <w:pPr>
+        <w:rPr>
+          <w:lang w:val="en-US"/>
+        </w:rPr>
+      </w:pPr>
+    </w:p>
+    <w:p>
+      <w:r>
+        <w:rPr>
+          <w:lang w:val="en-US"/>
+        </w:rPr>
+        <w:t xml:space="preserve">    </w:t>
+      </w:r>
+      <w:r>
+        <w:t xml:space="preserve">CONSTRAINT </w:t>
+      </w:r>
+      <w:proofErr w:type="spellStart"/>
+      <w:r>
+        <w:t>fk_alocacao_disciplina</w:t>
+      </w:r>
+      <w:proofErr w:type="spellEnd"/>
+    </w:p>
+    <w:p>
+      <w:r>
+        <w:t xml:space="preserve">        FOREIGN KEY (</w:t>
+      </w:r>
+      <w:proofErr w:type="spellStart"/>
+      <w:r>
+        <w:t>id_disciplina</w:t>
+      </w:r>
+      <w:proofErr w:type="spellEnd"/>
+      <w:r>
+        <w:t>)</w:t>
+      </w:r>
+    </w:p>
+    <w:p>
+      <w:r>
+        <w:t xml:space="preserve">        REFERENCES disciplina(</w:t>
+      </w:r>
+      <w:proofErr w:type="spellStart"/>
+      <w:r>
+        <w:t>id_disciplina</w:t>
+      </w:r>
+      <w:proofErr w:type="spellEnd"/>
+      <w:r>
+        <w:t>)</w:t>
+      </w:r>
+    </w:p>
+    <w:p>
+      <w:pPr>
+        <w:rPr>
+          <w:lang w:val="en-US"/>
+        </w:rPr>
+      </w:pPr>
+      <w:r>
+        <w:t xml:space="preserve">        </w:t>
+      </w:r>
+      <w:r>
+        <w:rPr>
+          <w:lang w:val="en-US"/>
+        </w:rPr>
+        <w:t>ON UPDATE CASCADE</w:t>
+      </w:r>
+    </w:p>
+    <w:p>
+      <w:pPr>
+        <w:rPr>
+          <w:lang w:val="en-US"/>
+        </w:rPr>
+      </w:pPr>
+      <w:r>
+        <w:rPr>
+          <w:lang w:val="en-US"/>
+        </w:rPr>
+        <w:t xml:space="preserve">        ON DELETE RESTRICT,</w:t>
+      </w:r>
+    </w:p>
+    <w:p>
+      <w:pPr>
+        <w:rPr>
+          <w:lang w:val="en-US"/>
+        </w:rPr>
+      </w:pPr>
+    </w:p>
+    <w:p>
+      <w:pPr>
+        <w:rPr>
+          <w:lang w:val="en-US"/>
+        </w:rPr>
+      </w:pPr>
+      <w:r>
+        <w:rPr>
+          <w:lang w:val="en-US"/>
+        </w:rPr>
+        <w:t xml:space="preserve">    CONSTRAINT </w:t>
+      </w:r>
+      <w:proofErr w:type="spellStart"/>
+      <w:r>
+        <w:rPr>
+          <w:lang w:val="en-US"/>
+        </w:rPr>
+        <w:t>fk_alocacao_laboratorio</w:t>
+      </w:r>
+      <w:proofErr w:type="spellEnd"/>
+    </w:p>
+    <w:p>
+      <w:pPr>
+        <w:rPr>
+          <w:lang w:val="en-US"/>
+        </w:rPr>
+      </w:pPr>
+      <w:r>
+        <w:rPr>
+          <w:lang w:val="en-US"/>
+        </w:rPr>
+        <w:t xml:space="preserve">        FOREIGN KEY (</w:t>
+      </w:r>
+      <w:proofErr w:type="spellStart"/>
+      <w:r>
+        <w:rPr>
+          <w:lang w:val="en-US"/>
+        </w:rPr>
+        <w:t>id_laboratorio</w:t>
+      </w:r>
+      <w:proofErr w:type="spellEnd"/>
+      <w:r>
+        <w:rPr>
+          <w:lang w:val="en-US"/>
+        </w:rPr>
+        <w:t>)</w:t>
+      </w:r>
+    </w:p>
+    <w:p>
+      <w:pPr>
+        <w:rPr>
+          <w:lang w:val="en-US"/>
+        </w:rPr>
+      </w:pPr>
+      <w:r>
+        <w:rPr>
+          <w:lang w:val="en-US"/>
+        </w:rPr>
+        <w:t xml:space="preserve">        REFERENCES </w:t>
+      </w:r>
+      <w:proofErr w:type="spellStart"/>
+      <w:r>
+        <w:rPr>
+          <w:lang w:val="en-US"/>
+        </w:rPr>
+        <w:t>laboratorio</w:t>
+      </w:r>
+      <w:proofErr w:type="spellEnd"/>
+      <w:r>
+        <w:rPr>
+          <w:lang w:val="en-US"/>
+        </w:rPr>
+        <w:t>(</w:t>
+      </w:r>
+      <w:proofErr w:type="spellStart"/>
+      <w:r>
+        <w:rPr>
+          <w:lang w:val="en-US"/>
+        </w:rPr>
+        <w:t>id_laboratorio</w:t>
+      </w:r>
+      <w:proofErr w:type="spellEnd"/>
+      <w:r>
+        <w:rPr>
+          <w:lang w:val="en-US"/>
+        </w:rPr>
+        <w:t>)</w:t>
+      </w:r>
+    </w:p>
+    <w:p>
+      <w:pPr>
+        <w:rPr>
+          <w:lang w:val="en-US"/>
+        </w:rPr>
+      </w:pPr>
+      <w:r>
+        <w:rPr>
+          <w:lang w:val="en-US"/>
+        </w:rPr>
+        <w:t xml:space="preserve">        ON UPDATE CASCADE</w:t>
+      </w:r>
+    </w:p>
+    <w:p>
+      <w:pPr>
+        <w:rPr>
+          <w:lang w:val="en-US"/>
+        </w:rPr>
+      </w:pPr>
+      <w:r>
+        <w:rPr>
+          <w:lang w:val="en-US"/>
+        </w:rPr>
+        <w:t xml:space="preserve">        ON DELETE RESTRICT,</w:t>
+      </w:r>
+    </w:p>
+    <w:p>
+      <w:pPr>
+        <w:rPr>
+          <w:lang w:val="en-US"/>
+        </w:rPr>
+      </w:pPr>
+    </w:p>
+    <w:p>
+      <w:pPr>
+        <w:rPr>
+          <w:lang w:val="en-US"/>
+        </w:rPr>
+      </w:pPr>
+      <w:r>
+        <w:rPr>
+          <w:lang w:val="en-US"/>
+        </w:rPr>
+        <w:t xml:space="preserve">    CONSTRAINT </w:t>
+      </w:r>
+      <w:proofErr w:type="spellStart"/>
+      <w:r>
+        <w:rPr>
+          <w:lang w:val="en-US"/>
+        </w:rPr>
+        <w:t>fk_alocacao_usuario</w:t>
+      </w:r>
+      <w:proofErr w:type="spellEnd"/>
+    </w:p>
+    <w:p>
+      <w:pPr>
+        <w:rPr>
+          <w:lang w:val="en-US"/>
+        </w:rPr>
+      </w:pPr>
+      <w:r>
+        <w:rPr>
+          <w:lang w:val="en-US"/>
+        </w:rPr>
+        <w:t xml:space="preserve">        FOREIGN KEY (</w:t>
+      </w:r>
+      <w:proofErr w:type="spellStart"/>
+      <w:r>
+        <w:rPr>
+          <w:lang w:val="en-US"/>
+        </w:rPr>
+        <w:t>id_usuario</w:t>
+      </w:r>
+      <w:proofErr w:type="spellEnd"/>
+      <w:r>
+        <w:rPr>
+          <w:lang w:val="en-US"/>
+        </w:rPr>
+        <w:t>)</w:t>
+      </w:r>
+    </w:p>
+    <w:p>
+      <w:pPr>
+        <w:rPr>
+          <w:lang w:val="en-US"/>
+        </w:rPr>
+      </w:pPr>
+      <w:r>
+        <w:rPr>
+          <w:lang w:val="en-US"/>
+        </w:rPr>
+        <w:t xml:space="preserve">        REFERENCES </w:t>
+      </w:r>
+      <w:proofErr w:type="spellStart"/>
+      <w:r>
+        <w:rPr>
+          <w:lang w:val="en-US"/>
+        </w:rPr>
+        <w:t>usuario</w:t>
+      </w:r>
+      <w:proofErr w:type="spellEnd"/>
+      <w:r>
+        <w:rPr>
+          <w:lang w:val="en-US"/>
+        </w:rPr>
+        <w:t>(</w:t>
+      </w:r>
+      <w:proofErr w:type="spellStart"/>
+      <w:r>
+        <w:rPr>
+          <w:lang w:val="en-US"/>
+        </w:rPr>
+        <w:t>id_usuario</w:t>
+      </w:r>
+      <w:proofErr w:type="spellEnd"/>
+      <w:r>
+        <w:rPr>
+          <w:lang w:val="en-US"/>
+        </w:rPr>
+        <w:t>)</w:t>
+      </w:r>
+    </w:p>
+    <w:p>
+      <w:pPr>
+        <w:rPr>
+          <w:lang w:val="en-US"/>
+        </w:rPr>
+      </w:pPr>
+      <w:r>
+        <w:rPr>
+          <w:lang w:val="en-US"/>
+        </w:rPr>
+        <w:t xml:space="preserve">        ON UPDATE CASCADE</w:t>
+      </w:r>
+    </w:p>
+    <w:p>
+      <w:pPr>
+        <w:rPr>
+          <w:lang w:val="en-US"/>
+        </w:rPr>
+      </w:pPr>
+      <w:r>
+        <w:rPr>
+          <w:lang w:val="en-US"/>
+        </w:rPr>
+        <w:t xml:space="preserve">        ON DELETE RESTRICT</w:t>
+      </w:r>
+    </w:p>
+    <w:p>
+      <w:pPr>
+        <w:rPr>
+          <w:lang w:val="en-US"/>
+        </w:rPr>
+      </w:pPr>
+      <w:r>
+        <w:rPr>
+          <w:lang w:val="en-US"/>
+        </w:rPr>
+        <w:t>);</w:t>
+      </w:r>
+    </w:p>
+    <w:p>
+      <w:pPr>
+        <w:rPr>
+          <w:lang w:val="en-US"/>
+        </w:rPr>
+      </w:pPr>
+    </w:p>
+    <w:p>
+      <w:pPr>
+        <w:rPr>
+          <w:b/>
+          <w:bCs/>
+          <w:lang w:val="en-US"/>
+        </w:rPr>
+      </w:pPr>
+      <w:r>
+        <w:rPr>
+          <w:b/>
+          <w:bCs/>
+          <w:lang w:val="en-US"/>
+        </w:rPr>
+        <w:t>LABORATÓRIO-SOFTWARE (</w:t>
+      </w:r>
+      <w:proofErr w:type="gramStart"/>
+      <w:r>
+        <w:rPr>
+          <w:b/>
+          <w:bCs/>
+          <w:lang w:val="en-US"/>
+        </w:rPr>
+        <w:t>N:N</w:t>
+      </w:r>
+      <w:proofErr w:type="gramEnd"/>
+      <w:r>
+        <w:rPr>
+          <w:b/>
+          <w:bCs/>
+          <w:lang w:val="en-US"/>
+        </w:rPr>
+        <w:t>)</w:t>
+      </w:r>
+      <w:r>
+        <w:rPr>
+          <w:b/>
+          <w:bCs/>
+          <w:lang w:val="en-US"/>
+        </w:rPr>
+        <w:t>:</w:t>
+      </w:r>
+    </w:p>
+    <w:p>
+      <w:pPr>
+        <w:rPr>
+          <w:lang w:val="en-US"/>
+        </w:rPr>
+      </w:pPr>
+    </w:p>
+    <w:p>
+      <w:pPr>
+        <w:rPr>
+          <w:lang w:val="en-US"/>
+        </w:rPr>
+      </w:pPr>
+      <w:r>
+        <w:rPr>
+          <w:lang w:val="en-US"/>
+        </w:rPr>
+        <w:t xml:space="preserve">CREATE TABLE </w:t>
+      </w:r>
+      <w:proofErr w:type="spellStart"/>
+      <w:r>
+        <w:rPr>
+          <w:lang w:val="en-US"/>
+        </w:rPr>
+        <w:t>laboratorio_software</w:t>
+      </w:r>
+      <w:proofErr w:type="spellEnd"/>
+      <w:r>
+        <w:rPr>
+          <w:lang w:val="en-US"/>
+        </w:rPr>
+        <w:t xml:space="preserve"> (</w:t>
+      </w:r>
+    </w:p>
+    <w:p>
+      <w:pPr>
+        <w:rPr>
+          <w:lang w:val="en-US"/>
+        </w:rPr>
+      </w:pPr>
+      <w:r>
+        <w:rPr>
+          <w:lang w:val="en-US"/>
+        </w:rPr>
+        <w:t xml:space="preserve">    </w:t>
+      </w:r>
+      <w:proofErr w:type="spellStart"/>
+      <w:r>
+        <w:rPr>
+          <w:lang w:val="en-US"/>
+        </w:rPr>
         <w:t>id_software</w:t>
       </w:r>
       <w:proofErr w:type="spellEnd"/>
@@ -7901,6 +7902,7 @@
         <w:rPr>
           <w:lang w:val="en-US"/>
         </w:rPr>
+        <w:lastRenderedPageBreak/>
         <w:t xml:space="preserve">        REFERENCES software(</w:t>
       </w:r>
       <w:proofErr w:type="spellStart"/>
@@ -8313,7 +8315,6 @@
     </w:p>
     <w:p>
       <w:r>
-        <w:lastRenderedPageBreak/>
         <w:t xml:space="preserve">        REFERENCES disciplina(id_disciplina)</w:t>
       </w:r>
     </w:p>
@@ -8667,7 +8668,7 @@
           <w:lang w:eastAsia="pt-BR"/>
         </w:rPr>
         <w:drawing>
-          <wp:inline distT="0" distB="0" distL="0" distR="0" wp14:anchorId="7D1B9FBA" wp14:editId="454A4538">
+          <wp:inline distT="0" distB="0" distL="0" distR="0" wp14:anchorId="7D1B9FBA" wp14:editId="1356FBCD">
             <wp:extent cx="2881439" cy="4064751"/>
             <wp:effectExtent l="0" t="0" r="0" b="0"/>
             <wp:docPr id="1726782481" name="Imagem 2"/>

</xml_diff>

<commit_message>
Alterando a documentação e o dicionário de dados - 22/04/2026
</commit_message>
<xml_diff>
--- a/Terceiro_Semestre/Projeto_Integrador/Documentação/Modelo_Projeto_Integrador_principal.docx
+++ b/Terceiro_Semestre/Projeto_Integrador/Documentação/Modelo_Projeto_Integrador_principal.docx
@@ -1,6 +1,6 @@
 
 <file path=word/document.xml><?xml version="1.0" encoding="utf-8"?>
-<w:document xmlns:wpc="http://schemas.microsoft.com/office/word/2010/wordprocessingCanvas" xmlns:cx="http://schemas.microsoft.com/office/drawing/2014/chartex" xmlns:cx1="http://schemas.microsoft.com/office/drawing/2015/9/8/chartex" xmlns:cx2="http://schemas.microsoft.com/office/drawing/2015/10/21/chartex" xmlns:cx3="http://schemas.microsoft.com/office/drawing/2016/5/9/chartex" xmlns:cx4="http://schemas.microsoft.com/office/drawing/2016/5/10/chartex" xmlns:cx5="http://schemas.microsoft.com/office/drawing/2016/5/11/chartex" xmlns:cx6="http://schemas.microsoft.com/office/drawing/2016/5/12/chartex" xmlns:cx7="http://schemas.microsoft.com/office/drawing/2016/5/13/chartex" xmlns:cx8="http://schemas.microsoft.com/office/drawing/2016/5/14/chartex" xmlns:mc="http://schemas.openxmlformats.org/markup-compatibility/2006" xmlns:aink="http://schemas.microsoft.com/office/drawing/2016/ink" xmlns:am3d="http://schemas.microsoft.com/office/drawing/2017/model3d" xmlns:o="urn:schemas-microsoft-com:office:office" xmlns:oel="http://schemas.microsoft.com/office/2019/extlst" xmlns:r="http://schemas.openxmlformats.org/officeDocument/2006/relationships" xmlns:m="http://schemas.openxmlformats.org/officeDocument/2006/math" xmlns:v="urn:schemas-microsoft-com:vml" xmlns:wp14="http://schemas.microsoft.com/office/word/2010/wordprocessingDrawing" xmlns:wp="http://schemas.openxmlformats.org/drawingml/2006/wordprocessingDrawing" xmlns:w10="urn:schemas-microsoft-com:office:word" xmlns:w="http://schemas.openxmlformats.org/wordprocessingml/2006/main" xmlns:w14="http://schemas.microsoft.com/office/word/2010/wordml" xmlns:w15="http://schemas.microsoft.com/office/word/2012/wordml" xmlns:w16cex="http://schemas.microsoft.com/office/word/2018/wordml/cex" xmlns:w16cid="http://schemas.microsoft.com/office/word/2016/wordml/cid" xmlns:w16="http://schemas.microsoft.com/office/word/2018/wordml" xmlns:w16du="http://schemas.microsoft.com/office/word/2023/wordml/word16du" xmlns:w16sdtdh="http://schemas.microsoft.com/office/word/2020/wordml/sdtdatahash" xmlns:w16sdtfl="http://schemas.microsoft.com/office/word/2024/wordml/sdtformatlock" xmlns:w16se="http://schemas.microsoft.com/office/word/2015/wordml/symex" xmlns:wpg="http://schemas.microsoft.com/office/word/2010/wordprocessingGroup" xmlns:wpi="http://schemas.microsoft.com/office/word/2010/wordprocessingInk" xmlns:wne="http://schemas.microsoft.com/office/word/2006/wordml" xmlns:wps="http://schemas.microsoft.com/office/word/2010/wordprocessingShape" mc:Ignorable="w14 w15 w16se w16cid w16 w16cex w16sdtdh w16sdtfl w16du wp14">
+<w:document xmlns:wpc="http://schemas.microsoft.com/office/word/2010/wordprocessingCanvas" xmlns:cx="http://schemas.microsoft.com/office/drawing/2014/chartex" xmlns:mc="http://schemas.openxmlformats.org/markup-compatibility/2006" xmlns:o="urn:schemas-microsoft-com:office:office" xmlns:r="http://schemas.openxmlformats.org/officeDocument/2006/relationships" xmlns:m="http://schemas.openxmlformats.org/officeDocument/2006/math" xmlns:v="urn:schemas-microsoft-com:vml" xmlns:wp14="http://schemas.microsoft.com/office/word/2010/wordprocessingDrawing" xmlns:wp="http://schemas.openxmlformats.org/drawingml/2006/wordprocessingDrawing" xmlns:w10="urn:schemas-microsoft-com:office:word" xmlns:w="http://schemas.openxmlformats.org/wordprocessingml/2006/main" xmlns:w14="http://schemas.microsoft.com/office/word/2010/wordml" xmlns:w15="http://schemas.microsoft.com/office/word/2012/wordml" xmlns:w16se="http://schemas.microsoft.com/office/word/2015/wordml/symex" xmlns:wpg="http://schemas.microsoft.com/office/word/2010/wordprocessingGroup" xmlns:wpi="http://schemas.microsoft.com/office/word/2010/wordprocessingInk" xmlns:wne="http://schemas.microsoft.com/office/word/2006/wordml" xmlns:wps="http://schemas.microsoft.com/office/word/2010/wordprocessingShape" mc:Ignorable="w14 w15 w16se wp14">
   <w:body>
     <w:p>
       <w:pPr>
@@ -3833,6 +3833,9 @@
       </w:r>
     </w:p>
     <w:p>
+      <w:pPr>
+        <w:ind w:firstLine="720"/>
+      </w:pPr>
       <w:r>
         <w:rPr>
           <w:b/>
@@ -3908,6 +3911,98 @@
     </w:p>
     <w:p>
       <w:pPr>
+        <w:pStyle w:val="PargrafodaLista"/>
+        <w:rPr>
+          <w:u w:val="single"/>
+        </w:rPr>
+      </w:pPr>
+    </w:p>
+    <w:p>
+      <w:pPr>
+        <w:pStyle w:val="PargrafodaLista"/>
+      </w:pPr>
+      <w:r>
+        <w:rPr>
+          <w:b/>
+          <w:bCs/>
+        </w:rPr>
+        <w:t>Atores:</w:t>
+      </w:r>
+      <w:r>
+        <w:t xml:space="preserve"> Coordenador e responsá</w:t>
+      </w:r>
+      <w:bookmarkStart w:id="20" w:name="_GoBack"/>
+      <w:bookmarkEnd w:id="20"/>
+      <w:r>
+        <w:t>vel de TI:</w:t>
+      </w:r>
+    </w:p>
+    <w:p>
+      <w:pPr>
+        <w:pStyle w:val="PargrafodaLista"/>
+        <w:numPr>
+          <w:ilvl w:val="0"/>
+          <w:numId w:val="22"/>
+        </w:numPr>
+        <w:rPr>
+          <w:b/>
+          <w:bCs/>
+        </w:rPr>
+      </w:pPr>
+      <w:r>
+        <w:rPr>
+          <w:b/>
+          <w:bCs/>
+        </w:rPr>
+        <w:t>RF13</w:t>
+      </w:r>
+      <w:r>
+        <w:rPr>
+          <w:b/>
+          <w:bCs/>
+        </w:rPr>
+        <w:t xml:space="preserve"> </w:t>
+      </w:r>
+      <w:r>
+        <w:rPr>
+          <w:b/>
+          <w:bCs/>
+        </w:rPr>
+        <w:t>–</w:t>
+      </w:r>
+      <w:r>
+        <w:rPr>
+          <w:b/>
+          <w:bCs/>
+        </w:rPr>
+        <w:t xml:space="preserve"> </w:t>
+      </w:r>
+      <w:r>
+        <w:rPr>
+          <w:b/>
+          <w:bCs/>
+        </w:rPr>
+        <w:t>Filtrar Software por Laboratórios</w:t>
+      </w:r>
+    </w:p>
+    <w:p>
+      <w:pPr>
+        <w:pStyle w:val="PargrafodaLista"/>
+      </w:pPr>
+      <w:r>
+        <w:t>Ator: Coordenador e Responsável de TI.</w:t>
+      </w:r>
+    </w:p>
+    <w:p>
+      <w:pPr>
+        <w:pStyle w:val="PargrafodaLista"/>
+      </w:pPr>
+      <w:r>
+        <w:t>Descrição: O sistema deve permitir filtrar os softwares disponíveis por laboratório.</w:t>
+      </w:r>
+    </w:p>
+    <w:p>
+      <w:pPr>
         <w:spacing w:line="240" w:lineRule="auto"/>
         <w:contextualSpacing w:val="0"/>
         <w:rPr>
@@ -3939,30 +4034,19 @@
       </w:pPr>
       <w:r>
         <w:rPr>
-          <w:b/>
-          <w:bCs/>
-        </w:rPr>
-        <w:t>Ator:</w:t>
-      </w:r>
-      <w:r>
-        <w:t xml:space="preserve"> Diretor Acadêmico</w:t>
-      </w:r>
-    </w:p>
-    <w:p>
-      <w:r>
-        <w:rPr>
           <w:noProof/>
+          <w:lang w:eastAsia="pt-BR"/>
         </w:rPr>
         <w:drawing>
-          <wp:anchor distT="0" distB="0" distL="114300" distR="114300" simplePos="0" relativeHeight="251660288" behindDoc="1" locked="0" layoutInCell="1" allowOverlap="1" wp14:anchorId="2A5BC031" wp14:editId="08BE3FE0">
+          <wp:anchor distT="0" distB="0" distL="114300" distR="114300" simplePos="0" relativeHeight="251660288" behindDoc="1" locked="0" layoutInCell="1" allowOverlap="1" wp14:anchorId="2A5BC031" wp14:editId="61B0FA78">
             <wp:simplePos x="0" y="0"/>
             <wp:positionH relativeFrom="page">
               <wp:align>center</wp:align>
             </wp:positionH>
             <wp:positionV relativeFrom="paragraph">
-              <wp:posOffset>0</wp:posOffset>
+              <wp:posOffset>314960</wp:posOffset>
             </wp:positionV>
-            <wp:extent cx="2072640" cy="5379720"/>
+            <wp:extent cx="2072640" cy="4409440"/>
             <wp:effectExtent l="0" t="0" r="3810" b="0"/>
             <wp:wrapTopAndBottom/>
             <wp:docPr id="219989828" name="Imagem 1"/>
@@ -3991,7 +4075,7 @@
                   <pic:spPr>
                     <a:xfrm>
                       <a:off x="0" y="0"/>
-                      <a:ext cx="2072640" cy="5379720"/>
+                      <a:ext cx="2072640" cy="4409440"/>
                     </a:xfrm>
                     <a:prstGeom prst="rect">
                       <a:avLst/>
@@ -4000,10 +4084,24 @@
                 </pic:pic>
               </a:graphicData>
             </a:graphic>
+            <wp14:sizeRelV relativeFrom="margin">
+              <wp14:pctHeight>0</wp14:pctHeight>
+            </wp14:sizeRelV>
           </wp:anchor>
         </w:drawing>
       </w:r>
-    </w:p>
+      <w:r>
+        <w:rPr>
+          <w:b/>
+          <w:bCs/>
+        </w:rPr>
+        <w:t>Ator:</w:t>
+      </w:r>
+      <w:r>
+        <w:t xml:space="preserve"> Diretor Acadêmico</w:t>
+      </w:r>
+    </w:p>
+    <w:p/>
     <w:p>
       <w:pPr>
         <w:pStyle w:val="PargrafodaLista"/>
@@ -4139,7 +4237,6 @@
         <w:rPr>
           <w:b/>
         </w:rPr>
-        <w:lastRenderedPageBreak/>
         <w:t xml:space="preserve">Descrição: </w:t>
       </w:r>
       <w:r>
@@ -4188,6 +4285,7 @@
         <w:rPr>
           <w:b/>
         </w:rPr>
+        <w:lastRenderedPageBreak/>
         <w:t>Descrição:</w:t>
       </w:r>
       <w:r>
@@ -4433,19 +4531,20 @@
       <w:r>
         <w:rPr>
           <w:noProof/>
-        </w:rPr>
-        <w:lastRenderedPageBreak/>
+          <w:u w:val="single"/>
+          <w:lang w:eastAsia="pt-BR"/>
+        </w:rPr>
         <w:drawing>
-          <wp:anchor distT="0" distB="0" distL="114300" distR="114300" simplePos="0" relativeHeight="251661312" behindDoc="0" locked="0" layoutInCell="1" allowOverlap="1" wp14:anchorId="7161466E" wp14:editId="2E96E315">
+          <wp:anchor distT="0" distB="0" distL="114300" distR="114300" simplePos="0" relativeHeight="251661312" behindDoc="0" locked="0" layoutInCell="1" allowOverlap="1" wp14:anchorId="7161466E" wp14:editId="6A085C0C">
             <wp:simplePos x="0" y="0"/>
             <wp:positionH relativeFrom="margin">
               <wp:align>center</wp:align>
             </wp:positionH>
             <wp:positionV relativeFrom="paragraph">
-              <wp:posOffset>238125</wp:posOffset>
+              <wp:posOffset>365125</wp:posOffset>
             </wp:positionV>
-            <wp:extent cx="2308860" cy="4724400"/>
-            <wp:effectExtent l="0" t="0" r="0" b="0"/>
+            <wp:extent cx="2308860" cy="4050665"/>
+            <wp:effectExtent l="0" t="0" r="0" b="6985"/>
             <wp:wrapTopAndBottom/>
             <wp:docPr id="639381757" name="Imagem 2"/>
             <wp:cNvGraphicFramePr>
@@ -4473,7 +4572,7 @@
                   <pic:spPr>
                     <a:xfrm>
                       <a:off x="0" y="0"/>
-                      <a:ext cx="2308860" cy="4724400"/>
+                      <a:ext cx="2308860" cy="4050665"/>
                     </a:xfrm>
                     <a:prstGeom prst="rect">
                       <a:avLst/>
@@ -4482,6 +4581,9 @@
                 </pic:pic>
               </a:graphicData>
             </a:graphic>
+            <wp14:sizeRelV relativeFrom="margin">
+              <wp14:pctHeight>0</wp14:pctHeight>
+            </wp14:sizeRelV>
           </wp:anchor>
         </w:drawing>
       </w:r>
@@ -4489,8 +4591,16 @@
         <w:rPr>
           <w:b/>
           <w:bCs/>
-        </w:rPr>
-        <w:t>Ator:</w:t>
+          <w:u w:val="single"/>
+        </w:rPr>
+        <w:t>Ator</w:t>
+      </w:r>
+      <w:r>
+        <w:rPr>
+          <w:b/>
+          <w:bCs/>
+        </w:rPr>
+        <w:t>:</w:t>
       </w:r>
       <w:r>
         <w:t xml:space="preserve"> Coordenador</w:t>
@@ -4599,6 +4709,7 @@
         <w:rPr>
           <w:b/>
         </w:rPr>
+        <w:lastRenderedPageBreak/>
         <w:t>Descrição:</w:t>
       </w:r>
       <w:r>
@@ -4723,122 +4834,30 @@
       <w:r>
         <w:t>O sistema deve permitir solicitar a alocação de laboratórios para as disciplinas.</w:t>
       </w:r>
+      <w:r>
+        <w:br/>
+      </w:r>
     </w:p>
     <w:p>
       <w:pPr>
         <w:pStyle w:val="PargrafodaLista"/>
       </w:pPr>
-    </w:p>
-    <w:p>
-      <w:pPr>
-        <w:pStyle w:val="PargrafodaLista"/>
-      </w:pPr>
-      <w:r>
-        <w:rPr>
-          <w:b/>
-          <w:bCs/>
-        </w:rPr>
-        <w:t>Atores:</w:t>
-      </w:r>
-      <w:r>
-        <w:t xml:space="preserve"> Coordenador e responsável de TI:</w:t>
-      </w:r>
-    </w:p>
-    <w:p>
-      <w:pPr>
-        <w:pStyle w:val="PargrafodaLista"/>
-        <w:numPr>
-          <w:ilvl w:val="0"/>
-          <w:numId w:val="22"/>
-        </w:numPr>
-        <w:rPr>
-          <w:b/>
-          <w:bCs/>
-        </w:rPr>
-      </w:pPr>
-      <w:r>
-        <w:rPr>
-          <w:b/>
-          <w:bCs/>
-        </w:rPr>
-        <w:t>RF13</w:t>
-      </w:r>
-      <w:r>
-        <w:rPr>
-          <w:b/>
-          <w:bCs/>
-        </w:rPr>
-        <w:t xml:space="preserve"> </w:t>
-      </w:r>
-      <w:r>
-        <w:rPr>
-          <w:b/>
-          <w:bCs/>
-        </w:rPr>
-        <w:t>–</w:t>
-      </w:r>
-      <w:r>
-        <w:rPr>
-          <w:b/>
-          <w:bCs/>
-        </w:rPr>
-        <w:t xml:space="preserve"> </w:t>
-      </w:r>
-      <w:r>
-        <w:rPr>
-          <w:b/>
-          <w:bCs/>
-        </w:rPr>
-        <w:t>Filtrar Software por Laboratórios</w:t>
-      </w:r>
-    </w:p>
-    <w:p>
-      <w:pPr>
-        <w:pStyle w:val="PargrafodaLista"/>
-      </w:pPr>
-      <w:r>
-        <w:t>Ator: Coordenador</w:t>
-      </w:r>
-      <w:r>
-        <w:t xml:space="preserve"> e </w:t>
-      </w:r>
-      <w:r>
-        <w:t>Responsável de TI.</w:t>
-      </w:r>
-    </w:p>
-    <w:p>
-      <w:pPr>
-        <w:pStyle w:val="PargrafodaLista"/>
-      </w:pPr>
-      <w:r>
-        <w:t xml:space="preserve">Descrição: </w:t>
-      </w:r>
-      <w:r>
-        <w:t>O sistema deve permitir filtrar os softwares disponíveis por laboratório.</w:t>
-      </w:r>
-      <w:r>
-        <w:br/>
-      </w:r>
-    </w:p>
-    <w:p>
-      <w:pPr>
-        <w:pStyle w:val="PargrafodaLista"/>
-      </w:pPr>
       <w:r>
         <w:rPr>
           <w:noProof/>
+          <w:lang w:eastAsia="pt-BR"/>
         </w:rPr>
         <w:drawing>
-          <wp:anchor distT="0" distB="0" distL="114300" distR="114300" simplePos="0" relativeHeight="251662336" behindDoc="0" locked="0" layoutInCell="1" allowOverlap="1" wp14:anchorId="70C4E604" wp14:editId="7245E8EA">
+          <wp:anchor distT="0" distB="0" distL="114300" distR="114300" simplePos="0" relativeHeight="251662336" behindDoc="0" locked="0" layoutInCell="1" allowOverlap="1" wp14:anchorId="70C4E604" wp14:editId="0FE0ACFB">
             <wp:simplePos x="0" y="0"/>
             <wp:positionH relativeFrom="page">
-              <wp:align>center</wp:align>
+              <wp:posOffset>2479040</wp:posOffset>
             </wp:positionH>
             <wp:positionV relativeFrom="paragraph">
-              <wp:posOffset>285115</wp:posOffset>
+              <wp:posOffset>281940</wp:posOffset>
             </wp:positionV>
-            <wp:extent cx="2705100" cy="3863340"/>
-            <wp:effectExtent l="0" t="0" r="0" b="3810"/>
+            <wp:extent cx="2604135" cy="3863340"/>
+            <wp:effectExtent l="0" t="0" r="5715" b="3810"/>
             <wp:wrapTopAndBottom/>
             <wp:docPr id="834560516" name="Imagem 3"/>
             <wp:cNvGraphicFramePr>
@@ -4866,7 +4885,7 @@
                   <pic:spPr>
                     <a:xfrm>
                       <a:off x="0" y="0"/>
-                      <a:ext cx="2705100" cy="3863340"/>
+                      <a:ext cx="2604135" cy="3863340"/>
                     </a:xfrm>
                     <a:prstGeom prst="rect">
                       <a:avLst/>
@@ -4875,6 +4894,9 @@
                 </pic:pic>
               </a:graphicData>
             </a:graphic>
+            <wp14:sizeRelH relativeFrom="margin">
+              <wp14:pctWidth>0</wp14:pctWidth>
+            </wp14:sizeRelH>
           </wp:anchor>
         </w:drawing>
       </w:r>
@@ -4890,6 +4912,24 @@
       </w:r>
       <w:r>
         <w:br/>
+      </w:r>
+    </w:p>
+    <w:p>
+      <w:pPr>
+        <w:spacing w:line="240" w:lineRule="auto"/>
+        <w:contextualSpacing w:val="0"/>
+        <w:rPr>
+          <w:b/>
+          <w:bCs/>
+          <w:u w:val="single"/>
+        </w:rPr>
+      </w:pPr>
+      <w:r>
+        <w:rPr>
+          <w:b/>
+          <w:bCs/>
+        </w:rPr>
+        <w:br w:type="page"/>
       </w:r>
     </w:p>
     <w:p>
@@ -4909,6 +4949,7 @@
           <w:b/>
           <w:bCs/>
         </w:rPr>
+        <w:lastRenderedPageBreak/>
         <w:t>RF1</w:t>
       </w:r>
       <w:r>
@@ -5101,7 +5142,7 @@
           <w:i w:val="0"/>
         </w:rPr>
       </w:pPr>
-      <w:bookmarkStart w:id="20" w:name="_Toc16793"/>
+      <w:bookmarkStart w:id="21" w:name="_Toc16793"/>
       <w:r>
         <w:rPr>
           <w:i w:val="0"/>
@@ -5117,7 +5158,7 @@
         </w:rPr>
         <w:t>REQUISITOS DE BANCO DE DADOS</w:t>
       </w:r>
-      <w:bookmarkEnd w:id="20"/>
+      <w:bookmarkEnd w:id="21"/>
     </w:p>
     <w:p>
       <w:pPr>
@@ -5128,12 +5169,11 @@
           <w:iCs/>
         </w:rPr>
       </w:pPr>
-      <w:bookmarkStart w:id="21" w:name="_Toc27034"/>
+      <w:bookmarkStart w:id="22" w:name="_Toc27034"/>
       <w:r>
         <w:rPr>
           <w:i w:val="0"/>
         </w:rPr>
-        <w:lastRenderedPageBreak/>
         <w:t>3.4.1</w:t>
       </w:r>
       <w:r>
@@ -5145,7 +5185,7 @@
         </w:rPr>
         <w:t>MODELO FÍSICO E LÓGICO DA BASE DE DADOS</w:t>
       </w:r>
-      <w:bookmarkEnd w:id="21"/>
+      <w:bookmarkEnd w:id="22"/>
     </w:p>
     <w:p>
       <w:pPr>
@@ -5233,7 +5273,7 @@
           <w:i w:val="0"/>
         </w:rPr>
       </w:pPr>
-      <w:bookmarkStart w:id="22" w:name="_Toc16266"/>
+      <w:bookmarkStart w:id="23" w:name="_Toc16266"/>
       <w:r>
         <w:rPr>
           <w:i w:val="0"/>
@@ -5249,7 +5289,7 @@
         </w:rPr>
         <w:t>DICIONÁRIO DE DADOS</w:t>
       </w:r>
-      <w:bookmarkEnd w:id="22"/>
+      <w:bookmarkEnd w:id="23"/>
     </w:p>
     <w:p>
       <w:pPr>
@@ -5315,22 +5355,19 @@
         </w:drawing>
       </w:r>
     </w:p>
-    <w:p/>
-    <w:p/>
-    <w:p/>
-    <w:p/>
-    <w:p>
-      <w:pPr>
-        <w:rPr>
-          <w:b/>
-          <w:bCs/>
-        </w:rPr>
-      </w:pPr>
-      <w:r>
-        <w:rPr>
-          <w:b/>
-          <w:bCs/>
-        </w:rPr>
+    <w:p>
+      <w:pPr>
+        <w:rPr>
+          <w:b/>
+          <w:bCs/>
+        </w:rPr>
+      </w:pPr>
+      <w:r>
+        <w:rPr>
+          <w:b/>
+          <w:bCs/>
+        </w:rPr>
+        <w:lastRenderedPageBreak/>
         <w:t>2. Tabela</w:t>
       </w:r>
       <w:r>
@@ -5402,7 +5439,6 @@
           <w:b/>
           <w:bCs/>
         </w:rPr>
-        <w:lastRenderedPageBreak/>
         <w:t>3. Tipo Usuário</w:t>
       </w:r>
       <w:r>
@@ -5420,9 +5456,9 @@
           <w:lang w:eastAsia="pt-BR"/>
         </w:rPr>
         <w:drawing>
-          <wp:inline distT="0" distB="0" distL="0" distR="0" wp14:anchorId="0C2017A5" wp14:editId="22178AD3">
-            <wp:extent cx="5760720" cy="657860"/>
-            <wp:effectExtent l="0" t="0" r="0" b="8890"/>
+          <wp:inline distT="0" distB="0" distL="0" distR="0" wp14:anchorId="0C2017A5" wp14:editId="4D87ACA4">
+            <wp:extent cx="5783997" cy="953669"/>
+            <wp:effectExtent l="0" t="0" r="0" b="0"/>
             <wp:docPr id="223634582" name="Imagem 1"/>
             <wp:cNvGraphicFramePr>
               <a:graphicFrameLocks xmlns:a="http://schemas.openxmlformats.org/drawingml/2006/main" noChangeAspect="1"/>
@@ -5435,7 +5471,7 @@
                     <pic:cNvPicPr/>
                   </pic:nvPicPr>
                   <pic:blipFill>
-                    <a:blip r:embed="rId22" cstate="print">
+                    <a:blip r:embed="rId22">
                       <a:extLst>
                         <a:ext uri="{28A0092B-C50C-407E-A947-70E740481C1C}">
                           <a14:useLocalDpi xmlns:a14="http://schemas.microsoft.com/office/drawing/2010/main" val="0"/>
@@ -5449,7 +5485,7 @@
                   <pic:spPr>
                     <a:xfrm>
                       <a:off x="0" y="0"/>
-                      <a:ext cx="5760720" cy="657860"/>
+                      <a:ext cx="5833454" cy="961824"/>
                     </a:xfrm>
                     <a:prstGeom prst="rect">
                       <a:avLst/>
@@ -5461,6 +5497,31 @@
           </wp:inline>
         </w:drawing>
       </w:r>
+    </w:p>
+    <w:p>
+      <w:pPr>
+        <w:spacing w:line="240" w:lineRule="auto"/>
+        <w:contextualSpacing w:val="0"/>
+        <w:rPr>
+          <w:b/>
+          <w:bCs/>
+        </w:rPr>
+      </w:pPr>
+      <w:r>
+        <w:rPr>
+          <w:b/>
+          <w:bCs/>
+        </w:rPr>
+        <w:br w:type="page"/>
+      </w:r>
+    </w:p>
+    <w:p>
+      <w:pPr>
+        <w:rPr>
+          <w:b/>
+          <w:bCs/>
+        </w:rPr>
+      </w:pPr>
     </w:p>
     <w:p>
       <w:pPr>
@@ -5862,7 +5923,7 @@
           <w:iCs/>
         </w:rPr>
       </w:pPr>
-      <w:bookmarkStart w:id="23" w:name="_Toc7182"/>
+      <w:bookmarkStart w:id="24" w:name="_Toc7182"/>
       <w:r>
         <w:rPr>
           <w:i w:val="0"/>
@@ -5878,7 +5939,7 @@
         <w:tab/>
         <w:t>SCRIPTS DE CRIAÇÃO DE BANCO DE DADOS E TABELAS</w:t>
       </w:r>
-      <w:bookmarkEnd w:id="23"/>
+      <w:bookmarkEnd w:id="24"/>
     </w:p>
     <w:p>
       <w:pPr>
@@ -5958,75 +6019,75 @@
         <w:rPr>
           <w:lang w:val="en-US"/>
         </w:rPr>
+        <w:t xml:space="preserve">    </w:t>
+      </w:r>
+      <w:proofErr w:type="spellStart"/>
+      <w:proofErr w:type="gramStart"/>
+      <w:r>
+        <w:t>numero</w:t>
+      </w:r>
+      <w:proofErr w:type="gramEnd"/>
+      <w:r>
+        <w:t>_laboratorio</w:t>
+      </w:r>
+      <w:proofErr w:type="spellEnd"/>
+      <w:r>
+        <w:t xml:space="preserve"> INTEGER NOT NULL,</w:t>
+      </w:r>
+    </w:p>
+    <w:p>
+      <w:r>
+        <w:t xml:space="preserve">    </w:t>
+      </w:r>
+      <w:proofErr w:type="spellStart"/>
+      <w:r>
+        <w:t>qtde_computador</w:t>
+      </w:r>
+      <w:proofErr w:type="spellEnd"/>
+      <w:r>
+        <w:t xml:space="preserve"> INTEGER NOT NULL CHECK (</w:t>
+      </w:r>
+      <w:proofErr w:type="spellStart"/>
+      <w:r>
+        <w:t>qtde_computador</w:t>
+      </w:r>
+      <w:proofErr w:type="spellEnd"/>
+      <w:r>
+        <w:t xml:space="preserve"> &gt; 0),</w:t>
+      </w:r>
+    </w:p>
+    <w:p>
+      <w:r>
+        <w:t xml:space="preserve">    </w:t>
+      </w:r>
+      <w:proofErr w:type="spellStart"/>
+      <w:r>
+        <w:t>capacidade_max_aluno</w:t>
+      </w:r>
+      <w:proofErr w:type="spellEnd"/>
+      <w:r>
+        <w:t xml:space="preserve"> INTEGER NOT NULL CHECK (</w:t>
+      </w:r>
+      <w:proofErr w:type="spellStart"/>
+      <w:r>
+        <w:t>capacidade_max_aluno</w:t>
+      </w:r>
+      <w:proofErr w:type="spellEnd"/>
+      <w:r>
+        <w:t xml:space="preserve"> &gt; 0),</w:t>
+      </w:r>
+    </w:p>
+    <w:p>
+      <w:pPr>
+        <w:rPr>
+          <w:lang w:val="en-US"/>
+        </w:rPr>
+      </w:pPr>
+      <w:r>
         <w:lastRenderedPageBreak/>
         <w:t xml:space="preserve">    </w:t>
       </w:r>
       <w:proofErr w:type="spellStart"/>
-      <w:proofErr w:type="gramStart"/>
-      <w:r>
-        <w:t>numero</w:t>
-      </w:r>
-      <w:proofErr w:type="gramEnd"/>
-      <w:r>
-        <w:t>_laboratorio</w:t>
-      </w:r>
-      <w:proofErr w:type="spellEnd"/>
-      <w:r>
-        <w:t xml:space="preserve"> INTEGER NOT NULL,</w:t>
-      </w:r>
-    </w:p>
-    <w:p>
-      <w:r>
-        <w:t xml:space="preserve">    </w:t>
-      </w:r>
-      <w:proofErr w:type="spellStart"/>
-      <w:r>
-        <w:t>qtde_computador</w:t>
-      </w:r>
-      <w:proofErr w:type="spellEnd"/>
-      <w:r>
-        <w:t xml:space="preserve"> INTEGER NOT NULL CHECK (</w:t>
-      </w:r>
-      <w:proofErr w:type="spellStart"/>
-      <w:r>
-        <w:t>qtde_computador</w:t>
-      </w:r>
-      <w:proofErr w:type="spellEnd"/>
-      <w:r>
-        <w:t xml:space="preserve"> &gt; 0),</w:t>
-      </w:r>
-    </w:p>
-    <w:p>
-      <w:r>
-        <w:t xml:space="preserve">    </w:t>
-      </w:r>
-      <w:proofErr w:type="spellStart"/>
-      <w:r>
-        <w:t>capacidade_max_aluno</w:t>
-      </w:r>
-      <w:proofErr w:type="spellEnd"/>
-      <w:r>
-        <w:t xml:space="preserve"> INTEGER NOT NULL CHECK (</w:t>
-      </w:r>
-      <w:proofErr w:type="spellStart"/>
-      <w:r>
-        <w:t>capacidade_max_aluno</w:t>
-      </w:r>
-      <w:proofErr w:type="spellEnd"/>
-      <w:r>
-        <w:t xml:space="preserve"> &gt; 0),</w:t>
-      </w:r>
-    </w:p>
-    <w:p>
-      <w:pPr>
-        <w:rPr>
-          <w:lang w:val="en-US"/>
-        </w:rPr>
-      </w:pPr>
-      <w:r>
-        <w:t xml:space="preserve">    </w:t>
-      </w:r>
-      <w:proofErr w:type="spellStart"/>
       <w:r>
         <w:rPr>
           <w:lang w:val="en-US"/>
@@ -6603,27 +6664,27 @@
           <w:bCs/>
           <w:lang w:val="en-US"/>
         </w:rPr>
+        <w:t>SOFTWARE:</w:t>
+      </w:r>
+    </w:p>
+    <w:p>
+      <w:pPr>
+        <w:rPr>
+          <w:lang w:val="en-US"/>
+        </w:rPr>
+      </w:pPr>
+    </w:p>
+    <w:p>
+      <w:pPr>
+        <w:rPr>
+          <w:lang w:val="en-US"/>
+        </w:rPr>
+      </w:pPr>
+      <w:r>
+        <w:rPr>
+          <w:lang w:val="en-US"/>
+        </w:rPr>
         <w:lastRenderedPageBreak/>
-        <w:t>SOFTWARE:</w:t>
-      </w:r>
-    </w:p>
-    <w:p>
-      <w:pPr>
-        <w:rPr>
-          <w:lang w:val="en-US"/>
-        </w:rPr>
-      </w:pPr>
-    </w:p>
-    <w:p>
-      <w:pPr>
-        <w:rPr>
-          <w:lang w:val="en-US"/>
-        </w:rPr>
-      </w:pPr>
-      <w:r>
-        <w:rPr>
-          <w:lang w:val="en-US"/>
-        </w:rPr>
         <w:t>CREATE TABLE software (</w:t>
       </w:r>
       <w:r>
@@ -6809,21 +6870,7 @@
         <w:rPr>
           <w:lang w:val="en-US"/>
         </w:rPr>
-        <w:t xml:space="preserve"> </w:t>
-      </w:r>
-      <w:proofErr w:type="gramStart"/>
-      <w:r>
-        <w:rPr>
-          <w:lang w:val="en-US"/>
-        </w:rPr>
-        <w:t>VARCHAR(</w:t>
-      </w:r>
-      <w:proofErr w:type="gramEnd"/>
-      <w:r>
-        <w:rPr>
-          <w:lang w:val="en-US"/>
-        </w:rPr>
-        <w:t>50) NOT NULL,</w:t>
+        <w:t xml:space="preserve"> VARCHAR(50) NOT NULL,</w:t>
       </w:r>
       <w:r>
         <w:rPr>
@@ -7243,11 +7290,321 @@
         <w:rPr>
           <w:lang w:val="en-US"/>
         </w:rPr>
+        <w:t xml:space="preserve">    </w:t>
+      </w:r>
+      <w:proofErr w:type="spellStart"/>
+      <w:r>
+        <w:rPr>
+          <w:lang w:val="en-US"/>
+        </w:rPr>
+        <w:t>id_usuario</w:t>
+      </w:r>
+      <w:proofErr w:type="spellEnd"/>
+      <w:r>
+        <w:rPr>
+          <w:lang w:val="en-US"/>
+        </w:rPr>
+        <w:t xml:space="preserve"> INTEGER NOT NULL,</w:t>
+      </w:r>
+    </w:p>
+    <w:p>
+      <w:pPr>
+        <w:rPr>
+          <w:lang w:val="en-US"/>
+        </w:rPr>
+      </w:pPr>
+    </w:p>
+    <w:p>
+      <w:pPr>
+        <w:rPr>
+          <w:lang w:val="en-US"/>
+        </w:rPr>
+      </w:pPr>
+      <w:r>
+        <w:rPr>
+          <w:lang w:val="en-US"/>
+        </w:rPr>
         <w:lastRenderedPageBreak/>
+        <w:t xml:space="preserve">    CONSTRAINT </w:t>
+      </w:r>
+      <w:proofErr w:type="spellStart"/>
+      <w:r>
+        <w:rPr>
+          <w:lang w:val="en-US"/>
+        </w:rPr>
+        <w:t>chk_status_aprovacao</w:t>
+      </w:r>
+      <w:proofErr w:type="spellEnd"/>
+    </w:p>
+    <w:p>
+      <w:pPr>
+        <w:rPr>
+          <w:lang w:val="en-US"/>
+        </w:rPr>
+      </w:pPr>
+      <w:r>
+        <w:rPr>
+          <w:lang w:val="en-US"/>
+        </w:rPr>
+        <w:t xml:space="preserve">        CHECK (</w:t>
+      </w:r>
+      <w:proofErr w:type="spellStart"/>
+      <w:r>
+        <w:rPr>
+          <w:lang w:val="en-US"/>
+        </w:rPr>
+        <w:t>status_aprovacao</w:t>
+      </w:r>
+      <w:proofErr w:type="spellEnd"/>
+      <w:r>
+        <w:rPr>
+          <w:lang w:val="en-US"/>
+        </w:rPr>
+        <w:t xml:space="preserve"> IN ('A', 'R', 'P')),</w:t>
+      </w:r>
+    </w:p>
+    <w:p>
+      <w:pPr>
+        <w:rPr>
+          <w:lang w:val="en-US"/>
+        </w:rPr>
+      </w:pPr>
+    </w:p>
+    <w:p>
+      <w:r>
+        <w:rPr>
+          <w:lang w:val="en-US"/>
+        </w:rPr>
         <w:t xml:space="preserve">    </w:t>
       </w:r>
+      <w:r>
+        <w:t xml:space="preserve">CONSTRAINT </w:t>
+      </w:r>
       <w:proofErr w:type="spellStart"/>
       <w:r>
+        <w:t>fk_alocacao_disciplina</w:t>
+      </w:r>
+      <w:proofErr w:type="spellEnd"/>
+    </w:p>
+    <w:p>
+      <w:r>
+        <w:t xml:space="preserve">        FOREIGN KEY (</w:t>
+      </w:r>
+      <w:proofErr w:type="spellStart"/>
+      <w:r>
+        <w:t>id_disciplina</w:t>
+      </w:r>
+      <w:proofErr w:type="spellEnd"/>
+      <w:r>
+        <w:t>)</w:t>
+      </w:r>
+    </w:p>
+    <w:p>
+      <w:r>
+        <w:t xml:space="preserve">        REFERENCES disciplina(</w:t>
+      </w:r>
+      <w:proofErr w:type="spellStart"/>
+      <w:r>
+        <w:t>id_disciplina</w:t>
+      </w:r>
+      <w:proofErr w:type="spellEnd"/>
+      <w:r>
+        <w:t>)</w:t>
+      </w:r>
+    </w:p>
+    <w:p>
+      <w:pPr>
+        <w:rPr>
+          <w:lang w:val="en-US"/>
+        </w:rPr>
+      </w:pPr>
+      <w:r>
+        <w:t xml:space="preserve">        </w:t>
+      </w:r>
+      <w:r>
+        <w:rPr>
+          <w:lang w:val="en-US"/>
+        </w:rPr>
+        <w:t>ON UPDATE CASCADE</w:t>
+      </w:r>
+    </w:p>
+    <w:p>
+      <w:pPr>
+        <w:rPr>
+          <w:lang w:val="en-US"/>
+        </w:rPr>
+      </w:pPr>
+      <w:r>
+        <w:rPr>
+          <w:lang w:val="en-US"/>
+        </w:rPr>
+        <w:t xml:space="preserve">        ON DELETE RESTRICT,</w:t>
+      </w:r>
+    </w:p>
+    <w:p>
+      <w:pPr>
+        <w:rPr>
+          <w:lang w:val="en-US"/>
+        </w:rPr>
+      </w:pPr>
+    </w:p>
+    <w:p>
+      <w:pPr>
+        <w:rPr>
+          <w:lang w:val="en-US"/>
+        </w:rPr>
+      </w:pPr>
+      <w:r>
+        <w:rPr>
+          <w:lang w:val="en-US"/>
+        </w:rPr>
+        <w:t xml:space="preserve">    CONSTRAINT </w:t>
+      </w:r>
+      <w:proofErr w:type="spellStart"/>
+      <w:r>
+        <w:rPr>
+          <w:lang w:val="en-US"/>
+        </w:rPr>
+        <w:t>fk_alocacao_laboratorio</w:t>
+      </w:r>
+      <w:proofErr w:type="spellEnd"/>
+    </w:p>
+    <w:p>
+      <w:pPr>
+        <w:rPr>
+          <w:lang w:val="en-US"/>
+        </w:rPr>
+      </w:pPr>
+      <w:r>
+        <w:rPr>
+          <w:lang w:val="en-US"/>
+        </w:rPr>
+        <w:t xml:space="preserve">        FOREIGN KEY (</w:t>
+      </w:r>
+      <w:proofErr w:type="spellStart"/>
+      <w:r>
+        <w:rPr>
+          <w:lang w:val="en-US"/>
+        </w:rPr>
+        <w:t>id_laboratorio</w:t>
+      </w:r>
+      <w:proofErr w:type="spellEnd"/>
+      <w:r>
+        <w:rPr>
+          <w:lang w:val="en-US"/>
+        </w:rPr>
+        <w:t>)</w:t>
+      </w:r>
+    </w:p>
+    <w:p>
+      <w:pPr>
+        <w:rPr>
+          <w:lang w:val="en-US"/>
+        </w:rPr>
+      </w:pPr>
+      <w:r>
+        <w:rPr>
+          <w:lang w:val="en-US"/>
+        </w:rPr>
+        <w:t xml:space="preserve">        REFERENCES </w:t>
+      </w:r>
+      <w:proofErr w:type="spellStart"/>
+      <w:r>
+        <w:rPr>
+          <w:lang w:val="en-US"/>
+        </w:rPr>
+        <w:t>laboratorio</w:t>
+      </w:r>
+      <w:proofErr w:type="spellEnd"/>
+      <w:r>
+        <w:rPr>
+          <w:lang w:val="en-US"/>
+        </w:rPr>
+        <w:t>(</w:t>
+      </w:r>
+      <w:proofErr w:type="spellStart"/>
+      <w:r>
+        <w:rPr>
+          <w:lang w:val="en-US"/>
+        </w:rPr>
+        <w:t>id_laboratorio</w:t>
+      </w:r>
+      <w:proofErr w:type="spellEnd"/>
+      <w:r>
+        <w:rPr>
+          <w:lang w:val="en-US"/>
+        </w:rPr>
+        <w:t>)</w:t>
+      </w:r>
+    </w:p>
+    <w:p>
+      <w:pPr>
+        <w:rPr>
+          <w:lang w:val="en-US"/>
+        </w:rPr>
+      </w:pPr>
+      <w:r>
+        <w:rPr>
+          <w:lang w:val="en-US"/>
+        </w:rPr>
+        <w:t xml:space="preserve">        ON UPDATE CASCADE</w:t>
+      </w:r>
+    </w:p>
+    <w:p>
+      <w:pPr>
+        <w:rPr>
+          <w:lang w:val="en-US"/>
+        </w:rPr>
+      </w:pPr>
+      <w:r>
+        <w:rPr>
+          <w:lang w:val="en-US"/>
+        </w:rPr>
+        <w:t xml:space="preserve">        ON DELETE RESTRICT,</w:t>
+      </w:r>
+    </w:p>
+    <w:p>
+      <w:pPr>
+        <w:rPr>
+          <w:lang w:val="en-US"/>
+        </w:rPr>
+      </w:pPr>
+    </w:p>
+    <w:p>
+      <w:pPr>
+        <w:rPr>
+          <w:lang w:val="en-US"/>
+        </w:rPr>
+      </w:pPr>
+      <w:r>
+        <w:rPr>
+          <w:lang w:val="en-US"/>
+        </w:rPr>
+        <w:t xml:space="preserve">    CONSTRAINT </w:t>
+      </w:r>
+      <w:proofErr w:type="spellStart"/>
+      <w:r>
+        <w:rPr>
+          <w:lang w:val="en-US"/>
+        </w:rPr>
+        <w:t>fk_alocacao_usuario</w:t>
+      </w:r>
+      <w:proofErr w:type="spellEnd"/>
+    </w:p>
+    <w:p>
+      <w:pPr>
+        <w:rPr>
+          <w:lang w:val="en-US"/>
+        </w:rPr>
+      </w:pPr>
+      <w:r>
+        <w:rPr>
+          <w:lang w:val="en-US"/>
+        </w:rPr>
+        <w:t xml:space="preserve">        FOREIGN KEY (</w:t>
+      </w:r>
+      <w:proofErr w:type="spellStart"/>
+      <w:r>
         <w:rPr>
           <w:lang w:val="en-US"/>
         </w:rPr>
@@ -7258,6 +7615,197 @@
         <w:rPr>
           <w:lang w:val="en-US"/>
         </w:rPr>
+        <w:t>)</w:t>
+      </w:r>
+    </w:p>
+    <w:p>
+      <w:pPr>
+        <w:rPr>
+          <w:lang w:val="en-US"/>
+        </w:rPr>
+      </w:pPr>
+      <w:r>
+        <w:rPr>
+          <w:lang w:val="en-US"/>
+        </w:rPr>
+        <w:t xml:space="preserve">        REFERENCES </w:t>
+      </w:r>
+      <w:proofErr w:type="spellStart"/>
+      <w:r>
+        <w:rPr>
+          <w:lang w:val="en-US"/>
+        </w:rPr>
+        <w:t>usuario</w:t>
+      </w:r>
+      <w:proofErr w:type="spellEnd"/>
+      <w:r>
+        <w:rPr>
+          <w:lang w:val="en-US"/>
+        </w:rPr>
+        <w:t>(</w:t>
+      </w:r>
+      <w:proofErr w:type="spellStart"/>
+      <w:r>
+        <w:rPr>
+          <w:lang w:val="en-US"/>
+        </w:rPr>
+        <w:t>id_usuario</w:t>
+      </w:r>
+      <w:proofErr w:type="spellEnd"/>
+      <w:r>
+        <w:rPr>
+          <w:lang w:val="en-US"/>
+        </w:rPr>
+        <w:t>)</w:t>
+      </w:r>
+    </w:p>
+    <w:p>
+      <w:pPr>
+        <w:rPr>
+          <w:lang w:val="en-US"/>
+        </w:rPr>
+      </w:pPr>
+      <w:r>
+        <w:rPr>
+          <w:lang w:val="en-US"/>
+        </w:rPr>
+        <w:t xml:space="preserve">        ON UPDATE CASCADE</w:t>
+      </w:r>
+    </w:p>
+    <w:p>
+      <w:pPr>
+        <w:rPr>
+          <w:lang w:val="en-US"/>
+        </w:rPr>
+      </w:pPr>
+      <w:r>
+        <w:rPr>
+          <w:lang w:val="en-US"/>
+        </w:rPr>
+        <w:t xml:space="preserve">        ON DELETE RESTRICT</w:t>
+      </w:r>
+    </w:p>
+    <w:p>
+      <w:pPr>
+        <w:rPr>
+          <w:lang w:val="en-US"/>
+        </w:rPr>
+      </w:pPr>
+      <w:r>
+        <w:rPr>
+          <w:lang w:val="en-US"/>
+        </w:rPr>
+        <w:t>);</w:t>
+      </w:r>
+    </w:p>
+    <w:p>
+      <w:pPr>
+        <w:rPr>
+          <w:lang w:val="en-US"/>
+        </w:rPr>
+      </w:pPr>
+    </w:p>
+    <w:p>
+      <w:pPr>
+        <w:rPr>
+          <w:b/>
+          <w:bCs/>
+          <w:lang w:val="en-US"/>
+        </w:rPr>
+      </w:pPr>
+      <w:r>
+        <w:rPr>
+          <w:b/>
+          <w:bCs/>
+          <w:lang w:val="en-US"/>
+        </w:rPr>
+        <w:t>LABORATÓRIO-SOFTWARE (</w:t>
+      </w:r>
+      <w:proofErr w:type="gramStart"/>
+      <w:r>
+        <w:rPr>
+          <w:b/>
+          <w:bCs/>
+          <w:lang w:val="en-US"/>
+        </w:rPr>
+        <w:t>N:N</w:t>
+      </w:r>
+      <w:proofErr w:type="gramEnd"/>
+      <w:r>
+        <w:rPr>
+          <w:b/>
+          <w:bCs/>
+          <w:lang w:val="en-US"/>
+        </w:rPr>
+        <w:t>)</w:t>
+      </w:r>
+      <w:r>
+        <w:rPr>
+          <w:b/>
+          <w:bCs/>
+          <w:lang w:val="en-US"/>
+        </w:rPr>
+        <w:t>:</w:t>
+      </w:r>
+    </w:p>
+    <w:p>
+      <w:pPr>
+        <w:rPr>
+          <w:lang w:val="en-US"/>
+        </w:rPr>
+      </w:pPr>
+    </w:p>
+    <w:p>
+      <w:pPr>
+        <w:rPr>
+          <w:lang w:val="en-US"/>
+        </w:rPr>
+      </w:pPr>
+      <w:r>
+        <w:rPr>
+          <w:lang w:val="en-US"/>
+        </w:rPr>
+        <w:t xml:space="preserve">CREATE TABLE </w:t>
+      </w:r>
+      <w:proofErr w:type="spellStart"/>
+      <w:r>
+        <w:rPr>
+          <w:lang w:val="en-US"/>
+        </w:rPr>
+        <w:t>laboratorio_software</w:t>
+      </w:r>
+      <w:proofErr w:type="spellEnd"/>
+      <w:r>
+        <w:rPr>
+          <w:lang w:val="en-US"/>
+        </w:rPr>
+        <w:t xml:space="preserve"> (</w:t>
+      </w:r>
+    </w:p>
+    <w:p>
+      <w:pPr>
+        <w:rPr>
+          <w:lang w:val="en-US"/>
+        </w:rPr>
+      </w:pPr>
+      <w:r>
+        <w:rPr>
+          <w:lang w:val="en-US"/>
+        </w:rPr>
+        <w:t xml:space="preserve">    </w:t>
+      </w:r>
+      <w:proofErr w:type="spellStart"/>
+      <w:r>
+        <w:rPr>
+          <w:lang w:val="en-US"/>
+        </w:rPr>
+        <w:t>id_software</w:t>
+      </w:r>
+      <w:proofErr w:type="spellEnd"/>
+      <w:r>
+        <w:rPr>
+          <w:lang w:val="en-US"/>
+        </w:rPr>
         <w:t xml:space="preserve"> INTEGER NOT NULL,</w:t>
       </w:r>
     </w:p>
@@ -7267,6 +7815,81 @@
           <w:lang w:val="en-US"/>
         </w:rPr>
       </w:pPr>
+      <w:r>
+        <w:rPr>
+          <w:lang w:val="en-US"/>
+        </w:rPr>
+        <w:t xml:space="preserve">    </w:t>
+      </w:r>
+      <w:proofErr w:type="spellStart"/>
+      <w:r>
+        <w:rPr>
+          <w:lang w:val="en-US"/>
+        </w:rPr>
+        <w:t>id_laboratorio</w:t>
+      </w:r>
+      <w:proofErr w:type="spellEnd"/>
+      <w:r>
+        <w:rPr>
+          <w:lang w:val="en-US"/>
+        </w:rPr>
+        <w:t xml:space="preserve"> INTEGER NOT NULL,</w:t>
+      </w:r>
+    </w:p>
+    <w:p>
+      <w:pPr>
+        <w:rPr>
+          <w:lang w:val="en-US"/>
+        </w:rPr>
+      </w:pPr>
+    </w:p>
+    <w:p>
+      <w:pPr>
+        <w:rPr>
+          <w:lang w:val="en-US"/>
+        </w:rPr>
+      </w:pPr>
+      <w:r>
+        <w:rPr>
+          <w:lang w:val="en-US"/>
+        </w:rPr>
+        <w:t xml:space="preserve">    PRIMARY KEY (</w:t>
+      </w:r>
+      <w:proofErr w:type="spellStart"/>
+      <w:r>
+        <w:rPr>
+          <w:lang w:val="en-US"/>
+        </w:rPr>
+        <w:t>id_software</w:t>
+      </w:r>
+      <w:proofErr w:type="spellEnd"/>
+      <w:r>
+        <w:rPr>
+          <w:lang w:val="en-US"/>
+        </w:rPr>
+        <w:t xml:space="preserve">, </w:t>
+      </w:r>
+      <w:proofErr w:type="spellStart"/>
+      <w:r>
+        <w:rPr>
+          <w:lang w:val="en-US"/>
+        </w:rPr>
+        <w:t>id_laboratorio</w:t>
+      </w:r>
+      <w:proofErr w:type="spellEnd"/>
+      <w:r>
+        <w:rPr>
+          <w:lang w:val="en-US"/>
+        </w:rPr>
+        <w:t>),</w:t>
+      </w:r>
+    </w:p>
+    <w:p>
+      <w:pPr>
+        <w:rPr>
+          <w:lang w:val="en-US"/>
+        </w:rPr>
+      </w:pPr>
     </w:p>
     <w:p>
       <w:pPr>
@@ -7285,7 +7908,7 @@
         <w:rPr>
           <w:lang w:val="en-US"/>
         </w:rPr>
-        <w:t>chk_status_aprovacao</w:t>
+        <w:t>fk_labsoft_software</w:t>
       </w:r>
       <w:proofErr w:type="spellEnd"/>
     </w:p>
@@ -7299,198 +7922,51 @@
         <w:rPr>
           <w:lang w:val="en-US"/>
         </w:rPr>
-        <w:t xml:space="preserve">        CHECK (</w:t>
+        <w:t xml:space="preserve">        FOREIGN KEY (</w:t>
       </w:r>
       <w:proofErr w:type="spellStart"/>
       <w:r>
         <w:rPr>
           <w:lang w:val="en-US"/>
         </w:rPr>
-        <w:t>status_aprovacao</w:t>
+        <w:t>id_software</w:t>
       </w:r>
       <w:proofErr w:type="spellEnd"/>
       <w:r>
         <w:rPr>
           <w:lang w:val="en-US"/>
         </w:rPr>
-        <w:t xml:space="preserve"> IN ('A', 'R', 'P')),</w:t>
-      </w:r>
-    </w:p>
-    <w:p>
-      <w:pPr>
-        <w:rPr>
-          <w:lang w:val="en-US"/>
-        </w:rPr>
-      </w:pPr>
-    </w:p>
-    <w:p>
-      <w:r>
-        <w:rPr>
-          <w:lang w:val="en-US"/>
-        </w:rPr>
-        <w:t xml:space="preserve">    </w:t>
-      </w:r>
-      <w:r>
-        <w:t xml:space="preserve">CONSTRAINT </w:t>
+        <w:t>)</w:t>
+      </w:r>
+    </w:p>
+    <w:p>
+      <w:pPr>
+        <w:rPr>
+          <w:lang w:val="en-US"/>
+        </w:rPr>
+      </w:pPr>
+      <w:r>
+        <w:rPr>
+          <w:lang w:val="en-US"/>
+        </w:rPr>
+        <w:t xml:space="preserve">        REFERENCES software(</w:t>
       </w:r>
       <w:proofErr w:type="spellStart"/>
       <w:r>
-        <w:t>fk_alocacao_disciplina</w:t>
+        <w:rPr>
+          <w:lang w:val="en-US"/>
+        </w:rPr>
+        <w:t>id_software</w:t>
       </w:r>
       <w:proofErr w:type="spellEnd"/>
-    </w:p>
-    <w:p>
-      <w:r>
-        <w:t xml:space="preserve">        FOREIGN KEY (</w:t>
-      </w:r>
-      <w:proofErr w:type="spellStart"/>
-      <w:r>
-        <w:t>id_disciplina</w:t>
-      </w:r>
-      <w:proofErr w:type="spellEnd"/>
-      <w:r>
+      <w:r>
+        <w:rPr>
+          <w:lang w:val="en-US"/>
+        </w:rPr>
         <w:t>)</w:t>
       </w:r>
     </w:p>
     <w:p>
-      <w:r>
-        <w:t xml:space="preserve">        REFERENCES disciplina(</w:t>
-      </w:r>
-      <w:proofErr w:type="spellStart"/>
-      <w:r>
-        <w:t>id_disciplina</w:t>
-      </w:r>
-      <w:proofErr w:type="spellEnd"/>
-      <w:r>
-        <w:t>)</w:t>
-      </w:r>
-    </w:p>
-    <w:p>
-      <w:pPr>
-        <w:rPr>
-          <w:lang w:val="en-US"/>
-        </w:rPr>
-      </w:pPr>
-      <w:r>
-        <w:t xml:space="preserve">        </w:t>
-      </w:r>
-      <w:r>
-        <w:rPr>
-          <w:lang w:val="en-US"/>
-        </w:rPr>
-        <w:t>ON UPDATE CASCADE</w:t>
-      </w:r>
-    </w:p>
-    <w:p>
-      <w:pPr>
-        <w:rPr>
-          <w:lang w:val="en-US"/>
-        </w:rPr>
-      </w:pPr>
-      <w:r>
-        <w:rPr>
-          <w:lang w:val="en-US"/>
-        </w:rPr>
-        <w:t xml:space="preserve">        ON DELETE RESTRICT,</w:t>
-      </w:r>
-    </w:p>
-    <w:p>
-      <w:pPr>
-        <w:rPr>
-          <w:lang w:val="en-US"/>
-        </w:rPr>
-      </w:pPr>
-    </w:p>
-    <w:p>
-      <w:pPr>
-        <w:rPr>
-          <w:lang w:val="en-US"/>
-        </w:rPr>
-      </w:pPr>
-      <w:r>
-        <w:rPr>
-          <w:lang w:val="en-US"/>
-        </w:rPr>
-        <w:t xml:space="preserve">    CONSTRAINT </w:t>
-      </w:r>
-      <w:proofErr w:type="spellStart"/>
-      <w:r>
-        <w:rPr>
-          <w:lang w:val="en-US"/>
-        </w:rPr>
-        <w:t>fk_alocacao_laboratorio</w:t>
-      </w:r>
-      <w:proofErr w:type="spellEnd"/>
-    </w:p>
-    <w:p>
-      <w:pPr>
-        <w:rPr>
-          <w:lang w:val="en-US"/>
-        </w:rPr>
-      </w:pPr>
-      <w:r>
-        <w:rPr>
-          <w:lang w:val="en-US"/>
-        </w:rPr>
-        <w:t xml:space="preserve">        FOREIGN KEY (</w:t>
-      </w:r>
-      <w:proofErr w:type="spellStart"/>
-      <w:r>
-        <w:rPr>
-          <w:lang w:val="en-US"/>
-        </w:rPr>
-        <w:t>id_laboratorio</w:t>
-      </w:r>
-      <w:proofErr w:type="spellEnd"/>
-      <w:r>
-        <w:rPr>
-          <w:lang w:val="en-US"/>
-        </w:rPr>
-        <w:t>)</w:t>
-      </w:r>
-    </w:p>
-    <w:p>
-      <w:pPr>
-        <w:rPr>
-          <w:lang w:val="en-US"/>
-        </w:rPr>
-      </w:pPr>
-      <w:r>
-        <w:rPr>
-          <w:lang w:val="en-US"/>
-        </w:rPr>
-        <w:t xml:space="preserve">        REFERENCES </w:t>
-      </w:r>
-      <w:proofErr w:type="spellStart"/>
-      <w:r>
-        <w:rPr>
-          <w:lang w:val="en-US"/>
-        </w:rPr>
-        <w:t>laboratorio</w:t>
-      </w:r>
-      <w:proofErr w:type="spellEnd"/>
-      <w:r>
-        <w:rPr>
-          <w:lang w:val="en-US"/>
-        </w:rPr>
-        <w:t>(</w:t>
-      </w:r>
-      <w:proofErr w:type="spellStart"/>
-      <w:r>
-        <w:rPr>
-          <w:lang w:val="en-US"/>
-        </w:rPr>
-        <w:t>id_laboratorio</w:t>
-      </w:r>
-      <w:proofErr w:type="spellEnd"/>
-      <w:r>
-        <w:rPr>
-          <w:lang w:val="en-US"/>
-        </w:rPr>
-        <w:t>)</w:t>
-      </w:r>
-    </w:p>
-    <w:p>
       <w:pPr>
         <w:rPr>
           <w:lang w:val="en-US"/>
@@ -7513,436 +7989,7 @@
         <w:rPr>
           <w:lang w:val="en-US"/>
         </w:rPr>
-        <w:t xml:space="preserve">        ON DELETE RESTRICT,</w:t>
-      </w:r>
-    </w:p>
-    <w:p>
-      <w:pPr>
-        <w:rPr>
-          <w:lang w:val="en-US"/>
-        </w:rPr>
-      </w:pPr>
-    </w:p>
-    <w:p>
-      <w:pPr>
-        <w:rPr>
-          <w:lang w:val="en-US"/>
-        </w:rPr>
-      </w:pPr>
-      <w:r>
-        <w:rPr>
-          <w:lang w:val="en-US"/>
-        </w:rPr>
-        <w:t xml:space="preserve">    CONSTRAINT </w:t>
-      </w:r>
-      <w:proofErr w:type="spellStart"/>
-      <w:r>
-        <w:rPr>
-          <w:lang w:val="en-US"/>
-        </w:rPr>
-        <w:t>fk_alocacao_usuario</w:t>
-      </w:r>
-      <w:proofErr w:type="spellEnd"/>
-    </w:p>
-    <w:p>
-      <w:pPr>
-        <w:rPr>
-          <w:lang w:val="en-US"/>
-        </w:rPr>
-      </w:pPr>
-      <w:r>
-        <w:rPr>
-          <w:lang w:val="en-US"/>
-        </w:rPr>
-        <w:t xml:space="preserve">        FOREIGN KEY (</w:t>
-      </w:r>
-      <w:proofErr w:type="spellStart"/>
-      <w:r>
-        <w:rPr>
-          <w:lang w:val="en-US"/>
-        </w:rPr>
-        <w:t>id_usuario</w:t>
-      </w:r>
-      <w:proofErr w:type="spellEnd"/>
-      <w:r>
-        <w:rPr>
-          <w:lang w:val="en-US"/>
-        </w:rPr>
-        <w:t>)</w:t>
-      </w:r>
-    </w:p>
-    <w:p>
-      <w:pPr>
-        <w:rPr>
-          <w:lang w:val="en-US"/>
-        </w:rPr>
-      </w:pPr>
-      <w:r>
-        <w:rPr>
-          <w:lang w:val="en-US"/>
-        </w:rPr>
-        <w:t xml:space="preserve">        REFERENCES </w:t>
-      </w:r>
-      <w:proofErr w:type="spellStart"/>
-      <w:r>
-        <w:rPr>
-          <w:lang w:val="en-US"/>
-        </w:rPr>
-        <w:t>usuario</w:t>
-      </w:r>
-      <w:proofErr w:type="spellEnd"/>
-      <w:r>
-        <w:rPr>
-          <w:lang w:val="en-US"/>
-        </w:rPr>
-        <w:t>(</w:t>
-      </w:r>
-      <w:proofErr w:type="spellStart"/>
-      <w:r>
-        <w:rPr>
-          <w:lang w:val="en-US"/>
-        </w:rPr>
-        <w:t>id_usuario</w:t>
-      </w:r>
-      <w:proofErr w:type="spellEnd"/>
-      <w:r>
-        <w:rPr>
-          <w:lang w:val="en-US"/>
-        </w:rPr>
-        <w:t>)</w:t>
-      </w:r>
-    </w:p>
-    <w:p>
-      <w:pPr>
-        <w:rPr>
-          <w:lang w:val="en-US"/>
-        </w:rPr>
-      </w:pPr>
-      <w:r>
-        <w:rPr>
-          <w:lang w:val="en-US"/>
-        </w:rPr>
-        <w:t xml:space="preserve">        ON UPDATE CASCADE</w:t>
-      </w:r>
-    </w:p>
-    <w:p>
-      <w:pPr>
-        <w:rPr>
-          <w:lang w:val="en-US"/>
-        </w:rPr>
-      </w:pPr>
-      <w:r>
-        <w:rPr>
-          <w:lang w:val="en-US"/>
-        </w:rPr>
-        <w:t xml:space="preserve">        ON DELETE RESTRICT</w:t>
-      </w:r>
-    </w:p>
-    <w:p>
-      <w:pPr>
-        <w:rPr>
-          <w:lang w:val="en-US"/>
-        </w:rPr>
-      </w:pPr>
-      <w:r>
-        <w:rPr>
-          <w:lang w:val="en-US"/>
-        </w:rPr>
-        <w:t>);</w:t>
-      </w:r>
-    </w:p>
-    <w:p>
-      <w:pPr>
-        <w:rPr>
-          <w:lang w:val="en-US"/>
-        </w:rPr>
-      </w:pPr>
-    </w:p>
-    <w:p>
-      <w:pPr>
-        <w:rPr>
-          <w:b/>
-          <w:bCs/>
-          <w:lang w:val="en-US"/>
-        </w:rPr>
-      </w:pPr>
-      <w:r>
-        <w:rPr>
-          <w:b/>
-          <w:bCs/>
-          <w:lang w:val="en-US"/>
-        </w:rPr>
-        <w:t>LABORATÓRIO-SOFTWARE (</w:t>
-      </w:r>
-      <w:proofErr w:type="gramStart"/>
-      <w:r>
-        <w:rPr>
-          <w:b/>
-          <w:bCs/>
-          <w:lang w:val="en-US"/>
-        </w:rPr>
-        <w:t>N:N</w:t>
-      </w:r>
-      <w:proofErr w:type="gramEnd"/>
-      <w:r>
-        <w:rPr>
-          <w:b/>
-          <w:bCs/>
-          <w:lang w:val="en-US"/>
-        </w:rPr>
-        <w:t>)</w:t>
-      </w:r>
-      <w:r>
-        <w:rPr>
-          <w:b/>
-          <w:bCs/>
-          <w:lang w:val="en-US"/>
-        </w:rPr>
-        <w:t>:</w:t>
-      </w:r>
-    </w:p>
-    <w:p>
-      <w:pPr>
-        <w:rPr>
-          <w:lang w:val="en-US"/>
-        </w:rPr>
-      </w:pPr>
-    </w:p>
-    <w:p>
-      <w:pPr>
-        <w:rPr>
-          <w:lang w:val="en-US"/>
-        </w:rPr>
-      </w:pPr>
-      <w:r>
-        <w:rPr>
-          <w:lang w:val="en-US"/>
-        </w:rPr>
-        <w:t xml:space="preserve">CREATE TABLE </w:t>
-      </w:r>
-      <w:proofErr w:type="spellStart"/>
-      <w:r>
-        <w:rPr>
-          <w:lang w:val="en-US"/>
-        </w:rPr>
-        <w:t>laboratorio_software</w:t>
-      </w:r>
-      <w:proofErr w:type="spellEnd"/>
-      <w:r>
-        <w:rPr>
-          <w:lang w:val="en-US"/>
-        </w:rPr>
-        <w:t xml:space="preserve"> (</w:t>
-      </w:r>
-    </w:p>
-    <w:p>
-      <w:pPr>
-        <w:rPr>
-          <w:lang w:val="en-US"/>
-        </w:rPr>
-      </w:pPr>
-      <w:r>
-        <w:rPr>
-          <w:lang w:val="en-US"/>
-        </w:rPr>
-        <w:t xml:space="preserve">    </w:t>
-      </w:r>
-      <w:proofErr w:type="spellStart"/>
-      <w:r>
-        <w:rPr>
-          <w:lang w:val="en-US"/>
-        </w:rPr>
-        <w:t>id_software</w:t>
-      </w:r>
-      <w:proofErr w:type="spellEnd"/>
-      <w:r>
-        <w:rPr>
-          <w:lang w:val="en-US"/>
-        </w:rPr>
-        <w:t xml:space="preserve"> INTEGER NOT NULL,</w:t>
-      </w:r>
-    </w:p>
-    <w:p>
-      <w:pPr>
-        <w:rPr>
-          <w:lang w:val="en-US"/>
-        </w:rPr>
-      </w:pPr>
-      <w:r>
-        <w:rPr>
-          <w:lang w:val="en-US"/>
-        </w:rPr>
-        <w:t xml:space="preserve">    </w:t>
-      </w:r>
-      <w:proofErr w:type="spellStart"/>
-      <w:r>
-        <w:rPr>
-          <w:lang w:val="en-US"/>
-        </w:rPr>
-        <w:t>id_laboratorio</w:t>
-      </w:r>
-      <w:proofErr w:type="spellEnd"/>
-      <w:r>
-        <w:rPr>
-          <w:lang w:val="en-US"/>
-        </w:rPr>
-        <w:t xml:space="preserve"> INTEGER NOT NULL,</w:t>
-      </w:r>
-    </w:p>
-    <w:p>
-      <w:pPr>
-        <w:rPr>
-          <w:lang w:val="en-US"/>
-        </w:rPr>
-      </w:pPr>
-    </w:p>
-    <w:p>
-      <w:pPr>
-        <w:rPr>
-          <w:lang w:val="en-US"/>
-        </w:rPr>
-      </w:pPr>
-      <w:r>
-        <w:rPr>
-          <w:lang w:val="en-US"/>
-        </w:rPr>
-        <w:t xml:space="preserve">    PRIMARY KEY (</w:t>
-      </w:r>
-      <w:proofErr w:type="spellStart"/>
-      <w:r>
-        <w:rPr>
-          <w:lang w:val="en-US"/>
-        </w:rPr>
-        <w:t>id_software</w:t>
-      </w:r>
-      <w:proofErr w:type="spellEnd"/>
-      <w:r>
-        <w:rPr>
-          <w:lang w:val="en-US"/>
-        </w:rPr>
-        <w:t xml:space="preserve">, </w:t>
-      </w:r>
-      <w:proofErr w:type="spellStart"/>
-      <w:r>
-        <w:rPr>
-          <w:lang w:val="en-US"/>
-        </w:rPr>
-        <w:t>id_laboratorio</w:t>
-      </w:r>
-      <w:proofErr w:type="spellEnd"/>
-      <w:r>
-        <w:rPr>
-          <w:lang w:val="en-US"/>
-        </w:rPr>
-        <w:t>),</w:t>
-      </w:r>
-    </w:p>
-    <w:p>
-      <w:pPr>
-        <w:rPr>
-          <w:lang w:val="en-US"/>
-        </w:rPr>
-      </w:pPr>
-    </w:p>
-    <w:p>
-      <w:pPr>
-        <w:rPr>
-          <w:lang w:val="en-US"/>
-        </w:rPr>
-      </w:pPr>
-      <w:r>
-        <w:rPr>
-          <w:lang w:val="en-US"/>
-        </w:rPr>
-        <w:t xml:space="preserve">    CONSTRAINT </w:t>
-      </w:r>
-      <w:proofErr w:type="spellStart"/>
-      <w:r>
-        <w:rPr>
-          <w:lang w:val="en-US"/>
-        </w:rPr>
-        <w:t>fk_labsoft_software</w:t>
-      </w:r>
-      <w:proofErr w:type="spellEnd"/>
-    </w:p>
-    <w:p>
-      <w:pPr>
-        <w:rPr>
-          <w:lang w:val="en-US"/>
-        </w:rPr>
-      </w:pPr>
-      <w:r>
-        <w:rPr>
-          <w:lang w:val="en-US"/>
-        </w:rPr>
-        <w:t xml:space="preserve">        FOREIGN KEY (</w:t>
-      </w:r>
-      <w:proofErr w:type="spellStart"/>
-      <w:r>
-        <w:rPr>
-          <w:lang w:val="en-US"/>
-        </w:rPr>
-        <w:t>id_software</w:t>
-      </w:r>
-      <w:proofErr w:type="spellEnd"/>
-      <w:r>
-        <w:rPr>
-          <w:lang w:val="en-US"/>
-        </w:rPr>
-        <w:t>)</w:t>
-      </w:r>
-    </w:p>
-    <w:p>
-      <w:pPr>
-        <w:rPr>
-          <w:lang w:val="en-US"/>
-        </w:rPr>
-      </w:pPr>
-      <w:r>
-        <w:rPr>
-          <w:lang w:val="en-US"/>
-        </w:rPr>
         <w:lastRenderedPageBreak/>
-        <w:t xml:space="preserve">        REFERENCES software(</w:t>
-      </w:r>
-      <w:proofErr w:type="spellStart"/>
-      <w:r>
-        <w:rPr>
-          <w:lang w:val="en-US"/>
-        </w:rPr>
-        <w:t>id_software</w:t>
-      </w:r>
-      <w:proofErr w:type="spellEnd"/>
-      <w:r>
-        <w:rPr>
-          <w:lang w:val="en-US"/>
-        </w:rPr>
-        <w:t>)</w:t>
-      </w:r>
-    </w:p>
-    <w:p>
-      <w:pPr>
-        <w:rPr>
-          <w:lang w:val="en-US"/>
-        </w:rPr>
-      </w:pPr>
-      <w:r>
-        <w:rPr>
-          <w:lang w:val="en-US"/>
-        </w:rPr>
-        <w:t xml:space="preserve">        ON UPDATE CASCADE</w:t>
-      </w:r>
-    </w:p>
-    <w:p>
-      <w:pPr>
-        <w:rPr>
-          <w:lang w:val="en-US"/>
-        </w:rPr>
-      </w:pPr>
-      <w:r>
-        <w:rPr>
-          <w:lang w:val="en-US"/>
-        </w:rPr>
         <w:t xml:space="preserve">        ON DELETE CASCADE,</w:t>
       </w:r>
     </w:p>
@@ -8375,21 +8422,21 @@
         <w:pStyle w:val="Ttulo1"/>
         <w:jc w:val="center"/>
       </w:pPr>
-      <w:bookmarkStart w:id="24" w:name="_Toc21242"/>
+      <w:bookmarkStart w:id="25" w:name="_Toc21242"/>
       <w:r>
         <w:lastRenderedPageBreak/>
         <w:t>ANEXOS</w:t>
       </w:r>
-      <w:bookmarkEnd w:id="24"/>
+      <w:bookmarkEnd w:id="25"/>
     </w:p>
     <w:p/>
     <w:p>
-      <w:bookmarkStart w:id="25" w:name="Ata_1"/>
+      <w:bookmarkStart w:id="26" w:name="Ata_1"/>
       <w:r>
         <w:t>Ata 1</w:t>
       </w:r>
     </w:p>
-    <w:bookmarkEnd w:id="25"/>
+    <w:bookmarkEnd w:id="26"/>
     <w:p>
       <w:pPr>
         <w:jc w:val="both"/>
@@ -8447,12 +8494,12 @@
       </w:r>
     </w:p>
     <w:p>
-      <w:bookmarkStart w:id="26" w:name="Ata_2"/>
+      <w:bookmarkStart w:id="27" w:name="Ata_2"/>
       <w:r>
         <w:t>Ata 2</w:t>
       </w:r>
     </w:p>
-    <w:bookmarkEnd w:id="26"/>
+    <w:bookmarkEnd w:id="27"/>
     <w:p>
       <w:pPr>
         <w:jc w:val="both"/>
@@ -8528,7 +8575,7 @@
       <w:pPr>
         <w:jc w:val="both"/>
       </w:pPr>
-      <w:bookmarkStart w:id="27" w:name="Ata_3"/>
+      <w:bookmarkStart w:id="28" w:name="Ata_3"/>
       <w:r>
         <w:t>Ata</w:t>
       </w:r>
@@ -8536,7 +8583,7 @@
         <w:t xml:space="preserve"> 3</w:t>
       </w:r>
     </w:p>
-    <w:bookmarkEnd w:id="27"/>
+    <w:bookmarkEnd w:id="28"/>
     <w:p>
       <w:pPr>
         <w:jc w:val="both"/>
@@ -8593,12 +8640,12 @@
       <w:pPr>
         <w:jc w:val="both"/>
       </w:pPr>
-      <w:bookmarkStart w:id="28" w:name="Ata_4"/>
+      <w:bookmarkStart w:id="29" w:name="Ata_4"/>
       <w:r>
         <w:t>Ata 4</w:t>
       </w:r>
     </w:p>
-    <w:bookmarkEnd w:id="28"/>
+    <w:bookmarkEnd w:id="29"/>
     <w:p>
       <w:pPr>
         <w:jc w:val="both"/>
@@ -8655,12 +8702,12 @@
     <w:p/>
     <w:p/>
     <w:p>
-      <w:bookmarkStart w:id="29" w:name="Ata_5"/>
+      <w:bookmarkStart w:id="30" w:name="Ata_5"/>
       <w:r>
         <w:t>Ata 5</w:t>
       </w:r>
     </w:p>
-    <w:bookmarkEnd w:id="29"/>
+    <w:bookmarkEnd w:id="30"/>
     <w:p>
       <w:r>
         <w:rPr>
@@ -8771,7 +8818,7 @@
 </file>
 
 <file path=word/endnotes.xml><?xml version="1.0" encoding="utf-8"?>
-<w:endnotes xmlns:wpc="http://schemas.microsoft.com/office/word/2010/wordprocessingCanvas" xmlns:cx="http://schemas.microsoft.com/office/drawing/2014/chartex" xmlns:cx1="http://schemas.microsoft.com/office/drawing/2015/9/8/chartex" xmlns:cx2="http://schemas.microsoft.com/office/drawing/2015/10/21/chartex" xmlns:cx3="http://schemas.microsoft.com/office/drawing/2016/5/9/chartex" xmlns:cx4="http://schemas.microsoft.com/office/drawing/2016/5/10/chartex" xmlns:cx5="http://schemas.microsoft.com/office/drawing/2016/5/11/chartex" xmlns:cx6="http://schemas.microsoft.com/office/drawing/2016/5/12/chartex" xmlns:cx7="http://schemas.microsoft.com/office/drawing/2016/5/13/chartex" xmlns:cx8="http://schemas.microsoft.com/office/drawing/2016/5/14/chartex" xmlns:mc="http://schemas.openxmlformats.org/markup-compatibility/2006" xmlns:aink="http://schemas.microsoft.com/office/drawing/2016/ink" xmlns:am3d="http://schemas.microsoft.com/office/drawing/2017/model3d" xmlns:o="urn:schemas-microsoft-com:office:office" xmlns:oel="http://schemas.microsoft.com/office/2019/extlst" xmlns:r="http://schemas.openxmlformats.org/officeDocument/2006/relationships" xmlns:m="http://schemas.openxmlformats.org/officeDocument/2006/math" xmlns:v="urn:schemas-microsoft-com:vml" xmlns:wp14="http://schemas.microsoft.com/office/word/2010/wordprocessingDrawing" xmlns:wp="http://schemas.openxmlformats.org/drawingml/2006/wordprocessingDrawing" xmlns:w10="urn:schemas-microsoft-com:office:word" xmlns:w="http://schemas.openxmlformats.org/wordprocessingml/2006/main" xmlns:w14="http://schemas.microsoft.com/office/word/2010/wordml" xmlns:w15="http://schemas.microsoft.com/office/word/2012/wordml" xmlns:w16cex="http://schemas.microsoft.com/office/word/2018/wordml/cex" xmlns:w16cid="http://schemas.microsoft.com/office/word/2016/wordml/cid" xmlns:w16="http://schemas.microsoft.com/office/word/2018/wordml" xmlns:w16du="http://schemas.microsoft.com/office/word/2023/wordml/word16du" xmlns:w16sdtdh="http://schemas.microsoft.com/office/word/2020/wordml/sdtdatahash" xmlns:w16sdtfl="http://schemas.microsoft.com/office/word/2024/wordml/sdtformatlock" xmlns:w16se="http://schemas.microsoft.com/office/word/2015/wordml/symex" xmlns:wpg="http://schemas.microsoft.com/office/word/2010/wordprocessingGroup" xmlns:wpi="http://schemas.microsoft.com/office/word/2010/wordprocessingInk" xmlns:wne="http://schemas.microsoft.com/office/word/2006/wordml" xmlns:wps="http://schemas.microsoft.com/office/word/2010/wordprocessingShape" mc:Ignorable="w14 w15 w16se w16cid w16 w16cex w16sdtdh w16sdtfl w16du wp14">
+<w:endnotes xmlns:wpc="http://schemas.microsoft.com/office/word/2010/wordprocessingCanvas" xmlns:cx="http://schemas.microsoft.com/office/drawing/2014/chartex" xmlns:mc="http://schemas.openxmlformats.org/markup-compatibility/2006" xmlns:o="urn:schemas-microsoft-com:office:office" xmlns:r="http://schemas.openxmlformats.org/officeDocument/2006/relationships" xmlns:m="http://schemas.openxmlformats.org/officeDocument/2006/math" xmlns:v="urn:schemas-microsoft-com:vml" xmlns:wp14="http://schemas.microsoft.com/office/word/2010/wordprocessingDrawing" xmlns:wp="http://schemas.openxmlformats.org/drawingml/2006/wordprocessingDrawing" xmlns:w10="urn:schemas-microsoft-com:office:word" xmlns:w="http://schemas.openxmlformats.org/wordprocessingml/2006/main" xmlns:w14="http://schemas.microsoft.com/office/word/2010/wordml" xmlns:w15="http://schemas.microsoft.com/office/word/2012/wordml" xmlns:w16se="http://schemas.microsoft.com/office/word/2015/wordml/symex" xmlns:wpg="http://schemas.microsoft.com/office/word/2010/wordprocessingGroup" xmlns:wpi="http://schemas.microsoft.com/office/word/2010/wordprocessingInk" xmlns:wne="http://schemas.microsoft.com/office/word/2006/wordml" xmlns:wps="http://schemas.microsoft.com/office/word/2010/wordprocessingShape" mc:Ignorable="w14 w15 w16se wp14">
   <w:endnote w:type="separator" w:id="-1">
     <w:p>
       <w:pPr>
@@ -8796,7 +8843,7 @@
 </file>
 
 <file path=word/footer1.xml><?xml version="1.0" encoding="utf-8"?>
-<w:ftr xmlns:wpc="http://schemas.microsoft.com/office/word/2010/wordprocessingCanvas" xmlns:cx="http://schemas.microsoft.com/office/drawing/2014/chartex" xmlns:cx1="http://schemas.microsoft.com/office/drawing/2015/9/8/chartex" xmlns:cx2="http://schemas.microsoft.com/office/drawing/2015/10/21/chartex" xmlns:cx3="http://schemas.microsoft.com/office/drawing/2016/5/9/chartex" xmlns:cx4="http://schemas.microsoft.com/office/drawing/2016/5/10/chartex" xmlns:cx5="http://schemas.microsoft.com/office/drawing/2016/5/11/chartex" xmlns:cx6="http://schemas.microsoft.com/office/drawing/2016/5/12/chartex" xmlns:cx7="http://schemas.microsoft.com/office/drawing/2016/5/13/chartex" xmlns:cx8="http://schemas.microsoft.com/office/drawing/2016/5/14/chartex" xmlns:mc="http://schemas.openxmlformats.org/markup-compatibility/2006" xmlns:aink="http://schemas.microsoft.com/office/drawing/2016/ink" xmlns:am3d="http://schemas.microsoft.com/office/drawing/2017/model3d" xmlns:o="urn:schemas-microsoft-com:office:office" xmlns:oel="http://schemas.microsoft.com/office/2019/extlst" xmlns:r="http://schemas.openxmlformats.org/officeDocument/2006/relationships" xmlns:m="http://schemas.openxmlformats.org/officeDocument/2006/math" xmlns:v="urn:schemas-microsoft-com:vml" xmlns:wp14="http://schemas.microsoft.com/office/word/2010/wordprocessingDrawing" xmlns:wp="http://schemas.openxmlformats.org/drawingml/2006/wordprocessingDrawing" xmlns:w10="urn:schemas-microsoft-com:office:word" xmlns:w="http://schemas.openxmlformats.org/wordprocessingml/2006/main" xmlns:w14="http://schemas.microsoft.com/office/word/2010/wordml" xmlns:w15="http://schemas.microsoft.com/office/word/2012/wordml" xmlns:w16cex="http://schemas.microsoft.com/office/word/2018/wordml/cex" xmlns:w16cid="http://schemas.microsoft.com/office/word/2016/wordml/cid" xmlns:w16="http://schemas.microsoft.com/office/word/2018/wordml" xmlns:w16du="http://schemas.microsoft.com/office/word/2023/wordml/word16du" xmlns:w16sdtdh="http://schemas.microsoft.com/office/word/2020/wordml/sdtdatahash" xmlns:w16sdtfl="http://schemas.microsoft.com/office/word/2024/wordml/sdtformatlock" xmlns:w16se="http://schemas.microsoft.com/office/word/2015/wordml/symex" xmlns:wpg="http://schemas.microsoft.com/office/word/2010/wordprocessingGroup" xmlns:wpi="http://schemas.microsoft.com/office/word/2010/wordprocessingInk" xmlns:wne="http://schemas.microsoft.com/office/word/2006/wordml" xmlns:wps="http://schemas.microsoft.com/office/word/2010/wordprocessingShape" mc:Ignorable="w14 w15 w16se w16cid w16 w16cex w16sdtdh w16sdtfl w16du wp14">
+<w:ftr xmlns:wpc="http://schemas.microsoft.com/office/word/2010/wordprocessingCanvas" xmlns:cx="http://schemas.microsoft.com/office/drawing/2014/chartex" xmlns:mc="http://schemas.openxmlformats.org/markup-compatibility/2006" xmlns:o="urn:schemas-microsoft-com:office:office" xmlns:r="http://schemas.openxmlformats.org/officeDocument/2006/relationships" xmlns:m="http://schemas.openxmlformats.org/officeDocument/2006/math" xmlns:v="urn:schemas-microsoft-com:vml" xmlns:wp14="http://schemas.microsoft.com/office/word/2010/wordprocessingDrawing" xmlns:wp="http://schemas.openxmlformats.org/drawingml/2006/wordprocessingDrawing" xmlns:w10="urn:schemas-microsoft-com:office:word" xmlns:w="http://schemas.openxmlformats.org/wordprocessingml/2006/main" xmlns:w14="http://schemas.microsoft.com/office/word/2010/wordml" xmlns:w15="http://schemas.microsoft.com/office/word/2012/wordml" xmlns:w16se="http://schemas.microsoft.com/office/word/2015/wordml/symex" xmlns:wpg="http://schemas.microsoft.com/office/word/2010/wordprocessingGroup" xmlns:wpi="http://schemas.microsoft.com/office/word/2010/wordprocessingInk" xmlns:wne="http://schemas.microsoft.com/office/word/2006/wordml" xmlns:wps="http://schemas.microsoft.com/office/word/2010/wordprocessingShape" mc:Ignorable="w14 w15 w16se wp14">
   <w:p>
     <w:pPr>
       <w:pStyle w:val="Rodap"/>
@@ -8806,7 +8853,7 @@
 </file>
 
 <file path=word/footnotes.xml><?xml version="1.0" encoding="utf-8"?>
-<w:footnotes xmlns:wpc="http://schemas.microsoft.com/office/word/2010/wordprocessingCanvas" xmlns:cx="http://schemas.microsoft.com/office/drawing/2014/chartex" xmlns:cx1="http://schemas.microsoft.com/office/drawing/2015/9/8/chartex" xmlns:cx2="http://schemas.microsoft.com/office/drawing/2015/10/21/chartex" xmlns:cx3="http://schemas.microsoft.com/office/drawing/2016/5/9/chartex" xmlns:cx4="http://schemas.microsoft.com/office/drawing/2016/5/10/chartex" xmlns:cx5="http://schemas.microsoft.com/office/drawing/2016/5/11/chartex" xmlns:cx6="http://schemas.microsoft.com/office/drawing/2016/5/12/chartex" xmlns:cx7="http://schemas.microsoft.com/office/drawing/2016/5/13/chartex" xmlns:cx8="http://schemas.microsoft.com/office/drawing/2016/5/14/chartex" xmlns:mc="http://schemas.openxmlformats.org/markup-compatibility/2006" xmlns:aink="http://schemas.microsoft.com/office/drawing/2016/ink" xmlns:am3d="http://schemas.microsoft.com/office/drawing/2017/model3d" xmlns:o="urn:schemas-microsoft-com:office:office" xmlns:oel="http://schemas.microsoft.com/office/2019/extlst" xmlns:r="http://schemas.openxmlformats.org/officeDocument/2006/relationships" xmlns:m="http://schemas.openxmlformats.org/officeDocument/2006/math" xmlns:v="urn:schemas-microsoft-com:vml" xmlns:wp14="http://schemas.microsoft.com/office/word/2010/wordprocessingDrawing" xmlns:wp="http://schemas.openxmlformats.org/drawingml/2006/wordprocessingDrawing" xmlns:w10="urn:schemas-microsoft-com:office:word" xmlns:w="http://schemas.openxmlformats.org/wordprocessingml/2006/main" xmlns:w14="http://schemas.microsoft.com/office/word/2010/wordml" xmlns:w15="http://schemas.microsoft.com/office/word/2012/wordml" xmlns:w16cex="http://schemas.microsoft.com/office/word/2018/wordml/cex" xmlns:w16cid="http://schemas.microsoft.com/office/word/2016/wordml/cid" xmlns:w16="http://schemas.microsoft.com/office/word/2018/wordml" xmlns:w16du="http://schemas.microsoft.com/office/word/2023/wordml/word16du" xmlns:w16sdtdh="http://schemas.microsoft.com/office/word/2020/wordml/sdtdatahash" xmlns:w16sdtfl="http://schemas.microsoft.com/office/word/2024/wordml/sdtformatlock" xmlns:w16se="http://schemas.microsoft.com/office/word/2015/wordml/symex" xmlns:wpg="http://schemas.microsoft.com/office/word/2010/wordprocessingGroup" xmlns:wpi="http://schemas.microsoft.com/office/word/2010/wordprocessingInk" xmlns:wne="http://schemas.microsoft.com/office/word/2006/wordml" xmlns:wps="http://schemas.microsoft.com/office/word/2010/wordprocessingShape" mc:Ignorable="w14 w15 w16se w16cid w16 w16cex w16sdtdh w16sdtfl w16du wp14">
+<w:footnotes xmlns:wpc="http://schemas.microsoft.com/office/word/2010/wordprocessingCanvas" xmlns:cx="http://schemas.microsoft.com/office/drawing/2014/chartex" xmlns:mc="http://schemas.openxmlformats.org/markup-compatibility/2006" xmlns:o="urn:schemas-microsoft-com:office:office" xmlns:r="http://schemas.openxmlformats.org/officeDocument/2006/relationships" xmlns:m="http://schemas.openxmlformats.org/officeDocument/2006/math" xmlns:v="urn:schemas-microsoft-com:vml" xmlns:wp14="http://schemas.microsoft.com/office/word/2010/wordprocessingDrawing" xmlns:wp="http://schemas.openxmlformats.org/drawingml/2006/wordprocessingDrawing" xmlns:w10="urn:schemas-microsoft-com:office:word" xmlns:w="http://schemas.openxmlformats.org/wordprocessingml/2006/main" xmlns:w14="http://schemas.microsoft.com/office/word/2010/wordml" xmlns:w15="http://schemas.microsoft.com/office/word/2012/wordml" xmlns:w16se="http://schemas.microsoft.com/office/word/2015/wordml/symex" xmlns:wpg="http://schemas.microsoft.com/office/word/2010/wordprocessingGroup" xmlns:wpi="http://schemas.microsoft.com/office/word/2010/wordprocessingInk" xmlns:wne="http://schemas.microsoft.com/office/word/2006/wordml" xmlns:wps="http://schemas.microsoft.com/office/word/2010/wordprocessingShape" mc:Ignorable="w14 w15 w16se wp14">
   <w:footnote w:type="separator" w:id="-1">
     <w:p>
       <w:r>
@@ -8825,7 +8872,7 @@
 </file>
 
 <file path=word/header1.xml><?xml version="1.0" encoding="utf-8"?>
-<w:hdr xmlns:wpc="http://schemas.microsoft.com/office/word/2010/wordprocessingCanvas" xmlns:cx="http://schemas.microsoft.com/office/drawing/2014/chartex" xmlns:cx1="http://schemas.microsoft.com/office/drawing/2015/9/8/chartex" xmlns:cx2="http://schemas.microsoft.com/office/drawing/2015/10/21/chartex" xmlns:cx3="http://schemas.microsoft.com/office/drawing/2016/5/9/chartex" xmlns:cx4="http://schemas.microsoft.com/office/drawing/2016/5/10/chartex" xmlns:cx5="http://schemas.microsoft.com/office/drawing/2016/5/11/chartex" xmlns:cx6="http://schemas.microsoft.com/office/drawing/2016/5/12/chartex" xmlns:cx7="http://schemas.microsoft.com/office/drawing/2016/5/13/chartex" xmlns:cx8="http://schemas.microsoft.com/office/drawing/2016/5/14/chartex" xmlns:mc="http://schemas.openxmlformats.org/markup-compatibility/2006" xmlns:aink="http://schemas.microsoft.com/office/drawing/2016/ink" xmlns:am3d="http://schemas.microsoft.com/office/drawing/2017/model3d" xmlns:o="urn:schemas-microsoft-com:office:office" xmlns:oel="http://schemas.microsoft.com/office/2019/extlst" xmlns:r="http://schemas.openxmlformats.org/officeDocument/2006/relationships" xmlns:m="http://schemas.openxmlformats.org/officeDocument/2006/math" xmlns:v="urn:schemas-microsoft-com:vml" xmlns:wp14="http://schemas.microsoft.com/office/word/2010/wordprocessingDrawing" xmlns:wp="http://schemas.openxmlformats.org/drawingml/2006/wordprocessingDrawing" xmlns:w10="urn:schemas-microsoft-com:office:word" xmlns:w="http://schemas.openxmlformats.org/wordprocessingml/2006/main" xmlns:w14="http://schemas.microsoft.com/office/word/2010/wordml" xmlns:w15="http://schemas.microsoft.com/office/word/2012/wordml" xmlns:w16cex="http://schemas.microsoft.com/office/word/2018/wordml/cex" xmlns:w16cid="http://schemas.microsoft.com/office/word/2016/wordml/cid" xmlns:w16="http://schemas.microsoft.com/office/word/2018/wordml" xmlns:w16du="http://schemas.microsoft.com/office/word/2023/wordml/word16du" xmlns:w16sdtdh="http://schemas.microsoft.com/office/word/2020/wordml/sdtdatahash" xmlns:w16sdtfl="http://schemas.microsoft.com/office/word/2024/wordml/sdtformatlock" xmlns:w16se="http://schemas.microsoft.com/office/word/2015/wordml/symex" xmlns:wpg="http://schemas.microsoft.com/office/word/2010/wordprocessingGroup" xmlns:wpi="http://schemas.microsoft.com/office/word/2010/wordprocessingInk" xmlns:wne="http://schemas.microsoft.com/office/word/2006/wordml" xmlns:wps="http://schemas.microsoft.com/office/word/2010/wordprocessingShape" mc:Ignorable="w14 w15 w16se w16cid w16 w16cex w16sdtdh w16sdtfl w16du wp14">
+<w:hdr xmlns:wpc="http://schemas.microsoft.com/office/word/2010/wordprocessingCanvas" xmlns:cx="http://schemas.microsoft.com/office/drawing/2014/chartex" xmlns:mc="http://schemas.openxmlformats.org/markup-compatibility/2006" xmlns:o="urn:schemas-microsoft-com:office:office" xmlns:r="http://schemas.openxmlformats.org/officeDocument/2006/relationships" xmlns:m="http://schemas.openxmlformats.org/officeDocument/2006/math" xmlns:v="urn:schemas-microsoft-com:vml" xmlns:wp14="http://schemas.microsoft.com/office/word/2010/wordprocessingDrawing" xmlns:wp="http://schemas.openxmlformats.org/drawingml/2006/wordprocessingDrawing" xmlns:w10="urn:schemas-microsoft-com:office:word" xmlns:w="http://schemas.openxmlformats.org/wordprocessingml/2006/main" xmlns:w14="http://schemas.microsoft.com/office/word/2010/wordml" xmlns:w15="http://schemas.microsoft.com/office/word/2012/wordml" xmlns:w16se="http://schemas.microsoft.com/office/word/2015/wordml/symex" xmlns:wpg="http://schemas.microsoft.com/office/word/2010/wordprocessingGroup" xmlns:wpi="http://schemas.microsoft.com/office/word/2010/wordprocessingInk" xmlns:wne="http://schemas.microsoft.com/office/word/2006/wordml" xmlns:wps="http://schemas.microsoft.com/office/word/2010/wordprocessingShape" mc:Ignorable="w14 w15 w16se wp14">
   <w:p>
     <w:pPr>
       <w:pStyle w:val="Cabealho"/>
@@ -8841,7 +8888,7 @@
 </file>
 
 <file path=word/header2.xml><?xml version="1.0" encoding="utf-8"?>
-<w:hdr xmlns:wpc="http://schemas.microsoft.com/office/word/2010/wordprocessingCanvas" xmlns:cx="http://schemas.microsoft.com/office/drawing/2014/chartex" xmlns:cx1="http://schemas.microsoft.com/office/drawing/2015/9/8/chartex" xmlns:cx2="http://schemas.microsoft.com/office/drawing/2015/10/21/chartex" xmlns:cx3="http://schemas.microsoft.com/office/drawing/2016/5/9/chartex" xmlns:cx4="http://schemas.microsoft.com/office/drawing/2016/5/10/chartex" xmlns:cx5="http://schemas.microsoft.com/office/drawing/2016/5/11/chartex" xmlns:cx6="http://schemas.microsoft.com/office/drawing/2016/5/12/chartex" xmlns:cx7="http://schemas.microsoft.com/office/drawing/2016/5/13/chartex" xmlns:cx8="http://schemas.microsoft.com/office/drawing/2016/5/14/chartex" xmlns:mc="http://schemas.openxmlformats.org/markup-compatibility/2006" xmlns:aink="http://schemas.microsoft.com/office/drawing/2016/ink" xmlns:am3d="http://schemas.microsoft.com/office/drawing/2017/model3d" xmlns:o="urn:schemas-microsoft-com:office:office" xmlns:oel="http://schemas.microsoft.com/office/2019/extlst" xmlns:r="http://schemas.openxmlformats.org/officeDocument/2006/relationships" xmlns:m="http://schemas.openxmlformats.org/officeDocument/2006/math" xmlns:v="urn:schemas-microsoft-com:vml" xmlns:wp14="http://schemas.microsoft.com/office/word/2010/wordprocessingDrawing" xmlns:wp="http://schemas.openxmlformats.org/drawingml/2006/wordprocessingDrawing" xmlns:w10="urn:schemas-microsoft-com:office:word" xmlns:w="http://schemas.openxmlformats.org/wordprocessingml/2006/main" xmlns:w14="http://schemas.microsoft.com/office/word/2010/wordml" xmlns:w15="http://schemas.microsoft.com/office/word/2012/wordml" xmlns:w16cex="http://schemas.microsoft.com/office/word/2018/wordml/cex" xmlns:w16cid="http://schemas.microsoft.com/office/word/2016/wordml/cid" xmlns:w16="http://schemas.microsoft.com/office/word/2018/wordml" xmlns:w16du="http://schemas.microsoft.com/office/word/2023/wordml/word16du" xmlns:w16sdtdh="http://schemas.microsoft.com/office/word/2020/wordml/sdtdatahash" xmlns:w16sdtfl="http://schemas.microsoft.com/office/word/2024/wordml/sdtformatlock" xmlns:w16se="http://schemas.microsoft.com/office/word/2015/wordml/symex" xmlns:wpg="http://schemas.microsoft.com/office/word/2010/wordprocessingGroup" xmlns:wpi="http://schemas.microsoft.com/office/word/2010/wordprocessingInk" xmlns:wne="http://schemas.microsoft.com/office/word/2006/wordml" xmlns:wps="http://schemas.microsoft.com/office/word/2010/wordprocessingShape" mc:Ignorable="w14 w15 w16se w16cid w16 w16cex w16sdtdh w16sdtfl w16du wp14">
+<w:hdr xmlns:wpc="http://schemas.microsoft.com/office/word/2010/wordprocessingCanvas" xmlns:cx="http://schemas.microsoft.com/office/drawing/2014/chartex" xmlns:mc="http://schemas.openxmlformats.org/markup-compatibility/2006" xmlns:o="urn:schemas-microsoft-com:office:office" xmlns:r="http://schemas.openxmlformats.org/officeDocument/2006/relationships" xmlns:m="http://schemas.openxmlformats.org/officeDocument/2006/math" xmlns:v="urn:schemas-microsoft-com:vml" xmlns:wp14="http://schemas.microsoft.com/office/word/2010/wordprocessingDrawing" xmlns:wp="http://schemas.openxmlformats.org/drawingml/2006/wordprocessingDrawing" xmlns:w10="urn:schemas-microsoft-com:office:word" xmlns:w="http://schemas.openxmlformats.org/wordprocessingml/2006/main" xmlns:w14="http://schemas.microsoft.com/office/word/2010/wordml" xmlns:w15="http://schemas.microsoft.com/office/word/2012/wordml" xmlns:w16se="http://schemas.microsoft.com/office/word/2015/wordml/symex" xmlns:wpg="http://schemas.microsoft.com/office/word/2010/wordprocessingGroup" xmlns:wpi="http://schemas.microsoft.com/office/word/2010/wordprocessingInk" xmlns:wne="http://schemas.microsoft.com/office/word/2006/wordml" xmlns:wps="http://schemas.microsoft.com/office/word/2010/wordprocessingShape" mc:Ignorable="w14 w15 w16se wp14">
   <w:sdt>
     <w:sdtPr>
       <w:id w:val="-1699001773"/>
@@ -8889,7 +8936,7 @@
             <w:sz w:val="20"/>
             <w:szCs w:val="20"/>
           </w:rPr>
-          <w:t>15</w:t>
+          <w:t>13</w:t>
         </w:r>
         <w:r>
           <w:rPr>
@@ -8905,7 +8952,7 @@
 </file>
 
 <file path=word/header3.xml><?xml version="1.0" encoding="utf-8"?>
-<w:hdr xmlns:wpc="http://schemas.microsoft.com/office/word/2010/wordprocessingCanvas" xmlns:cx="http://schemas.microsoft.com/office/drawing/2014/chartex" xmlns:cx1="http://schemas.microsoft.com/office/drawing/2015/9/8/chartex" xmlns:cx2="http://schemas.microsoft.com/office/drawing/2015/10/21/chartex" xmlns:cx3="http://schemas.microsoft.com/office/drawing/2016/5/9/chartex" xmlns:cx4="http://schemas.microsoft.com/office/drawing/2016/5/10/chartex" xmlns:cx5="http://schemas.microsoft.com/office/drawing/2016/5/11/chartex" xmlns:cx6="http://schemas.microsoft.com/office/drawing/2016/5/12/chartex" xmlns:cx7="http://schemas.microsoft.com/office/drawing/2016/5/13/chartex" xmlns:cx8="http://schemas.microsoft.com/office/drawing/2016/5/14/chartex" xmlns:mc="http://schemas.openxmlformats.org/markup-compatibility/2006" xmlns:aink="http://schemas.microsoft.com/office/drawing/2016/ink" xmlns:am3d="http://schemas.microsoft.com/office/drawing/2017/model3d" xmlns:o="urn:schemas-microsoft-com:office:office" xmlns:oel="http://schemas.microsoft.com/office/2019/extlst" xmlns:r="http://schemas.openxmlformats.org/officeDocument/2006/relationships" xmlns:m="http://schemas.openxmlformats.org/officeDocument/2006/math" xmlns:v="urn:schemas-microsoft-com:vml" xmlns:wp14="http://schemas.microsoft.com/office/word/2010/wordprocessingDrawing" xmlns:wp="http://schemas.openxmlformats.org/drawingml/2006/wordprocessingDrawing" xmlns:w10="urn:schemas-microsoft-com:office:word" xmlns:w="http://schemas.openxmlformats.org/wordprocessingml/2006/main" xmlns:w14="http://schemas.microsoft.com/office/word/2010/wordml" xmlns:w15="http://schemas.microsoft.com/office/word/2012/wordml" xmlns:w16cex="http://schemas.microsoft.com/office/word/2018/wordml/cex" xmlns:w16cid="http://schemas.microsoft.com/office/word/2016/wordml/cid" xmlns:w16="http://schemas.microsoft.com/office/word/2018/wordml" xmlns:w16du="http://schemas.microsoft.com/office/word/2023/wordml/word16du" xmlns:w16sdtdh="http://schemas.microsoft.com/office/word/2020/wordml/sdtdatahash" xmlns:w16sdtfl="http://schemas.microsoft.com/office/word/2024/wordml/sdtformatlock" xmlns:w16se="http://schemas.microsoft.com/office/word/2015/wordml/symex" xmlns:wpg="http://schemas.microsoft.com/office/word/2010/wordprocessingGroup" xmlns:wpi="http://schemas.microsoft.com/office/word/2010/wordprocessingInk" xmlns:wne="http://schemas.microsoft.com/office/word/2006/wordml" xmlns:wps="http://schemas.microsoft.com/office/word/2010/wordprocessingShape" mc:Ignorable="w14 w15 w16se w16cid w16 w16cex w16sdtdh w16sdtfl w16du wp14">
+<w:hdr xmlns:wpc="http://schemas.microsoft.com/office/word/2010/wordprocessingCanvas" xmlns:cx="http://schemas.microsoft.com/office/drawing/2014/chartex" xmlns:mc="http://schemas.openxmlformats.org/markup-compatibility/2006" xmlns:o="urn:schemas-microsoft-com:office:office" xmlns:r="http://schemas.openxmlformats.org/officeDocument/2006/relationships" xmlns:m="http://schemas.openxmlformats.org/officeDocument/2006/math" xmlns:v="urn:schemas-microsoft-com:vml" xmlns:wp14="http://schemas.microsoft.com/office/word/2010/wordprocessingDrawing" xmlns:wp="http://schemas.openxmlformats.org/drawingml/2006/wordprocessingDrawing" xmlns:w10="urn:schemas-microsoft-com:office:word" xmlns:w="http://schemas.openxmlformats.org/wordprocessingml/2006/main" xmlns:w14="http://schemas.microsoft.com/office/word/2010/wordml" xmlns:w15="http://schemas.microsoft.com/office/word/2012/wordml" xmlns:w16se="http://schemas.microsoft.com/office/word/2015/wordml/symex" xmlns:wpg="http://schemas.microsoft.com/office/word/2010/wordprocessingGroup" xmlns:wpi="http://schemas.microsoft.com/office/word/2010/wordprocessingInk" xmlns:wne="http://schemas.microsoft.com/office/word/2006/wordml" xmlns:wps="http://schemas.microsoft.com/office/word/2010/wordprocessingShape" mc:Ignorable="w14 w15 w16se wp14">
   <w:sdt>
     <w:sdtPr>
       <w:id w:val="958228592"/>
@@ -8953,7 +9000,7 @@
             <w:sz w:val="20"/>
             <w:szCs w:val="20"/>
           </w:rPr>
-          <w:t>22</w:t>
+          <w:t>4</w:t>
         </w:r>
         <w:r>
           <w:rPr>
@@ -8982,7 +9029,7 @@
 </file>
 
 <file path=word/numbering.xml><?xml version="1.0" encoding="utf-8"?>
-<w:numbering xmlns:wpc="http://schemas.microsoft.com/office/word/2010/wordprocessingCanvas" xmlns:cx="http://schemas.microsoft.com/office/drawing/2014/chartex" xmlns:cx1="http://schemas.microsoft.com/office/drawing/2015/9/8/chartex" xmlns:cx2="http://schemas.microsoft.com/office/drawing/2015/10/21/chartex" xmlns:cx3="http://schemas.microsoft.com/office/drawing/2016/5/9/chartex" xmlns:cx4="http://schemas.microsoft.com/office/drawing/2016/5/10/chartex" xmlns:cx5="http://schemas.microsoft.com/office/drawing/2016/5/11/chartex" xmlns:cx6="http://schemas.microsoft.com/office/drawing/2016/5/12/chartex" xmlns:cx7="http://schemas.microsoft.com/office/drawing/2016/5/13/chartex" xmlns:cx8="http://schemas.microsoft.com/office/drawing/2016/5/14/chartex" xmlns:mc="http://schemas.openxmlformats.org/markup-compatibility/2006" xmlns:aink="http://schemas.microsoft.com/office/drawing/2016/ink" xmlns:am3d="http://schemas.microsoft.com/office/drawing/2017/model3d" xmlns:o="urn:schemas-microsoft-com:office:office" xmlns:oel="http://schemas.microsoft.com/office/2019/extlst" xmlns:r="http://schemas.openxmlformats.org/officeDocument/2006/relationships" xmlns:m="http://schemas.openxmlformats.org/officeDocument/2006/math" xmlns:v="urn:schemas-microsoft-com:vml" xmlns:wp14="http://schemas.microsoft.com/office/word/2010/wordprocessingDrawing" xmlns:wp="http://schemas.openxmlformats.org/drawingml/2006/wordprocessingDrawing" xmlns:w10="urn:schemas-microsoft-com:office:word" xmlns:w="http://schemas.openxmlformats.org/wordprocessingml/2006/main" xmlns:w14="http://schemas.microsoft.com/office/word/2010/wordml" xmlns:w15="http://schemas.microsoft.com/office/word/2012/wordml" xmlns:w16cex="http://schemas.microsoft.com/office/word/2018/wordml/cex" xmlns:w16cid="http://schemas.microsoft.com/office/word/2016/wordml/cid" xmlns:w16="http://schemas.microsoft.com/office/word/2018/wordml" xmlns:w16du="http://schemas.microsoft.com/office/word/2023/wordml/word16du" xmlns:w16sdtdh="http://schemas.microsoft.com/office/word/2020/wordml/sdtdatahash" xmlns:w16sdtfl="http://schemas.microsoft.com/office/word/2024/wordml/sdtformatlock" xmlns:w16se="http://schemas.microsoft.com/office/word/2015/wordml/symex" xmlns:wpg="http://schemas.microsoft.com/office/word/2010/wordprocessingGroup" xmlns:wpi="http://schemas.microsoft.com/office/word/2010/wordprocessingInk" xmlns:wne="http://schemas.microsoft.com/office/word/2006/wordml" xmlns:wps="http://schemas.microsoft.com/office/word/2010/wordprocessingShape" mc:Ignorable="w14 w15 w16se w16cid w16 w16cex w16sdtdh w16sdtfl w16du wp14">
+<w:numbering xmlns:wpc="http://schemas.microsoft.com/office/word/2010/wordprocessingCanvas" xmlns:cx="http://schemas.microsoft.com/office/drawing/2014/chartex" xmlns:mc="http://schemas.openxmlformats.org/markup-compatibility/2006" xmlns:o="urn:schemas-microsoft-com:office:office" xmlns:r="http://schemas.openxmlformats.org/officeDocument/2006/relationships" xmlns:m="http://schemas.openxmlformats.org/officeDocument/2006/math" xmlns:v="urn:schemas-microsoft-com:vml" xmlns:wp14="http://schemas.microsoft.com/office/word/2010/wordprocessingDrawing" xmlns:wp="http://schemas.openxmlformats.org/drawingml/2006/wordprocessingDrawing" xmlns:w10="urn:schemas-microsoft-com:office:word" xmlns:w="http://schemas.openxmlformats.org/wordprocessingml/2006/main" xmlns:w14="http://schemas.microsoft.com/office/word/2010/wordml" xmlns:w15="http://schemas.microsoft.com/office/word/2012/wordml" xmlns:w16se="http://schemas.microsoft.com/office/word/2015/wordml/symex" xmlns:wpg="http://schemas.microsoft.com/office/word/2010/wordprocessingGroup" xmlns:wpi="http://schemas.microsoft.com/office/word/2010/wordprocessingInk" xmlns:wne="http://schemas.microsoft.com/office/word/2006/wordml" xmlns:wps="http://schemas.microsoft.com/office/word/2010/wordprocessingShape" mc:Ignorable="w14 w15 w16se wp14">
   <w:abstractNum w:abstractNumId="0" w15:restartNumberingAfterBreak="0">
     <w:nsid w:val="00AB5A76"/>
     <w:multiLevelType w:val="hybridMultilevel"/>
@@ -11897,89 +11944,89 @@
       </w:rPr>
     </w:lvl>
   </w:abstractNum>
-  <w:num w:numId="1" w16cid:durableId="292565627">
+  <w:num w:numId="1">
     <w:abstractNumId w:val="6"/>
   </w:num>
-  <w:num w:numId="2" w16cid:durableId="1312061582">
+  <w:num w:numId="2">
     <w:abstractNumId w:val="11"/>
   </w:num>
-  <w:num w:numId="3" w16cid:durableId="1710489717">
+  <w:num w:numId="3">
     <w:abstractNumId w:val="1"/>
   </w:num>
-  <w:num w:numId="4" w16cid:durableId="557326752">
+  <w:num w:numId="4">
     <w:abstractNumId w:val="10"/>
   </w:num>
-  <w:num w:numId="5" w16cid:durableId="1547988692">
+  <w:num w:numId="5">
     <w:abstractNumId w:val="21"/>
   </w:num>
-  <w:num w:numId="6" w16cid:durableId="1522935137">
+  <w:num w:numId="6">
     <w:abstractNumId w:val="20"/>
   </w:num>
-  <w:num w:numId="7" w16cid:durableId="2118212896">
+  <w:num w:numId="7">
     <w:abstractNumId w:val="22"/>
   </w:num>
-  <w:num w:numId="8" w16cid:durableId="1131631543">
+  <w:num w:numId="8">
     <w:abstractNumId w:val="4"/>
   </w:num>
-  <w:num w:numId="9" w16cid:durableId="2075345970">
+  <w:num w:numId="9">
     <w:abstractNumId w:val="23"/>
   </w:num>
-  <w:num w:numId="10" w16cid:durableId="199050510">
+  <w:num w:numId="10">
     <w:abstractNumId w:val="2"/>
   </w:num>
-  <w:num w:numId="11" w16cid:durableId="399180704">
+  <w:num w:numId="11">
     <w:abstractNumId w:val="24"/>
   </w:num>
-  <w:num w:numId="12" w16cid:durableId="778835016">
+  <w:num w:numId="12">
     <w:abstractNumId w:val="25"/>
   </w:num>
-  <w:num w:numId="13" w16cid:durableId="936711822">
+  <w:num w:numId="13">
     <w:abstractNumId w:val="16"/>
   </w:num>
-  <w:num w:numId="14" w16cid:durableId="1031417465">
+  <w:num w:numId="14">
     <w:abstractNumId w:val="14"/>
   </w:num>
-  <w:num w:numId="15" w16cid:durableId="81608087">
+  <w:num w:numId="15">
     <w:abstractNumId w:val="12"/>
   </w:num>
-  <w:num w:numId="16" w16cid:durableId="636029299">
+  <w:num w:numId="16">
     <w:abstractNumId w:val="15"/>
   </w:num>
-  <w:num w:numId="17" w16cid:durableId="343557435">
+  <w:num w:numId="17">
     <w:abstractNumId w:val="9"/>
   </w:num>
-  <w:num w:numId="18" w16cid:durableId="222907287">
+  <w:num w:numId="18">
     <w:abstractNumId w:val="3"/>
   </w:num>
-  <w:num w:numId="19" w16cid:durableId="2035954109">
+  <w:num w:numId="19">
     <w:abstractNumId w:val="19"/>
   </w:num>
-  <w:num w:numId="20" w16cid:durableId="289554794">
+  <w:num w:numId="20">
     <w:abstractNumId w:val="8"/>
   </w:num>
-  <w:num w:numId="21" w16cid:durableId="1914386974">
+  <w:num w:numId="21">
     <w:abstractNumId w:val="0"/>
   </w:num>
-  <w:num w:numId="22" w16cid:durableId="1214578792">
+  <w:num w:numId="22">
     <w:abstractNumId w:val="7"/>
   </w:num>
-  <w:num w:numId="23" w16cid:durableId="1249729942">
+  <w:num w:numId="23">
     <w:abstractNumId w:val="5"/>
   </w:num>
-  <w:num w:numId="24" w16cid:durableId="105151554">
+  <w:num w:numId="24">
     <w:abstractNumId w:val="18"/>
   </w:num>
-  <w:num w:numId="25" w16cid:durableId="2048984961">
+  <w:num w:numId="25">
     <w:abstractNumId w:val="13"/>
   </w:num>
-  <w:num w:numId="26" w16cid:durableId="2034190305">
+  <w:num w:numId="26">
     <w:abstractNumId w:val="17"/>
   </w:num>
 </w:numbering>
 </file>
 
 <file path=word/styles.xml><?xml version="1.0" encoding="utf-8"?>
-<w:styles xmlns:mc="http://schemas.openxmlformats.org/markup-compatibility/2006" xmlns:r="http://schemas.openxmlformats.org/officeDocument/2006/relationships" xmlns:w="http://schemas.openxmlformats.org/wordprocessingml/2006/main" xmlns:w14="http://schemas.microsoft.com/office/word/2010/wordml" xmlns:w15="http://schemas.microsoft.com/office/word/2012/wordml" xmlns:w16cex="http://schemas.microsoft.com/office/word/2018/wordml/cex" xmlns:w16cid="http://schemas.microsoft.com/office/word/2016/wordml/cid" xmlns:w16="http://schemas.microsoft.com/office/word/2018/wordml" xmlns:w16du="http://schemas.microsoft.com/office/word/2023/wordml/word16du" xmlns:w16sdtdh="http://schemas.microsoft.com/office/word/2020/wordml/sdtdatahash" xmlns:w16sdtfl="http://schemas.microsoft.com/office/word/2024/wordml/sdtformatlock" xmlns:w16se="http://schemas.microsoft.com/office/word/2015/wordml/symex" mc:Ignorable="w14 w15 w16se w16cid w16 w16cex w16sdtdh w16sdtfl w16du">
+<w:styles xmlns:mc="http://schemas.openxmlformats.org/markup-compatibility/2006" xmlns:r="http://schemas.openxmlformats.org/officeDocument/2006/relationships" xmlns:w="http://schemas.openxmlformats.org/wordprocessingml/2006/main" xmlns:w14="http://schemas.microsoft.com/office/word/2010/wordml" xmlns:w15="http://schemas.microsoft.com/office/word/2012/wordml" xmlns:w16se="http://schemas.microsoft.com/office/word/2015/wordml/symex" mc:Ignorable="w14 w15 w16se">
   <w:docDefaults>
     <w:rPrDefault>
       <w:rPr>
@@ -11989,7 +12036,7 @@
     </w:rPrDefault>
     <w:pPrDefault/>
   </w:docDefaults>
-  <w:latentStyles w:defLockedState="0" w:defUIPriority="99" w:defSemiHidden="0" w:defUnhideWhenUsed="0" w:defQFormat="0" w:count="376">
+  <w:latentStyles w:defLockedState="0" w:defUIPriority="99" w:defSemiHidden="0" w:defUnhideWhenUsed="0" w:defQFormat="0" w:count="371">
     <w:lsdException w:name="Normal" w:uiPriority="0" w:qFormat="1"/>
     <w:lsdException w:name="heading 1" w:uiPriority="9" w:qFormat="1"/>
     <w:lsdException w:name="heading 2" w:uiPriority="9" w:unhideWhenUsed="1" w:qFormat="1"/>
@@ -12361,11 +12408,6 @@
     <w:lsdException w:name="List Table 5 Dark Accent 6" w:uiPriority="50"/>
     <w:lsdException w:name="List Table 6 Colorful Accent 6" w:uiPriority="51"/>
     <w:lsdException w:name="List Table 7 Colorful Accent 6" w:uiPriority="52"/>
-    <w:lsdException w:name="Mention" w:semiHidden="1" w:unhideWhenUsed="1"/>
-    <w:lsdException w:name="Smart Hyperlink" w:semiHidden="1" w:unhideWhenUsed="1"/>
-    <w:lsdException w:name="Hashtag" w:semiHidden="1" w:unhideWhenUsed="1"/>
-    <w:lsdException w:name="Unresolved Mention" w:semiHidden="1" w:unhideWhenUsed="1"/>
-    <w:lsdException w:name="Smart Link" w:semiHidden="1" w:unhideWhenUsed="1"/>
   </w:latentStyles>
   <w:style w:type="paragraph" w:default="1" w:styleId="Normal">
     <w:name w:val="Normal"/>
@@ -13591,7 +13633,7 @@
 </file>
 
 <file path=customXml/itemProps1.xml><?xml version="1.0" encoding="utf-8"?>
-<ds:datastoreItem xmlns:ds="http://schemas.openxmlformats.org/officeDocument/2006/customXml" ds:itemID="{F378F67F-B58E-4D52-B5BC-8FD384A0F951}">
+<ds:datastoreItem xmlns:ds="http://schemas.openxmlformats.org/officeDocument/2006/customXml" ds:itemID="{5E8DA92B-9F4F-4380-ACDB-DCA52F562C89}">
   <ds:schemaRefs>
     <ds:schemaRef ds:uri="http://schemas.openxmlformats.org/officeDocument/2006/bibliography"/>
   </ds:schemaRefs>

</xml_diff>

<commit_message>
Lançando a documentação do projeto integrador atualizado para o Github - 23/04/2026
</commit_message>
<xml_diff>
--- a/Terceiro_Semestre/Projeto_Integrador/Documentação/Modelo_Projeto_Integrador_principal.docx
+++ b/Terceiro_Semestre/Projeto_Integrador/Documentação/Modelo_Projeto_Integrador_principal.docx
@@ -3757,6 +3757,7 @@
         </w:rPr>
         <w:br/>
       </w:r>
+      <w:bookmarkStart w:id="20" w:name="_GoBack"/>
       <w:r>
         <w:rPr>
           <w:b w:val="0"/>
@@ -3767,8 +3768,8 @@
           <w:lang w:eastAsia="pt-BR"/>
         </w:rPr>
         <w:drawing>
-          <wp:inline distT="0" distB="0" distL="0" distR="0" wp14:anchorId="675E87CB" wp14:editId="136409C4">
-            <wp:extent cx="4996527" cy="3323399"/>
+          <wp:inline distT="0" distB="0" distL="0" distR="0" wp14:anchorId="675E87CB" wp14:editId="67D1DC8F">
+            <wp:extent cx="4993203" cy="3323399"/>
             <wp:effectExtent l="0" t="0" r="0" b="0"/>
             <wp:docPr id="568772802" name="drawing"/>
             <wp:cNvGraphicFramePr>
@@ -3796,7 +3797,7 @@
                   <pic:spPr>
                     <a:xfrm>
                       <a:off x="0" y="0"/>
-                      <a:ext cx="4996527" cy="3323399"/>
+                      <a:ext cx="4993203" cy="3323399"/>
                     </a:xfrm>
                     <a:prstGeom prst="rect">
                       <a:avLst/>
@@ -3808,6 +3809,7 @@
           </wp:inline>
         </w:drawing>
       </w:r>
+      <w:bookmarkEnd w:id="20"/>
       <w:r>
         <w:rPr>
           <w:i w:val="0"/>
@@ -3929,12 +3931,7 @@
         <w:t>Atores:</w:t>
       </w:r>
       <w:r>
-        <w:t xml:space="preserve"> Coordenador e responsá</w:t>
-      </w:r>
-      <w:bookmarkStart w:id="20" w:name="_GoBack"/>
-      <w:bookmarkEnd w:id="20"/>
-      <w:r>
-        <w:t>vel de TI:</w:t>
+        <w:t xml:space="preserve"> Coordenador e responsável de TI:</w:t>
       </w:r>
     </w:p>
     <w:p>
@@ -8936,7 +8933,7 @@
             <w:sz w:val="20"/>
             <w:szCs w:val="20"/>
           </w:rPr>
-          <w:t>13</w:t>
+          <w:t>25</w:t>
         </w:r>
         <w:r>
           <w:rPr>
@@ -9000,7 +8997,7 @@
             <w:sz w:val="20"/>
             <w:szCs w:val="20"/>
           </w:rPr>
-          <w:t>4</w:t>
+          <w:t>23</w:t>
         </w:r>
         <w:r>
           <w:rPr>
@@ -13633,7 +13630,7 @@
 </file>
 
 <file path=customXml/itemProps1.xml><?xml version="1.0" encoding="utf-8"?>
-<ds:datastoreItem xmlns:ds="http://schemas.openxmlformats.org/officeDocument/2006/customXml" ds:itemID="{5E8DA92B-9F4F-4380-ACDB-DCA52F562C89}">
+<ds:datastoreItem xmlns:ds="http://schemas.openxmlformats.org/officeDocument/2006/customXml" ds:itemID="{1D45D35C-69EC-4761-B029-73A3A942A5B1}">
   <ds:schemaRefs>
     <ds:schemaRef ds:uri="http://schemas.openxmlformats.org/officeDocument/2006/bibliography"/>
   </ds:schemaRefs>

</xml_diff>

<commit_message>
Enviando a documentação em PDF do projeto integrador para o github >:( - 24/04/2026
</commit_message>
<xml_diff>
--- a/Terceiro_Semestre/Projeto_Integrador/Documentação/Modelo_Projeto_Integrador_principal.docx
+++ b/Terceiro_Semestre/Projeto_Integrador/Documentação/Modelo_Projeto_Integrador_principal.docx
@@ -7,6 +7,8 @@
         <w:pStyle w:val="Default"/>
         <w:jc w:val="center"/>
       </w:pPr>
+      <w:bookmarkStart w:id="0" w:name="_GoBack"/>
+      <w:bookmarkEnd w:id="0"/>
       <w:r>
         <w:rPr>
           <w:b/>
@@ -1030,7 +1032,7 @@
           <w:rPr>
             <w:noProof/>
           </w:rPr>
-          <w:t>4</w:t>
+          <w:t>5</w:t>
         </w:r>
         <w:r>
           <w:fldChar w:fldCharType="end"/>
@@ -1098,7 +1100,7 @@
           <w:rPr>
             <w:noProof/>
           </w:rPr>
-          <w:t>6</w:t>
+          <w:t>5</w:t>
         </w:r>
         <w:r>
           <w:fldChar w:fldCharType="end"/>
@@ -1132,7 +1134,7 @@
           <w:rPr>
             <w:noProof/>
           </w:rPr>
-          <w:t>6</w:t>
+          <w:t>5</w:t>
         </w:r>
         <w:r>
           <w:fldChar w:fldCharType="end"/>
@@ -1166,7 +1168,7 @@
           <w:rPr>
             <w:noProof/>
           </w:rPr>
-          <w:t>7</w:t>
+          <w:t>6</w:t>
         </w:r>
         <w:r>
           <w:fldChar w:fldCharType="end"/>
@@ -1200,7 +1202,7 @@
           <w:rPr>
             <w:noProof/>
           </w:rPr>
-          <w:t>7</w:t>
+          <w:t>8</w:t>
         </w:r>
         <w:r>
           <w:fldChar w:fldCharType="end"/>
@@ -1234,7 +1236,7 @@
           <w:rPr>
             <w:noProof/>
           </w:rPr>
-          <w:t>7</w:t>
+          <w:t>8</w:t>
         </w:r>
         <w:r>
           <w:fldChar w:fldCharType="end"/>
@@ -1336,7 +1338,7 @@
           <w:rPr>
             <w:noProof/>
           </w:rPr>
-          <w:t>8</w:t>
+          <w:t>10</w:t>
         </w:r>
         <w:r>
           <w:fldChar w:fldCharType="end"/>
@@ -1370,7 +1372,7 @@
           <w:rPr>
             <w:noProof/>
           </w:rPr>
-          <w:t>9</w:t>
+          <w:t>11</w:t>
         </w:r>
         <w:r>
           <w:fldChar w:fldCharType="end"/>
@@ -1404,7 +1406,7 @@
           <w:rPr>
             <w:noProof/>
           </w:rPr>
-          <w:t>9</w:t>
+          <w:t>11</w:t>
         </w:r>
         <w:r>
           <w:fldChar w:fldCharType="end"/>
@@ -1441,7 +1443,7 @@
           <w:rPr>
             <w:noProof/>
           </w:rPr>
-          <w:t>9</w:t>
+          <w:t>11</w:t>
         </w:r>
         <w:r>
           <w:fldChar w:fldCharType="end"/>
@@ -1478,7 +1480,7 @@
           <w:rPr>
             <w:noProof/>
           </w:rPr>
-          <w:t>9</w:t>
+          <w:t>11</w:t>
         </w:r>
         <w:r>
           <w:fldChar w:fldCharType="end"/>
@@ -1515,7 +1517,7 @@
           <w:rPr>
             <w:noProof/>
           </w:rPr>
-          <w:t>9</w:t>
+          <w:t>11</w:t>
         </w:r>
         <w:r>
           <w:fldChar w:fldCharType="end"/>
@@ -1552,7 +1554,7 @@
           <w:rPr>
             <w:noProof/>
           </w:rPr>
-          <w:t>9</w:t>
+          <w:t>11</w:t>
         </w:r>
         <w:r>
           <w:fldChar w:fldCharType="end"/>
@@ -1589,7 +1591,7 @@
           <w:rPr>
             <w:noProof/>
           </w:rPr>
-          <w:t>9</w:t>
+          <w:t>12</w:t>
         </w:r>
         <w:r>
           <w:fldChar w:fldCharType="end"/>
@@ -1626,7 +1628,7 @@
           <w:rPr>
             <w:noProof/>
           </w:rPr>
-          <w:t>9</w:t>
+          <w:t>16</w:t>
         </w:r>
         <w:r>
           <w:fldChar w:fldCharType="end"/>
@@ -1663,7 +1665,7 @@
           <w:rPr>
             <w:noProof/>
           </w:rPr>
-          <w:t>9</w:t>
+          <w:t>16</w:t>
         </w:r>
         <w:r>
           <w:fldChar w:fldCharType="end"/>
@@ -1700,7 +1702,7 @@
           <w:rPr>
             <w:noProof/>
           </w:rPr>
-          <w:t>9</w:t>
+          <w:t>16</w:t>
         </w:r>
         <w:r>
           <w:fldChar w:fldCharType="end"/>
@@ -1737,7 +1739,7 @@
           <w:rPr>
             <w:noProof/>
           </w:rPr>
-          <w:t>9</w:t>
+          <w:t>18</w:t>
         </w:r>
         <w:r>
           <w:fldChar w:fldCharType="end"/>
@@ -1771,7 +1773,7 @@
           <w:rPr>
             <w:noProof/>
           </w:rPr>
-          <w:t>10</w:t>
+          <w:t>23</w:t>
         </w:r>
         <w:r>
           <w:fldChar w:fldCharType="end"/>
@@ -1830,7 +1832,7 @@
         <w:pStyle w:val="Ttulo1"/>
         <w:jc w:val="both"/>
       </w:pPr>
-      <w:bookmarkStart w:id="0" w:name="_Toc4818"/>
+      <w:bookmarkStart w:id="1" w:name="_Toc4818"/>
       <w:r>
         <w:lastRenderedPageBreak/>
         <w:t>1</w:t>
@@ -1839,14 +1841,14 @@
         <w:tab/>
         <w:t>INTRODUÇÃO</w:t>
       </w:r>
-      <w:bookmarkEnd w:id="0"/>
+      <w:bookmarkEnd w:id="1"/>
     </w:p>
     <w:p>
       <w:pPr>
         <w:pStyle w:val="Ttulo2"/>
         <w:jc w:val="both"/>
       </w:pPr>
-      <w:bookmarkStart w:id="1" w:name="_Toc14616"/>
+      <w:bookmarkStart w:id="2" w:name="_Toc14616"/>
       <w:r>
         <w:t>1.1</w:t>
       </w:r>
@@ -1854,7 +1856,7 @@
         <w:tab/>
         <w:t>APRESENTAÇÃO DO PROJETO</w:t>
       </w:r>
-      <w:bookmarkEnd w:id="1"/>
+      <w:bookmarkEnd w:id="2"/>
     </w:p>
     <w:p>
       <w:pPr>
@@ -1931,7 +1933,7 @@
         <w:pStyle w:val="Ttulo2"/>
         <w:jc w:val="both"/>
       </w:pPr>
-      <w:bookmarkStart w:id="2" w:name="_Toc5478"/>
+      <w:bookmarkStart w:id="3" w:name="_Toc5478"/>
       <w:r>
         <w:t>1.2</w:t>
       </w:r>
@@ -1939,7 +1941,7 @@
         <w:tab/>
         <w:t>ESCOPO DO PROJETO</w:t>
       </w:r>
-      <w:bookmarkEnd w:id="2"/>
+      <w:bookmarkEnd w:id="3"/>
     </w:p>
     <w:p>
       <w:pPr>
@@ -2043,7 +2045,7 @@
           <w:highlight w:val="yellow"/>
         </w:rPr>
       </w:pPr>
-      <w:bookmarkStart w:id="3" w:name="_Toc25614"/>
+      <w:bookmarkStart w:id="4" w:name="_Toc25614"/>
       <w:r>
         <w:t>1.3</w:t>
       </w:r>
@@ -2053,7 +2055,7 @@
       <w:r>
         <w:t>MATERIAIS DE REFERÊNCIA</w:t>
       </w:r>
-      <w:bookmarkEnd w:id="3"/>
+      <w:bookmarkEnd w:id="4"/>
     </w:p>
     <w:p>
       <w:pPr>
@@ -2145,7 +2147,7 @@
         <w:pStyle w:val="Ttulo2"/>
         <w:jc w:val="both"/>
       </w:pPr>
-      <w:bookmarkStart w:id="4" w:name="_Toc6800"/>
+      <w:bookmarkStart w:id="5" w:name="_Toc6800"/>
       <w:r>
         <w:t>1.4</w:t>
       </w:r>
@@ -2155,7 +2157,7 @@
       <w:r>
         <w:t>DEFINIÇÕES, SIGLAS E ABREVIATURAS</w:t>
       </w:r>
-      <w:bookmarkEnd w:id="4"/>
+      <w:bookmarkEnd w:id="5"/>
     </w:p>
     <w:p>
       <w:pPr>
@@ -2181,7 +2183,7 @@
           <w:szCs w:val="28"/>
         </w:rPr>
       </w:pPr>
-      <w:bookmarkStart w:id="5" w:name="_Toc26631"/>
+      <w:bookmarkStart w:id="6" w:name="_Toc26631"/>
     </w:p>
     <w:p>
       <w:pPr>
@@ -2195,14 +2197,14 @@
         <w:tab/>
         <w:t>DESCRIÇÃO GERAL DO PRODUTO</w:t>
       </w:r>
-      <w:bookmarkEnd w:id="5"/>
+      <w:bookmarkEnd w:id="6"/>
     </w:p>
     <w:p>
       <w:pPr>
         <w:pStyle w:val="Ttulo2"/>
         <w:jc w:val="both"/>
       </w:pPr>
-      <w:bookmarkStart w:id="6" w:name="_Toc25433"/>
+      <w:bookmarkStart w:id="7" w:name="_Toc25433"/>
       <w:r>
         <w:t>2.1</w:t>
       </w:r>
@@ -2210,7 +2212,7 @@
         <w:tab/>
         <w:t>FUNÇÕES DO PRODUTO</w:t>
       </w:r>
-      <w:bookmarkEnd w:id="6"/>
+      <w:bookmarkEnd w:id="7"/>
     </w:p>
     <w:p>
       <w:pPr>
@@ -2725,7 +2727,7 @@
         <w:pStyle w:val="Ttulo2"/>
         <w:jc w:val="both"/>
       </w:pPr>
-      <w:bookmarkStart w:id="7" w:name="_Toc25136"/>
+      <w:bookmarkStart w:id="8" w:name="_Toc25136"/>
       <w:r>
         <w:t>2.2</w:t>
       </w:r>
@@ -2735,7 +2737,7 @@
       <w:r>
         <w:t>INTERFACES DE USUÁRIO</w:t>
       </w:r>
-      <w:bookmarkEnd w:id="7"/>
+      <w:bookmarkEnd w:id="8"/>
     </w:p>
     <w:p>
       <w:pPr>
@@ -3025,7 +3027,7 @@
         <w:pStyle w:val="Ttulo2"/>
         <w:jc w:val="both"/>
       </w:pPr>
-      <w:bookmarkStart w:id="8" w:name="_Toc32629"/>
+      <w:bookmarkStart w:id="9" w:name="_Toc32629"/>
       <w:r>
         <w:t>2.3</w:t>
       </w:r>
@@ -3035,7 +3037,7 @@
       <w:r>
         <w:t>INTERFACES DE HARDWARE</w:t>
       </w:r>
-      <w:bookmarkEnd w:id="8"/>
+      <w:bookmarkEnd w:id="9"/>
     </w:p>
     <w:p>
       <w:pPr>
@@ -3060,7 +3062,7 @@
         <w:pStyle w:val="Ttulo2"/>
         <w:jc w:val="both"/>
       </w:pPr>
-      <w:bookmarkStart w:id="9" w:name="_Toc21948"/>
+      <w:bookmarkStart w:id="10" w:name="_Toc21948"/>
       <w:r>
         <w:t>2.4</w:t>
       </w:r>
@@ -3068,7 +3070,7 @@
         <w:tab/>
         <w:t>INTERFACES DE SOFTWARE</w:t>
       </w:r>
-      <w:bookmarkEnd w:id="9"/>
+      <w:bookmarkEnd w:id="10"/>
     </w:p>
     <w:p>
       <w:pPr>
@@ -3090,7 +3092,7 @@
         <w:pStyle w:val="Ttulo2"/>
         <w:jc w:val="both"/>
       </w:pPr>
-      <w:bookmarkStart w:id="10" w:name="_Toc5711"/>
+      <w:bookmarkStart w:id="11" w:name="_Toc5711"/>
       <w:r>
         <w:t>2.5</w:t>
       </w:r>
@@ -3098,7 +3100,7 @@
         <w:tab/>
         <w:t>INTERFACES DE COMUNICAÇÃO</w:t>
       </w:r>
-      <w:bookmarkEnd w:id="10"/>
+      <w:bookmarkEnd w:id="11"/>
     </w:p>
     <w:p>
       <w:pPr>
@@ -3126,7 +3128,7 @@
         <w:pStyle w:val="Ttulo2"/>
         <w:jc w:val="both"/>
       </w:pPr>
-      <w:bookmarkStart w:id="11" w:name="_Toc24908"/>
+      <w:bookmarkStart w:id="12" w:name="_Toc24908"/>
       <w:r>
         <w:t>2.6</w:t>
       </w:r>
@@ -3134,7 +3136,7 @@
         <w:tab/>
         <w:t>RESTRIÇÕES DE AMBIENTE</w:t>
       </w:r>
-      <w:bookmarkEnd w:id="11"/>
+      <w:bookmarkEnd w:id="12"/>
     </w:p>
     <w:p>
       <w:pPr>
@@ -3221,7 +3223,7 @@
           <w:szCs w:val="26"/>
         </w:rPr>
       </w:pPr>
-      <w:bookmarkStart w:id="12" w:name="_Toc18518"/>
+      <w:bookmarkStart w:id="13" w:name="_Toc18518"/>
       <w:r>
         <w:br w:type="page"/>
       </w:r>
@@ -3306,8 +3308,8 @@
       <w:r>
         <w:t>CRONOGRAMA</w:t>
       </w:r>
-      <w:bookmarkStart w:id="13" w:name="_Toc22143"/>
-      <w:bookmarkEnd w:id="12"/>
+      <w:bookmarkStart w:id="14" w:name="_Toc22143"/>
+      <w:bookmarkEnd w:id="13"/>
     </w:p>
     <w:p>
       <w:pPr>
@@ -3322,14 +3324,14 @@
         <w:tab/>
         <w:t>REQUISITOS</w:t>
       </w:r>
-      <w:bookmarkEnd w:id="13"/>
+      <w:bookmarkEnd w:id="14"/>
     </w:p>
     <w:p>
       <w:pPr>
         <w:pStyle w:val="Ttulo2"/>
         <w:jc w:val="both"/>
       </w:pPr>
-      <w:bookmarkStart w:id="14" w:name="_Toc14604"/>
+      <w:bookmarkStart w:id="15" w:name="_Toc14604"/>
       <w:r>
         <w:t>3.1</w:t>
       </w:r>
@@ -3337,7 +3339,7 @@
         <w:tab/>
         <w:t>ESPECÍFICOS</w:t>
       </w:r>
-      <w:bookmarkEnd w:id="14"/>
+      <w:bookmarkEnd w:id="15"/>
     </w:p>
     <w:p>
       <w:pPr>
@@ -3348,7 +3350,7 @@
           <w:iCs/>
         </w:rPr>
       </w:pPr>
-      <w:bookmarkStart w:id="15" w:name="_Toc9338"/>
+      <w:bookmarkStart w:id="16" w:name="_Toc9338"/>
       <w:r>
         <w:rPr>
           <w:i w:val="0"/>
@@ -3364,7 +3366,7 @@
         <w:tab/>
         <w:t>LINGUAGEM DE PROGRAMAÇÃO</w:t>
       </w:r>
-      <w:bookmarkEnd w:id="15"/>
+      <w:bookmarkEnd w:id="16"/>
     </w:p>
     <w:p>
       <w:pPr>
@@ -3398,7 +3400,7 @@
           <w:i w:val="0"/>
         </w:rPr>
       </w:pPr>
-      <w:bookmarkStart w:id="16" w:name="_Toc14943"/>
+      <w:bookmarkStart w:id="17" w:name="_Toc14943"/>
       <w:r>
         <w:rPr>
           <w:i w:val="0"/>
@@ -3414,7 +3416,7 @@
         </w:rPr>
         <w:t>BANCO DE DADOS</w:t>
       </w:r>
-      <w:bookmarkEnd w:id="16"/>
+      <w:bookmarkEnd w:id="17"/>
     </w:p>
     <w:p>
       <w:pPr>
@@ -3525,7 +3527,7 @@
           <w:iCs/>
         </w:rPr>
       </w:pPr>
-      <w:bookmarkStart w:id="17" w:name="_Toc31698"/>
+      <w:bookmarkStart w:id="18" w:name="_Toc31698"/>
       <w:r>
         <w:rPr>
           <w:i w:val="0"/>
@@ -3541,7 +3543,7 @@
         </w:rPr>
         <w:t>OUTRAS FERRAMENTAS DE DESENVOLVIMENTO</w:t>
       </w:r>
-      <w:bookmarkEnd w:id="17"/>
+      <w:bookmarkEnd w:id="18"/>
     </w:p>
     <w:p>
       <w:pPr>
@@ -3604,7 +3606,7 @@
           <w:i w:val="0"/>
         </w:rPr>
       </w:pPr>
-      <w:bookmarkStart w:id="18" w:name="_Toc19201"/>
+      <w:bookmarkStart w:id="19" w:name="_Toc19201"/>
       <w:r>
         <w:rPr>
           <w:i w:val="0"/>
@@ -3620,7 +3622,7 @@
         </w:rPr>
         <w:t>REQUISITOS NÃO FUNCIONAIS</w:t>
       </w:r>
-      <w:bookmarkEnd w:id="18"/>
+      <w:bookmarkEnd w:id="19"/>
     </w:p>
     <w:p>
       <w:r>
@@ -3712,7 +3714,7 @@
           <w:iCs/>
         </w:rPr>
       </w:pPr>
-      <w:bookmarkStart w:id="19" w:name="_Toc3084"/>
+      <w:bookmarkStart w:id="20" w:name="_Toc3084"/>
       <w:r>
         <w:rPr>
           <w:i w:val="0"/>
@@ -3729,7 +3731,7 @@
         </w:rPr>
         <w:t>REQUISITOS FUNCIONAIS</w:t>
       </w:r>
-      <w:bookmarkEnd w:id="19"/>
+      <w:bookmarkEnd w:id="20"/>
     </w:p>
     <w:p>
       <w:pPr>
@@ -3757,7 +3759,6 @@
         </w:rPr>
         <w:br/>
       </w:r>
-      <w:bookmarkStart w:id="20" w:name="_GoBack"/>
       <w:r>
         <w:rPr>
           <w:b w:val="0"/>
@@ -3809,7 +3810,6 @@
           </wp:inline>
         </w:drawing>
       </w:r>
-      <w:bookmarkEnd w:id="20"/>
       <w:r>
         <w:rPr>
           <w:i w:val="0"/>
@@ -8933,7 +8933,7 @@
             <w:sz w:val="20"/>
             <w:szCs w:val="20"/>
           </w:rPr>
-          <w:t>25</w:t>
+          <w:t>20</w:t>
         </w:r>
         <w:r>
           <w:rPr>
@@ -8997,7 +8997,7 @@
             <w:sz w:val="20"/>
             <w:szCs w:val="20"/>
           </w:rPr>
-          <w:t>23</w:t>
+          <w:t>4</w:t>
         </w:r>
         <w:r>
           <w:rPr>
@@ -13630,7 +13630,7 @@
 </file>
 
 <file path=customXml/itemProps1.xml><?xml version="1.0" encoding="utf-8"?>
-<ds:datastoreItem xmlns:ds="http://schemas.openxmlformats.org/officeDocument/2006/customXml" ds:itemID="{1D45D35C-69EC-4761-B029-73A3A942A5B1}">
+<ds:datastoreItem xmlns:ds="http://schemas.openxmlformats.org/officeDocument/2006/customXml" ds:itemID="{6EEAF6FF-848A-493A-931C-A1F150D435DA}">
   <ds:schemaRefs>
     <ds:schemaRef ds:uri="http://schemas.openxmlformats.org/officeDocument/2006/bibliography"/>
   </ds:schemaRefs>

</xml_diff>

<commit_message>
Atualizando a documentação (prazo final para entrega: 26/04/2026) - 25/04/2026
</commit_message>
<xml_diff>
--- a/Terceiro_Semestre/Projeto_Integrador/Documentação/Modelo_Projeto_Integrador_principal.docx
+++ b/Terceiro_Semestre/Projeto_Integrador/Documentação/Modelo_Projeto_Integrador_principal.docx
@@ -1,14 +1,12 @@
 
 <file path=word/document.xml><?xml version="1.0" encoding="utf-8"?>
-<w:document xmlns:wpc="http://schemas.microsoft.com/office/word/2010/wordprocessingCanvas" xmlns:cx="http://schemas.microsoft.com/office/drawing/2014/chartex" xmlns:mc="http://schemas.openxmlformats.org/markup-compatibility/2006" xmlns:o="urn:schemas-microsoft-com:office:office" xmlns:r="http://schemas.openxmlformats.org/officeDocument/2006/relationships" xmlns:m="http://schemas.openxmlformats.org/officeDocument/2006/math" xmlns:v="urn:schemas-microsoft-com:vml" xmlns:wp14="http://schemas.microsoft.com/office/word/2010/wordprocessingDrawing" xmlns:wp="http://schemas.openxmlformats.org/drawingml/2006/wordprocessingDrawing" xmlns:w10="urn:schemas-microsoft-com:office:word" xmlns:w="http://schemas.openxmlformats.org/wordprocessingml/2006/main" xmlns:w14="http://schemas.microsoft.com/office/word/2010/wordml" xmlns:w15="http://schemas.microsoft.com/office/word/2012/wordml" xmlns:w16se="http://schemas.microsoft.com/office/word/2015/wordml/symex" xmlns:wpg="http://schemas.microsoft.com/office/word/2010/wordprocessingGroup" xmlns:wpi="http://schemas.microsoft.com/office/word/2010/wordprocessingInk" xmlns:wne="http://schemas.microsoft.com/office/word/2006/wordml" xmlns:wps="http://schemas.microsoft.com/office/word/2010/wordprocessingShape" mc:Ignorable="w14 w15 w16se wp14">
+<w:document xmlns:wpc="http://schemas.microsoft.com/office/word/2010/wordprocessingCanvas" xmlns:cx="http://schemas.microsoft.com/office/drawing/2014/chartex" xmlns:cx1="http://schemas.microsoft.com/office/drawing/2015/9/8/chartex" xmlns:cx2="http://schemas.microsoft.com/office/drawing/2015/10/21/chartex" xmlns:cx3="http://schemas.microsoft.com/office/drawing/2016/5/9/chartex" xmlns:cx4="http://schemas.microsoft.com/office/drawing/2016/5/10/chartex" xmlns:cx5="http://schemas.microsoft.com/office/drawing/2016/5/11/chartex" xmlns:cx6="http://schemas.microsoft.com/office/drawing/2016/5/12/chartex" xmlns:cx7="http://schemas.microsoft.com/office/drawing/2016/5/13/chartex" xmlns:cx8="http://schemas.microsoft.com/office/drawing/2016/5/14/chartex" xmlns:mc="http://schemas.openxmlformats.org/markup-compatibility/2006" xmlns:aink="http://schemas.microsoft.com/office/drawing/2016/ink" xmlns:am3d="http://schemas.microsoft.com/office/drawing/2017/model3d" xmlns:o="urn:schemas-microsoft-com:office:office" xmlns:oel="http://schemas.microsoft.com/office/2019/extlst" xmlns:r="http://schemas.openxmlformats.org/officeDocument/2006/relationships" xmlns:m="http://schemas.openxmlformats.org/officeDocument/2006/math" xmlns:v="urn:schemas-microsoft-com:vml" xmlns:wp14="http://schemas.microsoft.com/office/word/2010/wordprocessingDrawing" xmlns:wp="http://schemas.openxmlformats.org/drawingml/2006/wordprocessingDrawing" xmlns:w10="urn:schemas-microsoft-com:office:word" xmlns:w="http://schemas.openxmlformats.org/wordprocessingml/2006/main" xmlns:w14="http://schemas.microsoft.com/office/word/2010/wordml" xmlns:w15="http://schemas.microsoft.com/office/word/2012/wordml" xmlns:w16cex="http://schemas.microsoft.com/office/word/2018/wordml/cex" xmlns:w16cid="http://schemas.microsoft.com/office/word/2016/wordml/cid" xmlns:w16="http://schemas.microsoft.com/office/word/2018/wordml" xmlns:w16du="http://schemas.microsoft.com/office/word/2023/wordml/word16du" xmlns:w16sdtdh="http://schemas.microsoft.com/office/word/2020/wordml/sdtdatahash" xmlns:w16sdtfl="http://schemas.microsoft.com/office/word/2024/wordml/sdtformatlock" xmlns:w16se="http://schemas.microsoft.com/office/word/2015/wordml/symex" xmlns:wpg="http://schemas.microsoft.com/office/word/2010/wordprocessingGroup" xmlns:wpi="http://schemas.microsoft.com/office/word/2010/wordprocessingInk" xmlns:wne="http://schemas.microsoft.com/office/word/2006/wordml" xmlns:wps="http://schemas.microsoft.com/office/word/2010/wordprocessingShape" mc:Ignorable="w14 w15 w16se w16cid w16 w16cex w16sdtdh w16sdtfl w16du wp14">
   <w:body>
     <w:p>
       <w:pPr>
         <w:pStyle w:val="Default"/>
         <w:jc w:val="center"/>
       </w:pPr>
-      <w:bookmarkStart w:id="0" w:name="_GoBack"/>
-      <w:bookmarkEnd w:id="0"/>
       <w:r>
         <w:rPr>
           <w:b/>
@@ -1832,7 +1830,7 @@
         <w:pStyle w:val="Ttulo1"/>
         <w:jc w:val="both"/>
       </w:pPr>
-      <w:bookmarkStart w:id="1" w:name="_Toc4818"/>
+      <w:bookmarkStart w:id="0" w:name="_Toc4818"/>
       <w:r>
         <w:lastRenderedPageBreak/>
         <w:t>1</w:t>
@@ -1841,14 +1839,14 @@
         <w:tab/>
         <w:t>INTRODUÇÃO</w:t>
       </w:r>
-      <w:bookmarkEnd w:id="1"/>
+      <w:bookmarkEnd w:id="0"/>
     </w:p>
     <w:p>
       <w:pPr>
         <w:pStyle w:val="Ttulo2"/>
         <w:jc w:val="both"/>
       </w:pPr>
-      <w:bookmarkStart w:id="2" w:name="_Toc14616"/>
+      <w:bookmarkStart w:id="1" w:name="_Toc14616"/>
       <w:r>
         <w:t>1.1</w:t>
       </w:r>
@@ -1856,7 +1854,7 @@
         <w:tab/>
         <w:t>APRESENTAÇÃO DO PROJETO</w:t>
       </w:r>
-      <w:bookmarkEnd w:id="2"/>
+      <w:bookmarkEnd w:id="1"/>
     </w:p>
     <w:p>
       <w:pPr>
@@ -1933,7 +1931,7 @@
         <w:pStyle w:val="Ttulo2"/>
         <w:jc w:val="both"/>
       </w:pPr>
-      <w:bookmarkStart w:id="3" w:name="_Toc5478"/>
+      <w:bookmarkStart w:id="2" w:name="_Toc5478"/>
       <w:r>
         <w:t>1.2</w:t>
       </w:r>
@@ -1941,7 +1939,7 @@
         <w:tab/>
         <w:t>ESCOPO DO PROJETO</w:t>
       </w:r>
-      <w:bookmarkEnd w:id="3"/>
+      <w:bookmarkEnd w:id="2"/>
     </w:p>
     <w:p>
       <w:pPr>
@@ -2045,7 +2043,7 @@
           <w:highlight w:val="yellow"/>
         </w:rPr>
       </w:pPr>
-      <w:bookmarkStart w:id="4" w:name="_Toc25614"/>
+      <w:bookmarkStart w:id="3" w:name="_Toc25614"/>
       <w:r>
         <w:t>1.3</w:t>
       </w:r>
@@ -2055,7 +2053,7 @@
       <w:r>
         <w:t>MATERIAIS DE REFERÊNCIA</w:t>
       </w:r>
-      <w:bookmarkEnd w:id="4"/>
+      <w:bookmarkEnd w:id="3"/>
     </w:p>
     <w:p>
       <w:pPr>
@@ -2147,7 +2145,7 @@
         <w:pStyle w:val="Ttulo2"/>
         <w:jc w:val="both"/>
       </w:pPr>
-      <w:bookmarkStart w:id="5" w:name="_Toc6800"/>
+      <w:bookmarkStart w:id="4" w:name="_Toc6800"/>
       <w:r>
         <w:t>1.4</w:t>
       </w:r>
@@ -2157,7 +2155,7 @@
       <w:r>
         <w:t>DEFINIÇÕES, SIGLAS E ABREVIATURAS</w:t>
       </w:r>
-      <w:bookmarkEnd w:id="5"/>
+      <w:bookmarkEnd w:id="4"/>
     </w:p>
     <w:p>
       <w:pPr>
@@ -2183,7 +2181,7 @@
           <w:szCs w:val="28"/>
         </w:rPr>
       </w:pPr>
-      <w:bookmarkStart w:id="6" w:name="_Toc26631"/>
+      <w:bookmarkStart w:id="5" w:name="_Toc26631"/>
     </w:p>
     <w:p>
       <w:pPr>
@@ -2197,14 +2195,14 @@
         <w:tab/>
         <w:t>DESCRIÇÃO GERAL DO PRODUTO</w:t>
       </w:r>
-      <w:bookmarkEnd w:id="6"/>
+      <w:bookmarkEnd w:id="5"/>
     </w:p>
     <w:p>
       <w:pPr>
         <w:pStyle w:val="Ttulo2"/>
         <w:jc w:val="both"/>
       </w:pPr>
-      <w:bookmarkStart w:id="7" w:name="_Toc25433"/>
+      <w:bookmarkStart w:id="6" w:name="_Toc25433"/>
       <w:r>
         <w:t>2.1</w:t>
       </w:r>
@@ -2212,7 +2210,7 @@
         <w:tab/>
         <w:t>FUNÇÕES DO PRODUTO</w:t>
       </w:r>
-      <w:bookmarkEnd w:id="7"/>
+      <w:bookmarkEnd w:id="6"/>
     </w:p>
     <w:p>
       <w:pPr>
@@ -2727,7 +2725,7 @@
         <w:pStyle w:val="Ttulo2"/>
         <w:jc w:val="both"/>
       </w:pPr>
-      <w:bookmarkStart w:id="8" w:name="_Toc25136"/>
+      <w:bookmarkStart w:id="7" w:name="_Toc25136"/>
       <w:r>
         <w:t>2.2</w:t>
       </w:r>
@@ -2737,7 +2735,7 @@
       <w:r>
         <w:t>INTERFACES DE USUÁRIO</w:t>
       </w:r>
-      <w:bookmarkEnd w:id="8"/>
+      <w:bookmarkEnd w:id="7"/>
     </w:p>
     <w:p>
       <w:pPr>
@@ -3027,7 +3025,7 @@
         <w:pStyle w:val="Ttulo2"/>
         <w:jc w:val="both"/>
       </w:pPr>
-      <w:bookmarkStart w:id="9" w:name="_Toc32629"/>
+      <w:bookmarkStart w:id="8" w:name="_Toc32629"/>
       <w:r>
         <w:t>2.3</w:t>
       </w:r>
@@ -3037,7 +3035,7 @@
       <w:r>
         <w:t>INTERFACES DE HARDWARE</w:t>
       </w:r>
-      <w:bookmarkEnd w:id="9"/>
+      <w:bookmarkEnd w:id="8"/>
     </w:p>
     <w:p>
       <w:pPr>
@@ -3062,7 +3060,7 @@
         <w:pStyle w:val="Ttulo2"/>
         <w:jc w:val="both"/>
       </w:pPr>
-      <w:bookmarkStart w:id="10" w:name="_Toc21948"/>
+      <w:bookmarkStart w:id="9" w:name="_Toc21948"/>
       <w:r>
         <w:t>2.4</w:t>
       </w:r>
@@ -3070,7 +3068,7 @@
         <w:tab/>
         <w:t>INTERFACES DE SOFTWARE</w:t>
       </w:r>
-      <w:bookmarkEnd w:id="10"/>
+      <w:bookmarkEnd w:id="9"/>
     </w:p>
     <w:p>
       <w:pPr>
@@ -3092,7 +3090,7 @@
         <w:pStyle w:val="Ttulo2"/>
         <w:jc w:val="both"/>
       </w:pPr>
-      <w:bookmarkStart w:id="11" w:name="_Toc5711"/>
+      <w:bookmarkStart w:id="10" w:name="_Toc5711"/>
       <w:r>
         <w:t>2.5</w:t>
       </w:r>
@@ -3100,7 +3098,7 @@
         <w:tab/>
         <w:t>INTERFACES DE COMUNICAÇÃO</w:t>
       </w:r>
-      <w:bookmarkEnd w:id="11"/>
+      <w:bookmarkEnd w:id="10"/>
     </w:p>
     <w:p>
       <w:pPr>
@@ -3128,7 +3126,7 @@
         <w:pStyle w:val="Ttulo2"/>
         <w:jc w:val="both"/>
       </w:pPr>
-      <w:bookmarkStart w:id="12" w:name="_Toc24908"/>
+      <w:bookmarkStart w:id="11" w:name="_Toc24908"/>
       <w:r>
         <w:t>2.6</w:t>
       </w:r>
@@ -3136,7 +3134,7 @@
         <w:tab/>
         <w:t>RESTRIÇÕES DE AMBIENTE</w:t>
       </w:r>
-      <w:bookmarkEnd w:id="12"/>
+      <w:bookmarkEnd w:id="11"/>
     </w:p>
     <w:p>
       <w:pPr>
@@ -3223,7 +3221,7 @@
           <w:szCs w:val="26"/>
         </w:rPr>
       </w:pPr>
-      <w:bookmarkStart w:id="13" w:name="_Toc18518"/>
+      <w:bookmarkStart w:id="12" w:name="_Toc18518"/>
       <w:r>
         <w:br w:type="page"/>
       </w:r>
@@ -3308,8 +3306,8 @@
       <w:r>
         <w:t>CRONOGRAMA</w:t>
       </w:r>
-      <w:bookmarkStart w:id="14" w:name="_Toc22143"/>
-      <w:bookmarkEnd w:id="13"/>
+      <w:bookmarkStart w:id="13" w:name="_Toc22143"/>
+      <w:bookmarkEnd w:id="12"/>
     </w:p>
     <w:p>
       <w:pPr>
@@ -3324,14 +3322,14 @@
         <w:tab/>
         <w:t>REQUISITOS</w:t>
       </w:r>
-      <w:bookmarkEnd w:id="14"/>
+      <w:bookmarkEnd w:id="13"/>
     </w:p>
     <w:p>
       <w:pPr>
         <w:pStyle w:val="Ttulo2"/>
         <w:jc w:val="both"/>
       </w:pPr>
-      <w:bookmarkStart w:id="15" w:name="_Toc14604"/>
+      <w:bookmarkStart w:id="14" w:name="_Toc14604"/>
       <w:r>
         <w:t>3.1</w:t>
       </w:r>
@@ -3339,7 +3337,7 @@
         <w:tab/>
         <w:t>ESPECÍFICOS</w:t>
       </w:r>
-      <w:bookmarkEnd w:id="15"/>
+      <w:bookmarkEnd w:id="14"/>
     </w:p>
     <w:p>
       <w:pPr>
@@ -3350,7 +3348,7 @@
           <w:iCs/>
         </w:rPr>
       </w:pPr>
-      <w:bookmarkStart w:id="16" w:name="_Toc9338"/>
+      <w:bookmarkStart w:id="15" w:name="_Toc9338"/>
       <w:r>
         <w:rPr>
           <w:i w:val="0"/>
@@ -3366,7 +3364,7 @@
         <w:tab/>
         <w:t>LINGUAGEM DE PROGRAMAÇÃO</w:t>
       </w:r>
-      <w:bookmarkEnd w:id="16"/>
+      <w:bookmarkEnd w:id="15"/>
     </w:p>
     <w:p>
       <w:pPr>
@@ -3400,7 +3398,7 @@
           <w:i w:val="0"/>
         </w:rPr>
       </w:pPr>
-      <w:bookmarkStart w:id="17" w:name="_Toc14943"/>
+      <w:bookmarkStart w:id="16" w:name="_Toc14943"/>
       <w:r>
         <w:rPr>
           <w:i w:val="0"/>
@@ -3416,7 +3414,7 @@
         </w:rPr>
         <w:t>BANCO DE DADOS</w:t>
       </w:r>
-      <w:bookmarkEnd w:id="17"/>
+      <w:bookmarkEnd w:id="16"/>
     </w:p>
     <w:p>
       <w:pPr>
@@ -3527,7 +3525,7 @@
           <w:iCs/>
         </w:rPr>
       </w:pPr>
-      <w:bookmarkStart w:id="18" w:name="_Toc31698"/>
+      <w:bookmarkStart w:id="17" w:name="_Toc31698"/>
       <w:r>
         <w:rPr>
           <w:i w:val="0"/>
@@ -3543,7 +3541,7 @@
         </w:rPr>
         <w:t>OUTRAS FERRAMENTAS DE DESENVOLVIMENTO</w:t>
       </w:r>
-      <w:bookmarkEnd w:id="18"/>
+      <w:bookmarkEnd w:id="17"/>
     </w:p>
     <w:p>
       <w:pPr>
@@ -3606,7 +3604,7 @@
           <w:i w:val="0"/>
         </w:rPr>
       </w:pPr>
-      <w:bookmarkStart w:id="19" w:name="_Toc19201"/>
+      <w:bookmarkStart w:id="18" w:name="_Toc19201"/>
       <w:r>
         <w:rPr>
           <w:i w:val="0"/>
@@ -3622,7 +3620,7 @@
         </w:rPr>
         <w:t>REQUISITOS NÃO FUNCIONAIS</w:t>
       </w:r>
-      <w:bookmarkEnd w:id="19"/>
+      <w:bookmarkEnd w:id="18"/>
     </w:p>
     <w:p>
       <w:r>
@@ -3714,7 +3712,7 @@
           <w:iCs/>
         </w:rPr>
       </w:pPr>
-      <w:bookmarkStart w:id="20" w:name="_Toc3084"/>
+      <w:bookmarkStart w:id="19" w:name="_Toc3084"/>
       <w:r>
         <w:rPr>
           <w:i w:val="0"/>
@@ -3731,7 +3729,7 @@
         </w:rPr>
         <w:t>REQUISITOS FUNCIONAIS</w:t>
       </w:r>
-      <w:bookmarkEnd w:id="20"/>
+      <w:bookmarkEnd w:id="19"/>
     </w:p>
     <w:p>
       <w:pPr>
@@ -5139,7 +5137,7 @@
           <w:i w:val="0"/>
         </w:rPr>
       </w:pPr>
-      <w:bookmarkStart w:id="21" w:name="_Toc16793"/>
+      <w:bookmarkStart w:id="20" w:name="_Toc16793"/>
       <w:r>
         <w:rPr>
           <w:i w:val="0"/>
@@ -5155,7 +5153,7 @@
         </w:rPr>
         <w:t>REQUISITOS DE BANCO DE DADOS</w:t>
       </w:r>
-      <w:bookmarkEnd w:id="21"/>
+      <w:bookmarkEnd w:id="20"/>
     </w:p>
     <w:p>
       <w:pPr>
@@ -5166,7 +5164,7 @@
           <w:iCs/>
         </w:rPr>
       </w:pPr>
-      <w:bookmarkStart w:id="22" w:name="_Toc27034"/>
+      <w:bookmarkStart w:id="21" w:name="_Toc27034"/>
       <w:r>
         <w:rPr>
           <w:i w:val="0"/>
@@ -5182,7 +5180,7 @@
         </w:rPr>
         <w:t>MODELO FÍSICO E LÓGICO DA BASE DE DADOS</w:t>
       </w:r>
-      <w:bookmarkEnd w:id="22"/>
+      <w:bookmarkEnd w:id="21"/>
     </w:p>
     <w:p>
       <w:pPr>
@@ -5270,7 +5268,7 @@
           <w:i w:val="0"/>
         </w:rPr>
       </w:pPr>
-      <w:bookmarkStart w:id="23" w:name="_Toc16266"/>
+      <w:bookmarkStart w:id="22" w:name="_Toc16266"/>
       <w:r>
         <w:rPr>
           <w:i w:val="0"/>
@@ -5286,7 +5284,7 @@
         </w:rPr>
         <w:t>DICIONÁRIO DE DADOS</w:t>
       </w:r>
-      <w:bookmarkEnd w:id="23"/>
+      <w:bookmarkEnd w:id="22"/>
     </w:p>
     <w:p>
       <w:pPr>
@@ -5310,7 +5308,7 @@
           <w:lang w:eastAsia="pt-BR"/>
         </w:rPr>
         <w:drawing>
-          <wp:inline distT="0" distB="0" distL="0" distR="0" wp14:anchorId="2EA7A7F6" wp14:editId="2CB18543">
+          <wp:inline distT="0" distB="0" distL="0" distR="0" wp14:anchorId="2EA7A7F6" wp14:editId="4FA7F98D">
             <wp:extent cx="5839814" cy="1418493"/>
             <wp:effectExtent l="0" t="0" r="0" b="0"/>
             <wp:docPr id="2" name="Imagem 2"/>
@@ -5382,9 +5380,9 @@
           <w:lang w:eastAsia="pt-BR"/>
         </w:rPr>
         <w:drawing>
-          <wp:inline distT="0" distB="0" distL="0" distR="0" wp14:anchorId="32AD5C31" wp14:editId="7C35880E">
-            <wp:extent cx="5737189" cy="1154723"/>
-            <wp:effectExtent l="0" t="0" r="0" b="7620"/>
+          <wp:inline distT="0" distB="0" distL="0" distR="0" wp14:anchorId="32AD5C31" wp14:editId="4C4A0B80">
+            <wp:extent cx="5769408" cy="1155829"/>
+            <wp:effectExtent l="0" t="0" r="3175" b="6350"/>
             <wp:docPr id="5" name="Imagem 5"/>
             <wp:cNvGraphicFramePr>
               <a:graphicFrameLocks xmlns:a="http://schemas.openxmlformats.org/drawingml/2006/main" noChangeAspect="1"/>
@@ -5411,7 +5409,7 @@
                   <pic:spPr>
                     <a:xfrm>
                       <a:off x="0" y="0"/>
-                      <a:ext cx="5769408" cy="1161208"/>
+                      <a:ext cx="5769408" cy="1155829"/>
                     </a:xfrm>
                     <a:prstGeom prst="rect">
                       <a:avLst/>
@@ -5549,7 +5547,7 @@
           <w:lang w:eastAsia="pt-BR"/>
         </w:rPr>
         <w:drawing>
-          <wp:inline distT="0" distB="0" distL="0" distR="0" wp14:anchorId="5A0A9D17" wp14:editId="680EFD47">
+          <wp:inline distT="0" distB="0" distL="0" distR="0" wp14:anchorId="5A0A9D17" wp14:editId="7384E4CA">
             <wp:extent cx="5755479" cy="773723"/>
             <wp:effectExtent l="0" t="0" r="0" b="7620"/>
             <wp:docPr id="6" name="Imagem 6"/>
@@ -5620,7 +5618,7 @@
           <w:lang w:eastAsia="pt-BR"/>
         </w:rPr>
         <w:drawing>
-          <wp:inline distT="0" distB="0" distL="0" distR="0" wp14:anchorId="61B11120" wp14:editId="5210C2D3">
+          <wp:inline distT="0" distB="0" distL="0" distR="0" wp14:anchorId="61B11120" wp14:editId="2ED9C5C5">
             <wp:extent cx="5749743" cy="914400"/>
             <wp:effectExtent l="0" t="0" r="3810" b="0"/>
             <wp:docPr id="7" name="Imagem 7"/>
@@ -5698,7 +5696,7 @@
           <w:lang w:eastAsia="pt-BR"/>
         </w:rPr>
         <w:drawing>
-          <wp:inline distT="0" distB="0" distL="0" distR="0" wp14:anchorId="4DC00A87" wp14:editId="40CEA15A">
+          <wp:inline distT="0" distB="0" distL="0" distR="0" wp14:anchorId="4DC00A87" wp14:editId="0F6EF5D6">
             <wp:extent cx="5752398" cy="1453661"/>
             <wp:effectExtent l="0" t="0" r="1270" b="0"/>
             <wp:docPr id="8" name="Imagem 8"/>
@@ -5783,7 +5781,7 @@
           <w:lang w:eastAsia="pt-BR"/>
         </w:rPr>
         <w:drawing>
-          <wp:inline distT="0" distB="0" distL="0" distR="0" wp14:anchorId="6EF7DC13" wp14:editId="1625BCF4">
+          <wp:inline distT="0" distB="0" distL="0" distR="0" wp14:anchorId="6EF7DC13" wp14:editId="2E2D003D">
             <wp:extent cx="5788489" cy="574430"/>
             <wp:effectExtent l="0" t="0" r="3175" b="0"/>
             <wp:docPr id="9" name="Imagem 9"/>
@@ -5868,7 +5866,7 @@
           <w:lang w:eastAsia="pt-BR"/>
         </w:rPr>
         <w:drawing>
-          <wp:inline distT="0" distB="0" distL="0" distR="0" wp14:anchorId="0FA3CA38" wp14:editId="0B069243">
+          <wp:inline distT="0" distB="0" distL="0" distR="0" wp14:anchorId="0FA3CA38" wp14:editId="6090CD9E">
             <wp:extent cx="5773542" cy="580292"/>
             <wp:effectExtent l="0" t="0" r="0" b="0"/>
             <wp:docPr id="10" name="Imagem 10"/>
@@ -5920,7 +5918,7 @@
           <w:iCs/>
         </w:rPr>
       </w:pPr>
-      <w:bookmarkStart w:id="24" w:name="_Toc7182"/>
+      <w:bookmarkStart w:id="23" w:name="_Toc7182"/>
       <w:r>
         <w:rPr>
           <w:i w:val="0"/>
@@ -5936,7 +5934,7 @@
         <w:tab/>
         <w:t>SCRIPTS DE CRIAÇÃO DE BANCO DE DADOS E TABELAS</w:t>
       </w:r>
-      <w:bookmarkEnd w:id="24"/>
+      <w:bookmarkEnd w:id="23"/>
     </w:p>
     <w:p>
       <w:pPr>
@@ -6325,7 +6323,31 @@
         <w:rPr>
           <w:lang w:val="en-US"/>
         </w:rPr>
-        <w:t>re INTEGER NOT NULL UNIQUE CHECK (re &gt; 0),</w:t>
+        <w:t xml:space="preserve">re </w:t>
+      </w:r>
+      <w:r>
+        <w:rPr>
+          <w:lang w:val="en-US"/>
+        </w:rPr>
+        <w:t>VARCHAR(10)</w:t>
+      </w:r>
+      <w:r>
+        <w:rPr>
+          <w:lang w:val="en-US"/>
+        </w:rPr>
+        <w:t xml:space="preserve"> NO</w:t>
+      </w:r>
+      <w:r>
+        <w:rPr>
+          <w:lang w:val="en-US"/>
+        </w:rPr>
+        <w:t>T NULL UNIQUE</w:t>
+      </w:r>
+      <w:r>
+        <w:rPr>
+          <w:lang w:val="en-US"/>
+        </w:rPr>
+        <w:t>,</w:t>
       </w:r>
       <w:r>
         <w:rPr>
@@ -8419,21 +8441,21 @@
         <w:pStyle w:val="Ttulo1"/>
         <w:jc w:val="center"/>
       </w:pPr>
-      <w:bookmarkStart w:id="25" w:name="_Toc21242"/>
+      <w:bookmarkStart w:id="24" w:name="_Toc21242"/>
       <w:r>
         <w:lastRenderedPageBreak/>
         <w:t>ANEXOS</w:t>
       </w:r>
-      <w:bookmarkEnd w:id="25"/>
+      <w:bookmarkEnd w:id="24"/>
     </w:p>
     <w:p/>
     <w:p>
-      <w:bookmarkStart w:id="26" w:name="Ata_1"/>
+      <w:bookmarkStart w:id="25" w:name="Ata_1"/>
       <w:r>
         <w:t>Ata 1</w:t>
       </w:r>
     </w:p>
-    <w:bookmarkEnd w:id="26"/>
+    <w:bookmarkEnd w:id="25"/>
     <w:p>
       <w:pPr>
         <w:jc w:val="both"/>
@@ -8491,12 +8513,12 @@
       </w:r>
     </w:p>
     <w:p>
-      <w:bookmarkStart w:id="27" w:name="Ata_2"/>
+      <w:bookmarkStart w:id="26" w:name="Ata_2"/>
       <w:r>
         <w:t>Ata 2</w:t>
       </w:r>
     </w:p>
-    <w:bookmarkEnd w:id="27"/>
+    <w:bookmarkEnd w:id="26"/>
     <w:p>
       <w:pPr>
         <w:jc w:val="both"/>
@@ -8572,7 +8594,7 @@
       <w:pPr>
         <w:jc w:val="both"/>
       </w:pPr>
-      <w:bookmarkStart w:id="28" w:name="Ata_3"/>
+      <w:bookmarkStart w:id="27" w:name="Ata_3"/>
       <w:r>
         <w:t>Ata</w:t>
       </w:r>
@@ -8580,7 +8602,7 @@
         <w:t xml:space="preserve"> 3</w:t>
       </w:r>
     </w:p>
-    <w:bookmarkEnd w:id="28"/>
+    <w:bookmarkEnd w:id="27"/>
     <w:p>
       <w:pPr>
         <w:jc w:val="both"/>
@@ -8637,12 +8659,12 @@
       <w:pPr>
         <w:jc w:val="both"/>
       </w:pPr>
-      <w:bookmarkStart w:id="29" w:name="Ata_4"/>
+      <w:bookmarkStart w:id="28" w:name="Ata_4"/>
       <w:r>
         <w:t>Ata 4</w:t>
       </w:r>
     </w:p>
-    <w:bookmarkEnd w:id="29"/>
+    <w:bookmarkEnd w:id="28"/>
     <w:p>
       <w:pPr>
         <w:jc w:val="both"/>
@@ -8699,12 +8721,12 @@
     <w:p/>
     <w:p/>
     <w:p>
-      <w:bookmarkStart w:id="30" w:name="Ata_5"/>
+      <w:bookmarkStart w:id="29" w:name="Ata_5"/>
       <w:r>
         <w:t>Ata 5</w:t>
       </w:r>
     </w:p>
-    <w:bookmarkEnd w:id="30"/>
+    <w:bookmarkEnd w:id="29"/>
     <w:p>
       <w:r>
         <w:rPr>
@@ -8712,7 +8734,7 @@
           <w:lang w:eastAsia="pt-BR"/>
         </w:rPr>
         <w:drawing>
-          <wp:inline distT="0" distB="0" distL="0" distR="0" wp14:anchorId="7D1B9FBA" wp14:editId="1356FBCD">
+          <wp:inline distT="0" distB="0" distL="0" distR="0" wp14:anchorId="7D1B9FBA" wp14:editId="307DAE34">
             <wp:extent cx="2881439" cy="4064751"/>
             <wp:effectExtent l="0" t="0" r="0" b="0"/>
             <wp:docPr id="1726782481" name="Imagem 2"/>
@@ -8815,7 +8837,7 @@
 </file>
 
 <file path=word/endnotes.xml><?xml version="1.0" encoding="utf-8"?>
-<w:endnotes xmlns:wpc="http://schemas.microsoft.com/office/word/2010/wordprocessingCanvas" xmlns:cx="http://schemas.microsoft.com/office/drawing/2014/chartex" xmlns:mc="http://schemas.openxmlformats.org/markup-compatibility/2006" xmlns:o="urn:schemas-microsoft-com:office:office" xmlns:r="http://schemas.openxmlformats.org/officeDocument/2006/relationships" xmlns:m="http://schemas.openxmlformats.org/officeDocument/2006/math" xmlns:v="urn:schemas-microsoft-com:vml" xmlns:wp14="http://schemas.microsoft.com/office/word/2010/wordprocessingDrawing" xmlns:wp="http://schemas.openxmlformats.org/drawingml/2006/wordprocessingDrawing" xmlns:w10="urn:schemas-microsoft-com:office:word" xmlns:w="http://schemas.openxmlformats.org/wordprocessingml/2006/main" xmlns:w14="http://schemas.microsoft.com/office/word/2010/wordml" xmlns:w15="http://schemas.microsoft.com/office/word/2012/wordml" xmlns:w16se="http://schemas.microsoft.com/office/word/2015/wordml/symex" xmlns:wpg="http://schemas.microsoft.com/office/word/2010/wordprocessingGroup" xmlns:wpi="http://schemas.microsoft.com/office/word/2010/wordprocessingInk" xmlns:wne="http://schemas.microsoft.com/office/word/2006/wordml" xmlns:wps="http://schemas.microsoft.com/office/word/2010/wordprocessingShape" mc:Ignorable="w14 w15 w16se wp14">
+<w:endnotes xmlns:wpc="http://schemas.microsoft.com/office/word/2010/wordprocessingCanvas" xmlns:cx="http://schemas.microsoft.com/office/drawing/2014/chartex" xmlns:cx1="http://schemas.microsoft.com/office/drawing/2015/9/8/chartex" xmlns:cx2="http://schemas.microsoft.com/office/drawing/2015/10/21/chartex" xmlns:cx3="http://schemas.microsoft.com/office/drawing/2016/5/9/chartex" xmlns:cx4="http://schemas.microsoft.com/office/drawing/2016/5/10/chartex" xmlns:cx5="http://schemas.microsoft.com/office/drawing/2016/5/11/chartex" xmlns:cx6="http://schemas.microsoft.com/office/drawing/2016/5/12/chartex" xmlns:cx7="http://schemas.microsoft.com/office/drawing/2016/5/13/chartex" xmlns:cx8="http://schemas.microsoft.com/office/drawing/2016/5/14/chartex" xmlns:mc="http://schemas.openxmlformats.org/markup-compatibility/2006" xmlns:aink="http://schemas.microsoft.com/office/drawing/2016/ink" xmlns:am3d="http://schemas.microsoft.com/office/drawing/2017/model3d" xmlns:o="urn:schemas-microsoft-com:office:office" xmlns:oel="http://schemas.microsoft.com/office/2019/extlst" xmlns:r="http://schemas.openxmlformats.org/officeDocument/2006/relationships" xmlns:m="http://schemas.openxmlformats.org/officeDocument/2006/math" xmlns:v="urn:schemas-microsoft-com:vml" xmlns:wp14="http://schemas.microsoft.com/office/word/2010/wordprocessingDrawing" xmlns:wp="http://schemas.openxmlformats.org/drawingml/2006/wordprocessingDrawing" xmlns:w10="urn:schemas-microsoft-com:office:word" xmlns:w="http://schemas.openxmlformats.org/wordprocessingml/2006/main" xmlns:w14="http://schemas.microsoft.com/office/word/2010/wordml" xmlns:w15="http://schemas.microsoft.com/office/word/2012/wordml" xmlns:w16cex="http://schemas.microsoft.com/office/word/2018/wordml/cex" xmlns:w16cid="http://schemas.microsoft.com/office/word/2016/wordml/cid" xmlns:w16="http://schemas.microsoft.com/office/word/2018/wordml" xmlns:w16du="http://schemas.microsoft.com/office/word/2023/wordml/word16du" xmlns:w16sdtdh="http://schemas.microsoft.com/office/word/2020/wordml/sdtdatahash" xmlns:w16sdtfl="http://schemas.microsoft.com/office/word/2024/wordml/sdtformatlock" xmlns:w16se="http://schemas.microsoft.com/office/word/2015/wordml/symex" xmlns:wpg="http://schemas.microsoft.com/office/word/2010/wordprocessingGroup" xmlns:wpi="http://schemas.microsoft.com/office/word/2010/wordprocessingInk" xmlns:wne="http://schemas.microsoft.com/office/word/2006/wordml" xmlns:wps="http://schemas.microsoft.com/office/word/2010/wordprocessingShape" mc:Ignorable="w14 w15 w16se w16cid w16 w16cex w16sdtdh w16sdtfl w16du wp14">
   <w:endnote w:type="separator" w:id="-1">
     <w:p>
       <w:pPr>
@@ -8840,7 +8862,7 @@
 </file>
 
 <file path=word/footer1.xml><?xml version="1.0" encoding="utf-8"?>
-<w:ftr xmlns:wpc="http://schemas.microsoft.com/office/word/2010/wordprocessingCanvas" xmlns:cx="http://schemas.microsoft.com/office/drawing/2014/chartex" xmlns:mc="http://schemas.openxmlformats.org/markup-compatibility/2006" xmlns:o="urn:schemas-microsoft-com:office:office" xmlns:r="http://schemas.openxmlformats.org/officeDocument/2006/relationships" xmlns:m="http://schemas.openxmlformats.org/officeDocument/2006/math" xmlns:v="urn:schemas-microsoft-com:vml" xmlns:wp14="http://schemas.microsoft.com/office/word/2010/wordprocessingDrawing" xmlns:wp="http://schemas.openxmlformats.org/drawingml/2006/wordprocessingDrawing" xmlns:w10="urn:schemas-microsoft-com:office:word" xmlns:w="http://schemas.openxmlformats.org/wordprocessingml/2006/main" xmlns:w14="http://schemas.microsoft.com/office/word/2010/wordml" xmlns:w15="http://schemas.microsoft.com/office/word/2012/wordml" xmlns:w16se="http://schemas.microsoft.com/office/word/2015/wordml/symex" xmlns:wpg="http://schemas.microsoft.com/office/word/2010/wordprocessingGroup" xmlns:wpi="http://schemas.microsoft.com/office/word/2010/wordprocessingInk" xmlns:wne="http://schemas.microsoft.com/office/word/2006/wordml" xmlns:wps="http://schemas.microsoft.com/office/word/2010/wordprocessingShape" mc:Ignorable="w14 w15 w16se wp14">
+<w:ftr xmlns:wpc="http://schemas.microsoft.com/office/word/2010/wordprocessingCanvas" xmlns:cx="http://schemas.microsoft.com/office/drawing/2014/chartex" xmlns:cx1="http://schemas.microsoft.com/office/drawing/2015/9/8/chartex" xmlns:cx2="http://schemas.microsoft.com/office/drawing/2015/10/21/chartex" xmlns:cx3="http://schemas.microsoft.com/office/drawing/2016/5/9/chartex" xmlns:cx4="http://schemas.microsoft.com/office/drawing/2016/5/10/chartex" xmlns:cx5="http://schemas.microsoft.com/office/drawing/2016/5/11/chartex" xmlns:cx6="http://schemas.microsoft.com/office/drawing/2016/5/12/chartex" xmlns:cx7="http://schemas.microsoft.com/office/drawing/2016/5/13/chartex" xmlns:cx8="http://schemas.microsoft.com/office/drawing/2016/5/14/chartex" xmlns:mc="http://schemas.openxmlformats.org/markup-compatibility/2006" xmlns:aink="http://schemas.microsoft.com/office/drawing/2016/ink" xmlns:am3d="http://schemas.microsoft.com/office/drawing/2017/model3d" xmlns:o="urn:schemas-microsoft-com:office:office" xmlns:oel="http://schemas.microsoft.com/office/2019/extlst" xmlns:r="http://schemas.openxmlformats.org/officeDocument/2006/relationships" xmlns:m="http://schemas.openxmlformats.org/officeDocument/2006/math" xmlns:v="urn:schemas-microsoft-com:vml" xmlns:wp14="http://schemas.microsoft.com/office/word/2010/wordprocessingDrawing" xmlns:wp="http://schemas.openxmlformats.org/drawingml/2006/wordprocessingDrawing" xmlns:w10="urn:schemas-microsoft-com:office:word" xmlns:w="http://schemas.openxmlformats.org/wordprocessingml/2006/main" xmlns:w14="http://schemas.microsoft.com/office/word/2010/wordml" xmlns:w15="http://schemas.microsoft.com/office/word/2012/wordml" xmlns:w16cex="http://schemas.microsoft.com/office/word/2018/wordml/cex" xmlns:w16cid="http://schemas.microsoft.com/office/word/2016/wordml/cid" xmlns:w16="http://schemas.microsoft.com/office/word/2018/wordml" xmlns:w16du="http://schemas.microsoft.com/office/word/2023/wordml/word16du" xmlns:w16sdtdh="http://schemas.microsoft.com/office/word/2020/wordml/sdtdatahash" xmlns:w16sdtfl="http://schemas.microsoft.com/office/word/2024/wordml/sdtformatlock" xmlns:w16se="http://schemas.microsoft.com/office/word/2015/wordml/symex" xmlns:wpg="http://schemas.microsoft.com/office/word/2010/wordprocessingGroup" xmlns:wpi="http://schemas.microsoft.com/office/word/2010/wordprocessingInk" xmlns:wne="http://schemas.microsoft.com/office/word/2006/wordml" xmlns:wps="http://schemas.microsoft.com/office/word/2010/wordprocessingShape" mc:Ignorable="w14 w15 w16se w16cid w16 w16cex w16sdtdh w16sdtfl w16du wp14">
   <w:p>
     <w:pPr>
       <w:pStyle w:val="Rodap"/>
@@ -8850,7 +8872,7 @@
 </file>
 
 <file path=word/footnotes.xml><?xml version="1.0" encoding="utf-8"?>
-<w:footnotes xmlns:wpc="http://schemas.microsoft.com/office/word/2010/wordprocessingCanvas" xmlns:cx="http://schemas.microsoft.com/office/drawing/2014/chartex" xmlns:mc="http://schemas.openxmlformats.org/markup-compatibility/2006" xmlns:o="urn:schemas-microsoft-com:office:office" xmlns:r="http://schemas.openxmlformats.org/officeDocument/2006/relationships" xmlns:m="http://schemas.openxmlformats.org/officeDocument/2006/math" xmlns:v="urn:schemas-microsoft-com:vml" xmlns:wp14="http://schemas.microsoft.com/office/word/2010/wordprocessingDrawing" xmlns:wp="http://schemas.openxmlformats.org/drawingml/2006/wordprocessingDrawing" xmlns:w10="urn:schemas-microsoft-com:office:word" xmlns:w="http://schemas.openxmlformats.org/wordprocessingml/2006/main" xmlns:w14="http://schemas.microsoft.com/office/word/2010/wordml" xmlns:w15="http://schemas.microsoft.com/office/word/2012/wordml" xmlns:w16se="http://schemas.microsoft.com/office/word/2015/wordml/symex" xmlns:wpg="http://schemas.microsoft.com/office/word/2010/wordprocessingGroup" xmlns:wpi="http://schemas.microsoft.com/office/word/2010/wordprocessingInk" xmlns:wne="http://schemas.microsoft.com/office/word/2006/wordml" xmlns:wps="http://schemas.microsoft.com/office/word/2010/wordprocessingShape" mc:Ignorable="w14 w15 w16se wp14">
+<w:footnotes xmlns:wpc="http://schemas.microsoft.com/office/word/2010/wordprocessingCanvas" xmlns:cx="http://schemas.microsoft.com/office/drawing/2014/chartex" xmlns:cx1="http://schemas.microsoft.com/office/drawing/2015/9/8/chartex" xmlns:cx2="http://schemas.microsoft.com/office/drawing/2015/10/21/chartex" xmlns:cx3="http://schemas.microsoft.com/office/drawing/2016/5/9/chartex" xmlns:cx4="http://schemas.microsoft.com/office/drawing/2016/5/10/chartex" xmlns:cx5="http://schemas.microsoft.com/office/drawing/2016/5/11/chartex" xmlns:cx6="http://schemas.microsoft.com/office/drawing/2016/5/12/chartex" xmlns:cx7="http://schemas.microsoft.com/office/drawing/2016/5/13/chartex" xmlns:cx8="http://schemas.microsoft.com/office/drawing/2016/5/14/chartex" xmlns:mc="http://schemas.openxmlformats.org/markup-compatibility/2006" xmlns:aink="http://schemas.microsoft.com/office/drawing/2016/ink" xmlns:am3d="http://schemas.microsoft.com/office/drawing/2017/model3d" xmlns:o="urn:schemas-microsoft-com:office:office" xmlns:oel="http://schemas.microsoft.com/office/2019/extlst" xmlns:r="http://schemas.openxmlformats.org/officeDocument/2006/relationships" xmlns:m="http://schemas.openxmlformats.org/officeDocument/2006/math" xmlns:v="urn:schemas-microsoft-com:vml" xmlns:wp14="http://schemas.microsoft.com/office/word/2010/wordprocessingDrawing" xmlns:wp="http://schemas.openxmlformats.org/drawingml/2006/wordprocessingDrawing" xmlns:w10="urn:schemas-microsoft-com:office:word" xmlns:w="http://schemas.openxmlformats.org/wordprocessingml/2006/main" xmlns:w14="http://schemas.microsoft.com/office/word/2010/wordml" xmlns:w15="http://schemas.microsoft.com/office/word/2012/wordml" xmlns:w16cex="http://schemas.microsoft.com/office/word/2018/wordml/cex" xmlns:w16cid="http://schemas.microsoft.com/office/word/2016/wordml/cid" xmlns:w16="http://schemas.microsoft.com/office/word/2018/wordml" xmlns:w16du="http://schemas.microsoft.com/office/word/2023/wordml/word16du" xmlns:w16sdtdh="http://schemas.microsoft.com/office/word/2020/wordml/sdtdatahash" xmlns:w16sdtfl="http://schemas.microsoft.com/office/word/2024/wordml/sdtformatlock" xmlns:w16se="http://schemas.microsoft.com/office/word/2015/wordml/symex" xmlns:wpg="http://schemas.microsoft.com/office/word/2010/wordprocessingGroup" xmlns:wpi="http://schemas.microsoft.com/office/word/2010/wordprocessingInk" xmlns:wne="http://schemas.microsoft.com/office/word/2006/wordml" xmlns:wps="http://schemas.microsoft.com/office/word/2010/wordprocessingShape" mc:Ignorable="w14 w15 w16se w16cid w16 w16cex w16sdtdh w16sdtfl w16du wp14">
   <w:footnote w:type="separator" w:id="-1">
     <w:p>
       <w:r>
@@ -8869,7 +8891,7 @@
 </file>
 
 <file path=word/header1.xml><?xml version="1.0" encoding="utf-8"?>
-<w:hdr xmlns:wpc="http://schemas.microsoft.com/office/word/2010/wordprocessingCanvas" xmlns:cx="http://schemas.microsoft.com/office/drawing/2014/chartex" xmlns:mc="http://schemas.openxmlformats.org/markup-compatibility/2006" xmlns:o="urn:schemas-microsoft-com:office:office" xmlns:r="http://schemas.openxmlformats.org/officeDocument/2006/relationships" xmlns:m="http://schemas.openxmlformats.org/officeDocument/2006/math" xmlns:v="urn:schemas-microsoft-com:vml" xmlns:wp14="http://schemas.microsoft.com/office/word/2010/wordprocessingDrawing" xmlns:wp="http://schemas.openxmlformats.org/drawingml/2006/wordprocessingDrawing" xmlns:w10="urn:schemas-microsoft-com:office:word" xmlns:w="http://schemas.openxmlformats.org/wordprocessingml/2006/main" xmlns:w14="http://schemas.microsoft.com/office/word/2010/wordml" xmlns:w15="http://schemas.microsoft.com/office/word/2012/wordml" xmlns:w16se="http://schemas.microsoft.com/office/word/2015/wordml/symex" xmlns:wpg="http://schemas.microsoft.com/office/word/2010/wordprocessingGroup" xmlns:wpi="http://schemas.microsoft.com/office/word/2010/wordprocessingInk" xmlns:wne="http://schemas.microsoft.com/office/word/2006/wordml" xmlns:wps="http://schemas.microsoft.com/office/word/2010/wordprocessingShape" mc:Ignorable="w14 w15 w16se wp14">
+<w:hdr xmlns:wpc="http://schemas.microsoft.com/office/word/2010/wordprocessingCanvas" xmlns:cx="http://schemas.microsoft.com/office/drawing/2014/chartex" xmlns:cx1="http://schemas.microsoft.com/office/drawing/2015/9/8/chartex" xmlns:cx2="http://schemas.microsoft.com/office/drawing/2015/10/21/chartex" xmlns:cx3="http://schemas.microsoft.com/office/drawing/2016/5/9/chartex" xmlns:cx4="http://schemas.microsoft.com/office/drawing/2016/5/10/chartex" xmlns:cx5="http://schemas.microsoft.com/office/drawing/2016/5/11/chartex" xmlns:cx6="http://schemas.microsoft.com/office/drawing/2016/5/12/chartex" xmlns:cx7="http://schemas.microsoft.com/office/drawing/2016/5/13/chartex" xmlns:cx8="http://schemas.microsoft.com/office/drawing/2016/5/14/chartex" xmlns:mc="http://schemas.openxmlformats.org/markup-compatibility/2006" xmlns:aink="http://schemas.microsoft.com/office/drawing/2016/ink" xmlns:am3d="http://schemas.microsoft.com/office/drawing/2017/model3d" xmlns:o="urn:schemas-microsoft-com:office:office" xmlns:oel="http://schemas.microsoft.com/office/2019/extlst" xmlns:r="http://schemas.openxmlformats.org/officeDocument/2006/relationships" xmlns:m="http://schemas.openxmlformats.org/officeDocument/2006/math" xmlns:v="urn:schemas-microsoft-com:vml" xmlns:wp14="http://schemas.microsoft.com/office/word/2010/wordprocessingDrawing" xmlns:wp="http://schemas.openxmlformats.org/drawingml/2006/wordprocessingDrawing" xmlns:w10="urn:schemas-microsoft-com:office:word" xmlns:w="http://schemas.openxmlformats.org/wordprocessingml/2006/main" xmlns:w14="http://schemas.microsoft.com/office/word/2010/wordml" xmlns:w15="http://schemas.microsoft.com/office/word/2012/wordml" xmlns:w16cex="http://schemas.microsoft.com/office/word/2018/wordml/cex" xmlns:w16cid="http://schemas.microsoft.com/office/word/2016/wordml/cid" xmlns:w16="http://schemas.microsoft.com/office/word/2018/wordml" xmlns:w16du="http://schemas.microsoft.com/office/word/2023/wordml/word16du" xmlns:w16sdtdh="http://schemas.microsoft.com/office/word/2020/wordml/sdtdatahash" xmlns:w16sdtfl="http://schemas.microsoft.com/office/word/2024/wordml/sdtformatlock" xmlns:w16se="http://schemas.microsoft.com/office/word/2015/wordml/symex" xmlns:wpg="http://schemas.microsoft.com/office/word/2010/wordprocessingGroup" xmlns:wpi="http://schemas.microsoft.com/office/word/2010/wordprocessingInk" xmlns:wne="http://schemas.microsoft.com/office/word/2006/wordml" xmlns:wps="http://schemas.microsoft.com/office/word/2010/wordprocessingShape" mc:Ignorable="w14 w15 w16se w16cid w16 w16cex w16sdtdh w16sdtfl w16du wp14">
   <w:p>
     <w:pPr>
       <w:pStyle w:val="Cabealho"/>
@@ -8885,7 +8907,7 @@
 </file>
 
 <file path=word/header2.xml><?xml version="1.0" encoding="utf-8"?>
-<w:hdr xmlns:wpc="http://schemas.microsoft.com/office/word/2010/wordprocessingCanvas" xmlns:cx="http://schemas.microsoft.com/office/drawing/2014/chartex" xmlns:mc="http://schemas.openxmlformats.org/markup-compatibility/2006" xmlns:o="urn:schemas-microsoft-com:office:office" xmlns:r="http://schemas.openxmlformats.org/officeDocument/2006/relationships" xmlns:m="http://schemas.openxmlformats.org/officeDocument/2006/math" xmlns:v="urn:schemas-microsoft-com:vml" xmlns:wp14="http://schemas.microsoft.com/office/word/2010/wordprocessingDrawing" xmlns:wp="http://schemas.openxmlformats.org/drawingml/2006/wordprocessingDrawing" xmlns:w10="urn:schemas-microsoft-com:office:word" xmlns:w="http://schemas.openxmlformats.org/wordprocessingml/2006/main" xmlns:w14="http://schemas.microsoft.com/office/word/2010/wordml" xmlns:w15="http://schemas.microsoft.com/office/word/2012/wordml" xmlns:w16se="http://schemas.microsoft.com/office/word/2015/wordml/symex" xmlns:wpg="http://schemas.microsoft.com/office/word/2010/wordprocessingGroup" xmlns:wpi="http://schemas.microsoft.com/office/word/2010/wordprocessingInk" xmlns:wne="http://schemas.microsoft.com/office/word/2006/wordml" xmlns:wps="http://schemas.microsoft.com/office/word/2010/wordprocessingShape" mc:Ignorable="w14 w15 w16se wp14">
+<w:hdr xmlns:wpc="http://schemas.microsoft.com/office/word/2010/wordprocessingCanvas" xmlns:cx="http://schemas.microsoft.com/office/drawing/2014/chartex" xmlns:cx1="http://schemas.microsoft.com/office/drawing/2015/9/8/chartex" xmlns:cx2="http://schemas.microsoft.com/office/drawing/2015/10/21/chartex" xmlns:cx3="http://schemas.microsoft.com/office/drawing/2016/5/9/chartex" xmlns:cx4="http://schemas.microsoft.com/office/drawing/2016/5/10/chartex" xmlns:cx5="http://schemas.microsoft.com/office/drawing/2016/5/11/chartex" xmlns:cx6="http://schemas.microsoft.com/office/drawing/2016/5/12/chartex" xmlns:cx7="http://schemas.microsoft.com/office/drawing/2016/5/13/chartex" xmlns:cx8="http://schemas.microsoft.com/office/drawing/2016/5/14/chartex" xmlns:mc="http://schemas.openxmlformats.org/markup-compatibility/2006" xmlns:aink="http://schemas.microsoft.com/office/drawing/2016/ink" xmlns:am3d="http://schemas.microsoft.com/office/drawing/2017/model3d" xmlns:o="urn:schemas-microsoft-com:office:office" xmlns:oel="http://schemas.microsoft.com/office/2019/extlst" xmlns:r="http://schemas.openxmlformats.org/officeDocument/2006/relationships" xmlns:m="http://schemas.openxmlformats.org/officeDocument/2006/math" xmlns:v="urn:schemas-microsoft-com:vml" xmlns:wp14="http://schemas.microsoft.com/office/word/2010/wordprocessingDrawing" xmlns:wp="http://schemas.openxmlformats.org/drawingml/2006/wordprocessingDrawing" xmlns:w10="urn:schemas-microsoft-com:office:word" xmlns:w="http://schemas.openxmlformats.org/wordprocessingml/2006/main" xmlns:w14="http://schemas.microsoft.com/office/word/2010/wordml" xmlns:w15="http://schemas.microsoft.com/office/word/2012/wordml" xmlns:w16cex="http://schemas.microsoft.com/office/word/2018/wordml/cex" xmlns:w16cid="http://schemas.microsoft.com/office/word/2016/wordml/cid" xmlns:w16="http://schemas.microsoft.com/office/word/2018/wordml" xmlns:w16du="http://schemas.microsoft.com/office/word/2023/wordml/word16du" xmlns:w16sdtdh="http://schemas.microsoft.com/office/word/2020/wordml/sdtdatahash" xmlns:w16sdtfl="http://schemas.microsoft.com/office/word/2024/wordml/sdtformatlock" xmlns:w16se="http://schemas.microsoft.com/office/word/2015/wordml/symex" xmlns:wpg="http://schemas.microsoft.com/office/word/2010/wordprocessingGroup" xmlns:wpi="http://schemas.microsoft.com/office/word/2010/wordprocessingInk" xmlns:wne="http://schemas.microsoft.com/office/word/2006/wordml" xmlns:wps="http://schemas.microsoft.com/office/word/2010/wordprocessingShape" mc:Ignorable="w14 w15 w16se w16cid w16 w16cex w16sdtdh w16sdtfl w16du wp14">
   <w:sdt>
     <w:sdtPr>
       <w:id w:val="-1699001773"/>
@@ -8949,7 +8971,7 @@
 </file>
 
 <file path=word/header3.xml><?xml version="1.0" encoding="utf-8"?>
-<w:hdr xmlns:wpc="http://schemas.microsoft.com/office/word/2010/wordprocessingCanvas" xmlns:cx="http://schemas.microsoft.com/office/drawing/2014/chartex" xmlns:mc="http://schemas.openxmlformats.org/markup-compatibility/2006" xmlns:o="urn:schemas-microsoft-com:office:office" xmlns:r="http://schemas.openxmlformats.org/officeDocument/2006/relationships" xmlns:m="http://schemas.openxmlformats.org/officeDocument/2006/math" xmlns:v="urn:schemas-microsoft-com:vml" xmlns:wp14="http://schemas.microsoft.com/office/word/2010/wordprocessingDrawing" xmlns:wp="http://schemas.openxmlformats.org/drawingml/2006/wordprocessingDrawing" xmlns:w10="urn:schemas-microsoft-com:office:word" xmlns:w="http://schemas.openxmlformats.org/wordprocessingml/2006/main" xmlns:w14="http://schemas.microsoft.com/office/word/2010/wordml" xmlns:w15="http://schemas.microsoft.com/office/word/2012/wordml" xmlns:w16se="http://schemas.microsoft.com/office/word/2015/wordml/symex" xmlns:wpg="http://schemas.microsoft.com/office/word/2010/wordprocessingGroup" xmlns:wpi="http://schemas.microsoft.com/office/word/2010/wordprocessingInk" xmlns:wne="http://schemas.microsoft.com/office/word/2006/wordml" xmlns:wps="http://schemas.microsoft.com/office/word/2010/wordprocessingShape" mc:Ignorable="w14 w15 w16se wp14">
+<w:hdr xmlns:wpc="http://schemas.microsoft.com/office/word/2010/wordprocessingCanvas" xmlns:cx="http://schemas.microsoft.com/office/drawing/2014/chartex" xmlns:cx1="http://schemas.microsoft.com/office/drawing/2015/9/8/chartex" xmlns:cx2="http://schemas.microsoft.com/office/drawing/2015/10/21/chartex" xmlns:cx3="http://schemas.microsoft.com/office/drawing/2016/5/9/chartex" xmlns:cx4="http://schemas.microsoft.com/office/drawing/2016/5/10/chartex" xmlns:cx5="http://schemas.microsoft.com/office/drawing/2016/5/11/chartex" xmlns:cx6="http://schemas.microsoft.com/office/drawing/2016/5/12/chartex" xmlns:cx7="http://schemas.microsoft.com/office/drawing/2016/5/13/chartex" xmlns:cx8="http://schemas.microsoft.com/office/drawing/2016/5/14/chartex" xmlns:mc="http://schemas.openxmlformats.org/markup-compatibility/2006" xmlns:aink="http://schemas.microsoft.com/office/drawing/2016/ink" xmlns:am3d="http://schemas.microsoft.com/office/drawing/2017/model3d" xmlns:o="urn:schemas-microsoft-com:office:office" xmlns:oel="http://schemas.microsoft.com/office/2019/extlst" xmlns:r="http://schemas.openxmlformats.org/officeDocument/2006/relationships" xmlns:m="http://schemas.openxmlformats.org/officeDocument/2006/math" xmlns:v="urn:schemas-microsoft-com:vml" xmlns:wp14="http://schemas.microsoft.com/office/word/2010/wordprocessingDrawing" xmlns:wp="http://schemas.openxmlformats.org/drawingml/2006/wordprocessingDrawing" xmlns:w10="urn:schemas-microsoft-com:office:word" xmlns:w="http://schemas.openxmlformats.org/wordprocessingml/2006/main" xmlns:w14="http://schemas.microsoft.com/office/word/2010/wordml" xmlns:w15="http://schemas.microsoft.com/office/word/2012/wordml" xmlns:w16cex="http://schemas.microsoft.com/office/word/2018/wordml/cex" xmlns:w16cid="http://schemas.microsoft.com/office/word/2016/wordml/cid" xmlns:w16="http://schemas.microsoft.com/office/word/2018/wordml" xmlns:w16du="http://schemas.microsoft.com/office/word/2023/wordml/word16du" xmlns:w16sdtdh="http://schemas.microsoft.com/office/word/2020/wordml/sdtdatahash" xmlns:w16sdtfl="http://schemas.microsoft.com/office/word/2024/wordml/sdtformatlock" xmlns:w16se="http://schemas.microsoft.com/office/word/2015/wordml/symex" xmlns:wpg="http://schemas.microsoft.com/office/word/2010/wordprocessingGroup" xmlns:wpi="http://schemas.microsoft.com/office/word/2010/wordprocessingInk" xmlns:wne="http://schemas.microsoft.com/office/word/2006/wordml" xmlns:wps="http://schemas.microsoft.com/office/word/2010/wordprocessingShape" mc:Ignorable="w14 w15 w16se w16cid w16 w16cex w16sdtdh w16sdtfl w16du wp14">
   <w:sdt>
     <w:sdtPr>
       <w:id w:val="958228592"/>
@@ -9026,7 +9048,7 @@
 </file>
 
 <file path=word/numbering.xml><?xml version="1.0" encoding="utf-8"?>
-<w:numbering xmlns:wpc="http://schemas.microsoft.com/office/word/2010/wordprocessingCanvas" xmlns:cx="http://schemas.microsoft.com/office/drawing/2014/chartex" xmlns:mc="http://schemas.openxmlformats.org/markup-compatibility/2006" xmlns:o="urn:schemas-microsoft-com:office:office" xmlns:r="http://schemas.openxmlformats.org/officeDocument/2006/relationships" xmlns:m="http://schemas.openxmlformats.org/officeDocument/2006/math" xmlns:v="urn:schemas-microsoft-com:vml" xmlns:wp14="http://schemas.microsoft.com/office/word/2010/wordprocessingDrawing" xmlns:wp="http://schemas.openxmlformats.org/drawingml/2006/wordprocessingDrawing" xmlns:w10="urn:schemas-microsoft-com:office:word" xmlns:w="http://schemas.openxmlformats.org/wordprocessingml/2006/main" xmlns:w14="http://schemas.microsoft.com/office/word/2010/wordml" xmlns:w15="http://schemas.microsoft.com/office/word/2012/wordml" xmlns:w16se="http://schemas.microsoft.com/office/word/2015/wordml/symex" xmlns:wpg="http://schemas.microsoft.com/office/word/2010/wordprocessingGroup" xmlns:wpi="http://schemas.microsoft.com/office/word/2010/wordprocessingInk" xmlns:wne="http://schemas.microsoft.com/office/word/2006/wordml" xmlns:wps="http://schemas.microsoft.com/office/word/2010/wordprocessingShape" mc:Ignorable="w14 w15 w16se wp14">
+<w:numbering xmlns:wpc="http://schemas.microsoft.com/office/word/2010/wordprocessingCanvas" xmlns:cx="http://schemas.microsoft.com/office/drawing/2014/chartex" xmlns:cx1="http://schemas.microsoft.com/office/drawing/2015/9/8/chartex" xmlns:cx2="http://schemas.microsoft.com/office/drawing/2015/10/21/chartex" xmlns:cx3="http://schemas.microsoft.com/office/drawing/2016/5/9/chartex" xmlns:cx4="http://schemas.microsoft.com/office/drawing/2016/5/10/chartex" xmlns:cx5="http://schemas.microsoft.com/office/drawing/2016/5/11/chartex" xmlns:cx6="http://schemas.microsoft.com/office/drawing/2016/5/12/chartex" xmlns:cx7="http://schemas.microsoft.com/office/drawing/2016/5/13/chartex" xmlns:cx8="http://schemas.microsoft.com/office/drawing/2016/5/14/chartex" xmlns:mc="http://schemas.openxmlformats.org/markup-compatibility/2006" xmlns:aink="http://schemas.microsoft.com/office/drawing/2016/ink" xmlns:am3d="http://schemas.microsoft.com/office/drawing/2017/model3d" xmlns:o="urn:schemas-microsoft-com:office:office" xmlns:oel="http://schemas.microsoft.com/office/2019/extlst" xmlns:r="http://schemas.openxmlformats.org/officeDocument/2006/relationships" xmlns:m="http://schemas.openxmlformats.org/officeDocument/2006/math" xmlns:v="urn:schemas-microsoft-com:vml" xmlns:wp14="http://schemas.microsoft.com/office/word/2010/wordprocessingDrawing" xmlns:wp="http://schemas.openxmlformats.org/drawingml/2006/wordprocessingDrawing" xmlns:w10="urn:schemas-microsoft-com:office:word" xmlns:w="http://schemas.openxmlformats.org/wordprocessingml/2006/main" xmlns:w14="http://schemas.microsoft.com/office/word/2010/wordml" xmlns:w15="http://schemas.microsoft.com/office/word/2012/wordml" xmlns:w16cex="http://schemas.microsoft.com/office/word/2018/wordml/cex" xmlns:w16cid="http://schemas.microsoft.com/office/word/2016/wordml/cid" xmlns:w16="http://schemas.microsoft.com/office/word/2018/wordml" xmlns:w16du="http://schemas.microsoft.com/office/word/2023/wordml/word16du" xmlns:w16sdtdh="http://schemas.microsoft.com/office/word/2020/wordml/sdtdatahash" xmlns:w16sdtfl="http://schemas.microsoft.com/office/word/2024/wordml/sdtformatlock" xmlns:w16se="http://schemas.microsoft.com/office/word/2015/wordml/symex" xmlns:wpg="http://schemas.microsoft.com/office/word/2010/wordprocessingGroup" xmlns:wpi="http://schemas.microsoft.com/office/word/2010/wordprocessingInk" xmlns:wne="http://schemas.microsoft.com/office/word/2006/wordml" xmlns:wps="http://schemas.microsoft.com/office/word/2010/wordprocessingShape" mc:Ignorable="w14 w15 w16se w16cid w16 w16cex w16sdtdh w16sdtfl w16du wp14">
   <w:abstractNum w:abstractNumId="0" w15:restartNumberingAfterBreak="0">
     <w:nsid w:val="00AB5A76"/>
     <w:multiLevelType w:val="hybridMultilevel"/>
@@ -11941,89 +11963,89 @@
       </w:rPr>
     </w:lvl>
   </w:abstractNum>
-  <w:num w:numId="1">
+  <w:num w:numId="1" w16cid:durableId="1023096013">
     <w:abstractNumId w:val="6"/>
   </w:num>
-  <w:num w:numId="2">
+  <w:num w:numId="2" w16cid:durableId="781535628">
     <w:abstractNumId w:val="11"/>
   </w:num>
-  <w:num w:numId="3">
+  <w:num w:numId="3" w16cid:durableId="820775593">
     <w:abstractNumId w:val="1"/>
   </w:num>
-  <w:num w:numId="4">
+  <w:num w:numId="4" w16cid:durableId="84546144">
     <w:abstractNumId w:val="10"/>
   </w:num>
-  <w:num w:numId="5">
+  <w:num w:numId="5" w16cid:durableId="552232775">
     <w:abstractNumId w:val="21"/>
   </w:num>
-  <w:num w:numId="6">
+  <w:num w:numId="6" w16cid:durableId="1097562568">
     <w:abstractNumId w:val="20"/>
   </w:num>
-  <w:num w:numId="7">
+  <w:num w:numId="7" w16cid:durableId="824973730">
     <w:abstractNumId w:val="22"/>
   </w:num>
-  <w:num w:numId="8">
+  <w:num w:numId="8" w16cid:durableId="1520319157">
     <w:abstractNumId w:val="4"/>
   </w:num>
-  <w:num w:numId="9">
+  <w:num w:numId="9" w16cid:durableId="1117599329">
     <w:abstractNumId w:val="23"/>
   </w:num>
-  <w:num w:numId="10">
+  <w:num w:numId="10" w16cid:durableId="1793087711">
     <w:abstractNumId w:val="2"/>
   </w:num>
-  <w:num w:numId="11">
+  <w:num w:numId="11" w16cid:durableId="572855102">
     <w:abstractNumId w:val="24"/>
   </w:num>
-  <w:num w:numId="12">
+  <w:num w:numId="12" w16cid:durableId="346710294">
     <w:abstractNumId w:val="25"/>
   </w:num>
-  <w:num w:numId="13">
+  <w:num w:numId="13" w16cid:durableId="565919559">
     <w:abstractNumId w:val="16"/>
   </w:num>
-  <w:num w:numId="14">
+  <w:num w:numId="14" w16cid:durableId="28579507">
     <w:abstractNumId w:val="14"/>
   </w:num>
-  <w:num w:numId="15">
+  <w:num w:numId="15" w16cid:durableId="1248073974">
     <w:abstractNumId w:val="12"/>
   </w:num>
-  <w:num w:numId="16">
+  <w:num w:numId="16" w16cid:durableId="1811357296">
     <w:abstractNumId w:val="15"/>
   </w:num>
-  <w:num w:numId="17">
+  <w:num w:numId="17" w16cid:durableId="1474978181">
     <w:abstractNumId w:val="9"/>
   </w:num>
-  <w:num w:numId="18">
+  <w:num w:numId="18" w16cid:durableId="244799228">
     <w:abstractNumId w:val="3"/>
   </w:num>
-  <w:num w:numId="19">
+  <w:num w:numId="19" w16cid:durableId="998001893">
     <w:abstractNumId w:val="19"/>
   </w:num>
-  <w:num w:numId="20">
+  <w:num w:numId="20" w16cid:durableId="1553927464">
     <w:abstractNumId w:val="8"/>
   </w:num>
-  <w:num w:numId="21">
+  <w:num w:numId="21" w16cid:durableId="1115370622">
     <w:abstractNumId w:val="0"/>
   </w:num>
-  <w:num w:numId="22">
+  <w:num w:numId="22" w16cid:durableId="1772168441">
     <w:abstractNumId w:val="7"/>
   </w:num>
-  <w:num w:numId="23">
+  <w:num w:numId="23" w16cid:durableId="1046105627">
     <w:abstractNumId w:val="5"/>
   </w:num>
-  <w:num w:numId="24">
+  <w:num w:numId="24" w16cid:durableId="100344261">
     <w:abstractNumId w:val="18"/>
   </w:num>
-  <w:num w:numId="25">
+  <w:num w:numId="25" w16cid:durableId="1547519780">
     <w:abstractNumId w:val="13"/>
   </w:num>
-  <w:num w:numId="26">
+  <w:num w:numId="26" w16cid:durableId="74204964">
     <w:abstractNumId w:val="17"/>
   </w:num>
 </w:numbering>
 </file>
 
 <file path=word/styles.xml><?xml version="1.0" encoding="utf-8"?>
-<w:styles xmlns:mc="http://schemas.openxmlformats.org/markup-compatibility/2006" xmlns:r="http://schemas.openxmlformats.org/officeDocument/2006/relationships" xmlns:w="http://schemas.openxmlformats.org/wordprocessingml/2006/main" xmlns:w14="http://schemas.microsoft.com/office/word/2010/wordml" xmlns:w15="http://schemas.microsoft.com/office/word/2012/wordml" xmlns:w16se="http://schemas.microsoft.com/office/word/2015/wordml/symex" mc:Ignorable="w14 w15 w16se">
+<w:styles xmlns:mc="http://schemas.openxmlformats.org/markup-compatibility/2006" xmlns:r="http://schemas.openxmlformats.org/officeDocument/2006/relationships" xmlns:w="http://schemas.openxmlformats.org/wordprocessingml/2006/main" xmlns:w14="http://schemas.microsoft.com/office/word/2010/wordml" xmlns:w15="http://schemas.microsoft.com/office/word/2012/wordml" xmlns:w16cex="http://schemas.microsoft.com/office/word/2018/wordml/cex" xmlns:w16cid="http://schemas.microsoft.com/office/word/2016/wordml/cid" xmlns:w16="http://schemas.microsoft.com/office/word/2018/wordml" xmlns:w16du="http://schemas.microsoft.com/office/word/2023/wordml/word16du" xmlns:w16sdtdh="http://schemas.microsoft.com/office/word/2020/wordml/sdtdatahash" xmlns:w16sdtfl="http://schemas.microsoft.com/office/word/2024/wordml/sdtformatlock" xmlns:w16se="http://schemas.microsoft.com/office/word/2015/wordml/symex" mc:Ignorable="w14 w15 w16se w16cid w16 w16cex w16sdtdh w16sdtfl w16du">
   <w:docDefaults>
     <w:rPrDefault>
       <w:rPr>
@@ -12033,7 +12055,7 @@
     </w:rPrDefault>
     <w:pPrDefault/>
   </w:docDefaults>
-  <w:latentStyles w:defLockedState="0" w:defUIPriority="99" w:defSemiHidden="0" w:defUnhideWhenUsed="0" w:defQFormat="0" w:count="371">
+  <w:latentStyles w:defLockedState="0" w:defUIPriority="99" w:defSemiHidden="0" w:defUnhideWhenUsed="0" w:defQFormat="0" w:count="376">
     <w:lsdException w:name="Normal" w:uiPriority="0" w:qFormat="1"/>
     <w:lsdException w:name="heading 1" w:uiPriority="9" w:qFormat="1"/>
     <w:lsdException w:name="heading 2" w:uiPriority="9" w:unhideWhenUsed="1" w:qFormat="1"/>
@@ -12405,6 +12427,11 @@
     <w:lsdException w:name="List Table 5 Dark Accent 6" w:uiPriority="50"/>
     <w:lsdException w:name="List Table 6 Colorful Accent 6" w:uiPriority="51"/>
     <w:lsdException w:name="List Table 7 Colorful Accent 6" w:uiPriority="52"/>
+    <w:lsdException w:name="Mention" w:semiHidden="1" w:unhideWhenUsed="1"/>
+    <w:lsdException w:name="Smart Hyperlink" w:semiHidden="1" w:unhideWhenUsed="1"/>
+    <w:lsdException w:name="Hashtag" w:semiHidden="1" w:unhideWhenUsed="1"/>
+    <w:lsdException w:name="Unresolved Mention" w:semiHidden="1" w:unhideWhenUsed="1"/>
+    <w:lsdException w:name="Smart Link" w:semiHidden="1" w:unhideWhenUsed="1"/>
   </w:latentStyles>
   <w:style w:type="paragraph" w:default="1" w:styleId="Normal">
     <w:name w:val="Normal"/>

</xml_diff>

<commit_message>
Atualizando a documentação do projeto - 26/04/2026
</commit_message>
<xml_diff>
--- a/Terceiro_Semestre/Projeto_Integrador/Documentação/Modelo_Projeto_Integrador_principal.docx
+++ b/Terceiro_Semestre/Projeto_Integrador/Documentação/Modelo_Projeto_Integrador_principal.docx
@@ -3743,22 +3743,6 @@
       </w:pPr>
       <w:r>
         <w:rPr>
-          <w:i w:val="0"/>
-          <w:iCs/>
-        </w:rPr>
-        <w:t>Diagrama de Classes:</w:t>
-      </w:r>
-      <w:r>
-        <w:rPr>
-          <w:b w:val="0"/>
-          <w:bCs w:val="0"/>
-          <w:i w:val="0"/>
-          <w:iCs/>
-        </w:rPr>
-        <w:br/>
-      </w:r>
-      <w:r>
-        <w:rPr>
           <w:b w:val="0"/>
           <w:bCs w:val="0"/>
           <w:i w:val="0"/>
@@ -3767,9 +3751,17 @@
           <w:lang w:eastAsia="pt-BR"/>
         </w:rPr>
         <w:drawing>
-          <wp:inline distT="0" distB="0" distL="0" distR="0" wp14:anchorId="675E87CB" wp14:editId="67D1DC8F">
-            <wp:extent cx="4993203" cy="3323399"/>
+          <wp:anchor distT="0" distB="0" distL="114300" distR="114300" simplePos="0" relativeHeight="251663360" behindDoc="0" locked="0" layoutInCell="1" allowOverlap="1" wp14:anchorId="675E87CB" wp14:editId="6AD5B273">
+            <wp:simplePos x="0" y="0"/>
+            <wp:positionH relativeFrom="page">
+              <wp:align>center</wp:align>
+            </wp:positionH>
+            <wp:positionV relativeFrom="paragraph">
+              <wp:posOffset>277380</wp:posOffset>
+            </wp:positionV>
+            <wp:extent cx="2197100" cy="3322955"/>
             <wp:effectExtent l="0" t="0" r="0" b="0"/>
+            <wp:wrapTopAndBottom/>
             <wp:docPr id="568772802" name="drawing"/>
             <wp:cNvGraphicFramePr>
               <a:graphicFrameLocks xmlns:a="http://schemas.openxmlformats.org/drawingml/2006/main" noChangeAspect="1"/>
@@ -3782,7 +3774,7 @@
                     <pic:cNvPicPr/>
                   </pic:nvPicPr>
                   <pic:blipFill>
-                    <a:blip r:embed="rId15">
+                    <a:blip r:embed="rId15" cstate="print">
                       <a:extLst>
                         <a:ext uri="{28A0092B-C50C-407E-A947-70E740481C1C}">
                           <a14:useLocalDpi xmlns:a14="http://schemas.microsoft.com/office/drawing/2010/main" val="0"/>
@@ -3796,7 +3788,7 @@
                   <pic:spPr>
                     <a:xfrm>
                       <a:off x="0" y="0"/>
-                      <a:ext cx="4993203" cy="3323399"/>
+                      <a:ext cx="2197100" cy="3322955"/>
                     </a:xfrm>
                     <a:prstGeom prst="rect">
                       <a:avLst/>
@@ -3805,11 +3797,20 @@
                 </pic:pic>
               </a:graphicData>
             </a:graphic>
-          </wp:inline>
+          </wp:anchor>
         </w:drawing>
       </w:r>
       <w:r>
         <w:rPr>
+          <w:i w:val="0"/>
+          <w:iCs/>
+        </w:rPr>
+        <w:t>Diagrama de Classes:</w:t>
+      </w:r>
+      <w:r>
+        <w:rPr>
+          <w:b w:val="0"/>
+          <w:bCs w:val="0"/>
           <w:i w:val="0"/>
           <w:iCs/>
         </w:rPr>
@@ -5308,7 +5309,7 @@
           <w:lang w:eastAsia="pt-BR"/>
         </w:rPr>
         <w:drawing>
-          <wp:inline distT="0" distB="0" distL="0" distR="0" wp14:anchorId="2EA7A7F6" wp14:editId="4FA7F98D">
+          <wp:inline distT="0" distB="0" distL="0" distR="0" wp14:anchorId="2EA7A7F6" wp14:editId="560722FA">
             <wp:extent cx="5839814" cy="1418493"/>
             <wp:effectExtent l="0" t="0" r="0" b="0"/>
             <wp:docPr id="2" name="Imagem 2"/>
@@ -5380,7 +5381,7 @@
           <w:lang w:eastAsia="pt-BR"/>
         </w:rPr>
         <w:drawing>
-          <wp:inline distT="0" distB="0" distL="0" distR="0" wp14:anchorId="32AD5C31" wp14:editId="4C4A0B80">
+          <wp:inline distT="0" distB="0" distL="0" distR="0" wp14:anchorId="32AD5C31" wp14:editId="6553AC55">
             <wp:extent cx="5769408" cy="1155829"/>
             <wp:effectExtent l="0" t="0" r="3175" b="6350"/>
             <wp:docPr id="5" name="Imagem 5"/>
@@ -5547,7 +5548,7 @@
           <w:lang w:eastAsia="pt-BR"/>
         </w:rPr>
         <w:drawing>
-          <wp:inline distT="0" distB="0" distL="0" distR="0" wp14:anchorId="5A0A9D17" wp14:editId="7384E4CA">
+          <wp:inline distT="0" distB="0" distL="0" distR="0" wp14:anchorId="5A0A9D17" wp14:editId="5BA508E9">
             <wp:extent cx="5755479" cy="773723"/>
             <wp:effectExtent l="0" t="0" r="0" b="7620"/>
             <wp:docPr id="6" name="Imagem 6"/>
@@ -5618,7 +5619,7 @@
           <w:lang w:eastAsia="pt-BR"/>
         </w:rPr>
         <w:drawing>
-          <wp:inline distT="0" distB="0" distL="0" distR="0" wp14:anchorId="61B11120" wp14:editId="2ED9C5C5">
+          <wp:inline distT="0" distB="0" distL="0" distR="0" wp14:anchorId="61B11120" wp14:editId="19A14A1D">
             <wp:extent cx="5749743" cy="914400"/>
             <wp:effectExtent l="0" t="0" r="3810" b="0"/>
             <wp:docPr id="7" name="Imagem 7"/>
@@ -5696,7 +5697,7 @@
           <w:lang w:eastAsia="pt-BR"/>
         </w:rPr>
         <w:drawing>
-          <wp:inline distT="0" distB="0" distL="0" distR="0" wp14:anchorId="4DC00A87" wp14:editId="0F6EF5D6">
+          <wp:inline distT="0" distB="0" distL="0" distR="0" wp14:anchorId="4DC00A87" wp14:editId="1D4C77EC">
             <wp:extent cx="5752398" cy="1453661"/>
             <wp:effectExtent l="0" t="0" r="1270" b="0"/>
             <wp:docPr id="8" name="Imagem 8"/>
@@ -5781,7 +5782,7 @@
           <w:lang w:eastAsia="pt-BR"/>
         </w:rPr>
         <w:drawing>
-          <wp:inline distT="0" distB="0" distL="0" distR="0" wp14:anchorId="6EF7DC13" wp14:editId="2E2D003D">
+          <wp:inline distT="0" distB="0" distL="0" distR="0" wp14:anchorId="6EF7DC13" wp14:editId="7B08D7D1">
             <wp:extent cx="5788489" cy="574430"/>
             <wp:effectExtent l="0" t="0" r="3175" b="0"/>
             <wp:docPr id="9" name="Imagem 9"/>
@@ -5866,7 +5867,7 @@
           <w:lang w:eastAsia="pt-BR"/>
         </w:rPr>
         <w:drawing>
-          <wp:inline distT="0" distB="0" distL="0" distR="0" wp14:anchorId="0FA3CA38" wp14:editId="6090CD9E">
+          <wp:inline distT="0" distB="0" distL="0" distR="0" wp14:anchorId="0FA3CA38" wp14:editId="4179DC65">
             <wp:extent cx="5773542" cy="580292"/>
             <wp:effectExtent l="0" t="0" r="0" b="0"/>
             <wp:docPr id="10" name="Imagem 10"/>
@@ -8734,7 +8735,7 @@
           <w:lang w:eastAsia="pt-BR"/>
         </w:rPr>
         <w:drawing>
-          <wp:inline distT="0" distB="0" distL="0" distR="0" wp14:anchorId="7D1B9FBA" wp14:editId="307DAE34">
+          <wp:inline distT="0" distB="0" distL="0" distR="0" wp14:anchorId="7D1B9FBA" wp14:editId="565CCEE4">
             <wp:extent cx="2881439" cy="4064751"/>
             <wp:effectExtent l="0" t="0" r="0" b="0"/>
             <wp:docPr id="1726782481" name="Imagem 2"/>

</xml_diff>

<commit_message>
Atualizando os diagramas e a documentação do projeto - 26/04/2026
</commit_message>
<xml_diff>
--- a/Terceiro_Semestre/Projeto_Integrador/Documentação/Modelo_Projeto_Integrador_principal.docx
+++ b/Terceiro_Semestre/Projeto_Integrador/Documentação/Modelo_Projeto_Integrador_principal.docx
@@ -3735,8 +3735,6 @@
       <w:pPr>
         <w:pStyle w:val="Ttulo3"/>
         <w:rPr>
-          <w:b w:val="0"/>
-          <w:bCs w:val="0"/>
           <w:i w:val="0"/>
           <w:iCs/>
         </w:rPr>
@@ -3751,16 +3749,16 @@
           <w:lang w:eastAsia="pt-BR"/>
         </w:rPr>
         <w:drawing>
-          <wp:anchor distT="0" distB="0" distL="114300" distR="114300" simplePos="0" relativeHeight="251663360" behindDoc="0" locked="0" layoutInCell="1" allowOverlap="1" wp14:anchorId="675E87CB" wp14:editId="6AD5B273">
+          <wp:anchor distT="0" distB="0" distL="114300" distR="114300" simplePos="0" relativeHeight="251663360" behindDoc="0" locked="0" layoutInCell="1" allowOverlap="1" wp14:anchorId="675E87CB" wp14:editId="674B47F0">
             <wp:simplePos x="0" y="0"/>
             <wp:positionH relativeFrom="page">
-              <wp:align>center</wp:align>
+              <wp:posOffset>2680335</wp:posOffset>
             </wp:positionH>
             <wp:positionV relativeFrom="paragraph">
-              <wp:posOffset>277380</wp:posOffset>
+              <wp:posOffset>476250</wp:posOffset>
             </wp:positionV>
-            <wp:extent cx="2197100" cy="3322955"/>
-            <wp:effectExtent l="0" t="0" r="0" b="0"/>
+            <wp:extent cx="2197100" cy="2925445"/>
+            <wp:effectExtent l="0" t="0" r="0" b="8255"/>
             <wp:wrapTopAndBottom/>
             <wp:docPr id="568772802" name="drawing"/>
             <wp:cNvGraphicFramePr>
@@ -3788,7 +3786,7 @@
                   <pic:spPr>
                     <a:xfrm>
                       <a:off x="0" y="0"/>
-                      <a:ext cx="2197100" cy="3322955"/>
+                      <a:ext cx="2197100" cy="2925445"/>
                     </a:xfrm>
                     <a:prstGeom prst="rect">
                       <a:avLst/>
@@ -3797,6 +3795,9 @@
                 </pic:pic>
               </a:graphicData>
             </a:graphic>
+            <wp14:sizeRelV relativeFrom="margin">
+              <wp14:pctHeight>0</wp14:pctHeight>
+            </wp14:sizeRelV>
           </wp:anchor>
         </w:drawing>
       </w:r>
@@ -3825,6 +3826,17 @@
         </w:rPr>
         <w:br/>
       </w:r>
+    </w:p>
+    <w:p>
+      <w:pPr>
+        <w:pStyle w:val="Ttulo3"/>
+        <w:rPr>
+          <w:b w:val="0"/>
+          <w:bCs w:val="0"/>
+          <w:i w:val="0"/>
+          <w:iCs/>
+        </w:rPr>
+      </w:pPr>
       <w:r>
         <w:rPr>
           <w:i w:val="0"/>
@@ -5309,7 +5321,7 @@
           <w:lang w:eastAsia="pt-BR"/>
         </w:rPr>
         <w:drawing>
-          <wp:inline distT="0" distB="0" distL="0" distR="0" wp14:anchorId="2EA7A7F6" wp14:editId="560722FA">
+          <wp:inline distT="0" distB="0" distL="0" distR="0" wp14:anchorId="2EA7A7F6" wp14:editId="32B866C4">
             <wp:extent cx="5839814" cy="1418493"/>
             <wp:effectExtent l="0" t="0" r="0" b="0"/>
             <wp:docPr id="2" name="Imagem 2"/>
@@ -5381,7 +5393,7 @@
           <w:lang w:eastAsia="pt-BR"/>
         </w:rPr>
         <w:drawing>
-          <wp:inline distT="0" distB="0" distL="0" distR="0" wp14:anchorId="32AD5C31" wp14:editId="6553AC55">
+          <wp:inline distT="0" distB="0" distL="0" distR="0" wp14:anchorId="32AD5C31" wp14:editId="6ECC67D6">
             <wp:extent cx="5769408" cy="1155829"/>
             <wp:effectExtent l="0" t="0" r="3175" b="6350"/>
             <wp:docPr id="5" name="Imagem 5"/>
@@ -5548,7 +5560,7 @@
           <w:lang w:eastAsia="pt-BR"/>
         </w:rPr>
         <w:drawing>
-          <wp:inline distT="0" distB="0" distL="0" distR="0" wp14:anchorId="5A0A9D17" wp14:editId="5BA508E9">
+          <wp:inline distT="0" distB="0" distL="0" distR="0" wp14:anchorId="5A0A9D17" wp14:editId="2245E770">
             <wp:extent cx="5755479" cy="773723"/>
             <wp:effectExtent l="0" t="0" r="0" b="7620"/>
             <wp:docPr id="6" name="Imagem 6"/>
@@ -5619,7 +5631,7 @@
           <w:lang w:eastAsia="pt-BR"/>
         </w:rPr>
         <w:drawing>
-          <wp:inline distT="0" distB="0" distL="0" distR="0" wp14:anchorId="61B11120" wp14:editId="19A14A1D">
+          <wp:inline distT="0" distB="0" distL="0" distR="0" wp14:anchorId="61B11120" wp14:editId="1A4348A0">
             <wp:extent cx="5749743" cy="914400"/>
             <wp:effectExtent l="0" t="0" r="3810" b="0"/>
             <wp:docPr id="7" name="Imagem 7"/>
@@ -5697,7 +5709,7 @@
           <w:lang w:eastAsia="pt-BR"/>
         </w:rPr>
         <w:drawing>
-          <wp:inline distT="0" distB="0" distL="0" distR="0" wp14:anchorId="4DC00A87" wp14:editId="1D4C77EC">
+          <wp:inline distT="0" distB="0" distL="0" distR="0" wp14:anchorId="4DC00A87" wp14:editId="1C5C4156">
             <wp:extent cx="5752398" cy="1453661"/>
             <wp:effectExtent l="0" t="0" r="1270" b="0"/>
             <wp:docPr id="8" name="Imagem 8"/>
@@ -5782,7 +5794,7 @@
           <w:lang w:eastAsia="pt-BR"/>
         </w:rPr>
         <w:drawing>
-          <wp:inline distT="0" distB="0" distL="0" distR="0" wp14:anchorId="6EF7DC13" wp14:editId="7B08D7D1">
+          <wp:inline distT="0" distB="0" distL="0" distR="0" wp14:anchorId="6EF7DC13" wp14:editId="68A4FBC9">
             <wp:extent cx="5788489" cy="574430"/>
             <wp:effectExtent l="0" t="0" r="3175" b="0"/>
             <wp:docPr id="9" name="Imagem 9"/>
@@ -5867,7 +5879,7 @@
           <w:lang w:eastAsia="pt-BR"/>
         </w:rPr>
         <w:drawing>
-          <wp:inline distT="0" distB="0" distL="0" distR="0" wp14:anchorId="0FA3CA38" wp14:editId="4179DC65">
+          <wp:inline distT="0" distB="0" distL="0" distR="0" wp14:anchorId="0FA3CA38" wp14:editId="6CFE08D0">
             <wp:extent cx="5773542" cy="580292"/>
             <wp:effectExtent l="0" t="0" r="0" b="0"/>
             <wp:docPr id="10" name="Imagem 10"/>
@@ -8735,7 +8747,7 @@
           <w:lang w:eastAsia="pt-BR"/>
         </w:rPr>
         <w:drawing>
-          <wp:inline distT="0" distB="0" distL="0" distR="0" wp14:anchorId="7D1B9FBA" wp14:editId="565CCEE4">
+          <wp:inline distT="0" distB="0" distL="0" distR="0" wp14:anchorId="7D1B9FBA" wp14:editId="7D883249">
             <wp:extent cx="2881439" cy="4064751"/>
             <wp:effectExtent l="0" t="0" r="0" b="0"/>
             <wp:docPr id="1726782481" name="Imagem 2"/>

</xml_diff>

<commit_message>
Atualizando os diagramas e finalizando a documentação - 26/04/2026
</commit_message>
<xml_diff>
--- a/Terceiro_Semestre/Projeto_Integrador/Documentação/Modelo_Projeto_Integrador_principal.docx
+++ b/Terceiro_Semestre/Projeto_Integrador/Documentação/Modelo_Projeto_Integrador_principal.docx
@@ -3749,15 +3749,15 @@
           <w:lang w:eastAsia="pt-BR"/>
         </w:rPr>
         <w:drawing>
-          <wp:anchor distT="0" distB="0" distL="114300" distR="114300" simplePos="0" relativeHeight="251663360" behindDoc="0" locked="0" layoutInCell="1" allowOverlap="1" wp14:anchorId="675E87CB" wp14:editId="674B47F0">
+          <wp:anchor distT="0" distB="0" distL="114300" distR="114300" simplePos="0" relativeHeight="251663360" behindDoc="0" locked="0" layoutInCell="1" allowOverlap="1" wp14:anchorId="675E87CB" wp14:editId="5447447D">
             <wp:simplePos x="0" y="0"/>
             <wp:positionH relativeFrom="page">
-              <wp:posOffset>2680335</wp:posOffset>
+              <wp:posOffset>2711450</wp:posOffset>
             </wp:positionH>
             <wp:positionV relativeFrom="paragraph">
-              <wp:posOffset>476250</wp:posOffset>
+              <wp:posOffset>474345</wp:posOffset>
             </wp:positionV>
-            <wp:extent cx="2197100" cy="2925445"/>
+            <wp:extent cx="2135505" cy="2925445"/>
             <wp:effectExtent l="0" t="0" r="0" b="8255"/>
             <wp:wrapTopAndBottom/>
             <wp:docPr id="568772802" name="drawing"/>
@@ -3786,7 +3786,7 @@
                   <pic:spPr>
                     <a:xfrm>
                       <a:off x="0" y="0"/>
-                      <a:ext cx="2197100" cy="2925445"/>
+                      <a:ext cx="2135505" cy="2925445"/>
                     </a:xfrm>
                     <a:prstGeom prst="rect">
                       <a:avLst/>
@@ -3795,6 +3795,9 @@
                 </pic:pic>
               </a:graphicData>
             </a:graphic>
+            <wp14:sizeRelH relativeFrom="margin">
+              <wp14:pctWidth>0</wp14:pctWidth>
+            </wp14:sizeRelH>
             <wp14:sizeRelV relativeFrom="margin">
               <wp14:pctHeight>0</wp14:pctHeight>
             </wp14:sizeRelV>
@@ -5225,9 +5228,9 @@
           <w:lang w:eastAsia="pt-BR"/>
         </w:rPr>
         <w:drawing>
-          <wp:inline distT="0" distB="0" distL="0" distR="0" wp14:anchorId="220AB256" wp14:editId="6F7269EF">
-            <wp:extent cx="4695092" cy="2976464"/>
-            <wp:effectExtent l="0" t="0" r="0" b="0"/>
+          <wp:inline distT="0" distB="0" distL="0" distR="0" wp14:anchorId="220AB256" wp14:editId="678E2B8F">
+            <wp:extent cx="4701422" cy="2980476"/>
+            <wp:effectExtent l="0" t="0" r="4445" b="0"/>
             <wp:docPr id="3" name="Imagem 3"/>
             <wp:cNvGraphicFramePr>
               <a:graphicFrameLocks xmlns:a="http://schemas.openxmlformats.org/drawingml/2006/main" noChangeAspect="1"/>
@@ -5254,7 +5257,7 @@
                   <pic:spPr>
                     <a:xfrm>
                       <a:off x="0" y="0"/>
-                      <a:ext cx="4701422" cy="2980477"/>
+                      <a:ext cx="4701422" cy="2980476"/>
                     </a:xfrm>
                     <a:prstGeom prst="rect">
                       <a:avLst/>
@@ -5321,7 +5324,7 @@
           <w:lang w:eastAsia="pt-BR"/>
         </w:rPr>
         <w:drawing>
-          <wp:inline distT="0" distB="0" distL="0" distR="0" wp14:anchorId="2EA7A7F6" wp14:editId="32B866C4">
+          <wp:inline distT="0" distB="0" distL="0" distR="0" wp14:anchorId="2EA7A7F6" wp14:editId="67EB9886">
             <wp:extent cx="5839814" cy="1418493"/>
             <wp:effectExtent l="0" t="0" r="0" b="0"/>
             <wp:docPr id="2" name="Imagem 2"/>
@@ -5393,7 +5396,7 @@
           <w:lang w:eastAsia="pt-BR"/>
         </w:rPr>
         <w:drawing>
-          <wp:inline distT="0" distB="0" distL="0" distR="0" wp14:anchorId="32AD5C31" wp14:editId="6ECC67D6">
+          <wp:inline distT="0" distB="0" distL="0" distR="0" wp14:anchorId="32AD5C31" wp14:editId="77D2AAB3">
             <wp:extent cx="5769408" cy="1155829"/>
             <wp:effectExtent l="0" t="0" r="3175" b="6350"/>
             <wp:docPr id="5" name="Imagem 5"/>
@@ -5560,7 +5563,7 @@
           <w:lang w:eastAsia="pt-BR"/>
         </w:rPr>
         <w:drawing>
-          <wp:inline distT="0" distB="0" distL="0" distR="0" wp14:anchorId="5A0A9D17" wp14:editId="2245E770">
+          <wp:inline distT="0" distB="0" distL="0" distR="0" wp14:anchorId="5A0A9D17" wp14:editId="4BEDAB55">
             <wp:extent cx="5755479" cy="773723"/>
             <wp:effectExtent l="0" t="0" r="0" b="7620"/>
             <wp:docPr id="6" name="Imagem 6"/>
@@ -5631,7 +5634,7 @@
           <w:lang w:eastAsia="pt-BR"/>
         </w:rPr>
         <w:drawing>
-          <wp:inline distT="0" distB="0" distL="0" distR="0" wp14:anchorId="61B11120" wp14:editId="1A4348A0">
+          <wp:inline distT="0" distB="0" distL="0" distR="0" wp14:anchorId="61B11120" wp14:editId="1D86801D">
             <wp:extent cx="5749743" cy="914400"/>
             <wp:effectExtent l="0" t="0" r="3810" b="0"/>
             <wp:docPr id="7" name="Imagem 7"/>
@@ -5709,7 +5712,7 @@
           <w:lang w:eastAsia="pt-BR"/>
         </w:rPr>
         <w:drawing>
-          <wp:inline distT="0" distB="0" distL="0" distR="0" wp14:anchorId="4DC00A87" wp14:editId="1C5C4156">
+          <wp:inline distT="0" distB="0" distL="0" distR="0" wp14:anchorId="4DC00A87" wp14:editId="47F1ACFF">
             <wp:extent cx="5752398" cy="1453661"/>
             <wp:effectExtent l="0" t="0" r="1270" b="0"/>
             <wp:docPr id="8" name="Imagem 8"/>
@@ -5794,7 +5797,7 @@
           <w:lang w:eastAsia="pt-BR"/>
         </w:rPr>
         <w:drawing>
-          <wp:inline distT="0" distB="0" distL="0" distR="0" wp14:anchorId="6EF7DC13" wp14:editId="68A4FBC9">
+          <wp:inline distT="0" distB="0" distL="0" distR="0" wp14:anchorId="6EF7DC13" wp14:editId="5E42E901">
             <wp:extent cx="5788489" cy="574430"/>
             <wp:effectExtent l="0" t="0" r="3175" b="0"/>
             <wp:docPr id="9" name="Imagem 9"/>
@@ -5879,7 +5882,7 @@
           <w:lang w:eastAsia="pt-BR"/>
         </w:rPr>
         <w:drawing>
-          <wp:inline distT="0" distB="0" distL="0" distR="0" wp14:anchorId="0FA3CA38" wp14:editId="6CFE08D0">
+          <wp:inline distT="0" distB="0" distL="0" distR="0" wp14:anchorId="0FA3CA38" wp14:editId="6B4F5A2A">
             <wp:extent cx="5773542" cy="580292"/>
             <wp:effectExtent l="0" t="0" r="0" b="0"/>
             <wp:docPr id="10" name="Imagem 10"/>
@@ -8747,7 +8750,7 @@
           <w:lang w:eastAsia="pt-BR"/>
         </w:rPr>
         <w:drawing>
-          <wp:inline distT="0" distB="0" distL="0" distR="0" wp14:anchorId="7D1B9FBA" wp14:editId="7D883249">
+          <wp:inline distT="0" distB="0" distL="0" distR="0" wp14:anchorId="7D1B9FBA" wp14:editId="3762FB4C">
             <wp:extent cx="2881439" cy="4064751"/>
             <wp:effectExtent l="0" t="0" r="0" b="0"/>
             <wp:docPr id="1726782481" name="Imagem 2"/>

</xml_diff>

<commit_message>
Atualizando a documentação do projeto - 29/05/2026
</commit_message>
<xml_diff>
--- a/Terceiro_Semestre/Projeto_Integrador/Documentação/Modelo_Projeto_Integrador_principal.docx
+++ b/Terceiro_Semestre/Projeto_Integrador/Documentação/Modelo_Projeto_Integrador_principal.docx
@@ -3370,6 +3370,9 @@
       <w:pPr>
         <w:ind w:left="851" w:firstLine="1"/>
         <w:jc w:val="both"/>
+        <w:rPr>
+          <w:u w:val="single"/>
+        </w:rPr>
       </w:pPr>
       <w:r>
         <w:t xml:space="preserve">Linguagem de </w:t>
@@ -3381,7 +3384,18 @@
         <w:t xml:space="preserve">, versão 12.0. </w:t>
       </w:r>
       <w:r>
-        <w:t>Com auxilio do Framework .NET Core LTS 8</w:t>
+        <w:t xml:space="preserve">Com </w:t>
+      </w:r>
+      <w:proofErr w:type="gramStart"/>
+      <w:r>
+        <w:t>auxilio</w:t>
+      </w:r>
+      <w:proofErr w:type="gramEnd"/>
+      <w:r>
+        <w:t xml:space="preserve"> do Framework .NET Core LTS </w:t>
+      </w:r>
+      <w:r>
+        <w:t>10</w:t>
       </w:r>
     </w:p>
     <w:p>
@@ -5324,7 +5338,7 @@
           <w:lang w:eastAsia="pt-BR"/>
         </w:rPr>
         <w:drawing>
-          <wp:inline distT="0" distB="0" distL="0" distR="0" wp14:anchorId="2EA7A7F6" wp14:editId="67EB9886">
+          <wp:inline distT="0" distB="0" distL="0" distR="0" wp14:anchorId="2EA7A7F6" wp14:editId="64596043">
             <wp:extent cx="5839814" cy="1418493"/>
             <wp:effectExtent l="0" t="0" r="0" b="0"/>
             <wp:docPr id="2" name="Imagem 2"/>
@@ -5396,7 +5410,7 @@
           <w:lang w:eastAsia="pt-BR"/>
         </w:rPr>
         <w:drawing>
-          <wp:inline distT="0" distB="0" distL="0" distR="0" wp14:anchorId="32AD5C31" wp14:editId="77D2AAB3">
+          <wp:inline distT="0" distB="0" distL="0" distR="0" wp14:anchorId="32AD5C31" wp14:editId="348819FA">
             <wp:extent cx="5769408" cy="1155829"/>
             <wp:effectExtent l="0" t="0" r="3175" b="6350"/>
             <wp:docPr id="5" name="Imagem 5"/>
@@ -5511,31 +5525,6 @@
     </w:p>
     <w:p>
       <w:pPr>
-        <w:spacing w:line="240" w:lineRule="auto"/>
-        <w:contextualSpacing w:val="0"/>
-        <w:rPr>
-          <w:b/>
-          <w:bCs/>
-        </w:rPr>
-      </w:pPr>
-      <w:r>
-        <w:rPr>
-          <w:b/>
-          <w:bCs/>
-        </w:rPr>
-        <w:br w:type="page"/>
-      </w:r>
-    </w:p>
-    <w:p>
-      <w:pPr>
-        <w:rPr>
-          <w:b/>
-          <w:bCs/>
-        </w:rPr>
-      </w:pPr>
-    </w:p>
-    <w:p>
-      <w:pPr>
         <w:rPr>
           <w:b/>
           <w:bCs/>
@@ -5563,7 +5552,7 @@
           <w:lang w:eastAsia="pt-BR"/>
         </w:rPr>
         <w:drawing>
-          <wp:inline distT="0" distB="0" distL="0" distR="0" wp14:anchorId="5A0A9D17" wp14:editId="4BEDAB55">
+          <wp:inline distT="0" distB="0" distL="0" distR="0" wp14:anchorId="5A0A9D17" wp14:editId="72FB7A1A">
             <wp:extent cx="5755479" cy="773723"/>
             <wp:effectExtent l="0" t="0" r="0" b="7620"/>
             <wp:docPr id="6" name="Imagem 6"/>
@@ -5634,7 +5623,7 @@
           <w:lang w:eastAsia="pt-BR"/>
         </w:rPr>
         <w:drawing>
-          <wp:inline distT="0" distB="0" distL="0" distR="0" wp14:anchorId="61B11120" wp14:editId="1D86801D">
+          <wp:inline distT="0" distB="0" distL="0" distR="0" wp14:anchorId="61B11120" wp14:editId="2378F92A">
             <wp:extent cx="5749743" cy="914400"/>
             <wp:effectExtent l="0" t="0" r="3810" b="0"/>
             <wp:docPr id="7" name="Imagem 7"/>
@@ -5712,7 +5701,7 @@
           <w:lang w:eastAsia="pt-BR"/>
         </w:rPr>
         <w:drawing>
-          <wp:inline distT="0" distB="0" distL="0" distR="0" wp14:anchorId="4DC00A87" wp14:editId="47F1ACFF">
+          <wp:inline distT="0" distB="0" distL="0" distR="0" wp14:anchorId="4DC00A87" wp14:editId="295E5894">
             <wp:extent cx="5752398" cy="1453661"/>
             <wp:effectExtent l="0" t="0" r="1270" b="0"/>
             <wp:docPr id="8" name="Imagem 8"/>
@@ -5797,7 +5786,7 @@
           <w:lang w:eastAsia="pt-BR"/>
         </w:rPr>
         <w:drawing>
-          <wp:inline distT="0" distB="0" distL="0" distR="0" wp14:anchorId="6EF7DC13" wp14:editId="5E42E901">
+          <wp:inline distT="0" distB="0" distL="0" distR="0" wp14:anchorId="6EF7DC13" wp14:editId="62491959">
             <wp:extent cx="5788489" cy="574430"/>
             <wp:effectExtent l="0" t="0" r="3175" b="0"/>
             <wp:docPr id="9" name="Imagem 9"/>
@@ -5882,7 +5871,7 @@
           <w:lang w:eastAsia="pt-BR"/>
         </w:rPr>
         <w:drawing>
-          <wp:inline distT="0" distB="0" distL="0" distR="0" wp14:anchorId="0FA3CA38" wp14:editId="6B4F5A2A">
+          <wp:inline distT="0" distB="0" distL="0" distR="0" wp14:anchorId="0FA3CA38" wp14:editId="330858F2">
             <wp:extent cx="5773542" cy="580292"/>
             <wp:effectExtent l="0" t="0" r="0" b="0"/>
             <wp:docPr id="10" name="Imagem 10"/>
@@ -5924,7 +5913,6 @@
         </w:drawing>
       </w:r>
     </w:p>
-    <w:p/>
     <w:p>
       <w:pPr>
         <w:pStyle w:val="Ttulo3"/>
@@ -5940,6 +5928,7 @@
           <w:i w:val="0"/>
           <w:iCs/>
         </w:rPr>
+        <w:lastRenderedPageBreak/>
         <w:t>3.4.3</w:t>
       </w:r>
       <w:r>
@@ -6095,7 +6084,6 @@
         </w:rPr>
       </w:pPr>
       <w:r>
-        <w:lastRenderedPageBreak/>
         <w:t xml:space="preserve">    </w:t>
       </w:r>
       <w:proofErr w:type="spellStart"/>
@@ -6559,6 +6547,13 @@
         <w:br/>
         <w:t>);</w:t>
       </w:r>
+    </w:p>
+    <w:p>
+      <w:pPr>
+        <w:rPr>
+          <w:lang w:val="en-US"/>
+        </w:rPr>
+      </w:pPr>
       <w:r>
         <w:rPr>
           <w:lang w:val="en-US"/>
@@ -6570,6 +6565,12 @@
           <w:lang w:val="en-US"/>
         </w:rPr>
         <w:br/>
+      </w:r>
+      <w:r>
+        <w:rPr>
+          <w:lang w:val="en-US"/>
+        </w:rPr>
+        <w:lastRenderedPageBreak/>
         <w:t xml:space="preserve">TIPO </w:t>
       </w:r>
       <w:r>
@@ -6668,7 +6669,21 @@
         <w:rPr>
           <w:lang w:val="en-US"/>
         </w:rPr>
-        <w:t xml:space="preserve"> VARCHAR(30) NOT NULL UNIQUE</w:t>
+        <w:t xml:space="preserve"> </w:t>
+      </w:r>
+      <w:proofErr w:type="gramStart"/>
+      <w:r>
+        <w:rPr>
+          <w:lang w:val="en-US"/>
+        </w:rPr>
+        <w:t>VARCHAR(</w:t>
+      </w:r>
+      <w:proofErr w:type="gramEnd"/>
+      <w:r>
+        <w:rPr>
+          <w:lang w:val="en-US"/>
+        </w:rPr>
+        <w:t>30) NOT NULL UNIQUE</w:t>
       </w:r>
       <w:r>
         <w:rPr>
@@ -6719,7 +6734,6 @@
         <w:rPr>
           <w:lang w:val="en-US"/>
         </w:rPr>
-        <w:lastRenderedPageBreak/>
         <w:t>CREATE TABLE software (</w:t>
       </w:r>
       <w:r>
@@ -6905,7 +6919,21 @@
         <w:rPr>
           <w:lang w:val="en-US"/>
         </w:rPr>
-        <w:t xml:space="preserve"> VARCHAR(50) NOT NULL,</w:t>
+        <w:t xml:space="preserve"> </w:t>
+      </w:r>
+      <w:proofErr w:type="gramStart"/>
+      <w:r>
+        <w:rPr>
+          <w:lang w:val="en-US"/>
+        </w:rPr>
+        <w:t>VARCHAR(</w:t>
+      </w:r>
+      <w:proofErr w:type="gramEnd"/>
+      <w:r>
+        <w:rPr>
+          <w:lang w:val="en-US"/>
+        </w:rPr>
+        <w:t>50) NOT NULL,</w:t>
       </w:r>
       <w:r>
         <w:rPr>
@@ -7070,6 +7098,28 @@
     </w:p>
     <w:p>
       <w:pPr>
+        <w:spacing w:line="240" w:lineRule="auto"/>
+        <w:contextualSpacing w:val="0"/>
+        <w:rPr>
+          <w:lang w:val="en-US"/>
+        </w:rPr>
+      </w:pPr>
+      <w:r>
+        <w:rPr>
+          <w:lang w:val="en-US"/>
+        </w:rPr>
+        <w:br w:type="page"/>
+      </w:r>
+    </w:p>
+    <w:p>
+      <w:pPr>
+        <w:rPr>
+          <w:lang w:val="en-US"/>
+        </w:rPr>
+      </w:pPr>
+    </w:p>
+    <w:p>
+      <w:pPr>
         <w:rPr>
           <w:b/>
           <w:bCs/>
@@ -7359,7 +7409,583 @@
         <w:rPr>
           <w:lang w:val="en-US"/>
         </w:rPr>
+        <w:t xml:space="preserve">    CONSTRAINT </w:t>
+      </w:r>
+      <w:proofErr w:type="spellStart"/>
+      <w:r>
+        <w:rPr>
+          <w:lang w:val="en-US"/>
+        </w:rPr>
+        <w:t>chk_status_aprovacao</w:t>
+      </w:r>
+      <w:proofErr w:type="spellEnd"/>
+    </w:p>
+    <w:p>
+      <w:pPr>
+        <w:rPr>
+          <w:lang w:val="en-US"/>
+        </w:rPr>
+      </w:pPr>
+      <w:r>
+        <w:rPr>
+          <w:lang w:val="en-US"/>
+        </w:rPr>
+        <w:t xml:space="preserve">        CHECK (</w:t>
+      </w:r>
+      <w:proofErr w:type="spellStart"/>
+      <w:r>
+        <w:rPr>
+          <w:lang w:val="en-US"/>
+        </w:rPr>
+        <w:t>status_aprovacao</w:t>
+      </w:r>
+      <w:proofErr w:type="spellEnd"/>
+      <w:r>
+        <w:rPr>
+          <w:lang w:val="en-US"/>
+        </w:rPr>
+        <w:t xml:space="preserve"> IN ('A', 'R', 'P')),</w:t>
+      </w:r>
+    </w:p>
+    <w:p>
+      <w:pPr>
+        <w:rPr>
+          <w:lang w:val="en-US"/>
+        </w:rPr>
+      </w:pPr>
+    </w:p>
+    <w:p>
+      <w:r>
+        <w:rPr>
+          <w:lang w:val="en-US"/>
+        </w:rPr>
+        <w:t xml:space="preserve">    </w:t>
+      </w:r>
+      <w:r>
+        <w:t xml:space="preserve">CONSTRAINT </w:t>
+      </w:r>
+      <w:proofErr w:type="spellStart"/>
+      <w:r>
+        <w:t>fk_alocacao_disciplina</w:t>
+      </w:r>
+      <w:proofErr w:type="spellEnd"/>
+    </w:p>
+    <w:p>
+      <w:r>
+        <w:t xml:space="preserve">        FOREIGN KEY (</w:t>
+      </w:r>
+      <w:proofErr w:type="spellStart"/>
+      <w:r>
+        <w:t>id_disciplina</w:t>
+      </w:r>
+      <w:proofErr w:type="spellEnd"/>
+      <w:r>
+        <w:t>)</w:t>
+      </w:r>
+    </w:p>
+    <w:p>
+      <w:r>
+        <w:t xml:space="preserve">        REFERENCES disciplina(</w:t>
+      </w:r>
+      <w:proofErr w:type="spellStart"/>
+      <w:r>
+        <w:t>id_disciplina</w:t>
+      </w:r>
+      <w:proofErr w:type="spellEnd"/>
+      <w:r>
+        <w:t>)</w:t>
+      </w:r>
+    </w:p>
+    <w:p>
+      <w:pPr>
+        <w:rPr>
+          <w:lang w:val="en-US"/>
+        </w:rPr>
+      </w:pPr>
+      <w:r>
+        <w:t xml:space="preserve">        </w:t>
+      </w:r>
+      <w:r>
+        <w:rPr>
+          <w:lang w:val="en-US"/>
+        </w:rPr>
+        <w:t>ON UPDATE CASCADE</w:t>
+      </w:r>
+    </w:p>
+    <w:p>
+      <w:pPr>
+        <w:rPr>
+          <w:lang w:val="en-US"/>
+        </w:rPr>
+      </w:pPr>
+      <w:r>
+        <w:rPr>
+          <w:lang w:val="en-US"/>
+        </w:rPr>
+        <w:t xml:space="preserve">        ON DELETE RESTRICT,</w:t>
+      </w:r>
+    </w:p>
+    <w:p>
+      <w:pPr>
+        <w:rPr>
+          <w:lang w:val="en-US"/>
+        </w:rPr>
+      </w:pPr>
+    </w:p>
+    <w:p>
+      <w:pPr>
+        <w:rPr>
+          <w:lang w:val="en-US"/>
+        </w:rPr>
+      </w:pPr>
+      <w:r>
+        <w:rPr>
+          <w:lang w:val="en-US"/>
+        </w:rPr>
+        <w:t xml:space="preserve">    CONSTRAINT </w:t>
+      </w:r>
+      <w:proofErr w:type="spellStart"/>
+      <w:r>
+        <w:rPr>
+          <w:lang w:val="en-US"/>
+        </w:rPr>
+        <w:t>fk_alocacao_laboratorio</w:t>
+      </w:r>
+      <w:proofErr w:type="spellEnd"/>
+    </w:p>
+    <w:p>
+      <w:pPr>
+        <w:rPr>
+          <w:lang w:val="en-US"/>
+        </w:rPr>
+      </w:pPr>
+      <w:r>
+        <w:rPr>
+          <w:lang w:val="en-US"/>
+        </w:rPr>
+        <w:t xml:space="preserve">        FOREIGN KEY (</w:t>
+      </w:r>
+      <w:proofErr w:type="spellStart"/>
+      <w:r>
+        <w:rPr>
+          <w:lang w:val="en-US"/>
+        </w:rPr>
+        <w:t>id_laboratorio</w:t>
+      </w:r>
+      <w:proofErr w:type="spellEnd"/>
+      <w:r>
+        <w:rPr>
+          <w:lang w:val="en-US"/>
+        </w:rPr>
+        <w:t>)</w:t>
+      </w:r>
+    </w:p>
+    <w:p>
+      <w:pPr>
+        <w:rPr>
+          <w:lang w:val="en-US"/>
+        </w:rPr>
+      </w:pPr>
+      <w:r>
+        <w:rPr>
+          <w:lang w:val="en-US"/>
+        </w:rPr>
+        <w:t xml:space="preserve">        REFERENCES </w:t>
+      </w:r>
+      <w:proofErr w:type="spellStart"/>
+      <w:r>
+        <w:rPr>
+          <w:lang w:val="en-US"/>
+        </w:rPr>
+        <w:t>laboratorio</w:t>
+      </w:r>
+      <w:proofErr w:type="spellEnd"/>
+      <w:r>
+        <w:rPr>
+          <w:lang w:val="en-US"/>
+        </w:rPr>
+        <w:t>(</w:t>
+      </w:r>
+      <w:proofErr w:type="spellStart"/>
+      <w:r>
+        <w:rPr>
+          <w:lang w:val="en-US"/>
+        </w:rPr>
+        <w:t>id_laboratorio</w:t>
+      </w:r>
+      <w:proofErr w:type="spellEnd"/>
+      <w:r>
+        <w:rPr>
+          <w:lang w:val="en-US"/>
+        </w:rPr>
+        <w:t>)</w:t>
+      </w:r>
+    </w:p>
+    <w:p>
+      <w:pPr>
+        <w:rPr>
+          <w:lang w:val="en-US"/>
+        </w:rPr>
+      </w:pPr>
+      <w:r>
+        <w:rPr>
+          <w:lang w:val="en-US"/>
+        </w:rPr>
+        <w:t xml:space="preserve">        ON UPDATE CASCADE</w:t>
+      </w:r>
+    </w:p>
+    <w:p>
+      <w:pPr>
+        <w:rPr>
+          <w:lang w:val="en-US"/>
+        </w:rPr>
+      </w:pPr>
+      <w:r>
+        <w:rPr>
+          <w:lang w:val="en-US"/>
+        </w:rPr>
+        <w:t xml:space="preserve">        ON DELETE RESTRICT,</w:t>
+      </w:r>
+    </w:p>
+    <w:p>
+      <w:pPr>
+        <w:rPr>
+          <w:lang w:val="en-US"/>
+        </w:rPr>
+      </w:pPr>
+    </w:p>
+    <w:p>
+      <w:pPr>
+        <w:rPr>
+          <w:lang w:val="en-US"/>
+        </w:rPr>
+      </w:pPr>
+      <w:r>
+        <w:rPr>
+          <w:lang w:val="en-US"/>
+        </w:rPr>
+        <w:t xml:space="preserve">    CONSTRAINT </w:t>
+      </w:r>
+      <w:proofErr w:type="spellStart"/>
+      <w:r>
+        <w:rPr>
+          <w:lang w:val="en-US"/>
+        </w:rPr>
+        <w:t>fk_alocacao_usuario</w:t>
+      </w:r>
+      <w:proofErr w:type="spellEnd"/>
+    </w:p>
+    <w:p>
+      <w:pPr>
+        <w:rPr>
+          <w:lang w:val="en-US"/>
+        </w:rPr>
+      </w:pPr>
+      <w:r>
+        <w:rPr>
+          <w:lang w:val="en-US"/>
+        </w:rPr>
+        <w:t xml:space="preserve">        FOREIGN KEY (</w:t>
+      </w:r>
+      <w:proofErr w:type="spellStart"/>
+      <w:r>
+        <w:rPr>
+          <w:lang w:val="en-US"/>
+        </w:rPr>
+        <w:t>id_usuario</w:t>
+      </w:r>
+      <w:proofErr w:type="spellEnd"/>
+      <w:r>
+        <w:rPr>
+          <w:lang w:val="en-US"/>
+        </w:rPr>
+        <w:t>)</w:t>
+      </w:r>
+    </w:p>
+    <w:p>
+      <w:pPr>
+        <w:rPr>
+          <w:lang w:val="en-US"/>
+        </w:rPr>
+      </w:pPr>
+      <w:r>
+        <w:rPr>
+          <w:lang w:val="en-US"/>
+        </w:rPr>
+        <w:t xml:space="preserve">        REFERENCES </w:t>
+      </w:r>
+      <w:proofErr w:type="spellStart"/>
+      <w:r>
+        <w:rPr>
+          <w:lang w:val="en-US"/>
+        </w:rPr>
+        <w:t>usuario</w:t>
+      </w:r>
+      <w:proofErr w:type="spellEnd"/>
+      <w:r>
+        <w:rPr>
+          <w:lang w:val="en-US"/>
+        </w:rPr>
+        <w:t>(</w:t>
+      </w:r>
+      <w:proofErr w:type="spellStart"/>
+      <w:r>
+        <w:rPr>
+          <w:lang w:val="en-US"/>
+        </w:rPr>
+        <w:t>id_usuario</w:t>
+      </w:r>
+      <w:proofErr w:type="spellEnd"/>
+      <w:r>
+        <w:rPr>
+          <w:lang w:val="en-US"/>
+        </w:rPr>
+        <w:t>)</w:t>
+      </w:r>
+    </w:p>
+    <w:p>
+      <w:pPr>
+        <w:rPr>
+          <w:lang w:val="en-US"/>
+        </w:rPr>
+      </w:pPr>
+      <w:r>
+        <w:rPr>
+          <w:lang w:val="en-US"/>
+        </w:rPr>
+        <w:t xml:space="preserve">        ON UPDATE CASCADE</w:t>
+      </w:r>
+    </w:p>
+    <w:p>
+      <w:pPr>
+        <w:rPr>
+          <w:lang w:val="en-US"/>
+        </w:rPr>
+      </w:pPr>
+      <w:r>
+        <w:rPr>
+          <w:lang w:val="en-US"/>
+        </w:rPr>
+        <w:t xml:space="preserve">        ON DELETE RESTRICT</w:t>
+      </w:r>
+    </w:p>
+    <w:p>
+      <w:pPr>
+        <w:rPr>
+          <w:lang w:val="en-US"/>
+        </w:rPr>
+      </w:pPr>
+      <w:r>
+        <w:rPr>
+          <w:lang w:val="en-US"/>
+        </w:rPr>
         <w:lastRenderedPageBreak/>
+        <w:t>);</w:t>
+      </w:r>
+    </w:p>
+    <w:p>
+      <w:pPr>
+        <w:rPr>
+          <w:lang w:val="en-US"/>
+        </w:rPr>
+      </w:pPr>
+    </w:p>
+    <w:p>
+      <w:pPr>
+        <w:rPr>
+          <w:b/>
+          <w:bCs/>
+          <w:lang w:val="en-US"/>
+        </w:rPr>
+      </w:pPr>
+      <w:r>
+        <w:rPr>
+          <w:b/>
+          <w:bCs/>
+          <w:lang w:val="en-US"/>
+        </w:rPr>
+        <w:t>LABORATÓRIO-SOFTWARE (</w:t>
+      </w:r>
+      <w:proofErr w:type="gramStart"/>
+      <w:r>
+        <w:rPr>
+          <w:b/>
+          <w:bCs/>
+          <w:lang w:val="en-US"/>
+        </w:rPr>
+        <w:t>N:N</w:t>
+      </w:r>
+      <w:proofErr w:type="gramEnd"/>
+      <w:r>
+        <w:rPr>
+          <w:b/>
+          <w:bCs/>
+          <w:lang w:val="en-US"/>
+        </w:rPr>
+        <w:t>)</w:t>
+      </w:r>
+      <w:r>
+        <w:rPr>
+          <w:b/>
+          <w:bCs/>
+          <w:lang w:val="en-US"/>
+        </w:rPr>
+        <w:t>:</w:t>
+      </w:r>
+    </w:p>
+    <w:p>
+      <w:pPr>
+        <w:rPr>
+          <w:lang w:val="en-US"/>
+        </w:rPr>
+      </w:pPr>
+    </w:p>
+    <w:p>
+      <w:pPr>
+        <w:rPr>
+          <w:lang w:val="en-US"/>
+        </w:rPr>
+      </w:pPr>
+      <w:r>
+        <w:rPr>
+          <w:lang w:val="en-US"/>
+        </w:rPr>
+        <w:t xml:space="preserve">CREATE TABLE </w:t>
+      </w:r>
+      <w:proofErr w:type="spellStart"/>
+      <w:r>
+        <w:rPr>
+          <w:lang w:val="en-US"/>
+        </w:rPr>
+        <w:t>laboratorio_software</w:t>
+      </w:r>
+      <w:proofErr w:type="spellEnd"/>
+      <w:r>
+        <w:rPr>
+          <w:lang w:val="en-US"/>
+        </w:rPr>
+        <w:t xml:space="preserve"> (</w:t>
+      </w:r>
+    </w:p>
+    <w:p>
+      <w:pPr>
+        <w:rPr>
+          <w:lang w:val="en-US"/>
+        </w:rPr>
+      </w:pPr>
+      <w:r>
+        <w:rPr>
+          <w:lang w:val="en-US"/>
+        </w:rPr>
+        <w:t xml:space="preserve">    </w:t>
+      </w:r>
+      <w:proofErr w:type="spellStart"/>
+      <w:r>
+        <w:rPr>
+          <w:lang w:val="en-US"/>
+        </w:rPr>
+        <w:t>id_software</w:t>
+      </w:r>
+      <w:proofErr w:type="spellEnd"/>
+      <w:r>
+        <w:rPr>
+          <w:lang w:val="en-US"/>
+        </w:rPr>
+        <w:t xml:space="preserve"> INTEGER NOT NULL,</w:t>
+      </w:r>
+    </w:p>
+    <w:p>
+      <w:pPr>
+        <w:rPr>
+          <w:lang w:val="en-US"/>
+        </w:rPr>
+      </w:pPr>
+      <w:r>
+        <w:rPr>
+          <w:lang w:val="en-US"/>
+        </w:rPr>
+        <w:t xml:space="preserve">    </w:t>
+      </w:r>
+      <w:proofErr w:type="spellStart"/>
+      <w:r>
+        <w:rPr>
+          <w:lang w:val="en-US"/>
+        </w:rPr>
+        <w:t>id_laboratorio</w:t>
+      </w:r>
+      <w:proofErr w:type="spellEnd"/>
+      <w:r>
+        <w:rPr>
+          <w:lang w:val="en-US"/>
+        </w:rPr>
+        <w:t xml:space="preserve"> INTEGER NOT NULL,</w:t>
+      </w:r>
+    </w:p>
+    <w:p>
+      <w:pPr>
+        <w:rPr>
+          <w:lang w:val="en-US"/>
+        </w:rPr>
+      </w:pPr>
+    </w:p>
+    <w:p>
+      <w:pPr>
+        <w:rPr>
+          <w:lang w:val="en-US"/>
+        </w:rPr>
+      </w:pPr>
+      <w:r>
+        <w:rPr>
+          <w:lang w:val="en-US"/>
+        </w:rPr>
+        <w:t xml:space="preserve">    PRIMARY KEY (</w:t>
+      </w:r>
+      <w:proofErr w:type="spellStart"/>
+      <w:r>
+        <w:rPr>
+          <w:lang w:val="en-US"/>
+        </w:rPr>
+        <w:t>id_software</w:t>
+      </w:r>
+      <w:proofErr w:type="spellEnd"/>
+      <w:r>
+        <w:rPr>
+          <w:lang w:val="en-US"/>
+        </w:rPr>
+        <w:t xml:space="preserve">, </w:t>
+      </w:r>
+      <w:proofErr w:type="spellStart"/>
+      <w:r>
+        <w:rPr>
+          <w:lang w:val="en-US"/>
+        </w:rPr>
+        <w:t>id_laboratorio</w:t>
+      </w:r>
+      <w:proofErr w:type="spellEnd"/>
+      <w:r>
+        <w:rPr>
+          <w:lang w:val="en-US"/>
+        </w:rPr>
+        <w:t>),</w:t>
+      </w:r>
+    </w:p>
+    <w:p>
+      <w:pPr>
+        <w:rPr>
+          <w:lang w:val="en-US"/>
+        </w:rPr>
+      </w:pPr>
+    </w:p>
+    <w:p>
+      <w:pPr>
+        <w:rPr>
+          <w:lang w:val="en-US"/>
+        </w:rPr>
+      </w:pPr>
+      <w:r>
+        <w:rPr>
+          <w:lang w:val="en-US"/>
+        </w:rPr>
         <w:t xml:space="preserve">    CONSTRAINT </w:t>
       </w:r>
       <w:proofErr w:type="spellStart"/>
@@ -7367,7 +7993,7 @@
         <w:rPr>
           <w:lang w:val="en-US"/>
         </w:rPr>
-        <w:t>chk_status_aprovacao</w:t>
+        <w:t>fk_labsoft_software</w:t>
       </w:r>
       <w:proofErr w:type="spellEnd"/>
     </w:p>
@@ -7381,69 +8007,405 @@
         <w:rPr>
           <w:lang w:val="en-US"/>
         </w:rPr>
-        <w:t xml:space="preserve">        CHECK (</w:t>
+        <w:t xml:space="preserve">        FOREIGN KEY (</w:t>
       </w:r>
       <w:proofErr w:type="spellStart"/>
       <w:r>
         <w:rPr>
           <w:lang w:val="en-US"/>
         </w:rPr>
-        <w:t>status_aprovacao</w:t>
+        <w:t>id_software</w:t>
       </w:r>
       <w:proofErr w:type="spellEnd"/>
       <w:r>
         <w:rPr>
           <w:lang w:val="en-US"/>
         </w:rPr>
-        <w:t xml:space="preserve"> IN ('A', 'R', 'P')),</w:t>
-      </w:r>
-    </w:p>
-    <w:p>
-      <w:pPr>
-        <w:rPr>
-          <w:lang w:val="en-US"/>
-        </w:rPr>
-      </w:pPr>
-    </w:p>
-    <w:p>
+        <w:t>)</w:t>
+      </w:r>
+    </w:p>
+    <w:p>
+      <w:pPr>
+        <w:rPr>
+          <w:lang w:val="en-US"/>
+        </w:rPr>
+      </w:pPr>
+      <w:r>
+        <w:rPr>
+          <w:lang w:val="en-US"/>
+        </w:rPr>
+        <w:t xml:space="preserve">        REFERENCES software(</w:t>
+      </w:r>
+      <w:proofErr w:type="spellStart"/>
+      <w:r>
+        <w:rPr>
+          <w:lang w:val="en-US"/>
+        </w:rPr>
+        <w:t>id_software</w:t>
+      </w:r>
+      <w:proofErr w:type="spellEnd"/>
+      <w:r>
+        <w:rPr>
+          <w:lang w:val="en-US"/>
+        </w:rPr>
+        <w:t>)</w:t>
+      </w:r>
+    </w:p>
+    <w:p>
+      <w:pPr>
+        <w:rPr>
+          <w:lang w:val="en-US"/>
+        </w:rPr>
+      </w:pPr>
+      <w:r>
+        <w:rPr>
+          <w:lang w:val="en-US"/>
+        </w:rPr>
+        <w:t xml:space="preserve">        ON UPDATE CASCADE</w:t>
+      </w:r>
+    </w:p>
+    <w:p>
+      <w:pPr>
+        <w:rPr>
+          <w:lang w:val="en-US"/>
+        </w:rPr>
+      </w:pPr>
+      <w:r>
+        <w:rPr>
+          <w:lang w:val="en-US"/>
+        </w:rPr>
+        <w:t xml:space="preserve">        ON DELETE CASCADE,</w:t>
+      </w:r>
+    </w:p>
+    <w:p>
+      <w:pPr>
+        <w:rPr>
+          <w:lang w:val="en-US"/>
+        </w:rPr>
+      </w:pPr>
+    </w:p>
+    <w:p>
+      <w:pPr>
+        <w:rPr>
+          <w:lang w:val="en-US"/>
+        </w:rPr>
+      </w:pPr>
+      <w:r>
+        <w:rPr>
+          <w:lang w:val="en-US"/>
+        </w:rPr>
+        <w:t xml:space="preserve">    CONSTRAINT </w:t>
+      </w:r>
+      <w:proofErr w:type="spellStart"/>
+      <w:r>
+        <w:rPr>
+          <w:lang w:val="en-US"/>
+        </w:rPr>
+        <w:t>fk_labsoft_laboratorio</w:t>
+      </w:r>
+      <w:proofErr w:type="spellEnd"/>
+    </w:p>
+    <w:p>
+      <w:pPr>
+        <w:rPr>
+          <w:lang w:val="en-US"/>
+        </w:rPr>
+      </w:pPr>
+      <w:r>
+        <w:rPr>
+          <w:lang w:val="en-US"/>
+        </w:rPr>
+        <w:t xml:space="preserve">        FOREIGN KEY (</w:t>
+      </w:r>
+      <w:proofErr w:type="spellStart"/>
+      <w:r>
+        <w:rPr>
+          <w:lang w:val="en-US"/>
+        </w:rPr>
+        <w:t>id_laboratorio</w:t>
+      </w:r>
+      <w:proofErr w:type="spellEnd"/>
+      <w:r>
+        <w:rPr>
+          <w:lang w:val="en-US"/>
+        </w:rPr>
+        <w:t>)</w:t>
+      </w:r>
+    </w:p>
+    <w:p>
+      <w:r>
+        <w:rPr>
+          <w:lang w:val="en-US"/>
+        </w:rPr>
+        <w:t xml:space="preserve">        </w:t>
+      </w:r>
+      <w:r>
+        <w:t xml:space="preserve">REFERENCES </w:t>
+      </w:r>
+      <w:proofErr w:type="spellStart"/>
+      <w:r>
+        <w:t>laboratorio</w:t>
+      </w:r>
+      <w:proofErr w:type="spellEnd"/>
+      <w:r>
+        <w:t>(</w:t>
+      </w:r>
+      <w:proofErr w:type="spellStart"/>
+      <w:r>
+        <w:t>id_laboratorio</w:t>
+      </w:r>
+      <w:proofErr w:type="spellEnd"/>
+      <w:r>
+        <w:t>)</w:t>
+      </w:r>
+    </w:p>
+    <w:p>
+      <w:r>
+        <w:t xml:space="preserve">        ON UPDATE CASCADE</w:t>
+      </w:r>
+    </w:p>
+    <w:p>
+      <w:r>
+        <w:t xml:space="preserve">        ON DELETE CASCADE</w:t>
+      </w:r>
+    </w:p>
+    <w:p>
+      <w:r>
+        <w:t>);</w:t>
+      </w:r>
+    </w:p>
+    <w:p/>
+    <w:p>
+      <w:pPr>
+        <w:rPr>
+          <w:b/>
+          <w:bCs/>
+        </w:rPr>
+      </w:pPr>
+      <w:r>
+        <w:rPr>
+          <w:b/>
+          <w:bCs/>
+        </w:rPr>
+        <w:t>SOFTWARE-DISCIPLINA (N:N)</w:t>
+      </w:r>
+      <w:r>
+        <w:rPr>
+          <w:b/>
+          <w:bCs/>
+        </w:rPr>
+        <w:t>:</w:t>
+      </w:r>
+    </w:p>
+    <w:p/>
+    <w:p>
+      <w:pPr>
+        <w:rPr>
+          <w:lang w:val="en-US"/>
+        </w:rPr>
+      </w:pPr>
+      <w:r>
+        <w:rPr>
+          <w:lang w:val="en-US"/>
+        </w:rPr>
+        <w:t xml:space="preserve">CREATE TABLE </w:t>
+      </w:r>
+      <w:proofErr w:type="spellStart"/>
+      <w:r>
+        <w:rPr>
+          <w:lang w:val="en-US"/>
+        </w:rPr>
+        <w:t>software_disciplina</w:t>
+      </w:r>
+      <w:proofErr w:type="spellEnd"/>
+      <w:r>
+        <w:rPr>
+          <w:lang w:val="en-US"/>
+        </w:rPr>
+        <w:t xml:space="preserve"> (</w:t>
+      </w:r>
+    </w:p>
+    <w:p>
+      <w:pPr>
+        <w:rPr>
+          <w:lang w:val="en-US"/>
+        </w:rPr>
+      </w:pPr>
       <w:r>
         <w:rPr>
           <w:lang w:val="en-US"/>
         </w:rPr>
         <w:t xml:space="preserve">    </w:t>
       </w:r>
-      <w:r>
-        <w:t xml:space="preserve">CONSTRAINT </w:t>
-      </w:r>
       <w:proofErr w:type="spellStart"/>
       <w:r>
-        <w:t>fk_alocacao_disciplina</w:t>
+        <w:rPr>
+          <w:lang w:val="en-US"/>
+        </w:rPr>
+        <w:t>id_software</w:t>
       </w:r>
       <w:proofErr w:type="spellEnd"/>
-    </w:p>
-    <w:p>
-      <w:r>
+      <w:r>
+        <w:rPr>
+          <w:lang w:val="en-US"/>
+        </w:rPr>
+        <w:t xml:space="preserve"> INTEGER NOT NULL,</w:t>
+      </w:r>
+    </w:p>
+    <w:p>
+      <w:pPr>
+        <w:rPr>
+          <w:lang w:val="en-US"/>
+        </w:rPr>
+      </w:pPr>
+      <w:r>
+        <w:rPr>
+          <w:lang w:val="en-US"/>
+        </w:rPr>
+        <w:t xml:space="preserve">    </w:t>
+      </w:r>
+      <w:proofErr w:type="spellStart"/>
+      <w:r>
+        <w:rPr>
+          <w:lang w:val="en-US"/>
+        </w:rPr>
+        <w:t>id_disciplina</w:t>
+      </w:r>
+      <w:proofErr w:type="spellEnd"/>
+      <w:r>
+        <w:rPr>
+          <w:lang w:val="en-US"/>
+        </w:rPr>
+        <w:t xml:space="preserve"> INTEGER NOT NULL,</w:t>
+      </w:r>
+    </w:p>
+    <w:p>
+      <w:pPr>
+        <w:rPr>
+          <w:lang w:val="en-US"/>
+        </w:rPr>
+      </w:pPr>
+    </w:p>
+    <w:p>
+      <w:pPr>
+        <w:rPr>
+          <w:lang w:val="en-US"/>
+        </w:rPr>
+      </w:pPr>
+      <w:r>
+        <w:rPr>
+          <w:lang w:val="en-US"/>
+        </w:rPr>
+        <w:t xml:space="preserve">    PRIMARY KEY (</w:t>
+      </w:r>
+      <w:proofErr w:type="spellStart"/>
+      <w:r>
+        <w:rPr>
+          <w:lang w:val="en-US"/>
+        </w:rPr>
+        <w:t>id_software</w:t>
+      </w:r>
+      <w:proofErr w:type="spellEnd"/>
+      <w:r>
+        <w:rPr>
+          <w:lang w:val="en-US"/>
+        </w:rPr>
+        <w:t xml:space="preserve">, </w:t>
+      </w:r>
+      <w:proofErr w:type="spellStart"/>
+      <w:r>
+        <w:rPr>
+          <w:lang w:val="en-US"/>
+        </w:rPr>
+        <w:t>id_disciplina</w:t>
+      </w:r>
+      <w:proofErr w:type="spellEnd"/>
+      <w:r>
+        <w:rPr>
+          <w:lang w:val="en-US"/>
+        </w:rPr>
+        <w:t>),</w:t>
+      </w:r>
+    </w:p>
+    <w:p>
+      <w:pPr>
+        <w:rPr>
+          <w:lang w:val="en-US"/>
+        </w:rPr>
+      </w:pPr>
+    </w:p>
+    <w:p>
+      <w:pPr>
+        <w:rPr>
+          <w:lang w:val="en-US"/>
+        </w:rPr>
+      </w:pPr>
+      <w:r>
+        <w:rPr>
+          <w:lang w:val="en-US"/>
+        </w:rPr>
+        <w:t xml:space="preserve">    CONSTRAINT </w:t>
+      </w:r>
+      <w:proofErr w:type="spellStart"/>
+      <w:r>
+        <w:rPr>
+          <w:lang w:val="en-US"/>
+        </w:rPr>
+        <w:t>fk_softdisc_software</w:t>
+      </w:r>
+      <w:proofErr w:type="spellEnd"/>
+    </w:p>
+    <w:p>
+      <w:pPr>
+        <w:rPr>
+          <w:lang w:val="en-US"/>
+        </w:rPr>
+      </w:pPr>
+      <w:r>
+        <w:rPr>
+          <w:lang w:val="en-US"/>
+        </w:rPr>
         <w:t xml:space="preserve">        FOREIGN KEY (</w:t>
       </w:r>
       <w:proofErr w:type="spellStart"/>
       <w:r>
-        <w:t>id_disciplina</w:t>
+        <w:rPr>
+          <w:lang w:val="en-US"/>
+        </w:rPr>
+        <w:t>id_software</w:t>
       </w:r>
       <w:proofErr w:type="spellEnd"/>
       <w:r>
+        <w:rPr>
+          <w:lang w:val="en-US"/>
+        </w:rPr>
         <w:t>)</w:t>
       </w:r>
     </w:p>
     <w:p>
-      <w:r>
-        <w:t xml:space="preserve">        REFERENCES disciplina(</w:t>
+      <w:pPr>
+        <w:rPr>
+          <w:lang w:val="en-US"/>
+        </w:rPr>
+      </w:pPr>
+      <w:r>
+        <w:rPr>
+          <w:lang w:val="en-US"/>
+        </w:rPr>
+        <w:t xml:space="preserve">        REFERENCES software(</w:t>
       </w:r>
       <w:proofErr w:type="spellStart"/>
       <w:r>
-        <w:t>id_disciplina</w:t>
+        <w:rPr>
+          <w:lang w:val="en-US"/>
+        </w:rPr>
+        <w:t>id_software</w:t>
       </w:r>
       <w:proofErr w:type="spellEnd"/>
       <w:r>
+        <w:rPr>
+          <w:lang w:val="en-US"/>
+        </w:rPr>
         <w:t>)</w:t>
       </w:r>
     </w:p>
@@ -7454,922 +8416,10 @@
         </w:rPr>
       </w:pPr>
       <w:r>
-        <w:t xml:space="preserve">        </w:t>
-      </w:r>
-      <w:r>
-        <w:rPr>
-          <w:lang w:val="en-US"/>
-        </w:rPr>
-        <w:t>ON UPDATE CASCADE</w:t>
-      </w:r>
-    </w:p>
-    <w:p>
-      <w:pPr>
-        <w:rPr>
-          <w:lang w:val="en-US"/>
-        </w:rPr>
-      </w:pPr>
-      <w:r>
-        <w:rPr>
-          <w:lang w:val="en-US"/>
-        </w:rPr>
-        <w:t xml:space="preserve">        ON DELETE RESTRICT,</w:t>
-      </w:r>
-    </w:p>
-    <w:p>
-      <w:pPr>
-        <w:rPr>
-          <w:lang w:val="en-US"/>
-        </w:rPr>
-      </w:pPr>
-    </w:p>
-    <w:p>
-      <w:pPr>
-        <w:rPr>
-          <w:lang w:val="en-US"/>
-        </w:rPr>
-      </w:pPr>
-      <w:r>
-        <w:rPr>
-          <w:lang w:val="en-US"/>
-        </w:rPr>
-        <w:t xml:space="preserve">    CONSTRAINT </w:t>
-      </w:r>
-      <w:proofErr w:type="spellStart"/>
-      <w:r>
-        <w:rPr>
-          <w:lang w:val="en-US"/>
-        </w:rPr>
-        <w:t>fk_alocacao_laboratorio</w:t>
-      </w:r>
-      <w:proofErr w:type="spellEnd"/>
-    </w:p>
-    <w:p>
-      <w:pPr>
-        <w:rPr>
-          <w:lang w:val="en-US"/>
-        </w:rPr>
-      </w:pPr>
-      <w:r>
-        <w:rPr>
-          <w:lang w:val="en-US"/>
-        </w:rPr>
-        <w:t xml:space="preserve">        FOREIGN KEY (</w:t>
-      </w:r>
-      <w:proofErr w:type="spellStart"/>
-      <w:r>
-        <w:rPr>
-          <w:lang w:val="en-US"/>
-        </w:rPr>
-        <w:t>id_laboratorio</w:t>
-      </w:r>
-      <w:proofErr w:type="spellEnd"/>
-      <w:r>
-        <w:rPr>
-          <w:lang w:val="en-US"/>
-        </w:rPr>
-        <w:t>)</w:t>
-      </w:r>
-    </w:p>
-    <w:p>
-      <w:pPr>
-        <w:rPr>
-          <w:lang w:val="en-US"/>
-        </w:rPr>
-      </w:pPr>
-      <w:r>
-        <w:rPr>
-          <w:lang w:val="en-US"/>
-        </w:rPr>
-        <w:t xml:space="preserve">        REFERENCES </w:t>
-      </w:r>
-      <w:proofErr w:type="spellStart"/>
-      <w:r>
-        <w:rPr>
-          <w:lang w:val="en-US"/>
-        </w:rPr>
-        <w:t>laboratorio</w:t>
-      </w:r>
-      <w:proofErr w:type="spellEnd"/>
-      <w:r>
-        <w:rPr>
-          <w:lang w:val="en-US"/>
-        </w:rPr>
-        <w:t>(</w:t>
-      </w:r>
-      <w:proofErr w:type="spellStart"/>
-      <w:r>
-        <w:rPr>
-          <w:lang w:val="en-US"/>
-        </w:rPr>
-        <w:t>id_laboratorio</w:t>
-      </w:r>
-      <w:proofErr w:type="spellEnd"/>
-      <w:r>
-        <w:rPr>
-          <w:lang w:val="en-US"/>
-        </w:rPr>
-        <w:t>)</w:t>
-      </w:r>
-    </w:p>
-    <w:p>
-      <w:pPr>
-        <w:rPr>
-          <w:lang w:val="en-US"/>
-        </w:rPr>
-      </w:pPr>
-      <w:r>
-        <w:rPr>
-          <w:lang w:val="en-US"/>
-        </w:rPr>
-        <w:t xml:space="preserve">        ON UPDATE CASCADE</w:t>
-      </w:r>
-    </w:p>
-    <w:p>
-      <w:pPr>
-        <w:rPr>
-          <w:lang w:val="en-US"/>
-        </w:rPr>
-      </w:pPr>
-      <w:r>
-        <w:rPr>
-          <w:lang w:val="en-US"/>
-        </w:rPr>
-        <w:t xml:space="preserve">        ON DELETE RESTRICT,</w:t>
-      </w:r>
-    </w:p>
-    <w:p>
-      <w:pPr>
-        <w:rPr>
-          <w:lang w:val="en-US"/>
-        </w:rPr>
-      </w:pPr>
-    </w:p>
-    <w:p>
-      <w:pPr>
-        <w:rPr>
-          <w:lang w:val="en-US"/>
-        </w:rPr>
-      </w:pPr>
-      <w:r>
-        <w:rPr>
-          <w:lang w:val="en-US"/>
-        </w:rPr>
-        <w:t xml:space="preserve">    CONSTRAINT </w:t>
-      </w:r>
-      <w:proofErr w:type="spellStart"/>
-      <w:r>
-        <w:rPr>
-          <w:lang w:val="en-US"/>
-        </w:rPr>
-        <w:t>fk_alocacao_usuario</w:t>
-      </w:r>
-      <w:proofErr w:type="spellEnd"/>
-    </w:p>
-    <w:p>
-      <w:pPr>
-        <w:rPr>
-          <w:lang w:val="en-US"/>
-        </w:rPr>
-      </w:pPr>
-      <w:r>
-        <w:rPr>
-          <w:lang w:val="en-US"/>
-        </w:rPr>
-        <w:t xml:space="preserve">        FOREIGN KEY (</w:t>
-      </w:r>
-      <w:proofErr w:type="spellStart"/>
-      <w:r>
-        <w:rPr>
-          <w:lang w:val="en-US"/>
-        </w:rPr>
-        <w:t>id_usuario</w:t>
-      </w:r>
-      <w:proofErr w:type="spellEnd"/>
-      <w:r>
-        <w:rPr>
-          <w:lang w:val="en-US"/>
-        </w:rPr>
-        <w:t>)</w:t>
-      </w:r>
-    </w:p>
-    <w:p>
-      <w:pPr>
-        <w:rPr>
-          <w:lang w:val="en-US"/>
-        </w:rPr>
-      </w:pPr>
-      <w:r>
-        <w:rPr>
-          <w:lang w:val="en-US"/>
-        </w:rPr>
-        <w:t xml:space="preserve">        REFERENCES </w:t>
-      </w:r>
-      <w:proofErr w:type="spellStart"/>
-      <w:r>
-        <w:rPr>
-          <w:lang w:val="en-US"/>
-        </w:rPr>
-        <w:t>usuario</w:t>
-      </w:r>
-      <w:proofErr w:type="spellEnd"/>
-      <w:r>
-        <w:rPr>
-          <w:lang w:val="en-US"/>
-        </w:rPr>
-        <w:t>(</w:t>
-      </w:r>
-      <w:proofErr w:type="spellStart"/>
-      <w:r>
-        <w:rPr>
-          <w:lang w:val="en-US"/>
-        </w:rPr>
-        <w:t>id_usuario</w:t>
-      </w:r>
-      <w:proofErr w:type="spellEnd"/>
-      <w:r>
-        <w:rPr>
-          <w:lang w:val="en-US"/>
-        </w:rPr>
-        <w:t>)</w:t>
-      </w:r>
-    </w:p>
-    <w:p>
-      <w:pPr>
-        <w:rPr>
-          <w:lang w:val="en-US"/>
-        </w:rPr>
-      </w:pPr>
-      <w:r>
-        <w:rPr>
-          <w:lang w:val="en-US"/>
-        </w:rPr>
-        <w:t xml:space="preserve">        ON UPDATE CASCADE</w:t>
-      </w:r>
-    </w:p>
-    <w:p>
-      <w:pPr>
-        <w:rPr>
-          <w:lang w:val="en-US"/>
-        </w:rPr>
-      </w:pPr>
-      <w:r>
-        <w:rPr>
-          <w:lang w:val="en-US"/>
-        </w:rPr>
-        <w:t xml:space="preserve">        ON DELETE RESTRICT</w:t>
-      </w:r>
-    </w:p>
-    <w:p>
-      <w:pPr>
-        <w:rPr>
-          <w:lang w:val="en-US"/>
-        </w:rPr>
-      </w:pPr>
-      <w:r>
-        <w:rPr>
-          <w:lang w:val="en-US"/>
-        </w:rPr>
-        <w:t>);</w:t>
-      </w:r>
-    </w:p>
-    <w:p>
-      <w:pPr>
-        <w:rPr>
-          <w:lang w:val="en-US"/>
-        </w:rPr>
-      </w:pPr>
-    </w:p>
-    <w:p>
-      <w:pPr>
-        <w:rPr>
-          <w:b/>
-          <w:bCs/>
-          <w:lang w:val="en-US"/>
-        </w:rPr>
-      </w:pPr>
-      <w:r>
-        <w:rPr>
-          <w:b/>
-          <w:bCs/>
-          <w:lang w:val="en-US"/>
-        </w:rPr>
-        <w:t>LABORATÓRIO-SOFTWARE (</w:t>
-      </w:r>
-      <w:proofErr w:type="gramStart"/>
-      <w:r>
-        <w:rPr>
-          <w:b/>
-          <w:bCs/>
-          <w:lang w:val="en-US"/>
-        </w:rPr>
-        <w:t>N:N</w:t>
-      </w:r>
-      <w:proofErr w:type="gramEnd"/>
-      <w:r>
-        <w:rPr>
-          <w:b/>
-          <w:bCs/>
-          <w:lang w:val="en-US"/>
-        </w:rPr>
-        <w:t>)</w:t>
-      </w:r>
-      <w:r>
-        <w:rPr>
-          <w:b/>
-          <w:bCs/>
-          <w:lang w:val="en-US"/>
-        </w:rPr>
-        <w:t>:</w:t>
-      </w:r>
-    </w:p>
-    <w:p>
-      <w:pPr>
-        <w:rPr>
-          <w:lang w:val="en-US"/>
-        </w:rPr>
-      </w:pPr>
-    </w:p>
-    <w:p>
-      <w:pPr>
-        <w:rPr>
-          <w:lang w:val="en-US"/>
-        </w:rPr>
-      </w:pPr>
-      <w:r>
-        <w:rPr>
-          <w:lang w:val="en-US"/>
-        </w:rPr>
-        <w:t xml:space="preserve">CREATE TABLE </w:t>
-      </w:r>
-      <w:proofErr w:type="spellStart"/>
-      <w:r>
-        <w:rPr>
-          <w:lang w:val="en-US"/>
-        </w:rPr>
-        <w:t>laboratorio_software</w:t>
-      </w:r>
-      <w:proofErr w:type="spellEnd"/>
-      <w:r>
-        <w:rPr>
-          <w:lang w:val="en-US"/>
-        </w:rPr>
-        <w:t xml:space="preserve"> (</w:t>
-      </w:r>
-    </w:p>
-    <w:p>
-      <w:pPr>
-        <w:rPr>
-          <w:lang w:val="en-US"/>
-        </w:rPr>
-      </w:pPr>
-      <w:r>
-        <w:rPr>
-          <w:lang w:val="en-US"/>
-        </w:rPr>
-        <w:t xml:space="preserve">    </w:t>
-      </w:r>
-      <w:proofErr w:type="spellStart"/>
-      <w:r>
-        <w:rPr>
-          <w:lang w:val="en-US"/>
-        </w:rPr>
-        <w:t>id_software</w:t>
-      </w:r>
-      <w:proofErr w:type="spellEnd"/>
-      <w:r>
-        <w:rPr>
-          <w:lang w:val="en-US"/>
-        </w:rPr>
-        <w:t xml:space="preserve"> INTEGER NOT NULL,</w:t>
-      </w:r>
-    </w:p>
-    <w:p>
-      <w:pPr>
-        <w:rPr>
-          <w:lang w:val="en-US"/>
-        </w:rPr>
-      </w:pPr>
-      <w:r>
-        <w:rPr>
-          <w:lang w:val="en-US"/>
-        </w:rPr>
-        <w:t xml:space="preserve">    </w:t>
-      </w:r>
-      <w:proofErr w:type="spellStart"/>
-      <w:r>
-        <w:rPr>
-          <w:lang w:val="en-US"/>
-        </w:rPr>
-        <w:t>id_laboratorio</w:t>
-      </w:r>
-      <w:proofErr w:type="spellEnd"/>
-      <w:r>
-        <w:rPr>
-          <w:lang w:val="en-US"/>
-        </w:rPr>
-        <w:t xml:space="preserve"> INTEGER NOT NULL,</w:t>
-      </w:r>
-    </w:p>
-    <w:p>
-      <w:pPr>
-        <w:rPr>
-          <w:lang w:val="en-US"/>
-        </w:rPr>
-      </w:pPr>
-    </w:p>
-    <w:p>
-      <w:pPr>
-        <w:rPr>
-          <w:lang w:val="en-US"/>
-        </w:rPr>
-      </w:pPr>
-      <w:r>
-        <w:rPr>
-          <w:lang w:val="en-US"/>
-        </w:rPr>
-        <w:t xml:space="preserve">    PRIMARY KEY (</w:t>
-      </w:r>
-      <w:proofErr w:type="spellStart"/>
-      <w:r>
-        <w:rPr>
-          <w:lang w:val="en-US"/>
-        </w:rPr>
-        <w:t>id_software</w:t>
-      </w:r>
-      <w:proofErr w:type="spellEnd"/>
-      <w:r>
-        <w:rPr>
-          <w:lang w:val="en-US"/>
-        </w:rPr>
-        <w:t xml:space="preserve">, </w:t>
-      </w:r>
-      <w:proofErr w:type="spellStart"/>
-      <w:r>
-        <w:rPr>
-          <w:lang w:val="en-US"/>
-        </w:rPr>
-        <w:t>id_laboratorio</w:t>
-      </w:r>
-      <w:proofErr w:type="spellEnd"/>
-      <w:r>
-        <w:rPr>
-          <w:lang w:val="en-US"/>
-        </w:rPr>
-        <w:t>),</w:t>
-      </w:r>
-    </w:p>
-    <w:p>
-      <w:pPr>
-        <w:rPr>
-          <w:lang w:val="en-US"/>
-        </w:rPr>
-      </w:pPr>
-    </w:p>
-    <w:p>
-      <w:pPr>
-        <w:rPr>
-          <w:lang w:val="en-US"/>
-        </w:rPr>
-      </w:pPr>
-      <w:r>
-        <w:rPr>
-          <w:lang w:val="en-US"/>
-        </w:rPr>
-        <w:t xml:space="preserve">    CONSTRAINT </w:t>
-      </w:r>
-      <w:proofErr w:type="spellStart"/>
-      <w:r>
-        <w:rPr>
-          <w:lang w:val="en-US"/>
-        </w:rPr>
-        <w:t>fk_labsoft_software</w:t>
-      </w:r>
-      <w:proofErr w:type="spellEnd"/>
-    </w:p>
-    <w:p>
-      <w:pPr>
-        <w:rPr>
-          <w:lang w:val="en-US"/>
-        </w:rPr>
-      </w:pPr>
-      <w:r>
-        <w:rPr>
-          <w:lang w:val="en-US"/>
-        </w:rPr>
-        <w:t xml:space="preserve">        FOREIGN KEY (</w:t>
-      </w:r>
-      <w:proofErr w:type="spellStart"/>
-      <w:r>
-        <w:rPr>
-          <w:lang w:val="en-US"/>
-        </w:rPr>
-        <w:t>id_software</w:t>
-      </w:r>
-      <w:proofErr w:type="spellEnd"/>
-      <w:r>
-        <w:rPr>
-          <w:lang w:val="en-US"/>
-        </w:rPr>
-        <w:t>)</w:t>
-      </w:r>
-    </w:p>
-    <w:p>
-      <w:pPr>
-        <w:rPr>
-          <w:lang w:val="en-US"/>
-        </w:rPr>
-      </w:pPr>
-      <w:r>
-        <w:rPr>
-          <w:lang w:val="en-US"/>
-        </w:rPr>
-        <w:t xml:space="preserve">        REFERENCES software(</w:t>
-      </w:r>
-      <w:proofErr w:type="spellStart"/>
-      <w:r>
-        <w:rPr>
-          <w:lang w:val="en-US"/>
-        </w:rPr>
-        <w:t>id_software</w:t>
-      </w:r>
-      <w:proofErr w:type="spellEnd"/>
-      <w:r>
-        <w:rPr>
-          <w:lang w:val="en-US"/>
-        </w:rPr>
-        <w:t>)</w:t>
-      </w:r>
-    </w:p>
-    <w:p>
-      <w:pPr>
-        <w:rPr>
-          <w:lang w:val="en-US"/>
-        </w:rPr>
-      </w:pPr>
-      <w:r>
-        <w:rPr>
-          <w:lang w:val="en-US"/>
-        </w:rPr>
-        <w:t xml:space="preserve">        ON UPDATE CASCADE</w:t>
-      </w:r>
-    </w:p>
-    <w:p>
-      <w:pPr>
-        <w:rPr>
-          <w:lang w:val="en-US"/>
-        </w:rPr>
-      </w:pPr>
-      <w:r>
         <w:rPr>
           <w:lang w:val="en-US"/>
         </w:rPr>
         <w:lastRenderedPageBreak/>
-        <w:t xml:space="preserve">        ON DELETE CASCADE,</w:t>
-      </w:r>
-    </w:p>
-    <w:p>
-      <w:pPr>
-        <w:rPr>
-          <w:lang w:val="en-US"/>
-        </w:rPr>
-      </w:pPr>
-    </w:p>
-    <w:p>
-      <w:pPr>
-        <w:rPr>
-          <w:lang w:val="en-US"/>
-        </w:rPr>
-      </w:pPr>
-      <w:r>
-        <w:rPr>
-          <w:lang w:val="en-US"/>
-        </w:rPr>
-        <w:t xml:space="preserve">    CONSTRAINT </w:t>
-      </w:r>
-      <w:proofErr w:type="spellStart"/>
-      <w:r>
-        <w:rPr>
-          <w:lang w:val="en-US"/>
-        </w:rPr>
-        <w:t>fk_labsoft_laboratorio</w:t>
-      </w:r>
-      <w:proofErr w:type="spellEnd"/>
-    </w:p>
-    <w:p>
-      <w:pPr>
-        <w:rPr>
-          <w:lang w:val="en-US"/>
-        </w:rPr>
-      </w:pPr>
-      <w:r>
-        <w:rPr>
-          <w:lang w:val="en-US"/>
-        </w:rPr>
-        <w:t xml:space="preserve">        FOREIGN KEY (</w:t>
-      </w:r>
-      <w:proofErr w:type="spellStart"/>
-      <w:r>
-        <w:rPr>
-          <w:lang w:val="en-US"/>
-        </w:rPr>
-        <w:t>id_laboratorio</w:t>
-      </w:r>
-      <w:proofErr w:type="spellEnd"/>
-      <w:r>
-        <w:rPr>
-          <w:lang w:val="en-US"/>
-        </w:rPr>
-        <w:t>)</w:t>
-      </w:r>
-    </w:p>
-    <w:p>
-      <w:r>
-        <w:rPr>
-          <w:lang w:val="en-US"/>
-        </w:rPr>
-        <w:t xml:space="preserve">        </w:t>
-      </w:r>
-      <w:r>
-        <w:t xml:space="preserve">REFERENCES </w:t>
-      </w:r>
-      <w:proofErr w:type="spellStart"/>
-      <w:r>
-        <w:t>laboratorio</w:t>
-      </w:r>
-      <w:proofErr w:type="spellEnd"/>
-      <w:r>
-        <w:t>(</w:t>
-      </w:r>
-      <w:proofErr w:type="spellStart"/>
-      <w:r>
-        <w:t>id_laboratorio</w:t>
-      </w:r>
-      <w:proofErr w:type="spellEnd"/>
-      <w:r>
-        <w:t>)</w:t>
-      </w:r>
-    </w:p>
-    <w:p>
-      <w:r>
-        <w:t xml:space="preserve">        ON UPDATE CASCADE</w:t>
-      </w:r>
-    </w:p>
-    <w:p>
-      <w:r>
-        <w:t xml:space="preserve">        ON DELETE CASCADE</w:t>
-      </w:r>
-    </w:p>
-    <w:p>
-      <w:r>
-        <w:t>);</w:t>
-      </w:r>
-    </w:p>
-    <w:p/>
-    <w:p>
-      <w:pPr>
-        <w:rPr>
-          <w:b/>
-          <w:bCs/>
-        </w:rPr>
-      </w:pPr>
-      <w:r>
-        <w:rPr>
-          <w:b/>
-          <w:bCs/>
-        </w:rPr>
-        <w:t>SOFTWARE-DISCIPLINA (N:N)</w:t>
-      </w:r>
-      <w:r>
-        <w:rPr>
-          <w:b/>
-          <w:bCs/>
-        </w:rPr>
-        <w:t>:</w:t>
-      </w:r>
-    </w:p>
-    <w:p/>
-    <w:p>
-      <w:pPr>
-        <w:rPr>
-          <w:lang w:val="en-US"/>
-        </w:rPr>
-      </w:pPr>
-      <w:r>
-        <w:rPr>
-          <w:lang w:val="en-US"/>
-        </w:rPr>
-        <w:t xml:space="preserve">CREATE TABLE </w:t>
-      </w:r>
-      <w:proofErr w:type="spellStart"/>
-      <w:r>
-        <w:rPr>
-          <w:lang w:val="en-US"/>
-        </w:rPr>
-        <w:t>software_disciplina</w:t>
-      </w:r>
-      <w:proofErr w:type="spellEnd"/>
-      <w:r>
-        <w:rPr>
-          <w:lang w:val="en-US"/>
-        </w:rPr>
-        <w:t xml:space="preserve"> (</w:t>
-      </w:r>
-    </w:p>
-    <w:p>
-      <w:pPr>
-        <w:rPr>
-          <w:lang w:val="en-US"/>
-        </w:rPr>
-      </w:pPr>
-      <w:r>
-        <w:rPr>
-          <w:lang w:val="en-US"/>
-        </w:rPr>
-        <w:t xml:space="preserve">    </w:t>
-      </w:r>
-      <w:proofErr w:type="spellStart"/>
-      <w:r>
-        <w:rPr>
-          <w:lang w:val="en-US"/>
-        </w:rPr>
-        <w:t>id_software</w:t>
-      </w:r>
-      <w:proofErr w:type="spellEnd"/>
-      <w:r>
-        <w:rPr>
-          <w:lang w:val="en-US"/>
-        </w:rPr>
-        <w:t xml:space="preserve"> INTEGER NOT NULL,</w:t>
-      </w:r>
-    </w:p>
-    <w:p>
-      <w:pPr>
-        <w:rPr>
-          <w:lang w:val="en-US"/>
-        </w:rPr>
-      </w:pPr>
-      <w:r>
-        <w:rPr>
-          <w:lang w:val="en-US"/>
-        </w:rPr>
-        <w:t xml:space="preserve">    </w:t>
-      </w:r>
-      <w:proofErr w:type="spellStart"/>
-      <w:r>
-        <w:rPr>
-          <w:lang w:val="en-US"/>
-        </w:rPr>
-        <w:t>id_disciplina</w:t>
-      </w:r>
-      <w:proofErr w:type="spellEnd"/>
-      <w:r>
-        <w:rPr>
-          <w:lang w:val="en-US"/>
-        </w:rPr>
-        <w:t xml:space="preserve"> INTEGER NOT NULL,</w:t>
-      </w:r>
-    </w:p>
-    <w:p>
-      <w:pPr>
-        <w:rPr>
-          <w:lang w:val="en-US"/>
-        </w:rPr>
-      </w:pPr>
-    </w:p>
-    <w:p>
-      <w:pPr>
-        <w:rPr>
-          <w:lang w:val="en-US"/>
-        </w:rPr>
-      </w:pPr>
-      <w:r>
-        <w:rPr>
-          <w:lang w:val="en-US"/>
-        </w:rPr>
-        <w:t xml:space="preserve">    PRIMARY KEY (</w:t>
-      </w:r>
-      <w:proofErr w:type="spellStart"/>
-      <w:r>
-        <w:rPr>
-          <w:lang w:val="en-US"/>
-        </w:rPr>
-        <w:t>id_software</w:t>
-      </w:r>
-      <w:proofErr w:type="spellEnd"/>
-      <w:r>
-        <w:rPr>
-          <w:lang w:val="en-US"/>
-        </w:rPr>
-        <w:t xml:space="preserve">, </w:t>
-      </w:r>
-      <w:proofErr w:type="spellStart"/>
-      <w:r>
-        <w:rPr>
-          <w:lang w:val="en-US"/>
-        </w:rPr>
-        <w:t>id_disciplina</w:t>
-      </w:r>
-      <w:proofErr w:type="spellEnd"/>
-      <w:r>
-        <w:rPr>
-          <w:lang w:val="en-US"/>
-        </w:rPr>
-        <w:t>),</w:t>
-      </w:r>
-    </w:p>
-    <w:p>
-      <w:pPr>
-        <w:rPr>
-          <w:lang w:val="en-US"/>
-        </w:rPr>
-      </w:pPr>
-    </w:p>
-    <w:p>
-      <w:pPr>
-        <w:rPr>
-          <w:lang w:val="en-US"/>
-        </w:rPr>
-      </w:pPr>
-      <w:r>
-        <w:rPr>
-          <w:lang w:val="en-US"/>
-        </w:rPr>
-        <w:t xml:space="preserve">    CONSTRAINT </w:t>
-      </w:r>
-      <w:proofErr w:type="spellStart"/>
-      <w:r>
-        <w:rPr>
-          <w:lang w:val="en-US"/>
-        </w:rPr>
-        <w:t>fk_softdisc_software</w:t>
-      </w:r>
-      <w:proofErr w:type="spellEnd"/>
-    </w:p>
-    <w:p>
-      <w:pPr>
-        <w:rPr>
-          <w:lang w:val="en-US"/>
-        </w:rPr>
-      </w:pPr>
-      <w:r>
-        <w:rPr>
-          <w:lang w:val="en-US"/>
-        </w:rPr>
-        <w:t xml:space="preserve">        FOREIGN KEY (</w:t>
-      </w:r>
-      <w:proofErr w:type="spellStart"/>
-      <w:r>
-        <w:rPr>
-          <w:lang w:val="en-US"/>
-        </w:rPr>
-        <w:t>id_software</w:t>
-      </w:r>
-      <w:proofErr w:type="spellEnd"/>
-      <w:r>
-        <w:rPr>
-          <w:lang w:val="en-US"/>
-        </w:rPr>
-        <w:t>)</w:t>
-      </w:r>
-    </w:p>
-    <w:p>
-      <w:pPr>
-        <w:rPr>
-          <w:lang w:val="en-US"/>
-        </w:rPr>
-      </w:pPr>
-      <w:r>
-        <w:rPr>
-          <w:lang w:val="en-US"/>
-        </w:rPr>
-        <w:t xml:space="preserve">        REFERENCES software(</w:t>
-      </w:r>
-      <w:proofErr w:type="spellStart"/>
-      <w:r>
-        <w:rPr>
-          <w:lang w:val="en-US"/>
-        </w:rPr>
-        <w:t>id_software</w:t>
-      </w:r>
-      <w:proofErr w:type="spellEnd"/>
-      <w:r>
-        <w:rPr>
-          <w:lang w:val="en-US"/>
-        </w:rPr>
-        <w:t>)</w:t>
-      </w:r>
-    </w:p>
-    <w:p>
-      <w:pPr>
-        <w:rPr>
-          <w:lang w:val="en-US"/>
-        </w:rPr>
-      </w:pPr>
-      <w:r>
-        <w:rPr>
-          <w:lang w:val="en-US"/>
-        </w:rPr>
         <w:t xml:space="preserve">        ON UPDATE CASCADE</w:t>
       </w:r>
     </w:p>
@@ -8750,7 +8800,7 @@
           <w:lang w:eastAsia="pt-BR"/>
         </w:rPr>
         <w:drawing>
-          <wp:inline distT="0" distB="0" distL="0" distR="0" wp14:anchorId="7D1B9FBA" wp14:editId="3762FB4C">
+          <wp:inline distT="0" distB="0" distL="0" distR="0" wp14:anchorId="7D1B9FBA" wp14:editId="75B4C577">
             <wp:extent cx="2881439" cy="4064751"/>
             <wp:effectExtent l="0" t="0" r="0" b="0"/>
             <wp:docPr id="1726782481" name="Imagem 2"/>

</xml_diff>